<commit_message>
Correct publication details, Scholar link, and the Paramo calibration
- Paramo calibration at RIT: both versions now say it was calibrated
  directly with gradient-based optimization *and* that a graduate
  student was supervised on the same problem (they had each said only
  one of the two).
- Article [12]: "to Module Propagule Dispersal" -> "to Model".
- Proceedings: "The blazar sequence revised" had the other proceeding's
  DOI; now 10.1002/asna.202113895. J. Phys.: Conf. Ser. volume is 454,
  not 42.
- Google Scholar link pointed at a non-existent user id; now
  user=hrld5zgAAAAJ.
- Plain CV: M.Sc. and B.Sc. dates restored (the CV keeps full dates;
  the resume still omits them).

Fixed in both the plain YAML sources and the moderncv CV sources.

Co-Authored-By: Claude Opus 5.5 <noreply@anthropic.com>
</commit_message>
<xml_diff>
--- a/RuedaBecerrilJM-CV-plain.docx
+++ b/RuedaBecerrilJM-CV-plain.docx
@@ -28,7 +28,7 @@
       <w:r>
         <w:t xml:space="preserve">  |  </w:t>
       </w:r>
-      <w:hyperlink w:history="1" r:id="rIdycjnw4luao7uor5xs2ryl">
+      <w:hyperlink w:history="1" r:id="rIdqyuy5t01sktrnrdf3bj6x">
         <w:r>
           <w:t xml:space="preserve">jm.ruebe@gmail.com</w:t>
         </w:r>
@@ -42,7 +42,7 @@
       <w:r>
         <w:t xml:space="preserve">  |  </w:t>
       </w:r>
-      <w:hyperlink w:history="1" r:id="rIdeihtvodi5vgilna2d2uzj">
+      <w:hyperlink w:history="1" r:id="rId5ctx9znpty6kstlsjuf2e">
         <w:r>
           <w:t xml:space="preserve">linkedin.com/in/jeruebe</w:t>
         </w:r>
@@ -53,7 +53,7 @@
         <w:spacing w:after="60"/>
         <w:jc w:val="center"/>
       </w:pPr>
-      <w:hyperlink w:history="1" r:id="rIdbupgxlq2yzpy7lv6vtbsb">
+      <w:hyperlink w:history="1" r:id="rIdy0tdrr8rlfd2-xvilrjfj">
         <w:r>
           <w:t xml:space="preserve">altjerue.github.io</w:t>
         </w:r>
@@ -61,7 +61,7 @@
       <w:r>
         <w:t xml:space="preserve">  |  </w:t>
       </w:r>
-      <w:hyperlink w:history="1" r:id="rIdtjl-dd-akkkfle91zpcqr">
+      <w:hyperlink w:history="1" r:id="rIdzs5rl4m0ntmnvuspruneo">
         <w:r>
           <w:t xml:space="preserve">github.com/altjerue</w:t>
         </w:r>
@@ -69,7 +69,7 @@
       <w:r>
         <w:t xml:space="preserve">  |  </w:t>
       </w:r>
-      <w:hyperlink w:history="1" r:id="rIdxpwlfsdq46zn6s3-xjc1i">
+      <w:hyperlink w:history="1" r:id="rId-ag1-syixzeza3psyan_l">
         <w:r>
           <w:t xml:space="preserve">orcid.org/0000-0003-1988-1912</w:t>
         </w:r>
@@ -77,7 +77,7 @@
       <w:r>
         <w:t xml:space="preserve">  |  </w:t>
       </w:r>
-      <w:hyperlink w:history="1" r:id="rIdj0c31t3e89hwclakubhlf">
+      <w:hyperlink w:history="1" r:id="rIdud58tfodc7q-aaqnmv3p-">
         <w:r>
           <w:t xml:space="preserve">Google Scholar</w:t>
         </w:r>
@@ -707,7 +707,7 @@
         <w:spacing w:after="20"/>
       </w:pPr>
       <w:r>
-        <w:t xml:space="preserve">Supervised a graduate student calibrating Paramo model parameters against Fermi-LAT gamma-ray spectra with gradient-based optimization.</w:t>
+        <w:t xml:space="preserve">Calibrated Paramo model parameters against Fermi-LAT gamma-ray spectra with gradient-based optimization, and supervised a graduate student applying gradient descent to the same problem.</w:t>
       </w:r>
     </w:p>
     <w:p>
@@ -1097,7 +1097,7 @@
         <w:tab/>
       </w:r>
       <w:r>
-        <w:t xml:space="preserve">Jul 2017</w:t>
+        <w:t xml:space="preserve">Oct 2011 – Jul 2017</w:t>
       </w:r>
     </w:p>
     <w:p>
@@ -1152,7 +1152,7 @@
       <w:r>
         <w:t xml:space="preserve">Thesis: </w:t>
       </w:r>
-      <w:hyperlink w:history="1" r:id="rIducimpzeccmfloi2wx2do6">
+      <w:hyperlink w:history="1" r:id="rId9aun1ndhy3dtloq-wpjdz">
         <w:r>
           <w:t xml:space="preserve">Numerical treatment of radiation processes in the internal shocks of magnetized relativistic outflows</w:t>
         </w:r>
@@ -1179,6 +1179,12 @@
         </w:rPr>
         <w:t xml:space="preserve">M.Sc. in Physics</w:t>
       </w:r>
+      <w:r>
+        <w:tab/>
+      </w:r>
+      <w:r>
+        <w:t xml:space="preserve">Aug 2009 – Sep 2011</w:t>
+      </w:r>
     </w:p>
     <w:p>
       <w:pPr>
@@ -1246,6 +1252,12 @@
         </w:rPr>
         <w:t xml:space="preserve">B.Sc. in Physics</w:t>
       </w:r>
+      <w:r>
+        <w:tab/>
+      </w:r>
+      <w:r>
+        <w:t xml:space="preserve">Aug 2004 – Dec 2008</w:t>
+      </w:r>
     </w:p>
     <w:p>
       <w:pPr>
@@ -1345,7 +1357,7 @@
           <w:i/>
           <w:iCs/>
         </w:rPr>
-        <w:t xml:space="preserve">Using Numerical Simulations of Wind on Hilly Terrain to Module Propagule Dispersal</w:t>
+        <w:t xml:space="preserve">Using Numerical Simulations of Wind on Hilly Terrain to Model Propagule Dispersal</w:t>
       </w:r>
       <w:r>
         <w:t xml:space="preserve">, in prep.</w:t>
@@ -1437,7 +1449,7 @@
       <w:r>
         <w:t xml:space="preserve">, </w:t>
       </w:r>
-      <w:hyperlink w:history="1" r:id="rIdvvghnhleuekl7m-gr1yz5">
+      <w:hyperlink w:history="1" r:id="rIdpilfr1k6armhnt2kvflyl">
         <w:r>
           <w:t xml:space="preserve">ApJ 976, 182 (2024)</w:t>
         </w:r>
@@ -1445,7 +1457,7 @@
       <w:r>
         <w:t xml:space="preserve">, </w:t>
       </w:r>
-      <w:hyperlink w:history="1" r:id="rIdm8lskfkbsk-kamjdu1mdo">
+      <w:hyperlink w:history="1" r:id="rIdfca3p0dha2veof5m9dooy">
         <w:r>
           <w:t xml:space="preserve">arXiv:2405.17581</w:t>
         </w:r>
@@ -1482,7 +1494,7 @@
       <w:r>
         <w:t xml:space="preserve">, </w:t>
       </w:r>
-      <w:hyperlink w:history="1" r:id="rIdffgeejmjlqrqen2ypccyx">
+      <w:hyperlink w:history="1" r:id="rIdfouythyricb7k0webivx5">
         <w:r>
           <w:t xml:space="preserve">MNRAS 513, 5766–5779 (2022)</w:t>
         </w:r>
@@ -1490,7 +1502,7 @@
       <w:r>
         <w:t xml:space="preserve">, </w:t>
       </w:r>
-      <w:hyperlink w:history="1" r:id="rIdtlnlvnaf7n-dpddlouxvm">
+      <w:hyperlink w:history="1" r:id="rIdwqcng3w_itkao4jtfeiyi">
         <w:r>
           <w:t xml:space="preserve">arXiv:2201.07790</w:t>
         </w:r>
@@ -1527,7 +1539,7 @@
       <w:r>
         <w:t xml:space="preserve">, </w:t>
       </w:r>
-      <w:hyperlink w:history="1" r:id="rIdvvtqd6n4xnehggb0eby1q">
+      <w:hyperlink w:history="1" r:id="rIdrybcfkui5ejhojxpsjsmu">
         <w:r>
           <w:t xml:space="preserve">Phys. Rev. D 106, 083015 (2022)</w:t>
         </w:r>
@@ -1535,7 +1547,7 @@
       <w:r>
         <w:t xml:space="preserve">, </w:t>
       </w:r>
-      <w:hyperlink w:history="1" r:id="rIdlrth_mxsqgj3b2st9xcir">
+      <w:hyperlink w:history="1" r:id="rId2bb0tshuwwg3lnkn-d5pe">
         <w:r>
           <w:t xml:space="preserve">arXiv:2112.09817</w:t>
         </w:r>
@@ -1572,7 +1584,7 @@
       <w:r>
         <w:t xml:space="preserve">, </w:t>
       </w:r>
-      <w:hyperlink w:history="1" r:id="rIdptxdtbmcry1f31nmhpnfu">
+      <w:hyperlink w:history="1" r:id="rId6sphuxasv0lzzvoshll-c">
         <w:r>
           <w:t xml:space="preserve">ApJ 919, 95 (2021)</w:t>
         </w:r>
@@ -1580,7 +1592,7 @@
       <w:r>
         <w:t xml:space="preserve">, </w:t>
       </w:r>
-      <w:hyperlink w:history="1" r:id="rIdsgs8do-zo66ferfmb9xah">
+      <w:hyperlink w:history="1" r:id="rId9g1hsdw9tilpsgzgghcxy">
         <w:r>
           <w:t xml:space="preserve">arXiv:2106.05356</w:t>
         </w:r>
@@ -1617,7 +1629,7 @@
       <w:r>
         <w:t xml:space="preserve">, </w:t>
       </w:r>
-      <w:hyperlink w:history="1" r:id="rIdjn5ioqjoicj83pvjkxorz">
+      <w:hyperlink w:history="1" r:id="rIdsvlnlyizqrljfuweh9ru2">
         <w:r>
           <w:t xml:space="preserve">MNRAS 501, 4092–4102 (2021)</w:t>
         </w:r>
@@ -1625,7 +1637,7 @@
       <w:r>
         <w:t xml:space="preserve">, </w:t>
       </w:r>
-      <w:hyperlink w:history="1" r:id="rIdbeesatlw4ocpjesnnvu8t">
+      <w:hyperlink w:history="1" r:id="rIdam_77tpwjw01tq8ggqy1j">
         <w:r>
           <w:t xml:space="preserve">arXiv:2009.02273</w:t>
         </w:r>
@@ -1662,7 +1674,7 @@
       <w:r>
         <w:t xml:space="preserve">, </w:t>
       </w:r>
-      <w:hyperlink w:history="1" r:id="rIdaqwq8rsmi92o5hlbanpfs">
+      <w:hyperlink w:history="1" r:id="rIdstbiqbvgsga2rfz2x0f_p">
         <w:r>
           <w:t xml:space="preserve">MNRAS 496, 974–986 (2020)</w:t>
         </w:r>
@@ -1670,7 +1682,7 @@
       <w:r>
         <w:t xml:space="preserve">, </w:t>
       </w:r>
-      <w:hyperlink w:history="1" r:id="rIdswrqeoyecieamcj7wbxbo">
+      <w:hyperlink w:history="1" r:id="rIduwgtswjm04si_ftkknvf1">
         <w:r>
           <w:t xml:space="preserve">arXiv:1910.14049</w:t>
         </w:r>
@@ -1707,7 +1719,7 @@
       <w:r>
         <w:t xml:space="preserve">, </w:t>
       </w:r>
-      <w:hyperlink w:history="1" r:id="rId6tpixhh9wvf_7ekyezocx">
+      <w:hyperlink w:history="1" r:id="rIdknsgkcxysbhkx1qvrp-w6">
         <w:r>
           <w:t xml:space="preserve">MNRAS 468, 1169–1182 (2017)</w:t>
         </w:r>
@@ -1715,7 +1727,7 @@
       <w:r>
         <w:t xml:space="preserve">, </w:t>
       </w:r>
-      <w:hyperlink w:history="1" r:id="rId2_qysp4wv30jv5oz6oy3y">
+      <w:hyperlink w:history="1" r:id="rId2pwbetgas6wotm15ombmx">
         <w:r>
           <w:t xml:space="preserve">arXiv:1612.06383</w:t>
         </w:r>
@@ -1752,7 +1764,7 @@
       <w:r>
         <w:t xml:space="preserve">, </w:t>
       </w:r>
-      <w:hyperlink w:history="1" r:id="rIdt5om6rajz6tri4jf1upvt">
+      <w:hyperlink w:history="1" r:id="rIdcnlhiskkcaj9jbzi70bhi">
         <w:r>
           <w:t xml:space="preserve">MNRAS 438, 1856–1869 (2014)</w:t>
         </w:r>
@@ -1760,7 +1772,7 @@
       <w:r>
         <w:t xml:space="preserve">, </w:t>
       </w:r>
-      <w:hyperlink w:history="1" r:id="rId-zzft1xlxwbpejge-_eqd">
+      <w:hyperlink w:history="1" r:id="rId1fhwskmjsore3ir-u8_uw">
         <w:r>
           <w:t xml:space="preserve">arXiv:1310.5441</w:t>
         </w:r>
@@ -1797,7 +1809,7 @@
       <w:r>
         <w:t xml:space="preserve">, </w:t>
       </w:r>
-      <w:hyperlink w:history="1" r:id="rIdvjz7ej0oceboc5k8gm6kn">
+      <w:hyperlink w:history="1" r:id="rIdmj3_fhtdilhkxcy4rgmlk">
         <w:r>
           <w:t xml:space="preserve">Phys. Rev. D 80, 084023 (2009)</w:t>
         </w:r>
@@ -1805,7 +1817,7 @@
       <w:r>
         <w:t xml:space="preserve">, </w:t>
       </w:r>
-      <w:hyperlink w:history="1" r:id="rIdxiaew0te-jgwhxcn4jy-y">
+      <w:hyperlink w:history="1" r:id="rIdochhoo-etyigd0rmgisb_">
         <w:r>
           <w:t xml:space="preserve">arXiv:1009.1250</w:t>
         </w:r>
@@ -1850,7 +1862,7 @@
       <w:r>
         <w:t xml:space="preserve">, </w:t>
       </w:r>
-      <w:hyperlink w:history="1" r:id="rIdheybubyztdvbkksfab2dv">
+      <w:hyperlink w:history="1" r:id="rId9a2ommlztj0lgdih8s0ex">
         <w:r>
           <w:t xml:space="preserve">Astron. Nachr. 342, 277–282 (2021)</w:t>
         </w:r>
@@ -1858,7 +1870,7 @@
       <w:r>
         <w:t xml:space="preserve">, 9th International Workshop on Astronomy and Relativistic Astrophysics, </w:t>
       </w:r>
-      <w:hyperlink w:history="1" r:id="rIdtk2dsylymz2dycaoeyesr">
+      <w:hyperlink w:history="1" r:id="rIdotlipxymwgvuaybv6c2l-">
         <w:r>
           <w:t xml:space="preserve">arXiv:2011.13797</w:t>
         </w:r>
@@ -1895,7 +1907,7 @@
       <w:r>
         <w:t xml:space="preserve">, </w:t>
       </w:r>
-      <w:hyperlink w:history="1" r:id="rId_dasfdy-pnpcendm0pgtk">
+      <w:hyperlink w:history="1" r:id="rId9ac4nwclgavsshaiszjrn">
         <w:r>
           <w:t xml:space="preserve">Astron. Nachr. 342, 147–152 (2021)</w:t>
         </w:r>
@@ -1903,7 +1915,7 @@
       <w:r>
         <w:t xml:space="preserve">, 9th International Workshop on Astronomy and Relativistic Astrophysics, </w:t>
       </w:r>
-      <w:hyperlink w:history="1" r:id="rIdsp5udcdddzk5pw9irimet">
+      <w:hyperlink w:history="1" r:id="rId9ve9zxygwjdzby9defsai">
         <w:r>
           <w:t xml:space="preserve">arXiv:2011.13805</w:t>
         </w:r>
@@ -1940,7 +1952,7 @@
       <w:r>
         <w:t xml:space="preserve">, </w:t>
       </w:r>
-      <w:hyperlink w:history="1" r:id="rIdzd84denfmitwduekj-xnz">
+      <w:hyperlink w:history="1" r:id="rIdk4yhciltvufvwdzna8hyy">
         <w:r>
           <w:t xml:space="preserve">PoS(SWIFT 10) 233, 159 (2014)</w:t>
         </w:r>
@@ -1948,7 +1960,7 @@
       <w:r>
         <w:t xml:space="preserve">, </w:t>
       </w:r>
-      <w:hyperlink w:history="1" r:id="rIdmkthytinqgrundnezcq1w">
+      <w:hyperlink w:history="1" r:id="rIdcw-tosiawygirxzwpjwle">
         <w:r>
           <w:t xml:space="preserve">arXiv:1502.07882</w:t>
         </w:r>
@@ -1985,7 +1997,7 @@
       <w:r>
         <w:t xml:space="preserve">, </w:t>
       </w:r>
-      <w:hyperlink w:history="1" r:id="rIdfy9ep0bxrpzfuaytqzb6y">
+      <w:hyperlink w:history="1" r:id="rIdu-yzh5tufd4hcr3xjllvg">
         <w:r>
           <w:t xml:space="preserve">EPJ Web Conf. 61, 02007 (2013)</w:t>
         </w:r>
@@ -1993,7 +2005,7 @@
       <w:r>
         <w:t xml:space="preserve">, </w:t>
       </w:r>
-      <w:hyperlink w:history="1" r:id="rIdkngvkvccxqmah_c9fr79a">
+      <w:hyperlink w:history="1" r:id="rIdpytunmarwqbtzp3gkr21z">
         <w:r>
           <w:t xml:space="preserve">arXiv:1309.4612</w:t>
         </w:r>
@@ -2030,15 +2042,15 @@
       <w:r>
         <w:t xml:space="preserve">, </w:t>
       </w:r>
-      <w:hyperlink w:history="1" r:id="rIdtgphpowglspkw8vnafjod">
+      <w:hyperlink w:history="1" r:id="rIdwznygcpnp0wveepks7vjq">
         <w:r>
-          <w:t xml:space="preserve">J. Phys.: Conf. Ser. 42, 012001 (2013)</w:t>
+          <w:t xml:space="preserve">J. Phys.: Conf. Ser. 454, 012001 (2013)</w:t>
         </w:r>
       </w:hyperlink>
       <w:r>
         <w:t xml:space="preserve">, </w:t>
       </w:r>
-      <w:hyperlink w:history="1" r:id="rIdww2uimnz-r7bbgprtv4ro">
+      <w:hyperlink w:history="1" r:id="rIddhosu6xzm9jn_fpwuxmpr">
         <w:r>
           <w:t xml:space="preserve">arXiv:1211.1794</w:t>
         </w:r>
@@ -2441,7 +2453,7 @@
       <w:r>
         <w:tab/>
       </w:r>
-      <w:hyperlink w:history="1" r:id="rIddzw8h0cr-lvk_vc_4ibvf">
+      <w:hyperlink w:history="1" r:id="rIdi8_vqjar9p2hzfs6cwgcd">
         <w:r>
           <w:t xml:space="preserve">github.com/altjerue/ilwikak-ml</w:t>
         </w:r>
@@ -2532,7 +2544,7 @@
       <w:r>
         <w:tab/>
       </w:r>
-      <w:hyperlink w:history="1" r:id="rIdvvt-peaxjpvvtpdylcka7">
+      <w:hyperlink w:history="1" r:id="rIdumwe7usu-9qraufextybp">
         <w:r>
           <w:t xml:space="preserve">github.com/UW-ForestMycobiomeLab/WindSporesHills</w:t>
         </w:r>
@@ -2597,7 +2609,7 @@
       <w:r>
         <w:tab/>
       </w:r>
-      <w:hyperlink w:history="1" r:id="rIdbr3tcrmgda3cljmtwczwt">
+      <w:hyperlink w:history="1" r:id="rId3uoef_pgppadndzi-uh0j">
         <w:r>
           <w:t xml:space="preserve">github.com/zkdavis/Tleco</w:t>
         </w:r>
@@ -2662,7 +2674,7 @@
       <w:r>
         <w:tab/>
       </w:r>
-      <w:hyperlink w:history="1" r:id="rIdfpwdbz5upqcmdtr_viw_4">
+      <w:hyperlink w:history="1" r:id="rId67ja-htcngj4xxwqt3cor">
         <w:r>
           <w:t xml:space="preserve">github.com/altjerue/paramo</w:t>
         </w:r>
@@ -3273,7 +3285,7 @@
       <w:r>
         <w:t xml:space="preserve">Video: </w:t>
       </w:r>
-      <w:hyperlink w:history="1" r:id="rId5hcqy6ojud7qzjutz4e8z">
+      <w:hyperlink w:history="1" r:id="rIdttsys1kofxj8wutooac2z">
         <w:r>
           <w:t xml:space="preserve">youtube.com/watch?v=BAZNWLNT69M</w:t>
         </w:r>
@@ -3444,7 +3456,7 @@
       <w:r>
         <w:t xml:space="preserve">Marcos Moshinsky Award for Best Poster. Video: </w:t>
       </w:r>
-      <w:hyperlink w:history="1" r:id="rIdmnh7rtvamwww2dvih-wqk">
+      <w:hyperlink w:history="1" r:id="rIdczosveril-3mdrspsl8or">
         <w:r>
           <w:t xml:space="preserve">youtube.com/watch?v=0TJiKg7kOPI</w:t>
         </w:r>
@@ -4372,7 +4384,7 @@
       <w:r>
         <w:tab/>
       </w:r>
-      <w:hyperlink w:history="1" r:id="rIdvciahxekh89eod8nwkiz9">
+      <w:hyperlink w:history="1" r:id="rIdxlymntdf88ekmoexd9fd7">
         <w:r>
           <w:t xml:space="preserve">Kaggle</w:t>
         </w:r>
@@ -4506,7 +4518,7 @@
       <w:r>
         <w:tab/>
       </w:r>
-      <w:hyperlink w:history="1" r:id="rIdcmuwe2mp2ps7sq_8ifbmx">
+      <w:hyperlink w:history="1" r:id="rIdfdlreixtvufucno3nvjg1">
         <w:r>
           <w:t xml:space="preserve">Udemy</w:t>
         </w:r>
@@ -4552,7 +4564,7 @@
       <w:r>
         <w:tab/>
       </w:r>
-      <w:hyperlink w:history="1" r:id="rIdo7u8gci7w1jznb8k9lmw_">
+      <w:hyperlink w:history="1" r:id="rIdlh0dpnb7ghtjx1ad2_7eg">
         <w:r>
           <w:t xml:space="preserve">Udemy</w:t>
         </w:r>
@@ -4736,7 +4748,7 @@
       <w:pPr>
         <w:spacing w:after="0"/>
       </w:pPr>
-      <w:hyperlink w:history="1" r:id="rId1eexqtwvpaxktaykv6pda">
+      <w:hyperlink w:history="1" r:id="rIdy47_a8mzp-ubo7ngdeiuj">
         <w:r>
           <w:t xml:space="preserve">mexiciencia.github.io/post/anita</w:t>
         </w:r>
@@ -4796,7 +4808,7 @@
       <w:pPr>
         <w:spacing w:after="0"/>
       </w:pPr>
-      <w:hyperlink w:history="1" r:id="rIdnpcqbufmg3nr3q6m7opvv">
+      <w:hyperlink w:history="1" r:id="rIdqptrmjdwpw7ytxmsj-bmb">
         <w:r>
           <w:t xml:space="preserve">mexiciencia.github.io/post/modelo-sir</w:t>
         </w:r>
@@ -4859,7 +4871,7 @@
       <w:r>
         <w:t xml:space="preserve">Data analysis and modeling collaborator. </w:t>
       </w:r>
-      <w:hyperlink w:history="1" r:id="rIdfbv3xfd16nye16idvbnyh">
+      <w:hyperlink w:history="1" r:id="rIdqwoowei5idnmlmn4hyxsw">
         <w:r>
           <w:t xml:space="preserve">mexiciencia.github.io/post/covid19</w:t>
         </w:r>

</xml_diff>

<commit_message>
Use confirmed figures for Paramo, Frontera, Paychex, and Mercor
- Paramo: about 20x faster than the original serial code on 5 cores,
  from OpenMP parallelization plus optimized work distribution (was
  "20x on 10 cores" attributed to OpenMP alone).
- Frontera: about 1,200 node-hours of benchmarking for the new
  features (no production runs).
- Paychex: the Splunk dashboards tracked 200-400 users shared between
  enterprise systems and Oracle EBS.
- Mercor: wrote original prompts that stumped frontier models and
  co-developed others with fellow writers.

Co-Authored-By: Claude Opus 5.5 <noreply@anthropic.com>
</commit_message>
<xml_diff>
--- a/RuedaBecerrilJM-CV-plain.docx
+++ b/RuedaBecerrilJM-CV-plain.docx
@@ -28,7 +28,7 @@
       <w:r>
         <w:t xml:space="preserve">  |  </w:t>
       </w:r>
-      <w:hyperlink w:history="1" r:id="rIdqyuy5t01sktrnrdf3bj6x">
+      <w:hyperlink w:history="1" r:id="rIdnwovtjsz3hg94fphr8uti">
         <w:r>
           <w:t xml:space="preserve">jm.ruebe@gmail.com</w:t>
         </w:r>
@@ -42,7 +42,7 @@
       <w:r>
         <w:t xml:space="preserve">  |  </w:t>
       </w:r>
-      <w:hyperlink w:history="1" r:id="rId5ctx9znpty6kstlsjuf2e">
+      <w:hyperlink w:history="1" r:id="rIdu0soufttixg4t_qi7svcq">
         <w:r>
           <w:t xml:space="preserve">linkedin.com/in/jeruebe</w:t>
         </w:r>
@@ -53,7 +53,7 @@
         <w:spacing w:after="60"/>
         <w:jc w:val="center"/>
       </w:pPr>
-      <w:hyperlink w:history="1" r:id="rIdy0tdrr8rlfd2-xvilrjfj">
+      <w:hyperlink w:history="1" r:id="rIddyxx6qvv86cjzvfzw2ait">
         <w:r>
           <w:t xml:space="preserve">altjerue.github.io</w:t>
         </w:r>
@@ -61,7 +61,7 @@
       <w:r>
         <w:t xml:space="preserve">  |  </w:t>
       </w:r>
-      <w:hyperlink w:history="1" r:id="rIdzs5rl4m0ntmnvuspruneo">
+      <w:hyperlink w:history="1" r:id="rIdolvnxeagit_go79vcw5tb">
         <w:r>
           <w:t xml:space="preserve">github.com/altjerue</w:t>
         </w:r>
@@ -69,7 +69,7 @@
       <w:r>
         <w:t xml:space="preserve">  |  </w:t>
       </w:r>
-      <w:hyperlink w:history="1" r:id="rId-ag1-syixzeza3psyan_l">
+      <w:hyperlink w:history="1" r:id="rIdg_ujlrcxmfsmghrl6mu35">
         <w:r>
           <w:t xml:space="preserve">orcid.org/0000-0003-1988-1912</w:t>
         </w:r>
@@ -77,7 +77,7 @@
       <w:r>
         <w:t xml:space="preserve">  |  </w:t>
       </w:r>
-      <w:hyperlink w:history="1" r:id="rIdud58tfodc7q-aaqnmv3p-">
+      <w:hyperlink w:history="1" r:id="rIdwudy0rlp4qihaymwmy-mg">
         <w:r>
           <w:t xml:space="preserve">Google Scholar</w:t>
         </w:r>
@@ -106,7 +106,7 @@
     </w:p>
     <w:p>
       <w:pPr>
-        <w:spacing w:after="30"/>
+        <w:spacing w:after="20"/>
       </w:pPr>
       <w:r>
         <w:rPr>
@@ -121,7 +121,7 @@
     </w:p>
     <w:p>
       <w:pPr>
-        <w:spacing w:after="30"/>
+        <w:spacing w:after="20"/>
       </w:pPr>
       <w:r>
         <w:rPr>
@@ -136,7 +136,7 @@
     </w:p>
     <w:p>
       <w:pPr>
-        <w:spacing w:after="30"/>
+        <w:spacing w:after="20"/>
       </w:pPr>
       <w:r>
         <w:rPr>
@@ -151,7 +151,7 @@
     </w:p>
     <w:p>
       <w:pPr>
-        <w:spacing w:after="30"/>
+        <w:spacing w:after="20"/>
       </w:pPr>
       <w:r>
         <w:rPr>
@@ -166,7 +166,7 @@
     </w:p>
     <w:p>
       <w:pPr>
-        <w:spacing w:after="30"/>
+        <w:spacing w:after="20"/>
       </w:pPr>
       <w:r>
         <w:rPr>
@@ -247,10 +247,10 @@
           <w:ilvl w:val="0"/>
           <w:numId w:val="2"/>
         </w:numPr>
-        <w:spacing w:after="20"/>
-      </w:pPr>
-      <w:r>
-        <w:t xml:space="preserve">Reviewed 50+ expert-level problems in physics, hydrodynamics, astrophysics, and cosmology, and wrote prompts that stumped frontier models.</w:t>
+        <w:spacing w:after="10"/>
+      </w:pPr>
+      <w:r>
+        <w:t xml:space="preserve">Reviewed 50+ expert-level problems in physics, hydrodynamics, astrophysics, and cosmology; wrote original prompts that stumped frontier models and co-developed others with fellow writers.</w:t>
       </w:r>
     </w:p>
     <w:p>
@@ -260,7 +260,7 @@
           <w:ilvl w:val="0"/>
           <w:numId w:val="2"/>
         </w:numPr>
-        <w:spacing w:after="20"/>
+        <w:spacing w:after="10"/>
       </w:pPr>
       <w:r>
         <w:t xml:space="preserve">Diagnose failure modes in model reasoning and write structured feedback to improve scientific accuracy.</w:t>
@@ -273,7 +273,7 @@
           <w:ilvl w:val="0"/>
           <w:numId w:val="2"/>
         </w:numPr>
-        <w:spacing w:after="20"/>
+        <w:spacing w:after="10"/>
       </w:pPr>
       <w:r>
         <w:t xml:space="preserve">Benchmark model performance and quality-check solutions to complex STEM problems.</w:t>
@@ -345,7 +345,7 @@
           <w:ilvl w:val="0"/>
           <w:numId w:val="2"/>
         </w:numPr>
-        <w:spacing w:after="20"/>
+        <w:spacing w:after="10"/>
       </w:pPr>
       <w:r>
         <w:t xml:space="preserve">Mapped wetland probability across the 2,160 km² Skykomish watershed with the Wetland Intrinsic Potential (WIP) random-forest model, reaching &gt;75% accuracy.</w:t>
@@ -358,7 +358,7 @@
           <w:ilvl w:val="0"/>
           <w:numId w:val="2"/>
         </w:numPr>
-        <w:spacing w:after="20"/>
+        <w:spacing w:after="10"/>
       </w:pPr>
       <w:r>
         <w:t xml:space="preserve">Optimized the terrain-modeling code that computes elevation derivatives from 1 m, 3 m, and 10 m DEMs over 20 tiles, improving its computational performance.</w:t>
@@ -371,7 +371,7 @@
           <w:ilvl w:val="0"/>
           <w:numId w:val="2"/>
         </w:numPr>
-        <w:spacing w:after="20"/>
+        <w:spacing w:after="10"/>
       </w:pPr>
       <w:r>
         <w:t xml:space="preserve">Engineered features from Sentinel-1/2 multispectral imagery and terrain derivatives for ML land-cover and wetland models; built Python processing tools and QGIS visualizations.</w:t>
@@ -384,7 +384,7 @@
           <w:ilvl w:val="0"/>
           <w:numId w:val="2"/>
         </w:numPr>
-        <w:spacing w:after="20"/>
+        <w:spacing w:after="10"/>
       </w:pPr>
       <w:r>
         <w:t xml:space="preserve">Presented results to managers and decision-makers, trained 2 colleagues on the WIP tool, and worked with software engineers to move prototype tools into production.</w:t>
@@ -456,7 +456,7 @@
           <w:ilvl w:val="0"/>
           <w:numId w:val="2"/>
         </w:numPr>
-        <w:spacing w:after="20"/>
+        <w:spacing w:after="10"/>
       </w:pPr>
       <w:r>
         <w:t xml:space="preserve">Co-developed Tleco, a Rust/Python toolkit that models radiation from relativistic outflows by solving the Fokker–Planck equation coupled to radiative transfer; published in ApJ (2024) [9].</w:t>
@@ -469,7 +469,7 @@
           <w:ilvl w:val="0"/>
           <w:numId w:val="2"/>
         </w:numPr>
-        <w:spacing w:after="20"/>
+        <w:spacing w:after="10"/>
       </w:pPr>
       <w:r>
         <w:t xml:space="preserve">Developing WindsOfChange with the UW Forest Mycobiome Lab: a C++/R library that simulates wind-driven spore dispersal over forested, hilly terrain, parallelized with RcppParallel and OpenMP.</w:t>
@@ -482,7 +482,7 @@
           <w:ilvl w:val="0"/>
           <w:numId w:val="2"/>
         </w:numPr>
-        <w:spacing w:after="20"/>
+        <w:spacing w:after="10"/>
       </w:pPr>
       <w:r>
         <w:t xml:space="preserve">Invited talk on machine learning in environmental science at the University of Washington (2024).</w:t>
@@ -554,7 +554,7 @@
           <w:ilvl w:val="0"/>
           <w:numId w:val="2"/>
         </w:numPr>
-        <w:spacing w:after="20"/>
+        <w:spacing w:after="10"/>
       </w:pPr>
       <w:r>
         <w:t xml:space="preserve">Built Java Kafka consumers that moved data between enterprise databases, deployed through Jenkins and OpenShift CI/CD pipelines.</w:t>
@@ -567,10 +567,10 @@
           <w:ilvl w:val="0"/>
           <w:numId w:val="2"/>
         </w:numPr>
-        <w:spacing w:after="20"/>
-      </w:pPr>
-      <w:r>
-        <w:t xml:space="preserve">Created Splunk dashboards tracking the users shared between enterprise systems and Oracle EBS, with alerts that flagged production incidents.</w:t>
+        <w:spacing w:after="10"/>
+      </w:pPr>
+      <w:r>
+        <w:t xml:space="preserve">Created Splunk dashboards tracking the 200–400 users shared between enterprise systems and Oracle EBS, with alerts that flagged production incidents.</w:t>
       </w:r>
     </w:p>
     <w:p>
@@ -580,7 +580,7 @@
           <w:ilvl w:val="0"/>
           <w:numId w:val="2"/>
         </w:numPr>
-        <w:spacing w:after="20"/>
+        <w:spacing w:after="10"/>
       </w:pPr>
       <w:r>
         <w:t xml:space="preserve">Wrote full test suites for 5+ Python services in the CI pipeline, keeping production defect rates low.</w:t>
@@ -593,7 +593,7 @@
           <w:ilvl w:val="0"/>
           <w:numId w:val="2"/>
         </w:numPr>
-        <w:spacing w:after="20"/>
+        <w:spacing w:after="10"/>
       </w:pPr>
       <w:r>
         <w:t xml:space="preserve">Prepared, validated, and analyzed Oracle EBS data with SQL.</w:t>
@@ -665,7 +665,7 @@
           <w:ilvl w:val="0"/>
           <w:numId w:val="2"/>
         </w:numPr>
-        <w:spacing w:after="20"/>
+        <w:spacing w:after="10"/>
       </w:pPr>
       <w:r>
         <w:t xml:space="preserve">Led a 7-person team upgrading PatchworkMHD, a C code for magnetohydrodynamic simulations of supermassive black-hole binaries.</w:t>
@@ -678,7 +678,7 @@
           <w:ilvl w:val="0"/>
           <w:numId w:val="2"/>
         </w:numPr>
-        <w:spacing w:after="20"/>
+        <w:spacing w:after="10"/>
       </w:pPr>
       <w:r>
         <w:t xml:space="preserve">Added black-hole spin to the simulations with under 5% runtime overhead.</w:t>
@@ -691,10 +691,10 @@
           <w:ilvl w:val="0"/>
           <w:numId w:val="2"/>
         </w:numPr>
-        <w:spacing w:after="20"/>
-      </w:pPr>
-      <w:r>
-        <w:t xml:space="preserve">Designed the simulation experiments and ran and benchmarked the code on TACC's Frontera supercomputer, identifying performance optimization opportunities.</w:t>
+        <w:spacing w:after="10"/>
+      </w:pPr>
+      <w:r>
+        <w:t xml:space="preserve">Designed and ran benchmark simulations of the new features on TACC's Frontera supercomputer (about 1,200 node-hours), identifying performance optimization opportunities.</w:t>
       </w:r>
     </w:p>
     <w:p>
@@ -704,7 +704,7 @@
           <w:ilvl w:val="0"/>
           <w:numId w:val="2"/>
         </w:numPr>
-        <w:spacing w:after="20"/>
+        <w:spacing w:after="10"/>
       </w:pPr>
       <w:r>
         <w:t xml:space="preserve">Calibrated Paramo model parameters against Fermi-LAT gamma-ray spectra with gradient-based optimization, and supervised a graduate student applying gradient descent to the same problem.</w:t>
@@ -717,7 +717,7 @@
           <w:ilvl w:val="0"/>
           <w:numId w:val="2"/>
         </w:numPr>
-        <w:spacing w:after="20"/>
+        <w:spacing w:after="10"/>
       </w:pPr>
       <w:r>
         <w:t xml:space="preserve">Co-authored 2 papers from a multi-institution study of binary neutron-star mergers [6, 7] and a third on blazar heating and cooling [8].</w:t>
@@ -789,10 +789,10 @@
           <w:ilvl w:val="0"/>
           <w:numId w:val="2"/>
         </w:numPr>
-        <w:spacing w:after="20"/>
-      </w:pPr>
-      <w:r>
-        <w:t xml:space="preserve">Architected Paramo, an open-source Fortran 95 library that solves the Fokker–Planck equation coupled to radiative transfer; parallelized it with OpenMP for a 20× speedup over the serial code on 10 cores.</w:t>
+        <w:spacing w:after="10"/>
+      </w:pPr>
+      <w:r>
+        <w:t xml:space="preserve">Architected Paramo, an open-source Fortran 95 library that solves the Fokker–Planck equation coupled to radiative transfer; parallelized and optimized it with OpenMP, making it about 20× faster than the original serial code on 5 cores.</w:t>
       </w:r>
     </w:p>
     <w:p>
@@ -802,7 +802,7 @@
           <w:ilvl w:val="0"/>
           <w:numId w:val="2"/>
         </w:numPr>
-        <w:spacing w:after="20"/>
+        <w:spacing w:after="10"/>
       </w:pPr>
       <w:r>
         <w:t xml:space="preserve">Paramo has been adopted by other research groups, including in Combi &amp; Siegel (2023).</w:t>
@@ -815,7 +815,7 @@
           <w:ilvl w:val="0"/>
           <w:numId w:val="2"/>
         </w:numPr>
-        <w:spacing w:after="20"/>
+        <w:spacing w:after="10"/>
       </w:pPr>
       <w:r>
         <w:t xml:space="preserve">Co-I on two NASA Fermi Guest Investigator proposals; one was funded ($68K) and supported the finding that blazar jets are launched with similar energy per baryon, independently of their power [5].</w:t>
@@ -828,7 +828,7 @@
           <w:ilvl w:val="0"/>
           <w:numId w:val="2"/>
         </w:numPr>
-        <w:spacing w:after="20"/>
+        <w:spacing w:after="10"/>
       </w:pPr>
       <w:r>
         <w:t xml:space="preserve">Added numerical-integration and OpenMP features to Paramo and built Python tools to compute energy losses and spectra of high-energy particles in gamma-ray burst afterglows [4].</w:t>
@@ -841,7 +841,7 @@
           <w:ilvl w:val="0"/>
           <w:numId w:val="2"/>
         </w:numPr>
-        <w:spacing w:after="20"/>
+        <w:spacing w:after="10"/>
       </w:pPr>
       <w:r>
         <w:t xml:space="preserve">Mentored 3 graduate students (1 M.S., 2 Ph.D.), co-authoring papers with each.</w:t>
@@ -854,7 +854,7 @@
           <w:ilvl w:val="0"/>
           <w:numId w:val="2"/>
         </w:numPr>
-        <w:spacing w:after="20"/>
+        <w:spacing w:after="10"/>
       </w:pPr>
       <w:r>
         <w:t xml:space="preserve">Wrote Python scripts for statistical modeling of the COVID-19 outbreak in Mexico with a multidisciplinary group, and co-wrote Spanish-language infographics and blog posts against misinformation.</w:t>
@@ -917,7 +917,7 @@
           <w:ilvl w:val="0"/>
           <w:numId w:val="2"/>
         </w:numPr>
-        <w:spacing w:after="20"/>
+        <w:spacing w:after="10"/>
       </w:pPr>
       <w:r>
         <w:t xml:space="preserve">Built a Python pipeline that turned GRTrans black-hole simulation images into training data for an SVM classifier of black-hole spin (grayscale conversion, intensity normalization, spatial feature extraction).</w:t>
@@ -930,7 +930,7 @@
           <w:ilvl w:val="0"/>
           <w:numId w:val="2"/>
         </w:numPr>
-        <w:spacing w:after="20"/>
+        <w:spacing w:after="10"/>
       </w:pPr>
       <w:r>
         <w:t xml:space="preserve">Released an open-source Python tool for computing radiative-transfer spectra and light curves in relativistic astrophysics.</w:t>
@@ -943,7 +943,7 @@
           <w:ilvl w:val="0"/>
           <w:numId w:val="2"/>
         </w:numPr>
-        <w:spacing w:after="20"/>
+        <w:spacing w:after="10"/>
       </w:pPr>
       <w:r>
         <w:t xml:space="preserve">Organized an HDF5 workshop to train graduate students in high-volume data storage.</w:t>
@@ -1006,7 +1006,7 @@
           <w:ilvl w:val="0"/>
           <w:numId w:val="2"/>
         </w:numPr>
-        <w:spacing w:after="20"/>
+        <w:spacing w:after="10"/>
       </w:pPr>
       <w:r>
         <w:t xml:space="preserve">Automated runs of the C-SPEV radiative-transfer code with Shell and Python pipelines: 10–60 simulations per project and tens of GB of HDF5 output, with data-quality checks for downstream analysis.</w:t>
@@ -1019,7 +1019,7 @@
           <w:ilvl w:val="0"/>
           <w:numId w:val="2"/>
         </w:numPr>
-        <w:spacing w:after="20"/>
+        <w:spacing w:after="10"/>
       </w:pPr>
       <w:r>
         <w:t xml:space="preserve">Analyzed multi-wavelength observations from the NASA Fermi-LAT telescope and the Very Long Baseline Array (VLBA), including cross-matching sources across catalogs by sky coordinates and fitting log-parabola spectra.</w:t>
@@ -1032,7 +1032,7 @@
           <w:ilvl w:val="0"/>
           <w:numId w:val="2"/>
         </w:numPr>
-        <w:spacing w:after="20"/>
+        <w:spacing w:after="10"/>
       </w:pPr>
       <w:r>
         <w:t xml:space="preserve">Fit C-SPEV simulation models to telescope data, identifying spectral and light-curve patterns that quantify the magnetization of plasma in blazars.</w:t>
@@ -1045,7 +1045,7 @@
           <w:ilvl w:val="0"/>
           <w:numId w:val="2"/>
         </w:numPr>
-        <w:spacing w:after="20"/>
+        <w:spacing w:after="10"/>
       </w:pPr>
       <w:r>
         <w:t xml:space="preserve">Extended C-SPEV to compute discrete and continuous spectra from particle distributions of arbitrary shape, without affecting simulation runtime.</w:t>
@@ -1058,7 +1058,7 @@
           <w:ilvl w:val="0"/>
           <w:numId w:val="2"/>
         </w:numPr>
-        <w:spacing w:after="20"/>
+        <w:spacing w:after="10"/>
       </w:pPr>
       <w:r>
         <w:t xml:space="preserve">Published 2 first-author papers in MNRAS [2, 3].</w:t>
@@ -1152,7 +1152,7 @@
       <w:r>
         <w:t xml:space="preserve">Thesis: </w:t>
       </w:r>
-      <w:hyperlink w:history="1" r:id="rId9aun1ndhy3dtloq-wpjdz">
+      <w:hyperlink w:history="1" r:id="rIdfqo6wdjbtooprl7p6cmrq">
         <w:r>
           <w:t xml:space="preserve">Numerical treatment of radiation processes in the internal shocks of magnetized relativistic outflows</w:t>
         </w:r>
@@ -1449,7 +1449,7 @@
       <w:r>
         <w:t xml:space="preserve">, </w:t>
       </w:r>
-      <w:hyperlink w:history="1" r:id="rIdpilfr1k6armhnt2kvflyl">
+      <w:hyperlink w:history="1" r:id="rIdakhfnkghftij9klxa2qix">
         <w:r>
           <w:t xml:space="preserve">ApJ 976, 182 (2024)</w:t>
         </w:r>
@@ -1457,7 +1457,7 @@
       <w:r>
         <w:t xml:space="preserve">, </w:t>
       </w:r>
-      <w:hyperlink w:history="1" r:id="rIdfca3p0dha2veof5m9dooy">
+      <w:hyperlink w:history="1" r:id="rIdx7uumxe99wwjnc4l0257z">
         <w:r>
           <w:t xml:space="preserve">arXiv:2405.17581</w:t>
         </w:r>
@@ -1494,7 +1494,7 @@
       <w:r>
         <w:t xml:space="preserve">, </w:t>
       </w:r>
-      <w:hyperlink w:history="1" r:id="rIdfouythyricb7k0webivx5">
+      <w:hyperlink w:history="1" r:id="rIdgu1fmqusmhyhvdt6nrizu">
         <w:r>
           <w:t xml:space="preserve">MNRAS 513, 5766–5779 (2022)</w:t>
         </w:r>
@@ -1502,7 +1502,7 @@
       <w:r>
         <w:t xml:space="preserve">, </w:t>
       </w:r>
-      <w:hyperlink w:history="1" r:id="rIdwqcng3w_itkao4jtfeiyi">
+      <w:hyperlink w:history="1" r:id="rIduhbr2waf0yr3sof9cikt6">
         <w:r>
           <w:t xml:space="preserve">arXiv:2201.07790</w:t>
         </w:r>
@@ -1539,7 +1539,7 @@
       <w:r>
         <w:t xml:space="preserve">, </w:t>
       </w:r>
-      <w:hyperlink w:history="1" r:id="rIdrybcfkui5ejhojxpsjsmu">
+      <w:hyperlink w:history="1" r:id="rIdpxmsssnu9cvcsumgkr3uu">
         <w:r>
           <w:t xml:space="preserve">Phys. Rev. D 106, 083015 (2022)</w:t>
         </w:r>
@@ -1547,7 +1547,7 @@
       <w:r>
         <w:t xml:space="preserve">, </w:t>
       </w:r>
-      <w:hyperlink w:history="1" r:id="rId2bb0tshuwwg3lnkn-d5pe">
+      <w:hyperlink w:history="1" r:id="rId3rd-_kvbvc77xxjdlga3g">
         <w:r>
           <w:t xml:space="preserve">arXiv:2112.09817</w:t>
         </w:r>
@@ -1584,7 +1584,7 @@
       <w:r>
         <w:t xml:space="preserve">, </w:t>
       </w:r>
-      <w:hyperlink w:history="1" r:id="rId6sphuxasv0lzzvoshll-c">
+      <w:hyperlink w:history="1" r:id="rIdgcqqu17gkv6igzzcidnm3">
         <w:r>
           <w:t xml:space="preserve">ApJ 919, 95 (2021)</w:t>
         </w:r>
@@ -1592,7 +1592,7 @@
       <w:r>
         <w:t xml:space="preserve">, </w:t>
       </w:r>
-      <w:hyperlink w:history="1" r:id="rId9g1hsdw9tilpsgzgghcxy">
+      <w:hyperlink w:history="1" r:id="rIdwvev4pfl7n8n73_irq92t">
         <w:r>
           <w:t xml:space="preserve">arXiv:2106.05356</w:t>
         </w:r>
@@ -1629,7 +1629,7 @@
       <w:r>
         <w:t xml:space="preserve">, </w:t>
       </w:r>
-      <w:hyperlink w:history="1" r:id="rIdsvlnlyizqrljfuweh9ru2">
+      <w:hyperlink w:history="1" r:id="rIdxfqpv_ybnmotqejpqb5hk">
         <w:r>
           <w:t xml:space="preserve">MNRAS 501, 4092–4102 (2021)</w:t>
         </w:r>
@@ -1637,7 +1637,7 @@
       <w:r>
         <w:t xml:space="preserve">, </w:t>
       </w:r>
-      <w:hyperlink w:history="1" r:id="rIdam_77tpwjw01tq8ggqy1j">
+      <w:hyperlink w:history="1" r:id="rId4oj_gnzvbcpndtdst2lej">
         <w:r>
           <w:t xml:space="preserve">arXiv:2009.02273</w:t>
         </w:r>
@@ -1674,7 +1674,7 @@
       <w:r>
         <w:t xml:space="preserve">, </w:t>
       </w:r>
-      <w:hyperlink w:history="1" r:id="rIdstbiqbvgsga2rfz2x0f_p">
+      <w:hyperlink w:history="1" r:id="rIdxixsykssqtkpxkegjmj3o">
         <w:r>
           <w:t xml:space="preserve">MNRAS 496, 974–986 (2020)</w:t>
         </w:r>
@@ -1682,7 +1682,7 @@
       <w:r>
         <w:t xml:space="preserve">, </w:t>
       </w:r>
-      <w:hyperlink w:history="1" r:id="rIduwgtswjm04si_ftkknvf1">
+      <w:hyperlink w:history="1" r:id="rIdozup2kykh_ctn1g_bpzzz">
         <w:r>
           <w:t xml:space="preserve">arXiv:1910.14049</w:t>
         </w:r>
@@ -1719,7 +1719,7 @@
       <w:r>
         <w:t xml:space="preserve">, </w:t>
       </w:r>
-      <w:hyperlink w:history="1" r:id="rIdknsgkcxysbhkx1qvrp-w6">
+      <w:hyperlink w:history="1" r:id="rIdi-0pqii0neoda7xfyel4g">
         <w:r>
           <w:t xml:space="preserve">MNRAS 468, 1169–1182 (2017)</w:t>
         </w:r>
@@ -1727,7 +1727,7 @@
       <w:r>
         <w:t xml:space="preserve">, </w:t>
       </w:r>
-      <w:hyperlink w:history="1" r:id="rId2pwbetgas6wotm15ombmx">
+      <w:hyperlink w:history="1" r:id="rIdlyk_5xlhvmld5pd-lgdsi">
         <w:r>
           <w:t xml:space="preserve">arXiv:1612.06383</w:t>
         </w:r>
@@ -1764,7 +1764,7 @@
       <w:r>
         <w:t xml:space="preserve">, </w:t>
       </w:r>
-      <w:hyperlink w:history="1" r:id="rIdcnlhiskkcaj9jbzi70bhi">
+      <w:hyperlink w:history="1" r:id="rIdt7al1xwkgfhct6mf8outp">
         <w:r>
           <w:t xml:space="preserve">MNRAS 438, 1856–1869 (2014)</w:t>
         </w:r>
@@ -1772,7 +1772,7 @@
       <w:r>
         <w:t xml:space="preserve">, </w:t>
       </w:r>
-      <w:hyperlink w:history="1" r:id="rId1fhwskmjsore3ir-u8_uw">
+      <w:hyperlink w:history="1" r:id="rIdspztll-etlcfivfsylp9-">
         <w:r>
           <w:t xml:space="preserve">arXiv:1310.5441</w:t>
         </w:r>
@@ -1809,7 +1809,7 @@
       <w:r>
         <w:t xml:space="preserve">, </w:t>
       </w:r>
-      <w:hyperlink w:history="1" r:id="rIdmj3_fhtdilhkxcy4rgmlk">
+      <w:hyperlink w:history="1" r:id="rIds6rgzwrhg4wpxxwbhguhe">
         <w:r>
           <w:t xml:space="preserve">Phys. Rev. D 80, 084023 (2009)</w:t>
         </w:r>
@@ -1817,7 +1817,7 @@
       <w:r>
         <w:t xml:space="preserve">, </w:t>
       </w:r>
-      <w:hyperlink w:history="1" r:id="rIdochhoo-etyigd0rmgisb_">
+      <w:hyperlink w:history="1" r:id="rId1s49uqq61eebsus7fgsps">
         <w:r>
           <w:t xml:space="preserve">arXiv:1009.1250</w:t>
         </w:r>
@@ -1862,7 +1862,7 @@
       <w:r>
         <w:t xml:space="preserve">, </w:t>
       </w:r>
-      <w:hyperlink w:history="1" r:id="rId9a2ommlztj0lgdih8s0ex">
+      <w:hyperlink w:history="1" r:id="rIdzgqfmdywn_v8gy8q37twg">
         <w:r>
           <w:t xml:space="preserve">Astron. Nachr. 342, 277–282 (2021)</w:t>
         </w:r>
@@ -1870,7 +1870,7 @@
       <w:r>
         <w:t xml:space="preserve">, 9th International Workshop on Astronomy and Relativistic Astrophysics, </w:t>
       </w:r>
-      <w:hyperlink w:history="1" r:id="rIdotlipxymwgvuaybv6c2l-">
+      <w:hyperlink w:history="1" r:id="rIdxfn47ctpuntlovzhsezp8">
         <w:r>
           <w:t xml:space="preserve">arXiv:2011.13797</w:t>
         </w:r>
@@ -1907,7 +1907,7 @@
       <w:r>
         <w:t xml:space="preserve">, </w:t>
       </w:r>
-      <w:hyperlink w:history="1" r:id="rId9ac4nwclgavsshaiszjrn">
+      <w:hyperlink w:history="1" r:id="rIdtg1rvvjccs5rvb4ejsl13">
         <w:r>
           <w:t xml:space="preserve">Astron. Nachr. 342, 147–152 (2021)</w:t>
         </w:r>
@@ -1915,7 +1915,7 @@
       <w:r>
         <w:t xml:space="preserve">, 9th International Workshop on Astronomy and Relativistic Astrophysics, </w:t>
       </w:r>
-      <w:hyperlink w:history="1" r:id="rId9ve9zxygwjdzby9defsai">
+      <w:hyperlink w:history="1" r:id="rIdrel4q6do4da20d2vkeod7">
         <w:r>
           <w:t xml:space="preserve">arXiv:2011.13805</w:t>
         </w:r>
@@ -1952,7 +1952,7 @@
       <w:r>
         <w:t xml:space="preserve">, </w:t>
       </w:r>
-      <w:hyperlink w:history="1" r:id="rIdk4yhciltvufvwdzna8hyy">
+      <w:hyperlink w:history="1" r:id="rId9o3glicvisyeixaupy4ta">
         <w:r>
           <w:t xml:space="preserve">PoS(SWIFT 10) 233, 159 (2014)</w:t>
         </w:r>
@@ -1960,7 +1960,7 @@
       <w:r>
         <w:t xml:space="preserve">, </w:t>
       </w:r>
-      <w:hyperlink w:history="1" r:id="rIdcw-tosiawygirxzwpjwle">
+      <w:hyperlink w:history="1" r:id="rId0c6kexkp3kcncae_e0xah">
         <w:r>
           <w:t xml:space="preserve">arXiv:1502.07882</w:t>
         </w:r>
@@ -1997,7 +1997,7 @@
       <w:r>
         <w:t xml:space="preserve">, </w:t>
       </w:r>
-      <w:hyperlink w:history="1" r:id="rIdu-yzh5tufd4hcr3xjllvg">
+      <w:hyperlink w:history="1" r:id="rIdur1mjjgp3wlxizr4n3er5">
         <w:r>
           <w:t xml:space="preserve">EPJ Web Conf. 61, 02007 (2013)</w:t>
         </w:r>
@@ -2005,7 +2005,7 @@
       <w:r>
         <w:t xml:space="preserve">, </w:t>
       </w:r>
-      <w:hyperlink w:history="1" r:id="rIdpytunmarwqbtzp3gkr21z">
+      <w:hyperlink w:history="1" r:id="rIdegj9seyzk66tuxif5on7e">
         <w:r>
           <w:t xml:space="preserve">arXiv:1309.4612</w:t>
         </w:r>
@@ -2042,7 +2042,7 @@
       <w:r>
         <w:t xml:space="preserve">, </w:t>
       </w:r>
-      <w:hyperlink w:history="1" r:id="rIdwznygcpnp0wveepks7vjq">
+      <w:hyperlink w:history="1" r:id="rIdjtqph71mv575sqjp_joo_">
         <w:r>
           <w:t xml:space="preserve">J. Phys.: Conf. Ser. 454, 012001 (2013)</w:t>
         </w:r>
@@ -2050,7 +2050,7 @@
       <w:r>
         <w:t xml:space="preserve">, </w:t>
       </w:r>
-      <w:hyperlink w:history="1" r:id="rIddhosu6xzm9jn_fpwuxmpr">
+      <w:hyperlink w:history="1" r:id="rIdp2bsfbhi1oqpzpozlwx4i">
         <w:r>
           <w:t xml:space="preserve">arXiv:1211.1794</w:t>
         </w:r>
@@ -2453,7 +2453,7 @@
       <w:r>
         <w:tab/>
       </w:r>
-      <w:hyperlink w:history="1" r:id="rIdi8_vqjar9p2hzfs6cwgcd">
+      <w:hyperlink w:history="1" r:id="rIdqwhjkibiqqzqt3zm_tf-t">
         <w:r>
           <w:t xml:space="preserve">github.com/altjerue/ilwikak-ml</w:t>
         </w:r>
@@ -2466,7 +2466,7 @@
           <w:ilvl w:val="0"/>
           <w:numId w:val="2"/>
         </w:numPr>
-        <w:spacing w:after="20"/>
+        <w:spacing w:after="10"/>
       </w:pPr>
       <w:r>
         <w:t xml:space="preserve">Applying classical ML and Bayesian inference to the Fermi-LAT 4LAC-DR3 catalog (3,407 sources) to recover physical jet parameters from multi-wavelength data.</w:t>
@@ -2479,7 +2479,7 @@
           <w:ilvl w:val="0"/>
           <w:numId w:val="2"/>
         </w:numPr>
-        <w:spacing w:after="20"/>
+        <w:spacing w:after="10"/>
       </w:pPr>
       <w:r>
         <w:t xml:space="preserve">Building a neural network that maps physical jet parameters to observable spectral energy distributions accurately enough to compare with Tleco results.</w:t>
@@ -2492,7 +2492,7 @@
           <w:ilvl w:val="0"/>
           <w:numId w:val="2"/>
         </w:numPr>
-        <w:spacing w:after="20"/>
+        <w:spacing w:after="10"/>
       </w:pPr>
       <w:r>
         <w:t xml:space="preserve">Forecasting blazar gamma-ray flares with a time-series foundation model fine-tuned on Tleco-generated synthetic light curves.</w:t>
@@ -2544,7 +2544,7 @@
       <w:r>
         <w:tab/>
       </w:r>
-      <w:hyperlink w:history="1" r:id="rIdumwe7usu-9qraufextybp">
+      <w:hyperlink w:history="1" r:id="rId6si3vptxyeexmenabcmfm">
         <w:r>
           <w:t xml:space="preserve">github.com/UW-ForestMycobiomeLab/WindSporesHills</w:t>
         </w:r>
@@ -2557,7 +2557,7 @@
           <w:ilvl w:val="0"/>
           <w:numId w:val="2"/>
         </w:numPr>
-        <w:spacing w:after="20"/>
+        <w:spacing w:after="10"/>
       </w:pPr>
       <w:r>
         <w:t xml:space="preserve">Simulates particle dispersion, atmospheric turbulence, and flow over hilly terrain with forest canopy, based on analytical models (Massman &amp; Weil 1999; Finnigan &amp; Belcher 2004); designed to scale to tens of thousands of particles over kilometer-scale domains.</w:t>
@@ -2609,7 +2609,7 @@
       <w:r>
         <w:tab/>
       </w:r>
-      <w:hyperlink w:history="1" r:id="rId3uoef_pgppadndzi-uh0j">
+      <w:hyperlink w:history="1" r:id="rIdl45cbqd-eblv_ad8zoi7s">
         <w:r>
           <w:t xml:space="preserve">github.com/zkdavis/Tleco</w:t>
         </w:r>
@@ -2622,7 +2622,7 @@
           <w:ilvl w:val="0"/>
           <w:numId w:val="2"/>
         </w:numPr>
-        <w:spacing w:after="20"/>
+        <w:spacing w:after="10"/>
       </w:pPr>
       <w:r>
         <w:t xml:space="preserve">Numerical PDE solvers, particle-distribution algorithms, and spectral calculations for relativistic plasmas; successor to Paramo [9].</w:t>
@@ -2674,7 +2674,7 @@
       <w:r>
         <w:tab/>
       </w:r>
-      <w:hyperlink w:history="1" r:id="rId67ja-htcngj4xxwqt3cor">
+      <w:hyperlink w:history="1" r:id="rIdeztwyt0o4jorhecqx1z9w">
         <w:r>
           <w:t xml:space="preserve">github.com/altjerue/paramo</w:t>
         </w:r>
@@ -2687,10 +2687,10 @@
           <w:ilvl w:val="0"/>
           <w:numId w:val="2"/>
         </w:numPr>
-        <w:spacing w:after="20"/>
-      </w:pPr>
-      <w:r>
-        <w:t xml:space="preserve">Fokker–Planck and radiative-transfer solver for relativistic particle distributions; 20× OpenMP speedup on 10 cores; used by other groups, including Combi &amp; Siegel (2023).</w:t>
+        <w:spacing w:after="10"/>
+      </w:pPr>
+      <w:r>
+        <w:t xml:space="preserve">Fokker–Planck and radiative-transfer solver for relativistic particle distributions; about 20× faster than the original serial code on 5 cores after OpenMP parallelization and optimization; used by other groups, including Combi &amp; Siegel (2023).</w:t>
       </w:r>
     </w:p>
     <w:p>
@@ -2744,7 +2744,7 @@
           <w:ilvl w:val="0"/>
           <w:numId w:val="2"/>
         </w:numPr>
-        <w:spacing w:after="20"/>
+        <w:spacing w:after="10"/>
       </w:pPr>
       <w:r>
         <w:t xml:space="preserve">Led a 7-person upgrade of this production C code for HPC environments, adding black-hole spin with under 5% runtime overhead.</w:t>
@@ -3285,7 +3285,7 @@
       <w:r>
         <w:t xml:space="preserve">Video: </w:t>
       </w:r>
-      <w:hyperlink w:history="1" r:id="rIdttsys1kofxj8wutooac2z">
+      <w:hyperlink w:history="1" r:id="rIdaosmzzciua-ssi6ch0mmj">
         <w:r>
           <w:t xml:space="preserve">youtube.com/watch?v=BAZNWLNT69M</w:t>
         </w:r>
@@ -3456,7 +3456,7 @@
       <w:r>
         <w:t xml:space="preserve">Marcos Moshinsky Award for Best Poster. Video: </w:t>
       </w:r>
-      <w:hyperlink w:history="1" r:id="rIdczosveril-3mdrspsl8or">
+      <w:hyperlink w:history="1" r:id="rIddtcbmnb-59r9qi8vz_y7s">
         <w:r>
           <w:t xml:space="preserve">youtube.com/watch?v=0TJiKg7kOPI</w:t>
         </w:r>
@@ -4384,7 +4384,7 @@
       <w:r>
         <w:tab/>
       </w:r>
-      <w:hyperlink w:history="1" r:id="rIdxlymntdf88ekmoexd9fd7">
+      <w:hyperlink w:history="1" r:id="rIds9rh-icm069urnnwsbcjo">
         <w:r>
           <w:t xml:space="preserve">Kaggle</w:t>
         </w:r>
@@ -4518,7 +4518,7 @@
       <w:r>
         <w:tab/>
       </w:r>
-      <w:hyperlink w:history="1" r:id="rIdfdlreixtvufucno3nvjg1">
+      <w:hyperlink w:history="1" r:id="rIdcc_y7uy2qhb3djg3xqpku">
         <w:r>
           <w:t xml:space="preserve">Udemy</w:t>
         </w:r>
@@ -4564,7 +4564,7 @@
       <w:r>
         <w:tab/>
       </w:r>
-      <w:hyperlink w:history="1" r:id="rIdlh0dpnb7ghtjx1ad2_7eg">
+      <w:hyperlink w:history="1" r:id="rIddzrdwja-1bmkrolgnx9ew">
         <w:r>
           <w:t xml:space="preserve">Udemy</w:t>
         </w:r>
@@ -4748,7 +4748,7 @@
       <w:pPr>
         <w:spacing w:after="0"/>
       </w:pPr>
-      <w:hyperlink w:history="1" r:id="rIdy47_a8mzp-ubo7ngdeiuj">
+      <w:hyperlink w:history="1" r:id="rIdequucsdocwcxxl5j5y7mk">
         <w:r>
           <w:t xml:space="preserve">mexiciencia.github.io/post/anita</w:t>
         </w:r>
@@ -4808,7 +4808,7 @@
       <w:pPr>
         <w:spacing w:after="0"/>
       </w:pPr>
-      <w:hyperlink w:history="1" r:id="rIdqptrmjdwpw7ytxmsj-bmb">
+      <w:hyperlink w:history="1" r:id="rId4vkzpc_9fhy9ynsnvbrb1">
         <w:r>
           <w:t xml:space="preserve">mexiciencia.github.io/post/modelo-sir</w:t>
         </w:r>
@@ -4871,7 +4871,7 @@
       <w:r>
         <w:t xml:space="preserve">Data analysis and modeling collaborator. </w:t>
       </w:r>
-      <w:hyperlink w:history="1" r:id="rIdqwoowei5idnmlmn4hyxsw">
+      <w:hyperlink w:history="1" r:id="rIdzzbqe4w3z7cjub-_yrj7q">
         <w:r>
           <w:t xml:space="preserve">mexiciencia.github.io/post/covid19</w:t>
         </w:r>
@@ -5411,7 +5411,11 @@
         <w:szCs w:val="20"/>
       </w:rPr>
     </w:rPrDefault>
-    <w:pPrDefault/>
+    <w:pPrDefault>
+      <w:pPr>
+        <w:spacing w:line="230"/>
+      </w:pPr>
+    </w:pPrDefault>
   </w:docDefaults>
   <w:style w:type="paragraph" w:styleId="Normal" w:default="1">
     <w:name w:val="Normal"/>

</xml_diff>

<commit_message>
Updating resume and CV for computational scientist
</commit_message>
<xml_diff>
--- a/RuedaBecerrilJM-CV-plain.docx
+++ b/RuedaBecerrilJM-CV-plain.docx
@@ -28,7 +28,7 @@
       <w:r>
         <w:t xml:space="preserve">  |  </w:t>
       </w:r>
-      <w:hyperlink w:history="1" r:id="rIdnwovtjsz3hg94fphr8uti">
+      <w:hyperlink w:history="1" r:id="rIdtkrpb574skyuasz5hmzg2">
         <w:r>
           <w:t xml:space="preserve">jm.ruebe@gmail.com</w:t>
         </w:r>
@@ -42,7 +42,7 @@
       <w:r>
         <w:t xml:space="preserve">  |  </w:t>
       </w:r>
-      <w:hyperlink w:history="1" r:id="rIdu0soufttixg4t_qi7svcq">
+      <w:hyperlink w:history="1" r:id="rIdctkdrffjfa0mfg1cpwevw">
         <w:r>
           <w:t xml:space="preserve">linkedin.com/in/jeruebe</w:t>
         </w:r>
@@ -53,7 +53,7 @@
         <w:spacing w:after="60"/>
         <w:jc w:val="center"/>
       </w:pPr>
-      <w:hyperlink w:history="1" r:id="rIddyxx6qvv86cjzvfzw2ait">
+      <w:hyperlink w:history="1" r:id="rIdodsbmgicxdlvyrgxfbmjl">
         <w:r>
           <w:t xml:space="preserve">altjerue.github.io</w:t>
         </w:r>
@@ -61,7 +61,7 @@
       <w:r>
         <w:t xml:space="preserve">  |  </w:t>
       </w:r>
-      <w:hyperlink w:history="1" r:id="rIdolvnxeagit_go79vcw5tb">
+      <w:hyperlink w:history="1" r:id="rIdekirxli4r1gp4i-tx0qtn">
         <w:r>
           <w:t xml:space="preserve">github.com/altjerue</w:t>
         </w:r>
@@ -69,7 +69,7 @@
       <w:r>
         <w:t xml:space="preserve">  |  </w:t>
       </w:r>
-      <w:hyperlink w:history="1" r:id="rIdg_ujlrcxmfsmghrl6mu35">
+      <w:hyperlink w:history="1" r:id="rId-sqcusyegfs-plawud1wm">
         <w:r>
           <w:t xml:space="preserve">orcid.org/0000-0003-1988-1912</w:t>
         </w:r>
@@ -77,7 +77,7 @@
       <w:r>
         <w:t xml:space="preserve">  |  </w:t>
       </w:r>
-      <w:hyperlink w:history="1" r:id="rIdwudy0rlp4qihaymwmy-mg">
+      <w:hyperlink w:history="1" r:id="rIdn5_qxtkam1rtwuv5cb91-">
         <w:r>
           <w:t xml:space="preserve">Google Scholar</w:t>
         </w:r>
@@ -93,7 +93,7 @@
     </w:p>
     <w:p>
       <w:r>
-        <w:t xml:space="preserve">Computational physicist who turns complex physical models into fast, tested software and turns large scientific datasets into calibrated models. Ph.D. in Physics and ten years building simulation codes and the data pipelines around them: author of Paramo, an open-source Fortran/OpenMP radiative-transfer library used by other research groups; led a 7-person upgrade of the PatchworkMHD black-hole simulation code on the Frontera supercomputer; mapped wetland probability across a 2,160 km² watershed with random-forest models. Nine peer-reviewed articles and Co-I on a funded NASA Fermi Guest Investigator grant.</w:t>
+        <w:t xml:space="preserve">Computational physicist with a PhD in Physics and ten years of experience building and running simulation codes for relativistic plasmas. Author of Paramo, an open-source Fortran library that solves the Fokker-Planck equation coupled to radiative transfer. Led an upgrade of the PatchworkMHD code on Frontera and used gradient-based optimization to calibrate model parameters against observations. Nine publications, three as first author, and Co-I on a funded NASA Fermi grant.</w:t>
       </w:r>
     </w:p>
     <w:p>
@@ -113,25 +113,40 @@
           <w:b/>
           <w:bCs/>
         </w:rPr>
+        <w:t xml:space="preserve">Simulation: </w:t>
+      </w:r>
+      <w:r>
+        <w:t xml:space="preserve">Kinetic plasma modeling (Fokker–Planck), radiative processes (synchrotron, inverse Compton), radiative transfer, relativistic MHD, Lagrangian particle dynamics, numerical PDEs (advection–diffusion, Fokker–Planck), finite-difference/finite-volume methods, numerical linear algebra, parameter estimation, uncertainty quantification, synthetic dataset generation</w:t>
+      </w:r>
+    </w:p>
+    <w:p>
+      <w:pPr>
+        <w:spacing w:after="20"/>
+      </w:pPr>
+      <w:r>
+        <w:rPr>
+          <w:b/>
+          <w:bCs/>
+        </w:rPr>
+        <w:t xml:space="preserve">HPC &amp; Parallel: </w:t>
+      </w:r>
+      <w:r>
+        <w:t xml:space="preserve">OpenMP, MPI, OpenACC, SLURM, PBS, HDF5</w:t>
+      </w:r>
+    </w:p>
+    <w:p>
+      <w:pPr>
+        <w:spacing w:after="20"/>
+      </w:pPr>
+      <w:r>
+        <w:rPr>
+          <w:b/>
+          <w:bCs/>
+        </w:rPr>
         <w:t xml:space="preserve">ML &amp; Data: </w:t>
       </w:r>
       <w:r>
-        <w:t xml:space="preserve">Scientific ML, PyTorch, TensorFlow, scikit-learn, NumPy, SciPy, Pandas, Astropy, random forest, SVM, neural networks, gradient-based optimization, parameter estimation, uncertainty quantification, synthetic dataset generation</w:t>
-      </w:r>
-    </w:p>
-    <w:p>
-      <w:pPr>
-        <w:spacing w:after="20"/>
-      </w:pPr>
-      <w:r>
-        <w:rPr>
-          <w:b/>
-          <w:bCs/>
-        </w:rPr>
-        <w:t xml:space="preserve">Scientific Computing &amp; HPC: </w:t>
-      </w:r>
-      <w:r>
-        <w:t xml:space="preserve">Numerical PDEs (Fokker–Planck, advection–diffusion), radiative transfer, relativistic MHD, Lagrangian particle dynamics, finite-difference/finite-volume methods, numerical linear algebra, OpenMP, MPI, OpenACC, SLURM, PBS, HDF5</w:t>
+        <w:t xml:space="preserve">Scientific ML, PyTorch, TensorFlow, scikit-learn, NumPy, SciPy, Pandas, Astropy, random forest, SVM, neural networks, gradient-based optimization, parameter estimation</w:t>
       </w:r>
     </w:p>
     <w:p>
@@ -1152,7 +1167,7 @@
       <w:r>
         <w:t xml:space="preserve">Thesis: </w:t>
       </w:r>
-      <w:hyperlink w:history="1" r:id="rIdfqo6wdjbtooprl7p6cmrq">
+      <w:hyperlink w:history="1" r:id="rId6_qrozk7ffywbwnwknwxu">
         <w:r>
           <w:t xml:space="preserve">Numerical treatment of radiation processes in the internal shocks of magnetized relativistic outflows</w:t>
         </w:r>
@@ -1449,7 +1464,7 @@
       <w:r>
         <w:t xml:space="preserve">, </w:t>
       </w:r>
-      <w:hyperlink w:history="1" r:id="rIdakhfnkghftij9klxa2qix">
+      <w:hyperlink w:history="1" r:id="rId1f0gwqbf8ncw64m5fnxlw">
         <w:r>
           <w:t xml:space="preserve">ApJ 976, 182 (2024)</w:t>
         </w:r>
@@ -1457,7 +1472,7 @@
       <w:r>
         <w:t xml:space="preserve">, </w:t>
       </w:r>
-      <w:hyperlink w:history="1" r:id="rIdx7uumxe99wwjnc4l0257z">
+      <w:hyperlink w:history="1" r:id="rIdujindsl0utumszjfwdivu">
         <w:r>
           <w:t xml:space="preserve">arXiv:2405.17581</w:t>
         </w:r>
@@ -1494,7 +1509,7 @@
       <w:r>
         <w:t xml:space="preserve">, </w:t>
       </w:r>
-      <w:hyperlink w:history="1" r:id="rIdgu1fmqusmhyhvdt6nrizu">
+      <w:hyperlink w:history="1" r:id="rIdhx17i01ybysq8uyw-oj6w">
         <w:r>
           <w:t xml:space="preserve">MNRAS 513, 5766–5779 (2022)</w:t>
         </w:r>
@@ -1502,7 +1517,7 @@
       <w:r>
         <w:t xml:space="preserve">, </w:t>
       </w:r>
-      <w:hyperlink w:history="1" r:id="rIduhbr2waf0yr3sof9cikt6">
+      <w:hyperlink w:history="1" r:id="rId3ochbwkj8mtaahbxxditq">
         <w:r>
           <w:t xml:space="preserve">arXiv:2201.07790</w:t>
         </w:r>
@@ -1539,7 +1554,7 @@
       <w:r>
         <w:t xml:space="preserve">, </w:t>
       </w:r>
-      <w:hyperlink w:history="1" r:id="rIdpxmsssnu9cvcsumgkr3uu">
+      <w:hyperlink w:history="1" r:id="rIdutshpjmauksnrx8oidyp2">
         <w:r>
           <w:t xml:space="preserve">Phys. Rev. D 106, 083015 (2022)</w:t>
         </w:r>
@@ -1547,7 +1562,7 @@
       <w:r>
         <w:t xml:space="preserve">, </w:t>
       </w:r>
-      <w:hyperlink w:history="1" r:id="rId3rd-_kvbvc77xxjdlga3g">
+      <w:hyperlink w:history="1" r:id="rIdomjlarvpoktdouvs8qhtm">
         <w:r>
           <w:t xml:space="preserve">arXiv:2112.09817</w:t>
         </w:r>
@@ -1584,7 +1599,7 @@
       <w:r>
         <w:t xml:space="preserve">, </w:t>
       </w:r>
-      <w:hyperlink w:history="1" r:id="rIdgcqqu17gkv6igzzcidnm3">
+      <w:hyperlink w:history="1" r:id="rIdr13evfqcoupkj3uwq1lyl">
         <w:r>
           <w:t xml:space="preserve">ApJ 919, 95 (2021)</w:t>
         </w:r>
@@ -1592,7 +1607,7 @@
       <w:r>
         <w:t xml:space="preserve">, </w:t>
       </w:r>
-      <w:hyperlink w:history="1" r:id="rIdwvev4pfl7n8n73_irq92t">
+      <w:hyperlink w:history="1" r:id="rIdxs-hrtfpe01c3godenvkr">
         <w:r>
           <w:t xml:space="preserve">arXiv:2106.05356</w:t>
         </w:r>
@@ -1629,7 +1644,7 @@
       <w:r>
         <w:t xml:space="preserve">, </w:t>
       </w:r>
-      <w:hyperlink w:history="1" r:id="rIdxfqpv_ybnmotqejpqb5hk">
+      <w:hyperlink w:history="1" r:id="rId95a4hbpnmpl5gawts9nou">
         <w:r>
           <w:t xml:space="preserve">MNRAS 501, 4092–4102 (2021)</w:t>
         </w:r>
@@ -1637,7 +1652,7 @@
       <w:r>
         <w:t xml:space="preserve">, </w:t>
       </w:r>
-      <w:hyperlink w:history="1" r:id="rId4oj_gnzvbcpndtdst2lej">
+      <w:hyperlink w:history="1" r:id="rId5uro4rb9fhxs0sdaxpdck">
         <w:r>
           <w:t xml:space="preserve">arXiv:2009.02273</w:t>
         </w:r>
@@ -1674,7 +1689,7 @@
       <w:r>
         <w:t xml:space="preserve">, </w:t>
       </w:r>
-      <w:hyperlink w:history="1" r:id="rIdxixsykssqtkpxkegjmj3o">
+      <w:hyperlink w:history="1" r:id="rIdbmr6nuz0vbebynyuctibx">
         <w:r>
           <w:t xml:space="preserve">MNRAS 496, 974–986 (2020)</w:t>
         </w:r>
@@ -1682,7 +1697,7 @@
       <w:r>
         <w:t xml:space="preserve">, </w:t>
       </w:r>
-      <w:hyperlink w:history="1" r:id="rIdozup2kykh_ctn1g_bpzzz">
+      <w:hyperlink w:history="1" r:id="rIdclnlmn7rcwr8tlcxl1hwv">
         <w:r>
           <w:t xml:space="preserve">arXiv:1910.14049</w:t>
         </w:r>
@@ -1719,7 +1734,7 @@
       <w:r>
         <w:t xml:space="preserve">, </w:t>
       </w:r>
-      <w:hyperlink w:history="1" r:id="rIdi-0pqii0neoda7xfyel4g">
+      <w:hyperlink w:history="1" r:id="rIdizjcbfefhnk77ccomv9tv">
         <w:r>
           <w:t xml:space="preserve">MNRAS 468, 1169–1182 (2017)</w:t>
         </w:r>
@@ -1727,7 +1742,7 @@
       <w:r>
         <w:t xml:space="preserve">, </w:t>
       </w:r>
-      <w:hyperlink w:history="1" r:id="rIdlyk_5xlhvmld5pd-lgdsi">
+      <w:hyperlink w:history="1" r:id="rId4ewvz2v0dsut4fh06lnvn">
         <w:r>
           <w:t xml:space="preserve">arXiv:1612.06383</w:t>
         </w:r>
@@ -1764,7 +1779,7 @@
       <w:r>
         <w:t xml:space="preserve">, </w:t>
       </w:r>
-      <w:hyperlink w:history="1" r:id="rIdt7al1xwkgfhct6mf8outp">
+      <w:hyperlink w:history="1" r:id="rIdbjs6ueh1cetares6vby54">
         <w:r>
           <w:t xml:space="preserve">MNRAS 438, 1856–1869 (2014)</w:t>
         </w:r>
@@ -1772,7 +1787,7 @@
       <w:r>
         <w:t xml:space="preserve">, </w:t>
       </w:r>
-      <w:hyperlink w:history="1" r:id="rIdspztll-etlcfivfsylp9-">
+      <w:hyperlink w:history="1" r:id="rIdvexq9ssthlvq6e_mln6ks">
         <w:r>
           <w:t xml:space="preserve">arXiv:1310.5441</w:t>
         </w:r>
@@ -1809,7 +1824,7 @@
       <w:r>
         <w:t xml:space="preserve">, </w:t>
       </w:r>
-      <w:hyperlink w:history="1" r:id="rIds6rgzwrhg4wpxxwbhguhe">
+      <w:hyperlink w:history="1" r:id="rIdl_l0waozftjklzpl3_qr6">
         <w:r>
           <w:t xml:space="preserve">Phys. Rev. D 80, 084023 (2009)</w:t>
         </w:r>
@@ -1817,7 +1832,7 @@
       <w:r>
         <w:t xml:space="preserve">, </w:t>
       </w:r>
-      <w:hyperlink w:history="1" r:id="rId1s49uqq61eebsus7fgsps">
+      <w:hyperlink w:history="1" r:id="rIdpfyrzypvmnj9hu2hh86cq">
         <w:r>
           <w:t xml:space="preserve">arXiv:1009.1250</w:t>
         </w:r>
@@ -1862,7 +1877,7 @@
       <w:r>
         <w:t xml:space="preserve">, </w:t>
       </w:r>
-      <w:hyperlink w:history="1" r:id="rIdzgqfmdywn_v8gy8q37twg">
+      <w:hyperlink w:history="1" r:id="rIdstj8gzitm_wqjccfzl6ss">
         <w:r>
           <w:t xml:space="preserve">Astron. Nachr. 342, 277–282 (2021)</w:t>
         </w:r>
@@ -1870,7 +1885,7 @@
       <w:r>
         <w:t xml:space="preserve">, 9th International Workshop on Astronomy and Relativistic Astrophysics, </w:t>
       </w:r>
-      <w:hyperlink w:history="1" r:id="rIdxfn47ctpuntlovzhsezp8">
+      <w:hyperlink w:history="1" r:id="rId09kdckplaqlm3ve4dbe3g">
         <w:r>
           <w:t xml:space="preserve">arXiv:2011.13797</w:t>
         </w:r>
@@ -1907,7 +1922,7 @@
       <w:r>
         <w:t xml:space="preserve">, </w:t>
       </w:r>
-      <w:hyperlink w:history="1" r:id="rIdtg1rvvjccs5rvb4ejsl13">
+      <w:hyperlink w:history="1" r:id="rIdjedf06z4elcvgz9lrmjw6">
         <w:r>
           <w:t xml:space="preserve">Astron. Nachr. 342, 147–152 (2021)</w:t>
         </w:r>
@@ -1915,7 +1930,7 @@
       <w:r>
         <w:t xml:space="preserve">, 9th International Workshop on Astronomy and Relativistic Astrophysics, </w:t>
       </w:r>
-      <w:hyperlink w:history="1" r:id="rIdrel4q6do4da20d2vkeod7">
+      <w:hyperlink w:history="1" r:id="rIdwyrkqc9afdfcqowubxnij">
         <w:r>
           <w:t xml:space="preserve">arXiv:2011.13805</w:t>
         </w:r>
@@ -1952,7 +1967,7 @@
       <w:r>
         <w:t xml:space="preserve">, </w:t>
       </w:r>
-      <w:hyperlink w:history="1" r:id="rId9o3glicvisyeixaupy4ta">
+      <w:hyperlink w:history="1" r:id="rIdocoueomwah1f6drqtbbza">
         <w:r>
           <w:t xml:space="preserve">PoS(SWIFT 10) 233, 159 (2014)</w:t>
         </w:r>
@@ -1960,7 +1975,7 @@
       <w:r>
         <w:t xml:space="preserve">, </w:t>
       </w:r>
-      <w:hyperlink w:history="1" r:id="rId0c6kexkp3kcncae_e0xah">
+      <w:hyperlink w:history="1" r:id="rIdg790udgknma_dwt5ua-1y">
         <w:r>
           <w:t xml:space="preserve">arXiv:1502.07882</w:t>
         </w:r>
@@ -1997,7 +2012,7 @@
       <w:r>
         <w:t xml:space="preserve">, </w:t>
       </w:r>
-      <w:hyperlink w:history="1" r:id="rIdur1mjjgp3wlxizr4n3er5">
+      <w:hyperlink w:history="1" r:id="rId1c3wbdbjhlbv9qpjaambw">
         <w:r>
           <w:t xml:space="preserve">EPJ Web Conf. 61, 02007 (2013)</w:t>
         </w:r>
@@ -2005,7 +2020,7 @@
       <w:r>
         <w:t xml:space="preserve">, </w:t>
       </w:r>
-      <w:hyperlink w:history="1" r:id="rIdegj9seyzk66tuxif5on7e">
+      <w:hyperlink w:history="1" r:id="rIdk2czthodmobe7ko2dbsdd">
         <w:r>
           <w:t xml:space="preserve">arXiv:1309.4612</w:t>
         </w:r>
@@ -2042,7 +2057,7 @@
       <w:r>
         <w:t xml:space="preserve">, </w:t>
       </w:r>
-      <w:hyperlink w:history="1" r:id="rIdjtqph71mv575sqjp_joo_">
+      <w:hyperlink w:history="1" r:id="rIdasx22i3d0u47iepqm8mwv">
         <w:r>
           <w:t xml:space="preserve">J. Phys.: Conf. Ser. 454, 012001 (2013)</w:t>
         </w:r>
@@ -2050,7 +2065,7 @@
       <w:r>
         <w:t xml:space="preserve">, </w:t>
       </w:r>
-      <w:hyperlink w:history="1" r:id="rIdp2bsfbhi1oqpzpozlwx4i">
+      <w:hyperlink w:history="1" r:id="rId560qxdvwtqxuv8qjypka_">
         <w:r>
           <w:t xml:space="preserve">arXiv:1211.1794</w:t>
         </w:r>
@@ -2453,7 +2468,7 @@
       <w:r>
         <w:tab/>
       </w:r>
-      <w:hyperlink w:history="1" r:id="rIdqwhjkibiqqzqt3zm_tf-t">
+      <w:hyperlink w:history="1" r:id="rIdha2mg8sulla3iefktmkg6">
         <w:r>
           <w:t xml:space="preserve">github.com/altjerue/ilwikak-ml</w:t>
         </w:r>
@@ -2544,7 +2559,7 @@
       <w:r>
         <w:tab/>
       </w:r>
-      <w:hyperlink w:history="1" r:id="rId6si3vptxyeexmenabcmfm">
+      <w:hyperlink w:history="1" r:id="rIdo2zo50tc3mi7wu76ovosi">
         <w:r>
           <w:t xml:space="preserve">github.com/UW-ForestMycobiomeLab/WindSporesHills</w:t>
         </w:r>
@@ -2609,7 +2624,7 @@
       <w:r>
         <w:tab/>
       </w:r>
-      <w:hyperlink w:history="1" r:id="rIdl45cbqd-eblv_ad8zoi7s">
+      <w:hyperlink w:history="1" r:id="rIdqdj1xbha8mkmj1hxjgqen">
         <w:r>
           <w:t xml:space="preserve">github.com/zkdavis/Tleco</w:t>
         </w:r>
@@ -2674,7 +2689,7 @@
       <w:r>
         <w:tab/>
       </w:r>
-      <w:hyperlink w:history="1" r:id="rIdeztwyt0o4jorhecqx1z9w">
+      <w:hyperlink w:history="1" r:id="rIdzp4pu7nx0hvut7jcynvbi">
         <w:r>
           <w:t xml:space="preserve">github.com/altjerue/paramo</w:t>
         </w:r>
@@ -3285,7 +3300,7 @@
       <w:r>
         <w:t xml:space="preserve">Video: </w:t>
       </w:r>
-      <w:hyperlink w:history="1" r:id="rIdaosmzzciua-ssi6ch0mmj">
+      <w:hyperlink w:history="1" r:id="rIdr9o9vrbjmjeccllwi0phk">
         <w:r>
           <w:t xml:space="preserve">youtube.com/watch?v=BAZNWLNT69M</w:t>
         </w:r>
@@ -3456,7 +3471,7 @@
       <w:r>
         <w:t xml:space="preserve">Marcos Moshinsky Award for Best Poster. Video: </w:t>
       </w:r>
-      <w:hyperlink w:history="1" r:id="rIddtcbmnb-59r9qi8vz_y7s">
+      <w:hyperlink w:history="1" r:id="rIdhic8jt6nvl5pulcgnbjub">
         <w:r>
           <w:t xml:space="preserve">youtube.com/watch?v=0TJiKg7kOPI</w:t>
         </w:r>
@@ -4363,240 +4378,6 @@
         <w:pStyle w:val="Heading1"/>
       </w:pPr>
       <w:r>
-        <w:t xml:space="preserve">Certifications</w:t>
-      </w:r>
-    </w:p>
-    <w:p>
-      <w:pPr>
-        <w:keepNext/>
-        <w:tabs>
-          <w:tab w:val="right" w:pos="10512"/>
-        </w:tabs>
-        <w:spacing w:after="0"/>
-      </w:pPr>
-      <w:r>
-        <w:rPr>
-          <w:b/>
-          <w:bCs/>
-        </w:rPr>
-        <w:t xml:space="preserve">Gen AI Intensive</w:t>
-      </w:r>
-      <w:r>
-        <w:tab/>
-      </w:r>
-      <w:hyperlink w:history="1" r:id="rIds9rh-icm069urnnwsbcjo">
-        <w:r>
-          <w:t xml:space="preserve">Kaggle</w:t>
-        </w:r>
-      </w:hyperlink>
-    </w:p>
-    <w:p>
-      <w:pPr>
-        <w:keepNext/>
-        <w:tabs>
-          <w:tab w:val="right" w:pos="10512"/>
-        </w:tabs>
-        <w:spacing w:after="0"/>
-      </w:pPr>
-      <w:r>
-        <w:rPr>
-          <w:i/>
-          <w:iCs/>
-        </w:rPr>
-        <w:t xml:space="preserve">Generative AI</w:t>
-      </w:r>
-    </w:p>
-    <w:p>
-      <w:pPr>
-        <w:pStyle w:val="EntryGap"/>
-        <w:spacing w:after="0"/>
-      </w:pPr>
-    </w:p>
-    <w:p>
-      <w:pPr>
-        <w:keepNext/>
-        <w:tabs>
-          <w:tab w:val="right" w:pos="10512"/>
-        </w:tabs>
-        <w:spacing w:after="0"/>
-      </w:pPr>
-      <w:r>
-        <w:rPr>
-          <w:b/>
-          <w:bCs/>
-        </w:rPr>
-        <w:t xml:space="preserve">Data Scientist Professional with Python</w:t>
-      </w:r>
-      <w:r>
-        <w:tab/>
-      </w:r>
-      <w:r>
-        <w:t xml:space="preserve">DataCamp</w:t>
-      </w:r>
-    </w:p>
-    <w:p>
-      <w:pPr>
-        <w:keepNext/>
-        <w:tabs>
-          <w:tab w:val="right" w:pos="10512"/>
-        </w:tabs>
-        <w:spacing w:after="0"/>
-      </w:pPr>
-      <w:r>
-        <w:rPr>
-          <w:i/>
-          <w:iCs/>
-        </w:rPr>
-        <w:t xml:space="preserve">Python programming, data science, data communication, machine learning</w:t>
-      </w:r>
-    </w:p>
-    <w:p>
-      <w:pPr>
-        <w:pStyle w:val="EntryGap"/>
-        <w:spacing w:after="0"/>
-      </w:pPr>
-    </w:p>
-    <w:p>
-      <w:pPr>
-        <w:keepNext/>
-        <w:tabs>
-          <w:tab w:val="right" w:pos="10512"/>
-        </w:tabs>
-        <w:spacing w:after="0"/>
-      </w:pPr>
-      <w:r>
-        <w:rPr>
-          <w:b/>
-          <w:bCs/>
-        </w:rPr>
-        <w:t xml:space="preserve">Machine Learning Scientist with Python</w:t>
-      </w:r>
-      <w:r>
-        <w:tab/>
-      </w:r>
-      <w:r>
-        <w:t xml:space="preserve">DataCamp</w:t>
-      </w:r>
-    </w:p>
-    <w:p>
-      <w:pPr>
-        <w:keepNext/>
-        <w:tabs>
-          <w:tab w:val="right" w:pos="10512"/>
-        </w:tabs>
-        <w:spacing w:after="0"/>
-      </w:pPr>
-      <w:r>
-        <w:rPr>
-          <w:i/>
-          <w:iCs/>
-        </w:rPr>
-        <w:t xml:space="preserve">Machine learning, NLP, deep learning, image processing, big data</w:t>
-      </w:r>
-    </w:p>
-    <w:p>
-      <w:pPr>
-        <w:pStyle w:val="EntryGap"/>
-        <w:spacing w:after="0"/>
-      </w:pPr>
-    </w:p>
-    <w:p>
-      <w:pPr>
-        <w:keepNext/>
-        <w:tabs>
-          <w:tab w:val="right" w:pos="10512"/>
-        </w:tabs>
-        <w:spacing w:after="0"/>
-      </w:pPr>
-      <w:r>
-        <w:rPr>
-          <w:b/>
-          <w:bCs/>
-        </w:rPr>
-        <w:t xml:space="preserve">Mathematical Foundations of Machine Learning</w:t>
-      </w:r>
-      <w:r>
-        <w:tab/>
-      </w:r>
-      <w:hyperlink w:history="1" r:id="rIdcc_y7uy2qhb3djg3xqpku">
-        <w:r>
-          <w:t xml:space="preserve">Udemy</w:t>
-        </w:r>
-      </w:hyperlink>
-    </w:p>
-    <w:p>
-      <w:pPr>
-        <w:keepNext/>
-        <w:tabs>
-          <w:tab w:val="right" w:pos="10512"/>
-        </w:tabs>
-        <w:spacing w:after="0"/>
-      </w:pPr>
-      <w:r>
-        <w:rPr>
-          <w:i/>
-          <w:iCs/>
-        </w:rPr>
-        <w:t xml:space="preserve">Python programming, data science, statistics, machine learning</w:t>
-      </w:r>
-    </w:p>
-    <w:p>
-      <w:pPr>
-        <w:pStyle w:val="EntryGap"/>
-        <w:spacing w:after="0"/>
-      </w:pPr>
-    </w:p>
-    <w:p>
-      <w:pPr>
-        <w:keepNext/>
-        <w:tabs>
-          <w:tab w:val="right" w:pos="10512"/>
-        </w:tabs>
-        <w:spacing w:after="0"/>
-      </w:pPr>
-      <w:r>
-        <w:rPr>
-          <w:b/>
-          <w:bCs/>
-        </w:rPr>
-        <w:t xml:space="preserve">Python for Statistical Analysis</w:t>
-      </w:r>
-      <w:r>
-        <w:tab/>
-      </w:r>
-      <w:hyperlink w:history="1" r:id="rIddzrdwja-1bmkrolgnx9ew">
-        <w:r>
-          <w:t xml:space="preserve">Udemy</w:t>
-        </w:r>
-      </w:hyperlink>
-    </w:p>
-    <w:p>
-      <w:pPr>
-        <w:keepNext/>
-        <w:tabs>
-          <w:tab w:val="right" w:pos="10512"/>
-        </w:tabs>
-        <w:spacing w:after="0"/>
-      </w:pPr>
-      <w:r>
-        <w:rPr>
-          <w:i/>
-          <w:iCs/>
-        </w:rPr>
-        <w:t xml:space="preserve">Python programming, data science, data communication, machine learning</w:t>
-      </w:r>
-    </w:p>
-    <w:p>
-      <w:pPr>
-        <w:pStyle w:val="EntryGap"/>
-        <w:spacing w:after="0"/>
-      </w:pPr>
-    </w:p>
-    <w:p>
-      <w:pPr>
-        <w:pStyle w:val="Heading1"/>
-      </w:pPr>
-      <w:r>
         <w:t xml:space="preserve">Outreach</w:t>
       </w:r>
     </w:p>
@@ -4748,7 +4529,7 @@
       <w:pPr>
         <w:spacing w:after="0"/>
       </w:pPr>
-      <w:hyperlink w:history="1" r:id="rIdequucsdocwcxxl5j5y7mk">
+      <w:hyperlink w:history="1" r:id="rIdesolglfe4ctuts6l53mrg">
         <w:r>
           <w:t xml:space="preserve">mexiciencia.github.io/post/anita</w:t>
         </w:r>
@@ -4808,7 +4589,7 @@
       <w:pPr>
         <w:spacing w:after="0"/>
       </w:pPr>
-      <w:hyperlink w:history="1" r:id="rId4vkzpc_9fhy9ynsnvbrb1">
+      <w:hyperlink w:history="1" r:id="rIdyvp9-tqflydm1_95trywk">
         <w:r>
           <w:t xml:space="preserve">mexiciencia.github.io/post/modelo-sir</w:t>
         </w:r>
@@ -4871,7 +4652,7 @@
       <w:r>
         <w:t xml:space="preserve">Data analysis and modeling collaborator. </w:t>
       </w:r>
-      <w:hyperlink w:history="1" r:id="rIdzzbqe4w3z7cjub-_yrj7q">
+      <w:hyperlink w:history="1" r:id="rId45oioy9actn0aq3spmmrj">
         <w:r>
           <w:t xml:space="preserve">mexiciencia.github.io/post/covid19</w:t>
         </w:r>

</xml_diff>

<commit_message>
Align resume and CV versions for Theory application
Unify summary, skills order and Simulation line; cut resume experience
bullets; fix first-author count (3) and NASA grant wording (Co-I); drop
certifications from CV; build.js compiles PDFs into .tex_tmp/.

Co-Authored-By: Claude Sonnet 5.5 <noreply@anthropic.com>
</commit_message>
<xml_diff>
--- a/RuedaBecerrilJM-CV-plain.docx
+++ b/RuedaBecerrilJM-CV-plain.docx
@@ -28,7 +28,7 @@
       <w:r>
         <w:t xml:space="preserve">  |  </w:t>
       </w:r>
-      <w:hyperlink w:history="1" r:id="rIdtkrpb574skyuasz5hmzg2">
+      <w:hyperlink w:history="1" r:id="rId6snxlosbwrvn1nidwfdqk">
         <w:r>
           <w:t xml:space="preserve">jm.ruebe@gmail.com</w:t>
         </w:r>
@@ -42,7 +42,7 @@
       <w:r>
         <w:t xml:space="preserve">  |  </w:t>
       </w:r>
-      <w:hyperlink w:history="1" r:id="rIdctkdrffjfa0mfg1cpwevw">
+      <w:hyperlink w:history="1" r:id="rId7av61nfffaho4te9of_ku">
         <w:r>
           <w:t xml:space="preserve">linkedin.com/in/jeruebe</w:t>
         </w:r>
@@ -53,7 +53,7 @@
         <w:spacing w:after="60"/>
         <w:jc w:val="center"/>
       </w:pPr>
-      <w:hyperlink w:history="1" r:id="rIdodsbmgicxdlvyrgxfbmjl">
+      <w:hyperlink w:history="1" r:id="rIdnbolix4lzcaf9s9lg9b19">
         <w:r>
           <w:t xml:space="preserve">altjerue.github.io</w:t>
         </w:r>
@@ -61,7 +61,7 @@
       <w:r>
         <w:t xml:space="preserve">  |  </w:t>
       </w:r>
-      <w:hyperlink w:history="1" r:id="rIdekirxli4r1gp4i-tx0qtn">
+      <w:hyperlink w:history="1" r:id="rIdlv4o5yv4jpf7nj6fermmh">
         <w:r>
           <w:t xml:space="preserve">github.com/altjerue</w:t>
         </w:r>
@@ -69,7 +69,7 @@
       <w:r>
         <w:t xml:space="preserve">  |  </w:t>
       </w:r>
-      <w:hyperlink w:history="1" r:id="rId-sqcusyegfs-plawud1wm">
+      <w:hyperlink w:history="1" r:id="rIdq4wkvmhmoaj1xedasnk_o">
         <w:r>
           <w:t xml:space="preserve">orcid.org/0000-0003-1988-1912</w:t>
         </w:r>
@@ -77,7 +77,7 @@
       <w:r>
         <w:t xml:space="preserve">  |  </w:t>
       </w:r>
-      <w:hyperlink w:history="1" r:id="rIdn5_qxtkam1rtwuv5cb91-">
+      <w:hyperlink w:history="1" r:id="rIdy_npd6j86jr_7dsgxj2cn">
         <w:r>
           <w:t xml:space="preserve">Google Scholar</w:t>
         </w:r>
@@ -1167,7 +1167,7 @@
       <w:r>
         <w:t xml:space="preserve">Thesis: </w:t>
       </w:r>
-      <w:hyperlink w:history="1" r:id="rId6_qrozk7ffywbwnwknwxu">
+      <w:hyperlink w:history="1" r:id="rIdnamwehtgohounszkvzuyc">
         <w:r>
           <w:t xml:space="preserve">Numerical treatment of radiation processes in the internal shocks of magnetized relativistic outflows</w:t>
         </w:r>
@@ -1464,7 +1464,7 @@
       <w:r>
         <w:t xml:space="preserve">, </w:t>
       </w:r>
-      <w:hyperlink w:history="1" r:id="rId1f0gwqbf8ncw64m5fnxlw">
+      <w:hyperlink w:history="1" r:id="rIda-wdn2jupevryh1uj4tek">
         <w:r>
           <w:t xml:space="preserve">ApJ 976, 182 (2024)</w:t>
         </w:r>
@@ -1472,7 +1472,7 @@
       <w:r>
         <w:t xml:space="preserve">, </w:t>
       </w:r>
-      <w:hyperlink w:history="1" r:id="rIdujindsl0utumszjfwdivu">
+      <w:hyperlink w:history="1" r:id="rIda_sanopzxipmkbaz20s0b">
         <w:r>
           <w:t xml:space="preserve">arXiv:2405.17581</w:t>
         </w:r>
@@ -1509,7 +1509,7 @@
       <w:r>
         <w:t xml:space="preserve">, </w:t>
       </w:r>
-      <w:hyperlink w:history="1" r:id="rIdhx17i01ybysq8uyw-oj6w">
+      <w:hyperlink w:history="1" r:id="rIdgssjsxpn1uvwkbmvih44n">
         <w:r>
           <w:t xml:space="preserve">MNRAS 513, 5766–5779 (2022)</w:t>
         </w:r>
@@ -1517,7 +1517,7 @@
       <w:r>
         <w:t xml:space="preserve">, </w:t>
       </w:r>
-      <w:hyperlink w:history="1" r:id="rId3ochbwkj8mtaahbxxditq">
+      <w:hyperlink w:history="1" r:id="rIdvamjpeflimfecqj4huoxo">
         <w:r>
           <w:t xml:space="preserve">arXiv:2201.07790</w:t>
         </w:r>
@@ -1554,7 +1554,7 @@
       <w:r>
         <w:t xml:space="preserve">, </w:t>
       </w:r>
-      <w:hyperlink w:history="1" r:id="rIdutshpjmauksnrx8oidyp2">
+      <w:hyperlink w:history="1" r:id="rIdqditcrkmmxacnfb44lrzy">
         <w:r>
           <w:t xml:space="preserve">Phys. Rev. D 106, 083015 (2022)</w:t>
         </w:r>
@@ -1562,7 +1562,7 @@
       <w:r>
         <w:t xml:space="preserve">, </w:t>
       </w:r>
-      <w:hyperlink w:history="1" r:id="rIdomjlarvpoktdouvs8qhtm">
+      <w:hyperlink w:history="1" r:id="rId2bouapz2h0dryeagdgae4">
         <w:r>
           <w:t xml:space="preserve">arXiv:2112.09817</w:t>
         </w:r>
@@ -1599,7 +1599,7 @@
       <w:r>
         <w:t xml:space="preserve">, </w:t>
       </w:r>
-      <w:hyperlink w:history="1" r:id="rIdr13evfqcoupkj3uwq1lyl">
+      <w:hyperlink w:history="1" r:id="rId-xijhbs57kqe0djg5lhgi">
         <w:r>
           <w:t xml:space="preserve">ApJ 919, 95 (2021)</w:t>
         </w:r>
@@ -1607,7 +1607,7 @@
       <w:r>
         <w:t xml:space="preserve">, </w:t>
       </w:r>
-      <w:hyperlink w:history="1" r:id="rIdxs-hrtfpe01c3godenvkr">
+      <w:hyperlink w:history="1" r:id="rIdfco1obtii5objv7dup-cv">
         <w:r>
           <w:t xml:space="preserve">arXiv:2106.05356</w:t>
         </w:r>
@@ -1644,7 +1644,7 @@
       <w:r>
         <w:t xml:space="preserve">, </w:t>
       </w:r>
-      <w:hyperlink w:history="1" r:id="rId95a4hbpnmpl5gawts9nou">
+      <w:hyperlink w:history="1" r:id="rIdyssewtxtbs8irw9ebqnfe">
         <w:r>
           <w:t xml:space="preserve">MNRAS 501, 4092–4102 (2021)</w:t>
         </w:r>
@@ -1652,7 +1652,7 @@
       <w:r>
         <w:t xml:space="preserve">, </w:t>
       </w:r>
-      <w:hyperlink w:history="1" r:id="rId5uro4rb9fhxs0sdaxpdck">
+      <w:hyperlink w:history="1" r:id="rIdvqbbpewpqegnadkzjlune">
         <w:r>
           <w:t xml:space="preserve">arXiv:2009.02273</w:t>
         </w:r>
@@ -1689,7 +1689,7 @@
       <w:r>
         <w:t xml:space="preserve">, </w:t>
       </w:r>
-      <w:hyperlink w:history="1" r:id="rIdbmr6nuz0vbebynyuctibx">
+      <w:hyperlink w:history="1" r:id="rIdgpta7cafaylrbxxqoiehc">
         <w:r>
           <w:t xml:space="preserve">MNRAS 496, 974–986 (2020)</w:t>
         </w:r>
@@ -1697,7 +1697,7 @@
       <w:r>
         <w:t xml:space="preserve">, </w:t>
       </w:r>
-      <w:hyperlink w:history="1" r:id="rIdclnlmn7rcwr8tlcxl1hwv">
+      <w:hyperlink w:history="1" r:id="rId8lb9dhjj3gpwtrfwxirdy">
         <w:r>
           <w:t xml:space="preserve">arXiv:1910.14049</w:t>
         </w:r>
@@ -1734,7 +1734,7 @@
       <w:r>
         <w:t xml:space="preserve">, </w:t>
       </w:r>
-      <w:hyperlink w:history="1" r:id="rIdizjcbfefhnk77ccomv9tv">
+      <w:hyperlink w:history="1" r:id="rIdjvtppvqd3jhjwegiq98ky">
         <w:r>
           <w:t xml:space="preserve">MNRAS 468, 1169–1182 (2017)</w:t>
         </w:r>
@@ -1742,7 +1742,7 @@
       <w:r>
         <w:t xml:space="preserve">, </w:t>
       </w:r>
-      <w:hyperlink w:history="1" r:id="rId4ewvz2v0dsut4fh06lnvn">
+      <w:hyperlink w:history="1" r:id="rId5p-mhbl2-jixi7g9qf16d">
         <w:r>
           <w:t xml:space="preserve">arXiv:1612.06383</w:t>
         </w:r>
@@ -1779,7 +1779,7 @@
       <w:r>
         <w:t xml:space="preserve">, </w:t>
       </w:r>
-      <w:hyperlink w:history="1" r:id="rIdbjs6ueh1cetares6vby54">
+      <w:hyperlink w:history="1" r:id="rIdkq8lztl_om1wonbyc35dj">
         <w:r>
           <w:t xml:space="preserve">MNRAS 438, 1856–1869 (2014)</w:t>
         </w:r>
@@ -1787,7 +1787,7 @@
       <w:r>
         <w:t xml:space="preserve">, </w:t>
       </w:r>
-      <w:hyperlink w:history="1" r:id="rIdvexq9ssthlvq6e_mln6ks">
+      <w:hyperlink w:history="1" r:id="rIdda3xkqbzqlcwbao_mpmzh">
         <w:r>
           <w:t xml:space="preserve">arXiv:1310.5441</w:t>
         </w:r>
@@ -1824,7 +1824,7 @@
       <w:r>
         <w:t xml:space="preserve">, </w:t>
       </w:r>
-      <w:hyperlink w:history="1" r:id="rIdl_l0waozftjklzpl3_qr6">
+      <w:hyperlink w:history="1" r:id="rIdwzgcpfhaft67tfzqcxnuc">
         <w:r>
           <w:t xml:space="preserve">Phys. Rev. D 80, 084023 (2009)</w:t>
         </w:r>
@@ -1832,7 +1832,7 @@
       <w:r>
         <w:t xml:space="preserve">, </w:t>
       </w:r>
-      <w:hyperlink w:history="1" r:id="rIdpfyrzypvmnj9hu2hh86cq">
+      <w:hyperlink w:history="1" r:id="rId2vw6klrx1d3s-ztd8hwhr">
         <w:r>
           <w:t xml:space="preserve">arXiv:1009.1250</w:t>
         </w:r>
@@ -1877,7 +1877,7 @@
       <w:r>
         <w:t xml:space="preserve">, </w:t>
       </w:r>
-      <w:hyperlink w:history="1" r:id="rIdstj8gzitm_wqjccfzl6ss">
+      <w:hyperlink w:history="1" r:id="rId7hlcna6jkbvs-l-7wyg_b">
         <w:r>
           <w:t xml:space="preserve">Astron. Nachr. 342, 277–282 (2021)</w:t>
         </w:r>
@@ -1885,7 +1885,7 @@
       <w:r>
         <w:t xml:space="preserve">, 9th International Workshop on Astronomy and Relativistic Astrophysics, </w:t>
       </w:r>
-      <w:hyperlink w:history="1" r:id="rId09kdckplaqlm3ve4dbe3g">
+      <w:hyperlink w:history="1" r:id="rIdz4bhvydbymehej-j8ztcg">
         <w:r>
           <w:t xml:space="preserve">arXiv:2011.13797</w:t>
         </w:r>
@@ -1922,7 +1922,7 @@
       <w:r>
         <w:t xml:space="preserve">, </w:t>
       </w:r>
-      <w:hyperlink w:history="1" r:id="rIdjedf06z4elcvgz9lrmjw6">
+      <w:hyperlink w:history="1" r:id="rId3rq2ngsjja0wdh8tiuoty">
         <w:r>
           <w:t xml:space="preserve">Astron. Nachr. 342, 147–152 (2021)</w:t>
         </w:r>
@@ -1930,7 +1930,7 @@
       <w:r>
         <w:t xml:space="preserve">, 9th International Workshop on Astronomy and Relativistic Astrophysics, </w:t>
       </w:r>
-      <w:hyperlink w:history="1" r:id="rIdwyrkqc9afdfcqowubxnij">
+      <w:hyperlink w:history="1" r:id="rIdljtu4h6w6azdocijpdqgv">
         <w:r>
           <w:t xml:space="preserve">arXiv:2011.13805</w:t>
         </w:r>
@@ -1967,7 +1967,7 @@
       <w:r>
         <w:t xml:space="preserve">, </w:t>
       </w:r>
-      <w:hyperlink w:history="1" r:id="rIdocoueomwah1f6drqtbbza">
+      <w:hyperlink w:history="1" r:id="rIdlqwovmybgrouvgv9jw_aj">
         <w:r>
           <w:t xml:space="preserve">PoS(SWIFT 10) 233, 159 (2014)</w:t>
         </w:r>
@@ -1975,7 +1975,7 @@
       <w:r>
         <w:t xml:space="preserve">, </w:t>
       </w:r>
-      <w:hyperlink w:history="1" r:id="rIdg790udgknma_dwt5ua-1y">
+      <w:hyperlink w:history="1" r:id="rId7yymi9za9tjbrvwb5jka_">
         <w:r>
           <w:t xml:space="preserve">arXiv:1502.07882</w:t>
         </w:r>
@@ -2012,7 +2012,7 @@
       <w:r>
         <w:t xml:space="preserve">, </w:t>
       </w:r>
-      <w:hyperlink w:history="1" r:id="rId1c3wbdbjhlbv9qpjaambw">
+      <w:hyperlink w:history="1" r:id="rIdzfv3ckqwvlstnhgy_vit5">
         <w:r>
           <w:t xml:space="preserve">EPJ Web Conf. 61, 02007 (2013)</w:t>
         </w:r>
@@ -2020,7 +2020,7 @@
       <w:r>
         <w:t xml:space="preserve">, </w:t>
       </w:r>
-      <w:hyperlink w:history="1" r:id="rIdk2czthodmobe7ko2dbsdd">
+      <w:hyperlink w:history="1" r:id="rIde0yw6ueft2rkvmhavzn9s">
         <w:r>
           <w:t xml:space="preserve">arXiv:1309.4612</w:t>
         </w:r>
@@ -2057,7 +2057,7 @@
       <w:r>
         <w:t xml:space="preserve">, </w:t>
       </w:r>
-      <w:hyperlink w:history="1" r:id="rIdasx22i3d0u47iepqm8mwv">
+      <w:hyperlink w:history="1" r:id="rId2fmlauihpuxs6dlyn-jdq">
         <w:r>
           <w:t xml:space="preserve">J. Phys.: Conf. Ser. 454, 012001 (2013)</w:t>
         </w:r>
@@ -2065,7 +2065,7 @@
       <w:r>
         <w:t xml:space="preserve">, </w:t>
       </w:r>
-      <w:hyperlink w:history="1" r:id="rId560qxdvwtqxuv8qjypka_">
+      <w:hyperlink w:history="1" r:id="rId6fkhepujv4qlu3yjvv8jk">
         <w:r>
           <w:t xml:space="preserve">arXiv:1211.1794</w:t>
         </w:r>
@@ -2468,7 +2468,7 @@
       <w:r>
         <w:tab/>
       </w:r>
-      <w:hyperlink w:history="1" r:id="rIdha2mg8sulla3iefktmkg6">
+      <w:hyperlink w:history="1" r:id="rIdq0zgp91kevcs8sasonatn">
         <w:r>
           <w:t xml:space="preserve">github.com/altjerue/ilwikak-ml</w:t>
         </w:r>
@@ -2559,7 +2559,7 @@
       <w:r>
         <w:tab/>
       </w:r>
-      <w:hyperlink w:history="1" r:id="rIdo2zo50tc3mi7wu76ovosi">
+      <w:hyperlink w:history="1" r:id="rId2qbvz9ibyytfuejxms-hc">
         <w:r>
           <w:t xml:space="preserve">github.com/UW-ForestMycobiomeLab/WindSporesHills</w:t>
         </w:r>
@@ -2624,7 +2624,7 @@
       <w:r>
         <w:tab/>
       </w:r>
-      <w:hyperlink w:history="1" r:id="rIdqdj1xbha8mkmj1hxjgqen">
+      <w:hyperlink w:history="1" r:id="rId5puwharxrypofjx7mvpdq">
         <w:r>
           <w:t xml:space="preserve">github.com/zkdavis/Tleco</w:t>
         </w:r>
@@ -2689,7 +2689,7 @@
       <w:r>
         <w:tab/>
       </w:r>
-      <w:hyperlink w:history="1" r:id="rIdzp4pu7nx0hvut7jcynvbi">
+      <w:hyperlink w:history="1" r:id="rId2fttutzsikhmhyb-nfecq">
         <w:r>
           <w:t xml:space="preserve">github.com/altjerue/paramo</w:t>
         </w:r>
@@ -3300,7 +3300,7 @@
       <w:r>
         <w:t xml:space="preserve">Video: </w:t>
       </w:r>
-      <w:hyperlink w:history="1" r:id="rIdr9o9vrbjmjeccllwi0phk">
+      <w:hyperlink w:history="1" r:id="rIdp-eniya026b03qkv1kusy">
         <w:r>
           <w:t xml:space="preserve">youtube.com/watch?v=BAZNWLNT69M</w:t>
         </w:r>
@@ -3471,7 +3471,7 @@
       <w:r>
         <w:t xml:space="preserve">Marcos Moshinsky Award for Best Poster. Video: </w:t>
       </w:r>
-      <w:hyperlink w:history="1" r:id="rIdhic8jt6nvl5pulcgnbjub">
+      <w:hyperlink w:history="1" r:id="rIdlzve5vgqiw6hgbgpwikzb">
         <w:r>
           <w:t xml:space="preserve">youtube.com/watch?v=0TJiKg7kOPI</w:t>
         </w:r>
@@ -4529,7 +4529,7 @@
       <w:pPr>
         <w:spacing w:after="0"/>
       </w:pPr>
-      <w:hyperlink w:history="1" r:id="rIdesolglfe4ctuts6l53mrg">
+      <w:hyperlink w:history="1" r:id="rIdd7x35o2ntntep1xxdsbl8">
         <w:r>
           <w:t xml:space="preserve">mexiciencia.github.io/post/anita</w:t>
         </w:r>
@@ -4589,7 +4589,7 @@
       <w:pPr>
         <w:spacing w:after="0"/>
       </w:pPr>
-      <w:hyperlink w:history="1" r:id="rIdyvp9-tqflydm1_95trywk">
+      <w:hyperlink w:history="1" r:id="rIdknbr1ybdwiwx811qmf7mw">
         <w:r>
           <w:t xml:space="preserve">mexiciencia.github.io/post/modelo-sir</w:t>
         </w:r>
@@ -4652,7 +4652,7 @@
       <w:r>
         <w:t xml:space="preserve">Data analysis and modeling collaborator. </w:t>
       </w:r>
-      <w:hyperlink w:history="1" r:id="rId45oioy9actn0aq3spmmrj">
+      <w:hyperlink w:history="1" r:id="rIdxlgrzx21b35uxk9fqntsy">
         <w:r>
           <w:t xml:space="preserve">mexiciencia.github.io/post/covid19</w:t>
         </w:r>

</xml_diff>

<commit_message>
Remove unnecessary files. Improving style.
</commit_message>
<xml_diff>
--- a/RuedaBecerrilJM-CV-plain.docx
+++ b/RuedaBecerrilJM-CV-plain.docx
@@ -28,7 +28,7 @@
       <w:r>
         <w:t xml:space="preserve">  |  </w:t>
       </w:r>
-      <w:hyperlink w:history="1" r:id="rId6snxlosbwrvn1nidwfdqk">
+      <w:hyperlink w:history="1" r:id="rIdqdw64vweaimeysewmzddh">
         <w:r>
           <w:t xml:space="preserve">jm.ruebe@gmail.com</w:t>
         </w:r>
@@ -42,7 +42,7 @@
       <w:r>
         <w:t xml:space="preserve">  |  </w:t>
       </w:r>
-      <w:hyperlink w:history="1" r:id="rId7av61nfffaho4te9of_ku">
+      <w:hyperlink w:history="1" r:id="rIdbebor4indcp4fmfqvq8af">
         <w:r>
           <w:t xml:space="preserve">linkedin.com/in/jeruebe</w:t>
         </w:r>
@@ -53,7 +53,7 @@
         <w:spacing w:after="60"/>
         <w:jc w:val="center"/>
       </w:pPr>
-      <w:hyperlink w:history="1" r:id="rIdnbolix4lzcaf9s9lg9b19">
+      <w:hyperlink w:history="1" r:id="rIdn2bb8a0fyzrzbvipuim_r">
         <w:r>
           <w:t xml:space="preserve">altjerue.github.io</w:t>
         </w:r>
@@ -61,7 +61,7 @@
       <w:r>
         <w:t xml:space="preserve">  |  </w:t>
       </w:r>
-      <w:hyperlink w:history="1" r:id="rIdlv4o5yv4jpf7nj6fermmh">
+      <w:hyperlink w:history="1" r:id="rIdc0t6mafwbil99yrhtummr">
         <w:r>
           <w:t xml:space="preserve">github.com/altjerue</w:t>
         </w:r>
@@ -69,7 +69,7 @@
       <w:r>
         <w:t xml:space="preserve">  |  </w:t>
       </w:r>
-      <w:hyperlink w:history="1" r:id="rIdq4wkvmhmoaj1xedasnk_o">
+      <w:hyperlink w:history="1" r:id="rIdpi0eu6kszbcgjdgqkxioq">
         <w:r>
           <w:t xml:space="preserve">orcid.org/0000-0003-1988-1912</w:t>
         </w:r>
@@ -77,7 +77,7 @@
       <w:r>
         <w:t xml:space="preserve">  |  </w:t>
       </w:r>
-      <w:hyperlink w:history="1" r:id="rIdy_npd6j86jr_7dsgxj2cn">
+      <w:hyperlink w:history="1" r:id="rIdegwjoisomals4q6gc6sht">
         <w:r>
           <w:t xml:space="preserve">Google Scholar</w:t>
         </w:r>
@@ -1167,7 +1167,7 @@
       <w:r>
         <w:t xml:space="preserve">Thesis: </w:t>
       </w:r>
-      <w:hyperlink w:history="1" r:id="rIdnamwehtgohounszkvzuyc">
+      <w:hyperlink w:history="1" r:id="rIdsh5ldlqnzxguaworf7jjz">
         <w:r>
           <w:t xml:space="preserve">Numerical treatment of radiation processes in the internal shocks of magnetized relativistic outflows</w:t>
         </w:r>
@@ -1464,7 +1464,7 @@
       <w:r>
         <w:t xml:space="preserve">, </w:t>
       </w:r>
-      <w:hyperlink w:history="1" r:id="rIda-wdn2jupevryh1uj4tek">
+      <w:hyperlink w:history="1" r:id="rIdldnyk3px5hdp4nrntoa7s">
         <w:r>
           <w:t xml:space="preserve">ApJ 976, 182 (2024)</w:t>
         </w:r>
@@ -1472,7 +1472,7 @@
       <w:r>
         <w:t xml:space="preserve">, </w:t>
       </w:r>
-      <w:hyperlink w:history="1" r:id="rIda_sanopzxipmkbaz20s0b">
+      <w:hyperlink w:history="1" r:id="rId21lldzyusy4ccdqmmtsn8">
         <w:r>
           <w:t xml:space="preserve">arXiv:2405.17581</w:t>
         </w:r>
@@ -1509,7 +1509,7 @@
       <w:r>
         <w:t xml:space="preserve">, </w:t>
       </w:r>
-      <w:hyperlink w:history="1" r:id="rIdgssjsxpn1uvwkbmvih44n">
+      <w:hyperlink w:history="1" r:id="rIdxmfg-pgjww1d-ewihhjty">
         <w:r>
           <w:t xml:space="preserve">MNRAS 513, 5766–5779 (2022)</w:t>
         </w:r>
@@ -1517,7 +1517,7 @@
       <w:r>
         <w:t xml:space="preserve">, </w:t>
       </w:r>
-      <w:hyperlink w:history="1" r:id="rIdvamjpeflimfecqj4huoxo">
+      <w:hyperlink w:history="1" r:id="rIdzn9qljkxwiqmbx98cjfdz">
         <w:r>
           <w:t xml:space="preserve">arXiv:2201.07790</w:t>
         </w:r>
@@ -1554,7 +1554,7 @@
       <w:r>
         <w:t xml:space="preserve">, </w:t>
       </w:r>
-      <w:hyperlink w:history="1" r:id="rIdqditcrkmmxacnfb44lrzy">
+      <w:hyperlink w:history="1" r:id="rId2hj0aidwol2reorxurp8t">
         <w:r>
           <w:t xml:space="preserve">Phys. Rev. D 106, 083015 (2022)</w:t>
         </w:r>
@@ -1562,7 +1562,7 @@
       <w:r>
         <w:t xml:space="preserve">, </w:t>
       </w:r>
-      <w:hyperlink w:history="1" r:id="rId2bouapz2h0dryeagdgae4">
+      <w:hyperlink w:history="1" r:id="rIdjvyym0s9jn08onuzhjlzl">
         <w:r>
           <w:t xml:space="preserve">arXiv:2112.09817</w:t>
         </w:r>
@@ -1599,7 +1599,7 @@
       <w:r>
         <w:t xml:space="preserve">, </w:t>
       </w:r>
-      <w:hyperlink w:history="1" r:id="rId-xijhbs57kqe0djg5lhgi">
+      <w:hyperlink w:history="1" r:id="rIdxpm8pgk_s7knngmafqno7">
         <w:r>
           <w:t xml:space="preserve">ApJ 919, 95 (2021)</w:t>
         </w:r>
@@ -1607,7 +1607,7 @@
       <w:r>
         <w:t xml:space="preserve">, </w:t>
       </w:r>
-      <w:hyperlink w:history="1" r:id="rIdfco1obtii5objv7dup-cv">
+      <w:hyperlink w:history="1" r:id="rIdolbpx2u2mwpphgq0kyiqe">
         <w:r>
           <w:t xml:space="preserve">arXiv:2106.05356</w:t>
         </w:r>
@@ -1644,7 +1644,7 @@
       <w:r>
         <w:t xml:space="preserve">, </w:t>
       </w:r>
-      <w:hyperlink w:history="1" r:id="rIdyssewtxtbs8irw9ebqnfe">
+      <w:hyperlink w:history="1" r:id="rIdsdt7jgrrvrskjhddyr-6v">
         <w:r>
           <w:t xml:space="preserve">MNRAS 501, 4092–4102 (2021)</w:t>
         </w:r>
@@ -1652,7 +1652,7 @@
       <w:r>
         <w:t xml:space="preserve">, </w:t>
       </w:r>
-      <w:hyperlink w:history="1" r:id="rIdvqbbpewpqegnadkzjlune">
+      <w:hyperlink w:history="1" r:id="rIdgcsebjseldbnixs3mqgxa">
         <w:r>
           <w:t xml:space="preserve">arXiv:2009.02273</w:t>
         </w:r>
@@ -1689,7 +1689,7 @@
       <w:r>
         <w:t xml:space="preserve">, </w:t>
       </w:r>
-      <w:hyperlink w:history="1" r:id="rIdgpta7cafaylrbxxqoiehc">
+      <w:hyperlink w:history="1" r:id="rIdcbeagocl99dlrjlknrkkc">
         <w:r>
           <w:t xml:space="preserve">MNRAS 496, 974–986 (2020)</w:t>
         </w:r>
@@ -1697,7 +1697,7 @@
       <w:r>
         <w:t xml:space="preserve">, </w:t>
       </w:r>
-      <w:hyperlink w:history="1" r:id="rId8lb9dhjj3gpwtrfwxirdy">
+      <w:hyperlink w:history="1" r:id="rIdessbqztitc3avxyxtwxd7">
         <w:r>
           <w:t xml:space="preserve">arXiv:1910.14049</w:t>
         </w:r>
@@ -1734,7 +1734,7 @@
       <w:r>
         <w:t xml:space="preserve">, </w:t>
       </w:r>
-      <w:hyperlink w:history="1" r:id="rIdjvtppvqd3jhjwegiq98ky">
+      <w:hyperlink w:history="1" r:id="rIdmlcw4tpsdjdphvboq-rsk">
         <w:r>
           <w:t xml:space="preserve">MNRAS 468, 1169–1182 (2017)</w:t>
         </w:r>
@@ -1742,7 +1742,7 @@
       <w:r>
         <w:t xml:space="preserve">, </w:t>
       </w:r>
-      <w:hyperlink w:history="1" r:id="rId5p-mhbl2-jixi7g9qf16d">
+      <w:hyperlink w:history="1" r:id="rIdr0kcafbzkseaa1noz6erf">
         <w:r>
           <w:t xml:space="preserve">arXiv:1612.06383</w:t>
         </w:r>
@@ -1779,7 +1779,7 @@
       <w:r>
         <w:t xml:space="preserve">, </w:t>
       </w:r>
-      <w:hyperlink w:history="1" r:id="rIdkq8lztl_om1wonbyc35dj">
+      <w:hyperlink w:history="1" r:id="rIdm_uxysv3wcvnkt2anb4_6">
         <w:r>
           <w:t xml:space="preserve">MNRAS 438, 1856–1869 (2014)</w:t>
         </w:r>
@@ -1787,7 +1787,7 @@
       <w:r>
         <w:t xml:space="preserve">, </w:t>
       </w:r>
-      <w:hyperlink w:history="1" r:id="rIdda3xkqbzqlcwbao_mpmzh">
+      <w:hyperlink w:history="1" r:id="rIdpcswwfmlfo5c9_4jwek0v">
         <w:r>
           <w:t xml:space="preserve">arXiv:1310.5441</w:t>
         </w:r>
@@ -1824,7 +1824,7 @@
       <w:r>
         <w:t xml:space="preserve">, </w:t>
       </w:r>
-      <w:hyperlink w:history="1" r:id="rIdwzgcpfhaft67tfzqcxnuc">
+      <w:hyperlink w:history="1" r:id="rId2pjc_xihouoi1eqcjl_wz">
         <w:r>
           <w:t xml:space="preserve">Phys. Rev. D 80, 084023 (2009)</w:t>
         </w:r>
@@ -1832,7 +1832,7 @@
       <w:r>
         <w:t xml:space="preserve">, </w:t>
       </w:r>
-      <w:hyperlink w:history="1" r:id="rId2vw6klrx1d3s-ztd8hwhr">
+      <w:hyperlink w:history="1" r:id="rId3trqrq3ypciqfhacbr2-b">
         <w:r>
           <w:t xml:space="preserve">arXiv:1009.1250</w:t>
         </w:r>
@@ -1877,7 +1877,7 @@
       <w:r>
         <w:t xml:space="preserve">, </w:t>
       </w:r>
-      <w:hyperlink w:history="1" r:id="rId7hlcna6jkbvs-l-7wyg_b">
+      <w:hyperlink w:history="1" r:id="rId-ikswxe0dulh83cymdp8v">
         <w:r>
           <w:t xml:space="preserve">Astron. Nachr. 342, 277–282 (2021)</w:t>
         </w:r>
@@ -1885,7 +1885,7 @@
       <w:r>
         <w:t xml:space="preserve">, 9th International Workshop on Astronomy and Relativistic Astrophysics, </w:t>
       </w:r>
-      <w:hyperlink w:history="1" r:id="rIdz4bhvydbymehej-j8ztcg">
+      <w:hyperlink w:history="1" r:id="rIdj3lnvnnz97ihc61cibeek">
         <w:r>
           <w:t xml:space="preserve">arXiv:2011.13797</w:t>
         </w:r>
@@ -1922,7 +1922,7 @@
       <w:r>
         <w:t xml:space="preserve">, </w:t>
       </w:r>
-      <w:hyperlink w:history="1" r:id="rId3rq2ngsjja0wdh8tiuoty">
+      <w:hyperlink w:history="1" r:id="rIdchqkqkvbzcagx8z4z1zdi">
         <w:r>
           <w:t xml:space="preserve">Astron. Nachr. 342, 147–152 (2021)</w:t>
         </w:r>
@@ -1930,7 +1930,7 @@
       <w:r>
         <w:t xml:space="preserve">, 9th International Workshop on Astronomy and Relativistic Astrophysics, </w:t>
       </w:r>
-      <w:hyperlink w:history="1" r:id="rIdljtu4h6w6azdocijpdqgv">
+      <w:hyperlink w:history="1" r:id="rIdmxeuwb2we4xa8xdidgqud">
         <w:r>
           <w:t xml:space="preserve">arXiv:2011.13805</w:t>
         </w:r>
@@ -1967,7 +1967,7 @@
       <w:r>
         <w:t xml:space="preserve">, </w:t>
       </w:r>
-      <w:hyperlink w:history="1" r:id="rIdlqwovmybgrouvgv9jw_aj">
+      <w:hyperlink w:history="1" r:id="rId_o2g7yuz8aruatr265hbi">
         <w:r>
           <w:t xml:space="preserve">PoS(SWIFT 10) 233, 159 (2014)</w:t>
         </w:r>
@@ -1975,7 +1975,7 @@
       <w:r>
         <w:t xml:space="preserve">, </w:t>
       </w:r>
-      <w:hyperlink w:history="1" r:id="rId7yymi9za9tjbrvwb5jka_">
+      <w:hyperlink w:history="1" r:id="rIdfav0yd2smng2ph-x8bnnz">
         <w:r>
           <w:t xml:space="preserve">arXiv:1502.07882</w:t>
         </w:r>
@@ -2012,7 +2012,7 @@
       <w:r>
         <w:t xml:space="preserve">, </w:t>
       </w:r>
-      <w:hyperlink w:history="1" r:id="rIdzfv3ckqwvlstnhgy_vit5">
+      <w:hyperlink w:history="1" r:id="rIdmhoubscwljq0bjpquutwp">
         <w:r>
           <w:t xml:space="preserve">EPJ Web Conf. 61, 02007 (2013)</w:t>
         </w:r>
@@ -2020,7 +2020,7 @@
       <w:r>
         <w:t xml:space="preserve">, </w:t>
       </w:r>
-      <w:hyperlink w:history="1" r:id="rIde0yw6ueft2rkvmhavzn9s">
+      <w:hyperlink w:history="1" r:id="rId67c0r-enfl9sdkiilcb7l">
         <w:r>
           <w:t xml:space="preserve">arXiv:1309.4612</w:t>
         </w:r>
@@ -2057,7 +2057,7 @@
       <w:r>
         <w:t xml:space="preserve">, </w:t>
       </w:r>
-      <w:hyperlink w:history="1" r:id="rId2fmlauihpuxs6dlyn-jdq">
+      <w:hyperlink w:history="1" r:id="rId45t6jzulmqd0v4k4u6jul">
         <w:r>
           <w:t xml:space="preserve">J. Phys.: Conf. Ser. 454, 012001 (2013)</w:t>
         </w:r>
@@ -2065,7 +2065,7 @@
       <w:r>
         <w:t xml:space="preserve">, </w:t>
       </w:r>
-      <w:hyperlink w:history="1" r:id="rId6fkhepujv4qlu3yjvv8jk">
+      <w:hyperlink w:history="1" r:id="rIdkqrlalzxewklixml7rgz-">
         <w:r>
           <w:t xml:space="preserve">arXiv:1211.1794</w:t>
         </w:r>
@@ -2468,7 +2468,7 @@
       <w:r>
         <w:tab/>
       </w:r>
-      <w:hyperlink w:history="1" r:id="rIdq0zgp91kevcs8sasonatn">
+      <w:hyperlink w:history="1" r:id="rIdsvyfppxymjrnbpodfj0dm">
         <w:r>
           <w:t xml:space="preserve">github.com/altjerue/ilwikak-ml</w:t>
         </w:r>
@@ -2559,7 +2559,7 @@
       <w:r>
         <w:tab/>
       </w:r>
-      <w:hyperlink w:history="1" r:id="rId2qbvz9ibyytfuejxms-hc">
+      <w:hyperlink w:history="1" r:id="rIdkycxkngiinuwp-ngqr1fh">
         <w:r>
           <w:t xml:space="preserve">github.com/UW-ForestMycobiomeLab/WindSporesHills</w:t>
         </w:r>
@@ -2624,7 +2624,7 @@
       <w:r>
         <w:tab/>
       </w:r>
-      <w:hyperlink w:history="1" r:id="rId5puwharxrypofjx7mvpdq">
+      <w:hyperlink w:history="1" r:id="rId06lircoh0ujahtntuuidz">
         <w:r>
           <w:t xml:space="preserve">github.com/zkdavis/Tleco</w:t>
         </w:r>
@@ -2689,7 +2689,7 @@
       <w:r>
         <w:tab/>
       </w:r>
-      <w:hyperlink w:history="1" r:id="rId2fttutzsikhmhyb-nfecq">
+      <w:hyperlink w:history="1" r:id="rId6utfsoltgkef_ihryurbx">
         <w:r>
           <w:t xml:space="preserve">github.com/altjerue/paramo</w:t>
         </w:r>
@@ -3300,7 +3300,7 @@
       <w:r>
         <w:t xml:space="preserve">Video: </w:t>
       </w:r>
-      <w:hyperlink w:history="1" r:id="rIdp-eniya026b03qkv1kusy">
+      <w:hyperlink w:history="1" r:id="rIdnt0e6c_b547h-pbijfwpi">
         <w:r>
           <w:t xml:space="preserve">youtube.com/watch?v=BAZNWLNT69M</w:t>
         </w:r>
@@ -3471,7 +3471,7 @@
       <w:r>
         <w:t xml:space="preserve">Marcos Moshinsky Award for Best Poster. Video: </w:t>
       </w:r>
-      <w:hyperlink w:history="1" r:id="rIdlzve5vgqiw6hgbgpwikzb">
+      <w:hyperlink w:history="1" r:id="rId1yqwiwatkuuo5iz966lcq">
         <w:r>
           <w:t xml:space="preserve">youtube.com/watch?v=0TJiKg7kOPI</w:t>
         </w:r>
@@ -4529,7 +4529,7 @@
       <w:pPr>
         <w:spacing w:after="0"/>
       </w:pPr>
-      <w:hyperlink w:history="1" r:id="rIdd7x35o2ntntep1xxdsbl8">
+      <w:hyperlink w:history="1" r:id="rIdav0za_rhzzc_msqj40qx1">
         <w:r>
           <w:t xml:space="preserve">mexiciencia.github.io/post/anita</w:t>
         </w:r>
@@ -4589,7 +4589,7 @@
       <w:pPr>
         <w:spacing w:after="0"/>
       </w:pPr>
-      <w:hyperlink w:history="1" r:id="rIdknbr1ybdwiwx811qmf7mw">
+      <w:hyperlink w:history="1" r:id="rId8x3dggaiwy1_wcpcillt3">
         <w:r>
           <w:t xml:space="preserve">mexiciencia.github.io/post/modelo-sir</w:t>
         </w:r>
@@ -4652,7 +4652,7 @@
       <w:r>
         <w:t xml:space="preserve">Data analysis and modeling collaborator. </w:t>
       </w:r>
-      <w:hyperlink w:history="1" r:id="rIdxlgrzx21b35uxk9fqntsy">
+      <w:hyperlink w:history="1" r:id="rIdxpmxyu9ivl5e139qydojg">
         <w:r>
           <w:t xml:space="preserve">mexiciencia.github.io/post/covid19</w:t>
         </w:r>

</xml_diff>

<commit_message>
Split the generator into per-format modules
tools/build.js becomes a short entry point; the inline-markup and
LaTeX-escaping helpers, the plain-LaTeX renderer and the Word renderer
move to tools/lib/ unchanged, ahead of adding a moderncv renderer.
Generated files now name their source YAML in the header comment;
the documents' text is unchanged.

Co-Authored-By: Claude Opus 5.5 <noreply@anthropic.com>
</commit_message>
<xml_diff>
--- a/RuedaBecerrilJM-CV-plain.docx
+++ b/RuedaBecerrilJM-CV-plain.docx
@@ -28,7 +28,7 @@
       <w:r>
         <w:t xml:space="preserve">  |  </w:t>
       </w:r>
-      <w:hyperlink w:history="1" r:id="rIdnwovtjsz3hg94fphr8uti">
+      <w:hyperlink w:history="1" r:id="rIdufx5f_kc9rvb2asfxnfdt">
         <w:r>
           <w:t xml:space="preserve">jm.ruebe@gmail.com</w:t>
         </w:r>
@@ -42,7 +42,7 @@
       <w:r>
         <w:t xml:space="preserve">  |  </w:t>
       </w:r>
-      <w:hyperlink w:history="1" r:id="rIdu0soufttixg4t_qi7svcq">
+      <w:hyperlink w:history="1" r:id="rId7ezrweh55bs0_n8h4-cn9">
         <w:r>
           <w:t xml:space="preserve">linkedin.com/in/jeruebe</w:t>
         </w:r>
@@ -53,7 +53,7 @@
         <w:spacing w:after="60"/>
         <w:jc w:val="center"/>
       </w:pPr>
-      <w:hyperlink w:history="1" r:id="rIddyxx6qvv86cjzvfzw2ait">
+      <w:hyperlink w:history="1" r:id="rIdvduhw6f9t_ufigj0ls6h1">
         <w:r>
           <w:t xml:space="preserve">altjerue.github.io</w:t>
         </w:r>
@@ -61,7 +61,7 @@
       <w:r>
         <w:t xml:space="preserve">  |  </w:t>
       </w:r>
-      <w:hyperlink w:history="1" r:id="rIdolvnxeagit_go79vcw5tb">
+      <w:hyperlink w:history="1" r:id="rIdi15wkjha9ydko9_isdyda">
         <w:r>
           <w:t xml:space="preserve">github.com/altjerue</w:t>
         </w:r>
@@ -69,7 +69,7 @@
       <w:r>
         <w:t xml:space="preserve">  |  </w:t>
       </w:r>
-      <w:hyperlink w:history="1" r:id="rIdg_ujlrcxmfsmghrl6mu35">
+      <w:hyperlink w:history="1" r:id="rId6vsz_ss-xoe5iflomqrh9">
         <w:r>
           <w:t xml:space="preserve">orcid.org/0000-0003-1988-1912</w:t>
         </w:r>
@@ -77,7 +77,7 @@
       <w:r>
         <w:t xml:space="preserve">  |  </w:t>
       </w:r>
-      <w:hyperlink w:history="1" r:id="rIdwudy0rlp4qihaymwmy-mg">
+      <w:hyperlink w:history="1" r:id="rId4kbwat6-tym8d-hq7gw8i">
         <w:r>
           <w:t xml:space="preserve">Google Scholar</w:t>
         </w:r>
@@ -1152,7 +1152,7 @@
       <w:r>
         <w:t xml:space="preserve">Thesis: </w:t>
       </w:r>
-      <w:hyperlink w:history="1" r:id="rIdfqo6wdjbtooprl7p6cmrq">
+      <w:hyperlink w:history="1" r:id="rIdpxdngyyhuy6g1iihxiprk">
         <w:r>
           <w:t xml:space="preserve">Numerical treatment of radiation processes in the internal shocks of magnetized relativistic outflows</w:t>
         </w:r>
@@ -1449,7 +1449,7 @@
       <w:r>
         <w:t xml:space="preserve">, </w:t>
       </w:r>
-      <w:hyperlink w:history="1" r:id="rIdakhfnkghftij9klxa2qix">
+      <w:hyperlink w:history="1" r:id="rId72iu1bg8vll2es2hs0duy">
         <w:r>
           <w:t xml:space="preserve">ApJ 976, 182 (2024)</w:t>
         </w:r>
@@ -1457,7 +1457,7 @@
       <w:r>
         <w:t xml:space="preserve">, </w:t>
       </w:r>
-      <w:hyperlink w:history="1" r:id="rIdx7uumxe99wwjnc4l0257z">
+      <w:hyperlink w:history="1" r:id="rId1ocgyynblqcr9d2kztmg2">
         <w:r>
           <w:t xml:space="preserve">arXiv:2405.17581</w:t>
         </w:r>
@@ -1494,7 +1494,7 @@
       <w:r>
         <w:t xml:space="preserve">, </w:t>
       </w:r>
-      <w:hyperlink w:history="1" r:id="rIdgu1fmqusmhyhvdt6nrizu">
+      <w:hyperlink w:history="1" r:id="rIdyhnvfyb3uj9acrd35hv26">
         <w:r>
           <w:t xml:space="preserve">MNRAS 513, 5766–5779 (2022)</w:t>
         </w:r>
@@ -1502,7 +1502,7 @@
       <w:r>
         <w:t xml:space="preserve">, </w:t>
       </w:r>
-      <w:hyperlink w:history="1" r:id="rIduhbr2waf0yr3sof9cikt6">
+      <w:hyperlink w:history="1" r:id="rIdnoogzbs8fy6ypxy4lbrst">
         <w:r>
           <w:t xml:space="preserve">arXiv:2201.07790</w:t>
         </w:r>
@@ -1539,7 +1539,7 @@
       <w:r>
         <w:t xml:space="preserve">, </w:t>
       </w:r>
-      <w:hyperlink w:history="1" r:id="rIdpxmsssnu9cvcsumgkr3uu">
+      <w:hyperlink w:history="1" r:id="rId6qd_5jpg_zih4iozhdi5n">
         <w:r>
           <w:t xml:space="preserve">Phys. Rev. D 106, 083015 (2022)</w:t>
         </w:r>
@@ -1547,7 +1547,7 @@
       <w:r>
         <w:t xml:space="preserve">, </w:t>
       </w:r>
-      <w:hyperlink w:history="1" r:id="rId3rd-_kvbvc77xxjdlga3g">
+      <w:hyperlink w:history="1" r:id="rIdkec5oxcqjnw07kmqouizd">
         <w:r>
           <w:t xml:space="preserve">arXiv:2112.09817</w:t>
         </w:r>
@@ -1584,7 +1584,7 @@
       <w:r>
         <w:t xml:space="preserve">, </w:t>
       </w:r>
-      <w:hyperlink w:history="1" r:id="rIdgcqqu17gkv6igzzcidnm3">
+      <w:hyperlink w:history="1" r:id="rIda2mtkdrvfgfwjogszb8sn">
         <w:r>
           <w:t xml:space="preserve">ApJ 919, 95 (2021)</w:t>
         </w:r>
@@ -1592,7 +1592,7 @@
       <w:r>
         <w:t xml:space="preserve">, </w:t>
       </w:r>
-      <w:hyperlink w:history="1" r:id="rIdwvev4pfl7n8n73_irq92t">
+      <w:hyperlink w:history="1" r:id="rIdaicamfbslfo2qsaeepici">
         <w:r>
           <w:t xml:space="preserve">arXiv:2106.05356</w:t>
         </w:r>
@@ -1629,7 +1629,7 @@
       <w:r>
         <w:t xml:space="preserve">, </w:t>
       </w:r>
-      <w:hyperlink w:history="1" r:id="rIdxfqpv_ybnmotqejpqb5hk">
+      <w:hyperlink w:history="1" r:id="rIdnw6vp94naahkxc1sutszj">
         <w:r>
           <w:t xml:space="preserve">MNRAS 501, 4092–4102 (2021)</w:t>
         </w:r>
@@ -1637,7 +1637,7 @@
       <w:r>
         <w:t xml:space="preserve">, </w:t>
       </w:r>
-      <w:hyperlink w:history="1" r:id="rId4oj_gnzvbcpndtdst2lej">
+      <w:hyperlink w:history="1" r:id="rIdgseqzvtj14zjy4v73jnax">
         <w:r>
           <w:t xml:space="preserve">arXiv:2009.02273</w:t>
         </w:r>
@@ -1674,7 +1674,7 @@
       <w:r>
         <w:t xml:space="preserve">, </w:t>
       </w:r>
-      <w:hyperlink w:history="1" r:id="rIdxixsykssqtkpxkegjmj3o">
+      <w:hyperlink w:history="1" r:id="rId2qdirlruhdvybckcqn1fz">
         <w:r>
           <w:t xml:space="preserve">MNRAS 496, 974–986 (2020)</w:t>
         </w:r>
@@ -1682,7 +1682,7 @@
       <w:r>
         <w:t xml:space="preserve">, </w:t>
       </w:r>
-      <w:hyperlink w:history="1" r:id="rIdozup2kykh_ctn1g_bpzzz">
+      <w:hyperlink w:history="1" r:id="rId_ctw4xy60tdl3tx0r5crq">
         <w:r>
           <w:t xml:space="preserve">arXiv:1910.14049</w:t>
         </w:r>
@@ -1719,7 +1719,7 @@
       <w:r>
         <w:t xml:space="preserve">, </w:t>
       </w:r>
-      <w:hyperlink w:history="1" r:id="rIdi-0pqii0neoda7xfyel4g">
+      <w:hyperlink w:history="1" r:id="rIdxysfgvzqg42kievb871ep">
         <w:r>
           <w:t xml:space="preserve">MNRAS 468, 1169–1182 (2017)</w:t>
         </w:r>
@@ -1727,7 +1727,7 @@
       <w:r>
         <w:t xml:space="preserve">, </w:t>
       </w:r>
-      <w:hyperlink w:history="1" r:id="rIdlyk_5xlhvmld5pd-lgdsi">
+      <w:hyperlink w:history="1" r:id="rIddxuxilwtd_qqh3k4mnwqx">
         <w:r>
           <w:t xml:space="preserve">arXiv:1612.06383</w:t>
         </w:r>
@@ -1764,7 +1764,7 @@
       <w:r>
         <w:t xml:space="preserve">, </w:t>
       </w:r>
-      <w:hyperlink w:history="1" r:id="rIdt7al1xwkgfhct6mf8outp">
+      <w:hyperlink w:history="1" r:id="rIdvegyvbncp69ni_iniza8k">
         <w:r>
           <w:t xml:space="preserve">MNRAS 438, 1856–1869 (2014)</w:t>
         </w:r>
@@ -1772,7 +1772,7 @@
       <w:r>
         <w:t xml:space="preserve">, </w:t>
       </w:r>
-      <w:hyperlink w:history="1" r:id="rIdspztll-etlcfivfsylp9-">
+      <w:hyperlink w:history="1" r:id="rIdmcvgeq78vtzlg23xknmmj">
         <w:r>
           <w:t xml:space="preserve">arXiv:1310.5441</w:t>
         </w:r>
@@ -1809,7 +1809,7 @@
       <w:r>
         <w:t xml:space="preserve">, </w:t>
       </w:r>
-      <w:hyperlink w:history="1" r:id="rIds6rgzwrhg4wpxxwbhguhe">
+      <w:hyperlink w:history="1" r:id="rIdh9k4wijkrf9c_4f1jxben">
         <w:r>
           <w:t xml:space="preserve">Phys. Rev. D 80, 084023 (2009)</w:t>
         </w:r>
@@ -1817,7 +1817,7 @@
       <w:r>
         <w:t xml:space="preserve">, </w:t>
       </w:r>
-      <w:hyperlink w:history="1" r:id="rId1s49uqq61eebsus7fgsps">
+      <w:hyperlink w:history="1" r:id="rIdpple76e5fvjehn_0dk4k-">
         <w:r>
           <w:t xml:space="preserve">arXiv:1009.1250</w:t>
         </w:r>
@@ -1862,7 +1862,7 @@
       <w:r>
         <w:t xml:space="preserve">, </w:t>
       </w:r>
-      <w:hyperlink w:history="1" r:id="rIdzgqfmdywn_v8gy8q37twg">
+      <w:hyperlink w:history="1" r:id="rId-kefbimg7kjh7rlf_l-y7">
         <w:r>
           <w:t xml:space="preserve">Astron. Nachr. 342, 277–282 (2021)</w:t>
         </w:r>
@@ -1870,7 +1870,7 @@
       <w:r>
         <w:t xml:space="preserve">, 9th International Workshop on Astronomy and Relativistic Astrophysics, </w:t>
       </w:r>
-      <w:hyperlink w:history="1" r:id="rIdxfn47ctpuntlovzhsezp8">
+      <w:hyperlink w:history="1" r:id="rId2eu4qnrc32nundmbxfxul">
         <w:r>
           <w:t xml:space="preserve">arXiv:2011.13797</w:t>
         </w:r>
@@ -1907,7 +1907,7 @@
       <w:r>
         <w:t xml:space="preserve">, </w:t>
       </w:r>
-      <w:hyperlink w:history="1" r:id="rIdtg1rvvjccs5rvb4ejsl13">
+      <w:hyperlink w:history="1" r:id="rId0mfjyfr0lct2kef6ibg7w">
         <w:r>
           <w:t xml:space="preserve">Astron. Nachr. 342, 147–152 (2021)</w:t>
         </w:r>
@@ -1915,7 +1915,7 @@
       <w:r>
         <w:t xml:space="preserve">, 9th International Workshop on Astronomy and Relativistic Astrophysics, </w:t>
       </w:r>
-      <w:hyperlink w:history="1" r:id="rIdrel4q6do4da20d2vkeod7">
+      <w:hyperlink w:history="1" r:id="rIdh4nt2n1qeqjoant8kwqdd">
         <w:r>
           <w:t xml:space="preserve">arXiv:2011.13805</w:t>
         </w:r>
@@ -1952,7 +1952,7 @@
       <w:r>
         <w:t xml:space="preserve">, </w:t>
       </w:r>
-      <w:hyperlink w:history="1" r:id="rId9o3glicvisyeixaupy4ta">
+      <w:hyperlink w:history="1" r:id="rIdqkvzeyoyqe-sprc7lbxk9">
         <w:r>
           <w:t xml:space="preserve">PoS(SWIFT 10) 233, 159 (2014)</w:t>
         </w:r>
@@ -1960,7 +1960,7 @@
       <w:r>
         <w:t xml:space="preserve">, </w:t>
       </w:r>
-      <w:hyperlink w:history="1" r:id="rId0c6kexkp3kcncae_e0xah">
+      <w:hyperlink w:history="1" r:id="rId4u-c7jlsnhzd-dkyb1zyw">
         <w:r>
           <w:t xml:space="preserve">arXiv:1502.07882</w:t>
         </w:r>
@@ -1997,7 +1997,7 @@
       <w:r>
         <w:t xml:space="preserve">, </w:t>
       </w:r>
-      <w:hyperlink w:history="1" r:id="rIdur1mjjgp3wlxizr4n3er5">
+      <w:hyperlink w:history="1" r:id="rIdti24od9admgh2r_fg8jlv">
         <w:r>
           <w:t xml:space="preserve">EPJ Web Conf. 61, 02007 (2013)</w:t>
         </w:r>
@@ -2005,7 +2005,7 @@
       <w:r>
         <w:t xml:space="preserve">, </w:t>
       </w:r>
-      <w:hyperlink w:history="1" r:id="rIdegj9seyzk66tuxif5on7e">
+      <w:hyperlink w:history="1" r:id="rId2lzyjdjudim_fsq2xfj_g">
         <w:r>
           <w:t xml:space="preserve">arXiv:1309.4612</w:t>
         </w:r>
@@ -2042,7 +2042,7 @@
       <w:r>
         <w:t xml:space="preserve">, </w:t>
       </w:r>
-      <w:hyperlink w:history="1" r:id="rIdjtqph71mv575sqjp_joo_">
+      <w:hyperlink w:history="1" r:id="rId64lrqxkrnujhepepusiug">
         <w:r>
           <w:t xml:space="preserve">J. Phys.: Conf. Ser. 454, 012001 (2013)</w:t>
         </w:r>
@@ -2050,7 +2050,7 @@
       <w:r>
         <w:t xml:space="preserve">, </w:t>
       </w:r>
-      <w:hyperlink w:history="1" r:id="rIdp2bsfbhi1oqpzpozlwx4i">
+      <w:hyperlink w:history="1" r:id="rIdto9wujwlzhmmhk5-6lpsa">
         <w:r>
           <w:t xml:space="preserve">arXiv:1211.1794</w:t>
         </w:r>
@@ -2453,7 +2453,7 @@
       <w:r>
         <w:tab/>
       </w:r>
-      <w:hyperlink w:history="1" r:id="rIdqwhjkibiqqzqt3zm_tf-t">
+      <w:hyperlink w:history="1" r:id="rIdjvy8x4c-gyn4hmdpj6ybh">
         <w:r>
           <w:t xml:space="preserve">github.com/altjerue/ilwikak-ml</w:t>
         </w:r>
@@ -2544,7 +2544,7 @@
       <w:r>
         <w:tab/>
       </w:r>
-      <w:hyperlink w:history="1" r:id="rId6si3vptxyeexmenabcmfm">
+      <w:hyperlink w:history="1" r:id="rId-ukemwkpb6hsmk9odxajn">
         <w:r>
           <w:t xml:space="preserve">github.com/UW-ForestMycobiomeLab/WindSporesHills</w:t>
         </w:r>
@@ -2609,7 +2609,7 @@
       <w:r>
         <w:tab/>
       </w:r>
-      <w:hyperlink w:history="1" r:id="rIdl45cbqd-eblv_ad8zoi7s">
+      <w:hyperlink w:history="1" r:id="rId4lvjo-ydg5pd4cb40_3to">
         <w:r>
           <w:t xml:space="preserve">github.com/zkdavis/Tleco</w:t>
         </w:r>
@@ -2674,7 +2674,7 @@
       <w:r>
         <w:tab/>
       </w:r>
-      <w:hyperlink w:history="1" r:id="rIdeztwyt0o4jorhecqx1z9w">
+      <w:hyperlink w:history="1" r:id="rIddvno_ldbyh7qsbs8m31z-">
         <w:r>
           <w:t xml:space="preserve">github.com/altjerue/paramo</w:t>
         </w:r>
@@ -3285,7 +3285,7 @@
       <w:r>
         <w:t xml:space="preserve">Video: </w:t>
       </w:r>
-      <w:hyperlink w:history="1" r:id="rIdaosmzzciua-ssi6ch0mmj">
+      <w:hyperlink w:history="1" r:id="rId-h2f-9p4ehp1wjop-z7jz">
         <w:r>
           <w:t xml:space="preserve">youtube.com/watch?v=BAZNWLNT69M</w:t>
         </w:r>
@@ -3456,7 +3456,7 @@
       <w:r>
         <w:t xml:space="preserve">Marcos Moshinsky Award for Best Poster. Video: </w:t>
       </w:r>
-      <w:hyperlink w:history="1" r:id="rIddtcbmnb-59r9qi8vz_y7s">
+      <w:hyperlink w:history="1" r:id="rId1j6ua59u1br23lmtnx8zy">
         <w:r>
           <w:t xml:space="preserve">youtube.com/watch?v=0TJiKg7kOPI</w:t>
         </w:r>
@@ -4384,7 +4384,7 @@
       <w:r>
         <w:tab/>
       </w:r>
-      <w:hyperlink w:history="1" r:id="rIds9rh-icm069urnnwsbcjo">
+      <w:hyperlink w:history="1" r:id="rIdfhakly_2f46ivthvr072q">
         <w:r>
           <w:t xml:space="preserve">Kaggle</w:t>
         </w:r>
@@ -4518,7 +4518,7 @@
       <w:r>
         <w:tab/>
       </w:r>
-      <w:hyperlink w:history="1" r:id="rIdcc_y7uy2qhb3djg3xqpku">
+      <w:hyperlink w:history="1" r:id="rIdult3wgbefb1cn8gzvmftg">
         <w:r>
           <w:t xml:space="preserve">Udemy</w:t>
         </w:r>
@@ -4564,7 +4564,7 @@
       <w:r>
         <w:tab/>
       </w:r>
-      <w:hyperlink w:history="1" r:id="rIddzrdwja-1bmkrolgnx9ew">
+      <w:hyperlink w:history="1" r:id="rIdopsaqhi7becxeuoqvrcrb">
         <w:r>
           <w:t xml:space="preserve">Udemy</w:t>
         </w:r>
@@ -4748,7 +4748,7 @@
       <w:pPr>
         <w:spacing w:after="0"/>
       </w:pPr>
-      <w:hyperlink w:history="1" r:id="rIdequucsdocwcxxl5j5y7mk">
+      <w:hyperlink w:history="1" r:id="rIdhcznxu1v3t-_nhg8coaos">
         <w:r>
           <w:t xml:space="preserve">mexiciencia.github.io/post/anita</w:t>
         </w:r>
@@ -4808,7 +4808,7 @@
       <w:pPr>
         <w:spacing w:after="0"/>
       </w:pPr>
-      <w:hyperlink w:history="1" r:id="rId4vkzpc_9fhy9ynsnvbrb1">
+      <w:hyperlink w:history="1" r:id="rIdvh1inpe9hjlenjwrnyy3t">
         <w:r>
           <w:t xml:space="preserve">mexiciencia.github.io/post/modelo-sir</w:t>
         </w:r>
@@ -4871,7 +4871,7 @@
       <w:r>
         <w:t xml:space="preserve">Data analysis and modeling collaborator. </w:t>
       </w:r>
-      <w:hyperlink w:history="1" r:id="rIdzzbqe4w3z7cjub-_yrj7q">
+      <w:hyperlink w:history="1" r:id="rIdbb-u-vsap7t0toqiatxay">
         <w:r>
           <w:t xml:space="preserve">mexiciencia.github.io/post/covid19</w:t>
         </w:r>

</xml_diff>

<commit_message>
Updates for zap energy application
</commit_message>
<xml_diff>
--- a/RuedaBecerrilJM-CV-plain.docx
+++ b/RuedaBecerrilJM-CV-plain.docx
@@ -28,7 +28,7 @@
       <w:r>
         <w:t xml:space="preserve">  |  </w:t>
       </w:r>
-      <w:hyperlink w:history="1" r:id="rIdqe2xteqpfs-xwwpyw_l5w">
+      <w:hyperlink w:history="1" r:id="rIdtpsffr_uogeq8-auxslao">
         <w:r>
           <w:t xml:space="preserve">jm.ruebe@gmail.com</w:t>
         </w:r>
@@ -42,7 +42,7 @@
       <w:r>
         <w:t xml:space="preserve">  |  </w:t>
       </w:r>
-      <w:hyperlink w:history="1" r:id="rIdxgu7kt3jbc7z_xbgidt9t">
+      <w:hyperlink w:history="1" r:id="rIdw7ttykgzq8jclsoyiwr2n">
         <w:r>
           <w:t xml:space="preserve">linkedin.com/in/jeruebe</w:t>
         </w:r>
@@ -53,7 +53,7 @@
         <w:spacing w:after="60"/>
         <w:jc w:val="center"/>
       </w:pPr>
-      <w:hyperlink w:history="1" r:id="rIdvq9men0-_gb9x0la9rml_">
+      <w:hyperlink w:history="1" r:id="rIdqh07bglnrv4wuuljdz2ao">
         <w:r>
           <w:t xml:space="preserve">altjerue.github.io</w:t>
         </w:r>
@@ -61,7 +61,7 @@
       <w:r>
         <w:t xml:space="preserve">  |  </w:t>
       </w:r>
-      <w:hyperlink w:history="1" r:id="rIdgpemroqyluqfdrc4xpkba">
+      <w:hyperlink w:history="1" r:id="rIdxnxxq08i969_dh-7sav1t">
         <w:r>
           <w:t xml:space="preserve">github.com/altjerue</w:t>
         </w:r>
@@ -69,7 +69,7 @@
       <w:r>
         <w:t xml:space="preserve">  |  </w:t>
       </w:r>
-      <w:hyperlink w:history="1" r:id="rIdisyllx7p5omet5tpct8ib">
+      <w:hyperlink w:history="1" r:id="rIddthpyhdojlpv9q06n1smm">
         <w:r>
           <w:t xml:space="preserve">orcid.org/0000-0003-1988-1912</w:t>
         </w:r>
@@ -77,7 +77,7 @@
       <w:r>
         <w:t xml:space="preserve">  |  </w:t>
       </w:r>
-      <w:hyperlink w:history="1" r:id="rIdbwgx4b31esvyk3n0jm1ww">
+      <w:hyperlink w:history="1" r:id="rIdgvctju-5tq4bh4ksh9wxe">
         <w:r>
           <w:t xml:space="preserve">Google Scholar</w:t>
         </w:r>
@@ -93,7 +93,7 @@
     </w:p>
     <w:p>
       <w:r>
-        <w:t xml:space="preserve">Computational physicist with a PhD in Physics and 10+ years developing high-performance numerical algorithms and simulation software for relativistic plasmas. Author of the open-source Paramo library for kinetic particle evolution and radiative transfer. Experience with MHD codes on leadership-class HPC systems and with machine learning for calibrating physical models. Peer-reviewed publications, competitive grants, and collaboration across interdisciplinary teams.</w:t>
+        <w:t xml:space="preserve">Computational physicist with a PhD in Physics and 10+ years developing high-performance numerical algorithms and simulation software for relativistic plasmas. Author of the open-source Paramo library for kinetic particle evolution and radiative transfer. Experience with MHD codes on leadership-class HPC systems and with machine learning for calibrating physical models. Nine peer-reviewed publications, Co-I on a funded NASA grant, and mentor to three graduate students.</w:t>
       </w:r>
     </w:p>
     <w:p>
@@ -116,7 +116,7 @@
         <w:t xml:space="preserve">Simulation: </w:t>
       </w:r>
       <w:r>
-        <w:t xml:space="preserve">Kinetic plasma modeling (Fokker–Planck), radiative processes (synchrotron, inverse Compton), radiative transfer, relativistic MHD, Lagrangian particle dynamics, numerical PDEs (advection–diffusion, Fokker–Planck), finite-difference/finite-volume methods, numerical linear algebra, parameter estimation, uncertainty quantification, synthetic dataset generation</w:t>
+        <w:t xml:space="preserve">Kinetic plasma modeling (Fokker–Planck), radiative processes (synchrotron, inverse Compton), radiative transfer, relativistic MHD, hydrodynamics (SPH), Lagrangian particle dynamics, numerical PDEs (advection–diffusion, Fokker–Planck), finite-difference/finite-volume methods, numerical linear algebra, parameter estimation, uncertainty quantification, synthetic dataset generation</w:t>
       </w:r>
     </w:p>
     <w:p>
@@ -430,7 +430,7 @@
         <w:tab/>
       </w:r>
       <w:r>
-        <w:t xml:space="preserve">Jan 2024 – May 2025</w:t>
+        <w:t xml:space="preserve">Jan 2024 – Present</w:t>
       </w:r>
     </w:p>
     <w:p>
@@ -461,7 +461,7 @@
         <w:spacing w:after="20"/>
       </w:pPr>
       <w:r>
-        <w:t xml:space="preserve">Continued simulation research and open-source development between industry roles.</w:t>
+        <w:t xml:space="preserve">Simulation research and open-source development, ongoing alongside industry roles.</w:t>
       </w:r>
     </w:p>
     <w:p>
@@ -487,7 +487,7 @@
         <w:spacing w:after="10"/>
       </w:pPr>
       <w:r>
-        <w:t xml:space="preserve">Developing WindsOfChange with the UW Forest Mycobiome Lab: a C++/R library that simulates wind-driven spore dispersal over forested, hilly terrain, parallelized with RcppParallel and OpenMP.</w:t>
+        <w:t xml:space="preserve">Developing WindsOfChange with the UW Forest Mycobiome Lab: a C++/R library of Lagrangian particle models for turbulent transport over forested, hilly terrain, parallelized with RcppParallel and OpenMP.</w:t>
       </w:r>
     </w:p>
     <w:p>
@@ -500,66 +500,7 @@
         <w:spacing w:after="10"/>
       </w:pPr>
       <w:r>
-        <w:t xml:space="preserve">Invited talk on machine learning in environmental science at the University of Washington (2024).</w:t>
-      </w:r>
-    </w:p>
-    <w:p>
-      <w:pPr>
-        <w:pStyle w:val="EntryGap"/>
-        <w:spacing w:after="0"/>
-      </w:pPr>
-    </w:p>
-    <w:p>
-      <w:pPr>
-        <w:keepNext/>
-        <w:tabs>
-          <w:tab w:val="right" w:pos="10512"/>
-        </w:tabs>
-        <w:spacing w:after="0"/>
-      </w:pPr>
-      <w:r>
-        <w:rPr>
-          <w:b/>
-          <w:bCs/>
-        </w:rPr>
-        <w:t xml:space="preserve">Software Engineer</w:t>
-      </w:r>
-      <w:r>
-        <w:tab/>
-      </w:r>
-      <w:r>
-        <w:t xml:space="preserve">Apr 2022 – Jan 2024</w:t>
-      </w:r>
-    </w:p>
-    <w:p>
-      <w:pPr>
-        <w:keepNext/>
-        <w:tabs>
-          <w:tab w:val="right" w:pos="10512"/>
-        </w:tabs>
-        <w:spacing w:after="0"/>
-      </w:pPr>
-      <w:r>
-        <w:rPr>
-          <w:i/>
-          <w:iCs/>
-        </w:rPr>
-        <w:t xml:space="preserve">Paychex</w:t>
-      </w:r>
-      <w:r>
-        <w:tab/>
-      </w:r>
-      <w:r>
-        <w:t xml:space="preserve">Remote</w:t>
-      </w:r>
-    </w:p>
-    <w:p>
-      <w:pPr>
-        <w:keepNext/>
-        <w:spacing w:after="20"/>
-      </w:pPr>
-      <w:r>
-        <w:t xml:space="preserve">Built and tested data-integration services between enterprise systems and Oracle E-Business Suite.</w:t>
+        <w:t xml:space="preserve">Used AI coding assistants in the most recent stages of development; changes were accepted only if they passed the unit-test suite and, for some functions, matched reference solutions.</w:t>
       </w:r>
     </w:p>
     <w:p>
@@ -572,7 +513,66 @@
         <w:spacing w:after="10"/>
       </w:pPr>
       <w:r>
-        <w:t xml:space="preserve">Built Java Kafka consumers that moved data between enterprise databases, deployed through Jenkins and OpenShift CI/CD pipelines.</w:t>
+        <w:t xml:space="preserve">Invited talk on machine learning in environmental science at the University of Washington (2024).</w:t>
+      </w:r>
+    </w:p>
+    <w:p>
+      <w:pPr>
+        <w:pStyle w:val="EntryGap"/>
+        <w:spacing w:after="0"/>
+      </w:pPr>
+    </w:p>
+    <w:p>
+      <w:pPr>
+        <w:keepNext/>
+        <w:tabs>
+          <w:tab w:val="right" w:pos="10512"/>
+        </w:tabs>
+        <w:spacing w:after="0"/>
+      </w:pPr>
+      <w:r>
+        <w:rPr>
+          <w:b/>
+          <w:bCs/>
+        </w:rPr>
+        <w:t xml:space="preserve">Software Engineer</w:t>
+      </w:r>
+      <w:r>
+        <w:tab/>
+      </w:r>
+      <w:r>
+        <w:t xml:space="preserve">Apr 2022 – Jan 2024</w:t>
+      </w:r>
+    </w:p>
+    <w:p>
+      <w:pPr>
+        <w:keepNext/>
+        <w:tabs>
+          <w:tab w:val="right" w:pos="10512"/>
+        </w:tabs>
+        <w:spacing w:after="0"/>
+      </w:pPr>
+      <w:r>
+        <w:rPr>
+          <w:i/>
+          <w:iCs/>
+        </w:rPr>
+        <w:t xml:space="preserve">Paychex</w:t>
+      </w:r>
+      <w:r>
+        <w:tab/>
+      </w:r>
+      <w:r>
+        <w:t xml:space="preserve">Remote</w:t>
+      </w:r>
+    </w:p>
+    <w:p>
+      <w:pPr>
+        <w:keepNext/>
+        <w:spacing w:after="20"/>
+      </w:pPr>
+      <w:r>
+        <w:t xml:space="preserve">Built and tested data-integration services between enterprise systems and Oracle E-Business Suite.</w:t>
       </w:r>
     </w:p>
     <w:p>
@@ -585,7 +585,7 @@
         <w:spacing w:after="10"/>
       </w:pPr>
       <w:r>
-        <w:t xml:space="preserve">Created Splunk dashboards tracking the 200–400 users shared between enterprise systems and Oracle EBS, with alerts that flagged production incidents.</w:t>
+        <w:t xml:space="preserve">Built Java Kafka consumers that moved data between enterprise databases, deployed through Jenkins and OpenShift CI/CD pipelines.</w:t>
       </w:r>
     </w:p>
     <w:p>
@@ -598,7 +598,7 @@
         <w:spacing w:after="10"/>
       </w:pPr>
       <w:r>
-        <w:t xml:space="preserve">Wrote full test suites for 5+ Python services in the CI pipeline, keeping production defect rates low.</w:t>
+        <w:t xml:space="preserve">Created Splunk dashboards tracking the 200–400 users shared between enterprise systems and Oracle EBS, with alerts that flagged production incidents.</w:t>
       </w:r>
     </w:p>
     <w:p>
@@ -611,66 +611,7 @@
         <w:spacing w:after="10"/>
       </w:pPr>
       <w:r>
-        <w:t xml:space="preserve">Prepared, validated, and analyzed Oracle EBS data with SQL.</w:t>
-      </w:r>
-    </w:p>
-    <w:p>
-      <w:pPr>
-        <w:pStyle w:val="EntryGap"/>
-        <w:spacing w:after="0"/>
-      </w:pPr>
-    </w:p>
-    <w:p>
-      <w:pPr>
-        <w:keepNext/>
-        <w:tabs>
-          <w:tab w:val="right" w:pos="10512"/>
-        </w:tabs>
-        <w:spacing w:after="0"/>
-      </w:pPr>
-      <w:r>
-        <w:rPr>
-          <w:b/>
-          <w:bCs/>
-        </w:rPr>
-        <w:t xml:space="preserve">Postdoctoral Research Associate</w:t>
-      </w:r>
-      <w:r>
-        <w:tab/>
-      </w:r>
-      <w:r>
-        <w:t xml:space="preserve">Feb 2021 – Apr 2022</w:t>
-      </w:r>
-    </w:p>
-    <w:p>
-      <w:pPr>
-        <w:keepNext/>
-        <w:tabs>
-          <w:tab w:val="right" w:pos="10512"/>
-        </w:tabs>
-        <w:spacing w:after="0"/>
-      </w:pPr>
-      <w:r>
-        <w:rPr>
-          <w:i/>
-          <w:iCs/>
-        </w:rPr>
-        <w:t xml:space="preserve">Rochester Institute of Technology</w:t>
-      </w:r>
-      <w:r>
-        <w:tab/>
-      </w:r>
-      <w:r>
-        <w:t xml:space="preserve">Rochester, NY</w:t>
-      </w:r>
-    </w:p>
-    <w:p>
-      <w:pPr>
-        <w:keepNext/>
-        <w:spacing w:after="20"/>
-      </w:pPr>
-      <w:r>
-        <w:t xml:space="preserve">HPC simulations of supermassive black-hole binaries in an NSF-funded project.</w:t>
+        <w:t xml:space="preserve">Wrote full test suites for 5+ Python services in the CI pipeline, keeping production defect rates low.</w:t>
       </w:r>
     </w:p>
     <w:p>
@@ -683,7 +624,66 @@
         <w:spacing w:after="10"/>
       </w:pPr>
       <w:r>
-        <w:t xml:space="preserve">Led a 7-person team upgrading PatchworkMHD, a C code for magnetohydrodynamic simulations of supermassive black-hole binaries.</w:t>
+        <w:t xml:space="preserve">Prepared, validated, and analyzed Oracle EBS data with SQL.</w:t>
+      </w:r>
+    </w:p>
+    <w:p>
+      <w:pPr>
+        <w:pStyle w:val="EntryGap"/>
+        <w:spacing w:after="0"/>
+      </w:pPr>
+    </w:p>
+    <w:p>
+      <w:pPr>
+        <w:keepNext/>
+        <w:tabs>
+          <w:tab w:val="right" w:pos="10512"/>
+        </w:tabs>
+        <w:spacing w:after="0"/>
+      </w:pPr>
+      <w:r>
+        <w:rPr>
+          <w:b/>
+          <w:bCs/>
+        </w:rPr>
+        <w:t xml:space="preserve">Postdoctoral Research Associate</w:t>
+      </w:r>
+      <w:r>
+        <w:tab/>
+      </w:r>
+      <w:r>
+        <w:t xml:space="preserve">Feb 2021 – Apr 2022</w:t>
+      </w:r>
+    </w:p>
+    <w:p>
+      <w:pPr>
+        <w:keepNext/>
+        <w:tabs>
+          <w:tab w:val="right" w:pos="10512"/>
+        </w:tabs>
+        <w:spacing w:after="0"/>
+      </w:pPr>
+      <w:r>
+        <w:rPr>
+          <w:i/>
+          <w:iCs/>
+        </w:rPr>
+        <w:t xml:space="preserve">Rochester Institute of Technology</w:t>
+      </w:r>
+      <w:r>
+        <w:tab/>
+      </w:r>
+      <w:r>
+        <w:t xml:space="preserve">Rochester, NY</w:t>
+      </w:r>
+    </w:p>
+    <w:p>
+      <w:pPr>
+        <w:keepNext/>
+        <w:spacing w:after="20"/>
+      </w:pPr>
+      <w:r>
+        <w:t xml:space="preserve">HPC simulations of supermassive black hole binaries in an NSF-funded project.</w:t>
       </w:r>
     </w:p>
     <w:p>
@@ -696,7 +696,7 @@
         <w:spacing w:after="10"/>
       </w:pPr>
       <w:r>
-        <w:t xml:space="preserve">Added black-hole spin to the simulations with under 5% runtime overhead.</w:t>
+        <w:t xml:space="preserve">Led a 7-person team upgrading PatchworkMHD, a C code for magnetohydrodynamic simulations of supermassive black hole binaries.</w:t>
       </w:r>
     </w:p>
     <w:p>
@@ -709,7 +709,7 @@
         <w:spacing w:after="10"/>
       </w:pPr>
       <w:r>
-        <w:t xml:space="preserve">Designed and ran benchmark simulations of the new features on TACC's Frontera supercomputer (about 1,200 node-hours), identifying performance optimization opportunities.</w:t>
+        <w:t xml:space="preserve">Added black hole spin to the simulations with under 5% runtime overhead.</w:t>
       </w:r>
     </w:p>
     <w:p>
@@ -722,7 +722,7 @@
         <w:spacing w:after="10"/>
       </w:pPr>
       <w:r>
-        <w:t xml:space="preserve">Calibrated Paramo model parameters against Fermi-LAT gamma-ray spectra with gradient-based optimization, and supervised a graduate student applying gradient descent to the same problem.</w:t>
+        <w:t xml:space="preserve">Designed and ran benchmark simulations of the new features on TACC's Frontera supercomputer (about 10,000 node-hours), identifying performance optimization opportunities.</w:t>
       </w:r>
     </w:p>
     <w:p>
@@ -735,66 +735,7 @@
         <w:spacing w:after="10"/>
       </w:pPr>
       <w:r>
-        <w:t xml:space="preserve">Co-authored 2 papers from a multi-institution study of binary neutron-star mergers [6, 7] and a third on blazar heating and cooling [8].</w:t>
-      </w:r>
-    </w:p>
-    <w:p>
-      <w:pPr>
-        <w:pStyle w:val="EntryGap"/>
-        <w:spacing w:after="0"/>
-      </w:pPr>
-    </w:p>
-    <w:p>
-      <w:pPr>
-        <w:keepNext/>
-        <w:tabs>
-          <w:tab w:val="right" w:pos="10512"/>
-        </w:tabs>
-        <w:spacing w:after="0"/>
-      </w:pPr>
-      <w:r>
-        <w:rPr>
-          <w:b/>
-          <w:bCs/>
-        </w:rPr>
-        <w:t xml:space="preserve">Postdoctoral Research Fellow</w:t>
-      </w:r>
-      <w:r>
-        <w:tab/>
-      </w:r>
-      <w:r>
-        <w:t xml:space="preserve">Oct 2018 – Nov 2020</w:t>
-      </w:r>
-    </w:p>
-    <w:p>
-      <w:pPr>
-        <w:keepNext/>
-        <w:tabs>
-          <w:tab w:val="right" w:pos="10512"/>
-        </w:tabs>
-        <w:spacing w:after="0"/>
-      </w:pPr>
-      <w:r>
-        <w:rPr>
-          <w:i/>
-          <w:iCs/>
-        </w:rPr>
-        <w:t xml:space="preserve">Purdue University</w:t>
-      </w:r>
-      <w:r>
-        <w:tab/>
-      </w:r>
-      <w:r>
-        <w:t xml:space="preserve">West Lafayette, IN</w:t>
-      </w:r>
-    </w:p>
-    <w:p>
-      <w:pPr>
-        <w:keepNext/>
-        <w:spacing w:after="20"/>
-      </w:pPr>
-      <w:r>
-        <w:t xml:space="preserve">Radiative-transfer modeling of relativistic jets (blazars and gamma-ray burst afterglows).</w:t>
+        <w:t xml:space="preserve">Calibrated Paramo model parameters against Fermi-LAT gamma-ray spectra with gradient-based optimization, and supervised a graduate student applying gradient descent to the same problem.</w:t>
       </w:r>
     </w:p>
     <w:p>
@@ -807,7 +748,66 @@
         <w:spacing w:after="10"/>
       </w:pPr>
       <w:r>
-        <w:t xml:space="preserve">Architected Paramo, an open-source Fortran 95 library that solves the Fokker–Planck equation coupled to radiative transfer; parallelized and optimized it with OpenMP, making it about 20× faster than the original serial code on 5 cores.</w:t>
+        <w:t xml:space="preserve">Co-authored 2 papers from a multi-institution study of binary neutron star mergers [6, 7] and a third, a Fokker–Planck model of relativistic turbulent heating balanced by radiative cooling with transport coefficients from PIC simulations [8].</w:t>
+      </w:r>
+    </w:p>
+    <w:p>
+      <w:pPr>
+        <w:pStyle w:val="EntryGap"/>
+        <w:spacing w:after="0"/>
+      </w:pPr>
+    </w:p>
+    <w:p>
+      <w:pPr>
+        <w:keepNext/>
+        <w:tabs>
+          <w:tab w:val="right" w:pos="10512"/>
+        </w:tabs>
+        <w:spacing w:after="0"/>
+      </w:pPr>
+      <w:r>
+        <w:rPr>
+          <w:b/>
+          <w:bCs/>
+        </w:rPr>
+        <w:t xml:space="preserve">Postdoctoral Research Fellow</w:t>
+      </w:r>
+      <w:r>
+        <w:tab/>
+      </w:r>
+      <w:r>
+        <w:t xml:space="preserve">Oct 2018 – Nov 2020</w:t>
+      </w:r>
+    </w:p>
+    <w:p>
+      <w:pPr>
+        <w:keepNext/>
+        <w:tabs>
+          <w:tab w:val="right" w:pos="10512"/>
+        </w:tabs>
+        <w:spacing w:after="0"/>
+      </w:pPr>
+      <w:r>
+        <w:rPr>
+          <w:i/>
+          <w:iCs/>
+        </w:rPr>
+        <w:t xml:space="preserve">Purdue University</w:t>
+      </w:r>
+      <w:r>
+        <w:tab/>
+      </w:r>
+      <w:r>
+        <w:t xml:space="preserve">West Lafayette, IN</w:t>
+      </w:r>
+    </w:p>
+    <w:p>
+      <w:pPr>
+        <w:keepNext/>
+        <w:spacing w:after="20"/>
+      </w:pPr>
+      <w:r>
+        <w:t xml:space="preserve">Radiative-transfer modeling of relativistic jets (blazars and gamma-ray burst afterglows).</w:t>
       </w:r>
     </w:p>
     <w:p>
@@ -820,7 +820,7 @@
         <w:spacing w:after="10"/>
       </w:pPr>
       <w:r>
-        <w:t xml:space="preserve">Paramo has been adopted by other research groups, including in Combi &amp; Siegel (2023).</w:t>
+        <w:t xml:space="preserve">Architected Paramo, an open-source Fortran 95 library that solves the Fokker–Planck equation coupled to radiative transfer; parallelized and optimized it with OpenMP.</w:t>
       </w:r>
     </w:p>
     <w:p>
@@ -833,7 +833,7 @@
         <w:spacing w:after="10"/>
       </w:pPr>
       <w:r>
-        <w:t xml:space="preserve">Co-I on two NASA Fermi Guest Investigator proposals; one was funded ($68K) and supported the finding that blazar jets are launched with similar energy per baryon, independently of their power [5].</w:t>
+        <w:t xml:space="preserve">Paramo has been adopted by other research groups, including in Combi &amp; Siegel (2023).</w:t>
       </w:r>
     </w:p>
     <w:p>
@@ -846,7 +846,7 @@
         <w:spacing w:after="10"/>
       </w:pPr>
       <w:r>
-        <w:t xml:space="preserve">Added numerical-integration and OpenMP features to Paramo and built Python tools to compute energy losses and spectra of high-energy particles in gamma-ray burst afterglows [4].</w:t>
+        <w:t xml:space="preserve">Co-I on two NASA Fermi Guest Investigator proposals; one was funded ($68K) and supported the finding that blazar jets are launched with similar energy per baryon, independently of their power [5].</w:t>
       </w:r>
     </w:p>
     <w:p>
@@ -859,7 +859,7 @@
         <w:spacing w:after="10"/>
       </w:pPr>
       <w:r>
-        <w:t xml:space="preserve">Mentored 3 graduate students (1 M.S., 2 Ph.D.), co-authoring papers with each.</w:t>
+        <w:t xml:space="preserve">Added numerical-integration and OpenMP features to Paramo and built Python tools to compute energy losses and spectra of high-energy particles in gamma-ray burst afterglows [4].</w:t>
       </w:r>
     </w:p>
     <w:p>
@@ -872,57 +872,7 @@
         <w:spacing w:after="10"/>
       </w:pPr>
       <w:r>
-        <w:t xml:space="preserve">Wrote Python scripts for statistical modeling of the COVID-19 outbreak in Mexico with a multidisciplinary group, and co-wrote Spanish-language infographics and blog posts against misinformation.</w:t>
-      </w:r>
-    </w:p>
-    <w:p>
-      <w:pPr>
-        <w:pStyle w:val="EntryGap"/>
-        <w:spacing w:after="0"/>
-      </w:pPr>
-    </w:p>
-    <w:p>
-      <w:pPr>
-        <w:keepNext/>
-        <w:tabs>
-          <w:tab w:val="right" w:pos="10512"/>
-        </w:tabs>
-        <w:spacing w:after="0"/>
-      </w:pPr>
-      <w:r>
-        <w:rPr>
-          <w:b/>
-          <w:bCs/>
-        </w:rPr>
-        <w:t xml:space="preserve">Postdoctoral Research Fellow</w:t>
-      </w:r>
-      <w:r>
-        <w:tab/>
-      </w:r>
-      <w:r>
-        <w:t xml:space="preserve">Jan 2018 – Sep 2018</w:t>
-      </w:r>
-    </w:p>
-    <w:p>
-      <w:pPr>
-        <w:keepNext/>
-        <w:tabs>
-          <w:tab w:val="right" w:pos="10512"/>
-        </w:tabs>
-        <w:spacing w:after="0"/>
-      </w:pPr>
-      <w:r>
-        <w:rPr>
-          <w:i/>
-          <w:iCs/>
-        </w:rPr>
-        <w:t xml:space="preserve">Universidad Michoacana de San Nicolás de Hidalgo</w:t>
-      </w:r>
-      <w:r>
-        <w:tab/>
-      </w:r>
-      <w:r>
-        <w:t xml:space="preserve">Morelia, Mexico</w:t>
+        <w:t xml:space="preserve">Mentored 3 graduate students (1 M.S., 2 Ph.D.), co-authoring papers with each.</w:t>
       </w:r>
     </w:p>
     <w:p>
@@ -935,7 +885,57 @@
         <w:spacing w:after="10"/>
       </w:pPr>
       <w:r>
-        <w:t xml:space="preserve">Built a Python pipeline that turned GRTrans black-hole simulation images into training data for an SVM classifier of black-hole spin (grayscale conversion, intensity normalization, spatial feature extraction).</w:t>
+        <w:t xml:space="preserve">Wrote Python scripts for statistical modeling of the COVID-19 outbreak in Mexico with a multidisciplinary group, and co-wrote Spanish-language infographics and blog posts against misinformation.</w:t>
+      </w:r>
+    </w:p>
+    <w:p>
+      <w:pPr>
+        <w:pStyle w:val="EntryGap"/>
+        <w:spacing w:after="0"/>
+      </w:pPr>
+    </w:p>
+    <w:p>
+      <w:pPr>
+        <w:keepNext/>
+        <w:tabs>
+          <w:tab w:val="right" w:pos="10512"/>
+        </w:tabs>
+        <w:spacing w:after="0"/>
+      </w:pPr>
+      <w:r>
+        <w:rPr>
+          <w:b/>
+          <w:bCs/>
+        </w:rPr>
+        <w:t xml:space="preserve">Postdoctoral Research Fellow</w:t>
+      </w:r>
+      <w:r>
+        <w:tab/>
+      </w:r>
+      <w:r>
+        <w:t xml:space="preserve">Jan 2018 – Sep 2018</w:t>
+      </w:r>
+    </w:p>
+    <w:p>
+      <w:pPr>
+        <w:keepNext/>
+        <w:tabs>
+          <w:tab w:val="right" w:pos="10512"/>
+        </w:tabs>
+        <w:spacing w:after="0"/>
+      </w:pPr>
+      <w:r>
+        <w:rPr>
+          <w:i/>
+          <w:iCs/>
+        </w:rPr>
+        <w:t xml:space="preserve">Universidad Michoacana de San Nicolás de Hidalgo</w:t>
+      </w:r>
+      <w:r>
+        <w:tab/>
+      </w:r>
+      <w:r>
+        <w:t xml:space="preserve">Morelia, Mexico</w:t>
       </w:r>
     </w:p>
     <w:p>
@@ -948,7 +948,7 @@
         <w:spacing w:after="10"/>
       </w:pPr>
       <w:r>
-        <w:t xml:space="preserve">Released an open-source Python tool for computing radiative-transfer spectra and light curves in relativistic astrophysics.</w:t>
+        <w:t xml:space="preserve">Built a Python pipeline that turned GRTrans black hole simulation images into training data for an SVM classifier of black hole spin (grayscale conversion, intensity normalization, spatial feature extraction).</w:t>
       </w:r>
     </w:p>
     <w:p>
@@ -961,57 +961,7 @@
         <w:spacing w:after="10"/>
       </w:pPr>
       <w:r>
-        <w:t xml:space="preserve">Organized an HDF5 workshop to train graduate students in high-volume data storage.</w:t>
-      </w:r>
-    </w:p>
-    <w:p>
-      <w:pPr>
-        <w:pStyle w:val="EntryGap"/>
-        <w:spacing w:after="0"/>
-      </w:pPr>
-    </w:p>
-    <w:p>
-      <w:pPr>
-        <w:keepNext/>
-        <w:tabs>
-          <w:tab w:val="right" w:pos="10512"/>
-        </w:tabs>
-        <w:spacing w:after="0"/>
-      </w:pPr>
-      <w:r>
-        <w:rPr>
-          <w:b/>
-          <w:bCs/>
-        </w:rPr>
-        <w:t xml:space="preserve">Graduate Research Assistant</w:t>
-      </w:r>
-      <w:r>
-        <w:tab/>
-      </w:r>
-      <w:r>
-        <w:t xml:space="preserve">Oct 2011 – Jul 2017</w:t>
-      </w:r>
-    </w:p>
-    <w:p>
-      <w:pPr>
-        <w:keepNext/>
-        <w:tabs>
-          <w:tab w:val="right" w:pos="10512"/>
-        </w:tabs>
-        <w:spacing w:after="0"/>
-      </w:pPr>
-      <w:r>
-        <w:rPr>
-          <w:i/>
-          <w:iCs/>
-        </w:rPr>
-        <w:t xml:space="preserve">Universitat de València</w:t>
-      </w:r>
-      <w:r>
-        <w:tab/>
-      </w:r>
-      <w:r>
-        <w:t xml:space="preserve">Valencia, Spain</w:t>
+        <w:t xml:space="preserve">Released an open-source Python tool for computing radiative-transfer spectra and light curves in relativistic astrophysics.</w:t>
       </w:r>
     </w:p>
     <w:p>
@@ -1024,7 +974,57 @@
         <w:spacing w:after="10"/>
       </w:pPr>
       <w:r>
-        <w:t xml:space="preserve">Automated runs of the C-SPEV radiative-transfer code with Shell and Python pipelines: 10–60 simulations per project and tens of GB of HDF5 output, with data-quality checks for downstream analysis.</w:t>
+        <w:t xml:space="preserve">Organized an HDF5 workshop to train graduate students in high-volume data storage.</w:t>
+      </w:r>
+    </w:p>
+    <w:p>
+      <w:pPr>
+        <w:pStyle w:val="EntryGap"/>
+        <w:spacing w:after="0"/>
+      </w:pPr>
+    </w:p>
+    <w:p>
+      <w:pPr>
+        <w:keepNext/>
+        <w:tabs>
+          <w:tab w:val="right" w:pos="10512"/>
+        </w:tabs>
+        <w:spacing w:after="0"/>
+      </w:pPr>
+      <w:r>
+        <w:rPr>
+          <w:b/>
+          <w:bCs/>
+        </w:rPr>
+        <w:t xml:space="preserve">Graduate Research Assistant</w:t>
+      </w:r>
+      <w:r>
+        <w:tab/>
+      </w:r>
+      <w:r>
+        <w:t xml:space="preserve">Oct 2011 – Jul 2017</w:t>
+      </w:r>
+    </w:p>
+    <w:p>
+      <w:pPr>
+        <w:keepNext/>
+        <w:tabs>
+          <w:tab w:val="right" w:pos="10512"/>
+        </w:tabs>
+        <w:spacing w:after="0"/>
+      </w:pPr>
+      <w:r>
+        <w:rPr>
+          <w:i/>
+          <w:iCs/>
+        </w:rPr>
+        <w:t xml:space="preserve">Universitat de València</w:t>
+      </w:r>
+      <w:r>
+        <w:tab/>
+      </w:r>
+      <w:r>
+        <w:t xml:space="preserve">Valencia, Spain</w:t>
       </w:r>
     </w:p>
     <w:p>
@@ -1037,7 +1037,7 @@
         <w:spacing w:after="10"/>
       </w:pPr>
       <w:r>
-        <w:t xml:space="preserve">Analyzed multi-wavelength observations from the NASA Fermi-LAT telescope and the Very Long Baseline Array (VLBA), including cross-matching sources across catalogs by sky coordinates and fitting log-parabola spectra.</w:t>
+        <w:t xml:space="preserve">Studied how magnetization of shocked plasma shapes the radiation spectra of relativistic internal shocks, using the C-SPEV simulation code.</w:t>
       </w:r>
     </w:p>
     <w:p>
@@ -1050,7 +1050,7 @@
         <w:spacing w:after="10"/>
       </w:pPr>
       <w:r>
-        <w:t xml:space="preserve">Fit C-SPEV simulation models to telescope data, identifying spectral and light-curve patterns that quantify the magnetization of plasma in blazars.</w:t>
+        <w:t xml:space="preserve">Automated runs of the C-SPEV radiative-transfer code with Shell and Python pipelines: 10–60 simulations per project and tens of GB of HDF5 output, with data-quality checks for downstream analysis.</w:t>
       </w:r>
     </w:p>
     <w:p>
@@ -1063,7 +1063,7 @@
         <w:spacing w:after="10"/>
       </w:pPr>
       <w:r>
-        <w:t xml:space="preserve">Extended C-SPEV to compute discrete and continuous spectra from particle distributions of arbitrary shape, without affecting simulation runtime.</w:t>
+        <w:t xml:space="preserve">Analyzed multi-wavelength observations from the NASA Fermi-LAT telescope and the Very Long Baseline Array (VLBA), including cross-matching sources across catalogs by sky coordinates and fitting log-parabola spectra.</w:t>
       </w:r>
     </w:p>
     <w:p>
@@ -1076,1403 +1076,8 @@
         <w:spacing w:after="10"/>
       </w:pPr>
       <w:r>
-        <w:t xml:space="preserve">Published 2 first-author papers in MNRAS [2, 3].</w:t>
-      </w:r>
-    </w:p>
-    <w:p>
-      <w:pPr>
-        <w:pStyle w:val="EntryGap"/>
-        <w:spacing w:after="0"/>
-      </w:pPr>
-    </w:p>
-    <w:p>
-      <w:pPr>
-        <w:pStyle w:val="Heading1"/>
-      </w:pPr>
-      <w:r>
-        <w:t xml:space="preserve">Education</w:t>
-      </w:r>
-    </w:p>
-    <w:p>
-      <w:pPr>
-        <w:keepNext/>
-        <w:tabs>
-          <w:tab w:val="right" w:pos="10512"/>
-        </w:tabs>
-        <w:spacing w:after="0"/>
-      </w:pPr>
-      <w:r>
-        <w:rPr>
-          <w:b/>
-          <w:bCs/>
-        </w:rPr>
-        <w:t xml:space="preserve">Ph.D. in Physics</w:t>
-      </w:r>
-      <w:r>
-        <w:tab/>
-      </w:r>
-      <w:r>
-        <w:t xml:space="preserve">Oct 2011 – Jul 2017</w:t>
-      </w:r>
-    </w:p>
-    <w:p>
-      <w:pPr>
-        <w:keepNext/>
-        <w:tabs>
-          <w:tab w:val="right" w:pos="10512"/>
-        </w:tabs>
-        <w:spacing w:after="0"/>
-      </w:pPr>
-      <w:r>
-        <w:rPr>
-          <w:i/>
-          <w:iCs/>
-        </w:rPr>
-        <w:t xml:space="preserve">Universitat de València</w:t>
-      </w:r>
-      <w:r>
-        <w:tab/>
-      </w:r>
-      <w:r>
-        <w:t xml:space="preserve">Valencia, Spain</w:t>
-      </w:r>
-    </w:p>
-    <w:p>
-      <w:pPr>
-        <w:spacing w:after="0"/>
-      </w:pPr>
-      <w:r>
-        <w:t xml:space="preserve">Excellent </w:t>
-      </w:r>
-      <w:r>
-        <w:rPr>
-          <w:i/>
-          <w:iCs/>
-        </w:rPr>
-        <w:t xml:space="preserve">cum laude</w:t>
-      </w:r>
-    </w:p>
-    <w:p>
-      <w:pPr>
-        <w:spacing w:after="0"/>
-      </w:pPr>
-      <w:r>
-        <w:t xml:space="preserve">Advisors: Prof. Miguel A. Aloy and Dr. Petar Mimica</w:t>
-      </w:r>
-    </w:p>
-    <w:p>
-      <w:pPr>
-        <w:spacing w:after="0"/>
-      </w:pPr>
-      <w:r>
-        <w:t xml:space="preserve">Thesis: </w:t>
-      </w:r>
-      <w:hyperlink w:history="1" r:id="rIdjf3kmiesiqnl3nbage7cd">
-        <w:r>
-          <w:t xml:space="preserve">Numerical treatment of radiation processes in the internal shocks of magnetized relativistic outflows</w:t>
-        </w:r>
-      </w:hyperlink>
-    </w:p>
-    <w:p>
-      <w:pPr>
-        <w:pStyle w:val="EntryGap"/>
-        <w:spacing w:after="0"/>
-      </w:pPr>
-    </w:p>
-    <w:p>
-      <w:pPr>
-        <w:keepNext/>
-        <w:tabs>
-          <w:tab w:val="right" w:pos="10512"/>
-        </w:tabs>
-        <w:spacing w:after="0"/>
-      </w:pPr>
-      <w:r>
-        <w:rPr>
-          <w:b/>
-          <w:bCs/>
-        </w:rPr>
-        <w:t xml:space="preserve">M.Sc. in Physics</w:t>
-      </w:r>
-      <w:r>
-        <w:tab/>
-      </w:r>
-      <w:r>
-        <w:t xml:space="preserve">Aug 2009 – Sep 2011</w:t>
-      </w:r>
-    </w:p>
-    <w:p>
-      <w:pPr>
-        <w:keepNext/>
-        <w:tabs>
-          <w:tab w:val="right" w:pos="10512"/>
-        </w:tabs>
-        <w:spacing w:after="0"/>
-      </w:pPr>
-      <w:r>
-        <w:rPr>
-          <w:i/>
-          <w:iCs/>
-        </w:rPr>
-        <w:t xml:space="preserve">Universidad Michoacana de San Nicolás de Hidalgo</w:t>
-      </w:r>
-      <w:r>
-        <w:tab/>
-      </w:r>
-      <w:r>
-        <w:t xml:space="preserve">Morelia, Mexico</w:t>
-      </w:r>
-    </w:p>
-    <w:p>
-      <w:pPr>
-        <w:spacing w:after="0"/>
-      </w:pPr>
-      <w:r>
-        <w:t xml:space="preserve">Advisor: Prof. José A. Cervera</w:t>
-      </w:r>
-    </w:p>
-    <w:p>
-      <w:pPr>
-        <w:spacing w:after="0"/>
-      </w:pPr>
-      <w:r>
-        <w:t xml:space="preserve">Thesis: </w:t>
-      </w:r>
-      <w:r>
-        <w:rPr>
-          <w:i/>
-          <w:iCs/>
-        </w:rPr>
-        <w:t xml:space="preserve">Study of TOV stars with the SPH method</w:t>
-      </w:r>
-    </w:p>
-    <w:p>
-      <w:pPr>
-        <w:pStyle w:val="EntryGap"/>
-        <w:spacing w:after="0"/>
-      </w:pPr>
-    </w:p>
-    <w:p>
-      <w:pPr>
-        <w:keepNext/>
-        <w:tabs>
-          <w:tab w:val="right" w:pos="10512"/>
-        </w:tabs>
-        <w:spacing w:after="0"/>
-      </w:pPr>
-      <w:r>
-        <w:rPr>
-          <w:b/>
-          <w:bCs/>
-        </w:rPr>
-        <w:t xml:space="preserve">B.Sc. in Physics</w:t>
-      </w:r>
-      <w:r>
-        <w:tab/>
-      </w:r>
-      <w:r>
-        <w:t xml:space="preserve">Aug 2004 – Dec 2008</w:t>
-      </w:r>
-    </w:p>
-    <w:p>
-      <w:pPr>
-        <w:keepNext/>
-        <w:tabs>
-          <w:tab w:val="right" w:pos="10512"/>
-        </w:tabs>
-        <w:spacing w:after="0"/>
-      </w:pPr>
-      <w:r>
-        <w:rPr>
-          <w:i/>
-          <w:iCs/>
-        </w:rPr>
-        <w:t xml:space="preserve">Universidad Autónoma del Estado de México</w:t>
-      </w:r>
-      <w:r>
-        <w:tab/>
-      </w:r>
-      <w:r>
-        <w:t xml:space="preserve">Toluca, Mexico</w:t>
-      </w:r>
-    </w:p>
-    <w:p>
-      <w:pPr>
-        <w:spacing w:after="0"/>
-      </w:pPr>
-      <w:r>
-        <w:t xml:space="preserve">Advisor: Prof. Francisco S. Guzmán</w:t>
-      </w:r>
-    </w:p>
-    <w:p>
-      <w:pPr>
-        <w:spacing w:after="0"/>
-      </w:pPr>
-      <w:r>
-        <w:t xml:space="preserve">Thesis: </w:t>
-      </w:r>
-      <w:r>
-        <w:rPr>
-          <w:i/>
-          <w:iCs/>
-        </w:rPr>
-        <w:t xml:space="preserve">Numerical solution of null geodesics for the generation of gravitational lenses produced by spherically-symmetric and static spacetimes</w:t>
-      </w:r>
-    </w:p>
-    <w:p>
-      <w:pPr>
-        <w:spacing w:after="0"/>
-      </w:pPr>
-      <w:r>
-        <w:t xml:space="preserve">Lic. Juan Josafat Pichardo Cruz Award</w:t>
-      </w:r>
-    </w:p>
-    <w:p>
-      <w:pPr>
-        <w:pStyle w:val="EntryGap"/>
-        <w:spacing w:after="0"/>
-      </w:pPr>
-    </w:p>
-    <w:p>
-      <w:pPr>
-        <w:pStyle w:val="Heading1"/>
-      </w:pPr>
-      <w:r>
-        <w:t xml:space="preserve">Publications</w:t>
-      </w:r>
-    </w:p>
-    <w:p>
-      <w:pPr>
-        <w:pStyle w:val="Heading2"/>
-      </w:pPr>
-      <w:r>
-        <w:t xml:space="preserve">Articles (9 published, 3 first-author; 3 in preparation)</w:t>
-      </w:r>
-    </w:p>
-    <w:p>
-      <w:pPr>
-        <w:spacing w:after="20"/>
-        <w:ind w:left="300" w:hanging="300"/>
-      </w:pPr>
-      <w:r>
-        <w:t xml:space="preserve">[12] Winkowski, S., </w:t>
-      </w:r>
-      <w:r>
-        <w:rPr>
-          <w:b/>
-          <w:bCs/>
-        </w:rPr>
-        <w:t xml:space="preserve">Rueda-Becerril, J. M.</w:t>
-      </w:r>
-      <w:r>
-        <w:t xml:space="preserve">, &amp; Willing, C. </w:t>
-      </w:r>
-      <w:r>
-        <w:rPr>
-          <w:i/>
-          <w:iCs/>
-        </w:rPr>
-        <w:t xml:space="preserve">Using Numerical Simulations of Wind on Hilly Terrain to Model Propagule Dispersal</w:t>
-      </w:r>
-      <w:r>
-        <w:t xml:space="preserve">, in prep.</w:t>
-      </w:r>
-    </w:p>
-    <w:p>
-      <w:pPr>
-        <w:spacing w:after="20"/>
-        <w:ind w:left="300" w:hanging="300"/>
-      </w:pPr>
-      <w:r>
-        <w:t xml:space="preserve">[11] Holzman, L., </w:t>
-      </w:r>
-      <w:r>
-        <w:rPr>
-          <w:b/>
-          <w:bCs/>
-        </w:rPr>
-        <w:t xml:space="preserve">Rueda-Becerril, J. M.</w:t>
-      </w:r>
-      <w:r>
-        <w:t xml:space="preserve">, Creamer, C., &amp; Willing, C. </w:t>
-      </w:r>
-      <w:r>
-        <w:rPr>
-          <w:i/>
-          <w:iCs/>
-        </w:rPr>
-        <w:t xml:space="preserve">Random Forest Link Landscape Position to Drought Resilience in Giant Sequoia Forests</w:t>
-      </w:r>
-      <w:r>
-        <w:t xml:space="preserve">, in prep.</w:t>
-      </w:r>
-    </w:p>
-    <w:p>
-      <w:pPr>
-        <w:spacing w:after="20"/>
-        <w:ind w:left="300" w:hanging="300"/>
-      </w:pPr>
-      <w:r>
-        <w:t xml:space="preserve">[10] </w:t>
-      </w:r>
-      <w:r>
-        <w:rPr>
-          <w:b/>
-          <w:bCs/>
-        </w:rPr>
-        <w:t xml:space="preserve">Rueda-Becerril, J. M.</w:t>
-      </w:r>
-      <w:r>
-        <w:t xml:space="preserve">, Winkowski, S., &amp; Willing, C. </w:t>
-      </w:r>
-      <w:r>
-        <w:rPr>
-          <w:i/>
-          <w:iCs/>
-        </w:rPr>
-        <w:t xml:space="preserve">WindsOfChange: A New Toolkit for Modeling Spore Dispersal in Hilly Terrains</w:t>
-      </w:r>
-      <w:r>
-        <w:t xml:space="preserve">, in prep.</w:t>
-      </w:r>
-    </w:p>
-    <w:p>
-      <w:pPr>
-        <w:spacing w:after="20"/>
-        <w:ind w:left="300" w:hanging="300"/>
-      </w:pPr>
-      <w:r>
-        <w:t xml:space="preserve">[9] Davis, Z., </w:t>
-      </w:r>
-      <w:r>
-        <w:rPr>
-          <w:b/>
-          <w:bCs/>
-        </w:rPr>
-        <w:t xml:space="preserve">Rueda-Becerril, J. M.</w:t>
-      </w:r>
-      <w:r>
-        <w:t xml:space="preserve">, &amp; Giannios, D. </w:t>
-      </w:r>
-      <w:r>
-        <w:rPr>
-          <w:i/>
-          <w:iCs/>
-        </w:rPr>
-        <w:t xml:space="preserve">Tleco: A Toolkit for Modeling Radiative Signatures from Relativistic Outflows</w:t>
-      </w:r>
-      <w:r>
-        <w:t xml:space="preserve">, </w:t>
-      </w:r>
-      <w:hyperlink w:history="1" r:id="rId2oy3hulrup1ztsvoqij6r">
-        <w:r>
-          <w:t xml:space="preserve">ApJ 976, 182 (2024)</w:t>
-        </w:r>
-      </w:hyperlink>
-      <w:r>
-        <w:t xml:space="preserve">, </w:t>
-      </w:r>
-      <w:hyperlink w:history="1" r:id="rIdtj0-i790fffyjay4umkq6">
-        <w:r>
-          <w:t xml:space="preserve">arXiv:2405.17581</w:t>
-        </w:r>
-      </w:hyperlink>
-      <w:r>
-        <w:t xml:space="preserve">.</w:t>
-      </w:r>
-    </w:p>
-    <w:p>
-      <w:pPr>
-        <w:spacing w:after="20"/>
-        <w:ind w:left="300" w:hanging="300"/>
-      </w:pPr>
-      <w:r>
-        <w:t xml:space="preserve">[8] Davis, Z., </w:t>
-      </w:r>
-      <w:r>
-        <w:rPr>
-          <w:b/>
-          <w:bCs/>
-        </w:rPr>
-        <w:t xml:space="preserve">Rueda-Becerril, J. M.</w:t>
-      </w:r>
-      <w:r>
-        <w:t xml:space="preserve">, &amp; Giannios, D. </w:t>
-      </w:r>
-      <w:r>
-        <w:rPr>
-          <w:i/>
-          <w:iCs/>
-        </w:rPr>
-        <w:t xml:space="preserve">Balancing Turbulent Heating with Radiative Cooling in Blazars</w:t>
-      </w:r>
-      <w:r>
-        <w:t xml:space="preserve">, </w:t>
-      </w:r>
-      <w:hyperlink w:history="1" r:id="rIdsbnfd27urrspufxxdzgw1">
-        <w:r>
-          <w:t xml:space="preserve">MNRAS 513, 5766–5779 (2022)</w:t>
-        </w:r>
-      </w:hyperlink>
-      <w:r>
-        <w:t xml:space="preserve">, </w:t>
-      </w:r>
-      <w:hyperlink w:history="1" r:id="rIdt_zin-vn_vdcdhnvwwhtn">
-        <w:r>
-          <w:t xml:space="preserve">arXiv:2201.07790</w:t>
-        </w:r>
-      </w:hyperlink>
-      <w:r>
-        <w:t xml:space="preserve">.</w:t>
-      </w:r>
-    </w:p>
-    <w:p>
-      <w:pPr>
-        <w:spacing w:after="20"/>
-        <w:ind w:left="300" w:hanging="300"/>
-      </w:pPr>
-      <w:r>
-        <w:t xml:space="preserve">[7] Lopez-Armengol, F. G., Etienne, Z. B., [...], </w:t>
-      </w:r>
-      <w:r>
-        <w:rPr>
-          <w:b/>
-          <w:bCs/>
-        </w:rPr>
-        <w:t xml:space="preserve">Rueda-Becerril, J. M.</w:t>
-      </w:r>
-      <w:r>
-        <w:t xml:space="preserve">, [...] </w:t>
-      </w:r>
-      <w:r>
-        <w:rPr>
-          <w:i/>
-          <w:iCs/>
-        </w:rPr>
-        <w:t xml:space="preserve">Handing off the outcome of binary neutron star mergers for accurate and long-term postmerger simulations</w:t>
-      </w:r>
-      <w:r>
-        <w:t xml:space="preserve">, </w:t>
-      </w:r>
-      <w:hyperlink w:history="1" r:id="rIdif1b94ge8mzpskuylhq3u">
-        <w:r>
-          <w:t xml:space="preserve">Phys. Rev. D 106, 083015 (2022)</w:t>
-        </w:r>
-      </w:hyperlink>
-      <w:r>
-        <w:t xml:space="preserve">, </w:t>
-      </w:r>
-      <w:hyperlink w:history="1" r:id="rIdclv3gcqe5r8kllofg7szj">
-        <w:r>
-          <w:t xml:space="preserve">arXiv:2112.09817</w:t>
-        </w:r>
-      </w:hyperlink>
-      <w:r>
-        <w:t xml:space="preserve">.</w:t>
-      </w:r>
-    </w:p>
-    <w:p>
-      <w:pPr>
-        <w:spacing w:after="20"/>
-        <w:ind w:left="300" w:hanging="300"/>
-      </w:pPr>
-      <w:r>
-        <w:t xml:space="preserve">[6] Murguia-Berthier, A., Noble, S., [...], </w:t>
-      </w:r>
-      <w:r>
-        <w:rPr>
-          <w:b/>
-          <w:bCs/>
-        </w:rPr>
-        <w:t xml:space="preserve">Rueda-Becerril, J. M.</w:t>
-      </w:r>
-      <w:r>
-        <w:t xml:space="preserve">, [...] </w:t>
-      </w:r>
-      <w:r>
-        <w:rPr>
-          <w:i/>
-          <w:iCs/>
-        </w:rPr>
-        <w:t xml:space="preserve">HARM3D+NUC: A New Method for Simulating the Post-merger Phase of Binary Neutron Star Mergers with GRMHD, Tabulated EOS, and Neutrino Leakage</w:t>
-      </w:r>
-      <w:r>
-        <w:t xml:space="preserve">, </w:t>
-      </w:r>
-      <w:hyperlink w:history="1" r:id="rIdi1ssksqtyq1nzagddlacz">
-        <w:r>
-          <w:t xml:space="preserve">ApJ 919, 95 (2021)</w:t>
-        </w:r>
-      </w:hyperlink>
-      <w:r>
-        <w:t xml:space="preserve">, </w:t>
-      </w:r>
-      <w:hyperlink w:history="1" r:id="rIdnqgselzpcikaop2bah3at">
-        <w:r>
-          <w:t xml:space="preserve">arXiv:2106.05356</w:t>
-        </w:r>
-      </w:hyperlink>
-      <w:r>
-        <w:t xml:space="preserve">.</w:t>
-      </w:r>
-    </w:p>
-    <w:p>
-      <w:pPr>
-        <w:spacing w:after="20"/>
-        <w:ind w:left="300" w:hanging="300"/>
-      </w:pPr>
-      <w:r>
-        <w:t xml:space="preserve">[5] </w:t>
-      </w:r>
-      <w:r>
-        <w:rPr>
-          <w:b/>
-          <w:bCs/>
-        </w:rPr>
-        <w:t xml:space="preserve">Rueda-Becerril, J. M.</w:t>
-      </w:r>
-      <w:r>
-        <w:t xml:space="preserve">, Harrison, A. O., &amp; Giannios, D. </w:t>
-      </w:r>
-      <w:r>
-        <w:rPr>
-          <w:i/>
-          <w:iCs/>
-        </w:rPr>
-        <w:t xml:space="preserve">Blazar jets launched with similar energy per baryon, independently of their power</w:t>
-      </w:r>
-      <w:r>
-        <w:t xml:space="preserve">, </w:t>
-      </w:r>
-      <w:hyperlink w:history="1" r:id="rIdhqh4lfc_i6dwddij7ssrn">
-        <w:r>
-          <w:t xml:space="preserve">MNRAS 501, 4092–4102 (2021)</w:t>
-        </w:r>
-      </w:hyperlink>
-      <w:r>
-        <w:t xml:space="preserve">, </w:t>
-      </w:r>
-      <w:hyperlink w:history="1" r:id="rId0qw5kpyvijetm1ooppnl7">
-        <w:r>
-          <w:t xml:space="preserve">arXiv:2009.02273</w:t>
-        </w:r>
-      </w:hyperlink>
-      <w:r>
-        <w:t xml:space="preserve">.</w:t>
-      </w:r>
-    </w:p>
-    <w:p>
-      <w:pPr>
-        <w:spacing w:after="20"/>
-        <w:ind w:left="300" w:hanging="300"/>
-      </w:pPr>
-      <w:r>
-        <w:t xml:space="preserve">[4] Zhang, H., Christie, I., Petropoulou, M., </w:t>
-      </w:r>
-      <w:r>
-        <w:rPr>
-          <w:b/>
-          <w:bCs/>
-        </w:rPr>
-        <w:t xml:space="preserve">Rueda-Becerril, J. M.</w:t>
-      </w:r>
-      <w:r>
-        <w:t xml:space="preserve">, &amp; Giannios, D. </w:t>
-      </w:r>
-      <w:r>
-        <w:rPr>
-          <w:i/>
-          <w:iCs/>
-        </w:rPr>
-        <w:t xml:space="preserve">Inverse Compton Signatures of Gamma-Ray Burst Afterglows</w:t>
-      </w:r>
-      <w:r>
-        <w:t xml:space="preserve">, </w:t>
-      </w:r>
-      <w:hyperlink w:history="1" r:id="rIdx3qxgexdpbruiv2ybob6a">
-        <w:r>
-          <w:t xml:space="preserve">MNRAS 496, 974–986 (2020)</w:t>
-        </w:r>
-      </w:hyperlink>
-      <w:r>
-        <w:t xml:space="preserve">, </w:t>
-      </w:r>
-      <w:hyperlink w:history="1" r:id="rIdo0uaxbra9n5pfkjs4mp55">
-        <w:r>
-          <w:t xml:space="preserve">arXiv:1910.14049</w:t>
-        </w:r>
-      </w:hyperlink>
-      <w:r>
-        <w:t xml:space="preserve">.</w:t>
-      </w:r>
-    </w:p>
-    <w:p>
-      <w:pPr>
-        <w:spacing w:after="20"/>
-        <w:ind w:left="300" w:hanging="300"/>
-      </w:pPr>
-      <w:r>
-        <w:t xml:space="preserve">[3] </w:t>
-      </w:r>
-      <w:r>
-        <w:rPr>
-          <w:b/>
-          <w:bCs/>
-        </w:rPr>
-        <w:t xml:space="preserve">Rueda-Becerril, J. M.</w:t>
-      </w:r>
-      <w:r>
-        <w:t xml:space="preserve">, Mimica, P., &amp; Aloy, M. A. </w:t>
-      </w:r>
-      <w:r>
-        <w:rPr>
-          <w:i/>
-          <w:iCs/>
-        </w:rPr>
-        <w:t xml:space="preserve">On the influence of a hybrid thermal–non-thermal distribution in the internal shocks model for blazars</w:t>
-      </w:r>
-      <w:r>
-        <w:t xml:space="preserve">, </w:t>
-      </w:r>
-      <w:hyperlink w:history="1" r:id="rIdpk0ujhktckb92h4hgzy3o">
-        <w:r>
-          <w:t xml:space="preserve">MNRAS 468, 1169–1182 (2017)</w:t>
-        </w:r>
-      </w:hyperlink>
-      <w:r>
-        <w:t xml:space="preserve">, </w:t>
-      </w:r>
-      <w:hyperlink w:history="1" r:id="rIda-b114zi6ghk3msp7aq5a">
-        <w:r>
-          <w:t xml:space="preserve">arXiv:1612.06383</w:t>
-        </w:r>
-      </w:hyperlink>
-      <w:r>
-        <w:t xml:space="preserve">.</w:t>
-      </w:r>
-    </w:p>
-    <w:p>
-      <w:pPr>
-        <w:spacing w:after="20"/>
-        <w:ind w:left="300" w:hanging="300"/>
-      </w:pPr>
-      <w:r>
-        <w:t xml:space="preserve">[2] </w:t>
-      </w:r>
-      <w:r>
-        <w:rPr>
-          <w:b/>
-          <w:bCs/>
-        </w:rPr>
-        <w:t xml:space="preserve">Rueda-Becerril, J. M.</w:t>
-      </w:r>
-      <w:r>
-        <w:t xml:space="preserve">, Mimica, P., &amp; Aloy, M. A. </w:t>
-      </w:r>
-      <w:r>
-        <w:rPr>
-          <w:i/>
-          <w:iCs/>
-        </w:rPr>
-        <w:t xml:space="preserve">The influence of the magnetic field on the spectral properties of blazars</w:t>
-      </w:r>
-      <w:r>
-        <w:t xml:space="preserve">, </w:t>
-      </w:r>
-      <w:hyperlink w:history="1" r:id="rId3fc7webnxra1zwkkt9vw1">
-        <w:r>
-          <w:t xml:space="preserve">MNRAS 438, 1856–1869 (2014)</w:t>
-        </w:r>
-      </w:hyperlink>
-      <w:r>
-        <w:t xml:space="preserve">, </w:t>
-      </w:r>
-      <w:hyperlink w:history="1" r:id="rIdakvku_mrjycynqh_gqkid">
-        <w:r>
-          <w:t xml:space="preserve">arXiv:1310.5441</w:t>
-        </w:r>
-      </w:hyperlink>
-      <w:r>
-        <w:t xml:space="preserve">.</w:t>
-      </w:r>
-    </w:p>
-    <w:p>
-      <w:pPr>
-        <w:spacing w:after="20"/>
-        <w:ind w:left="300" w:hanging="300"/>
-      </w:pPr>
-      <w:r>
-        <w:t xml:space="preserve">[1] Guzmán, F. S., &amp; </w:t>
-      </w:r>
-      <w:r>
-        <w:rPr>
-          <w:b/>
-          <w:bCs/>
-        </w:rPr>
-        <w:t xml:space="preserve">Rueda-Becerril, J. M.</w:t>
-      </w:r>
-      <w:r>
-        <w:t xml:space="preserve"> </w:t>
-      </w:r>
-      <w:r>
-        <w:rPr>
-          <w:i/>
-          <w:iCs/>
-        </w:rPr>
-        <w:t xml:space="preserve">Spherical boson stars as black hole mimickers</w:t>
-      </w:r>
-      <w:r>
-        <w:t xml:space="preserve">, </w:t>
-      </w:r>
-      <w:hyperlink w:history="1" r:id="rIdt1uq6mo5d9bji1mpmggqw">
-        <w:r>
-          <w:t xml:space="preserve">Phys. Rev. D 80, 084023 (2009)</w:t>
-        </w:r>
-      </w:hyperlink>
-      <w:r>
-        <w:t xml:space="preserve">, </w:t>
-      </w:r>
-      <w:hyperlink w:history="1" r:id="rIdh3kbvwnhrmakkefjum_mi">
-        <w:r>
-          <w:t xml:space="preserve">arXiv:1009.1250</w:t>
-        </w:r>
-      </w:hyperlink>
-      <w:r>
-        <w:t xml:space="preserve">.</w:t>
-      </w:r>
-    </w:p>
-    <w:p>
-      <w:pPr>
-        <w:pStyle w:val="Heading2"/>
-      </w:pPr>
-      <w:r>
-        <w:t xml:space="preserve">Conference Proceedings</w:t>
-      </w:r>
-    </w:p>
-    <w:p>
-      <w:pPr>
-        <w:spacing w:after="20"/>
-        <w:ind w:left="300" w:hanging="300"/>
-      </w:pPr>
-      <w:r>
-        <w:t xml:space="preserve">[P5] </w:t>
-      </w:r>
-      <w:r>
-        <w:rPr>
-          <w:b/>
-          <w:bCs/>
-        </w:rPr>
-        <w:t xml:space="preserve">Rueda-Becerril, J. M.</w:t>
-      </w:r>
-      <w:r>
-        <w:t xml:space="preserve"> </w:t>
-      </w:r>
-      <w:r>
-        <w:rPr>
-          <w:i/>
-          <w:iCs/>
-        </w:rPr>
-        <w:t xml:space="preserve">A numerical approach for radiative cooling in relativistic outflows</w:t>
-      </w:r>
-      <w:r>
-        <w:t xml:space="preserve">, </w:t>
-      </w:r>
-      <w:hyperlink w:history="1" r:id="rIdhnqwizn50__e9xp92b-u9">
-        <w:r>
-          <w:t xml:space="preserve">Astron. Nachr. 342, 277–282 (2021)</w:t>
-        </w:r>
-      </w:hyperlink>
-      <w:r>
-        <w:t xml:space="preserve">, 9th International Workshop on Astronomy and Relativistic Astrophysics, </w:t>
-      </w:r>
-      <w:hyperlink w:history="1" r:id="rIdx26a6kz_gnjgx40mns2k9">
-        <w:r>
-          <w:t xml:space="preserve">arXiv:2011.13797</w:t>
-        </w:r>
-      </w:hyperlink>
-      <w:r>
-        <w:t xml:space="preserve">.</w:t>
-      </w:r>
-    </w:p>
-    <w:p>
-      <w:pPr>
-        <w:spacing w:after="20"/>
-        <w:ind w:left="300" w:hanging="300"/>
-      </w:pPr>
-      <w:r>
-        <w:t xml:space="preserve">[P4] </w:t>
-      </w:r>
-      <w:r>
-        <w:rPr>
-          <w:b/>
-          <w:bCs/>
-        </w:rPr>
-        <w:t xml:space="preserve">Rueda-Becerril, J. M.</w:t>
-      </w:r>
-      <w:r>
-        <w:t xml:space="preserve">, Harrison, A. O., &amp; Giannios, D. </w:t>
-      </w:r>
-      <w:r>
-        <w:rPr>
-          <w:i/>
-          <w:iCs/>
-        </w:rPr>
-        <w:t xml:space="preserve">The blazar sequence revised</w:t>
-      </w:r>
-      <w:r>
-        <w:t xml:space="preserve">, </w:t>
-      </w:r>
-      <w:hyperlink w:history="1" r:id="rIda2lphcb9rorkbquo0hne9">
-        <w:r>
-          <w:t xml:space="preserve">Astron. Nachr. 342, 147–152 (2021)</w:t>
-        </w:r>
-      </w:hyperlink>
-      <w:r>
-        <w:t xml:space="preserve">, 9th International Workshop on Astronomy and Relativistic Astrophysics, </w:t>
-      </w:r>
-      <w:hyperlink w:history="1" r:id="rId9bs6ktr8xutqkapmxxet0">
-        <w:r>
-          <w:t xml:space="preserve">arXiv:2011.13805</w:t>
-        </w:r>
-      </w:hyperlink>
-      <w:r>
-        <w:t xml:space="preserve">.</w:t>
-      </w:r>
-    </w:p>
-    <w:p>
-      <w:pPr>
-        <w:spacing w:after="20"/>
-        <w:ind w:left="300" w:hanging="300"/>
-      </w:pPr>
-      <w:r>
-        <w:t xml:space="preserve">[P3] </w:t>
-      </w:r>
-      <w:r>
-        <w:rPr>
-          <w:b/>
-          <w:bCs/>
-        </w:rPr>
-        <w:t xml:space="preserve">Rueda-Becerril, J. M.</w:t>
-      </w:r>
-      <w:r>
-        <w:t xml:space="preserve">, Mimica, P., &amp; Aloy, M. A. </w:t>
-      </w:r>
-      <w:r>
-        <w:rPr>
-          <w:i/>
-          <w:iCs/>
-        </w:rPr>
-        <w:t xml:space="preserve">Numerical simulations of the internal shock model in magnetized relativistic jets of blazars</w:t>
-      </w:r>
-      <w:r>
-        <w:t xml:space="preserve">, </w:t>
-      </w:r>
-      <w:hyperlink w:history="1" r:id="rId3cvb5z5hjvficxj9sddes">
-        <w:r>
-          <w:t xml:space="preserve">PoS(SWIFT 10) 233, 159 (2014)</w:t>
-        </w:r>
-      </w:hyperlink>
-      <w:r>
-        <w:t xml:space="preserve">, </w:t>
-      </w:r>
-      <w:hyperlink w:history="1" r:id="rIdoukprhhkptmsa_ejbdkwa">
-        <w:r>
-          <w:t xml:space="preserve">arXiv:1502.07882</w:t>
-        </w:r>
-      </w:hyperlink>
-      <w:r>
-        <w:t xml:space="preserve">.</w:t>
-      </w:r>
-    </w:p>
-    <w:p>
-      <w:pPr>
-        <w:spacing w:after="20"/>
-        <w:ind w:left="300" w:hanging="300"/>
-      </w:pPr>
-      <w:r>
-        <w:t xml:space="preserve">[P2] </w:t>
-      </w:r>
-      <w:r>
-        <w:rPr>
-          <w:b/>
-          <w:bCs/>
-        </w:rPr>
-        <w:t xml:space="preserve">Rueda-Becerril, J. M.</w:t>
-      </w:r>
-      <w:r>
-        <w:t xml:space="preserve">, Mimica, P., Aloy, M. A., &amp; Aloy, C. </w:t>
-      </w:r>
-      <w:r>
-        <w:rPr>
-          <w:i/>
-          <w:iCs/>
-        </w:rPr>
-        <w:t xml:space="preserve">Numerical study of broadband spectra caused by internal shocks in magnetized relativistic jets of blazars</w:t>
-      </w:r>
-      <w:r>
-        <w:t xml:space="preserve">, </w:t>
-      </w:r>
-      <w:hyperlink w:history="1" r:id="rIdjla_7psf7sd_9w9bhexfp">
-        <w:r>
-          <w:t xml:space="preserve">EPJ Web Conf. 61, 02007 (2013)</w:t>
-        </w:r>
-      </w:hyperlink>
-      <w:r>
-        <w:t xml:space="preserve">, </w:t>
-      </w:r>
-      <w:hyperlink w:history="1" r:id="rIdfl4wfpi5kcqcbku4mfzib">
-        <w:r>
-          <w:t xml:space="preserve">arXiv:1309.4612</w:t>
-        </w:r>
-      </w:hyperlink>
-      <w:r>
-        <w:t xml:space="preserve">.</w:t>
-      </w:r>
-    </w:p>
-    <w:p>
-      <w:pPr>
-        <w:spacing w:after="20"/>
-        <w:ind w:left="300" w:hanging="300"/>
-      </w:pPr>
-      <w:r>
-        <w:t xml:space="preserve">[P1] Mimica, P., Aloy, M. A., </w:t>
-      </w:r>
-      <w:r>
-        <w:rPr>
-          <w:b/>
-          <w:bCs/>
-        </w:rPr>
-        <w:t xml:space="preserve">Rueda-Becerril, J. M.</w:t>
-      </w:r>
-      <w:r>
-        <w:t xml:space="preserve">, Tabik, S., &amp; Aloy, C. </w:t>
-      </w:r>
-      <w:r>
-        <w:rPr>
-          <w:i/>
-          <w:iCs/>
-        </w:rPr>
-        <w:t xml:space="preserve">Numerical simulations of dynamics and emission from relativistic astrophysical jets</w:t>
-      </w:r>
-      <w:r>
-        <w:t xml:space="preserve">, </w:t>
-      </w:r>
-      <w:hyperlink w:history="1" r:id="rId9yqqelbjbyiwivphujrmh">
-        <w:r>
-          <w:t xml:space="preserve">J. Phys.: Conf. Ser. 454, 012001 (2013)</w:t>
-        </w:r>
-      </w:hyperlink>
-      <w:r>
-        <w:t xml:space="preserve">, </w:t>
-      </w:r>
-      <w:hyperlink w:history="1" r:id="rIdcxhugmrouqjjcifqoyyd4">
-        <w:r>
-          <w:t xml:space="preserve">arXiv:1211.1794</w:t>
-        </w:r>
-      </w:hyperlink>
-      <w:r>
-        <w:t xml:space="preserve">.</w:t>
-      </w:r>
-    </w:p>
-    <w:p>
-      <w:pPr>
-        <w:pStyle w:val="Heading1"/>
-      </w:pPr>
-      <w:r>
-        <w:t xml:space="preserve">Grants and Fellowships</w:t>
-      </w:r>
-    </w:p>
-    <w:p>
-      <w:pPr>
-        <w:pStyle w:val="Heading2"/>
-      </w:pPr>
-      <w:r>
-        <w:t xml:space="preserve">Research Grants</w:t>
-      </w:r>
-    </w:p>
-    <w:p>
-      <w:pPr>
-        <w:keepNext/>
-        <w:tabs>
-          <w:tab w:val="right" w:pos="10512"/>
-        </w:tabs>
-        <w:spacing w:after="0"/>
-      </w:pPr>
-      <w:r>
-        <w:rPr>
-          <w:b/>
-          <w:bCs/>
-        </w:rPr>
-        <w:t xml:space="preserve">NASA Fermi Guest Investigator Program, Cycle 12</w:t>
-      </w:r>
-      <w:r>
-        <w:tab/>
-      </w:r>
-      <w:r>
-        <w:t xml:space="preserve">2019</w:t>
-      </w:r>
-    </w:p>
-    <w:p>
-      <w:pPr>
-        <w:keepNext/>
-        <w:tabs>
-          <w:tab w:val="right" w:pos="10512"/>
-        </w:tabs>
-        <w:spacing w:after="0"/>
-      </w:pPr>
-      <w:r>
-        <w:rPr>
-          <w:i/>
-          <w:iCs/>
-        </w:rPr>
-        <w:t xml:space="preserve">A simple model to understand the blazar sequence</w:t>
-      </w:r>
-      <w:r>
-        <w:tab/>
-      </w:r>
-      <w:r>
-        <w:t xml:space="preserve">Grant #121077, $68K</w:t>
-      </w:r>
-    </w:p>
-    <w:p>
-      <w:pPr>
-        <w:spacing w:after="0"/>
-      </w:pPr>
-      <w:r>
-        <w:t xml:space="preserve">PI: D. Giannios; Co-I: J. M. Rueda-Becerril</w:t>
-      </w:r>
-    </w:p>
-    <w:p>
-      <w:pPr>
-        <w:pStyle w:val="EntryGap"/>
-        <w:spacing w:after="0"/>
-      </w:pPr>
-    </w:p>
-    <w:p>
-      <w:pPr>
-        <w:pStyle w:val="Heading2"/>
-      </w:pPr>
-      <w:r>
-        <w:t xml:space="preserve">Fellowships</w:t>
-      </w:r>
-    </w:p>
-    <w:p>
-      <w:pPr>
-        <w:keepNext/>
-        <w:tabs>
-          <w:tab w:val="right" w:pos="10512"/>
-        </w:tabs>
-        <w:spacing w:after="0"/>
-      </w:pPr>
-      <w:r>
-        <w:rPr>
-          <w:b/>
-          <w:bCs/>
-        </w:rPr>
-        <w:t xml:space="preserve">International Postdoctoral Fellowship</w:t>
-      </w:r>
-      <w:r>
-        <w:tab/>
-      </w:r>
-      <w:r>
-        <w:t xml:space="preserve">Oct 2018 – Nov 2020</w:t>
-      </w:r>
-    </w:p>
-    <w:p>
-      <w:pPr>
-        <w:keepNext/>
-        <w:tabs>
-          <w:tab w:val="right" w:pos="10512"/>
-        </w:tabs>
-        <w:spacing w:after="0"/>
-      </w:pPr>
-      <w:r>
-        <w:rPr>
-          <w:i/>
-          <w:iCs/>
-        </w:rPr>
-        <w:t xml:space="preserve">National Council of Science and Technology (CONACyT), Mexico</w:t>
-      </w:r>
-    </w:p>
-    <w:p>
-      <w:pPr>
-        <w:pStyle w:val="EntryGap"/>
-        <w:spacing w:after="0"/>
-      </w:pPr>
-    </w:p>
-    <w:p>
-      <w:pPr>
-        <w:keepNext/>
-        <w:tabs>
-          <w:tab w:val="right" w:pos="10512"/>
-        </w:tabs>
-        <w:spacing w:after="0"/>
-      </w:pPr>
-      <w:r>
-        <w:rPr>
-          <w:b/>
-          <w:bCs/>
-        </w:rPr>
-        <w:t xml:space="preserve">Postdoctoral Fellowship</w:t>
-      </w:r>
-      <w:r>
-        <w:tab/>
-      </w:r>
-      <w:r>
-        <w:t xml:space="preserve">Jan 2018 – Sep 2018</w:t>
-      </w:r>
-    </w:p>
-    <w:p>
-      <w:pPr>
-        <w:keepNext/>
-        <w:tabs>
-          <w:tab w:val="right" w:pos="10512"/>
-        </w:tabs>
-        <w:spacing w:after="0"/>
-      </w:pPr>
-      <w:r>
-        <w:rPr>
-          <w:i/>
-          <w:iCs/>
-        </w:rPr>
-        <w:t xml:space="preserve">Secretariat of Public Education, Mexico (Program for the Professional Development of Higher Education Institutions)</w:t>
-      </w:r>
-    </w:p>
-    <w:p>
-      <w:pPr>
-        <w:pStyle w:val="EntryGap"/>
-        <w:spacing w:after="0"/>
-      </w:pPr>
-    </w:p>
-    <w:p>
-      <w:pPr>
-        <w:keepNext/>
-        <w:tabs>
-          <w:tab w:val="right" w:pos="10512"/>
-        </w:tabs>
-        <w:spacing w:after="0"/>
-      </w:pPr>
-      <w:r>
-        <w:rPr>
-          <w:b/>
-          <w:bCs/>
-        </w:rPr>
-        <w:t xml:space="preserve">Study-Abroad Fellowship</w:t>
-      </w:r>
-      <w:r>
-        <w:tab/>
-      </w:r>
-      <w:r>
-        <w:t xml:space="preserve">Sep 2014 – Aug 2016</w:t>
-      </w:r>
-    </w:p>
-    <w:p>
-      <w:pPr>
-        <w:keepNext/>
-        <w:tabs>
-          <w:tab w:val="right" w:pos="10512"/>
-        </w:tabs>
-        <w:spacing w:after="0"/>
-      </w:pPr>
-      <w:r>
-        <w:rPr>
-          <w:i/>
-          <w:iCs/>
-        </w:rPr>
-        <w:t xml:space="preserve">National Council of Science and Technology (CONACyT), Mexico</w:t>
-      </w:r>
-    </w:p>
-    <w:p>
-      <w:pPr>
-        <w:pStyle w:val="EntryGap"/>
-        <w:spacing w:after="0"/>
-      </w:pPr>
-    </w:p>
-    <w:p>
-      <w:pPr>
-        <w:keepNext/>
-        <w:tabs>
-          <w:tab w:val="right" w:pos="10512"/>
-        </w:tabs>
-        <w:spacing w:after="0"/>
-      </w:pPr>
-      <w:r>
-        <w:rPr>
-          <w:b/>
-          <w:bCs/>
-        </w:rPr>
-        <w:t xml:space="preserve">Santiago Grisolía Fellowship</w:t>
-      </w:r>
-      <w:r>
-        <w:tab/>
-      </w:r>
-      <w:r>
-        <w:t xml:space="preserve">Oct 2011 – Jun 2014</w:t>
-      </w:r>
-    </w:p>
-    <w:p>
-      <w:pPr>
-        <w:keepNext/>
-        <w:tabs>
-          <w:tab w:val="right" w:pos="10512"/>
-        </w:tabs>
-        <w:spacing w:after="0"/>
-      </w:pPr>
-      <w:r>
-        <w:rPr>
-          <w:i/>
-          <w:iCs/>
-        </w:rPr>
-        <w:t xml:space="preserve">Council of Education, Research, Culture and Sport, Valencian Community, Spain</w:t>
-      </w:r>
-    </w:p>
-    <w:p>
-      <w:pPr>
-        <w:pStyle w:val="EntryGap"/>
-        <w:spacing w:after="0"/>
-      </w:pPr>
-    </w:p>
-    <w:p>
-      <w:pPr>
-        <w:keepNext/>
-        <w:tabs>
-          <w:tab w:val="right" w:pos="10512"/>
-        </w:tabs>
-        <w:spacing w:after="0"/>
-      </w:pPr>
-      <w:r>
-        <w:rPr>
-          <w:b/>
-          <w:bCs/>
-        </w:rPr>
-        <w:t xml:space="preserve">M.Sc. Fellowship</w:t>
-      </w:r>
-      <w:r>
-        <w:tab/>
-      </w:r>
-      <w:r>
-        <w:t xml:space="preserve">Sep 2009 – Aug 2011</w:t>
-      </w:r>
-    </w:p>
-    <w:p>
-      <w:pPr>
-        <w:keepNext/>
-        <w:tabs>
-          <w:tab w:val="right" w:pos="10512"/>
-        </w:tabs>
-        <w:spacing w:after="0"/>
-      </w:pPr>
-      <w:r>
-        <w:rPr>
-          <w:i/>
-          <w:iCs/>
-        </w:rPr>
-        <w:t xml:space="preserve">CONACyT, at the Institute of Physics and Mathematics, Universidad Michoacana de San Nicolás de Hidalgo</w:t>
-      </w:r>
-    </w:p>
-    <w:p>
-      <w:pPr>
-        <w:pStyle w:val="EntryGap"/>
-        <w:spacing w:after="0"/>
-      </w:pPr>
-    </w:p>
-    <w:p>
-      <w:pPr>
-        <w:keepNext/>
-        <w:tabs>
-          <w:tab w:val="right" w:pos="10512"/>
-        </w:tabs>
-        <w:spacing w:after="0"/>
-      </w:pPr>
-      <w:r>
-        <w:rPr>
-          <w:b/>
-          <w:bCs/>
-        </w:rPr>
-        <w:t xml:space="preserve">Summer Research Fellowship (XVII Summer of Scientific Research)</w:t>
-      </w:r>
-      <w:r>
-        <w:tab/>
-      </w:r>
-      <w:r>
-        <w:t xml:space="preserve">Jun 2007 – Aug 2007</w:t>
-      </w:r>
-    </w:p>
-    <w:p>
-      <w:pPr>
-        <w:keepNext/>
-        <w:tabs>
-          <w:tab w:val="right" w:pos="10512"/>
-        </w:tabs>
-        <w:spacing w:after="0"/>
-      </w:pPr>
-      <w:r>
-        <w:rPr>
-          <w:i/>
-          <w:iCs/>
-        </w:rPr>
-        <w:t xml:space="preserve">Mexican Academy of Sciences</w:t>
-      </w:r>
-    </w:p>
-    <w:p>
-      <w:pPr>
-        <w:pStyle w:val="EntryGap"/>
-        <w:spacing w:after="0"/>
-      </w:pPr>
-    </w:p>
-    <w:p>
-      <w:pPr>
-        <w:pStyle w:val="Heading1"/>
-      </w:pPr>
-      <w:r>
-        <w:t xml:space="preserve">Software and Projects</w:t>
-      </w:r>
-    </w:p>
-    <w:p>
-      <w:pPr>
-        <w:keepNext/>
-        <w:tabs>
-          <w:tab w:val="right" w:pos="10512"/>
-        </w:tabs>
-        <w:spacing w:after="0"/>
-      </w:pPr>
-      <w:r>
-        <w:rPr>
-          <w:b/>
-          <w:bCs/>
-        </w:rPr>
-        <w:t xml:space="preserve">Blazar Population ML</w:t>
-      </w:r>
-      <w:r>
-        <w:tab/>
-      </w:r>
-      <w:r>
-        <w:t xml:space="preserve">Jan 2026 – Present</w:t>
-      </w:r>
-    </w:p>
-    <w:p>
-      <w:pPr>
-        <w:keepNext/>
-        <w:tabs>
-          <w:tab w:val="right" w:pos="10512"/>
-        </w:tabs>
-        <w:spacing w:after="0"/>
-      </w:pPr>
-      <w:r>
-        <w:rPr>
-          <w:i/>
-          <w:iCs/>
-        </w:rPr>
-        <w:t xml:space="preserve">Scientific ML (Python, scikit-learn, PyTorch)</w:t>
-      </w:r>
-      <w:r>
-        <w:tab/>
-      </w:r>
-      <w:hyperlink w:history="1" r:id="rIdc3anddb-cyo9jrc277lbj">
-        <w:r>
-          <w:t xml:space="preserve">github.com/altjerue/ilwikak-ml</w:t>
-        </w:r>
-      </w:hyperlink>
+        <w:t xml:space="preserve">Fit C-SPEV simulation models to telescope data, identifying spectral and light-curve patterns that quantify the magnetization of plasma in blazars.</w:t>
+      </w:r>
     </w:p>
     <w:p>
       <w:pPr>
@@ -2484,7 +1089,7 @@
         <w:spacing w:after="10"/>
       </w:pPr>
       <w:r>
-        <w:t xml:space="preserve">Applying classical ML and Bayesian inference to the Fermi-LAT 4LAC-DR3 catalog (3,407 sources) to recover physical jet parameters from multi-wavelength data.</w:t>
+        <w:t xml:space="preserve">Extended C-SPEV to compute discrete and continuous spectra from particle distributions of arbitrary shape, without affecting simulation runtime.</w:t>
       </w:r>
     </w:p>
     <w:p>
@@ -2497,8 +1102,1380 @@
         <w:spacing w:after="10"/>
       </w:pPr>
       <w:r>
-        <w:t xml:space="preserve">Building a neural network that maps physical jet parameters to observable spectral energy distributions accurately enough to compare with Tleco results.</w:t>
-      </w:r>
+        <w:t xml:space="preserve">Published 2 first-author papers in MNRAS [2, 3].</w:t>
+      </w:r>
+    </w:p>
+    <w:p>
+      <w:pPr>
+        <w:pStyle w:val="EntryGap"/>
+        <w:spacing w:after="0"/>
+      </w:pPr>
+    </w:p>
+    <w:p>
+      <w:pPr>
+        <w:pStyle w:val="Heading1"/>
+      </w:pPr>
+      <w:r>
+        <w:t xml:space="preserve">Education</w:t>
+      </w:r>
+    </w:p>
+    <w:p>
+      <w:pPr>
+        <w:keepNext/>
+        <w:tabs>
+          <w:tab w:val="right" w:pos="10512"/>
+        </w:tabs>
+        <w:spacing w:after="0"/>
+      </w:pPr>
+      <w:r>
+        <w:rPr>
+          <w:b/>
+          <w:bCs/>
+        </w:rPr>
+        <w:t xml:space="preserve">Ph.D. in Physics</w:t>
+      </w:r>
+      <w:r>
+        <w:tab/>
+      </w:r>
+      <w:r>
+        <w:t xml:space="preserve">Oct 2011 – Jul 2017</w:t>
+      </w:r>
+    </w:p>
+    <w:p>
+      <w:pPr>
+        <w:keepNext/>
+        <w:tabs>
+          <w:tab w:val="right" w:pos="10512"/>
+        </w:tabs>
+        <w:spacing w:after="0"/>
+      </w:pPr>
+      <w:r>
+        <w:rPr>
+          <w:i/>
+          <w:iCs/>
+        </w:rPr>
+        <w:t xml:space="preserve">Universitat de València</w:t>
+      </w:r>
+      <w:r>
+        <w:tab/>
+      </w:r>
+      <w:r>
+        <w:t xml:space="preserve">Valencia, Spain</w:t>
+      </w:r>
+    </w:p>
+    <w:p>
+      <w:pPr>
+        <w:spacing w:after="0"/>
+      </w:pPr>
+      <w:r>
+        <w:t xml:space="preserve">Excellent </w:t>
+      </w:r>
+      <w:r>
+        <w:rPr>
+          <w:i/>
+          <w:iCs/>
+        </w:rPr>
+        <w:t xml:space="preserve">cum laude</w:t>
+      </w:r>
+    </w:p>
+    <w:p>
+      <w:pPr>
+        <w:spacing w:after="0"/>
+      </w:pPr>
+      <w:r>
+        <w:t xml:space="preserve">Thesis: </w:t>
+      </w:r>
+      <w:hyperlink w:history="1" r:id="rId6jg71a-8vilri5mytbdl7">
+        <w:r>
+          <w:t xml:space="preserve">Numerical treatment of radiation processes in the internal shocks of magnetized relativistic outflows</w:t>
+        </w:r>
+      </w:hyperlink>
+    </w:p>
+    <w:p>
+      <w:pPr>
+        <w:pStyle w:val="EntryGap"/>
+        <w:spacing w:after="0"/>
+      </w:pPr>
+    </w:p>
+    <w:p>
+      <w:pPr>
+        <w:keepNext/>
+        <w:tabs>
+          <w:tab w:val="right" w:pos="10512"/>
+        </w:tabs>
+        <w:spacing w:after="0"/>
+      </w:pPr>
+      <w:r>
+        <w:rPr>
+          <w:b/>
+          <w:bCs/>
+        </w:rPr>
+        <w:t xml:space="preserve">M.Sc. in Physics</w:t>
+      </w:r>
+      <w:r>
+        <w:tab/>
+      </w:r>
+      <w:r>
+        <w:t xml:space="preserve">Aug 2009 – Sep 2011</w:t>
+      </w:r>
+    </w:p>
+    <w:p>
+      <w:pPr>
+        <w:keepNext/>
+        <w:tabs>
+          <w:tab w:val="right" w:pos="10512"/>
+        </w:tabs>
+        <w:spacing w:after="0"/>
+      </w:pPr>
+      <w:r>
+        <w:rPr>
+          <w:i/>
+          <w:iCs/>
+        </w:rPr>
+        <w:t xml:space="preserve">Universidad Michoacana de San Nicolás de Hidalgo</w:t>
+      </w:r>
+      <w:r>
+        <w:tab/>
+      </w:r>
+      <w:r>
+        <w:t xml:space="preserve">Morelia, Mexico</w:t>
+      </w:r>
+    </w:p>
+    <w:p>
+      <w:pPr>
+        <w:spacing w:after="0"/>
+      </w:pPr>
+      <w:r>
+        <w:t xml:space="preserve">Thesis: Study of TOV stars with the SPH method (wrote an SPH hydrodynamics code to study the stability of relativistic stars).</w:t>
+      </w:r>
+    </w:p>
+    <w:p>
+      <w:pPr>
+        <w:pStyle w:val="EntryGap"/>
+        <w:spacing w:after="0"/>
+      </w:pPr>
+    </w:p>
+    <w:p>
+      <w:pPr>
+        <w:keepNext/>
+        <w:tabs>
+          <w:tab w:val="right" w:pos="10512"/>
+        </w:tabs>
+        <w:spacing w:after="0"/>
+      </w:pPr>
+      <w:r>
+        <w:rPr>
+          <w:b/>
+          <w:bCs/>
+        </w:rPr>
+        <w:t xml:space="preserve">B.Sc. in Physics</w:t>
+      </w:r>
+      <w:r>
+        <w:tab/>
+      </w:r>
+      <w:r>
+        <w:t xml:space="preserve">Aug 2004 – Dec 2008</w:t>
+      </w:r>
+    </w:p>
+    <w:p>
+      <w:pPr>
+        <w:keepNext/>
+        <w:tabs>
+          <w:tab w:val="right" w:pos="10512"/>
+        </w:tabs>
+        <w:spacing w:after="0"/>
+      </w:pPr>
+      <w:r>
+        <w:rPr>
+          <w:i/>
+          <w:iCs/>
+        </w:rPr>
+        <w:t xml:space="preserve">Universidad Autónoma del Estado de México</w:t>
+      </w:r>
+      <w:r>
+        <w:tab/>
+      </w:r>
+      <w:r>
+        <w:t xml:space="preserve">Toluca, Mexico</w:t>
+      </w:r>
+    </w:p>
+    <w:p>
+      <w:pPr>
+        <w:spacing w:after="0"/>
+      </w:pPr>
+      <w:r>
+        <w:t xml:space="preserve">Advisor: Prof. Francisco S. Guzmán</w:t>
+      </w:r>
+    </w:p>
+    <w:p>
+      <w:pPr>
+        <w:spacing w:after="0"/>
+      </w:pPr>
+      <w:r>
+        <w:t xml:space="preserve">Thesis: </w:t>
+      </w:r>
+      <w:r>
+        <w:rPr>
+          <w:i/>
+          <w:iCs/>
+        </w:rPr>
+        <w:t xml:space="preserve">Numerical solution of null geodesics for the generation of gravitational lenses produced by spherically-symmetric and static spacetimes</w:t>
+      </w:r>
+    </w:p>
+    <w:p>
+      <w:pPr>
+        <w:spacing w:after="0"/>
+      </w:pPr>
+      <w:r>
+        <w:t xml:space="preserve">Lic. Juan Josafat Pichardo Cruz Award</w:t>
+      </w:r>
+    </w:p>
+    <w:p>
+      <w:pPr>
+        <w:pStyle w:val="EntryGap"/>
+        <w:spacing w:after="0"/>
+      </w:pPr>
+    </w:p>
+    <w:p>
+      <w:pPr>
+        <w:pStyle w:val="Heading1"/>
+      </w:pPr>
+      <w:r>
+        <w:t xml:space="preserve">Publications</w:t>
+      </w:r>
+    </w:p>
+    <w:p>
+      <w:pPr>
+        <w:pStyle w:val="Heading2"/>
+      </w:pPr>
+      <w:r>
+        <w:t xml:space="preserve">Articles (9 published, 3 first-author; 3 in preparation)</w:t>
+      </w:r>
+    </w:p>
+    <w:p>
+      <w:pPr>
+        <w:spacing w:after="20"/>
+        <w:ind w:left="300" w:hanging="300"/>
+      </w:pPr>
+      <w:r>
+        <w:t xml:space="preserve">[12] Winkowski, S., </w:t>
+      </w:r>
+      <w:r>
+        <w:rPr>
+          <w:b/>
+          <w:bCs/>
+        </w:rPr>
+        <w:t xml:space="preserve">Rueda-Becerril, J. M.</w:t>
+      </w:r>
+      <w:r>
+        <w:t xml:space="preserve">, &amp; Willing, C. </w:t>
+      </w:r>
+      <w:r>
+        <w:rPr>
+          <w:i/>
+          <w:iCs/>
+        </w:rPr>
+        <w:t xml:space="preserve">Using Numerical Simulations of Wind on Hilly Terrain to Model Propagule Dispersal</w:t>
+      </w:r>
+      <w:r>
+        <w:t xml:space="preserve">, in prep.</w:t>
+      </w:r>
+    </w:p>
+    <w:p>
+      <w:pPr>
+        <w:spacing w:after="20"/>
+        <w:ind w:left="300" w:hanging="300"/>
+      </w:pPr>
+      <w:r>
+        <w:t xml:space="preserve">[11] Holzman, L., </w:t>
+      </w:r>
+      <w:r>
+        <w:rPr>
+          <w:b/>
+          <w:bCs/>
+        </w:rPr>
+        <w:t xml:space="preserve">Rueda-Becerril, J. M.</w:t>
+      </w:r>
+      <w:r>
+        <w:t xml:space="preserve">, Creamer, C., &amp; Willing, C. </w:t>
+      </w:r>
+      <w:r>
+        <w:rPr>
+          <w:i/>
+          <w:iCs/>
+        </w:rPr>
+        <w:t xml:space="preserve">Random Forest Link Landscape Position to Drought Resilience in Giant Sequoia Forests</w:t>
+      </w:r>
+      <w:r>
+        <w:t xml:space="preserve">, in prep.</w:t>
+      </w:r>
+    </w:p>
+    <w:p>
+      <w:pPr>
+        <w:spacing w:after="20"/>
+        <w:ind w:left="300" w:hanging="300"/>
+      </w:pPr>
+      <w:r>
+        <w:t xml:space="preserve">[10] </w:t>
+      </w:r>
+      <w:r>
+        <w:rPr>
+          <w:b/>
+          <w:bCs/>
+        </w:rPr>
+        <w:t xml:space="preserve">Rueda-Becerril, J. M.</w:t>
+      </w:r>
+      <w:r>
+        <w:t xml:space="preserve">, Winkowski, S., &amp; Willing, C. </w:t>
+      </w:r>
+      <w:r>
+        <w:rPr>
+          <w:i/>
+          <w:iCs/>
+        </w:rPr>
+        <w:t xml:space="preserve">WindsOfChange: A New Toolkit for Modeling Spore Dispersal in Hilly Terrains</w:t>
+      </w:r>
+      <w:r>
+        <w:t xml:space="preserve">, in prep.</w:t>
+      </w:r>
+    </w:p>
+    <w:p>
+      <w:pPr>
+        <w:spacing w:after="20"/>
+        <w:ind w:left="300" w:hanging="300"/>
+      </w:pPr>
+      <w:r>
+        <w:t xml:space="preserve">[9] Davis, Z., </w:t>
+      </w:r>
+      <w:r>
+        <w:rPr>
+          <w:b/>
+          <w:bCs/>
+        </w:rPr>
+        <w:t xml:space="preserve">Rueda-Becerril, J. M.</w:t>
+      </w:r>
+      <w:r>
+        <w:t xml:space="preserve">, &amp; Giannios, D. </w:t>
+      </w:r>
+      <w:r>
+        <w:rPr>
+          <w:i/>
+          <w:iCs/>
+        </w:rPr>
+        <w:t xml:space="preserve">Tleco: A Toolkit for Modeling Radiative Signatures from Relativistic Outflows</w:t>
+      </w:r>
+      <w:r>
+        <w:t xml:space="preserve">, </w:t>
+      </w:r>
+      <w:hyperlink w:history="1" r:id="rIdxy1-vg4i9hfvkn8wkzhsa">
+        <w:r>
+          <w:t xml:space="preserve">ApJ 976, 182 (2024)</w:t>
+        </w:r>
+      </w:hyperlink>
+      <w:r>
+        <w:t xml:space="preserve">, </w:t>
+      </w:r>
+      <w:hyperlink w:history="1" r:id="rIdy1lccsr2bdh6zjklynhqf">
+        <w:r>
+          <w:t xml:space="preserve">arXiv:2405.17581</w:t>
+        </w:r>
+      </w:hyperlink>
+      <w:r>
+        <w:t xml:space="preserve">.</w:t>
+      </w:r>
+    </w:p>
+    <w:p>
+      <w:pPr>
+        <w:spacing w:after="20"/>
+        <w:ind w:left="300" w:hanging="300"/>
+      </w:pPr>
+      <w:r>
+        <w:t xml:space="preserve">[8] Davis, Z., </w:t>
+      </w:r>
+      <w:r>
+        <w:rPr>
+          <w:b/>
+          <w:bCs/>
+        </w:rPr>
+        <w:t xml:space="preserve">Rueda-Becerril, J. M.</w:t>
+      </w:r>
+      <w:r>
+        <w:t xml:space="preserve">, &amp; Giannios, D. </w:t>
+      </w:r>
+      <w:r>
+        <w:rPr>
+          <w:i/>
+          <w:iCs/>
+        </w:rPr>
+        <w:t xml:space="preserve">Balancing Turbulent Heating with Radiative Cooling in Blazars</w:t>
+      </w:r>
+      <w:r>
+        <w:t xml:space="preserve">, </w:t>
+      </w:r>
+      <w:hyperlink w:history="1" r:id="rIdnvb94ognixshnnjzsv8p6">
+        <w:r>
+          <w:t xml:space="preserve">MNRAS 513, 5766–5779 (2022)</w:t>
+        </w:r>
+      </w:hyperlink>
+      <w:r>
+        <w:t xml:space="preserve">, </w:t>
+      </w:r>
+      <w:hyperlink w:history="1" r:id="rId58bub07zue9nkn8azc1qh">
+        <w:r>
+          <w:t xml:space="preserve">arXiv:2201.07790</w:t>
+        </w:r>
+      </w:hyperlink>
+      <w:r>
+        <w:t xml:space="preserve">.</w:t>
+      </w:r>
+    </w:p>
+    <w:p>
+      <w:pPr>
+        <w:spacing w:after="20"/>
+        <w:ind w:left="300" w:hanging="300"/>
+      </w:pPr>
+      <w:r>
+        <w:t xml:space="preserve">[7] Lopez-Armengol, F. G., Etienne, Z. B., [...], </w:t>
+      </w:r>
+      <w:r>
+        <w:rPr>
+          <w:b/>
+          <w:bCs/>
+        </w:rPr>
+        <w:t xml:space="preserve">Rueda-Becerril, J. M.</w:t>
+      </w:r>
+      <w:r>
+        <w:t xml:space="preserve">, [...] </w:t>
+      </w:r>
+      <w:r>
+        <w:rPr>
+          <w:i/>
+          <w:iCs/>
+        </w:rPr>
+        <w:t xml:space="preserve">Handing off the outcome of binary neutron star mergers for accurate and long-term postmerger simulations</w:t>
+      </w:r>
+      <w:r>
+        <w:t xml:space="preserve">, </w:t>
+      </w:r>
+      <w:hyperlink w:history="1" r:id="rIdxygpi7d9939xpnivmmclu">
+        <w:r>
+          <w:t xml:space="preserve">Phys. Rev. D 106, 083015 (2022)</w:t>
+        </w:r>
+      </w:hyperlink>
+      <w:r>
+        <w:t xml:space="preserve">, </w:t>
+      </w:r>
+      <w:hyperlink w:history="1" r:id="rIdh2p2eqnegxftkvykvfiuy">
+        <w:r>
+          <w:t xml:space="preserve">arXiv:2112.09817</w:t>
+        </w:r>
+      </w:hyperlink>
+      <w:r>
+        <w:t xml:space="preserve">.</w:t>
+      </w:r>
+    </w:p>
+    <w:p>
+      <w:pPr>
+        <w:spacing w:after="20"/>
+        <w:ind w:left="300" w:hanging="300"/>
+      </w:pPr>
+      <w:r>
+        <w:t xml:space="preserve">[6] Murguia-Berthier, A., Noble, S., [...], </w:t>
+      </w:r>
+      <w:r>
+        <w:rPr>
+          <w:b/>
+          <w:bCs/>
+        </w:rPr>
+        <w:t xml:space="preserve">Rueda-Becerril, J. M.</w:t>
+      </w:r>
+      <w:r>
+        <w:t xml:space="preserve">, [...] </w:t>
+      </w:r>
+      <w:r>
+        <w:rPr>
+          <w:i/>
+          <w:iCs/>
+        </w:rPr>
+        <w:t xml:space="preserve">HARM3D+NUC: A New Method for Simulating the Post-merger Phase of Binary Neutron Star Mergers with GRMHD, Tabulated EOS, and Neutrino Leakage</w:t>
+      </w:r>
+      <w:r>
+        <w:t xml:space="preserve">, </w:t>
+      </w:r>
+      <w:hyperlink w:history="1" r:id="rIdhdmbxvf-v4dquj6qdrgfw">
+        <w:r>
+          <w:t xml:space="preserve">ApJ 919, 95 (2021)</w:t>
+        </w:r>
+      </w:hyperlink>
+      <w:r>
+        <w:t xml:space="preserve">, </w:t>
+      </w:r>
+      <w:hyperlink w:history="1" r:id="rIdprru7fk3xt_2y1dsb1log">
+        <w:r>
+          <w:t xml:space="preserve">arXiv:2106.05356</w:t>
+        </w:r>
+      </w:hyperlink>
+      <w:r>
+        <w:t xml:space="preserve">.</w:t>
+      </w:r>
+    </w:p>
+    <w:p>
+      <w:pPr>
+        <w:spacing w:after="20"/>
+        <w:ind w:left="300" w:hanging="300"/>
+      </w:pPr>
+      <w:r>
+        <w:t xml:space="preserve">[5] </w:t>
+      </w:r>
+      <w:r>
+        <w:rPr>
+          <w:b/>
+          <w:bCs/>
+        </w:rPr>
+        <w:t xml:space="preserve">Rueda-Becerril, J. M.</w:t>
+      </w:r>
+      <w:r>
+        <w:t xml:space="preserve">, Harrison, A. O., &amp; Giannios, D. </w:t>
+      </w:r>
+      <w:r>
+        <w:rPr>
+          <w:i/>
+          <w:iCs/>
+        </w:rPr>
+        <w:t xml:space="preserve">Blazar jets launched with similar energy per baryon, independently of their power</w:t>
+      </w:r>
+      <w:r>
+        <w:t xml:space="preserve">, </w:t>
+      </w:r>
+      <w:hyperlink w:history="1" r:id="rId3kivumrspzz8w9bx4w2wn">
+        <w:r>
+          <w:t xml:space="preserve">MNRAS 501, 4092–4102 (2021)</w:t>
+        </w:r>
+      </w:hyperlink>
+      <w:r>
+        <w:t xml:space="preserve">, </w:t>
+      </w:r>
+      <w:hyperlink w:history="1" r:id="rIdiq1vafpzntsjrkx_ytvsd">
+        <w:r>
+          <w:t xml:space="preserve">arXiv:2009.02273</w:t>
+        </w:r>
+      </w:hyperlink>
+      <w:r>
+        <w:t xml:space="preserve">.</w:t>
+      </w:r>
+    </w:p>
+    <w:p>
+      <w:pPr>
+        <w:spacing w:after="20"/>
+        <w:ind w:left="300" w:hanging="300"/>
+      </w:pPr>
+      <w:r>
+        <w:t xml:space="preserve">[4] Zhang, H., Christie, I., Petropoulou, M., </w:t>
+      </w:r>
+      <w:r>
+        <w:rPr>
+          <w:b/>
+          <w:bCs/>
+        </w:rPr>
+        <w:t xml:space="preserve">Rueda-Becerril, J. M.</w:t>
+      </w:r>
+      <w:r>
+        <w:t xml:space="preserve">, &amp; Giannios, D. </w:t>
+      </w:r>
+      <w:r>
+        <w:rPr>
+          <w:i/>
+          <w:iCs/>
+        </w:rPr>
+        <w:t xml:space="preserve">Inverse Compton Signatures of Gamma-Ray Burst Afterglows</w:t>
+      </w:r>
+      <w:r>
+        <w:t xml:space="preserve">, </w:t>
+      </w:r>
+      <w:hyperlink w:history="1" r:id="rIdixz8rhfuukzd6pljgy6b-">
+        <w:r>
+          <w:t xml:space="preserve">MNRAS 496, 974–986 (2020)</w:t>
+        </w:r>
+      </w:hyperlink>
+      <w:r>
+        <w:t xml:space="preserve">, </w:t>
+      </w:r>
+      <w:hyperlink w:history="1" r:id="rIdg0d7wnayp4ricwzllwhni">
+        <w:r>
+          <w:t xml:space="preserve">arXiv:1910.14049</w:t>
+        </w:r>
+      </w:hyperlink>
+      <w:r>
+        <w:t xml:space="preserve">.</w:t>
+      </w:r>
+    </w:p>
+    <w:p>
+      <w:pPr>
+        <w:spacing w:after="20"/>
+        <w:ind w:left="300" w:hanging="300"/>
+      </w:pPr>
+      <w:r>
+        <w:t xml:space="preserve">[3] </w:t>
+      </w:r>
+      <w:r>
+        <w:rPr>
+          <w:b/>
+          <w:bCs/>
+        </w:rPr>
+        <w:t xml:space="preserve">Rueda-Becerril, J. M.</w:t>
+      </w:r>
+      <w:r>
+        <w:t xml:space="preserve">, Mimica, P., &amp; Aloy, M. A. </w:t>
+      </w:r>
+      <w:r>
+        <w:rPr>
+          <w:i/>
+          <w:iCs/>
+        </w:rPr>
+        <w:t xml:space="preserve">On the influence of a hybrid thermal–non-thermal distribution in the internal shocks model for blazars</w:t>
+      </w:r>
+      <w:r>
+        <w:t xml:space="preserve">, </w:t>
+      </w:r>
+      <w:hyperlink w:history="1" r:id="rIdwehysezbsvzthjqqma0lp">
+        <w:r>
+          <w:t xml:space="preserve">MNRAS 468, 1169–1182 (2017)</w:t>
+        </w:r>
+      </w:hyperlink>
+      <w:r>
+        <w:t xml:space="preserve">, </w:t>
+      </w:r>
+      <w:hyperlink w:history="1" r:id="rIdxtzkc8pbc1emxxp7ul3ji">
+        <w:r>
+          <w:t xml:space="preserve">arXiv:1612.06383</w:t>
+        </w:r>
+      </w:hyperlink>
+      <w:r>
+        <w:t xml:space="preserve">.</w:t>
+      </w:r>
+    </w:p>
+    <w:p>
+      <w:pPr>
+        <w:spacing w:after="20"/>
+        <w:ind w:left="300" w:hanging="300"/>
+      </w:pPr>
+      <w:r>
+        <w:t xml:space="preserve">[2] </w:t>
+      </w:r>
+      <w:r>
+        <w:rPr>
+          <w:b/>
+          <w:bCs/>
+        </w:rPr>
+        <w:t xml:space="preserve">Rueda-Becerril, J. M.</w:t>
+      </w:r>
+      <w:r>
+        <w:t xml:space="preserve">, Mimica, P., &amp; Aloy, M. A. </w:t>
+      </w:r>
+      <w:r>
+        <w:rPr>
+          <w:i/>
+          <w:iCs/>
+        </w:rPr>
+        <w:t xml:space="preserve">The influence of the magnetic field on the spectral properties of blazars</w:t>
+      </w:r>
+      <w:r>
+        <w:t xml:space="preserve">, </w:t>
+      </w:r>
+      <w:hyperlink w:history="1" r:id="rIdvdkb4oflleba-m0y4trsr">
+        <w:r>
+          <w:t xml:space="preserve">MNRAS 438, 1856–1869 (2014)</w:t>
+        </w:r>
+      </w:hyperlink>
+      <w:r>
+        <w:t xml:space="preserve">, </w:t>
+      </w:r>
+      <w:hyperlink w:history="1" r:id="rIdunzhgh6obhic2yvfr1eks">
+        <w:r>
+          <w:t xml:space="preserve">arXiv:1310.5441</w:t>
+        </w:r>
+      </w:hyperlink>
+      <w:r>
+        <w:t xml:space="preserve">.</w:t>
+      </w:r>
+    </w:p>
+    <w:p>
+      <w:pPr>
+        <w:spacing w:after="20"/>
+        <w:ind w:left="300" w:hanging="300"/>
+      </w:pPr>
+      <w:r>
+        <w:t xml:space="preserve">[1] Guzmán, F. S., &amp; </w:t>
+      </w:r>
+      <w:r>
+        <w:rPr>
+          <w:b/>
+          <w:bCs/>
+        </w:rPr>
+        <w:t xml:space="preserve">Rueda-Becerril, J. M.</w:t>
+      </w:r>
+      <w:r>
+        <w:t xml:space="preserve"> </w:t>
+      </w:r>
+      <w:r>
+        <w:rPr>
+          <w:i/>
+          <w:iCs/>
+        </w:rPr>
+        <w:t xml:space="preserve">Spherical boson stars as black hole mimickers</w:t>
+      </w:r>
+      <w:r>
+        <w:t xml:space="preserve">, </w:t>
+      </w:r>
+      <w:hyperlink w:history="1" r:id="rIdf6bnck14yn7hkrbc0cmr3">
+        <w:r>
+          <w:t xml:space="preserve">Phys. Rev. D 80, 084023 (2009)</w:t>
+        </w:r>
+      </w:hyperlink>
+      <w:r>
+        <w:t xml:space="preserve">, </w:t>
+      </w:r>
+      <w:hyperlink w:history="1" r:id="rIdvpjdwdicldu96ofu_wivz">
+        <w:r>
+          <w:t xml:space="preserve">arXiv:1009.1250</w:t>
+        </w:r>
+      </w:hyperlink>
+      <w:r>
+        <w:t xml:space="preserve">.</w:t>
+      </w:r>
+    </w:p>
+    <w:p>
+      <w:pPr>
+        <w:pStyle w:val="Heading2"/>
+      </w:pPr>
+      <w:r>
+        <w:t xml:space="preserve">Conference Proceedings</w:t>
+      </w:r>
+    </w:p>
+    <w:p>
+      <w:pPr>
+        <w:spacing w:after="20"/>
+        <w:ind w:left="300" w:hanging="300"/>
+      </w:pPr>
+      <w:r>
+        <w:t xml:space="preserve">[P5] </w:t>
+      </w:r>
+      <w:r>
+        <w:rPr>
+          <w:b/>
+          <w:bCs/>
+        </w:rPr>
+        <w:t xml:space="preserve">Rueda-Becerril, J. M.</w:t>
+      </w:r>
+      <w:r>
+        <w:t xml:space="preserve"> </w:t>
+      </w:r>
+      <w:r>
+        <w:rPr>
+          <w:i/>
+          <w:iCs/>
+        </w:rPr>
+        <w:t xml:space="preserve">A numerical approach for radiative cooling in relativistic outflows</w:t>
+      </w:r>
+      <w:r>
+        <w:t xml:space="preserve">, </w:t>
+      </w:r>
+      <w:hyperlink w:history="1" r:id="rIdrconbkb8hsmk4zvmvdhjk">
+        <w:r>
+          <w:t xml:space="preserve">Astron. Nachr. 342, 277–282 (2021)</w:t>
+        </w:r>
+      </w:hyperlink>
+      <w:r>
+        <w:t xml:space="preserve">, 9th International Workshop on Astronomy and Relativistic Astrophysics, </w:t>
+      </w:r>
+      <w:hyperlink w:history="1" r:id="rIdpubjcbo3tdaq1eewj4_ab">
+        <w:r>
+          <w:t xml:space="preserve">arXiv:2011.13797</w:t>
+        </w:r>
+      </w:hyperlink>
+      <w:r>
+        <w:t xml:space="preserve">.</w:t>
+      </w:r>
+    </w:p>
+    <w:p>
+      <w:pPr>
+        <w:spacing w:after="20"/>
+        <w:ind w:left="300" w:hanging="300"/>
+      </w:pPr>
+      <w:r>
+        <w:t xml:space="preserve">[P4] </w:t>
+      </w:r>
+      <w:r>
+        <w:rPr>
+          <w:b/>
+          <w:bCs/>
+        </w:rPr>
+        <w:t xml:space="preserve">Rueda-Becerril, J. M.</w:t>
+      </w:r>
+      <w:r>
+        <w:t xml:space="preserve">, Harrison, A. O., &amp; Giannios, D. </w:t>
+      </w:r>
+      <w:r>
+        <w:rPr>
+          <w:i/>
+          <w:iCs/>
+        </w:rPr>
+        <w:t xml:space="preserve">The blazar sequence revised</w:t>
+      </w:r>
+      <w:r>
+        <w:t xml:space="preserve">, </w:t>
+      </w:r>
+      <w:hyperlink w:history="1" r:id="rIdsnkasmxnj22fdperqtfzq">
+        <w:r>
+          <w:t xml:space="preserve">Astron. Nachr. 342, 147–152 (2021)</w:t>
+        </w:r>
+      </w:hyperlink>
+      <w:r>
+        <w:t xml:space="preserve">, 9th International Workshop on Astronomy and Relativistic Astrophysics, </w:t>
+      </w:r>
+      <w:hyperlink w:history="1" r:id="rIdcmk1i8oqiu4ceflwpmyt2">
+        <w:r>
+          <w:t xml:space="preserve">arXiv:2011.13805</w:t>
+        </w:r>
+      </w:hyperlink>
+      <w:r>
+        <w:t xml:space="preserve">.</w:t>
+      </w:r>
+    </w:p>
+    <w:p>
+      <w:pPr>
+        <w:spacing w:after="20"/>
+        <w:ind w:left="300" w:hanging="300"/>
+      </w:pPr>
+      <w:r>
+        <w:t xml:space="preserve">[P3] </w:t>
+      </w:r>
+      <w:r>
+        <w:rPr>
+          <w:b/>
+          <w:bCs/>
+        </w:rPr>
+        <w:t xml:space="preserve">Rueda-Becerril, J. M.</w:t>
+      </w:r>
+      <w:r>
+        <w:t xml:space="preserve">, Mimica, P., &amp; Aloy, M. A. </w:t>
+      </w:r>
+      <w:r>
+        <w:rPr>
+          <w:i/>
+          <w:iCs/>
+        </w:rPr>
+        <w:t xml:space="preserve">Numerical simulations of the internal shock model in magnetized relativistic jets of blazars</w:t>
+      </w:r>
+      <w:r>
+        <w:t xml:space="preserve">, </w:t>
+      </w:r>
+      <w:hyperlink w:history="1" r:id="rIdoikndrws0otakj6d_hamy">
+        <w:r>
+          <w:t xml:space="preserve">PoS(SWIFT 10) 233, 159 (2014)</w:t>
+        </w:r>
+      </w:hyperlink>
+      <w:r>
+        <w:t xml:space="preserve">, </w:t>
+      </w:r>
+      <w:hyperlink w:history="1" r:id="rIdsu2febmrnddzemg8pka-i">
+        <w:r>
+          <w:t xml:space="preserve">arXiv:1502.07882</w:t>
+        </w:r>
+      </w:hyperlink>
+      <w:r>
+        <w:t xml:space="preserve">.</w:t>
+      </w:r>
+    </w:p>
+    <w:p>
+      <w:pPr>
+        <w:spacing w:after="20"/>
+        <w:ind w:left="300" w:hanging="300"/>
+      </w:pPr>
+      <w:r>
+        <w:t xml:space="preserve">[P2] </w:t>
+      </w:r>
+      <w:r>
+        <w:rPr>
+          <w:b/>
+          <w:bCs/>
+        </w:rPr>
+        <w:t xml:space="preserve">Rueda-Becerril, J. M.</w:t>
+      </w:r>
+      <w:r>
+        <w:t xml:space="preserve">, Mimica, P., Aloy, M. A., &amp; Aloy, C. </w:t>
+      </w:r>
+      <w:r>
+        <w:rPr>
+          <w:i/>
+          <w:iCs/>
+        </w:rPr>
+        <w:t xml:space="preserve">Numerical study of broadband spectra caused by internal shocks in magnetized relativistic jets of blazars</w:t>
+      </w:r>
+      <w:r>
+        <w:t xml:space="preserve">, </w:t>
+      </w:r>
+      <w:hyperlink w:history="1" r:id="rId6yvwcbd1vfhn4kjdmww8r">
+        <w:r>
+          <w:t xml:space="preserve">EPJ Web Conf. 61, 02007 (2013)</w:t>
+        </w:r>
+      </w:hyperlink>
+      <w:r>
+        <w:t xml:space="preserve">, </w:t>
+      </w:r>
+      <w:hyperlink w:history="1" r:id="rIdnc7eigp7mrb2orh1wy7mz">
+        <w:r>
+          <w:t xml:space="preserve">arXiv:1309.4612</w:t>
+        </w:r>
+      </w:hyperlink>
+      <w:r>
+        <w:t xml:space="preserve">.</w:t>
+      </w:r>
+    </w:p>
+    <w:p>
+      <w:pPr>
+        <w:spacing w:after="20"/>
+        <w:ind w:left="300" w:hanging="300"/>
+      </w:pPr>
+      <w:r>
+        <w:t xml:space="preserve">[P1] Mimica, P., Aloy, M. A., </w:t>
+      </w:r>
+      <w:r>
+        <w:rPr>
+          <w:b/>
+          <w:bCs/>
+        </w:rPr>
+        <w:t xml:space="preserve">Rueda-Becerril, J. M.</w:t>
+      </w:r>
+      <w:r>
+        <w:t xml:space="preserve">, Tabik, S., &amp; Aloy, C. </w:t>
+      </w:r>
+      <w:r>
+        <w:rPr>
+          <w:i/>
+          <w:iCs/>
+        </w:rPr>
+        <w:t xml:space="preserve">Numerical simulations of dynamics and emission from relativistic astrophysical jets</w:t>
+      </w:r>
+      <w:r>
+        <w:t xml:space="preserve">, </w:t>
+      </w:r>
+      <w:hyperlink w:history="1" r:id="rIdctrzaiytbsjkdts8zvecu">
+        <w:r>
+          <w:t xml:space="preserve">J. Phys.: Conf. Ser. 454, 012001 (2013)</w:t>
+        </w:r>
+      </w:hyperlink>
+      <w:r>
+        <w:t xml:space="preserve">, </w:t>
+      </w:r>
+      <w:hyperlink w:history="1" r:id="rIda_eseazu_8jj9gtjks2bv">
+        <w:r>
+          <w:t xml:space="preserve">arXiv:1211.1794</w:t>
+        </w:r>
+      </w:hyperlink>
+      <w:r>
+        <w:t xml:space="preserve">.</w:t>
+      </w:r>
+    </w:p>
+    <w:p>
+      <w:pPr>
+        <w:pStyle w:val="Heading1"/>
+      </w:pPr>
+      <w:r>
+        <w:t xml:space="preserve">Grants and Fellowships</w:t>
+      </w:r>
+    </w:p>
+    <w:p>
+      <w:pPr>
+        <w:pStyle w:val="Heading2"/>
+      </w:pPr>
+      <w:r>
+        <w:t xml:space="preserve">Research Grants</w:t>
+      </w:r>
+    </w:p>
+    <w:p>
+      <w:pPr>
+        <w:keepNext/>
+        <w:tabs>
+          <w:tab w:val="right" w:pos="10512"/>
+        </w:tabs>
+        <w:spacing w:after="0"/>
+      </w:pPr>
+      <w:r>
+        <w:rPr>
+          <w:b/>
+          <w:bCs/>
+        </w:rPr>
+        <w:t xml:space="preserve">NASA Fermi Guest Investigator Program, Cycle 12</w:t>
+      </w:r>
+      <w:r>
+        <w:tab/>
+      </w:r>
+      <w:r>
+        <w:t xml:space="preserve">2019</w:t>
+      </w:r>
+    </w:p>
+    <w:p>
+      <w:pPr>
+        <w:keepNext/>
+        <w:tabs>
+          <w:tab w:val="right" w:pos="10512"/>
+        </w:tabs>
+        <w:spacing w:after="0"/>
+      </w:pPr>
+      <w:r>
+        <w:rPr>
+          <w:i/>
+          <w:iCs/>
+        </w:rPr>
+        <w:t xml:space="preserve">A simple model to understand the blazar sequence</w:t>
+      </w:r>
+      <w:r>
+        <w:tab/>
+      </w:r>
+      <w:r>
+        <w:t xml:space="preserve">Grant #121077, $68K</w:t>
+      </w:r>
+    </w:p>
+    <w:p>
+      <w:pPr>
+        <w:spacing w:after="0"/>
+      </w:pPr>
+      <w:r>
+        <w:t xml:space="preserve">PI: D. Giannios; Co-I: J. M. Rueda-Becerril</w:t>
+      </w:r>
+    </w:p>
+    <w:p>
+      <w:pPr>
+        <w:pStyle w:val="EntryGap"/>
+        <w:spacing w:after="0"/>
+      </w:pPr>
+    </w:p>
+    <w:p>
+      <w:pPr>
+        <w:pStyle w:val="Heading2"/>
+      </w:pPr>
+      <w:r>
+        <w:t xml:space="preserve">Fellowships</w:t>
+      </w:r>
+    </w:p>
+    <w:p>
+      <w:pPr>
+        <w:keepNext/>
+        <w:tabs>
+          <w:tab w:val="right" w:pos="10512"/>
+        </w:tabs>
+        <w:spacing w:after="0"/>
+      </w:pPr>
+      <w:r>
+        <w:rPr>
+          <w:b/>
+          <w:bCs/>
+        </w:rPr>
+        <w:t xml:space="preserve">International Postdoctoral Fellowship</w:t>
+      </w:r>
+      <w:r>
+        <w:tab/>
+      </w:r>
+      <w:r>
+        <w:t xml:space="preserve">Oct 2018 – Nov 2020</w:t>
+      </w:r>
+    </w:p>
+    <w:p>
+      <w:pPr>
+        <w:keepNext/>
+        <w:tabs>
+          <w:tab w:val="right" w:pos="10512"/>
+        </w:tabs>
+        <w:spacing w:after="0"/>
+      </w:pPr>
+      <w:r>
+        <w:rPr>
+          <w:i/>
+          <w:iCs/>
+        </w:rPr>
+        <w:t xml:space="preserve">National Council of Science and Technology (CONACyT), Mexico</w:t>
+      </w:r>
+    </w:p>
+    <w:p>
+      <w:pPr>
+        <w:pStyle w:val="EntryGap"/>
+        <w:spacing w:after="0"/>
+      </w:pPr>
+    </w:p>
+    <w:p>
+      <w:pPr>
+        <w:keepNext/>
+        <w:tabs>
+          <w:tab w:val="right" w:pos="10512"/>
+        </w:tabs>
+        <w:spacing w:after="0"/>
+      </w:pPr>
+      <w:r>
+        <w:rPr>
+          <w:b/>
+          <w:bCs/>
+        </w:rPr>
+        <w:t xml:space="preserve">Postdoctoral Fellowship</w:t>
+      </w:r>
+      <w:r>
+        <w:tab/>
+      </w:r>
+      <w:r>
+        <w:t xml:space="preserve">Jan 2018 – Sep 2018</w:t>
+      </w:r>
+    </w:p>
+    <w:p>
+      <w:pPr>
+        <w:keepNext/>
+        <w:tabs>
+          <w:tab w:val="right" w:pos="10512"/>
+        </w:tabs>
+        <w:spacing w:after="0"/>
+      </w:pPr>
+      <w:r>
+        <w:rPr>
+          <w:i/>
+          <w:iCs/>
+        </w:rPr>
+        <w:t xml:space="preserve">Secretariat of Public Education, Mexico (Program for the Professional Development of Higher Education Institutions)</w:t>
+      </w:r>
+    </w:p>
+    <w:p>
+      <w:pPr>
+        <w:pStyle w:val="EntryGap"/>
+        <w:spacing w:after="0"/>
+      </w:pPr>
+    </w:p>
+    <w:p>
+      <w:pPr>
+        <w:keepNext/>
+        <w:tabs>
+          <w:tab w:val="right" w:pos="10512"/>
+        </w:tabs>
+        <w:spacing w:after="0"/>
+      </w:pPr>
+      <w:r>
+        <w:rPr>
+          <w:b/>
+          <w:bCs/>
+        </w:rPr>
+        <w:t xml:space="preserve">Study-Abroad Fellowship</w:t>
+      </w:r>
+      <w:r>
+        <w:tab/>
+      </w:r>
+      <w:r>
+        <w:t xml:space="preserve">Sep 2014 – Aug 2016</w:t>
+      </w:r>
+    </w:p>
+    <w:p>
+      <w:pPr>
+        <w:keepNext/>
+        <w:tabs>
+          <w:tab w:val="right" w:pos="10512"/>
+        </w:tabs>
+        <w:spacing w:after="0"/>
+      </w:pPr>
+      <w:r>
+        <w:rPr>
+          <w:i/>
+          <w:iCs/>
+        </w:rPr>
+        <w:t xml:space="preserve">National Council of Science and Technology (CONACyT), Mexico</w:t>
+      </w:r>
+    </w:p>
+    <w:p>
+      <w:pPr>
+        <w:pStyle w:val="EntryGap"/>
+        <w:spacing w:after="0"/>
+      </w:pPr>
+    </w:p>
+    <w:p>
+      <w:pPr>
+        <w:keepNext/>
+        <w:tabs>
+          <w:tab w:val="right" w:pos="10512"/>
+        </w:tabs>
+        <w:spacing w:after="0"/>
+      </w:pPr>
+      <w:r>
+        <w:rPr>
+          <w:b/>
+          <w:bCs/>
+        </w:rPr>
+        <w:t xml:space="preserve">Santiago Grisolía Fellowship</w:t>
+      </w:r>
+      <w:r>
+        <w:tab/>
+      </w:r>
+      <w:r>
+        <w:t xml:space="preserve">Oct 2011 – Jun 2014</w:t>
+      </w:r>
+    </w:p>
+    <w:p>
+      <w:pPr>
+        <w:keepNext/>
+        <w:tabs>
+          <w:tab w:val="right" w:pos="10512"/>
+        </w:tabs>
+        <w:spacing w:after="0"/>
+      </w:pPr>
+      <w:r>
+        <w:rPr>
+          <w:i/>
+          <w:iCs/>
+        </w:rPr>
+        <w:t xml:space="preserve">Council of Education, Research, Culture and Sport, Valencian Community, Spain</w:t>
+      </w:r>
+    </w:p>
+    <w:p>
+      <w:pPr>
+        <w:pStyle w:val="EntryGap"/>
+        <w:spacing w:after="0"/>
+      </w:pPr>
+    </w:p>
+    <w:p>
+      <w:pPr>
+        <w:keepNext/>
+        <w:tabs>
+          <w:tab w:val="right" w:pos="10512"/>
+        </w:tabs>
+        <w:spacing w:after="0"/>
+      </w:pPr>
+      <w:r>
+        <w:rPr>
+          <w:b/>
+          <w:bCs/>
+        </w:rPr>
+        <w:t xml:space="preserve">M.Sc. Fellowship</w:t>
+      </w:r>
+      <w:r>
+        <w:tab/>
+      </w:r>
+      <w:r>
+        <w:t xml:space="preserve">Sep 2009 – Aug 2011</w:t>
+      </w:r>
+    </w:p>
+    <w:p>
+      <w:pPr>
+        <w:keepNext/>
+        <w:tabs>
+          <w:tab w:val="right" w:pos="10512"/>
+        </w:tabs>
+        <w:spacing w:after="0"/>
+      </w:pPr>
+      <w:r>
+        <w:rPr>
+          <w:i/>
+          <w:iCs/>
+        </w:rPr>
+        <w:t xml:space="preserve">CONACyT, at the Institute of Physics and Mathematics, Universidad Michoacana de San Nicolás de Hidalgo</w:t>
+      </w:r>
+    </w:p>
+    <w:p>
+      <w:pPr>
+        <w:pStyle w:val="EntryGap"/>
+        <w:spacing w:after="0"/>
+      </w:pPr>
+    </w:p>
+    <w:p>
+      <w:pPr>
+        <w:keepNext/>
+        <w:tabs>
+          <w:tab w:val="right" w:pos="10512"/>
+        </w:tabs>
+        <w:spacing w:after="0"/>
+      </w:pPr>
+      <w:r>
+        <w:rPr>
+          <w:b/>
+          <w:bCs/>
+        </w:rPr>
+        <w:t xml:space="preserve">Summer Research Fellowship (XVII Summer of Scientific Research)</w:t>
+      </w:r>
+      <w:r>
+        <w:tab/>
+      </w:r>
+      <w:r>
+        <w:t xml:space="preserve">Jun 2007 – Aug 2007</w:t>
+      </w:r>
+    </w:p>
+    <w:p>
+      <w:pPr>
+        <w:keepNext/>
+        <w:tabs>
+          <w:tab w:val="right" w:pos="10512"/>
+        </w:tabs>
+        <w:spacing w:after="0"/>
+      </w:pPr>
+      <w:r>
+        <w:rPr>
+          <w:i/>
+          <w:iCs/>
+        </w:rPr>
+        <w:t xml:space="preserve">Mexican Academy of Sciences</w:t>
+      </w:r>
+    </w:p>
+    <w:p>
+      <w:pPr>
+        <w:pStyle w:val="EntryGap"/>
+        <w:spacing w:after="0"/>
+      </w:pPr>
+    </w:p>
+    <w:p>
+      <w:pPr>
+        <w:pStyle w:val="Heading1"/>
+      </w:pPr>
+      <w:r>
+        <w:t xml:space="preserve">Software and Projects</w:t>
+      </w:r>
+    </w:p>
+    <w:p>
+      <w:pPr>
+        <w:keepNext/>
+        <w:tabs>
+          <w:tab w:val="right" w:pos="10512"/>
+        </w:tabs>
+        <w:spacing w:after="0"/>
+      </w:pPr>
+      <w:r>
+        <w:rPr>
+          <w:b/>
+          <w:bCs/>
+        </w:rPr>
+        <w:t xml:space="preserve">Blazar Population ML</w:t>
+      </w:r>
+      <w:r>
+        <w:tab/>
+      </w:r>
+      <w:r>
+        <w:t xml:space="preserve">Jan 2026 – Present</w:t>
+      </w:r>
+    </w:p>
+    <w:p>
+      <w:pPr>
+        <w:keepNext/>
+        <w:tabs>
+          <w:tab w:val="right" w:pos="10512"/>
+        </w:tabs>
+        <w:spacing w:after="0"/>
+      </w:pPr>
+      <w:r>
+        <w:rPr>
+          <w:i/>
+          <w:iCs/>
+        </w:rPr>
+        <w:t xml:space="preserve">Scientific ML (Python, scikit-learn, PyTorch)</w:t>
+      </w:r>
+      <w:r>
+        <w:tab/>
+      </w:r>
+      <w:hyperlink w:history="1" r:id="rId9uel9rmsqv6ujmmssyqlq">
+        <w:r>
+          <w:t xml:space="preserve">github.com/altjerue/ilwikak-ml</w:t>
+        </w:r>
+      </w:hyperlink>
     </w:p>
     <w:p>
       <w:pPr>
@@ -2510,60 +2487,8 @@
         <w:spacing w:after="10"/>
       </w:pPr>
       <w:r>
-        <w:t xml:space="preserve">Forecasting blazar gamma-ray flares with a time-series foundation model fine-tuned on Tleco-generated synthetic light curves.</w:t>
-      </w:r>
-    </w:p>
-    <w:p>
-      <w:pPr>
-        <w:pStyle w:val="EntryGap"/>
-        <w:spacing w:after="0"/>
-      </w:pPr>
-    </w:p>
-    <w:p>
-      <w:pPr>
-        <w:keepNext/>
-        <w:tabs>
-          <w:tab w:val="right" w:pos="10512"/>
-        </w:tabs>
-        <w:spacing w:after="0"/>
-      </w:pPr>
-      <w:r>
-        <w:rPr>
-          <w:b/>
-          <w:bCs/>
-        </w:rPr>
-        <w:t xml:space="preserve">WindsOfChange</w:t>
-      </w:r>
-      <w:r>
-        <w:tab/>
-      </w:r>
-      <w:r>
-        <w:t xml:space="preserve">Aug 2024 – Present</w:t>
-      </w:r>
-    </w:p>
-    <w:p>
-      <w:pPr>
-        <w:keepNext/>
-        <w:tabs>
-          <w:tab w:val="right" w:pos="10512"/>
-        </w:tabs>
-        <w:spacing w:after="0"/>
-      </w:pPr>
-      <w:r>
-        <w:rPr>
-          <w:i/>
-          <w:iCs/>
-        </w:rPr>
-        <w:t xml:space="preserve">Lagrangian particle-dispersion library (C++/R)</w:t>
-      </w:r>
-      <w:r>
-        <w:tab/>
-      </w:r>
-      <w:hyperlink w:history="1" r:id="rIdhzlvlcukqu6s1-ye4wunt">
-        <w:r>
-          <w:t xml:space="preserve">github.com/UW-ForestMycobiomeLab/WindSporesHills</w:t>
-        </w:r>
-      </w:hyperlink>
+        <w:t xml:space="preserve">Applying classical ML (PCA, UMAP, Gaussian mixture models, HDBSCAN) to the Fermi-LAT 4LAC-DR3 catalog (3,407 sources) to test whether jet baryon-loading constraints from my 2021 simulation study can be recovered from observables; Gaussian process regression on a 334-source MOJAVE subsample in progress.</w:t>
+      </w:r>
     </w:p>
     <w:p>
       <w:pPr>
@@ -2575,58 +2500,58 @@
         <w:spacing w:after="10"/>
       </w:pPr>
       <w:r>
-        <w:t xml:space="preserve">Simulates particle dispersion, atmospheric turbulence, and flow over hilly terrain with forest canopy, based on analytical models (Massman &amp; Weil 1999; Finnigan &amp; Belcher 2004); designed to scale to tens of thousands of particles over kilometer-scale domains.</w:t>
-      </w:r>
-    </w:p>
-    <w:p>
-      <w:pPr>
-        <w:pStyle w:val="EntryGap"/>
-        <w:spacing w:after="0"/>
-      </w:pPr>
-    </w:p>
-    <w:p>
-      <w:pPr>
-        <w:keepNext/>
-        <w:tabs>
-          <w:tab w:val="right" w:pos="10512"/>
-        </w:tabs>
-        <w:spacing w:after="0"/>
-      </w:pPr>
-      <w:r>
-        <w:rPr>
-          <w:b/>
-          <w:bCs/>
-        </w:rPr>
-        <w:t xml:space="preserve">Tleco</w:t>
-      </w:r>
-      <w:r>
-        <w:tab/>
-      </w:r>
-      <w:r>
-        <w:t xml:space="preserve">Jan 2024 – Sep 2024</w:t>
-      </w:r>
-    </w:p>
-    <w:p>
-      <w:pPr>
-        <w:keepNext/>
-        <w:tabs>
-          <w:tab w:val="right" w:pos="10512"/>
-        </w:tabs>
-        <w:spacing w:after="0"/>
-      </w:pPr>
-      <w:r>
-        <w:rPr>
-          <w:i/>
-          <w:iCs/>
-        </w:rPr>
-        <w:t xml:space="preserve">Radiative-transfer toolkit (Rust/Python)</w:t>
-      </w:r>
-      <w:r>
-        <w:tab/>
-      </w:r>
-      <w:hyperlink w:history="1" r:id="rIdu5vguta98bcd7dd_9zs8v">
+        <w:t xml:space="preserve">Planned next stage: a neural emulator of Tleco trained on synthetic spectra, then flare forecasting on Tleco-generated light curves.</w:t>
+      </w:r>
+    </w:p>
+    <w:p>
+      <w:pPr>
+        <w:pStyle w:val="EntryGap"/>
+        <w:spacing w:after="0"/>
+      </w:pPr>
+    </w:p>
+    <w:p>
+      <w:pPr>
+        <w:keepNext/>
+        <w:tabs>
+          <w:tab w:val="right" w:pos="10512"/>
+        </w:tabs>
+        <w:spacing w:after="0"/>
+      </w:pPr>
+      <w:r>
+        <w:rPr>
+          <w:b/>
+          <w:bCs/>
+        </w:rPr>
+        <w:t xml:space="preserve">WindsOfChange</w:t>
+      </w:r>
+      <w:r>
+        <w:tab/>
+      </w:r>
+      <w:r>
+        <w:t xml:space="preserve">Aug 2024 – Present</w:t>
+      </w:r>
+    </w:p>
+    <w:p>
+      <w:pPr>
+        <w:keepNext/>
+        <w:tabs>
+          <w:tab w:val="right" w:pos="10512"/>
+        </w:tabs>
+        <w:spacing w:after="0"/>
+      </w:pPr>
+      <w:r>
+        <w:rPr>
+          <w:i/>
+          <w:iCs/>
+        </w:rPr>
+        <w:t xml:space="preserve">Lagrangian particle-dispersion library (C++/R)</w:t>
+      </w:r>
+      <w:r>
+        <w:tab/>
+      </w:r>
+      <w:hyperlink w:history="1" r:id="rIdqivuuycmt5jno2qzbvc60">
         <w:r>
-          <w:t xml:space="preserve">github.com/zkdavis/Tleco</w:t>
+          <w:t xml:space="preserve">github.com/UW-ForestMycobiomeLab/WindSporesHills</w:t>
         </w:r>
       </w:hyperlink>
     </w:p>
@@ -2640,60 +2565,8 @@
         <w:spacing w:after="10"/>
       </w:pPr>
       <w:r>
-        <w:t xml:space="preserve">Numerical PDE solvers, particle-distribution algorithms, and spectral calculations for relativistic plasmas; successor to Paramo [9].</w:t>
-      </w:r>
-    </w:p>
-    <w:p>
-      <w:pPr>
-        <w:pStyle w:val="EntryGap"/>
-        <w:spacing w:after="0"/>
-      </w:pPr>
-    </w:p>
-    <w:p>
-      <w:pPr>
-        <w:keepNext/>
-        <w:tabs>
-          <w:tab w:val="right" w:pos="10512"/>
-        </w:tabs>
-        <w:spacing w:after="0"/>
-      </w:pPr>
-      <w:r>
-        <w:rPr>
-          <w:b/>
-          <w:bCs/>
-        </w:rPr>
-        <w:t xml:space="preserve">Paramo</w:t>
-      </w:r>
-      <w:r>
-        <w:tab/>
-      </w:r>
-      <w:r>
-        <w:t xml:space="preserve">Oct 2018 – Apr 2022</w:t>
-      </w:r>
-    </w:p>
-    <w:p>
-      <w:pPr>
-        <w:keepNext/>
-        <w:tabs>
-          <w:tab w:val="right" w:pos="10512"/>
-        </w:tabs>
-        <w:spacing w:after="0"/>
-      </w:pPr>
-      <w:r>
-        <w:rPr>
-          <w:i/>
-          <w:iCs/>
-        </w:rPr>
-        <w:t xml:space="preserve">Radiative-transfer library (Fortran 95, OpenMP)</w:t>
-      </w:r>
-      <w:r>
-        <w:tab/>
-      </w:r>
-      <w:hyperlink w:history="1" r:id="rId_0zkaj2mnbtkpd6eupxrk">
-        <w:r>
-          <w:t xml:space="preserve">github.com/altjerue/paramo</w:t>
-        </w:r>
-      </w:hyperlink>
+        <w:t xml:space="preserve">Simulates particle dispersion, atmospheric turbulence, and flow over hilly terrain with forest canopy, based on analytical models (Massman &amp; Weil 1999; Finnigan &amp; Belcher 2004); designed to scale to tens of thousands of particles over kilometer-scale domains.</w:t>
+      </w:r>
     </w:p>
     <w:p>
       <w:pPr>
@@ -2705,52 +2578,60 @@
         <w:spacing w:after="10"/>
       </w:pPr>
       <w:r>
-        <w:t xml:space="preserve">Fokker–Planck and radiative-transfer solver for relativistic particle distributions; about 20× faster than the original serial code on 5 cores after OpenMP parallelization and optimization; used by other groups, including Combi &amp; Siegel (2023).</w:t>
-      </w:r>
-    </w:p>
-    <w:p>
-      <w:pPr>
-        <w:pStyle w:val="EntryGap"/>
-        <w:spacing w:after="0"/>
-      </w:pPr>
-    </w:p>
-    <w:p>
-      <w:pPr>
-        <w:keepNext/>
-        <w:tabs>
-          <w:tab w:val="right" w:pos="10512"/>
-        </w:tabs>
-        <w:spacing w:after="0"/>
-      </w:pPr>
-      <w:r>
-        <w:rPr>
-          <w:b/>
-          <w:bCs/>
-        </w:rPr>
-        <w:t xml:space="preserve">PatchworkMHD</w:t>
-      </w:r>
-      <w:r>
-        <w:tab/>
-      </w:r>
-      <w:r>
-        <w:t xml:space="preserve">Feb 2021 – Apr 2022</w:t>
-      </w:r>
-    </w:p>
-    <w:p>
-      <w:pPr>
-        <w:keepNext/>
-        <w:tabs>
-          <w:tab w:val="right" w:pos="10512"/>
-        </w:tabs>
-        <w:spacing w:after="0"/>
-      </w:pPr>
-      <w:r>
-        <w:rPr>
-          <w:i/>
-          <w:iCs/>
-        </w:rPr>
-        <w:t xml:space="preserve">Large-scale MHD simulation code (NSF project)</w:t>
-      </w:r>
+        <w:t xml:space="preserve">Used AI coding assistants in the most recent stages of development; changes were accepted only if they passed the unit-test suite and, for some functions, matched reference solutions.</w:t>
+      </w:r>
+    </w:p>
+    <w:p>
+      <w:pPr>
+        <w:pStyle w:val="EntryGap"/>
+        <w:spacing w:after="0"/>
+      </w:pPr>
+    </w:p>
+    <w:p>
+      <w:pPr>
+        <w:keepNext/>
+        <w:tabs>
+          <w:tab w:val="right" w:pos="10512"/>
+        </w:tabs>
+        <w:spacing w:after="0"/>
+      </w:pPr>
+      <w:r>
+        <w:rPr>
+          <w:b/>
+          <w:bCs/>
+        </w:rPr>
+        <w:t xml:space="preserve">Tleco</w:t>
+      </w:r>
+      <w:r>
+        <w:tab/>
+      </w:r>
+      <w:r>
+        <w:t xml:space="preserve">Jan 2024 – Sep 2024</w:t>
+      </w:r>
+    </w:p>
+    <w:p>
+      <w:pPr>
+        <w:keepNext/>
+        <w:tabs>
+          <w:tab w:val="right" w:pos="10512"/>
+        </w:tabs>
+        <w:spacing w:after="0"/>
+      </w:pPr>
+      <w:r>
+        <w:rPr>
+          <w:i/>
+          <w:iCs/>
+        </w:rPr>
+        <w:t xml:space="preserve">Radiative-transfer toolkit (Rust/Python)</w:t>
+      </w:r>
+      <w:r>
+        <w:tab/>
+      </w:r>
+      <w:hyperlink w:history="1" r:id="rIdrqtocjgb3h1m3aanejzgr">
+        <w:r>
+          <w:t xml:space="preserve">github.com/zkdavis/Tleco</w:t>
+        </w:r>
+      </w:hyperlink>
     </w:p>
     <w:p>
       <w:pPr>
@@ -2762,7 +2643,129 @@
         <w:spacing w:after="10"/>
       </w:pPr>
       <w:r>
-        <w:t xml:space="preserve">Led a 7-person upgrade of this production C code for HPC environments, adding black-hole spin with under 5% runtime overhead.</w:t>
+        <w:t xml:space="preserve">Numerical PDE solvers, particle-distribution algorithms, and spectral calculations for relativistic plasmas; successor to Paramo [9].</w:t>
+      </w:r>
+    </w:p>
+    <w:p>
+      <w:pPr>
+        <w:pStyle w:val="EntryGap"/>
+        <w:spacing w:after="0"/>
+      </w:pPr>
+    </w:p>
+    <w:p>
+      <w:pPr>
+        <w:keepNext/>
+        <w:tabs>
+          <w:tab w:val="right" w:pos="10512"/>
+        </w:tabs>
+        <w:spacing w:after="0"/>
+      </w:pPr>
+      <w:r>
+        <w:rPr>
+          <w:b/>
+          <w:bCs/>
+        </w:rPr>
+        <w:t xml:space="preserve">Paramo</w:t>
+      </w:r>
+      <w:r>
+        <w:tab/>
+      </w:r>
+      <w:r>
+        <w:t xml:space="preserve">Oct 2018 – Apr 2022</w:t>
+      </w:r>
+    </w:p>
+    <w:p>
+      <w:pPr>
+        <w:keepNext/>
+        <w:tabs>
+          <w:tab w:val="right" w:pos="10512"/>
+        </w:tabs>
+        <w:spacing w:after="0"/>
+      </w:pPr>
+      <w:r>
+        <w:rPr>
+          <w:i/>
+          <w:iCs/>
+        </w:rPr>
+        <w:t xml:space="preserve">Radiative-transfer library (Fortran 95, OpenMP)</w:t>
+      </w:r>
+      <w:r>
+        <w:tab/>
+      </w:r>
+      <w:hyperlink w:history="1" r:id="rIdm9qvpcb-fadwriyllwine">
+        <w:r>
+          <w:t xml:space="preserve">github.com/altjerue/paramo</w:t>
+        </w:r>
+      </w:hyperlink>
+    </w:p>
+    <w:p>
+      <w:pPr>
+        <w:pStyle w:val="ListParagraph"/>
+        <w:numPr>
+          <w:ilvl w:val="0"/>
+          <w:numId w:val="2"/>
+        </w:numPr>
+        <w:spacing w:after="10"/>
+      </w:pPr>
+      <w:r>
+        <w:t xml:space="preserve">Fokker–Planck and radiative-transfer solver for relativistic particle distributions; parallelized and optimized with OpenMP; used by other groups, including Combi &amp; Siegel (2023).</w:t>
+      </w:r>
+    </w:p>
+    <w:p>
+      <w:pPr>
+        <w:pStyle w:val="EntryGap"/>
+        <w:spacing w:after="0"/>
+      </w:pPr>
+    </w:p>
+    <w:p>
+      <w:pPr>
+        <w:keepNext/>
+        <w:tabs>
+          <w:tab w:val="right" w:pos="10512"/>
+        </w:tabs>
+        <w:spacing w:after="0"/>
+      </w:pPr>
+      <w:r>
+        <w:rPr>
+          <w:b/>
+          <w:bCs/>
+        </w:rPr>
+        <w:t xml:space="preserve">PatchworkMHD</w:t>
+      </w:r>
+      <w:r>
+        <w:tab/>
+      </w:r>
+      <w:r>
+        <w:t xml:space="preserve">Feb 2021 – Apr 2022</w:t>
+      </w:r>
+    </w:p>
+    <w:p>
+      <w:pPr>
+        <w:keepNext/>
+        <w:tabs>
+          <w:tab w:val="right" w:pos="10512"/>
+        </w:tabs>
+        <w:spacing w:after="0"/>
+      </w:pPr>
+      <w:r>
+        <w:rPr>
+          <w:i/>
+          <w:iCs/>
+        </w:rPr>
+        <w:t xml:space="preserve">Large-scale MHD simulation code (NSF project)</w:t>
+      </w:r>
+    </w:p>
+    <w:p>
+      <w:pPr>
+        <w:pStyle w:val="ListParagraph"/>
+        <w:numPr>
+          <w:ilvl w:val="0"/>
+          <w:numId w:val="2"/>
+        </w:numPr>
+        <w:spacing w:after="10"/>
+      </w:pPr>
+      <w:r>
+        <w:t xml:space="preserve">Led a 7-person upgrade of this production C code for HPC environments, adding black hole spin with under 5% runtime overhead.</w:t>
       </w:r>
     </w:p>
     <w:p>
@@ -3300,7 +3303,7 @@
       <w:r>
         <w:t xml:space="preserve">Video: </w:t>
       </w:r>
-      <w:hyperlink w:history="1" r:id="rIdjtjamlzldutd5zbftm9a8">
+      <w:hyperlink w:history="1" r:id="rIdw2a9rswh5n9aukdcys-co">
         <w:r>
           <w:t xml:space="preserve">youtube.com/watch?v=BAZNWLNT69M</w:t>
         </w:r>
@@ -3471,7 +3474,7 @@
       <w:r>
         <w:t xml:space="preserve">Marcos Moshinsky Award for Best Poster. Video: </w:t>
       </w:r>
-      <w:hyperlink w:history="1" r:id="rIdsvrqdhuguvxhnacz7efww">
+      <w:hyperlink w:history="1" r:id="rIdpctnksxtrsjspdxxplwdk">
         <w:r>
           <w:t xml:space="preserve">youtube.com/watch?v=0TJiKg7kOPI</w:t>
         </w:r>
@@ -4529,7 +4532,7 @@
       <w:pPr>
         <w:spacing w:after="0"/>
       </w:pPr>
-      <w:hyperlink w:history="1" r:id="rId0btmpgurrch1ihhiaxqx9">
+      <w:hyperlink w:history="1" r:id="rIda9dazxfik3vmc9q9yvpad">
         <w:r>
           <w:t xml:space="preserve">mexiciencia.github.io/post/anita</w:t>
         </w:r>
@@ -4589,7 +4592,7 @@
       <w:pPr>
         <w:spacing w:after="0"/>
       </w:pPr>
-      <w:hyperlink w:history="1" r:id="rIdjcfosgzdgl0yo4cos_5pf">
+      <w:hyperlink w:history="1" r:id="rIdx_3caksoseslhl48e3nxr">
         <w:r>
           <w:t xml:space="preserve">mexiciencia.github.io/post/modelo-sir</w:t>
         </w:r>
@@ -4652,7 +4655,7 @@
       <w:r>
         <w:t xml:space="preserve">Data analysis and modeling collaborator. </w:t>
       </w:r>
-      <w:hyperlink w:history="1" r:id="rIdqzomcp2phzswuzroc7g2m">
+      <w:hyperlink w:history="1" r:id="rIdgrtxgxey3lf112gbkm2vs">
         <w:r>
           <w:t xml:space="preserve">mexiciencia.github.io/post/covid19</w:t>
         </w:r>

</xml_diff>

<commit_message>
Refine teaching resume and align YAML with moderncv version
Restore the teaching moderncv sections from ea08391 (summary, experience,
publications note), use skills_resume.tex for the teaching skills and drop
skills2.tex. Rework content/resume.yaml to mirror the moderncv resume, move
Teaching and Mentoring up in cv.yaml, set the publications count to 3
first-author, and rebuild the plain and moderncv outputs.

Co-Authored-By: Claude Sonnet 5.5 <noreply@anthropic.com>
</commit_message>
<xml_diff>
--- a/RuedaBecerrilJM-CV-plain.docx
+++ b/RuedaBecerrilJM-CV-plain.docx
@@ -28,7 +28,7 @@
       <w:r>
         <w:t xml:space="preserve">  |  </w:t>
       </w:r>
-      <w:hyperlink w:history="1" r:id="rIdqe2xteqpfs-xwwpyw_l5w">
+      <w:hyperlink w:history="1" r:id="rIdc-s3lvci_q7d2qfy-juqc">
         <w:r>
           <w:t xml:space="preserve">jm.ruebe@gmail.com</w:t>
         </w:r>
@@ -42,7 +42,7 @@
       <w:r>
         <w:t xml:space="preserve">  |  </w:t>
       </w:r>
-      <w:hyperlink w:history="1" r:id="rIdxgu7kt3jbc7z_xbgidt9t">
+      <w:hyperlink w:history="1" r:id="rIdpt7fe-fjwzdb9ulp1gpud">
         <w:r>
           <w:t xml:space="preserve">linkedin.com/in/jeruebe</w:t>
         </w:r>
@@ -53,7 +53,7 @@
         <w:spacing w:after="60"/>
         <w:jc w:val="center"/>
       </w:pPr>
-      <w:hyperlink w:history="1" r:id="rIdvq9men0-_gb9x0la9rml_">
+      <w:hyperlink w:history="1" r:id="rIdfrnxachtiha0y_aaqfw0x">
         <w:r>
           <w:t xml:space="preserve">altjerue.github.io</w:t>
         </w:r>
@@ -61,7 +61,7 @@
       <w:r>
         <w:t xml:space="preserve">  |  </w:t>
       </w:r>
-      <w:hyperlink w:history="1" r:id="rIdgpemroqyluqfdrc4xpkba">
+      <w:hyperlink w:history="1" r:id="rIdl8ojp3qniuu0pp8ufrt1j">
         <w:r>
           <w:t xml:space="preserve">github.com/altjerue</w:t>
         </w:r>
@@ -69,7 +69,7 @@
       <w:r>
         <w:t xml:space="preserve">  |  </w:t>
       </w:r>
-      <w:hyperlink w:history="1" r:id="rIdisyllx7p5omet5tpct8ib">
+      <w:hyperlink w:history="1" r:id="rIdb4tqmrovkfzhcbvkukqqt">
         <w:r>
           <w:t xml:space="preserve">orcid.org/0000-0003-1988-1912</w:t>
         </w:r>
@@ -77,7 +77,7 @@
       <w:r>
         <w:t xml:space="preserve">  |  </w:t>
       </w:r>
-      <w:hyperlink w:history="1" r:id="rIdbwgx4b31esvyk3n0jm1ww">
+      <w:hyperlink w:history="1" r:id="rIdz1yjnrcrhydwdxd2hq_ct">
         <w:r>
           <w:t xml:space="preserve">Google Scholar</w:t>
         </w:r>
@@ -93,8 +93,240 @@
     </w:p>
     <w:p>
       <w:r>
-        <w:t xml:space="preserve">Computational physicist with a PhD in Physics and 10+ years developing high-performance numerical algorithms and simulation software for relativistic plasmas. Author of the open-source Paramo library for kinetic particle evolution and radiative transfer. Experience with MHD codes on leadership-class HPC systems and with machine learning for calibrating physical models. Peer-reviewed publications, competitive grants, and collaboration across interdisciplinary teams.</w:t>
-      </w:r>
+        <w:t xml:space="preserve">Physicist with a Ph.D. in Physics and over ten years of research experience in computational astrophysics, numerical methods, and high-performance computing. One term of classroom instruction at the graduate level and multi-year experience mentoring graduate researchers through the transition from confusion to independent work. Teaching approach built on intuition and critical thinking over memorization, and on collaborative problem-solving.</w:t>
+      </w:r>
+    </w:p>
+    <w:p>
+      <w:pPr>
+        <w:pStyle w:val="Heading1"/>
+      </w:pPr>
+      <w:r>
+        <w:t xml:space="preserve">Teaching and Mentoring</w:t>
+      </w:r>
+    </w:p>
+    <w:p>
+      <w:pPr>
+        <w:keepNext/>
+        <w:tabs>
+          <w:tab w:val="right" w:pos="10512"/>
+        </w:tabs>
+        <w:spacing w:after="0"/>
+      </w:pPr>
+      <w:r>
+        <w:rPr>
+          <w:b/>
+          <w:bCs/>
+        </w:rPr>
+        <w:t xml:space="preserve">Thermodynamics (graduate level)</w:t>
+      </w:r>
+      <w:r>
+        <w:tab/>
+      </w:r>
+      <w:r>
+        <w:t xml:space="preserve">Jun 2018</w:t>
+      </w:r>
+    </w:p>
+    <w:p>
+      <w:pPr>
+        <w:keepNext/>
+        <w:tabs>
+          <w:tab w:val="right" w:pos="10512"/>
+        </w:tabs>
+        <w:spacing w:after="0"/>
+      </w:pPr>
+      <w:r>
+        <w:rPr>
+          <w:i/>
+          <w:iCs/>
+        </w:rPr>
+        <w:t xml:space="preserve">Instituto de Física y Matemáticas, Universidad Michoacana de San Nicolás de Hidalgo</w:t>
+      </w:r>
+      <w:r>
+        <w:tab/>
+      </w:r>
+      <w:r>
+        <w:t xml:space="preserve">Substitute Instructor</w:t>
+      </w:r>
+    </w:p>
+    <w:p>
+      <w:pPr>
+        <w:pStyle w:val="EntryGap"/>
+        <w:spacing w:after="0"/>
+      </w:pPr>
+    </w:p>
+    <w:p>
+      <w:pPr>
+        <w:keepNext/>
+        <w:tabs>
+          <w:tab w:val="right" w:pos="10512"/>
+        </w:tabs>
+        <w:spacing w:after="0"/>
+      </w:pPr>
+      <w:r>
+        <w:rPr>
+          <w:b/>
+          <w:bCs/>
+        </w:rPr>
+        <w:t xml:space="preserve">Zachary Davis, graduate student</w:t>
+      </w:r>
+      <w:r>
+        <w:tab/>
+      </w:r>
+      <w:r>
+        <w:t xml:space="preserve">2018 – 2022</w:t>
+      </w:r>
+    </w:p>
+    <w:p>
+      <w:pPr>
+        <w:keepNext/>
+        <w:tabs>
+          <w:tab w:val="right" w:pos="10512"/>
+        </w:tabs>
+        <w:spacing w:after="0"/>
+      </w:pPr>
+      <w:r>
+        <w:rPr>
+          <w:i/>
+          <w:iCs/>
+        </w:rPr>
+        <w:t xml:space="preserve">Department of Physics and Astronomy, Purdue University</w:t>
+      </w:r>
+      <w:r>
+        <w:tab/>
+      </w:r>
+      <w:r>
+        <w:t xml:space="preserve">Mentoring</w:t>
+      </w:r>
+    </w:p>
+    <w:p>
+      <w:pPr>
+        <w:spacing w:after="0"/>
+      </w:pPr>
+      <w:r>
+        <w:t xml:space="preserve">Co-authored papers [8, 9]</w:t>
+      </w:r>
+    </w:p>
+    <w:p>
+      <w:pPr>
+        <w:pStyle w:val="EntryGap"/>
+        <w:spacing w:after="0"/>
+      </w:pPr>
+    </w:p>
+    <w:p>
+      <w:pPr>
+        <w:keepNext/>
+        <w:tabs>
+          <w:tab w:val="right" w:pos="10512"/>
+        </w:tabs>
+        <w:spacing w:after="0"/>
+      </w:pPr>
+      <w:r>
+        <w:rPr>
+          <w:b/>
+          <w:bCs/>
+        </w:rPr>
+        <w:t xml:space="preserve">Amanda O. Harrison, graduate student</w:t>
+      </w:r>
+      <w:r>
+        <w:tab/>
+      </w:r>
+      <w:r>
+        <w:t xml:space="preserve">2018 – 2020</w:t>
+      </w:r>
+    </w:p>
+    <w:p>
+      <w:pPr>
+        <w:keepNext/>
+        <w:tabs>
+          <w:tab w:val="right" w:pos="10512"/>
+        </w:tabs>
+        <w:spacing w:after="0"/>
+      </w:pPr>
+      <w:r>
+        <w:rPr>
+          <w:i/>
+          <w:iCs/>
+        </w:rPr>
+        <w:t xml:space="preserve">Department of Physics and Astronomy, Purdue University</w:t>
+      </w:r>
+      <w:r>
+        <w:tab/>
+      </w:r>
+      <w:r>
+        <w:t xml:space="preserve">Mentoring</w:t>
+      </w:r>
+    </w:p>
+    <w:p>
+      <w:pPr>
+        <w:spacing w:after="0"/>
+      </w:pPr>
+      <w:r>
+        <w:t xml:space="preserve">Co-authored paper [5]</w:t>
+      </w:r>
+    </w:p>
+    <w:p>
+      <w:pPr>
+        <w:pStyle w:val="EntryGap"/>
+        <w:spacing w:after="0"/>
+      </w:pPr>
+    </w:p>
+    <w:p>
+      <w:pPr>
+        <w:keepNext/>
+        <w:tabs>
+          <w:tab w:val="right" w:pos="10512"/>
+        </w:tabs>
+        <w:spacing w:after="0"/>
+      </w:pPr>
+      <w:r>
+        <w:rPr>
+          <w:b/>
+          <w:bCs/>
+        </w:rPr>
+        <w:t xml:space="preserve">Hao Zhang, graduate student</w:t>
+      </w:r>
+      <w:r>
+        <w:tab/>
+      </w:r>
+      <w:r>
+        <w:t xml:space="preserve">2018 – 2019</w:t>
+      </w:r>
+    </w:p>
+    <w:p>
+      <w:pPr>
+        <w:keepNext/>
+        <w:tabs>
+          <w:tab w:val="right" w:pos="10512"/>
+        </w:tabs>
+        <w:spacing w:after="0"/>
+      </w:pPr>
+      <w:r>
+        <w:rPr>
+          <w:i/>
+          <w:iCs/>
+        </w:rPr>
+        <w:t xml:space="preserve">Department of Physics and Astronomy, Purdue University</w:t>
+      </w:r>
+      <w:r>
+        <w:tab/>
+      </w:r>
+      <w:r>
+        <w:t xml:space="preserve">Mentoring</w:t>
+      </w:r>
+    </w:p>
+    <w:p>
+      <w:pPr>
+        <w:spacing w:after="0"/>
+      </w:pPr>
+      <w:r>
+        <w:t xml:space="preserve">Co-authored paper [4]</w:t>
+      </w:r>
+    </w:p>
+    <w:p>
+      <w:pPr>
+        <w:pStyle w:val="EntryGap"/>
+        <w:spacing w:after="0"/>
+      </w:pPr>
     </w:p>
     <w:p>
       <w:pPr>
@@ -1167,7 +1399,7 @@
       <w:r>
         <w:t xml:space="preserve">Thesis: </w:t>
       </w:r>
-      <w:hyperlink w:history="1" r:id="rIdjf3kmiesiqnl3nbage7cd">
+      <w:hyperlink w:history="1" r:id="rIdxyda-p4ntrvexrwhszwil">
         <w:r>
           <w:t xml:space="preserve">Numerical treatment of radiation processes in the internal shocks of magnetized relativistic outflows</w:t>
         </w:r>
@@ -1464,7 +1696,7 @@
       <w:r>
         <w:t xml:space="preserve">, </w:t>
       </w:r>
-      <w:hyperlink w:history="1" r:id="rId2oy3hulrup1ztsvoqij6r">
+      <w:hyperlink w:history="1" r:id="rIdnoohlaxp3efvoakjko09h">
         <w:r>
           <w:t xml:space="preserve">ApJ 976, 182 (2024)</w:t>
         </w:r>
@@ -1472,7 +1704,7 @@
       <w:r>
         <w:t xml:space="preserve">, </w:t>
       </w:r>
-      <w:hyperlink w:history="1" r:id="rIdtj0-i790fffyjay4umkq6">
+      <w:hyperlink w:history="1" r:id="rIdshi2ltlg605iuybhkvqek">
         <w:r>
           <w:t xml:space="preserve">arXiv:2405.17581</w:t>
         </w:r>
@@ -1509,7 +1741,7 @@
       <w:r>
         <w:t xml:space="preserve">, </w:t>
       </w:r>
-      <w:hyperlink w:history="1" r:id="rIdsbnfd27urrspufxxdzgw1">
+      <w:hyperlink w:history="1" r:id="rIdex5brhans8batu3-9xutj">
         <w:r>
           <w:t xml:space="preserve">MNRAS 513, 5766–5779 (2022)</w:t>
         </w:r>
@@ -1517,7 +1749,7 @@
       <w:r>
         <w:t xml:space="preserve">, </w:t>
       </w:r>
-      <w:hyperlink w:history="1" r:id="rIdt_zin-vn_vdcdhnvwwhtn">
+      <w:hyperlink w:history="1" r:id="rIdcsnwuwye2_ej7k-aerdm5">
         <w:r>
           <w:t xml:space="preserve">arXiv:2201.07790</w:t>
         </w:r>
@@ -1554,7 +1786,7 @@
       <w:r>
         <w:t xml:space="preserve">, </w:t>
       </w:r>
-      <w:hyperlink w:history="1" r:id="rIdif1b94ge8mzpskuylhq3u">
+      <w:hyperlink w:history="1" r:id="rIdok6jqb9hpvpcteftkcuiz">
         <w:r>
           <w:t xml:space="preserve">Phys. Rev. D 106, 083015 (2022)</w:t>
         </w:r>
@@ -1562,7 +1794,7 @@
       <w:r>
         <w:t xml:space="preserve">, </w:t>
       </w:r>
-      <w:hyperlink w:history="1" r:id="rIdclv3gcqe5r8kllofg7szj">
+      <w:hyperlink w:history="1" r:id="rIdsdl7-cubaglcizr-ozpz7">
         <w:r>
           <w:t xml:space="preserve">arXiv:2112.09817</w:t>
         </w:r>
@@ -1599,7 +1831,7 @@
       <w:r>
         <w:t xml:space="preserve">, </w:t>
       </w:r>
-      <w:hyperlink w:history="1" r:id="rIdi1ssksqtyq1nzagddlacz">
+      <w:hyperlink w:history="1" r:id="rIdhcpdqaffkuvo4dey-havy">
         <w:r>
           <w:t xml:space="preserve">ApJ 919, 95 (2021)</w:t>
         </w:r>
@@ -1607,7 +1839,7 @@
       <w:r>
         <w:t xml:space="preserve">, </w:t>
       </w:r>
-      <w:hyperlink w:history="1" r:id="rIdnqgselzpcikaop2bah3at">
+      <w:hyperlink w:history="1" r:id="rIdhwcxdt-rnrfhsggc7qwsh">
         <w:r>
           <w:t xml:space="preserve">arXiv:2106.05356</w:t>
         </w:r>
@@ -1644,7 +1876,7 @@
       <w:r>
         <w:t xml:space="preserve">, </w:t>
       </w:r>
-      <w:hyperlink w:history="1" r:id="rIdhqh4lfc_i6dwddij7ssrn">
+      <w:hyperlink w:history="1" r:id="rIdtql0lgcioro2dyahkggwr">
         <w:r>
           <w:t xml:space="preserve">MNRAS 501, 4092–4102 (2021)</w:t>
         </w:r>
@@ -1652,7 +1884,7 @@
       <w:r>
         <w:t xml:space="preserve">, </w:t>
       </w:r>
-      <w:hyperlink w:history="1" r:id="rId0qw5kpyvijetm1ooppnl7">
+      <w:hyperlink w:history="1" r:id="rIdmdlbs053hl3go7mfico90">
         <w:r>
           <w:t xml:space="preserve">arXiv:2009.02273</w:t>
         </w:r>
@@ -1689,7 +1921,7 @@
       <w:r>
         <w:t xml:space="preserve">, </w:t>
       </w:r>
-      <w:hyperlink w:history="1" r:id="rIdx3qxgexdpbruiv2ybob6a">
+      <w:hyperlink w:history="1" r:id="rIdg7x9_fhylu4o6aik6hns-">
         <w:r>
           <w:t xml:space="preserve">MNRAS 496, 974–986 (2020)</w:t>
         </w:r>
@@ -1697,7 +1929,7 @@
       <w:r>
         <w:t xml:space="preserve">, </w:t>
       </w:r>
-      <w:hyperlink w:history="1" r:id="rIdo0uaxbra9n5pfkjs4mp55">
+      <w:hyperlink w:history="1" r:id="rId24kxiheb07b8yesiiw1s7">
         <w:r>
           <w:t xml:space="preserve">arXiv:1910.14049</w:t>
         </w:r>
@@ -1734,7 +1966,7 @@
       <w:r>
         <w:t xml:space="preserve">, </w:t>
       </w:r>
-      <w:hyperlink w:history="1" r:id="rIdpk0ujhktckb92h4hgzy3o">
+      <w:hyperlink w:history="1" r:id="rIdkmokvokoys2rw8zpjvh_a">
         <w:r>
           <w:t xml:space="preserve">MNRAS 468, 1169–1182 (2017)</w:t>
         </w:r>
@@ -1742,7 +1974,7 @@
       <w:r>
         <w:t xml:space="preserve">, </w:t>
       </w:r>
-      <w:hyperlink w:history="1" r:id="rIda-b114zi6ghk3msp7aq5a">
+      <w:hyperlink w:history="1" r:id="rIdxvggtwojqgk_tiovwgpzu">
         <w:r>
           <w:t xml:space="preserve">arXiv:1612.06383</w:t>
         </w:r>
@@ -1779,7 +2011,7 @@
       <w:r>
         <w:t xml:space="preserve">, </w:t>
       </w:r>
-      <w:hyperlink w:history="1" r:id="rId3fc7webnxra1zwkkt9vw1">
+      <w:hyperlink w:history="1" r:id="rIdndafbgv8c6aamk5bvhirs">
         <w:r>
           <w:t xml:space="preserve">MNRAS 438, 1856–1869 (2014)</w:t>
         </w:r>
@@ -1787,7 +2019,7 @@
       <w:r>
         <w:t xml:space="preserve">, </w:t>
       </w:r>
-      <w:hyperlink w:history="1" r:id="rIdakvku_mrjycynqh_gqkid">
+      <w:hyperlink w:history="1" r:id="rId5rc6kzz-xmk9-jeprdfmv">
         <w:r>
           <w:t xml:space="preserve">arXiv:1310.5441</w:t>
         </w:r>
@@ -1824,7 +2056,7 @@
       <w:r>
         <w:t xml:space="preserve">, </w:t>
       </w:r>
-      <w:hyperlink w:history="1" r:id="rIdt1uq6mo5d9bji1mpmggqw">
+      <w:hyperlink w:history="1" r:id="rIdrdchucmxota1fdcuutazu">
         <w:r>
           <w:t xml:space="preserve">Phys. Rev. D 80, 084023 (2009)</w:t>
         </w:r>
@@ -1832,7 +2064,7 @@
       <w:r>
         <w:t xml:space="preserve">, </w:t>
       </w:r>
-      <w:hyperlink w:history="1" r:id="rIdh3kbvwnhrmakkefjum_mi">
+      <w:hyperlink w:history="1" r:id="rIdy5zdostbiaw7a3jy-lpw8">
         <w:r>
           <w:t xml:space="preserve">arXiv:1009.1250</w:t>
         </w:r>
@@ -1877,7 +2109,7 @@
       <w:r>
         <w:t xml:space="preserve">, </w:t>
       </w:r>
-      <w:hyperlink w:history="1" r:id="rIdhnqwizn50__e9xp92b-u9">
+      <w:hyperlink w:history="1" r:id="rIdsk9zbhlh6cndie-ujhu4a">
         <w:r>
           <w:t xml:space="preserve">Astron. Nachr. 342, 277–282 (2021)</w:t>
         </w:r>
@@ -1885,7 +2117,7 @@
       <w:r>
         <w:t xml:space="preserve">, 9th International Workshop on Astronomy and Relativistic Astrophysics, </w:t>
       </w:r>
-      <w:hyperlink w:history="1" r:id="rIdx26a6kz_gnjgx40mns2k9">
+      <w:hyperlink w:history="1" r:id="rIdbownq-mkgxhk2d8b1vib0">
         <w:r>
           <w:t xml:space="preserve">arXiv:2011.13797</w:t>
         </w:r>
@@ -1922,7 +2154,7 @@
       <w:r>
         <w:t xml:space="preserve">, </w:t>
       </w:r>
-      <w:hyperlink w:history="1" r:id="rIda2lphcb9rorkbquo0hne9">
+      <w:hyperlink w:history="1" r:id="rIdluzmj3g7rkmmyiievdynx">
         <w:r>
           <w:t xml:space="preserve">Astron. Nachr. 342, 147–152 (2021)</w:t>
         </w:r>
@@ -1930,7 +2162,7 @@
       <w:r>
         <w:t xml:space="preserve">, 9th International Workshop on Astronomy and Relativistic Astrophysics, </w:t>
       </w:r>
-      <w:hyperlink w:history="1" r:id="rId9bs6ktr8xutqkapmxxet0">
+      <w:hyperlink w:history="1" r:id="rIdgwysqmarx92x93gbe99od">
         <w:r>
           <w:t xml:space="preserve">arXiv:2011.13805</w:t>
         </w:r>
@@ -1967,7 +2199,7 @@
       <w:r>
         <w:t xml:space="preserve">, </w:t>
       </w:r>
-      <w:hyperlink w:history="1" r:id="rId3cvb5z5hjvficxj9sddes">
+      <w:hyperlink w:history="1" r:id="rIdylnzl0y1coq4u5ybsbejb">
         <w:r>
           <w:t xml:space="preserve">PoS(SWIFT 10) 233, 159 (2014)</w:t>
         </w:r>
@@ -1975,7 +2207,7 @@
       <w:r>
         <w:t xml:space="preserve">, </w:t>
       </w:r>
-      <w:hyperlink w:history="1" r:id="rIdoukprhhkptmsa_ejbdkwa">
+      <w:hyperlink w:history="1" r:id="rId1bs93vf9mxt7l9sauqe8a">
         <w:r>
           <w:t xml:space="preserve">arXiv:1502.07882</w:t>
         </w:r>
@@ -2012,7 +2244,7 @@
       <w:r>
         <w:t xml:space="preserve">, </w:t>
       </w:r>
-      <w:hyperlink w:history="1" r:id="rIdjla_7psf7sd_9w9bhexfp">
+      <w:hyperlink w:history="1" r:id="rIdi75d6pcouzbt_kkgvrhvl">
         <w:r>
           <w:t xml:space="preserve">EPJ Web Conf. 61, 02007 (2013)</w:t>
         </w:r>
@@ -2020,7 +2252,7 @@
       <w:r>
         <w:t xml:space="preserve">, </w:t>
       </w:r>
-      <w:hyperlink w:history="1" r:id="rIdfl4wfpi5kcqcbku4mfzib">
+      <w:hyperlink w:history="1" r:id="rIdertwererajmwm6d_zxp47">
         <w:r>
           <w:t xml:space="preserve">arXiv:1309.4612</w:t>
         </w:r>
@@ -2057,7 +2289,7 @@
       <w:r>
         <w:t xml:space="preserve">, </w:t>
       </w:r>
-      <w:hyperlink w:history="1" r:id="rId9yqqelbjbyiwivphujrmh">
+      <w:hyperlink w:history="1" r:id="rIdxjncqcgo78hi5dwgm2x3-">
         <w:r>
           <w:t xml:space="preserve">J. Phys.: Conf. Ser. 454, 012001 (2013)</w:t>
         </w:r>
@@ -2065,7 +2297,7 @@
       <w:r>
         <w:t xml:space="preserve">, </w:t>
       </w:r>
-      <w:hyperlink w:history="1" r:id="rIdcxhugmrouqjjcifqoyyd4">
+      <w:hyperlink w:history="1" r:id="rIdsghqkmoqhmatu6pp8bxbd">
         <w:r>
           <w:t xml:space="preserve">arXiv:1211.1794</w:t>
         </w:r>
@@ -2468,7 +2700,7 @@
       <w:r>
         <w:tab/>
       </w:r>
-      <w:hyperlink w:history="1" r:id="rIdc3anddb-cyo9jrc277lbj">
+      <w:hyperlink w:history="1" r:id="rIddl19rcaiyjlfxfpq2eicq">
         <w:r>
           <w:t xml:space="preserve">github.com/altjerue/ilwikak-ml</w:t>
         </w:r>
@@ -2559,7 +2791,7 @@
       <w:r>
         <w:tab/>
       </w:r>
-      <w:hyperlink w:history="1" r:id="rIdhzlvlcukqu6s1-ye4wunt">
+      <w:hyperlink w:history="1" r:id="rId29z3bthbowpbb5ecnn7ol">
         <w:r>
           <w:t xml:space="preserve">github.com/UW-ForestMycobiomeLab/WindSporesHills</w:t>
         </w:r>
@@ -2624,7 +2856,7 @@
       <w:r>
         <w:tab/>
       </w:r>
-      <w:hyperlink w:history="1" r:id="rIdu5vguta98bcd7dd_9zs8v">
+      <w:hyperlink w:history="1" r:id="rIdf4zraw9kxyrfvjrqwklov">
         <w:r>
           <w:t xml:space="preserve">github.com/zkdavis/Tleco</w:t>
         </w:r>
@@ -2689,7 +2921,7 @@
       <w:r>
         <w:tab/>
       </w:r>
-      <w:hyperlink w:history="1" r:id="rId_0zkaj2mnbtkpd6eupxrk">
+      <w:hyperlink w:history="1" r:id="rIddbjltih76ptf_xfvfqh0s">
         <w:r>
           <w:t xml:space="preserve">github.com/altjerue/paramo</w:t>
         </w:r>
@@ -3300,7 +3532,7 @@
       <w:r>
         <w:t xml:space="preserve">Video: </w:t>
       </w:r>
-      <w:hyperlink w:history="1" r:id="rIdjtjamlzldutd5zbftm9a8">
+      <w:hyperlink w:history="1" r:id="rIdayg5b8k3idihefqz7pemc">
         <w:r>
           <w:t xml:space="preserve">youtube.com/watch?v=BAZNWLNT69M</w:t>
         </w:r>
@@ -3471,7 +3703,7 @@
       <w:r>
         <w:t xml:space="preserve">Marcos Moshinsky Award for Best Poster. Video: </w:t>
       </w:r>
-      <w:hyperlink w:history="1" r:id="rIdsvrqdhuguvxhnacz7efww">
+      <w:hyperlink w:history="1" r:id="rIddwvlw1frsb34dhhypexwf">
         <w:r>
           <w:t xml:space="preserve">youtube.com/watch?v=0TJiKg7kOPI</w:t>
         </w:r>
@@ -3588,225 +3820,551 @@
         <w:pStyle w:val="Heading1"/>
       </w:pPr>
       <w:r>
-        <w:t xml:space="preserve">Teaching and Mentoring</w:t>
-      </w:r>
-    </w:p>
-    <w:p>
-      <w:pPr>
-        <w:keepNext/>
-        <w:tabs>
-          <w:tab w:val="right" w:pos="10512"/>
-        </w:tabs>
-        <w:spacing w:after="0"/>
-      </w:pPr>
-      <w:r>
-        <w:rPr>
-          <w:b/>
-          <w:bCs/>
-        </w:rPr>
-        <w:t xml:space="preserve">Zachary Davis, graduate student</w:t>
-      </w:r>
-      <w:r>
-        <w:tab/>
-      </w:r>
-      <w:r>
-        <w:t xml:space="preserve">2018 – 2022</w:t>
-      </w:r>
-    </w:p>
-    <w:p>
-      <w:pPr>
-        <w:keepNext/>
-        <w:tabs>
-          <w:tab w:val="right" w:pos="10512"/>
-        </w:tabs>
-        <w:spacing w:after="0"/>
-      </w:pPr>
-      <w:r>
-        <w:rPr>
-          <w:i/>
-          <w:iCs/>
-        </w:rPr>
-        <w:t xml:space="preserve">Department of Physics and Astronomy, Purdue University</w:t>
-      </w:r>
-      <w:r>
-        <w:tab/>
-      </w:r>
-      <w:r>
-        <w:t xml:space="preserve">Mentoring</w:t>
-      </w:r>
-    </w:p>
-    <w:p>
-      <w:pPr>
-        <w:spacing w:after="0"/>
-      </w:pPr>
-      <w:r>
-        <w:t xml:space="preserve">Co-authored papers [8, 9]</w:t>
-      </w:r>
-    </w:p>
-    <w:p>
-      <w:pPr>
-        <w:pStyle w:val="EntryGap"/>
-        <w:spacing w:after="0"/>
-      </w:pPr>
-    </w:p>
-    <w:p>
-      <w:pPr>
-        <w:keepNext/>
-        <w:tabs>
-          <w:tab w:val="right" w:pos="10512"/>
-        </w:tabs>
-        <w:spacing w:after="0"/>
-      </w:pPr>
-      <w:r>
-        <w:rPr>
-          <w:b/>
-          <w:bCs/>
-        </w:rPr>
-        <w:t xml:space="preserve">Amanda O. Harrison, graduate student</w:t>
-      </w:r>
-      <w:r>
-        <w:tab/>
-      </w:r>
-      <w:r>
-        <w:t xml:space="preserve">2018 – 2020</w:t>
-      </w:r>
-    </w:p>
-    <w:p>
-      <w:pPr>
-        <w:keepNext/>
-        <w:tabs>
-          <w:tab w:val="right" w:pos="10512"/>
-        </w:tabs>
-        <w:spacing w:after="0"/>
-      </w:pPr>
-      <w:r>
-        <w:rPr>
-          <w:i/>
-          <w:iCs/>
-        </w:rPr>
-        <w:t xml:space="preserve">Department of Physics and Astronomy, Purdue University</w:t>
-      </w:r>
-      <w:r>
-        <w:tab/>
-      </w:r>
-      <w:r>
-        <w:t xml:space="preserve">Mentoring</w:t>
-      </w:r>
-    </w:p>
-    <w:p>
-      <w:pPr>
-        <w:spacing w:after="0"/>
-      </w:pPr>
-      <w:r>
-        <w:t xml:space="preserve">Co-authored paper [5]</w:t>
-      </w:r>
-    </w:p>
-    <w:p>
-      <w:pPr>
-        <w:pStyle w:val="EntryGap"/>
-        <w:spacing w:after="0"/>
-      </w:pPr>
-    </w:p>
-    <w:p>
-      <w:pPr>
-        <w:keepNext/>
-        <w:tabs>
-          <w:tab w:val="right" w:pos="10512"/>
-        </w:tabs>
-        <w:spacing w:after="0"/>
-      </w:pPr>
-      <w:r>
-        <w:rPr>
-          <w:b/>
-          <w:bCs/>
-        </w:rPr>
-        <w:t xml:space="preserve">Hao Zhang, graduate student</w:t>
-      </w:r>
-      <w:r>
-        <w:tab/>
-      </w:r>
-      <w:r>
-        <w:t xml:space="preserve">2018 – 2019</w:t>
-      </w:r>
-    </w:p>
-    <w:p>
-      <w:pPr>
-        <w:keepNext/>
-        <w:tabs>
-          <w:tab w:val="right" w:pos="10512"/>
-        </w:tabs>
-        <w:spacing w:after="0"/>
-      </w:pPr>
-      <w:r>
-        <w:rPr>
-          <w:i/>
-          <w:iCs/>
-        </w:rPr>
-        <w:t xml:space="preserve">Department of Physics and Astronomy, Purdue University</w:t>
-      </w:r>
-      <w:r>
-        <w:tab/>
-      </w:r>
-      <w:r>
-        <w:t xml:space="preserve">Mentoring</w:t>
-      </w:r>
-    </w:p>
-    <w:p>
-      <w:pPr>
-        <w:spacing w:after="0"/>
-      </w:pPr>
-      <w:r>
-        <w:t xml:space="preserve">Co-authored paper [4]</w:t>
-      </w:r>
-    </w:p>
-    <w:p>
-      <w:pPr>
-        <w:pStyle w:val="EntryGap"/>
-        <w:spacing w:after="0"/>
-      </w:pPr>
-    </w:p>
-    <w:p>
-      <w:pPr>
-        <w:keepNext/>
-        <w:tabs>
-          <w:tab w:val="right" w:pos="10512"/>
-        </w:tabs>
-        <w:spacing w:after="0"/>
-      </w:pPr>
-      <w:r>
-        <w:rPr>
-          <w:b/>
-          <w:bCs/>
-        </w:rPr>
-        <w:t xml:space="preserve">Thermodynamics (graduate level)</w:t>
-      </w:r>
-      <w:r>
-        <w:tab/>
-      </w:r>
-      <w:r>
-        <w:t xml:space="preserve">Jun 2018</w:t>
-      </w:r>
-    </w:p>
-    <w:p>
-      <w:pPr>
-        <w:keepNext/>
-        <w:tabs>
-          <w:tab w:val="right" w:pos="10512"/>
-        </w:tabs>
-        <w:spacing w:after="0"/>
-      </w:pPr>
-      <w:r>
-        <w:rPr>
-          <w:i/>
-          <w:iCs/>
-        </w:rPr>
-        <w:t xml:space="preserve">Instituto de Física y Matemáticas, Universidad Michoacana de San Nicolás de Hidalgo</w:t>
-      </w:r>
-      <w:r>
-        <w:tab/>
-      </w:r>
-      <w:r>
-        <w:t xml:space="preserve">Substitute Instructor</w:t>
+        <w:t xml:space="preserve">Professional Development</w:t>
+      </w:r>
+    </w:p>
+    <w:p>
+      <w:pPr>
+        <w:keepNext/>
+        <w:tabs>
+          <w:tab w:val="right" w:pos="10512"/>
+        </w:tabs>
+        <w:spacing w:after="0"/>
+      </w:pPr>
+      <w:r>
+        <w:rPr>
+          <w:b/>
+          <w:bCs/>
+        </w:rPr>
+        <w:t xml:space="preserve">High Performance Computing on Frontera</w:t>
+      </w:r>
+      <w:r>
+        <w:tab/>
+      </w:r>
+      <w:r>
+        <w:t xml:space="preserve">May – Jun 2021</w:t>
+      </w:r>
+    </w:p>
+    <w:p>
+      <w:pPr>
+        <w:keepNext/>
+        <w:tabs>
+          <w:tab w:val="right" w:pos="10512"/>
+        </w:tabs>
+        <w:spacing w:after="0"/>
+      </w:pPr>
+      <w:r>
+        <w:rPr>
+          <w:i/>
+          <w:iCs/>
+        </w:rPr>
+        <w:t xml:space="preserve">Jason Allison et al., TACC, Austin, TX</w:t>
+      </w:r>
+      <w:r>
+        <w:tab/>
+      </w:r>
+      <w:r>
+        <w:t xml:space="preserve">Lecture series</w:t>
+      </w:r>
+    </w:p>
+    <w:p>
+      <w:pPr>
+        <w:pStyle w:val="EntryGap"/>
+        <w:spacing w:after="0"/>
+      </w:pPr>
+    </w:p>
+    <w:p>
+      <w:pPr>
+        <w:keepNext/>
+        <w:tabs>
+          <w:tab w:val="right" w:pos="10512"/>
+        </w:tabs>
+        <w:spacing w:after="0"/>
+      </w:pPr>
+      <w:r>
+        <w:rPr>
+          <w:b/>
+          <w:bCs/>
+        </w:rPr>
+        <w:t xml:space="preserve">Writing Winning Grants</w:t>
+      </w:r>
+      <w:r>
+        <w:tab/>
+      </w:r>
+      <w:r>
+        <w:t xml:space="preserve">Nov 2019</w:t>
+      </w:r>
+    </w:p>
+    <w:p>
+      <w:pPr>
+        <w:keepNext/>
+        <w:tabs>
+          <w:tab w:val="right" w:pos="10512"/>
+        </w:tabs>
+        <w:spacing w:after="0"/>
+      </w:pPr>
+      <w:r>
+        <w:rPr>
+          <w:i/>
+          <w:iCs/>
+        </w:rPr>
+        <w:t xml:space="preserve">Dr. Lauren Broyles, Purdue University</w:t>
+      </w:r>
+      <w:r>
+        <w:tab/>
+      </w:r>
+      <w:r>
+        <w:t xml:space="preserve">Lecture</w:t>
+      </w:r>
+    </w:p>
+    <w:p>
+      <w:pPr>
+        <w:pStyle w:val="EntryGap"/>
+        <w:spacing w:after="0"/>
+      </w:pPr>
+    </w:p>
+    <w:p>
+      <w:pPr>
+        <w:keepNext/>
+        <w:tabs>
+          <w:tab w:val="right" w:pos="10512"/>
+        </w:tabs>
+        <w:spacing w:after="0"/>
+      </w:pPr>
+      <w:r>
+        <w:rPr>
+          <w:b/>
+          <w:bCs/>
+        </w:rPr>
+        <w:t xml:space="preserve">XSEDE HPC Workshop: Summer Boot Camp</w:t>
+      </w:r>
+      <w:r>
+        <w:tab/>
+      </w:r>
+      <w:r>
+        <w:t xml:space="preserve">Jun 2019</w:t>
+      </w:r>
+    </w:p>
+    <w:p>
+      <w:pPr>
+        <w:keepNext/>
+        <w:tabs>
+          <w:tab w:val="right" w:pos="10512"/>
+        </w:tabs>
+        <w:spacing w:after="0"/>
+      </w:pPr>
+      <w:r>
+        <w:rPr>
+          <w:i/>
+          <w:iCs/>
+        </w:rPr>
+        <w:t xml:space="preserve">John Urbanic, Purdue University</w:t>
+      </w:r>
+      <w:r>
+        <w:tab/>
+      </w:r>
+      <w:r>
+        <w:t xml:space="preserve">Workshop</w:t>
+      </w:r>
+    </w:p>
+    <w:p>
+      <w:pPr>
+        <w:pStyle w:val="EntryGap"/>
+        <w:spacing w:after="0"/>
+      </w:pPr>
+    </w:p>
+    <w:p>
+      <w:pPr>
+        <w:keepNext/>
+        <w:tabs>
+          <w:tab w:val="right" w:pos="10512"/>
+        </w:tabs>
+        <w:spacing w:after="0"/>
+      </w:pPr>
+      <w:r>
+        <w:rPr>
+          <w:b/>
+          <w:bCs/>
+        </w:rPr>
+        <w:t xml:space="preserve">Data Analysis and Machine Learning with Python</w:t>
+      </w:r>
+      <w:r>
+        <w:tab/>
+      </w:r>
+      <w:r>
+        <w:t xml:space="preserve">Feb 2017</w:t>
+      </w:r>
+    </w:p>
+    <w:p>
+      <w:pPr>
+        <w:keepNext/>
+        <w:tabs>
+          <w:tab w:val="right" w:pos="10512"/>
+        </w:tabs>
+        <w:spacing w:after="0"/>
+      </w:pPr>
+      <w:r>
+        <w:rPr>
+          <w:i/>
+          <w:iCs/>
+        </w:rPr>
+        <w:t xml:space="preserve">Dr. Alejandro Torres, Universitat de València</w:t>
+      </w:r>
+      <w:r>
+        <w:tab/>
+      </w:r>
+      <w:r>
+        <w:t xml:space="preserve">Workshop</w:t>
+      </w:r>
+    </w:p>
+    <w:p>
+      <w:pPr>
+        <w:pStyle w:val="EntryGap"/>
+        <w:spacing w:after="0"/>
+      </w:pPr>
+    </w:p>
+    <w:p>
+      <w:pPr>
+        <w:keepNext/>
+        <w:tabs>
+          <w:tab w:val="right" w:pos="10512"/>
+        </w:tabs>
+        <w:spacing w:after="0"/>
+      </w:pPr>
+      <w:r>
+        <w:rPr>
+          <w:b/>
+          <w:bCs/>
+        </w:rPr>
+        <w:t xml:space="preserve">Numerical Relativity Simulations of BBH Coalescence Using the Einstein Toolkit</w:t>
+      </w:r>
+      <w:r>
+        <w:tab/>
+      </w:r>
+      <w:r>
+        <w:t xml:space="preserve">Jul 2016</w:t>
+      </w:r>
+    </w:p>
+    <w:p>
+      <w:pPr>
+        <w:keepNext/>
+        <w:tabs>
+          <w:tab w:val="right" w:pos="10512"/>
+        </w:tabs>
+        <w:spacing w:after="0"/>
+      </w:pPr>
+      <w:r>
+        <w:rPr>
+          <w:i/>
+          <w:iCs/>
+        </w:rPr>
+        <w:t xml:space="preserve">Dr. Vassilios Mewes, Universitat de València</w:t>
+      </w:r>
+      <w:r>
+        <w:tab/>
+      </w:r>
+      <w:r>
+        <w:t xml:space="preserve">Workshop, 8 hours</w:t>
+      </w:r>
+    </w:p>
+    <w:p>
+      <w:pPr>
+        <w:pStyle w:val="EntryGap"/>
+        <w:spacing w:after="0"/>
+      </w:pPr>
+    </w:p>
+    <w:p>
+      <w:pPr>
+        <w:keepNext/>
+        <w:tabs>
+          <w:tab w:val="right" w:pos="10512"/>
+        </w:tabs>
+        <w:spacing w:after="0"/>
+      </w:pPr>
+      <w:r>
+        <w:rPr>
+          <w:b/>
+          <w:bCs/>
+        </w:rPr>
+        <w:t xml:space="preserve">The Universe in the Light of PLANCK and BICEP2</w:t>
+      </w:r>
+      <w:r>
+        <w:tab/>
+      </w:r>
+      <w:r>
+        <w:t xml:space="preserve">May 2014</w:t>
+      </w:r>
+    </w:p>
+    <w:p>
+      <w:pPr>
+        <w:keepNext/>
+        <w:tabs>
+          <w:tab w:val="right" w:pos="10512"/>
+        </w:tabs>
+        <w:spacing w:after="0"/>
+      </w:pPr>
+      <w:r>
+        <w:rPr>
+          <w:i/>
+          <w:iCs/>
+        </w:rPr>
+        <w:t xml:space="preserve">Prof. Nick Mavromatos, Universitat de València</w:t>
+      </w:r>
+      <w:r>
+        <w:tab/>
+      </w:r>
+      <w:r>
+        <w:t xml:space="preserve">Lecture series, 2 credits</w:t>
+      </w:r>
+    </w:p>
+    <w:p>
+      <w:pPr>
+        <w:pStyle w:val="EntryGap"/>
+        <w:spacing w:after="0"/>
+      </w:pPr>
+    </w:p>
+    <w:p>
+      <w:pPr>
+        <w:keepNext/>
+        <w:tabs>
+          <w:tab w:val="right" w:pos="10512"/>
+        </w:tabs>
+        <w:spacing w:after="0"/>
+      </w:pPr>
+      <w:r>
+        <w:rPr>
+          <w:b/>
+          <w:bCs/>
+        </w:rPr>
+        <w:t xml:space="preserve">Dark Matter</w:t>
+      </w:r>
+      <w:r>
+        <w:tab/>
+      </w:r>
+      <w:r>
+        <w:t xml:space="preserve">Sep 2013</w:t>
+      </w:r>
+    </w:p>
+    <w:p>
+      <w:pPr>
+        <w:keepNext/>
+        <w:tabs>
+          <w:tab w:val="right" w:pos="10512"/>
+        </w:tabs>
+        <w:spacing w:after="0"/>
+      </w:pPr>
+      <w:r>
+        <w:rPr>
+          <w:i/>
+          <w:iCs/>
+        </w:rPr>
+        <w:t xml:space="preserve">Prof. Alejandro Ibarra, Universitat de València</w:t>
+      </w:r>
+      <w:r>
+        <w:tab/>
+      </w:r>
+      <w:r>
+        <w:t xml:space="preserve">Lecture series, 2 credits</w:t>
+      </w:r>
+    </w:p>
+    <w:p>
+      <w:pPr>
+        <w:pStyle w:val="EntryGap"/>
+        <w:spacing w:after="0"/>
+      </w:pPr>
+    </w:p>
+    <w:p>
+      <w:pPr>
+        <w:keepNext/>
+        <w:tabs>
+          <w:tab w:val="right" w:pos="10512"/>
+        </w:tabs>
+        <w:spacing w:after="0"/>
+      </w:pPr>
+      <w:r>
+        <w:rPr>
+          <w:b/>
+          <w:bCs/>
+        </w:rPr>
+        <w:t xml:space="preserve">International Cargèse School on Cosmic Accelerators</w:t>
+      </w:r>
+      <w:r>
+        <w:tab/>
+      </w:r>
+      <w:r>
+        <w:t xml:space="preserve">Apr – May 2013</w:t>
+      </w:r>
+    </w:p>
+    <w:p>
+      <w:pPr>
+        <w:keepNext/>
+        <w:tabs>
+          <w:tab w:val="right" w:pos="10512"/>
+        </w:tabs>
+        <w:spacing w:after="0"/>
+      </w:pPr>
+      <w:r>
+        <w:rPr>
+          <w:i/>
+          <w:iCs/>
+        </w:rPr>
+        <w:t xml:space="preserve">Institut d'Études Scientifiques de Cargèse, France</w:t>
+      </w:r>
+      <w:r>
+        <w:tab/>
+      </w:r>
+      <w:r>
+        <w:t xml:space="preserve">Summer school</w:t>
+      </w:r>
+    </w:p>
+    <w:p>
+      <w:pPr>
+        <w:pStyle w:val="EntryGap"/>
+        <w:spacing w:after="0"/>
+      </w:pPr>
+    </w:p>
+    <w:p>
+      <w:pPr>
+        <w:keepNext/>
+        <w:tabs>
+          <w:tab w:val="right" w:pos="10512"/>
+        </w:tabs>
+        <w:spacing w:after="0"/>
+      </w:pPr>
+      <w:r>
+        <w:rPr>
+          <w:b/>
+          <w:bCs/>
+        </w:rPr>
+        <w:t xml:space="preserve">Introduction to C++ Programming</w:t>
+      </w:r>
+      <w:r>
+        <w:tab/>
+      </w:r>
+      <w:r>
+        <w:t xml:space="preserve">Apr 2012</w:t>
+      </w:r>
+    </w:p>
+    <w:p>
+      <w:pPr>
+        <w:keepNext/>
+        <w:tabs>
+          <w:tab w:val="right" w:pos="10512"/>
+        </w:tabs>
+        <w:spacing w:after="0"/>
+      </w:pPr>
+      <w:r>
+        <w:rPr>
+          <w:i/>
+          <w:iCs/>
+        </w:rPr>
+        <w:t xml:space="preserve">Dr. Jacek Generowicz, Universitat de València</w:t>
+      </w:r>
+      <w:r>
+        <w:tab/>
+      </w:r>
+      <w:r>
+        <w:t xml:space="preserve">Workshop, 6 credits</w:t>
+      </w:r>
+    </w:p>
+    <w:p>
+      <w:pPr>
+        <w:pStyle w:val="EntryGap"/>
+        <w:spacing w:after="0"/>
+      </w:pPr>
+    </w:p>
+    <w:p>
+      <w:pPr>
+        <w:keepNext/>
+        <w:tabs>
+          <w:tab w:val="right" w:pos="10512"/>
+        </w:tabs>
+        <w:spacing w:after="0"/>
+      </w:pPr>
+      <w:r>
+        <w:rPr>
+          <w:b/>
+          <w:bCs/>
+        </w:rPr>
+        <w:t xml:space="preserve">Numerical Relativistic Astrophysics</w:t>
+      </w:r>
+      <w:r>
+        <w:tab/>
+      </w:r>
+      <w:r>
+        <w:t xml:space="preserve">Mar – Apr 2012</w:t>
+      </w:r>
+    </w:p>
+    <w:p>
+      <w:pPr>
+        <w:keepNext/>
+        <w:tabs>
+          <w:tab w:val="right" w:pos="10512"/>
+        </w:tabs>
+        <w:spacing w:after="0"/>
+      </w:pPr>
+      <w:r>
+        <w:rPr>
+          <w:i/>
+          <w:iCs/>
+        </w:rPr>
+        <w:t xml:space="preserve">Prof. Luciano Rezzolla, Universitat de València</w:t>
+      </w:r>
+      <w:r>
+        <w:tab/>
+      </w:r>
+      <w:r>
+        <w:t xml:space="preserve">Lecture series, 9 hours</w:t>
+      </w:r>
+    </w:p>
+    <w:p>
+      <w:pPr>
+        <w:pStyle w:val="EntryGap"/>
+        <w:spacing w:after="0"/>
+      </w:pPr>
+    </w:p>
+    <w:p>
+      <w:pPr>
+        <w:keepNext/>
+        <w:tabs>
+          <w:tab w:val="right" w:pos="10512"/>
+        </w:tabs>
+        <w:spacing w:after="0"/>
+      </w:pPr>
+      <w:r>
+        <w:rPr>
+          <w:b/>
+          <w:bCs/>
+        </w:rPr>
+        <w:t xml:space="preserve">Fortran for Scientific Computing</w:t>
+      </w:r>
+      <w:r>
+        <w:tab/>
+      </w:r>
+      <w:r>
+        <w:t xml:space="preserve">Mar 2012</w:t>
+      </w:r>
+    </w:p>
+    <w:p>
+      <w:pPr>
+        <w:keepNext/>
+        <w:tabs>
+          <w:tab w:val="right" w:pos="10512"/>
+        </w:tabs>
+        <w:spacing w:after="0"/>
+      </w:pPr>
+      <w:r>
+        <w:rPr>
+          <w:i/>
+          <w:iCs/>
+        </w:rPr>
+        <w:t xml:space="preserve">HLRS, University of Stuttgart, Germany</w:t>
+      </w:r>
+      <w:r>
+        <w:tab/>
+      </w:r>
+      <w:r>
+        <w:t xml:space="preserve">Workshop, 33 hours</w:t>
       </w:r>
     </w:p>
     <w:p>
@@ -3820,564 +4378,6 @@
         <w:pStyle w:val="Heading1"/>
       </w:pPr>
       <w:r>
-        <w:t xml:space="preserve">Professional Development</w:t>
-      </w:r>
-    </w:p>
-    <w:p>
-      <w:pPr>
-        <w:keepNext/>
-        <w:tabs>
-          <w:tab w:val="right" w:pos="10512"/>
-        </w:tabs>
-        <w:spacing w:after="0"/>
-      </w:pPr>
-      <w:r>
-        <w:rPr>
-          <w:b/>
-          <w:bCs/>
-        </w:rPr>
-        <w:t xml:space="preserve">High Performance Computing on Frontera</w:t>
-      </w:r>
-      <w:r>
-        <w:tab/>
-      </w:r>
-      <w:r>
-        <w:t xml:space="preserve">May – Jun 2021</w:t>
-      </w:r>
-    </w:p>
-    <w:p>
-      <w:pPr>
-        <w:keepNext/>
-        <w:tabs>
-          <w:tab w:val="right" w:pos="10512"/>
-        </w:tabs>
-        <w:spacing w:after="0"/>
-      </w:pPr>
-      <w:r>
-        <w:rPr>
-          <w:i/>
-          <w:iCs/>
-        </w:rPr>
-        <w:t xml:space="preserve">Jason Allison et al., TACC, Austin, TX</w:t>
-      </w:r>
-      <w:r>
-        <w:tab/>
-      </w:r>
-      <w:r>
-        <w:t xml:space="preserve">Lecture series</w:t>
-      </w:r>
-    </w:p>
-    <w:p>
-      <w:pPr>
-        <w:pStyle w:val="EntryGap"/>
-        <w:spacing w:after="0"/>
-      </w:pPr>
-    </w:p>
-    <w:p>
-      <w:pPr>
-        <w:keepNext/>
-        <w:tabs>
-          <w:tab w:val="right" w:pos="10512"/>
-        </w:tabs>
-        <w:spacing w:after="0"/>
-      </w:pPr>
-      <w:r>
-        <w:rPr>
-          <w:b/>
-          <w:bCs/>
-        </w:rPr>
-        <w:t xml:space="preserve">Writing Winning Grants</w:t>
-      </w:r>
-      <w:r>
-        <w:tab/>
-      </w:r>
-      <w:r>
-        <w:t xml:space="preserve">Nov 2019</w:t>
-      </w:r>
-    </w:p>
-    <w:p>
-      <w:pPr>
-        <w:keepNext/>
-        <w:tabs>
-          <w:tab w:val="right" w:pos="10512"/>
-        </w:tabs>
-        <w:spacing w:after="0"/>
-      </w:pPr>
-      <w:r>
-        <w:rPr>
-          <w:i/>
-          <w:iCs/>
-        </w:rPr>
-        <w:t xml:space="preserve">Dr. Lauren Broyles, Purdue University</w:t>
-      </w:r>
-      <w:r>
-        <w:tab/>
-      </w:r>
-      <w:r>
-        <w:t xml:space="preserve">Lecture</w:t>
-      </w:r>
-    </w:p>
-    <w:p>
-      <w:pPr>
-        <w:pStyle w:val="EntryGap"/>
-        <w:spacing w:after="0"/>
-      </w:pPr>
-    </w:p>
-    <w:p>
-      <w:pPr>
-        <w:keepNext/>
-        <w:tabs>
-          <w:tab w:val="right" w:pos="10512"/>
-        </w:tabs>
-        <w:spacing w:after="0"/>
-      </w:pPr>
-      <w:r>
-        <w:rPr>
-          <w:b/>
-          <w:bCs/>
-        </w:rPr>
-        <w:t xml:space="preserve">XSEDE HPC Workshop: Summer Boot Camp</w:t>
-      </w:r>
-      <w:r>
-        <w:tab/>
-      </w:r>
-      <w:r>
-        <w:t xml:space="preserve">Jun 2019</w:t>
-      </w:r>
-    </w:p>
-    <w:p>
-      <w:pPr>
-        <w:keepNext/>
-        <w:tabs>
-          <w:tab w:val="right" w:pos="10512"/>
-        </w:tabs>
-        <w:spacing w:after="0"/>
-      </w:pPr>
-      <w:r>
-        <w:rPr>
-          <w:i/>
-          <w:iCs/>
-        </w:rPr>
-        <w:t xml:space="preserve">John Urbanic, Purdue University</w:t>
-      </w:r>
-      <w:r>
-        <w:tab/>
-      </w:r>
-      <w:r>
-        <w:t xml:space="preserve">Workshop</w:t>
-      </w:r>
-    </w:p>
-    <w:p>
-      <w:pPr>
-        <w:pStyle w:val="EntryGap"/>
-        <w:spacing w:after="0"/>
-      </w:pPr>
-    </w:p>
-    <w:p>
-      <w:pPr>
-        <w:keepNext/>
-        <w:tabs>
-          <w:tab w:val="right" w:pos="10512"/>
-        </w:tabs>
-        <w:spacing w:after="0"/>
-      </w:pPr>
-      <w:r>
-        <w:rPr>
-          <w:b/>
-          <w:bCs/>
-        </w:rPr>
-        <w:t xml:space="preserve">Data Analysis and Machine Learning with Python</w:t>
-      </w:r>
-      <w:r>
-        <w:tab/>
-      </w:r>
-      <w:r>
-        <w:t xml:space="preserve">Feb 2017</w:t>
-      </w:r>
-    </w:p>
-    <w:p>
-      <w:pPr>
-        <w:keepNext/>
-        <w:tabs>
-          <w:tab w:val="right" w:pos="10512"/>
-        </w:tabs>
-        <w:spacing w:after="0"/>
-      </w:pPr>
-      <w:r>
-        <w:rPr>
-          <w:i/>
-          <w:iCs/>
-        </w:rPr>
-        <w:t xml:space="preserve">Dr. Alejandro Torres, Universitat de València</w:t>
-      </w:r>
-      <w:r>
-        <w:tab/>
-      </w:r>
-      <w:r>
-        <w:t xml:space="preserve">Workshop</w:t>
-      </w:r>
-    </w:p>
-    <w:p>
-      <w:pPr>
-        <w:pStyle w:val="EntryGap"/>
-        <w:spacing w:after="0"/>
-      </w:pPr>
-    </w:p>
-    <w:p>
-      <w:pPr>
-        <w:keepNext/>
-        <w:tabs>
-          <w:tab w:val="right" w:pos="10512"/>
-        </w:tabs>
-        <w:spacing w:after="0"/>
-      </w:pPr>
-      <w:r>
-        <w:rPr>
-          <w:b/>
-          <w:bCs/>
-        </w:rPr>
-        <w:t xml:space="preserve">Numerical Relativity Simulations of BBH Coalescence Using the Einstein Toolkit</w:t>
-      </w:r>
-      <w:r>
-        <w:tab/>
-      </w:r>
-      <w:r>
-        <w:t xml:space="preserve">Jul 2016</w:t>
-      </w:r>
-    </w:p>
-    <w:p>
-      <w:pPr>
-        <w:keepNext/>
-        <w:tabs>
-          <w:tab w:val="right" w:pos="10512"/>
-        </w:tabs>
-        <w:spacing w:after="0"/>
-      </w:pPr>
-      <w:r>
-        <w:rPr>
-          <w:i/>
-          <w:iCs/>
-        </w:rPr>
-        <w:t xml:space="preserve">Dr. Vassilios Mewes, Universitat de València</w:t>
-      </w:r>
-      <w:r>
-        <w:tab/>
-      </w:r>
-      <w:r>
-        <w:t xml:space="preserve">Workshop, 8 hours</w:t>
-      </w:r>
-    </w:p>
-    <w:p>
-      <w:pPr>
-        <w:pStyle w:val="EntryGap"/>
-        <w:spacing w:after="0"/>
-      </w:pPr>
-    </w:p>
-    <w:p>
-      <w:pPr>
-        <w:keepNext/>
-        <w:tabs>
-          <w:tab w:val="right" w:pos="10512"/>
-        </w:tabs>
-        <w:spacing w:after="0"/>
-      </w:pPr>
-      <w:r>
-        <w:rPr>
-          <w:b/>
-          <w:bCs/>
-        </w:rPr>
-        <w:t xml:space="preserve">The Universe in the Light of PLANCK and BICEP2</w:t>
-      </w:r>
-      <w:r>
-        <w:tab/>
-      </w:r>
-      <w:r>
-        <w:t xml:space="preserve">May 2014</w:t>
-      </w:r>
-    </w:p>
-    <w:p>
-      <w:pPr>
-        <w:keepNext/>
-        <w:tabs>
-          <w:tab w:val="right" w:pos="10512"/>
-        </w:tabs>
-        <w:spacing w:after="0"/>
-      </w:pPr>
-      <w:r>
-        <w:rPr>
-          <w:i/>
-          <w:iCs/>
-        </w:rPr>
-        <w:t xml:space="preserve">Prof. Nick Mavromatos, Universitat de València</w:t>
-      </w:r>
-      <w:r>
-        <w:tab/>
-      </w:r>
-      <w:r>
-        <w:t xml:space="preserve">Lecture series, 2 credits</w:t>
-      </w:r>
-    </w:p>
-    <w:p>
-      <w:pPr>
-        <w:pStyle w:val="EntryGap"/>
-        <w:spacing w:after="0"/>
-      </w:pPr>
-    </w:p>
-    <w:p>
-      <w:pPr>
-        <w:keepNext/>
-        <w:tabs>
-          <w:tab w:val="right" w:pos="10512"/>
-        </w:tabs>
-        <w:spacing w:after="0"/>
-      </w:pPr>
-      <w:r>
-        <w:rPr>
-          <w:b/>
-          <w:bCs/>
-        </w:rPr>
-        <w:t xml:space="preserve">Dark Matter</w:t>
-      </w:r>
-      <w:r>
-        <w:tab/>
-      </w:r>
-      <w:r>
-        <w:t xml:space="preserve">Sep 2013</w:t>
-      </w:r>
-    </w:p>
-    <w:p>
-      <w:pPr>
-        <w:keepNext/>
-        <w:tabs>
-          <w:tab w:val="right" w:pos="10512"/>
-        </w:tabs>
-        <w:spacing w:after="0"/>
-      </w:pPr>
-      <w:r>
-        <w:rPr>
-          <w:i/>
-          <w:iCs/>
-        </w:rPr>
-        <w:t xml:space="preserve">Prof. Alejandro Ibarra, Universitat de València</w:t>
-      </w:r>
-      <w:r>
-        <w:tab/>
-      </w:r>
-      <w:r>
-        <w:t xml:space="preserve">Lecture series, 2 credits</w:t>
-      </w:r>
-    </w:p>
-    <w:p>
-      <w:pPr>
-        <w:pStyle w:val="EntryGap"/>
-        <w:spacing w:after="0"/>
-      </w:pPr>
-    </w:p>
-    <w:p>
-      <w:pPr>
-        <w:keepNext/>
-        <w:tabs>
-          <w:tab w:val="right" w:pos="10512"/>
-        </w:tabs>
-        <w:spacing w:after="0"/>
-      </w:pPr>
-      <w:r>
-        <w:rPr>
-          <w:b/>
-          <w:bCs/>
-        </w:rPr>
-        <w:t xml:space="preserve">International Cargèse School on Cosmic Accelerators</w:t>
-      </w:r>
-      <w:r>
-        <w:tab/>
-      </w:r>
-      <w:r>
-        <w:t xml:space="preserve">Apr – May 2013</w:t>
-      </w:r>
-    </w:p>
-    <w:p>
-      <w:pPr>
-        <w:keepNext/>
-        <w:tabs>
-          <w:tab w:val="right" w:pos="10512"/>
-        </w:tabs>
-        <w:spacing w:after="0"/>
-      </w:pPr>
-      <w:r>
-        <w:rPr>
-          <w:i/>
-          <w:iCs/>
-        </w:rPr>
-        <w:t xml:space="preserve">Institut d'Études Scientifiques de Cargèse, France</w:t>
-      </w:r>
-      <w:r>
-        <w:tab/>
-      </w:r>
-      <w:r>
-        <w:t xml:space="preserve">Summer school</w:t>
-      </w:r>
-    </w:p>
-    <w:p>
-      <w:pPr>
-        <w:pStyle w:val="EntryGap"/>
-        <w:spacing w:after="0"/>
-      </w:pPr>
-    </w:p>
-    <w:p>
-      <w:pPr>
-        <w:keepNext/>
-        <w:tabs>
-          <w:tab w:val="right" w:pos="10512"/>
-        </w:tabs>
-        <w:spacing w:after="0"/>
-      </w:pPr>
-      <w:r>
-        <w:rPr>
-          <w:b/>
-          <w:bCs/>
-        </w:rPr>
-        <w:t xml:space="preserve">Introduction to C++ Programming</w:t>
-      </w:r>
-      <w:r>
-        <w:tab/>
-      </w:r>
-      <w:r>
-        <w:t xml:space="preserve">Apr 2012</w:t>
-      </w:r>
-    </w:p>
-    <w:p>
-      <w:pPr>
-        <w:keepNext/>
-        <w:tabs>
-          <w:tab w:val="right" w:pos="10512"/>
-        </w:tabs>
-        <w:spacing w:after="0"/>
-      </w:pPr>
-      <w:r>
-        <w:rPr>
-          <w:i/>
-          <w:iCs/>
-        </w:rPr>
-        <w:t xml:space="preserve">Dr. Jacek Generowicz, Universitat de València</w:t>
-      </w:r>
-      <w:r>
-        <w:tab/>
-      </w:r>
-      <w:r>
-        <w:t xml:space="preserve">Workshop, 6 credits</w:t>
-      </w:r>
-    </w:p>
-    <w:p>
-      <w:pPr>
-        <w:pStyle w:val="EntryGap"/>
-        <w:spacing w:after="0"/>
-      </w:pPr>
-    </w:p>
-    <w:p>
-      <w:pPr>
-        <w:keepNext/>
-        <w:tabs>
-          <w:tab w:val="right" w:pos="10512"/>
-        </w:tabs>
-        <w:spacing w:after="0"/>
-      </w:pPr>
-      <w:r>
-        <w:rPr>
-          <w:b/>
-          <w:bCs/>
-        </w:rPr>
-        <w:t xml:space="preserve">Numerical Relativistic Astrophysics</w:t>
-      </w:r>
-      <w:r>
-        <w:tab/>
-      </w:r>
-      <w:r>
-        <w:t xml:space="preserve">Mar – Apr 2012</w:t>
-      </w:r>
-    </w:p>
-    <w:p>
-      <w:pPr>
-        <w:keepNext/>
-        <w:tabs>
-          <w:tab w:val="right" w:pos="10512"/>
-        </w:tabs>
-        <w:spacing w:after="0"/>
-      </w:pPr>
-      <w:r>
-        <w:rPr>
-          <w:i/>
-          <w:iCs/>
-        </w:rPr>
-        <w:t xml:space="preserve">Prof. Luciano Rezzolla, Universitat de València</w:t>
-      </w:r>
-      <w:r>
-        <w:tab/>
-      </w:r>
-      <w:r>
-        <w:t xml:space="preserve">Lecture series, 9 hours</w:t>
-      </w:r>
-    </w:p>
-    <w:p>
-      <w:pPr>
-        <w:pStyle w:val="EntryGap"/>
-        <w:spacing w:after="0"/>
-      </w:pPr>
-    </w:p>
-    <w:p>
-      <w:pPr>
-        <w:keepNext/>
-        <w:tabs>
-          <w:tab w:val="right" w:pos="10512"/>
-        </w:tabs>
-        <w:spacing w:after="0"/>
-      </w:pPr>
-      <w:r>
-        <w:rPr>
-          <w:b/>
-          <w:bCs/>
-        </w:rPr>
-        <w:t xml:space="preserve">Fortran for Scientific Computing</w:t>
-      </w:r>
-      <w:r>
-        <w:tab/>
-      </w:r>
-      <w:r>
-        <w:t xml:space="preserve">Mar 2012</w:t>
-      </w:r>
-    </w:p>
-    <w:p>
-      <w:pPr>
-        <w:keepNext/>
-        <w:tabs>
-          <w:tab w:val="right" w:pos="10512"/>
-        </w:tabs>
-        <w:spacing w:after="0"/>
-      </w:pPr>
-      <w:r>
-        <w:rPr>
-          <w:i/>
-          <w:iCs/>
-        </w:rPr>
-        <w:t xml:space="preserve">HLRS, University of Stuttgart, Germany</w:t>
-      </w:r>
-      <w:r>
-        <w:tab/>
-      </w:r>
-      <w:r>
-        <w:t xml:space="preserve">Workshop, 33 hours</w:t>
-      </w:r>
-    </w:p>
-    <w:p>
-      <w:pPr>
-        <w:pStyle w:val="EntryGap"/>
-        <w:spacing w:after="0"/>
-      </w:pPr>
-    </w:p>
-    <w:p>
-      <w:pPr>
-        <w:pStyle w:val="Heading1"/>
-      </w:pPr>
-      <w:r>
         <w:t xml:space="preserve">Outreach</w:t>
       </w:r>
     </w:p>
@@ -4529,7 +4529,7 @@
       <w:pPr>
         <w:spacing w:after="0"/>
       </w:pPr>
-      <w:hyperlink w:history="1" r:id="rId0btmpgurrch1ihhiaxqx9">
+      <w:hyperlink w:history="1" r:id="rIdy2no01iqbc8vo020ecldz">
         <w:r>
           <w:t xml:space="preserve">mexiciencia.github.io/post/anita</w:t>
         </w:r>
@@ -4589,7 +4589,7 @@
       <w:pPr>
         <w:spacing w:after="0"/>
       </w:pPr>
-      <w:hyperlink w:history="1" r:id="rIdjcfosgzdgl0yo4cos_5pf">
+      <w:hyperlink w:history="1" r:id="rIduuajg3tpx1wq-9c6zfbj6">
         <w:r>
           <w:t xml:space="preserve">mexiciencia.github.io/post/modelo-sir</w:t>
         </w:r>
@@ -4652,7 +4652,7 @@
       <w:r>
         <w:t xml:space="preserve">Data analysis and modeling collaborator. </w:t>
       </w:r>
-      <w:hyperlink w:history="1" r:id="rIdqzomcp2phzswuzroc7g2m">
+      <w:hyperlink w:history="1" r:id="rIdvy5s802_jo6hwaj1rxrw0">
         <w:r>
           <w:t xml:space="preserve">mexiciencia.github.io/post/covid19</w:t>
         </w:r>

</xml_diff>

<commit_message>
Update YAML CV and resume content. Fixed some thigs that were written wongly.
</commit_message>
<xml_diff>
--- a/RuedaBecerrilJM-CV-plain.docx
+++ b/RuedaBecerrilJM-CV-plain.docx
@@ -28,7 +28,7 @@
       <w:r>
         <w:t xml:space="preserve">  |  </w:t>
       </w:r>
-      <w:hyperlink w:history="1" r:id="rIdkvypxsy8kxz_nhcmw-r8r">
+      <w:hyperlink w:history="1" r:id="rIdcp_ik5gft9xpskyp9hjjz">
         <w:r>
           <w:t xml:space="preserve">jm.ruebe@gmail.com</w:t>
         </w:r>
@@ -42,7 +42,7 @@
       <w:r>
         <w:t xml:space="preserve">  |  </w:t>
       </w:r>
-      <w:hyperlink w:history="1" r:id="rIdbuf2yg_3njmpdyfgfaogz">
+      <w:hyperlink w:history="1" r:id="rId7-0ygznevswy-smpxxjqr">
         <w:r>
           <w:t xml:space="preserve">linkedin.com/in/jeruebe</w:t>
         </w:r>
@@ -53,7 +53,7 @@
         <w:spacing w:after="60"/>
         <w:jc w:val="center"/>
       </w:pPr>
-      <w:hyperlink w:history="1" r:id="rIdmdarvl1ddthp34cccowxu">
+      <w:hyperlink w:history="1" r:id="rIdxg3zzmgk0bljru2o1iowi">
         <w:r>
           <w:t xml:space="preserve">altjerue.github.io</w:t>
         </w:r>
@@ -61,7 +61,7 @@
       <w:r>
         <w:t xml:space="preserve">  |  </w:t>
       </w:r>
-      <w:hyperlink w:history="1" r:id="rId_y8fict-p_y8qy4snjjw8">
+      <w:hyperlink w:history="1" r:id="rId4mzikwxkjy-7cqnh0fwxc">
         <w:r>
           <w:t xml:space="preserve">github.com/altjerue</w:t>
         </w:r>
@@ -69,7 +69,7 @@
       <w:r>
         <w:t xml:space="preserve">  |  </w:t>
       </w:r>
-      <w:hyperlink w:history="1" r:id="rIdnq2c19tuphuyoaolu8nwz">
+      <w:hyperlink w:history="1" r:id="rIdppoce_1w7hmu0txu_dbsb">
         <w:r>
           <w:t xml:space="preserve">orcid.org/0000-0003-1988-1912</w:t>
         </w:r>
@@ -77,7 +77,7 @@
       <w:r>
         <w:t xml:space="preserve">  |  </w:t>
       </w:r>
-      <w:hyperlink w:history="1" r:id="rId2ukmenvryyrgmfhrolet7">
+      <w:hyperlink w:history="1" r:id="rIdxohnkozayjhcpgr1vsjqx">
         <w:r>
           <w:t xml:space="preserve">Google Scholar</w:t>
         </w:r>
@@ -367,7 +367,7 @@
         <w:spacing w:after="10"/>
       </w:pPr>
       <w:r>
-        <w:t xml:space="preserve">Engineered features from Sentinel-1/2 imagery and terrain derivatives for ML land-cover and wetland models; built Python tools and QGIS visualizations.</w:t>
+        <w:t xml:space="preserve">Engineered features from Sentinel-1/2 multispectral imagery and terrain derivatives for ML land-cover and wetland models; built Python tools and QGIS visualizations.</w:t>
       </w:r>
     </w:p>
     <w:p>
@@ -470,65 +470,6 @@
     </w:p>
     <w:p>
       <w:pPr>
-        <w:pStyle w:val="EntryGap"/>
-        <w:spacing w:after="0"/>
-      </w:pPr>
-    </w:p>
-    <w:p>
-      <w:pPr>
-        <w:keepNext/>
-        <w:tabs>
-          <w:tab w:val="right" w:pos="10512"/>
-        </w:tabs>
-        <w:spacing w:after="0"/>
-      </w:pPr>
-      <w:r>
-        <w:rPr>
-          <w:b/>
-          <w:bCs/>
-        </w:rPr>
-        <w:t xml:space="preserve">Software Engineer</w:t>
-      </w:r>
-      <w:r>
-        <w:tab/>
-      </w:r>
-      <w:r>
-        <w:t xml:space="preserve">Apr 2022 – Jan 2024</w:t>
-      </w:r>
-    </w:p>
-    <w:p>
-      <w:pPr>
-        <w:keepNext/>
-        <w:tabs>
-          <w:tab w:val="right" w:pos="10512"/>
-        </w:tabs>
-        <w:spacing w:after="0"/>
-      </w:pPr>
-      <w:r>
-        <w:rPr>
-          <w:i/>
-          <w:iCs/>
-        </w:rPr>
-        <w:t xml:space="preserve">Paychex</w:t>
-      </w:r>
-      <w:r>
-        <w:tab/>
-      </w:r>
-      <w:r>
-        <w:t xml:space="preserve">Remote</w:t>
-      </w:r>
-    </w:p>
-    <w:p>
-      <w:pPr>
-        <w:keepNext/>
-        <w:spacing w:after="20"/>
-      </w:pPr>
-      <w:r>
-        <w:t xml:space="preserve">Built and tested data-integration services between enterprise systems and Oracle E-Business Suite.</w:t>
-      </w:r>
-    </w:p>
-    <w:p>
-      <w:pPr>
         <w:pStyle w:val="ListParagraph"/>
         <w:numPr>
           <w:ilvl w:val="0"/>
@@ -537,7 +478,66 @@
         <w:spacing w:after="10"/>
       </w:pPr>
       <w:r>
-        <w:t xml:space="preserve">Built Java Kafka consumers that moved data between enterprise databases, deployed through Jenkins and OpenShift CI/CD pipelines.</w:t>
+        <w:t xml:space="preserve">Invited talk on machine learning in environmental science at the University of Washington (2024).</w:t>
+      </w:r>
+    </w:p>
+    <w:p>
+      <w:pPr>
+        <w:pStyle w:val="EntryGap"/>
+        <w:spacing w:after="0"/>
+      </w:pPr>
+    </w:p>
+    <w:p>
+      <w:pPr>
+        <w:keepNext/>
+        <w:tabs>
+          <w:tab w:val="right" w:pos="10512"/>
+        </w:tabs>
+        <w:spacing w:after="0"/>
+      </w:pPr>
+      <w:r>
+        <w:rPr>
+          <w:b/>
+          <w:bCs/>
+        </w:rPr>
+        <w:t xml:space="preserve">Software Engineer</w:t>
+      </w:r>
+      <w:r>
+        <w:tab/>
+      </w:r>
+      <w:r>
+        <w:t xml:space="preserve">Apr 2022 – Jan 2024</w:t>
+      </w:r>
+    </w:p>
+    <w:p>
+      <w:pPr>
+        <w:keepNext/>
+        <w:tabs>
+          <w:tab w:val="right" w:pos="10512"/>
+        </w:tabs>
+        <w:spacing w:after="0"/>
+      </w:pPr>
+      <w:r>
+        <w:rPr>
+          <w:i/>
+          <w:iCs/>
+        </w:rPr>
+        <w:t xml:space="preserve">Paychex</w:t>
+      </w:r>
+      <w:r>
+        <w:tab/>
+      </w:r>
+      <w:r>
+        <w:t xml:space="preserve">Remote</w:t>
+      </w:r>
+    </w:p>
+    <w:p>
+      <w:pPr>
+        <w:keepNext/>
+        <w:spacing w:after="20"/>
+      </w:pPr>
+      <w:r>
+        <w:t xml:space="preserve">Built and tested data-integration services between enterprise systems and Oracle E-Business Suite.</w:t>
       </w:r>
     </w:p>
     <w:p>
@@ -550,7 +550,7 @@
         <w:spacing w:after="10"/>
       </w:pPr>
       <w:r>
-        <w:t xml:space="preserve">Created Splunk dashboards tracking the 200–400 users shared between enterprise systems and Oracle EBS, with alerts for production incidents; prepared and validated Oracle EBS data with SQL.</w:t>
+        <w:t xml:space="preserve">Built Java Kafka consumers that moved data between enterprise databases, deployed through Jenkins and OpenShift CI/CD pipelines.</w:t>
       </w:r>
     </w:p>
     <w:p>
@@ -563,66 +563,7 @@
         <w:spacing w:after="10"/>
       </w:pPr>
       <w:r>
-        <w:t xml:space="preserve">Wrote full test suites for 5+ Python services in the CI pipeline, keeping production defect rates low.</w:t>
-      </w:r>
-    </w:p>
-    <w:p>
-      <w:pPr>
-        <w:pStyle w:val="EntryGap"/>
-        <w:spacing w:after="0"/>
-      </w:pPr>
-    </w:p>
-    <w:p>
-      <w:pPr>
-        <w:keepNext/>
-        <w:tabs>
-          <w:tab w:val="right" w:pos="10512"/>
-        </w:tabs>
-        <w:spacing w:after="0"/>
-      </w:pPr>
-      <w:r>
-        <w:rPr>
-          <w:b/>
-          <w:bCs/>
-        </w:rPr>
-        <w:t xml:space="preserve">Postdoctoral Research Associate</w:t>
-      </w:r>
-      <w:r>
-        <w:tab/>
-      </w:r>
-      <w:r>
-        <w:t xml:space="preserve">Feb 2021 – Apr 2022</w:t>
-      </w:r>
-    </w:p>
-    <w:p>
-      <w:pPr>
-        <w:keepNext/>
-        <w:tabs>
-          <w:tab w:val="right" w:pos="10512"/>
-        </w:tabs>
-        <w:spacing w:after="0"/>
-      </w:pPr>
-      <w:r>
-        <w:rPr>
-          <w:i/>
-          <w:iCs/>
-        </w:rPr>
-        <w:t xml:space="preserve">Rochester Institute of Technology</w:t>
-      </w:r>
-      <w:r>
-        <w:tab/>
-      </w:r>
-      <w:r>
-        <w:t xml:space="preserve">Rochester, NY</w:t>
-      </w:r>
-    </w:p>
-    <w:p>
-      <w:pPr>
-        <w:keepNext/>
-        <w:spacing w:after="20"/>
-      </w:pPr>
-      <w:r>
-        <w:t xml:space="preserve">HPC simulations of supermassive black-hole binaries in an NSF-funded project.</w:t>
+        <w:t xml:space="preserve">Created Splunk dashboards tracking the 200–400 users shared between enterprise systems and Oracle EBS, with alerts for production incidents; prepared and validated Oracle EBS data with SQL.</w:t>
       </w:r>
     </w:p>
     <w:p>
@@ -635,7 +576,66 @@
         <w:spacing w:after="10"/>
       </w:pPr>
       <w:r>
-        <w:t xml:space="preserve">Led a 7-person team upgrading PatchworkMHD, a C code for magnetohydrodynamic simulations of supermassive black hole binaries, in an NSF-funded project.</w:t>
+        <w:t xml:space="preserve">Wrote full test suites for 5+ Python services in the CI pipeline, keeping production defect rates low.</w:t>
+      </w:r>
+    </w:p>
+    <w:p>
+      <w:pPr>
+        <w:pStyle w:val="EntryGap"/>
+        <w:spacing w:after="0"/>
+      </w:pPr>
+    </w:p>
+    <w:p>
+      <w:pPr>
+        <w:keepNext/>
+        <w:tabs>
+          <w:tab w:val="right" w:pos="10512"/>
+        </w:tabs>
+        <w:spacing w:after="0"/>
+      </w:pPr>
+      <w:r>
+        <w:rPr>
+          <w:b/>
+          <w:bCs/>
+        </w:rPr>
+        <w:t xml:space="preserve">Postdoctoral Research Associate</w:t>
+      </w:r>
+      <w:r>
+        <w:tab/>
+      </w:r>
+      <w:r>
+        <w:t xml:space="preserve">Feb 2021 – Apr 2022</w:t>
+      </w:r>
+    </w:p>
+    <w:p>
+      <w:pPr>
+        <w:keepNext/>
+        <w:tabs>
+          <w:tab w:val="right" w:pos="10512"/>
+        </w:tabs>
+        <w:spacing w:after="0"/>
+      </w:pPr>
+      <w:r>
+        <w:rPr>
+          <w:i/>
+          <w:iCs/>
+        </w:rPr>
+        <w:t xml:space="preserve">Rochester Institute of Technology</w:t>
+      </w:r>
+      <w:r>
+        <w:tab/>
+      </w:r>
+      <w:r>
+        <w:t xml:space="preserve">Rochester, NY</w:t>
+      </w:r>
+    </w:p>
+    <w:p>
+      <w:pPr>
+        <w:keepNext/>
+        <w:spacing w:after="20"/>
+      </w:pPr>
+      <w:r>
+        <w:t xml:space="preserve">HPC simulations of supermassive black hole binaries in an NSF-funded project.</w:t>
       </w:r>
     </w:p>
     <w:p>
@@ -648,7 +648,7 @@
         <w:spacing w:after="10"/>
       </w:pPr>
       <w:r>
-        <w:t xml:space="preserve">Added black hole spin to the simulations with under 5% runtime overhead.</w:t>
+        <w:t xml:space="preserve">Led a 7-person team upgrading PatchworkMHD, a C code for magnetohydrodynamic simulations of supermassive black hole binaries, in an NSF-funded project.</w:t>
       </w:r>
     </w:p>
     <w:p>
@@ -661,7 +661,7 @@
         <w:spacing w:after="10"/>
       </w:pPr>
       <w:r>
-        <w:t xml:space="preserve">Ran and benchmarked large production simulations on Frontera (TACC), about 10,000 node-hours, and identified performance bottlenecks in the parallel code.</w:t>
+        <w:t xml:space="preserve">Added black hole spin to the simulations with under 5% runtime overhead.</w:t>
       </w:r>
     </w:p>
     <w:p>
@@ -674,7 +674,7 @@
         <w:spacing w:after="10"/>
       </w:pPr>
       <w:r>
-        <w:t xml:space="preserve">Calibrated Paramo model parameters against Fermi-LAT gamma-ray spectra with gradient-based optimization, and supervised a graduate student applying gradient descent to the same problem.</w:t>
+        <w:t xml:space="preserve">Ran and benchmarked large production simulations on Frontera (TACC), about 10,000 node-hours, and identified performance bottlenecks in the parallel code.</w:t>
       </w:r>
     </w:p>
     <w:p>
@@ -687,66 +687,7 @@
         <w:spacing w:after="10"/>
       </w:pPr>
       <w:r>
-        <w:t xml:space="preserve">Co-authored 2 papers from a multi-institution study of binary neutron-star mergers [6, 7] and a third on blazar heating and cooling [8].</w:t>
-      </w:r>
-    </w:p>
-    <w:p>
-      <w:pPr>
-        <w:pStyle w:val="EntryGap"/>
-        <w:spacing w:after="0"/>
-      </w:pPr>
-    </w:p>
-    <w:p>
-      <w:pPr>
-        <w:keepNext/>
-        <w:tabs>
-          <w:tab w:val="right" w:pos="10512"/>
-        </w:tabs>
-        <w:spacing w:after="0"/>
-      </w:pPr>
-      <w:r>
-        <w:rPr>
-          <w:b/>
-          <w:bCs/>
-        </w:rPr>
-        <w:t xml:space="preserve">Postdoctoral Research Fellow</w:t>
-      </w:r>
-      <w:r>
-        <w:tab/>
-      </w:r>
-      <w:r>
-        <w:t xml:space="preserve">Oct 2018 – Nov 2020</w:t>
-      </w:r>
-    </w:p>
-    <w:p>
-      <w:pPr>
-        <w:keepNext/>
-        <w:tabs>
-          <w:tab w:val="right" w:pos="10512"/>
-        </w:tabs>
-        <w:spacing w:after="0"/>
-      </w:pPr>
-      <w:r>
-        <w:rPr>
-          <w:i/>
-          <w:iCs/>
-        </w:rPr>
-        <w:t xml:space="preserve">Purdue University</w:t>
-      </w:r>
-      <w:r>
-        <w:tab/>
-      </w:r>
-      <w:r>
-        <w:t xml:space="preserve">West Lafayette, IN</w:t>
-      </w:r>
-    </w:p>
-    <w:p>
-      <w:pPr>
-        <w:keepNext/>
-        <w:spacing w:after="20"/>
-      </w:pPr>
-      <w:r>
-        <w:t xml:space="preserve">Radiative-transfer modeling of relativistic jets (blazars and gamma-ray burst afterglows).</w:t>
+        <w:t xml:space="preserve">Calibrated Paramo model parameters against Fermi-LAT gamma-ray spectra with gradient-based optimization, and supervised a graduate student applying gradient descent to the same problem.</w:t>
       </w:r>
     </w:p>
     <w:p>
@@ -759,7 +700,66 @@
         <w:spacing w:after="10"/>
       </w:pPr>
       <w:r>
-        <w:t xml:space="preserve">Architected Paramo, an open-source Fortran 95 library that solves the Fokker–Planck equation coupled to radiative transfer; parallelized and optimized it with OpenMP, making it about 20× faster than the original serial code on 5 cores.</w:t>
+        <w:t xml:space="preserve">Co-authored 2 papers from a multi-institution study of binary neutron star mergers [6, 7] and a third on blazar heating and cooling [8].</w:t>
+      </w:r>
+    </w:p>
+    <w:p>
+      <w:pPr>
+        <w:pStyle w:val="EntryGap"/>
+        <w:spacing w:after="0"/>
+      </w:pPr>
+    </w:p>
+    <w:p>
+      <w:pPr>
+        <w:keepNext/>
+        <w:tabs>
+          <w:tab w:val="right" w:pos="10512"/>
+        </w:tabs>
+        <w:spacing w:after="0"/>
+      </w:pPr>
+      <w:r>
+        <w:rPr>
+          <w:b/>
+          <w:bCs/>
+        </w:rPr>
+        <w:t xml:space="preserve">Postdoctoral Research Fellow</w:t>
+      </w:r>
+      <w:r>
+        <w:tab/>
+      </w:r>
+      <w:r>
+        <w:t xml:space="preserve">Oct 2018 – Nov 2020</w:t>
+      </w:r>
+    </w:p>
+    <w:p>
+      <w:pPr>
+        <w:keepNext/>
+        <w:tabs>
+          <w:tab w:val="right" w:pos="10512"/>
+        </w:tabs>
+        <w:spacing w:after="0"/>
+      </w:pPr>
+      <w:r>
+        <w:rPr>
+          <w:i/>
+          <w:iCs/>
+        </w:rPr>
+        <w:t xml:space="preserve">Purdue University</w:t>
+      </w:r>
+      <w:r>
+        <w:tab/>
+      </w:r>
+      <w:r>
+        <w:t xml:space="preserve">West Lafayette, IN</w:t>
+      </w:r>
+    </w:p>
+    <w:p>
+      <w:pPr>
+        <w:keepNext/>
+        <w:spacing w:after="20"/>
+      </w:pPr>
+      <w:r>
+        <w:t xml:space="preserve">Radiative-transfer modeling of relativistic jets (blazars and gamma-ray burst afterglows).</w:t>
       </w:r>
     </w:p>
     <w:p>
@@ -772,7 +772,7 @@
         <w:spacing w:after="10"/>
       </w:pPr>
       <w:r>
-        <w:t xml:space="preserve">Paramo has been adopted by other groups, including Combi &amp; Siegel (2023).</w:t>
+        <w:t xml:space="preserve">Architected Paramo, an open-source Fortran 95 library that solves the Fokker–Planck equation coupled to radiative transfer; parallelized and optimized it with OpenMP, making it about 20× faster than the original serial code on 5 cores.</w:t>
       </w:r>
     </w:p>
     <w:p>
@@ -785,7 +785,7 @@
         <w:spacing w:after="10"/>
       </w:pPr>
       <w:r>
-        <w:t xml:space="preserve">Co-I on two NASA Fermi Guest Investigator proposals; one was funded ($68K) and supported the finding that blazar jets are launched with similar energy per baryon, independently of their power [5].</w:t>
+        <w:t xml:space="preserve">Paramo has been adopted by other research groups, including Combi &amp; Siegel (2023).</w:t>
       </w:r>
     </w:p>
     <w:p>
@@ -798,7 +798,7 @@
         <w:spacing w:after="10"/>
       </w:pPr>
       <w:r>
-        <w:t xml:space="preserve">Added numerical-integration and OpenMP features to Paramo and built Python tools to compute energy losses and spectra of high-energy particles in gamma-ray burst afterglows [4].</w:t>
+        <w:t xml:space="preserve">Co-I on two NASA Fermi Guest Investigator proposals; one was funded ($68K) and supported the finding that blazar jets are launched with similar energy per baryon, independently of their power [5].</w:t>
       </w:r>
     </w:p>
     <w:p>
@@ -811,7 +811,7 @@
         <w:spacing w:after="10"/>
       </w:pPr>
       <w:r>
-        <w:t xml:space="preserve">Mentored 3 graduate students (1 M.S., 2 Ph.D.), co-authoring papers with each.</w:t>
+        <w:t xml:space="preserve">Added numerical-integration and OpenMP features to Paramo and built Python tools to compute energy losses and spectra of high-energy particles in gamma-ray burst afterglows [4].</w:t>
       </w:r>
     </w:p>
     <w:p>
@@ -824,57 +824,7 @@
         <w:spacing w:after="10"/>
       </w:pPr>
       <w:r>
-        <w:t xml:space="preserve">Modeled the COVID-19 outbreak in Mexico (Python) and co-wrote Spanish-language infographics against misinformation.</w:t>
-      </w:r>
-    </w:p>
-    <w:p>
-      <w:pPr>
-        <w:pStyle w:val="EntryGap"/>
-        <w:spacing w:after="0"/>
-      </w:pPr>
-    </w:p>
-    <w:p>
-      <w:pPr>
-        <w:keepNext/>
-        <w:tabs>
-          <w:tab w:val="right" w:pos="10512"/>
-        </w:tabs>
-        <w:spacing w:after="0"/>
-      </w:pPr>
-      <w:r>
-        <w:rPr>
-          <w:b/>
-          <w:bCs/>
-        </w:rPr>
-        <w:t xml:space="preserve">Postdoctoral Research Fellow</w:t>
-      </w:r>
-      <w:r>
-        <w:tab/>
-      </w:r>
-      <w:r>
-        <w:t xml:space="preserve">Jan 2018 – Sep 2018</w:t>
-      </w:r>
-    </w:p>
-    <w:p>
-      <w:pPr>
-        <w:keepNext/>
-        <w:tabs>
-          <w:tab w:val="right" w:pos="10512"/>
-        </w:tabs>
-        <w:spacing w:after="0"/>
-      </w:pPr>
-      <w:r>
-        <w:rPr>
-          <w:i/>
-          <w:iCs/>
-        </w:rPr>
-        <w:t xml:space="preserve">Universidad Michoacana de San Nicolás de Hidalgo</w:t>
-      </w:r>
-      <w:r>
-        <w:tab/>
-      </w:r>
-      <w:r>
-        <w:t xml:space="preserve">Morelia, Mexico</w:t>
+        <w:t xml:space="preserve">Mentored 3 graduate students (1 M.S., 2 Ph.D.), co-authoring papers with each.</w:t>
       </w:r>
     </w:p>
     <w:p>
@@ -887,7 +837,57 @@
         <w:spacing w:after="10"/>
       </w:pPr>
       <w:r>
-        <w:t xml:space="preserve">Built a Python pipeline that turned GRTrans black-hole simulation images into training data for an SVM classifier of black-hole spin (grayscale conversion, intensity normalization, spatial feature extraction).</w:t>
+        <w:t xml:space="preserve">Modeled the COVID-19 outbreak in Mexico (Python) and co-wrote Spanish-language infographics in a campaign against misinformation.</w:t>
+      </w:r>
+    </w:p>
+    <w:p>
+      <w:pPr>
+        <w:pStyle w:val="EntryGap"/>
+        <w:spacing w:after="0"/>
+      </w:pPr>
+    </w:p>
+    <w:p>
+      <w:pPr>
+        <w:keepNext/>
+        <w:tabs>
+          <w:tab w:val="right" w:pos="10512"/>
+        </w:tabs>
+        <w:spacing w:after="0"/>
+      </w:pPr>
+      <w:r>
+        <w:rPr>
+          <w:b/>
+          <w:bCs/>
+        </w:rPr>
+        <w:t xml:space="preserve">Postdoctoral Research Fellow</w:t>
+      </w:r>
+      <w:r>
+        <w:tab/>
+      </w:r>
+      <w:r>
+        <w:t xml:space="preserve">Jan 2018 – Sep 2018</w:t>
+      </w:r>
+    </w:p>
+    <w:p>
+      <w:pPr>
+        <w:keepNext/>
+        <w:tabs>
+          <w:tab w:val="right" w:pos="10512"/>
+        </w:tabs>
+        <w:spacing w:after="0"/>
+      </w:pPr>
+      <w:r>
+        <w:rPr>
+          <w:i/>
+          <w:iCs/>
+        </w:rPr>
+        <w:t xml:space="preserve">Universidad Michoacana de San Nicolás de Hidalgo</w:t>
+      </w:r>
+      <w:r>
+        <w:tab/>
+      </w:r>
+      <w:r>
+        <w:t xml:space="preserve">Morelia, Mexico</w:t>
       </w:r>
     </w:p>
     <w:p>
@@ -900,7 +900,7 @@
         <w:spacing w:after="10"/>
       </w:pPr>
       <w:r>
-        <w:t xml:space="preserve">Released an open-source Python tool for radiative-transfer spectra and light curves.</w:t>
+        <w:t xml:space="preserve">Built a Python pipeline that turned GRTrans black hole simulation images into training data for an SVM classifier of black hole spin (grayscale conversion, intensity normalization, spatial feature extraction).</w:t>
       </w:r>
     </w:p>
     <w:p>
@@ -913,57 +913,7 @@
         <w:spacing w:after="10"/>
       </w:pPr>
       <w:r>
-        <w:t xml:space="preserve">Organized an HDF5 workshop to train graduate students in high-volume data storage.</w:t>
-      </w:r>
-    </w:p>
-    <w:p>
-      <w:pPr>
-        <w:pStyle w:val="EntryGap"/>
-        <w:spacing w:after="0"/>
-      </w:pPr>
-    </w:p>
-    <w:p>
-      <w:pPr>
-        <w:keepNext/>
-        <w:tabs>
-          <w:tab w:val="right" w:pos="10512"/>
-        </w:tabs>
-        <w:spacing w:after="0"/>
-      </w:pPr>
-      <w:r>
-        <w:rPr>
-          <w:b/>
-          <w:bCs/>
-        </w:rPr>
-        <w:t xml:space="preserve">Graduate Research Assistant</w:t>
-      </w:r>
-      <w:r>
-        <w:tab/>
-      </w:r>
-      <w:r>
-        <w:t xml:space="preserve">Oct 2011 – Jul 2017</w:t>
-      </w:r>
-    </w:p>
-    <w:p>
-      <w:pPr>
-        <w:keepNext/>
-        <w:tabs>
-          <w:tab w:val="right" w:pos="10512"/>
-        </w:tabs>
-        <w:spacing w:after="0"/>
-      </w:pPr>
-      <w:r>
-        <w:rPr>
-          <w:i/>
-          <w:iCs/>
-        </w:rPr>
-        <w:t xml:space="preserve">Universitat de València</w:t>
-      </w:r>
-      <w:r>
-        <w:tab/>
-      </w:r>
-      <w:r>
-        <w:t xml:space="preserve">Valencia, Spain</w:t>
+        <w:t xml:space="preserve">Released an open-source Python tool for radiative-transfer spectra and light curves.</w:t>
       </w:r>
     </w:p>
     <w:p>
@@ -976,7 +926,57 @@
         <w:spacing w:after="10"/>
       </w:pPr>
       <w:r>
-        <w:t xml:space="preserve">Automated runs of the C-SPEV radiative-transfer code with Shell and Python pipelines: 10–60 simulations per project and tens of GB of HDF5 output, with data-quality checks for downstream analysis.</w:t>
+        <w:t xml:space="preserve">Organized an HDF5 workshop to train graduate students in high-volume data storage.</w:t>
+      </w:r>
+    </w:p>
+    <w:p>
+      <w:pPr>
+        <w:pStyle w:val="EntryGap"/>
+        <w:spacing w:after="0"/>
+      </w:pPr>
+    </w:p>
+    <w:p>
+      <w:pPr>
+        <w:keepNext/>
+        <w:tabs>
+          <w:tab w:val="right" w:pos="10512"/>
+        </w:tabs>
+        <w:spacing w:after="0"/>
+      </w:pPr>
+      <w:r>
+        <w:rPr>
+          <w:b/>
+          <w:bCs/>
+        </w:rPr>
+        <w:t xml:space="preserve">Graduate Research Assistant</w:t>
+      </w:r>
+      <w:r>
+        <w:tab/>
+      </w:r>
+      <w:r>
+        <w:t xml:space="preserve">Oct 2011 – Jul 2017</w:t>
+      </w:r>
+    </w:p>
+    <w:p>
+      <w:pPr>
+        <w:keepNext/>
+        <w:tabs>
+          <w:tab w:val="right" w:pos="10512"/>
+        </w:tabs>
+        <w:spacing w:after="0"/>
+      </w:pPr>
+      <w:r>
+        <w:rPr>
+          <w:i/>
+          <w:iCs/>
+        </w:rPr>
+        <w:t xml:space="preserve">Universitat de València</w:t>
+      </w:r>
+      <w:r>
+        <w:tab/>
+      </w:r>
+      <w:r>
+        <w:t xml:space="preserve">Valencia, Spain</w:t>
       </w:r>
     </w:p>
     <w:p>
@@ -989,7 +989,7 @@
         <w:spacing w:after="10"/>
       </w:pPr>
       <w:r>
-        <w:t xml:space="preserve">Analyzed Fermi-LAT and VLBA multi-wavelength observations, cross-matching sources across catalogs and fitting log-parabola spectra.</w:t>
+        <w:t xml:space="preserve">Automated runs of the C-SPEV radiative-transfer code with Shell and Python pipelines: 10–60 simulations per project and tens of GB of HDF5 output, with data-quality checks for downstream analysis.</w:t>
       </w:r>
     </w:p>
     <w:p>
@@ -1002,7 +1002,7 @@
         <w:spacing w:after="10"/>
       </w:pPr>
       <w:r>
-        <w:t xml:space="preserve">Fit C-SPEV models to telescope data, finding spectral and light-curve patterns that quantify plasma magnetization in blazars.</w:t>
+        <w:t xml:space="preserve">Analyzed Fermi-LAT and VLBA multi-wavelength observations, cross-matching sources across catalogs and fitting log-parabola spectra.</w:t>
       </w:r>
     </w:p>
     <w:p>
@@ -1015,7 +1015,7 @@
         <w:spacing w:after="10"/>
       </w:pPr>
       <w:r>
-        <w:t xml:space="preserve">Extended C-SPEV to compute discrete and continuous spectra from particle distributions of arbitrary shape, without affecting simulation runtime.</w:t>
+        <w:t xml:space="preserve">Fit C-SPEV simulation models to telescope data, identifying spectra and light-curve patterns that quantify plasma magnetization in blazars.</w:t>
       </w:r>
     </w:p>
     <w:p>
@@ -1028,1403 +1028,8 @@
         <w:spacing w:after="10"/>
       </w:pPr>
       <w:r>
-        <w:t xml:space="preserve">Published 2 first-author papers in MNRAS [2, 3].</w:t>
-      </w:r>
-    </w:p>
-    <w:p>
-      <w:pPr>
-        <w:pStyle w:val="EntryGap"/>
-        <w:spacing w:after="0"/>
-      </w:pPr>
-    </w:p>
-    <w:p>
-      <w:pPr>
-        <w:pStyle w:val="Heading1"/>
-      </w:pPr>
-      <w:r>
-        <w:t xml:space="preserve">Education</w:t>
-      </w:r>
-    </w:p>
-    <w:p>
-      <w:pPr>
-        <w:keepNext/>
-        <w:tabs>
-          <w:tab w:val="right" w:pos="10512"/>
-        </w:tabs>
-        <w:spacing w:after="0"/>
-      </w:pPr>
-      <w:r>
-        <w:rPr>
-          <w:b/>
-          <w:bCs/>
-        </w:rPr>
-        <w:t xml:space="preserve">Ph.D. in Physics</w:t>
-      </w:r>
-      <w:r>
-        <w:tab/>
-      </w:r>
-      <w:r>
-        <w:t xml:space="preserve">Oct 2011 – Jul 2017</w:t>
-      </w:r>
-    </w:p>
-    <w:p>
-      <w:pPr>
-        <w:keepNext/>
-        <w:tabs>
-          <w:tab w:val="right" w:pos="10512"/>
-        </w:tabs>
-        <w:spacing w:after="0"/>
-      </w:pPr>
-      <w:r>
-        <w:rPr>
-          <w:i/>
-          <w:iCs/>
-        </w:rPr>
-        <w:t xml:space="preserve">Universitat de València</w:t>
-      </w:r>
-      <w:r>
-        <w:tab/>
-      </w:r>
-      <w:r>
-        <w:t xml:space="preserve">Valencia, Spain</w:t>
-      </w:r>
-    </w:p>
-    <w:p>
-      <w:pPr>
-        <w:spacing w:after="0"/>
-      </w:pPr>
-      <w:r>
-        <w:t xml:space="preserve">Excellent </w:t>
-      </w:r>
-      <w:r>
-        <w:rPr>
-          <w:i/>
-          <w:iCs/>
-        </w:rPr>
-        <w:t xml:space="preserve">cum laude</w:t>
-      </w:r>
-    </w:p>
-    <w:p>
-      <w:pPr>
-        <w:spacing w:after="0"/>
-      </w:pPr>
-      <w:r>
-        <w:t xml:space="preserve">Advisors: Prof. Miguel A. Aloy and Dr. Petar Mimica</w:t>
-      </w:r>
-    </w:p>
-    <w:p>
-      <w:pPr>
-        <w:spacing w:after="0"/>
-      </w:pPr>
-      <w:r>
-        <w:t xml:space="preserve">Thesis: </w:t>
-      </w:r>
-      <w:hyperlink w:history="1" r:id="rIdxwrqpe_xn_kecw_jrajoz">
-        <w:r>
-          <w:t xml:space="preserve">Numerical treatment of radiation processes in the internal shocks of magnetized relativistic outflows</w:t>
-        </w:r>
-      </w:hyperlink>
-    </w:p>
-    <w:p>
-      <w:pPr>
-        <w:pStyle w:val="EntryGap"/>
-        <w:spacing w:after="0"/>
-      </w:pPr>
-    </w:p>
-    <w:p>
-      <w:pPr>
-        <w:keepNext/>
-        <w:tabs>
-          <w:tab w:val="right" w:pos="10512"/>
-        </w:tabs>
-        <w:spacing w:after="0"/>
-      </w:pPr>
-      <w:r>
-        <w:rPr>
-          <w:b/>
-          <w:bCs/>
-        </w:rPr>
-        <w:t xml:space="preserve">M.Sc. in Physics</w:t>
-      </w:r>
-      <w:r>
-        <w:tab/>
-      </w:r>
-      <w:r>
-        <w:t xml:space="preserve">Aug 2009 – Sep 2011</w:t>
-      </w:r>
-    </w:p>
-    <w:p>
-      <w:pPr>
-        <w:keepNext/>
-        <w:tabs>
-          <w:tab w:val="right" w:pos="10512"/>
-        </w:tabs>
-        <w:spacing w:after="0"/>
-      </w:pPr>
-      <w:r>
-        <w:rPr>
-          <w:i/>
-          <w:iCs/>
-        </w:rPr>
-        <w:t xml:space="preserve">Universidad Michoacana de San Nicolás de Hidalgo</w:t>
-      </w:r>
-      <w:r>
-        <w:tab/>
-      </w:r>
-      <w:r>
-        <w:t xml:space="preserve">Morelia, Mexico</w:t>
-      </w:r>
-    </w:p>
-    <w:p>
-      <w:pPr>
-        <w:spacing w:after="0"/>
-      </w:pPr>
-      <w:r>
-        <w:t xml:space="preserve">Advisor: Prof. José A. Cervera</w:t>
-      </w:r>
-    </w:p>
-    <w:p>
-      <w:pPr>
-        <w:spacing w:after="0"/>
-      </w:pPr>
-      <w:r>
-        <w:t xml:space="preserve">Thesis: </w:t>
-      </w:r>
-      <w:r>
-        <w:rPr>
-          <w:i/>
-          <w:iCs/>
-        </w:rPr>
-        <w:t xml:space="preserve">Study of TOV stars with the SPH method</w:t>
-      </w:r>
-    </w:p>
-    <w:p>
-      <w:pPr>
-        <w:pStyle w:val="EntryGap"/>
-        <w:spacing w:after="0"/>
-      </w:pPr>
-    </w:p>
-    <w:p>
-      <w:pPr>
-        <w:keepNext/>
-        <w:tabs>
-          <w:tab w:val="right" w:pos="10512"/>
-        </w:tabs>
-        <w:spacing w:after="0"/>
-      </w:pPr>
-      <w:r>
-        <w:rPr>
-          <w:b/>
-          <w:bCs/>
-        </w:rPr>
-        <w:t xml:space="preserve">B.Sc. in Physics</w:t>
-      </w:r>
-      <w:r>
-        <w:tab/>
-      </w:r>
-      <w:r>
-        <w:t xml:space="preserve">Aug 2004 – Dec 2008</w:t>
-      </w:r>
-    </w:p>
-    <w:p>
-      <w:pPr>
-        <w:keepNext/>
-        <w:tabs>
-          <w:tab w:val="right" w:pos="10512"/>
-        </w:tabs>
-        <w:spacing w:after="0"/>
-      </w:pPr>
-      <w:r>
-        <w:rPr>
-          <w:i/>
-          <w:iCs/>
-        </w:rPr>
-        <w:t xml:space="preserve">Universidad Autónoma del Estado de México</w:t>
-      </w:r>
-      <w:r>
-        <w:tab/>
-      </w:r>
-      <w:r>
-        <w:t xml:space="preserve">Toluca, Mexico</w:t>
-      </w:r>
-    </w:p>
-    <w:p>
-      <w:pPr>
-        <w:spacing w:after="0"/>
-      </w:pPr>
-      <w:r>
-        <w:t xml:space="preserve">Advisor: Prof. Francisco S. Guzmán</w:t>
-      </w:r>
-    </w:p>
-    <w:p>
-      <w:pPr>
-        <w:spacing w:after="0"/>
-      </w:pPr>
-      <w:r>
-        <w:t xml:space="preserve">Thesis: </w:t>
-      </w:r>
-      <w:r>
-        <w:rPr>
-          <w:i/>
-          <w:iCs/>
-        </w:rPr>
-        <w:t xml:space="preserve">Numerical solution of null geodesics for the generation of gravitational lenses produced by spherically-symmetric and static spacetimes</w:t>
-      </w:r>
-    </w:p>
-    <w:p>
-      <w:pPr>
-        <w:spacing w:after="0"/>
-      </w:pPr>
-      <w:r>
-        <w:t xml:space="preserve">Lic. Juan Josafat Pichardo Cruz Award</w:t>
-      </w:r>
-    </w:p>
-    <w:p>
-      <w:pPr>
-        <w:pStyle w:val="EntryGap"/>
-        <w:spacing w:after="0"/>
-      </w:pPr>
-    </w:p>
-    <w:p>
-      <w:pPr>
-        <w:pStyle w:val="Heading1"/>
-      </w:pPr>
-      <w:r>
-        <w:t xml:space="preserve">Publications</w:t>
-      </w:r>
-    </w:p>
-    <w:p>
-      <w:pPr>
-        <w:pStyle w:val="Heading2"/>
-      </w:pPr>
-      <w:r>
-        <w:t xml:space="preserve">Articles (9 published, 3 first-author; 3 in preparation)</w:t>
-      </w:r>
-    </w:p>
-    <w:p>
-      <w:pPr>
-        <w:spacing w:after="20"/>
-        <w:ind w:left="300" w:hanging="300"/>
-      </w:pPr>
-      <w:r>
-        <w:t xml:space="preserve">[12] Winkowski, S., </w:t>
-      </w:r>
-      <w:r>
-        <w:rPr>
-          <w:b/>
-          <w:bCs/>
-        </w:rPr>
-        <w:t xml:space="preserve">Rueda-Becerril, J. M.</w:t>
-      </w:r>
-      <w:r>
-        <w:t xml:space="preserve">, &amp; Willing, C. </w:t>
-      </w:r>
-      <w:r>
-        <w:rPr>
-          <w:i/>
-          <w:iCs/>
-        </w:rPr>
-        <w:t xml:space="preserve">Using Numerical Simulations of Wind on Hilly Terrain to Model Propagule Dispersal</w:t>
-      </w:r>
-      <w:r>
-        <w:t xml:space="preserve">, in prep.</w:t>
-      </w:r>
-    </w:p>
-    <w:p>
-      <w:pPr>
-        <w:spacing w:after="20"/>
-        <w:ind w:left="300" w:hanging="300"/>
-      </w:pPr>
-      <w:r>
-        <w:t xml:space="preserve">[11] Holzman, L., </w:t>
-      </w:r>
-      <w:r>
-        <w:rPr>
-          <w:b/>
-          <w:bCs/>
-        </w:rPr>
-        <w:t xml:space="preserve">Rueda-Becerril, J. M.</w:t>
-      </w:r>
-      <w:r>
-        <w:t xml:space="preserve">, Creamer, C., &amp; Willing, C. </w:t>
-      </w:r>
-      <w:r>
-        <w:rPr>
-          <w:i/>
-          <w:iCs/>
-        </w:rPr>
-        <w:t xml:space="preserve">Random Forest Link Landscape Position to Drought Resilience in Giant Sequoia Forests</w:t>
-      </w:r>
-      <w:r>
-        <w:t xml:space="preserve">, in prep.</w:t>
-      </w:r>
-    </w:p>
-    <w:p>
-      <w:pPr>
-        <w:spacing w:after="20"/>
-        <w:ind w:left="300" w:hanging="300"/>
-      </w:pPr>
-      <w:r>
-        <w:t xml:space="preserve">[10] </w:t>
-      </w:r>
-      <w:r>
-        <w:rPr>
-          <w:b/>
-          <w:bCs/>
-        </w:rPr>
-        <w:t xml:space="preserve">Rueda-Becerril, J. M.</w:t>
-      </w:r>
-      <w:r>
-        <w:t xml:space="preserve">, Winkowski, S., &amp; Willing, C. </w:t>
-      </w:r>
-      <w:r>
-        <w:rPr>
-          <w:i/>
-          <w:iCs/>
-        </w:rPr>
-        <w:t xml:space="preserve">WindsOfChange: A New Toolkit for Modeling Spore Dispersal in Hilly Terrains</w:t>
-      </w:r>
-      <w:r>
-        <w:t xml:space="preserve">, in prep.</w:t>
-      </w:r>
-    </w:p>
-    <w:p>
-      <w:pPr>
-        <w:spacing w:after="20"/>
-        <w:ind w:left="300" w:hanging="300"/>
-      </w:pPr>
-      <w:r>
-        <w:t xml:space="preserve">[9] Davis, Z., </w:t>
-      </w:r>
-      <w:r>
-        <w:rPr>
-          <w:b/>
-          <w:bCs/>
-        </w:rPr>
-        <w:t xml:space="preserve">Rueda-Becerril, J. M.</w:t>
-      </w:r>
-      <w:r>
-        <w:t xml:space="preserve">, &amp; Giannios, D. </w:t>
-      </w:r>
-      <w:r>
-        <w:rPr>
-          <w:i/>
-          <w:iCs/>
-        </w:rPr>
-        <w:t xml:space="preserve">Tleco: A Toolkit for Modeling Radiative Signatures from Relativistic Outflows</w:t>
-      </w:r>
-      <w:r>
-        <w:t xml:space="preserve">, </w:t>
-      </w:r>
-      <w:hyperlink w:history="1" r:id="rIdvo8jx-j6mxhin_e032aar">
-        <w:r>
-          <w:t xml:space="preserve">ApJ 976, 182 (2024)</w:t>
-        </w:r>
-      </w:hyperlink>
-      <w:r>
-        <w:t xml:space="preserve">, </w:t>
-      </w:r>
-      <w:hyperlink w:history="1" r:id="rIdzjivwkfkesq-9glu_5obo">
-        <w:r>
-          <w:t xml:space="preserve">arXiv:2405.17581</w:t>
-        </w:r>
-      </w:hyperlink>
-      <w:r>
-        <w:t xml:space="preserve">.</w:t>
-      </w:r>
-    </w:p>
-    <w:p>
-      <w:pPr>
-        <w:spacing w:after="20"/>
-        <w:ind w:left="300" w:hanging="300"/>
-      </w:pPr>
-      <w:r>
-        <w:t xml:space="preserve">[8] Davis, Z., </w:t>
-      </w:r>
-      <w:r>
-        <w:rPr>
-          <w:b/>
-          <w:bCs/>
-        </w:rPr>
-        <w:t xml:space="preserve">Rueda-Becerril, J. M.</w:t>
-      </w:r>
-      <w:r>
-        <w:t xml:space="preserve">, &amp; Giannios, D. </w:t>
-      </w:r>
-      <w:r>
-        <w:rPr>
-          <w:i/>
-          <w:iCs/>
-        </w:rPr>
-        <w:t xml:space="preserve">Balancing Turbulent Heating with Radiative Cooling in Blazars</w:t>
-      </w:r>
-      <w:r>
-        <w:t xml:space="preserve">, </w:t>
-      </w:r>
-      <w:hyperlink w:history="1" r:id="rId8tvcxfvbo6uyxf4neweoy">
-        <w:r>
-          <w:t xml:space="preserve">MNRAS 513, 5766–5779 (2022)</w:t>
-        </w:r>
-      </w:hyperlink>
-      <w:r>
-        <w:t xml:space="preserve">, </w:t>
-      </w:r>
-      <w:hyperlink w:history="1" r:id="rIdlsopgvlbiijj_bboq5kjm">
-        <w:r>
-          <w:t xml:space="preserve">arXiv:2201.07790</w:t>
-        </w:r>
-      </w:hyperlink>
-      <w:r>
-        <w:t xml:space="preserve">.</w:t>
-      </w:r>
-    </w:p>
-    <w:p>
-      <w:pPr>
-        <w:spacing w:after="20"/>
-        <w:ind w:left="300" w:hanging="300"/>
-      </w:pPr>
-      <w:r>
-        <w:t xml:space="preserve">[7] Lopez-Armengol, F. G., Etienne, Z. B., [...], </w:t>
-      </w:r>
-      <w:r>
-        <w:rPr>
-          <w:b/>
-          <w:bCs/>
-        </w:rPr>
-        <w:t xml:space="preserve">Rueda-Becerril, J. M.</w:t>
-      </w:r>
-      <w:r>
-        <w:t xml:space="preserve">, [...] </w:t>
-      </w:r>
-      <w:r>
-        <w:rPr>
-          <w:i/>
-          <w:iCs/>
-        </w:rPr>
-        <w:t xml:space="preserve">Handing off the outcome of binary neutron star mergers for accurate and long-term postmerger simulations</w:t>
-      </w:r>
-      <w:r>
-        <w:t xml:space="preserve">, </w:t>
-      </w:r>
-      <w:hyperlink w:history="1" r:id="rIdcjc1_yju2zd620lrtdqbs">
-        <w:r>
-          <w:t xml:space="preserve">Phys. Rev. D 106, 083015 (2022)</w:t>
-        </w:r>
-      </w:hyperlink>
-      <w:r>
-        <w:t xml:space="preserve">, </w:t>
-      </w:r>
-      <w:hyperlink w:history="1" r:id="rIdkant7qvldrh4_oxkrgx4f">
-        <w:r>
-          <w:t xml:space="preserve">arXiv:2112.09817</w:t>
-        </w:r>
-      </w:hyperlink>
-      <w:r>
-        <w:t xml:space="preserve">.</w:t>
-      </w:r>
-    </w:p>
-    <w:p>
-      <w:pPr>
-        <w:spacing w:after="20"/>
-        <w:ind w:left="300" w:hanging="300"/>
-      </w:pPr>
-      <w:r>
-        <w:t xml:space="preserve">[6] Murguia-Berthier, A., Noble, S., [...], </w:t>
-      </w:r>
-      <w:r>
-        <w:rPr>
-          <w:b/>
-          <w:bCs/>
-        </w:rPr>
-        <w:t xml:space="preserve">Rueda-Becerril, J. M.</w:t>
-      </w:r>
-      <w:r>
-        <w:t xml:space="preserve">, [...] </w:t>
-      </w:r>
-      <w:r>
-        <w:rPr>
-          <w:i/>
-          <w:iCs/>
-        </w:rPr>
-        <w:t xml:space="preserve">HARM3D+NUC: A New Method for Simulating the Post-merger Phase of Binary Neutron Star Mergers with GRMHD, Tabulated EOS, and Neutrino Leakage</w:t>
-      </w:r>
-      <w:r>
-        <w:t xml:space="preserve">, </w:t>
-      </w:r>
-      <w:hyperlink w:history="1" r:id="rIdkk-bw-c_2v3yptgevaqav">
-        <w:r>
-          <w:t xml:space="preserve">ApJ 919, 95 (2021)</w:t>
-        </w:r>
-      </w:hyperlink>
-      <w:r>
-        <w:t xml:space="preserve">, </w:t>
-      </w:r>
-      <w:hyperlink w:history="1" r:id="rIde0had3g4t7vm4mvh7dqz3">
-        <w:r>
-          <w:t xml:space="preserve">arXiv:2106.05356</w:t>
-        </w:r>
-      </w:hyperlink>
-      <w:r>
-        <w:t xml:space="preserve">.</w:t>
-      </w:r>
-    </w:p>
-    <w:p>
-      <w:pPr>
-        <w:spacing w:after="20"/>
-        <w:ind w:left="300" w:hanging="300"/>
-      </w:pPr>
-      <w:r>
-        <w:t xml:space="preserve">[5] </w:t>
-      </w:r>
-      <w:r>
-        <w:rPr>
-          <w:b/>
-          <w:bCs/>
-        </w:rPr>
-        <w:t xml:space="preserve">Rueda-Becerril, J. M.</w:t>
-      </w:r>
-      <w:r>
-        <w:t xml:space="preserve">, Harrison, A. O., &amp; Giannios, D. </w:t>
-      </w:r>
-      <w:r>
-        <w:rPr>
-          <w:i/>
-          <w:iCs/>
-        </w:rPr>
-        <w:t xml:space="preserve">Blazar jets launched with similar energy per baryon, independently of their power</w:t>
-      </w:r>
-      <w:r>
-        <w:t xml:space="preserve">, </w:t>
-      </w:r>
-      <w:hyperlink w:history="1" r:id="rIdays7w_grtimcnul1ml_qi">
-        <w:r>
-          <w:t xml:space="preserve">MNRAS 501, 4092–4102 (2021)</w:t>
-        </w:r>
-      </w:hyperlink>
-      <w:r>
-        <w:t xml:space="preserve">, </w:t>
-      </w:r>
-      <w:hyperlink w:history="1" r:id="rIdefe9smaiiyes7btskd-t4">
-        <w:r>
-          <w:t xml:space="preserve">arXiv:2009.02273</w:t>
-        </w:r>
-      </w:hyperlink>
-      <w:r>
-        <w:t xml:space="preserve">.</w:t>
-      </w:r>
-    </w:p>
-    <w:p>
-      <w:pPr>
-        <w:spacing w:after="20"/>
-        <w:ind w:left="300" w:hanging="300"/>
-      </w:pPr>
-      <w:r>
-        <w:t xml:space="preserve">[4] Zhang, H., Christie, I., Petropoulou, M., </w:t>
-      </w:r>
-      <w:r>
-        <w:rPr>
-          <w:b/>
-          <w:bCs/>
-        </w:rPr>
-        <w:t xml:space="preserve">Rueda-Becerril, J. M.</w:t>
-      </w:r>
-      <w:r>
-        <w:t xml:space="preserve">, &amp; Giannios, D. </w:t>
-      </w:r>
-      <w:r>
-        <w:rPr>
-          <w:i/>
-          <w:iCs/>
-        </w:rPr>
-        <w:t xml:space="preserve">Inverse Compton Signatures of Gamma-Ray Burst Afterglows</w:t>
-      </w:r>
-      <w:r>
-        <w:t xml:space="preserve">, </w:t>
-      </w:r>
-      <w:hyperlink w:history="1" r:id="rIdwj2hvydmypqxkyy5pnclh">
-        <w:r>
-          <w:t xml:space="preserve">MNRAS 496, 974–986 (2020)</w:t>
-        </w:r>
-      </w:hyperlink>
-      <w:r>
-        <w:t xml:space="preserve">, </w:t>
-      </w:r>
-      <w:hyperlink w:history="1" r:id="rIditr9rjjo99nmb_xnzjh7b">
-        <w:r>
-          <w:t xml:space="preserve">arXiv:1910.14049</w:t>
-        </w:r>
-      </w:hyperlink>
-      <w:r>
-        <w:t xml:space="preserve">.</w:t>
-      </w:r>
-    </w:p>
-    <w:p>
-      <w:pPr>
-        <w:spacing w:after="20"/>
-        <w:ind w:left="300" w:hanging="300"/>
-      </w:pPr>
-      <w:r>
-        <w:t xml:space="preserve">[3] </w:t>
-      </w:r>
-      <w:r>
-        <w:rPr>
-          <w:b/>
-          <w:bCs/>
-        </w:rPr>
-        <w:t xml:space="preserve">Rueda-Becerril, J. M.</w:t>
-      </w:r>
-      <w:r>
-        <w:t xml:space="preserve">, Mimica, P., &amp; Aloy, M. A. </w:t>
-      </w:r>
-      <w:r>
-        <w:rPr>
-          <w:i/>
-          <w:iCs/>
-        </w:rPr>
-        <w:t xml:space="preserve">On the influence of a hybrid thermal–non-thermal distribution in the internal shocks model for blazars</w:t>
-      </w:r>
-      <w:r>
-        <w:t xml:space="preserve">, </w:t>
-      </w:r>
-      <w:hyperlink w:history="1" r:id="rId8w4g5erirdf8dlqopuwc3">
-        <w:r>
-          <w:t xml:space="preserve">MNRAS 468, 1169–1182 (2017)</w:t>
-        </w:r>
-      </w:hyperlink>
-      <w:r>
-        <w:t xml:space="preserve">, </w:t>
-      </w:r>
-      <w:hyperlink w:history="1" r:id="rIdxwroueg2ufg8865wxs8_j">
-        <w:r>
-          <w:t xml:space="preserve">arXiv:1612.06383</w:t>
-        </w:r>
-      </w:hyperlink>
-      <w:r>
-        <w:t xml:space="preserve">.</w:t>
-      </w:r>
-    </w:p>
-    <w:p>
-      <w:pPr>
-        <w:spacing w:after="20"/>
-        <w:ind w:left="300" w:hanging="300"/>
-      </w:pPr>
-      <w:r>
-        <w:t xml:space="preserve">[2] </w:t>
-      </w:r>
-      <w:r>
-        <w:rPr>
-          <w:b/>
-          <w:bCs/>
-        </w:rPr>
-        <w:t xml:space="preserve">Rueda-Becerril, J. M.</w:t>
-      </w:r>
-      <w:r>
-        <w:t xml:space="preserve">, Mimica, P., &amp; Aloy, M. A. </w:t>
-      </w:r>
-      <w:r>
-        <w:rPr>
-          <w:i/>
-          <w:iCs/>
-        </w:rPr>
-        <w:t xml:space="preserve">The influence of the magnetic field on the spectral properties of blazars</w:t>
-      </w:r>
-      <w:r>
-        <w:t xml:space="preserve">, </w:t>
-      </w:r>
-      <w:hyperlink w:history="1" r:id="rIdmjvyty2hitz25nygxps8c">
-        <w:r>
-          <w:t xml:space="preserve">MNRAS 438, 1856–1869 (2014)</w:t>
-        </w:r>
-      </w:hyperlink>
-      <w:r>
-        <w:t xml:space="preserve">, </w:t>
-      </w:r>
-      <w:hyperlink w:history="1" r:id="rIdv71seetefoue-_60ibiwx">
-        <w:r>
-          <w:t xml:space="preserve">arXiv:1310.5441</w:t>
-        </w:r>
-      </w:hyperlink>
-      <w:r>
-        <w:t xml:space="preserve">.</w:t>
-      </w:r>
-    </w:p>
-    <w:p>
-      <w:pPr>
-        <w:spacing w:after="20"/>
-        <w:ind w:left="300" w:hanging="300"/>
-      </w:pPr>
-      <w:r>
-        <w:t xml:space="preserve">[1] Guzmán, F. S., &amp; </w:t>
-      </w:r>
-      <w:r>
-        <w:rPr>
-          <w:b/>
-          <w:bCs/>
-        </w:rPr>
-        <w:t xml:space="preserve">Rueda-Becerril, J. M.</w:t>
-      </w:r>
-      <w:r>
-        <w:t xml:space="preserve"> </w:t>
-      </w:r>
-      <w:r>
-        <w:rPr>
-          <w:i/>
-          <w:iCs/>
-        </w:rPr>
-        <w:t xml:space="preserve">Spherical boson stars as black hole mimickers</w:t>
-      </w:r>
-      <w:r>
-        <w:t xml:space="preserve">, </w:t>
-      </w:r>
-      <w:hyperlink w:history="1" r:id="rIdumerxnfmtj855arsr5hex">
-        <w:r>
-          <w:t xml:space="preserve">Phys. Rev. D 80, 084023 (2009)</w:t>
-        </w:r>
-      </w:hyperlink>
-      <w:r>
-        <w:t xml:space="preserve">, </w:t>
-      </w:r>
-      <w:hyperlink w:history="1" r:id="rId5azwaskgjm5oedfvzz8ar">
-        <w:r>
-          <w:t xml:space="preserve">arXiv:1009.1250</w:t>
-        </w:r>
-      </w:hyperlink>
-      <w:r>
-        <w:t xml:space="preserve">.</w:t>
-      </w:r>
-    </w:p>
-    <w:p>
-      <w:pPr>
-        <w:pStyle w:val="Heading2"/>
-      </w:pPr>
-      <w:r>
-        <w:t xml:space="preserve">Conference Proceedings</w:t>
-      </w:r>
-    </w:p>
-    <w:p>
-      <w:pPr>
-        <w:spacing w:after="20"/>
-        <w:ind w:left="300" w:hanging="300"/>
-      </w:pPr>
-      <w:r>
-        <w:t xml:space="preserve">[P5] </w:t>
-      </w:r>
-      <w:r>
-        <w:rPr>
-          <w:b/>
-          <w:bCs/>
-        </w:rPr>
-        <w:t xml:space="preserve">Rueda-Becerril, J. M.</w:t>
-      </w:r>
-      <w:r>
-        <w:t xml:space="preserve"> </w:t>
-      </w:r>
-      <w:r>
-        <w:rPr>
-          <w:i/>
-          <w:iCs/>
-        </w:rPr>
-        <w:t xml:space="preserve">A numerical approach for radiative cooling in relativistic outflows</w:t>
-      </w:r>
-      <w:r>
-        <w:t xml:space="preserve">, </w:t>
-      </w:r>
-      <w:hyperlink w:history="1" r:id="rId1bj3mbssi3cdhipzx1mcd">
-        <w:r>
-          <w:t xml:space="preserve">Astron. Nachr. 342, 277–282 (2021)</w:t>
-        </w:r>
-      </w:hyperlink>
-      <w:r>
-        <w:t xml:space="preserve">, 9th International Workshop on Astronomy and Relativistic Astrophysics, </w:t>
-      </w:r>
-      <w:hyperlink w:history="1" r:id="rIdsa6yaqj4o5k7ggvsmdprm">
-        <w:r>
-          <w:t xml:space="preserve">arXiv:2011.13797</w:t>
-        </w:r>
-      </w:hyperlink>
-      <w:r>
-        <w:t xml:space="preserve">.</w:t>
-      </w:r>
-    </w:p>
-    <w:p>
-      <w:pPr>
-        <w:spacing w:after="20"/>
-        <w:ind w:left="300" w:hanging="300"/>
-      </w:pPr>
-      <w:r>
-        <w:t xml:space="preserve">[P4] </w:t>
-      </w:r>
-      <w:r>
-        <w:rPr>
-          <w:b/>
-          <w:bCs/>
-        </w:rPr>
-        <w:t xml:space="preserve">Rueda-Becerril, J. M.</w:t>
-      </w:r>
-      <w:r>
-        <w:t xml:space="preserve">, Harrison, A. O., &amp; Giannios, D. </w:t>
-      </w:r>
-      <w:r>
-        <w:rPr>
-          <w:i/>
-          <w:iCs/>
-        </w:rPr>
-        <w:t xml:space="preserve">The blazar sequence revised</w:t>
-      </w:r>
-      <w:r>
-        <w:t xml:space="preserve">, </w:t>
-      </w:r>
-      <w:hyperlink w:history="1" r:id="rIdgpwzeebjdgiev0zgohdxs">
-        <w:r>
-          <w:t xml:space="preserve">Astron. Nachr. 342, 147–152 (2021)</w:t>
-        </w:r>
-      </w:hyperlink>
-      <w:r>
-        <w:t xml:space="preserve">, 9th International Workshop on Astronomy and Relativistic Astrophysics, </w:t>
-      </w:r>
-      <w:hyperlink w:history="1" r:id="rIdbqervhsbtkqyzns6sd73g">
-        <w:r>
-          <w:t xml:space="preserve">arXiv:2011.13805</w:t>
-        </w:r>
-      </w:hyperlink>
-      <w:r>
-        <w:t xml:space="preserve">.</w:t>
-      </w:r>
-    </w:p>
-    <w:p>
-      <w:pPr>
-        <w:spacing w:after="20"/>
-        <w:ind w:left="300" w:hanging="300"/>
-      </w:pPr>
-      <w:r>
-        <w:t xml:space="preserve">[P3] </w:t>
-      </w:r>
-      <w:r>
-        <w:rPr>
-          <w:b/>
-          <w:bCs/>
-        </w:rPr>
-        <w:t xml:space="preserve">Rueda-Becerril, J. M.</w:t>
-      </w:r>
-      <w:r>
-        <w:t xml:space="preserve">, Mimica, P., &amp; Aloy, M. A. </w:t>
-      </w:r>
-      <w:r>
-        <w:rPr>
-          <w:i/>
-          <w:iCs/>
-        </w:rPr>
-        <w:t xml:space="preserve">Numerical simulations of the internal shock model in magnetized relativistic jets of blazars</w:t>
-      </w:r>
-      <w:r>
-        <w:t xml:space="preserve">, </w:t>
-      </w:r>
-      <w:hyperlink w:history="1" r:id="rIdajkolvivmdez4t4ydzib7">
-        <w:r>
-          <w:t xml:space="preserve">PoS(SWIFT 10) 233, 159 (2014)</w:t>
-        </w:r>
-      </w:hyperlink>
-      <w:r>
-        <w:t xml:space="preserve">, </w:t>
-      </w:r>
-      <w:hyperlink w:history="1" r:id="rId7ncoaphptj7cxibp1nq0f">
-        <w:r>
-          <w:t xml:space="preserve">arXiv:1502.07882</w:t>
-        </w:r>
-      </w:hyperlink>
-      <w:r>
-        <w:t xml:space="preserve">.</w:t>
-      </w:r>
-    </w:p>
-    <w:p>
-      <w:pPr>
-        <w:spacing w:after="20"/>
-        <w:ind w:left="300" w:hanging="300"/>
-      </w:pPr>
-      <w:r>
-        <w:t xml:space="preserve">[P2] </w:t>
-      </w:r>
-      <w:r>
-        <w:rPr>
-          <w:b/>
-          <w:bCs/>
-        </w:rPr>
-        <w:t xml:space="preserve">Rueda-Becerril, J. M.</w:t>
-      </w:r>
-      <w:r>
-        <w:t xml:space="preserve">, Mimica, P., Aloy, M. A., &amp; Aloy, C. </w:t>
-      </w:r>
-      <w:r>
-        <w:rPr>
-          <w:i/>
-          <w:iCs/>
-        </w:rPr>
-        <w:t xml:space="preserve">Numerical study of broadband spectra caused by internal shocks in magnetized relativistic jets of blazars</w:t>
-      </w:r>
-      <w:r>
-        <w:t xml:space="preserve">, </w:t>
-      </w:r>
-      <w:hyperlink w:history="1" r:id="rIdk4bj0uo4toku7-kp0dqhu">
-        <w:r>
-          <w:t xml:space="preserve">EPJ Web Conf. 61, 02007 (2013)</w:t>
-        </w:r>
-      </w:hyperlink>
-      <w:r>
-        <w:t xml:space="preserve">, </w:t>
-      </w:r>
-      <w:hyperlink w:history="1" r:id="rId1whqculvk6uvgsp1a5rmj">
-        <w:r>
-          <w:t xml:space="preserve">arXiv:1309.4612</w:t>
-        </w:r>
-      </w:hyperlink>
-      <w:r>
-        <w:t xml:space="preserve">.</w:t>
-      </w:r>
-    </w:p>
-    <w:p>
-      <w:pPr>
-        <w:spacing w:after="20"/>
-        <w:ind w:left="300" w:hanging="300"/>
-      </w:pPr>
-      <w:r>
-        <w:t xml:space="preserve">[P1] Mimica, P., Aloy, M. A., </w:t>
-      </w:r>
-      <w:r>
-        <w:rPr>
-          <w:b/>
-          <w:bCs/>
-        </w:rPr>
-        <w:t xml:space="preserve">Rueda-Becerril, J. M.</w:t>
-      </w:r>
-      <w:r>
-        <w:t xml:space="preserve">, Tabik, S., &amp; Aloy, C. </w:t>
-      </w:r>
-      <w:r>
-        <w:rPr>
-          <w:i/>
-          <w:iCs/>
-        </w:rPr>
-        <w:t xml:space="preserve">Numerical simulations of dynamics and emission from relativistic astrophysical jets</w:t>
-      </w:r>
-      <w:r>
-        <w:t xml:space="preserve">, </w:t>
-      </w:r>
-      <w:hyperlink w:history="1" r:id="rIdhyal-0ujta9umrar_wxs0">
-        <w:r>
-          <w:t xml:space="preserve">J. Phys.: Conf. Ser. 454, 012001 (2013)</w:t>
-        </w:r>
-      </w:hyperlink>
-      <w:r>
-        <w:t xml:space="preserve">, </w:t>
-      </w:r>
-      <w:hyperlink w:history="1" r:id="rIdvbs0qyo9-oslixkxjcteb">
-        <w:r>
-          <w:t xml:space="preserve">arXiv:1211.1794</w:t>
-        </w:r>
-      </w:hyperlink>
-      <w:r>
-        <w:t xml:space="preserve">.</w:t>
-      </w:r>
-    </w:p>
-    <w:p>
-      <w:pPr>
-        <w:pStyle w:val="Heading1"/>
-      </w:pPr>
-      <w:r>
-        <w:t xml:space="preserve">Grants and Fellowships</w:t>
-      </w:r>
-    </w:p>
-    <w:p>
-      <w:pPr>
-        <w:pStyle w:val="Heading2"/>
-      </w:pPr>
-      <w:r>
-        <w:t xml:space="preserve">Research Grants</w:t>
-      </w:r>
-    </w:p>
-    <w:p>
-      <w:pPr>
-        <w:keepNext/>
-        <w:tabs>
-          <w:tab w:val="right" w:pos="10512"/>
-        </w:tabs>
-        <w:spacing w:after="0"/>
-      </w:pPr>
-      <w:r>
-        <w:rPr>
-          <w:b/>
-          <w:bCs/>
-        </w:rPr>
-        <w:t xml:space="preserve">NASA Fermi Guest Investigator Program, Cycle 12</w:t>
-      </w:r>
-      <w:r>
-        <w:tab/>
-      </w:r>
-      <w:r>
-        <w:t xml:space="preserve">2019</w:t>
-      </w:r>
-    </w:p>
-    <w:p>
-      <w:pPr>
-        <w:keepNext/>
-        <w:tabs>
-          <w:tab w:val="right" w:pos="10512"/>
-        </w:tabs>
-        <w:spacing w:after="0"/>
-      </w:pPr>
-      <w:r>
-        <w:rPr>
-          <w:i/>
-          <w:iCs/>
-        </w:rPr>
-        <w:t xml:space="preserve">A simple model to understand the blazar sequence</w:t>
-      </w:r>
-      <w:r>
-        <w:tab/>
-      </w:r>
-      <w:r>
-        <w:t xml:space="preserve">Grant #121077, $68K</w:t>
-      </w:r>
-    </w:p>
-    <w:p>
-      <w:pPr>
-        <w:spacing w:after="0"/>
-      </w:pPr>
-      <w:r>
-        <w:t xml:space="preserve">PI: D. Giannios; Co-I: J. M. Rueda-Becerril</w:t>
-      </w:r>
-    </w:p>
-    <w:p>
-      <w:pPr>
-        <w:pStyle w:val="EntryGap"/>
-        <w:spacing w:after="0"/>
-      </w:pPr>
-    </w:p>
-    <w:p>
-      <w:pPr>
-        <w:pStyle w:val="Heading2"/>
-      </w:pPr>
-      <w:r>
-        <w:t xml:space="preserve">Fellowships</w:t>
-      </w:r>
-    </w:p>
-    <w:p>
-      <w:pPr>
-        <w:keepNext/>
-        <w:tabs>
-          <w:tab w:val="right" w:pos="10512"/>
-        </w:tabs>
-        <w:spacing w:after="0"/>
-      </w:pPr>
-      <w:r>
-        <w:rPr>
-          <w:b/>
-          <w:bCs/>
-        </w:rPr>
-        <w:t xml:space="preserve">International Postdoctoral Fellowship</w:t>
-      </w:r>
-      <w:r>
-        <w:tab/>
-      </w:r>
-      <w:r>
-        <w:t xml:space="preserve">Oct 2018 – Nov 2020</w:t>
-      </w:r>
-    </w:p>
-    <w:p>
-      <w:pPr>
-        <w:keepNext/>
-        <w:tabs>
-          <w:tab w:val="right" w:pos="10512"/>
-        </w:tabs>
-        <w:spacing w:after="0"/>
-      </w:pPr>
-      <w:r>
-        <w:rPr>
-          <w:i/>
-          <w:iCs/>
-        </w:rPr>
-        <w:t xml:space="preserve">National Council of Science and Technology (CONACyT), Mexico</w:t>
-      </w:r>
-    </w:p>
-    <w:p>
-      <w:pPr>
-        <w:pStyle w:val="EntryGap"/>
-        <w:spacing w:after="0"/>
-      </w:pPr>
-    </w:p>
-    <w:p>
-      <w:pPr>
-        <w:keepNext/>
-        <w:tabs>
-          <w:tab w:val="right" w:pos="10512"/>
-        </w:tabs>
-        <w:spacing w:after="0"/>
-      </w:pPr>
-      <w:r>
-        <w:rPr>
-          <w:b/>
-          <w:bCs/>
-        </w:rPr>
-        <w:t xml:space="preserve">Postdoctoral Fellowship</w:t>
-      </w:r>
-      <w:r>
-        <w:tab/>
-      </w:r>
-      <w:r>
-        <w:t xml:space="preserve">Jan 2018 – Sep 2018</w:t>
-      </w:r>
-    </w:p>
-    <w:p>
-      <w:pPr>
-        <w:keepNext/>
-        <w:tabs>
-          <w:tab w:val="right" w:pos="10512"/>
-        </w:tabs>
-        <w:spacing w:after="0"/>
-      </w:pPr>
-      <w:r>
-        <w:rPr>
-          <w:i/>
-          <w:iCs/>
-        </w:rPr>
-        <w:t xml:space="preserve">Secretariat of Public Education, Mexico (Program for the Professional Development of Higher Education Institutions)</w:t>
-      </w:r>
-    </w:p>
-    <w:p>
-      <w:pPr>
-        <w:pStyle w:val="EntryGap"/>
-        <w:spacing w:after="0"/>
-      </w:pPr>
-    </w:p>
-    <w:p>
-      <w:pPr>
-        <w:keepNext/>
-        <w:tabs>
-          <w:tab w:val="right" w:pos="10512"/>
-        </w:tabs>
-        <w:spacing w:after="0"/>
-      </w:pPr>
-      <w:r>
-        <w:rPr>
-          <w:b/>
-          <w:bCs/>
-        </w:rPr>
-        <w:t xml:space="preserve">Study-Abroad Fellowship</w:t>
-      </w:r>
-      <w:r>
-        <w:tab/>
-      </w:r>
-      <w:r>
-        <w:t xml:space="preserve">Sep 2014 – Aug 2016</w:t>
-      </w:r>
-    </w:p>
-    <w:p>
-      <w:pPr>
-        <w:keepNext/>
-        <w:tabs>
-          <w:tab w:val="right" w:pos="10512"/>
-        </w:tabs>
-        <w:spacing w:after="0"/>
-      </w:pPr>
-      <w:r>
-        <w:rPr>
-          <w:i/>
-          <w:iCs/>
-        </w:rPr>
-        <w:t xml:space="preserve">National Council of Science and Technology (CONACyT), Mexico</w:t>
-      </w:r>
-    </w:p>
-    <w:p>
-      <w:pPr>
-        <w:pStyle w:val="EntryGap"/>
-        <w:spacing w:after="0"/>
-      </w:pPr>
-    </w:p>
-    <w:p>
-      <w:pPr>
-        <w:keepNext/>
-        <w:tabs>
-          <w:tab w:val="right" w:pos="10512"/>
-        </w:tabs>
-        <w:spacing w:after="0"/>
-      </w:pPr>
-      <w:r>
-        <w:rPr>
-          <w:b/>
-          <w:bCs/>
-        </w:rPr>
-        <w:t xml:space="preserve">Santiago Grisolía Fellowship</w:t>
-      </w:r>
-      <w:r>
-        <w:tab/>
-      </w:r>
-      <w:r>
-        <w:t xml:space="preserve">Oct 2011 – Jun 2014</w:t>
-      </w:r>
-    </w:p>
-    <w:p>
-      <w:pPr>
-        <w:keepNext/>
-        <w:tabs>
-          <w:tab w:val="right" w:pos="10512"/>
-        </w:tabs>
-        <w:spacing w:after="0"/>
-      </w:pPr>
-      <w:r>
-        <w:rPr>
-          <w:i/>
-          <w:iCs/>
-        </w:rPr>
-        <w:t xml:space="preserve">Council of Education, Research, Culture and Sport, Valencian Community, Spain</w:t>
-      </w:r>
-    </w:p>
-    <w:p>
-      <w:pPr>
-        <w:pStyle w:val="EntryGap"/>
-        <w:spacing w:after="0"/>
-      </w:pPr>
-    </w:p>
-    <w:p>
-      <w:pPr>
-        <w:keepNext/>
-        <w:tabs>
-          <w:tab w:val="right" w:pos="10512"/>
-        </w:tabs>
-        <w:spacing w:after="0"/>
-      </w:pPr>
-      <w:r>
-        <w:rPr>
-          <w:b/>
-          <w:bCs/>
-        </w:rPr>
-        <w:t xml:space="preserve">M.Sc. Fellowship</w:t>
-      </w:r>
-      <w:r>
-        <w:tab/>
-      </w:r>
-      <w:r>
-        <w:t xml:space="preserve">Sep 2009 – Aug 2011</w:t>
-      </w:r>
-    </w:p>
-    <w:p>
-      <w:pPr>
-        <w:keepNext/>
-        <w:tabs>
-          <w:tab w:val="right" w:pos="10512"/>
-        </w:tabs>
-        <w:spacing w:after="0"/>
-      </w:pPr>
-      <w:r>
-        <w:rPr>
-          <w:i/>
-          <w:iCs/>
-        </w:rPr>
-        <w:t xml:space="preserve">CONACyT, at the Institute of Physics and Mathematics, Universidad Michoacana de San Nicolás de Hidalgo</w:t>
-      </w:r>
-    </w:p>
-    <w:p>
-      <w:pPr>
-        <w:pStyle w:val="EntryGap"/>
-        <w:spacing w:after="0"/>
-      </w:pPr>
-    </w:p>
-    <w:p>
-      <w:pPr>
-        <w:keepNext/>
-        <w:tabs>
-          <w:tab w:val="right" w:pos="10512"/>
-        </w:tabs>
-        <w:spacing w:after="0"/>
-      </w:pPr>
-      <w:r>
-        <w:rPr>
-          <w:b/>
-          <w:bCs/>
-        </w:rPr>
-        <w:t xml:space="preserve">Summer Research Fellowship (XVII Summer of Scientific Research)</w:t>
-      </w:r>
-      <w:r>
-        <w:tab/>
-      </w:r>
-      <w:r>
-        <w:t xml:space="preserve">Jun 2007 – Aug 2007</w:t>
-      </w:r>
-    </w:p>
-    <w:p>
-      <w:pPr>
-        <w:keepNext/>
-        <w:tabs>
-          <w:tab w:val="right" w:pos="10512"/>
-        </w:tabs>
-        <w:spacing w:after="0"/>
-      </w:pPr>
-      <w:r>
-        <w:rPr>
-          <w:i/>
-          <w:iCs/>
-        </w:rPr>
-        <w:t xml:space="preserve">Mexican Academy of Sciences</w:t>
-      </w:r>
-    </w:p>
-    <w:p>
-      <w:pPr>
-        <w:pStyle w:val="EntryGap"/>
-        <w:spacing w:after="0"/>
-      </w:pPr>
-    </w:p>
-    <w:p>
-      <w:pPr>
-        <w:pStyle w:val="Heading1"/>
-      </w:pPr>
-      <w:r>
-        <w:t xml:space="preserve">Software and Projects</w:t>
-      </w:r>
-    </w:p>
-    <w:p>
-      <w:pPr>
-        <w:keepNext/>
-        <w:tabs>
-          <w:tab w:val="right" w:pos="10512"/>
-        </w:tabs>
-        <w:spacing w:after="0"/>
-      </w:pPr>
-      <w:r>
-        <w:rPr>
-          <w:b/>
-          <w:bCs/>
-        </w:rPr>
-        <w:t xml:space="preserve">Blazar Population ML</w:t>
-      </w:r>
-      <w:r>
-        <w:tab/>
-      </w:r>
-      <w:r>
-        <w:t xml:space="preserve">Jan 2026 – Present</w:t>
-      </w:r>
-    </w:p>
-    <w:p>
-      <w:pPr>
-        <w:keepNext/>
-        <w:tabs>
-          <w:tab w:val="right" w:pos="10512"/>
-        </w:tabs>
-        <w:spacing w:after="0"/>
-      </w:pPr>
-      <w:r>
-        <w:rPr>
-          <w:i/>
-          <w:iCs/>
-        </w:rPr>
-        <w:t xml:space="preserve">Scientific ML (Python, scikit-learn, PyTorch)</w:t>
-      </w:r>
-      <w:r>
-        <w:tab/>
-      </w:r>
-      <w:hyperlink w:history="1" r:id="rIdv7holt-gwhzvphrxask5d">
-        <w:r>
-          <w:t xml:space="preserve">github.com/altjerue/ilwikak-ml</w:t>
-        </w:r>
-      </w:hyperlink>
+        <w:t xml:space="preserve">Extended C-SPEV to compute discrete and continuous spectra from particle distributions of arbitrary shape, without affecting simulation runtime.</w:t>
+      </w:r>
     </w:p>
     <w:p>
       <w:pPr>
@@ -2436,8 +1041,1403 @@
         <w:spacing w:after="10"/>
       </w:pPr>
       <w:r>
-        <w:t xml:space="preserve">Applying classical ML and Bayesian inference to the Fermi-LAT 4LAC-DR3 catalog (3,407 sources) to recover physical jet parameters from multi-wavelength data.</w:t>
-      </w:r>
+        <w:t xml:space="preserve">Published 2 first-author papers in MNRAS [2, 3].</w:t>
+      </w:r>
+    </w:p>
+    <w:p>
+      <w:pPr>
+        <w:pStyle w:val="EntryGap"/>
+        <w:spacing w:after="0"/>
+      </w:pPr>
+    </w:p>
+    <w:p>
+      <w:pPr>
+        <w:pStyle w:val="Heading1"/>
+      </w:pPr>
+      <w:r>
+        <w:t xml:space="preserve">Education</w:t>
+      </w:r>
+    </w:p>
+    <w:p>
+      <w:pPr>
+        <w:keepNext/>
+        <w:tabs>
+          <w:tab w:val="right" w:pos="10512"/>
+        </w:tabs>
+        <w:spacing w:after="0"/>
+      </w:pPr>
+      <w:r>
+        <w:rPr>
+          <w:b/>
+          <w:bCs/>
+        </w:rPr>
+        <w:t xml:space="preserve">Ph.D. in Physics</w:t>
+      </w:r>
+      <w:r>
+        <w:tab/>
+      </w:r>
+      <w:r>
+        <w:t xml:space="preserve">Oct 2011 – Jul 2017</w:t>
+      </w:r>
+    </w:p>
+    <w:p>
+      <w:pPr>
+        <w:keepNext/>
+        <w:tabs>
+          <w:tab w:val="right" w:pos="10512"/>
+        </w:tabs>
+        <w:spacing w:after="0"/>
+      </w:pPr>
+      <w:r>
+        <w:rPr>
+          <w:i/>
+          <w:iCs/>
+        </w:rPr>
+        <w:t xml:space="preserve">Universitat de València</w:t>
+      </w:r>
+      <w:r>
+        <w:tab/>
+      </w:r>
+      <w:r>
+        <w:t xml:space="preserve">Valencia, Spain</w:t>
+      </w:r>
+    </w:p>
+    <w:p>
+      <w:pPr>
+        <w:spacing w:after="0"/>
+      </w:pPr>
+      <w:r>
+        <w:t xml:space="preserve">Excellent </w:t>
+      </w:r>
+      <w:r>
+        <w:rPr>
+          <w:i/>
+          <w:iCs/>
+        </w:rPr>
+        <w:t xml:space="preserve">cum laude</w:t>
+      </w:r>
+    </w:p>
+    <w:p>
+      <w:pPr>
+        <w:spacing w:after="0"/>
+      </w:pPr>
+      <w:r>
+        <w:t xml:space="preserve">Advisors: Prof. Miguel A. Aloy and Dr. Petar Mimica</w:t>
+      </w:r>
+    </w:p>
+    <w:p>
+      <w:pPr>
+        <w:spacing w:after="0"/>
+      </w:pPr>
+      <w:r>
+        <w:t xml:space="preserve">Thesis: </w:t>
+      </w:r>
+      <w:hyperlink w:history="1" r:id="rIdry8wy2fxfoopy8izal6tc">
+        <w:r>
+          <w:t xml:space="preserve">Numerical treatment of radiation processes in the internal shocks of magnetized relativistic outflows</w:t>
+        </w:r>
+      </w:hyperlink>
+    </w:p>
+    <w:p>
+      <w:pPr>
+        <w:pStyle w:val="EntryGap"/>
+        <w:spacing w:after="0"/>
+      </w:pPr>
+    </w:p>
+    <w:p>
+      <w:pPr>
+        <w:keepNext/>
+        <w:tabs>
+          <w:tab w:val="right" w:pos="10512"/>
+        </w:tabs>
+        <w:spacing w:after="0"/>
+      </w:pPr>
+      <w:r>
+        <w:rPr>
+          <w:b/>
+          <w:bCs/>
+        </w:rPr>
+        <w:t xml:space="preserve">M.Sc. in Physics</w:t>
+      </w:r>
+      <w:r>
+        <w:tab/>
+      </w:r>
+      <w:r>
+        <w:t xml:space="preserve">Aug 2009 – Sep 2011</w:t>
+      </w:r>
+    </w:p>
+    <w:p>
+      <w:pPr>
+        <w:keepNext/>
+        <w:tabs>
+          <w:tab w:val="right" w:pos="10512"/>
+        </w:tabs>
+        <w:spacing w:after="0"/>
+      </w:pPr>
+      <w:r>
+        <w:rPr>
+          <w:i/>
+          <w:iCs/>
+        </w:rPr>
+        <w:t xml:space="preserve">Universidad Michoacana de San Nicolás de Hidalgo</w:t>
+      </w:r>
+      <w:r>
+        <w:tab/>
+      </w:r>
+      <w:r>
+        <w:t xml:space="preserve">Morelia, Mexico</w:t>
+      </w:r>
+    </w:p>
+    <w:p>
+      <w:pPr>
+        <w:spacing w:after="0"/>
+      </w:pPr>
+      <w:r>
+        <w:t xml:space="preserve">Advisor: Prof. José A. Cervera</w:t>
+      </w:r>
+    </w:p>
+    <w:p>
+      <w:pPr>
+        <w:spacing w:after="0"/>
+      </w:pPr>
+      <w:r>
+        <w:t xml:space="preserve">Thesis: </w:t>
+      </w:r>
+      <w:r>
+        <w:rPr>
+          <w:i/>
+          <w:iCs/>
+        </w:rPr>
+        <w:t xml:space="preserve">Study of TOV stars with the SPH method</w:t>
+      </w:r>
+    </w:p>
+    <w:p>
+      <w:pPr>
+        <w:pStyle w:val="EntryGap"/>
+        <w:spacing w:after="0"/>
+      </w:pPr>
+    </w:p>
+    <w:p>
+      <w:pPr>
+        <w:keepNext/>
+        <w:tabs>
+          <w:tab w:val="right" w:pos="10512"/>
+        </w:tabs>
+        <w:spacing w:after="0"/>
+      </w:pPr>
+      <w:r>
+        <w:rPr>
+          <w:b/>
+          <w:bCs/>
+        </w:rPr>
+        <w:t xml:space="preserve">B.Sc. in Physics</w:t>
+      </w:r>
+      <w:r>
+        <w:tab/>
+      </w:r>
+      <w:r>
+        <w:t xml:space="preserve">Aug 2004 – Dec 2008</w:t>
+      </w:r>
+    </w:p>
+    <w:p>
+      <w:pPr>
+        <w:keepNext/>
+        <w:tabs>
+          <w:tab w:val="right" w:pos="10512"/>
+        </w:tabs>
+        <w:spacing w:after="0"/>
+      </w:pPr>
+      <w:r>
+        <w:rPr>
+          <w:i/>
+          <w:iCs/>
+        </w:rPr>
+        <w:t xml:space="preserve">Universidad Autónoma del Estado de México</w:t>
+      </w:r>
+      <w:r>
+        <w:tab/>
+      </w:r>
+      <w:r>
+        <w:t xml:space="preserve">Toluca, Mexico</w:t>
+      </w:r>
+    </w:p>
+    <w:p>
+      <w:pPr>
+        <w:spacing w:after="0"/>
+      </w:pPr>
+      <w:r>
+        <w:t xml:space="preserve">Advisor: Prof. Francisco S. Guzmán</w:t>
+      </w:r>
+    </w:p>
+    <w:p>
+      <w:pPr>
+        <w:spacing w:after="0"/>
+      </w:pPr>
+      <w:r>
+        <w:t xml:space="preserve">Thesis: </w:t>
+      </w:r>
+      <w:r>
+        <w:rPr>
+          <w:i/>
+          <w:iCs/>
+        </w:rPr>
+        <w:t xml:space="preserve">Numerical solution of null geodesics for the generation of gravitational lenses produced by spherically-symmetric and static spacetimes</w:t>
+      </w:r>
+    </w:p>
+    <w:p>
+      <w:pPr>
+        <w:spacing w:after="0"/>
+      </w:pPr>
+      <w:r>
+        <w:t xml:space="preserve">Lic. Juan Josafat Pichardo Cruz Award</w:t>
+      </w:r>
+    </w:p>
+    <w:p>
+      <w:pPr>
+        <w:pStyle w:val="EntryGap"/>
+        <w:spacing w:after="0"/>
+      </w:pPr>
+    </w:p>
+    <w:p>
+      <w:pPr>
+        <w:pStyle w:val="Heading1"/>
+      </w:pPr>
+      <w:r>
+        <w:t xml:space="preserve">Publications</w:t>
+      </w:r>
+    </w:p>
+    <w:p>
+      <w:pPr>
+        <w:pStyle w:val="Heading2"/>
+      </w:pPr>
+      <w:r>
+        <w:t xml:space="preserve">Articles (9 published, 3 first-author; 3 in preparation)</w:t>
+      </w:r>
+    </w:p>
+    <w:p>
+      <w:pPr>
+        <w:spacing w:after="20"/>
+        <w:ind w:left="300" w:hanging="300"/>
+      </w:pPr>
+      <w:r>
+        <w:t xml:space="preserve">[12] Winkowski, S., </w:t>
+      </w:r>
+      <w:r>
+        <w:rPr>
+          <w:b/>
+          <w:bCs/>
+        </w:rPr>
+        <w:t xml:space="preserve">Rueda-Becerril, J. M.</w:t>
+      </w:r>
+      <w:r>
+        <w:t xml:space="preserve">, &amp; Willing, C. </w:t>
+      </w:r>
+      <w:r>
+        <w:rPr>
+          <w:i/>
+          <w:iCs/>
+        </w:rPr>
+        <w:t xml:space="preserve">Using Numerical Simulations of Wind on Hilly Terrain to Model Propagule Dispersal</w:t>
+      </w:r>
+      <w:r>
+        <w:t xml:space="preserve">, in prep.</w:t>
+      </w:r>
+    </w:p>
+    <w:p>
+      <w:pPr>
+        <w:spacing w:after="20"/>
+        <w:ind w:left="300" w:hanging="300"/>
+      </w:pPr>
+      <w:r>
+        <w:t xml:space="preserve">[11] Holzman, L., </w:t>
+      </w:r>
+      <w:r>
+        <w:rPr>
+          <w:b/>
+          <w:bCs/>
+        </w:rPr>
+        <w:t xml:space="preserve">Rueda-Becerril, J. M.</w:t>
+      </w:r>
+      <w:r>
+        <w:t xml:space="preserve">, Creamer, C., &amp; Willing, C. </w:t>
+      </w:r>
+      <w:r>
+        <w:rPr>
+          <w:i/>
+          <w:iCs/>
+        </w:rPr>
+        <w:t xml:space="preserve">Random Forest Link Landscape Position to Drought Resilience in Giant Sequoia Forests</w:t>
+      </w:r>
+      <w:r>
+        <w:t xml:space="preserve">, in prep.</w:t>
+      </w:r>
+    </w:p>
+    <w:p>
+      <w:pPr>
+        <w:spacing w:after="20"/>
+        <w:ind w:left="300" w:hanging="300"/>
+      </w:pPr>
+      <w:r>
+        <w:t xml:space="preserve">[10] </w:t>
+      </w:r>
+      <w:r>
+        <w:rPr>
+          <w:b/>
+          <w:bCs/>
+        </w:rPr>
+        <w:t xml:space="preserve">Rueda-Becerril, J. M.</w:t>
+      </w:r>
+      <w:r>
+        <w:t xml:space="preserve">, Winkowski, S., &amp; Willing, C. </w:t>
+      </w:r>
+      <w:r>
+        <w:rPr>
+          <w:i/>
+          <w:iCs/>
+        </w:rPr>
+        <w:t xml:space="preserve">WindsOfChange: A New Toolkit for Modeling Spore Dispersal in Hilly Terrains</w:t>
+      </w:r>
+      <w:r>
+        <w:t xml:space="preserve">, in prep.</w:t>
+      </w:r>
+    </w:p>
+    <w:p>
+      <w:pPr>
+        <w:spacing w:after="20"/>
+        <w:ind w:left="300" w:hanging="300"/>
+      </w:pPr>
+      <w:r>
+        <w:t xml:space="preserve">[9] Davis, Z., </w:t>
+      </w:r>
+      <w:r>
+        <w:rPr>
+          <w:b/>
+          <w:bCs/>
+        </w:rPr>
+        <w:t xml:space="preserve">Rueda-Becerril, J. M.</w:t>
+      </w:r>
+      <w:r>
+        <w:t xml:space="preserve">, &amp; Giannios, D. </w:t>
+      </w:r>
+      <w:r>
+        <w:rPr>
+          <w:i/>
+          <w:iCs/>
+        </w:rPr>
+        <w:t xml:space="preserve">Tleco: A Toolkit for Modeling Radiative Signatures from Relativistic Outflows</w:t>
+      </w:r>
+      <w:r>
+        <w:t xml:space="preserve">, </w:t>
+      </w:r>
+      <w:hyperlink w:history="1" r:id="rIdthczanmoxgwti4pyba62m">
+        <w:r>
+          <w:t xml:space="preserve">ApJ 976, 182 (2024)</w:t>
+        </w:r>
+      </w:hyperlink>
+      <w:r>
+        <w:t xml:space="preserve">, </w:t>
+      </w:r>
+      <w:hyperlink w:history="1" r:id="rIdcapfidgdebdb75a-oydzv">
+        <w:r>
+          <w:t xml:space="preserve">arXiv:2405.17581</w:t>
+        </w:r>
+      </w:hyperlink>
+      <w:r>
+        <w:t xml:space="preserve">.</w:t>
+      </w:r>
+    </w:p>
+    <w:p>
+      <w:pPr>
+        <w:spacing w:after="20"/>
+        <w:ind w:left="300" w:hanging="300"/>
+      </w:pPr>
+      <w:r>
+        <w:t xml:space="preserve">[8] Davis, Z., </w:t>
+      </w:r>
+      <w:r>
+        <w:rPr>
+          <w:b/>
+          <w:bCs/>
+        </w:rPr>
+        <w:t xml:space="preserve">Rueda-Becerril, J. M.</w:t>
+      </w:r>
+      <w:r>
+        <w:t xml:space="preserve">, &amp; Giannios, D. </w:t>
+      </w:r>
+      <w:r>
+        <w:rPr>
+          <w:i/>
+          <w:iCs/>
+        </w:rPr>
+        <w:t xml:space="preserve">Balancing Turbulent Heating with Radiative Cooling in Blazars</w:t>
+      </w:r>
+      <w:r>
+        <w:t xml:space="preserve">, </w:t>
+      </w:r>
+      <w:hyperlink w:history="1" r:id="rIdjh8t1eeujarjpj3ltbsdz">
+        <w:r>
+          <w:t xml:space="preserve">MNRAS 513, 5766–5779 (2022)</w:t>
+        </w:r>
+      </w:hyperlink>
+      <w:r>
+        <w:t xml:space="preserve">, </w:t>
+      </w:r>
+      <w:hyperlink w:history="1" r:id="rId4q__zedjghs33xa5ldan7">
+        <w:r>
+          <w:t xml:space="preserve">arXiv:2201.07790</w:t>
+        </w:r>
+      </w:hyperlink>
+      <w:r>
+        <w:t xml:space="preserve">.</w:t>
+      </w:r>
+    </w:p>
+    <w:p>
+      <w:pPr>
+        <w:spacing w:after="20"/>
+        <w:ind w:left="300" w:hanging="300"/>
+      </w:pPr>
+      <w:r>
+        <w:t xml:space="preserve">[7] Lopez-Armengol, F. G., Etienne, Z. B., [...], </w:t>
+      </w:r>
+      <w:r>
+        <w:rPr>
+          <w:b/>
+          <w:bCs/>
+        </w:rPr>
+        <w:t xml:space="preserve">Rueda-Becerril, J. M.</w:t>
+      </w:r>
+      <w:r>
+        <w:t xml:space="preserve">, [...] </w:t>
+      </w:r>
+      <w:r>
+        <w:rPr>
+          <w:i/>
+          <w:iCs/>
+        </w:rPr>
+        <w:t xml:space="preserve">Handing off the outcome of binary neutron star mergers for accurate and long-term postmerger simulations</w:t>
+      </w:r>
+      <w:r>
+        <w:t xml:space="preserve">, </w:t>
+      </w:r>
+      <w:hyperlink w:history="1" r:id="rIdtderxl6iiht3jr36qldrd">
+        <w:r>
+          <w:t xml:space="preserve">Phys. Rev. D 106, 083015 (2022)</w:t>
+        </w:r>
+      </w:hyperlink>
+      <w:r>
+        <w:t xml:space="preserve">, </w:t>
+      </w:r>
+      <w:hyperlink w:history="1" r:id="rIdbe7ec4yzr0n7hstpcx7pt">
+        <w:r>
+          <w:t xml:space="preserve">arXiv:2112.09817</w:t>
+        </w:r>
+      </w:hyperlink>
+      <w:r>
+        <w:t xml:space="preserve">.</w:t>
+      </w:r>
+    </w:p>
+    <w:p>
+      <w:pPr>
+        <w:spacing w:after="20"/>
+        <w:ind w:left="300" w:hanging="300"/>
+      </w:pPr>
+      <w:r>
+        <w:t xml:space="preserve">[6] Murguia-Berthier, A., Noble, S., [...], </w:t>
+      </w:r>
+      <w:r>
+        <w:rPr>
+          <w:b/>
+          <w:bCs/>
+        </w:rPr>
+        <w:t xml:space="preserve">Rueda-Becerril, J. M.</w:t>
+      </w:r>
+      <w:r>
+        <w:t xml:space="preserve">, [...] </w:t>
+      </w:r>
+      <w:r>
+        <w:rPr>
+          <w:i/>
+          <w:iCs/>
+        </w:rPr>
+        <w:t xml:space="preserve">HARM3D+NUC: A New Method for Simulating the Post-merger Phase of Binary Neutron Star Mergers with GRMHD, Tabulated EOS, and Neutrino Leakage</w:t>
+      </w:r>
+      <w:r>
+        <w:t xml:space="preserve">, </w:t>
+      </w:r>
+      <w:hyperlink w:history="1" r:id="rIdbbvauisz9fjbgbjkqhvmv">
+        <w:r>
+          <w:t xml:space="preserve">ApJ 919, 95 (2021)</w:t>
+        </w:r>
+      </w:hyperlink>
+      <w:r>
+        <w:t xml:space="preserve">, </w:t>
+      </w:r>
+      <w:hyperlink w:history="1" r:id="rIdpbrzkexjkohtqpt8g6nti">
+        <w:r>
+          <w:t xml:space="preserve">arXiv:2106.05356</w:t>
+        </w:r>
+      </w:hyperlink>
+      <w:r>
+        <w:t xml:space="preserve">.</w:t>
+      </w:r>
+    </w:p>
+    <w:p>
+      <w:pPr>
+        <w:spacing w:after="20"/>
+        <w:ind w:left="300" w:hanging="300"/>
+      </w:pPr>
+      <w:r>
+        <w:t xml:space="preserve">[5] </w:t>
+      </w:r>
+      <w:r>
+        <w:rPr>
+          <w:b/>
+          <w:bCs/>
+        </w:rPr>
+        <w:t xml:space="preserve">Rueda-Becerril, J. M.</w:t>
+      </w:r>
+      <w:r>
+        <w:t xml:space="preserve">, Harrison, A. O., &amp; Giannios, D. </w:t>
+      </w:r>
+      <w:r>
+        <w:rPr>
+          <w:i/>
+          <w:iCs/>
+        </w:rPr>
+        <w:t xml:space="preserve">Blazar jets launched with similar energy per baryon, independently of their power</w:t>
+      </w:r>
+      <w:r>
+        <w:t xml:space="preserve">, </w:t>
+      </w:r>
+      <w:hyperlink w:history="1" r:id="rIddvrwdeowdnldkrpcwruma">
+        <w:r>
+          <w:t xml:space="preserve">MNRAS 501, 4092–4102 (2021)</w:t>
+        </w:r>
+      </w:hyperlink>
+      <w:r>
+        <w:t xml:space="preserve">, </w:t>
+      </w:r>
+      <w:hyperlink w:history="1" r:id="rIdxbta61azq6-ogrwcpr-7u">
+        <w:r>
+          <w:t xml:space="preserve">arXiv:2009.02273</w:t>
+        </w:r>
+      </w:hyperlink>
+      <w:r>
+        <w:t xml:space="preserve">.</w:t>
+      </w:r>
+    </w:p>
+    <w:p>
+      <w:pPr>
+        <w:spacing w:after="20"/>
+        <w:ind w:left="300" w:hanging="300"/>
+      </w:pPr>
+      <w:r>
+        <w:t xml:space="preserve">[4] Zhang, H., Christie, I., Petropoulou, M., </w:t>
+      </w:r>
+      <w:r>
+        <w:rPr>
+          <w:b/>
+          <w:bCs/>
+        </w:rPr>
+        <w:t xml:space="preserve">Rueda-Becerril, J. M.</w:t>
+      </w:r>
+      <w:r>
+        <w:t xml:space="preserve">, &amp; Giannios, D. </w:t>
+      </w:r>
+      <w:r>
+        <w:rPr>
+          <w:i/>
+          <w:iCs/>
+        </w:rPr>
+        <w:t xml:space="preserve">Inverse Compton Signatures of Gamma-Ray Burst Afterglows</w:t>
+      </w:r>
+      <w:r>
+        <w:t xml:space="preserve">, </w:t>
+      </w:r>
+      <w:hyperlink w:history="1" r:id="rIdf6odr1iur2tkzylvdrj4w">
+        <w:r>
+          <w:t xml:space="preserve">MNRAS 496, 974–986 (2020)</w:t>
+        </w:r>
+      </w:hyperlink>
+      <w:r>
+        <w:t xml:space="preserve">, </w:t>
+      </w:r>
+      <w:hyperlink w:history="1" r:id="rIdviisxqq1c_ebfd_wpcuz1">
+        <w:r>
+          <w:t xml:space="preserve">arXiv:1910.14049</w:t>
+        </w:r>
+      </w:hyperlink>
+      <w:r>
+        <w:t xml:space="preserve">.</w:t>
+      </w:r>
+    </w:p>
+    <w:p>
+      <w:pPr>
+        <w:spacing w:after="20"/>
+        <w:ind w:left="300" w:hanging="300"/>
+      </w:pPr>
+      <w:r>
+        <w:t xml:space="preserve">[3] </w:t>
+      </w:r>
+      <w:r>
+        <w:rPr>
+          <w:b/>
+          <w:bCs/>
+        </w:rPr>
+        <w:t xml:space="preserve">Rueda-Becerril, J. M.</w:t>
+      </w:r>
+      <w:r>
+        <w:t xml:space="preserve">, Mimica, P., &amp; Aloy, M. A. </w:t>
+      </w:r>
+      <w:r>
+        <w:rPr>
+          <w:i/>
+          <w:iCs/>
+        </w:rPr>
+        <w:t xml:space="preserve">On the influence of a hybrid thermal–non-thermal distribution in the internal shocks model for blazars</w:t>
+      </w:r>
+      <w:r>
+        <w:t xml:space="preserve">, </w:t>
+      </w:r>
+      <w:hyperlink w:history="1" r:id="rId9q5x0zjmbq0dlixhn5gnq">
+        <w:r>
+          <w:t xml:space="preserve">MNRAS 468, 1169–1182 (2017)</w:t>
+        </w:r>
+      </w:hyperlink>
+      <w:r>
+        <w:t xml:space="preserve">, </w:t>
+      </w:r>
+      <w:hyperlink w:history="1" r:id="rIdyr8wjeuwren3vee_zxq2r">
+        <w:r>
+          <w:t xml:space="preserve">arXiv:1612.06383</w:t>
+        </w:r>
+      </w:hyperlink>
+      <w:r>
+        <w:t xml:space="preserve">.</w:t>
+      </w:r>
+    </w:p>
+    <w:p>
+      <w:pPr>
+        <w:spacing w:after="20"/>
+        <w:ind w:left="300" w:hanging="300"/>
+      </w:pPr>
+      <w:r>
+        <w:t xml:space="preserve">[2] </w:t>
+      </w:r>
+      <w:r>
+        <w:rPr>
+          <w:b/>
+          <w:bCs/>
+        </w:rPr>
+        <w:t xml:space="preserve">Rueda-Becerril, J. M.</w:t>
+      </w:r>
+      <w:r>
+        <w:t xml:space="preserve">, Mimica, P., &amp; Aloy, M. A. </w:t>
+      </w:r>
+      <w:r>
+        <w:rPr>
+          <w:i/>
+          <w:iCs/>
+        </w:rPr>
+        <w:t xml:space="preserve">The influence of the magnetic field on the spectral properties of blazars</w:t>
+      </w:r>
+      <w:r>
+        <w:t xml:space="preserve">, </w:t>
+      </w:r>
+      <w:hyperlink w:history="1" r:id="rIdafs_pfzk5x-ad1rme593s">
+        <w:r>
+          <w:t xml:space="preserve">MNRAS 438, 1856–1869 (2014)</w:t>
+        </w:r>
+      </w:hyperlink>
+      <w:r>
+        <w:t xml:space="preserve">, </w:t>
+      </w:r>
+      <w:hyperlink w:history="1" r:id="rId1augcig12n0bnlz5w4i1l">
+        <w:r>
+          <w:t xml:space="preserve">arXiv:1310.5441</w:t>
+        </w:r>
+      </w:hyperlink>
+      <w:r>
+        <w:t xml:space="preserve">.</w:t>
+      </w:r>
+    </w:p>
+    <w:p>
+      <w:pPr>
+        <w:spacing w:after="20"/>
+        <w:ind w:left="300" w:hanging="300"/>
+      </w:pPr>
+      <w:r>
+        <w:t xml:space="preserve">[1] Guzmán, F. S., &amp; </w:t>
+      </w:r>
+      <w:r>
+        <w:rPr>
+          <w:b/>
+          <w:bCs/>
+        </w:rPr>
+        <w:t xml:space="preserve">Rueda-Becerril, J. M.</w:t>
+      </w:r>
+      <w:r>
+        <w:t xml:space="preserve"> </w:t>
+      </w:r>
+      <w:r>
+        <w:rPr>
+          <w:i/>
+          <w:iCs/>
+        </w:rPr>
+        <w:t xml:space="preserve">Spherical boson stars as black hole mimickers</w:t>
+      </w:r>
+      <w:r>
+        <w:t xml:space="preserve">, </w:t>
+      </w:r>
+      <w:hyperlink w:history="1" r:id="rIdf2dwynphdmxm3cigdyfca">
+        <w:r>
+          <w:t xml:space="preserve">Phys. Rev. D 80, 084023 (2009)</w:t>
+        </w:r>
+      </w:hyperlink>
+      <w:r>
+        <w:t xml:space="preserve">, </w:t>
+      </w:r>
+      <w:hyperlink w:history="1" r:id="rId_0zlw-eawp0y1mbrvpc_l">
+        <w:r>
+          <w:t xml:space="preserve">arXiv:1009.1250</w:t>
+        </w:r>
+      </w:hyperlink>
+      <w:r>
+        <w:t xml:space="preserve">.</w:t>
+      </w:r>
+    </w:p>
+    <w:p>
+      <w:pPr>
+        <w:pStyle w:val="Heading2"/>
+      </w:pPr>
+      <w:r>
+        <w:t xml:space="preserve">Conference Proceedings</w:t>
+      </w:r>
+    </w:p>
+    <w:p>
+      <w:pPr>
+        <w:spacing w:after="20"/>
+        <w:ind w:left="300" w:hanging="300"/>
+      </w:pPr>
+      <w:r>
+        <w:t xml:space="preserve">[P5] </w:t>
+      </w:r>
+      <w:r>
+        <w:rPr>
+          <w:b/>
+          <w:bCs/>
+        </w:rPr>
+        <w:t xml:space="preserve">Rueda-Becerril, J. M.</w:t>
+      </w:r>
+      <w:r>
+        <w:t xml:space="preserve"> </w:t>
+      </w:r>
+      <w:r>
+        <w:rPr>
+          <w:i/>
+          <w:iCs/>
+        </w:rPr>
+        <w:t xml:space="preserve">A numerical approach for radiative cooling in relativistic outflows</w:t>
+      </w:r>
+      <w:r>
+        <w:t xml:space="preserve">, </w:t>
+      </w:r>
+      <w:hyperlink w:history="1" r:id="rIdsmjhg-vdrwp_gugq9vltb">
+        <w:r>
+          <w:t xml:space="preserve">Astron. Nachr. 342, 277–282 (2021)</w:t>
+        </w:r>
+      </w:hyperlink>
+      <w:r>
+        <w:t xml:space="preserve">, 9th International Workshop on Astronomy and Relativistic Astrophysics, </w:t>
+      </w:r>
+      <w:hyperlink w:history="1" r:id="rId0zeke3bakv7_cqrwogcxc">
+        <w:r>
+          <w:t xml:space="preserve">arXiv:2011.13797</w:t>
+        </w:r>
+      </w:hyperlink>
+      <w:r>
+        <w:t xml:space="preserve">.</w:t>
+      </w:r>
+    </w:p>
+    <w:p>
+      <w:pPr>
+        <w:spacing w:after="20"/>
+        <w:ind w:left="300" w:hanging="300"/>
+      </w:pPr>
+      <w:r>
+        <w:t xml:space="preserve">[P4] </w:t>
+      </w:r>
+      <w:r>
+        <w:rPr>
+          <w:b/>
+          <w:bCs/>
+        </w:rPr>
+        <w:t xml:space="preserve">Rueda-Becerril, J. M.</w:t>
+      </w:r>
+      <w:r>
+        <w:t xml:space="preserve">, Harrison, A. O., &amp; Giannios, D. </w:t>
+      </w:r>
+      <w:r>
+        <w:rPr>
+          <w:i/>
+          <w:iCs/>
+        </w:rPr>
+        <w:t xml:space="preserve">The blazar sequence revised</w:t>
+      </w:r>
+      <w:r>
+        <w:t xml:space="preserve">, </w:t>
+      </w:r>
+      <w:hyperlink w:history="1" r:id="rIdlxnz7jkeske7frmplerc2">
+        <w:r>
+          <w:t xml:space="preserve">Astron. Nachr. 342, 147–152 (2021)</w:t>
+        </w:r>
+      </w:hyperlink>
+      <w:r>
+        <w:t xml:space="preserve">, 9th International Workshop on Astronomy and Relativistic Astrophysics, </w:t>
+      </w:r>
+      <w:hyperlink w:history="1" r:id="rIdlfs5cdyd2k3argb658o6k">
+        <w:r>
+          <w:t xml:space="preserve">arXiv:2011.13805</w:t>
+        </w:r>
+      </w:hyperlink>
+      <w:r>
+        <w:t xml:space="preserve">.</w:t>
+      </w:r>
+    </w:p>
+    <w:p>
+      <w:pPr>
+        <w:spacing w:after="20"/>
+        <w:ind w:left="300" w:hanging="300"/>
+      </w:pPr>
+      <w:r>
+        <w:t xml:space="preserve">[P3] </w:t>
+      </w:r>
+      <w:r>
+        <w:rPr>
+          <w:b/>
+          <w:bCs/>
+        </w:rPr>
+        <w:t xml:space="preserve">Rueda-Becerril, J. M.</w:t>
+      </w:r>
+      <w:r>
+        <w:t xml:space="preserve">, Mimica, P., &amp; Aloy, M. A. </w:t>
+      </w:r>
+      <w:r>
+        <w:rPr>
+          <w:i/>
+          <w:iCs/>
+        </w:rPr>
+        <w:t xml:space="preserve">Numerical simulations of the internal shock model in magnetized relativistic jets of blazars</w:t>
+      </w:r>
+      <w:r>
+        <w:t xml:space="preserve">, </w:t>
+      </w:r>
+      <w:hyperlink w:history="1" r:id="rIdhloyqgroxbjlsrm5txbnt">
+        <w:r>
+          <w:t xml:space="preserve">PoS(SWIFT 10) 233, 159 (2014)</w:t>
+        </w:r>
+      </w:hyperlink>
+      <w:r>
+        <w:t xml:space="preserve">, </w:t>
+      </w:r>
+      <w:hyperlink w:history="1" r:id="rIdcm2rufbkwwhvwzycyhfzy">
+        <w:r>
+          <w:t xml:space="preserve">arXiv:1502.07882</w:t>
+        </w:r>
+      </w:hyperlink>
+      <w:r>
+        <w:t xml:space="preserve">.</w:t>
+      </w:r>
+    </w:p>
+    <w:p>
+      <w:pPr>
+        <w:spacing w:after="20"/>
+        <w:ind w:left="300" w:hanging="300"/>
+      </w:pPr>
+      <w:r>
+        <w:t xml:space="preserve">[P2] </w:t>
+      </w:r>
+      <w:r>
+        <w:rPr>
+          <w:b/>
+          <w:bCs/>
+        </w:rPr>
+        <w:t xml:space="preserve">Rueda-Becerril, J. M.</w:t>
+      </w:r>
+      <w:r>
+        <w:t xml:space="preserve">, Mimica, P., Aloy, M. A., &amp; Aloy, C. </w:t>
+      </w:r>
+      <w:r>
+        <w:rPr>
+          <w:i/>
+          <w:iCs/>
+        </w:rPr>
+        <w:t xml:space="preserve">Numerical study of broadband spectra caused by internal shocks in magnetized relativistic jets of blazars</w:t>
+      </w:r>
+      <w:r>
+        <w:t xml:space="preserve">, </w:t>
+      </w:r>
+      <w:hyperlink w:history="1" r:id="rIdaea0lk527gvxlupstfiui">
+        <w:r>
+          <w:t xml:space="preserve">EPJ Web Conf. 61, 02007 (2013)</w:t>
+        </w:r>
+      </w:hyperlink>
+      <w:r>
+        <w:t xml:space="preserve">, </w:t>
+      </w:r>
+      <w:hyperlink w:history="1" r:id="rIdtzfs9ir6kes2uu8nqooxu">
+        <w:r>
+          <w:t xml:space="preserve">arXiv:1309.4612</w:t>
+        </w:r>
+      </w:hyperlink>
+      <w:r>
+        <w:t xml:space="preserve">.</w:t>
+      </w:r>
+    </w:p>
+    <w:p>
+      <w:pPr>
+        <w:spacing w:after="20"/>
+        <w:ind w:left="300" w:hanging="300"/>
+      </w:pPr>
+      <w:r>
+        <w:t xml:space="preserve">[P1] Mimica, P., Aloy, M. A., </w:t>
+      </w:r>
+      <w:r>
+        <w:rPr>
+          <w:b/>
+          <w:bCs/>
+        </w:rPr>
+        <w:t xml:space="preserve">Rueda-Becerril, J. M.</w:t>
+      </w:r>
+      <w:r>
+        <w:t xml:space="preserve">, Tabik, S., &amp; Aloy, C. </w:t>
+      </w:r>
+      <w:r>
+        <w:rPr>
+          <w:i/>
+          <w:iCs/>
+        </w:rPr>
+        <w:t xml:space="preserve">Numerical simulations of dynamics and emission from relativistic astrophysical jets</w:t>
+      </w:r>
+      <w:r>
+        <w:t xml:space="preserve">, </w:t>
+      </w:r>
+      <w:hyperlink w:history="1" r:id="rIdbt2mk2fl3onujfqejvdru">
+        <w:r>
+          <w:t xml:space="preserve">J. Phys.: Conf. Ser. 454, 012001 (2013)</w:t>
+        </w:r>
+      </w:hyperlink>
+      <w:r>
+        <w:t xml:space="preserve">, </w:t>
+      </w:r>
+      <w:hyperlink w:history="1" r:id="rIdi_oueidwagdzhivt01jls">
+        <w:r>
+          <w:t xml:space="preserve">arXiv:1211.1794</w:t>
+        </w:r>
+      </w:hyperlink>
+      <w:r>
+        <w:t xml:space="preserve">.</w:t>
+      </w:r>
+    </w:p>
+    <w:p>
+      <w:pPr>
+        <w:pStyle w:val="Heading1"/>
+      </w:pPr>
+      <w:r>
+        <w:t xml:space="preserve">Grants and Fellowships</w:t>
+      </w:r>
+    </w:p>
+    <w:p>
+      <w:pPr>
+        <w:pStyle w:val="Heading2"/>
+      </w:pPr>
+      <w:r>
+        <w:t xml:space="preserve">Research Grants</w:t>
+      </w:r>
+    </w:p>
+    <w:p>
+      <w:pPr>
+        <w:keepNext/>
+        <w:tabs>
+          <w:tab w:val="right" w:pos="10512"/>
+        </w:tabs>
+        <w:spacing w:after="0"/>
+      </w:pPr>
+      <w:r>
+        <w:rPr>
+          <w:b/>
+          <w:bCs/>
+        </w:rPr>
+        <w:t xml:space="preserve">NASA Fermi Guest Investigator Program, Cycle 12</w:t>
+      </w:r>
+      <w:r>
+        <w:tab/>
+      </w:r>
+      <w:r>
+        <w:t xml:space="preserve">2019</w:t>
+      </w:r>
+    </w:p>
+    <w:p>
+      <w:pPr>
+        <w:keepNext/>
+        <w:tabs>
+          <w:tab w:val="right" w:pos="10512"/>
+        </w:tabs>
+        <w:spacing w:after="0"/>
+      </w:pPr>
+      <w:r>
+        <w:rPr>
+          <w:i/>
+          <w:iCs/>
+        </w:rPr>
+        <w:t xml:space="preserve">A simple model to understand the blazar sequence</w:t>
+      </w:r>
+      <w:r>
+        <w:tab/>
+      </w:r>
+      <w:r>
+        <w:t xml:space="preserve">Grant #121077, $68K</w:t>
+      </w:r>
+    </w:p>
+    <w:p>
+      <w:pPr>
+        <w:spacing w:after="0"/>
+      </w:pPr>
+      <w:r>
+        <w:t xml:space="preserve">PI: D. Giannios; Co-I: J. M. Rueda-Becerril</w:t>
+      </w:r>
+    </w:p>
+    <w:p>
+      <w:pPr>
+        <w:pStyle w:val="EntryGap"/>
+        <w:spacing w:after="0"/>
+      </w:pPr>
+    </w:p>
+    <w:p>
+      <w:pPr>
+        <w:pStyle w:val="Heading2"/>
+      </w:pPr>
+      <w:r>
+        <w:t xml:space="preserve">Fellowships</w:t>
+      </w:r>
+    </w:p>
+    <w:p>
+      <w:pPr>
+        <w:keepNext/>
+        <w:tabs>
+          <w:tab w:val="right" w:pos="10512"/>
+        </w:tabs>
+        <w:spacing w:after="0"/>
+      </w:pPr>
+      <w:r>
+        <w:rPr>
+          <w:b/>
+          <w:bCs/>
+        </w:rPr>
+        <w:t xml:space="preserve">International Postdoctoral Fellowship</w:t>
+      </w:r>
+      <w:r>
+        <w:tab/>
+      </w:r>
+      <w:r>
+        <w:t xml:space="preserve">Oct 2018 – Nov 2020</w:t>
+      </w:r>
+    </w:p>
+    <w:p>
+      <w:pPr>
+        <w:keepNext/>
+        <w:tabs>
+          <w:tab w:val="right" w:pos="10512"/>
+        </w:tabs>
+        <w:spacing w:after="0"/>
+      </w:pPr>
+      <w:r>
+        <w:rPr>
+          <w:i/>
+          <w:iCs/>
+        </w:rPr>
+        <w:t xml:space="preserve">National Council of Science and Technology (CONACyT), Mexico</w:t>
+      </w:r>
+    </w:p>
+    <w:p>
+      <w:pPr>
+        <w:pStyle w:val="EntryGap"/>
+        <w:spacing w:after="0"/>
+      </w:pPr>
+    </w:p>
+    <w:p>
+      <w:pPr>
+        <w:keepNext/>
+        <w:tabs>
+          <w:tab w:val="right" w:pos="10512"/>
+        </w:tabs>
+        <w:spacing w:after="0"/>
+      </w:pPr>
+      <w:r>
+        <w:rPr>
+          <w:b/>
+          <w:bCs/>
+        </w:rPr>
+        <w:t xml:space="preserve">Postdoctoral Fellowship</w:t>
+      </w:r>
+      <w:r>
+        <w:tab/>
+      </w:r>
+      <w:r>
+        <w:t xml:space="preserve">Jan 2018 – Sep 2018</w:t>
+      </w:r>
+    </w:p>
+    <w:p>
+      <w:pPr>
+        <w:keepNext/>
+        <w:tabs>
+          <w:tab w:val="right" w:pos="10512"/>
+        </w:tabs>
+        <w:spacing w:after="0"/>
+      </w:pPr>
+      <w:r>
+        <w:rPr>
+          <w:i/>
+          <w:iCs/>
+        </w:rPr>
+        <w:t xml:space="preserve">Secretariat of Public Education, Mexico (Program for the Professional Development of Higher Education Institutions)</w:t>
+      </w:r>
+    </w:p>
+    <w:p>
+      <w:pPr>
+        <w:pStyle w:val="EntryGap"/>
+        <w:spacing w:after="0"/>
+      </w:pPr>
+    </w:p>
+    <w:p>
+      <w:pPr>
+        <w:keepNext/>
+        <w:tabs>
+          <w:tab w:val="right" w:pos="10512"/>
+        </w:tabs>
+        <w:spacing w:after="0"/>
+      </w:pPr>
+      <w:r>
+        <w:rPr>
+          <w:b/>
+          <w:bCs/>
+        </w:rPr>
+        <w:t xml:space="preserve">Study-Abroad Fellowship</w:t>
+      </w:r>
+      <w:r>
+        <w:tab/>
+      </w:r>
+      <w:r>
+        <w:t xml:space="preserve">Sep 2014 – Aug 2016</w:t>
+      </w:r>
+    </w:p>
+    <w:p>
+      <w:pPr>
+        <w:keepNext/>
+        <w:tabs>
+          <w:tab w:val="right" w:pos="10512"/>
+        </w:tabs>
+        <w:spacing w:after="0"/>
+      </w:pPr>
+      <w:r>
+        <w:rPr>
+          <w:i/>
+          <w:iCs/>
+        </w:rPr>
+        <w:t xml:space="preserve">National Council of Science and Technology (CONACyT), Mexico</w:t>
+      </w:r>
+    </w:p>
+    <w:p>
+      <w:pPr>
+        <w:pStyle w:val="EntryGap"/>
+        <w:spacing w:after="0"/>
+      </w:pPr>
+    </w:p>
+    <w:p>
+      <w:pPr>
+        <w:keepNext/>
+        <w:tabs>
+          <w:tab w:val="right" w:pos="10512"/>
+        </w:tabs>
+        <w:spacing w:after="0"/>
+      </w:pPr>
+      <w:r>
+        <w:rPr>
+          <w:b/>
+          <w:bCs/>
+        </w:rPr>
+        <w:t xml:space="preserve">Santiago Grisolía Fellowship</w:t>
+      </w:r>
+      <w:r>
+        <w:tab/>
+      </w:r>
+      <w:r>
+        <w:t xml:space="preserve">Oct 2011 – Jun 2014</w:t>
+      </w:r>
+    </w:p>
+    <w:p>
+      <w:pPr>
+        <w:keepNext/>
+        <w:tabs>
+          <w:tab w:val="right" w:pos="10512"/>
+        </w:tabs>
+        <w:spacing w:after="0"/>
+      </w:pPr>
+      <w:r>
+        <w:rPr>
+          <w:i/>
+          <w:iCs/>
+        </w:rPr>
+        <w:t xml:space="preserve">Council of Education, Research, Culture and Sport, Valencian Community, Spain</w:t>
+      </w:r>
+    </w:p>
+    <w:p>
+      <w:pPr>
+        <w:pStyle w:val="EntryGap"/>
+        <w:spacing w:after="0"/>
+      </w:pPr>
+    </w:p>
+    <w:p>
+      <w:pPr>
+        <w:keepNext/>
+        <w:tabs>
+          <w:tab w:val="right" w:pos="10512"/>
+        </w:tabs>
+        <w:spacing w:after="0"/>
+      </w:pPr>
+      <w:r>
+        <w:rPr>
+          <w:b/>
+          <w:bCs/>
+        </w:rPr>
+        <w:t xml:space="preserve">M.Sc. Fellowship</w:t>
+      </w:r>
+      <w:r>
+        <w:tab/>
+      </w:r>
+      <w:r>
+        <w:t xml:space="preserve">Sep 2009 – Aug 2011</w:t>
+      </w:r>
+    </w:p>
+    <w:p>
+      <w:pPr>
+        <w:keepNext/>
+        <w:tabs>
+          <w:tab w:val="right" w:pos="10512"/>
+        </w:tabs>
+        <w:spacing w:after="0"/>
+      </w:pPr>
+      <w:r>
+        <w:rPr>
+          <w:i/>
+          <w:iCs/>
+        </w:rPr>
+        <w:t xml:space="preserve">CONACyT, at the Institute of Physics and Mathematics, Universidad Michoacana de San Nicolás de Hidalgo</w:t>
+      </w:r>
+    </w:p>
+    <w:p>
+      <w:pPr>
+        <w:pStyle w:val="EntryGap"/>
+        <w:spacing w:after="0"/>
+      </w:pPr>
+    </w:p>
+    <w:p>
+      <w:pPr>
+        <w:keepNext/>
+        <w:tabs>
+          <w:tab w:val="right" w:pos="10512"/>
+        </w:tabs>
+        <w:spacing w:after="0"/>
+      </w:pPr>
+      <w:r>
+        <w:rPr>
+          <w:b/>
+          <w:bCs/>
+        </w:rPr>
+        <w:t xml:space="preserve">Summer Research Fellowship (XVII Summer of Scientific Research)</w:t>
+      </w:r>
+      <w:r>
+        <w:tab/>
+      </w:r>
+      <w:r>
+        <w:t xml:space="preserve">Jun 2007 – Aug 2007</w:t>
+      </w:r>
+    </w:p>
+    <w:p>
+      <w:pPr>
+        <w:keepNext/>
+        <w:tabs>
+          <w:tab w:val="right" w:pos="10512"/>
+        </w:tabs>
+        <w:spacing w:after="0"/>
+      </w:pPr>
+      <w:r>
+        <w:rPr>
+          <w:i/>
+          <w:iCs/>
+        </w:rPr>
+        <w:t xml:space="preserve">Mexican Academy of Sciences</w:t>
+      </w:r>
+    </w:p>
+    <w:p>
+      <w:pPr>
+        <w:pStyle w:val="EntryGap"/>
+        <w:spacing w:after="0"/>
+      </w:pPr>
+    </w:p>
+    <w:p>
+      <w:pPr>
+        <w:pStyle w:val="Heading1"/>
+      </w:pPr>
+      <w:r>
+        <w:t xml:space="preserve">Software and Projects</w:t>
+      </w:r>
+    </w:p>
+    <w:p>
+      <w:pPr>
+        <w:keepNext/>
+        <w:tabs>
+          <w:tab w:val="right" w:pos="10512"/>
+        </w:tabs>
+        <w:spacing w:after="0"/>
+      </w:pPr>
+      <w:r>
+        <w:rPr>
+          <w:b/>
+          <w:bCs/>
+        </w:rPr>
+        <w:t xml:space="preserve">Blazar Population ML</w:t>
+      </w:r>
+      <w:r>
+        <w:tab/>
+      </w:r>
+      <w:r>
+        <w:t xml:space="preserve">Jan 2026 – Present</w:t>
+      </w:r>
+    </w:p>
+    <w:p>
+      <w:pPr>
+        <w:keepNext/>
+        <w:tabs>
+          <w:tab w:val="right" w:pos="10512"/>
+        </w:tabs>
+        <w:spacing w:after="0"/>
+      </w:pPr>
+      <w:r>
+        <w:rPr>
+          <w:i/>
+          <w:iCs/>
+        </w:rPr>
+        <w:t xml:space="preserve">Scientific ML (Python, scikit-learn, PyTorch)</w:t>
+      </w:r>
+      <w:r>
+        <w:tab/>
+      </w:r>
+      <w:hyperlink w:history="1" r:id="rId6j2wyumvu-hdgxucmi4yd">
+        <w:r>
+          <w:t xml:space="preserve">github.com/altjerue/ilwikak-ml</w:t>
+        </w:r>
+      </w:hyperlink>
     </w:p>
     <w:p>
       <w:pPr>
@@ -2449,7 +2449,7 @@
         <w:spacing w:after="10"/>
       </w:pPr>
       <w:r>
-        <w:t xml:space="preserve">Building a neural network that maps physical jet parameters to observable spectral energy distributions accurately enough to compare with Tleco results.</w:t>
+        <w:t xml:space="preserve">Applying classical ML and Bayesian inference to the Fermi-LAT 4LAC-DR3 catalog (3,407 sources) to recover physical jet parameters from multi-wavelength data.</w:t>
       </w:r>
     </w:p>
     <w:p>
@@ -2462,60 +2462,8 @@
         <w:spacing w:after="10"/>
       </w:pPr>
       <w:r>
-        <w:t xml:space="preserve">Forecasting blazar gamma-ray flares with a time-series foundation model fine-tuned on Tleco-generated synthetic light curves.</w:t>
-      </w:r>
-    </w:p>
-    <w:p>
-      <w:pPr>
-        <w:pStyle w:val="EntryGap"/>
-        <w:spacing w:after="0"/>
-      </w:pPr>
-    </w:p>
-    <w:p>
-      <w:pPr>
-        <w:keepNext/>
-        <w:tabs>
-          <w:tab w:val="right" w:pos="10512"/>
-        </w:tabs>
-        <w:spacing w:after="0"/>
-      </w:pPr>
-      <w:r>
-        <w:rPr>
-          <w:b/>
-          <w:bCs/>
-        </w:rPr>
-        <w:t xml:space="preserve">WindsOfChange</w:t>
-      </w:r>
-      <w:r>
-        <w:tab/>
-      </w:r>
-      <w:r>
-        <w:t xml:space="preserve">Aug 2024 – Present</w:t>
-      </w:r>
-    </w:p>
-    <w:p>
-      <w:pPr>
-        <w:keepNext/>
-        <w:tabs>
-          <w:tab w:val="right" w:pos="10512"/>
-        </w:tabs>
-        <w:spacing w:after="0"/>
-      </w:pPr>
-      <w:r>
-        <w:rPr>
-          <w:i/>
-          <w:iCs/>
-        </w:rPr>
-        <w:t xml:space="preserve">Lagrangian particle-dispersion library (C++/R)</w:t>
-      </w:r>
-      <w:r>
-        <w:tab/>
-      </w:r>
-      <w:hyperlink w:history="1" r:id="rIdhpuwtggv0ipeiurulvp95">
-        <w:r>
-          <w:t xml:space="preserve">github.com/UW-ForestMycobiomeLab/WindSporesHills</w:t>
-        </w:r>
-      </w:hyperlink>
+        <w:t xml:space="preserve">Building a neural network that maps physical jet parameters to observable spectral energy distributions accurately enough to compare with Tleco results.</w:t>
+      </w:r>
     </w:p>
     <w:p>
       <w:pPr>
@@ -2527,58 +2475,58 @@
         <w:spacing w:after="10"/>
       </w:pPr>
       <w:r>
-        <w:t xml:space="preserve">Simulates particle dispersion, atmospheric turbulence, and flow over hilly terrain with forest canopy, based on analytical models (Massman &amp; Weil 1999; Finnigan &amp; Belcher 2004); designed to scale to tens of thousands of particles over kilometer-scale domains.</w:t>
-      </w:r>
-    </w:p>
-    <w:p>
-      <w:pPr>
-        <w:pStyle w:val="EntryGap"/>
-        <w:spacing w:after="0"/>
-      </w:pPr>
-    </w:p>
-    <w:p>
-      <w:pPr>
-        <w:keepNext/>
-        <w:tabs>
-          <w:tab w:val="right" w:pos="10512"/>
-        </w:tabs>
-        <w:spacing w:after="0"/>
-      </w:pPr>
-      <w:r>
-        <w:rPr>
-          <w:b/>
-          <w:bCs/>
-        </w:rPr>
-        <w:t xml:space="preserve">Tleco</w:t>
-      </w:r>
-      <w:r>
-        <w:tab/>
-      </w:r>
-      <w:r>
-        <w:t xml:space="preserve">Jan 2024 – Sep 2024</w:t>
-      </w:r>
-    </w:p>
-    <w:p>
-      <w:pPr>
-        <w:keepNext/>
-        <w:tabs>
-          <w:tab w:val="right" w:pos="10512"/>
-        </w:tabs>
-        <w:spacing w:after="0"/>
-      </w:pPr>
-      <w:r>
-        <w:rPr>
-          <w:i/>
-          <w:iCs/>
-        </w:rPr>
-        <w:t xml:space="preserve">Radiative-transfer toolkit (Rust/Python)</w:t>
-      </w:r>
-      <w:r>
-        <w:tab/>
-      </w:r>
-      <w:hyperlink w:history="1" r:id="rIdqp4098mmlkxpzxn53nhug">
+        <w:t xml:space="preserve">Forecasting blazar gamma-ray flares with a time-series foundation model fine-tuned on Tleco-generated synthetic light curves.</w:t>
+      </w:r>
+    </w:p>
+    <w:p>
+      <w:pPr>
+        <w:pStyle w:val="EntryGap"/>
+        <w:spacing w:after="0"/>
+      </w:pPr>
+    </w:p>
+    <w:p>
+      <w:pPr>
+        <w:keepNext/>
+        <w:tabs>
+          <w:tab w:val="right" w:pos="10512"/>
+        </w:tabs>
+        <w:spacing w:after="0"/>
+      </w:pPr>
+      <w:r>
+        <w:rPr>
+          <w:b/>
+          <w:bCs/>
+        </w:rPr>
+        <w:t xml:space="preserve">WindsOfChange</w:t>
+      </w:r>
+      <w:r>
+        <w:tab/>
+      </w:r>
+      <w:r>
+        <w:t xml:space="preserve">Aug 2024 – Present</w:t>
+      </w:r>
+    </w:p>
+    <w:p>
+      <w:pPr>
+        <w:keepNext/>
+        <w:tabs>
+          <w:tab w:val="right" w:pos="10512"/>
+        </w:tabs>
+        <w:spacing w:after="0"/>
+      </w:pPr>
+      <w:r>
+        <w:rPr>
+          <w:i/>
+          <w:iCs/>
+        </w:rPr>
+        <w:t xml:space="preserve">Lagrangian particle-dispersion library (C++/R)</w:t>
+      </w:r>
+      <w:r>
+        <w:tab/>
+      </w:r>
+      <w:hyperlink w:history="1" r:id="rIdpourlobghevea6npvouil">
         <w:r>
-          <w:t xml:space="preserve">github.com/zkdavis/Tleco</w:t>
+          <w:t xml:space="preserve">github.com/UW-ForestMycobiomeLab/WindSporesHills</w:t>
         </w:r>
       </w:hyperlink>
     </w:p>
@@ -2592,58 +2540,58 @@
         <w:spacing w:after="10"/>
       </w:pPr>
       <w:r>
-        <w:t xml:space="preserve">Numerical PDE solvers, particle-distribution algorithms, and spectral calculations for relativistic plasmas; successor to Paramo [9].</w:t>
-      </w:r>
-    </w:p>
-    <w:p>
-      <w:pPr>
-        <w:pStyle w:val="EntryGap"/>
-        <w:spacing w:after="0"/>
-      </w:pPr>
-    </w:p>
-    <w:p>
-      <w:pPr>
-        <w:keepNext/>
-        <w:tabs>
-          <w:tab w:val="right" w:pos="10512"/>
-        </w:tabs>
-        <w:spacing w:after="0"/>
-      </w:pPr>
-      <w:r>
-        <w:rPr>
-          <w:b/>
-          <w:bCs/>
-        </w:rPr>
-        <w:t xml:space="preserve">Paramo</w:t>
-      </w:r>
-      <w:r>
-        <w:tab/>
-      </w:r>
-      <w:r>
-        <w:t xml:space="preserve">Oct 2018 – Apr 2022</w:t>
-      </w:r>
-    </w:p>
-    <w:p>
-      <w:pPr>
-        <w:keepNext/>
-        <w:tabs>
-          <w:tab w:val="right" w:pos="10512"/>
-        </w:tabs>
-        <w:spacing w:after="0"/>
-      </w:pPr>
-      <w:r>
-        <w:rPr>
-          <w:i/>
-          <w:iCs/>
-        </w:rPr>
-        <w:t xml:space="preserve">Radiative-transfer library (Fortran 95, OpenMP)</w:t>
-      </w:r>
-      <w:r>
-        <w:tab/>
-      </w:r>
-      <w:hyperlink w:history="1" r:id="rId6bvy5mwc63ps7gs85kohm">
+        <w:t xml:space="preserve">Simulates particle dispersion, atmospheric turbulence, and flow over hilly terrain with forest canopy, based on analytical models (Massman &amp; Weil 1999; Finnigan &amp; Belcher 2004); designed to scale to tens of thousands of particles over kilometer-scale domains.</w:t>
+      </w:r>
+    </w:p>
+    <w:p>
+      <w:pPr>
+        <w:pStyle w:val="EntryGap"/>
+        <w:spacing w:after="0"/>
+      </w:pPr>
+    </w:p>
+    <w:p>
+      <w:pPr>
+        <w:keepNext/>
+        <w:tabs>
+          <w:tab w:val="right" w:pos="10512"/>
+        </w:tabs>
+        <w:spacing w:after="0"/>
+      </w:pPr>
+      <w:r>
+        <w:rPr>
+          <w:b/>
+          <w:bCs/>
+        </w:rPr>
+        <w:t xml:space="preserve">Tleco</w:t>
+      </w:r>
+      <w:r>
+        <w:tab/>
+      </w:r>
+      <w:r>
+        <w:t xml:space="preserve">Jan 2024 – Sep 2024</w:t>
+      </w:r>
+    </w:p>
+    <w:p>
+      <w:pPr>
+        <w:keepNext/>
+        <w:tabs>
+          <w:tab w:val="right" w:pos="10512"/>
+        </w:tabs>
+        <w:spacing w:after="0"/>
+      </w:pPr>
+      <w:r>
+        <w:rPr>
+          <w:i/>
+          <w:iCs/>
+        </w:rPr>
+        <w:t xml:space="preserve">Radiative-transfer toolkit (Rust/Python)</w:t>
+      </w:r>
+      <w:r>
+        <w:tab/>
+      </w:r>
+      <w:hyperlink w:history="1" r:id="rIdwqgqa66ntsxp5fcnoofru">
         <w:r>
-          <w:t xml:space="preserve">github.com/altjerue/paramo</w:t>
+          <w:t xml:space="preserve">github.com/zkdavis/Tleco</w:t>
         </w:r>
       </w:hyperlink>
     </w:p>
@@ -2657,52 +2605,60 @@
         <w:spacing w:after="10"/>
       </w:pPr>
       <w:r>
-        <w:t xml:space="preserve">Fokker–Planck and radiative-transfer solver for relativistic particle distributions; about 20× faster than the original serial code on 5 cores after OpenMP parallelization and optimization; used by other groups, including Combi &amp; Siegel (2023).</w:t>
-      </w:r>
-    </w:p>
-    <w:p>
-      <w:pPr>
-        <w:pStyle w:val="EntryGap"/>
-        <w:spacing w:after="0"/>
-      </w:pPr>
-    </w:p>
-    <w:p>
-      <w:pPr>
-        <w:keepNext/>
-        <w:tabs>
-          <w:tab w:val="right" w:pos="10512"/>
-        </w:tabs>
-        <w:spacing w:after="0"/>
-      </w:pPr>
-      <w:r>
-        <w:rPr>
-          <w:b/>
-          <w:bCs/>
-        </w:rPr>
-        <w:t xml:space="preserve">PatchworkMHD</w:t>
-      </w:r>
-      <w:r>
-        <w:tab/>
-      </w:r>
-      <w:r>
-        <w:t xml:space="preserve">Feb 2021 – Apr 2022</w:t>
-      </w:r>
-    </w:p>
-    <w:p>
-      <w:pPr>
-        <w:keepNext/>
-        <w:tabs>
-          <w:tab w:val="right" w:pos="10512"/>
-        </w:tabs>
-        <w:spacing w:after="0"/>
-      </w:pPr>
-      <w:r>
-        <w:rPr>
-          <w:i/>
-          <w:iCs/>
-        </w:rPr>
-        <w:t xml:space="preserve">Large-scale MHD simulation code (NSF project)</w:t>
-      </w:r>
+        <w:t xml:space="preserve">Numerical PDE solvers, particle-distribution algorithms, and spectral calculations for relativistic plasmas; successor to Paramo [9].</w:t>
+      </w:r>
+    </w:p>
+    <w:p>
+      <w:pPr>
+        <w:pStyle w:val="EntryGap"/>
+        <w:spacing w:after="0"/>
+      </w:pPr>
+    </w:p>
+    <w:p>
+      <w:pPr>
+        <w:keepNext/>
+        <w:tabs>
+          <w:tab w:val="right" w:pos="10512"/>
+        </w:tabs>
+        <w:spacing w:after="0"/>
+      </w:pPr>
+      <w:r>
+        <w:rPr>
+          <w:b/>
+          <w:bCs/>
+        </w:rPr>
+        <w:t xml:space="preserve">Paramo</w:t>
+      </w:r>
+      <w:r>
+        <w:tab/>
+      </w:r>
+      <w:r>
+        <w:t xml:space="preserve">Oct 2018 – Apr 2022</w:t>
+      </w:r>
+    </w:p>
+    <w:p>
+      <w:pPr>
+        <w:keepNext/>
+        <w:tabs>
+          <w:tab w:val="right" w:pos="10512"/>
+        </w:tabs>
+        <w:spacing w:after="0"/>
+      </w:pPr>
+      <w:r>
+        <w:rPr>
+          <w:i/>
+          <w:iCs/>
+        </w:rPr>
+        <w:t xml:space="preserve">Radiative-transfer library (Fortran 95, OpenMP)</w:t>
+      </w:r>
+      <w:r>
+        <w:tab/>
+      </w:r>
+      <w:hyperlink w:history="1" r:id="rIdsglhgdrgggtabvp22vqcy">
+        <w:r>
+          <w:t xml:space="preserve">github.com/altjerue/paramo</w:t>
+        </w:r>
+      </w:hyperlink>
     </w:p>
     <w:p>
       <w:pPr>
@@ -2714,7 +2670,64 @@
         <w:spacing w:after="10"/>
       </w:pPr>
       <w:r>
-        <w:t xml:space="preserve">Led a 7-person upgrade of this production C code for HPC environments, adding black-hole spin with under 5% runtime overhead.</w:t>
+        <w:t xml:space="preserve">Fokker–Planck and radiative-transfer solver for relativistic particle distributions; about 20× faster than the original serial code on 5 cores after OpenMP parallelization and optimization; used by other groups, including Combi &amp; Siegel (2023).</w:t>
+      </w:r>
+    </w:p>
+    <w:p>
+      <w:pPr>
+        <w:pStyle w:val="EntryGap"/>
+        <w:spacing w:after="0"/>
+      </w:pPr>
+    </w:p>
+    <w:p>
+      <w:pPr>
+        <w:keepNext/>
+        <w:tabs>
+          <w:tab w:val="right" w:pos="10512"/>
+        </w:tabs>
+        <w:spacing w:after="0"/>
+      </w:pPr>
+      <w:r>
+        <w:rPr>
+          <w:b/>
+          <w:bCs/>
+        </w:rPr>
+        <w:t xml:space="preserve">PatchworkMHD</w:t>
+      </w:r>
+      <w:r>
+        <w:tab/>
+      </w:r>
+      <w:r>
+        <w:t xml:space="preserve">Feb 2021 – Apr 2022</w:t>
+      </w:r>
+    </w:p>
+    <w:p>
+      <w:pPr>
+        <w:keepNext/>
+        <w:tabs>
+          <w:tab w:val="right" w:pos="10512"/>
+        </w:tabs>
+        <w:spacing w:after="0"/>
+      </w:pPr>
+      <w:r>
+        <w:rPr>
+          <w:i/>
+          <w:iCs/>
+        </w:rPr>
+        <w:t xml:space="preserve">Large-scale MHD simulation code (NSF project)</w:t>
+      </w:r>
+    </w:p>
+    <w:p>
+      <w:pPr>
+        <w:pStyle w:val="ListParagraph"/>
+        <w:numPr>
+          <w:ilvl w:val="0"/>
+          <w:numId w:val="2"/>
+        </w:numPr>
+        <w:spacing w:after="10"/>
+      </w:pPr>
+      <w:r>
+        <w:t xml:space="preserve">Led a 7-person upgrade of this production C code for HPC environments, adding black hole spin with under 5% runtime overhead.</w:t>
       </w:r>
     </w:p>
     <w:p>
@@ -3252,7 +3265,7 @@
       <w:r>
         <w:t xml:space="preserve">Video: </w:t>
       </w:r>
-      <w:hyperlink w:history="1" r:id="rIdcqmpd_baqrmphwcl55ukq">
+      <w:hyperlink w:history="1" r:id="rIdt0l7c5jm0nh25v-lexr8s">
         <w:r>
           <w:t xml:space="preserve">youtube.com/watch?v=BAZNWLNT69M</w:t>
         </w:r>
@@ -3423,7 +3436,7 @@
       <w:r>
         <w:t xml:space="preserve">Marcos Moshinsky Award for Best Poster. Video: </w:t>
       </w:r>
-      <w:hyperlink w:history="1" r:id="rIdsa8j0atsslu5nkfiv2m_3">
+      <w:hyperlink w:history="1" r:id="rIdjbjrfn7ctsfb0arjx5bqa">
         <w:r>
           <w:t xml:space="preserve">youtube.com/watch?v=0TJiKg7kOPI</w:t>
         </w:r>
@@ -4481,7 +4494,7 @@
       <w:pPr>
         <w:spacing w:after="0"/>
       </w:pPr>
-      <w:hyperlink w:history="1" r:id="rIdrkqhukxucxr-5qbxy6hwu">
+      <w:hyperlink w:history="1" r:id="rId8jf526ir6mphereolr27m">
         <w:r>
           <w:t xml:space="preserve">mexiciencia.github.io/post/anita</w:t>
         </w:r>
@@ -4541,7 +4554,7 @@
       <w:pPr>
         <w:spacing w:after="0"/>
       </w:pPr>
-      <w:hyperlink w:history="1" r:id="rIdldwvhfafc0a9j0jrylzs5">
+      <w:hyperlink w:history="1" r:id="rIdwgtbmsj10cvohmcfcqu6f">
         <w:r>
           <w:t xml:space="preserve">mexiciencia.github.io/post/modelo-sir</w:t>
         </w:r>
@@ -4604,7 +4617,7 @@
       <w:r>
         <w:t xml:space="preserve">Data analysis and modeling collaborator. </w:t>
       </w:r>
-      <w:hyperlink w:history="1" r:id="rId6-xnef6kdluwbidccorei">
+      <w:hyperlink w:history="1" r:id="rIdoyrq-sc2874hpyf6mk4na">
         <w:r>
           <w:t xml:space="preserve">mexiciencia.github.io/post/covid19</w:t>
         </w:r>

</xml_diff>

<commit_message>
Teaching-focused summary and outreach; fix duplicate CV teaching section
Rewrite the summary for teaching in resume.yaml and cv.yaml, add the
undergraduate outreach talks to the resume's Teaching and Mentoring, and
remove the duplicate Teaching and Mentoring section from cv.yaml so the
moderncv CV inputs teaching.tex once. Regenerate all outputs.

Co-Authored-By: Claude Sonnet 5.5 <noreply@anthropic.com>
</commit_message>
<xml_diff>
--- a/RuedaBecerrilJM-CV-plain.docx
+++ b/RuedaBecerrilJM-CV-plain.docx
@@ -28,7 +28,7 @@
       <w:r>
         <w:t xml:space="preserve">  |  </w:t>
       </w:r>
-      <w:hyperlink w:history="1" r:id="rIdh0tzwgzn_3v7o70_x0fqp">
+      <w:hyperlink w:history="1" r:id="rIdvvelzr0f0dbjcjjb-xiot">
         <w:r>
           <w:t xml:space="preserve">jm.ruebe@gmail.com</w:t>
         </w:r>
@@ -42,7 +42,7 @@
       <w:r>
         <w:t xml:space="preserve">  |  </w:t>
       </w:r>
-      <w:hyperlink w:history="1" r:id="rIdycnjbpe3jmgwpyynsvohn">
+      <w:hyperlink w:history="1" r:id="rIdjezsnoiq0mu-dszb1jofp">
         <w:r>
           <w:t xml:space="preserve">linkedin.com/in/jeruebe</w:t>
         </w:r>
@@ -53,7 +53,7 @@
         <w:spacing w:after="60"/>
         <w:jc w:val="center"/>
       </w:pPr>
-      <w:hyperlink w:history="1" r:id="rIdxz2g6itoeckregb2jbbbx">
+      <w:hyperlink w:history="1" r:id="rIdpa2t2u29cqjmvt0xybzg1">
         <w:r>
           <w:t xml:space="preserve">altjerue.github.io</w:t>
         </w:r>
@@ -61,7 +61,7 @@
       <w:r>
         <w:t xml:space="preserve">  |  </w:t>
       </w:r>
-      <w:hyperlink w:history="1" r:id="rId2fzvwrb-vrxvmvqlbqw9x">
+      <w:hyperlink w:history="1" r:id="rIdfjc5ke5c3ibj7mng8ot_a">
         <w:r>
           <w:t xml:space="preserve">github.com/altjerue</w:t>
         </w:r>
@@ -69,7 +69,7 @@
       <w:r>
         <w:t xml:space="preserve">  |  </w:t>
       </w:r>
-      <w:hyperlink w:history="1" r:id="rIdac5hs8twriampmsy4ydkt">
+      <w:hyperlink w:history="1" r:id="rIdderzdlznhp4pctqn5na7o">
         <w:r>
           <w:t xml:space="preserve">orcid.org/0000-0003-1988-1912</w:t>
         </w:r>
@@ -77,7 +77,7 @@
       <w:r>
         <w:t xml:space="preserve">  |  </w:t>
       </w:r>
-      <w:hyperlink w:history="1" r:id="rIdc3ajeq0yef816j2wfefts">
+      <w:hyperlink w:history="1" r:id="rId4pqmzfxafpxxclc6dch1e">
         <w:r>
           <w:t xml:space="preserve">Google Scholar</w:t>
         </w:r>
@@ -93,7 +93,7 @@
     </w:p>
     <w:p>
       <w:r>
-        <w:t xml:space="preserve">Physicist with a Ph.D. in Physics and over ten years of research experience in computational astrophysics, numerical methods, and high-performance computing. One term of classroom instruction at the graduate level and multi-year experience mentoring graduate researchers through the transition from confusion to independent work. Teaching approach built on intuition and critical thinking over memorization, and on collaborative problem-solving.</w:t>
+        <w:t xml:space="preserve">Physicist (Ph.D. and M.Sc. in Physics) with ten years of research in computational astrophysics. Taught a graduate thermodynamics course, mentored three graduate researchers who co-authored papers with me, and gave talks to undergraduate physics students. Teaching approach built on intuition, critical thinking, and collaborative problem-solving.</w:t>
       </w:r>
     </w:p>
     <w:p>
@@ -1399,7 +1399,7 @@
       <w:r>
         <w:t xml:space="preserve">Thesis: </w:t>
       </w:r>
-      <w:hyperlink w:history="1" r:id="rIdl1gry6-mh1km3mh8ts9i6">
+      <w:hyperlink w:history="1" r:id="rIdctn4jx9zjhxiikqyhrw-h">
         <w:r>
           <w:t xml:space="preserve">Numerical treatment of radiation processes in the internal shocks of magnetized relativistic outflows</w:t>
         </w:r>
@@ -1696,7 +1696,7 @@
       <w:r>
         <w:t xml:space="preserve">, </w:t>
       </w:r>
-      <w:hyperlink w:history="1" r:id="rIdx1n45zahiuh5zrhe3hngg">
+      <w:hyperlink w:history="1" r:id="rIdjc7m9yrop7xh57hlfnbox">
         <w:r>
           <w:t xml:space="preserve">ApJ 976, 182 (2024)</w:t>
         </w:r>
@@ -1704,7 +1704,7 @@
       <w:r>
         <w:t xml:space="preserve">, </w:t>
       </w:r>
-      <w:hyperlink w:history="1" r:id="rIdke2jkif3g_unbnwtelxvj">
+      <w:hyperlink w:history="1" r:id="rIdtidympbqa4hr3z4l9c4hk">
         <w:r>
           <w:t xml:space="preserve">arXiv:2405.17581</w:t>
         </w:r>
@@ -1741,7 +1741,7 @@
       <w:r>
         <w:t xml:space="preserve">, </w:t>
       </w:r>
-      <w:hyperlink w:history="1" r:id="rIdjgnofjdsrfimxoo95ev9z">
+      <w:hyperlink w:history="1" r:id="rIdw_4n7k9mz2hywuxmvx4cf">
         <w:r>
           <w:t xml:space="preserve">MNRAS 513, 5766–5779 (2022)</w:t>
         </w:r>
@@ -1749,7 +1749,7 @@
       <w:r>
         <w:t xml:space="preserve">, </w:t>
       </w:r>
-      <w:hyperlink w:history="1" r:id="rIdj8lzgrre08m1uashuashb">
+      <w:hyperlink w:history="1" r:id="rId8rrgzafr-1_bkoyrwe9z9">
         <w:r>
           <w:t xml:space="preserve">arXiv:2201.07790</w:t>
         </w:r>
@@ -1786,7 +1786,7 @@
       <w:r>
         <w:t xml:space="preserve">, </w:t>
       </w:r>
-      <w:hyperlink w:history="1" r:id="rIdkqa94dwpncmtanjgjexrm">
+      <w:hyperlink w:history="1" r:id="rIdycuowmj824qnkezy7aidr">
         <w:r>
           <w:t xml:space="preserve">Phys. Rev. D 106, 083015 (2022)</w:t>
         </w:r>
@@ -1794,7 +1794,7 @@
       <w:r>
         <w:t xml:space="preserve">, </w:t>
       </w:r>
-      <w:hyperlink w:history="1" r:id="rIdnquwpsrqkqat3owemlclc">
+      <w:hyperlink w:history="1" r:id="rIdgvtn2hwilyyhfbkpyy6fe">
         <w:r>
           <w:t xml:space="preserve">arXiv:2112.09817</w:t>
         </w:r>
@@ -1831,7 +1831,7 @@
       <w:r>
         <w:t xml:space="preserve">, </w:t>
       </w:r>
-      <w:hyperlink w:history="1" r:id="rIdpork-ooypcuh2509crdya">
+      <w:hyperlink w:history="1" r:id="rIdgh3nrosv8d4jrmf4platr">
         <w:r>
           <w:t xml:space="preserve">ApJ 919, 95 (2021)</w:t>
         </w:r>
@@ -1839,7 +1839,7 @@
       <w:r>
         <w:t xml:space="preserve">, </w:t>
       </w:r>
-      <w:hyperlink w:history="1" r:id="rId4rgv-w36xs1i9usdad39n">
+      <w:hyperlink w:history="1" r:id="rIdjazvfbuzlstv6zn8w4crn">
         <w:r>
           <w:t xml:space="preserve">arXiv:2106.05356</w:t>
         </w:r>
@@ -1876,7 +1876,7 @@
       <w:r>
         <w:t xml:space="preserve">, </w:t>
       </w:r>
-      <w:hyperlink w:history="1" r:id="rIdgdcsi2gmtf04kwbu25oxx">
+      <w:hyperlink w:history="1" r:id="rIdayyoz7faqqdonmuxhm-l4">
         <w:r>
           <w:t xml:space="preserve">MNRAS 501, 4092–4102 (2021)</w:t>
         </w:r>
@@ -1884,7 +1884,7 @@
       <w:r>
         <w:t xml:space="preserve">, </w:t>
       </w:r>
-      <w:hyperlink w:history="1" r:id="rIdtj16kaky_lnol3r_uthtb">
+      <w:hyperlink w:history="1" r:id="rId7xrwj_prkl4ibhjfmulw4">
         <w:r>
           <w:t xml:space="preserve">arXiv:2009.02273</w:t>
         </w:r>
@@ -1921,7 +1921,7 @@
       <w:r>
         <w:t xml:space="preserve">, </w:t>
       </w:r>
-      <w:hyperlink w:history="1" r:id="rIdosauvkjjahfklhqvde--y">
+      <w:hyperlink w:history="1" r:id="rId8mfaho46ah2t-4kmtqtv2">
         <w:r>
           <w:t xml:space="preserve">MNRAS 496, 974–986 (2020)</w:t>
         </w:r>
@@ -1929,7 +1929,7 @@
       <w:r>
         <w:t xml:space="preserve">, </w:t>
       </w:r>
-      <w:hyperlink w:history="1" r:id="rIdqeojsn4edrfdl-zvnkkml">
+      <w:hyperlink w:history="1" r:id="rIdqlcrjpaxyo4wgmacjs0wo">
         <w:r>
           <w:t xml:space="preserve">arXiv:1910.14049</w:t>
         </w:r>
@@ -1966,7 +1966,7 @@
       <w:r>
         <w:t xml:space="preserve">, </w:t>
       </w:r>
-      <w:hyperlink w:history="1" r:id="rId7tg-wvp-lctyj8pr3dt-e">
+      <w:hyperlink w:history="1" r:id="rIdopdvyitrs0anbxjby_ick">
         <w:r>
           <w:t xml:space="preserve">MNRAS 468, 1169–1182 (2017)</w:t>
         </w:r>
@@ -1974,7 +1974,7 @@
       <w:r>
         <w:t xml:space="preserve">, </w:t>
       </w:r>
-      <w:hyperlink w:history="1" r:id="rIdhnkzrlhpohvcxchw0b37c">
+      <w:hyperlink w:history="1" r:id="rIdwttrkbcf6ruo9sm8xoj9k">
         <w:r>
           <w:t xml:space="preserve">arXiv:1612.06383</w:t>
         </w:r>
@@ -2011,7 +2011,7 @@
       <w:r>
         <w:t xml:space="preserve">, </w:t>
       </w:r>
-      <w:hyperlink w:history="1" r:id="rIdmjfsfq2d9-ixm0ny76vez">
+      <w:hyperlink w:history="1" r:id="rIdmuq5uexmfq6_ihmr591u6">
         <w:r>
           <w:t xml:space="preserve">MNRAS 438, 1856–1869 (2014)</w:t>
         </w:r>
@@ -2019,7 +2019,7 @@
       <w:r>
         <w:t xml:space="preserve">, </w:t>
       </w:r>
-      <w:hyperlink w:history="1" r:id="rIdn8th6bzrpi-da5j4ds497">
+      <w:hyperlink w:history="1" r:id="rIdpe6rwzdqofih1e8dvddxn">
         <w:r>
           <w:t xml:space="preserve">arXiv:1310.5441</w:t>
         </w:r>
@@ -2056,7 +2056,7 @@
       <w:r>
         <w:t xml:space="preserve">, </w:t>
       </w:r>
-      <w:hyperlink w:history="1" r:id="rIdvvmstqoe3p4rsps_asfif">
+      <w:hyperlink w:history="1" r:id="rIdpovieeimgao1riorwbq3-">
         <w:r>
           <w:t xml:space="preserve">Phys. Rev. D 80, 084023 (2009)</w:t>
         </w:r>
@@ -2064,7 +2064,7 @@
       <w:r>
         <w:t xml:space="preserve">, </w:t>
       </w:r>
-      <w:hyperlink w:history="1" r:id="rIdmqrp0bfgizxhb1xqhq2e7">
+      <w:hyperlink w:history="1" r:id="rIde3bnaxpuhqg8qozfh9hxb">
         <w:r>
           <w:t xml:space="preserve">arXiv:1009.1250</w:t>
         </w:r>
@@ -2109,7 +2109,7 @@
       <w:r>
         <w:t xml:space="preserve">, </w:t>
       </w:r>
-      <w:hyperlink w:history="1" r:id="rIduuhknpt2_cdlkcliudbeu">
+      <w:hyperlink w:history="1" r:id="rIdvdjlazwcx4cktfeczxgm-">
         <w:r>
           <w:t xml:space="preserve">Astron. Nachr. 342, 277–282 (2021)</w:t>
         </w:r>
@@ -2117,7 +2117,7 @@
       <w:r>
         <w:t xml:space="preserve">, 9th International Workshop on Astronomy and Relativistic Astrophysics, </w:t>
       </w:r>
-      <w:hyperlink w:history="1" r:id="rId9ghx1xygih4dce6dykwa3">
+      <w:hyperlink w:history="1" r:id="rIdbnemtpdmatgwcylopmcii">
         <w:r>
           <w:t xml:space="preserve">arXiv:2011.13797</w:t>
         </w:r>
@@ -2154,7 +2154,7 @@
       <w:r>
         <w:t xml:space="preserve">, </w:t>
       </w:r>
-      <w:hyperlink w:history="1" r:id="rIdapnxtk3xq-snlvgvfz0w7">
+      <w:hyperlink w:history="1" r:id="rIdfoars0p1mkmj1xqbfzylq">
         <w:r>
           <w:t xml:space="preserve">Astron. Nachr. 342, 147–152 (2021)</w:t>
         </w:r>
@@ -2162,7 +2162,7 @@
       <w:r>
         <w:t xml:space="preserve">, 9th International Workshop on Astronomy and Relativistic Astrophysics, </w:t>
       </w:r>
-      <w:hyperlink w:history="1" r:id="rIdf3rbrx3rzorgkruiymzcu">
+      <w:hyperlink w:history="1" r:id="rId0ws274pxcviwp0sebugmk">
         <w:r>
           <w:t xml:space="preserve">arXiv:2011.13805</w:t>
         </w:r>
@@ -2199,7 +2199,7 @@
       <w:r>
         <w:t xml:space="preserve">, </w:t>
       </w:r>
-      <w:hyperlink w:history="1" r:id="rIdhv0gg531-n0-k_d1lpedn">
+      <w:hyperlink w:history="1" r:id="rIdq6c3cwj56fhuee460rdqa">
         <w:r>
           <w:t xml:space="preserve">PoS(SWIFT 10) 233, 159 (2014)</w:t>
         </w:r>
@@ -2207,7 +2207,7 @@
       <w:r>
         <w:t xml:space="preserve">, </w:t>
       </w:r>
-      <w:hyperlink w:history="1" r:id="rIdt0jbymko6q2rbqrpiucdr">
+      <w:hyperlink w:history="1" r:id="rIdb5tubdqfudsef_luxz5fw">
         <w:r>
           <w:t xml:space="preserve">arXiv:1502.07882</w:t>
         </w:r>
@@ -2244,7 +2244,7 @@
       <w:r>
         <w:t xml:space="preserve">, </w:t>
       </w:r>
-      <w:hyperlink w:history="1" r:id="rIdqkq_7tbpb-mmgc7tggpse">
+      <w:hyperlink w:history="1" r:id="rId80jdi57h8sd6d2m8tixer">
         <w:r>
           <w:t xml:space="preserve">EPJ Web Conf. 61, 02007 (2013)</w:t>
         </w:r>
@@ -2252,7 +2252,7 @@
       <w:r>
         <w:t xml:space="preserve">, </w:t>
       </w:r>
-      <w:hyperlink w:history="1" r:id="rIdasvyutk-hugaroyhhkgse">
+      <w:hyperlink w:history="1" r:id="rIdbmntbegdzf3aokn4gjne8">
         <w:r>
           <w:t xml:space="preserve">arXiv:1309.4612</w:t>
         </w:r>
@@ -2289,7 +2289,7 @@
       <w:r>
         <w:t xml:space="preserve">, </w:t>
       </w:r>
-      <w:hyperlink w:history="1" r:id="rIdbcl0phqxc19pvl2uyz7zp">
+      <w:hyperlink w:history="1" r:id="rIdanns17n7jpoqlnn-ti3cb">
         <w:r>
           <w:t xml:space="preserve">J. Phys.: Conf. Ser. 454, 012001 (2013)</w:t>
         </w:r>
@@ -2297,7 +2297,7 @@
       <w:r>
         <w:t xml:space="preserve">, </w:t>
       </w:r>
-      <w:hyperlink w:history="1" r:id="rId7i8y1l7ey882gns5d3lxj">
+      <w:hyperlink w:history="1" r:id="rId1t8lti-zpfu-ui4q_kd_r">
         <w:r>
           <w:t xml:space="preserve">arXiv:1211.1794</w:t>
         </w:r>
@@ -2700,7 +2700,7 @@
       <w:r>
         <w:tab/>
       </w:r>
-      <w:hyperlink w:history="1" r:id="rIdj5e-1mhnuabln6zvgtavr">
+      <w:hyperlink w:history="1" r:id="rId2w5uny4fa8pg08s8ldfit">
         <w:r>
           <w:t xml:space="preserve">github.com/altjerue/ilwikak-ml</w:t>
         </w:r>
@@ -2791,7 +2791,7 @@
       <w:r>
         <w:tab/>
       </w:r>
-      <w:hyperlink w:history="1" r:id="rIdd9bsq-2yv2qddpq7ewnhq">
+      <w:hyperlink w:history="1" r:id="rIdws3-dkorgdbvrgns-esev">
         <w:r>
           <w:t xml:space="preserve">github.com/UW-ForestMycobiomeLab/WindSporesHills</w:t>
         </w:r>
@@ -2856,7 +2856,7 @@
       <w:r>
         <w:tab/>
       </w:r>
-      <w:hyperlink w:history="1" r:id="rIdpnpfgv48epafcfi31xpt7">
+      <w:hyperlink w:history="1" r:id="rId1v--gag9hzdhrtxrz688d">
         <w:r>
           <w:t xml:space="preserve">github.com/zkdavis/Tleco</w:t>
         </w:r>
@@ -2921,7 +2921,7 @@
       <w:r>
         <w:tab/>
       </w:r>
-      <w:hyperlink w:history="1" r:id="rId8fzi0gwd8q4uvbzkwbto6">
+      <w:hyperlink w:history="1" r:id="rId1pohprvd-p9zru-2k3un8">
         <w:r>
           <w:t xml:space="preserve">github.com/altjerue/paramo</w:t>
         </w:r>
@@ -3532,7 +3532,7 @@
       <w:r>
         <w:t xml:space="preserve">Video: </w:t>
       </w:r>
-      <w:hyperlink w:history="1" r:id="rIdg_4byweyjxyhjwxokbwz_">
+      <w:hyperlink w:history="1" r:id="rId8nk3pbdo8oluzcfy-ury5">
         <w:r>
           <w:t xml:space="preserve">youtube.com/watch?v=BAZNWLNT69M</w:t>
         </w:r>
@@ -3703,7 +3703,7 @@
       <w:r>
         <w:t xml:space="preserve">Marcos Moshinsky Award for Best Poster. Video: </w:t>
       </w:r>
-      <w:hyperlink w:history="1" r:id="rIdrqzx66mzim7tiskxiqzrc">
+      <w:hyperlink w:history="1" r:id="rIdoqignxwpd-8p5hkx0uace">
         <w:r>
           <w:t xml:space="preserve">youtube.com/watch?v=0TJiKg7kOPI</w:t>
         </w:r>
@@ -3820,225 +3820,551 @@
         <w:pStyle w:val="Heading1"/>
       </w:pPr>
       <w:r>
-        <w:t xml:space="preserve">Teaching and Mentoring</w:t>
-      </w:r>
-    </w:p>
-    <w:p>
-      <w:pPr>
-        <w:keepNext/>
-        <w:tabs>
-          <w:tab w:val="right" w:pos="10512"/>
-        </w:tabs>
-        <w:spacing w:after="0"/>
-      </w:pPr>
-      <w:r>
-        <w:rPr>
-          <w:b/>
-          <w:bCs/>
-        </w:rPr>
-        <w:t xml:space="preserve">Zachary Davis, graduate student</w:t>
-      </w:r>
-      <w:r>
-        <w:tab/>
-      </w:r>
-      <w:r>
-        <w:t xml:space="preserve">2018 – 2022</w:t>
-      </w:r>
-    </w:p>
-    <w:p>
-      <w:pPr>
-        <w:keepNext/>
-        <w:tabs>
-          <w:tab w:val="right" w:pos="10512"/>
-        </w:tabs>
-        <w:spacing w:after="0"/>
-      </w:pPr>
-      <w:r>
-        <w:rPr>
-          <w:i/>
-          <w:iCs/>
-        </w:rPr>
-        <w:t xml:space="preserve">Department of Physics and Astronomy, Purdue University</w:t>
-      </w:r>
-      <w:r>
-        <w:tab/>
-      </w:r>
-      <w:r>
-        <w:t xml:space="preserve">Mentoring</w:t>
-      </w:r>
-    </w:p>
-    <w:p>
-      <w:pPr>
-        <w:spacing w:after="0"/>
-      </w:pPr>
-      <w:r>
-        <w:t xml:space="preserve">Co-authored papers [8, 9]</w:t>
-      </w:r>
-    </w:p>
-    <w:p>
-      <w:pPr>
-        <w:pStyle w:val="EntryGap"/>
-        <w:spacing w:after="0"/>
-      </w:pPr>
-    </w:p>
-    <w:p>
-      <w:pPr>
-        <w:keepNext/>
-        <w:tabs>
-          <w:tab w:val="right" w:pos="10512"/>
-        </w:tabs>
-        <w:spacing w:after="0"/>
-      </w:pPr>
-      <w:r>
-        <w:rPr>
-          <w:b/>
-          <w:bCs/>
-        </w:rPr>
-        <w:t xml:space="preserve">Amanda O. Harrison, graduate student</w:t>
-      </w:r>
-      <w:r>
-        <w:tab/>
-      </w:r>
-      <w:r>
-        <w:t xml:space="preserve">2018 – 2020</w:t>
-      </w:r>
-    </w:p>
-    <w:p>
-      <w:pPr>
-        <w:keepNext/>
-        <w:tabs>
-          <w:tab w:val="right" w:pos="10512"/>
-        </w:tabs>
-        <w:spacing w:after="0"/>
-      </w:pPr>
-      <w:r>
-        <w:rPr>
-          <w:i/>
-          <w:iCs/>
-        </w:rPr>
-        <w:t xml:space="preserve">Department of Physics and Astronomy, Purdue University</w:t>
-      </w:r>
-      <w:r>
-        <w:tab/>
-      </w:r>
-      <w:r>
-        <w:t xml:space="preserve">Mentoring</w:t>
-      </w:r>
-    </w:p>
-    <w:p>
-      <w:pPr>
-        <w:spacing w:after="0"/>
-      </w:pPr>
-      <w:r>
-        <w:t xml:space="preserve">Co-authored paper [5]</w:t>
-      </w:r>
-    </w:p>
-    <w:p>
-      <w:pPr>
-        <w:pStyle w:val="EntryGap"/>
-        <w:spacing w:after="0"/>
-      </w:pPr>
-    </w:p>
-    <w:p>
-      <w:pPr>
-        <w:keepNext/>
-        <w:tabs>
-          <w:tab w:val="right" w:pos="10512"/>
-        </w:tabs>
-        <w:spacing w:after="0"/>
-      </w:pPr>
-      <w:r>
-        <w:rPr>
-          <w:b/>
-          <w:bCs/>
-        </w:rPr>
-        <w:t xml:space="preserve">Hao Zhang, graduate student</w:t>
-      </w:r>
-      <w:r>
-        <w:tab/>
-      </w:r>
-      <w:r>
-        <w:t xml:space="preserve">2018 – 2019</w:t>
-      </w:r>
-    </w:p>
-    <w:p>
-      <w:pPr>
-        <w:keepNext/>
-        <w:tabs>
-          <w:tab w:val="right" w:pos="10512"/>
-        </w:tabs>
-        <w:spacing w:after="0"/>
-      </w:pPr>
-      <w:r>
-        <w:rPr>
-          <w:i/>
-          <w:iCs/>
-        </w:rPr>
-        <w:t xml:space="preserve">Department of Physics and Astronomy, Purdue University</w:t>
-      </w:r>
-      <w:r>
-        <w:tab/>
-      </w:r>
-      <w:r>
-        <w:t xml:space="preserve">Mentoring</w:t>
-      </w:r>
-    </w:p>
-    <w:p>
-      <w:pPr>
-        <w:spacing w:after="0"/>
-      </w:pPr>
-      <w:r>
-        <w:t xml:space="preserve">Co-authored paper [4]</w:t>
-      </w:r>
-    </w:p>
-    <w:p>
-      <w:pPr>
-        <w:pStyle w:val="EntryGap"/>
-        <w:spacing w:after="0"/>
-      </w:pPr>
-    </w:p>
-    <w:p>
-      <w:pPr>
-        <w:keepNext/>
-        <w:tabs>
-          <w:tab w:val="right" w:pos="10512"/>
-        </w:tabs>
-        <w:spacing w:after="0"/>
-      </w:pPr>
-      <w:r>
-        <w:rPr>
-          <w:b/>
-          <w:bCs/>
-        </w:rPr>
-        <w:t xml:space="preserve">Thermodynamics (graduate level)</w:t>
-      </w:r>
-      <w:r>
-        <w:tab/>
-      </w:r>
-      <w:r>
-        <w:t xml:space="preserve">Jun 2018</w:t>
-      </w:r>
-    </w:p>
-    <w:p>
-      <w:pPr>
-        <w:keepNext/>
-        <w:tabs>
-          <w:tab w:val="right" w:pos="10512"/>
-        </w:tabs>
-        <w:spacing w:after="0"/>
-      </w:pPr>
-      <w:r>
-        <w:rPr>
-          <w:i/>
-          <w:iCs/>
-        </w:rPr>
-        <w:t xml:space="preserve">Instituto de Física y Matemáticas, Universidad Michoacana de San Nicolás de Hidalgo</w:t>
-      </w:r>
-      <w:r>
-        <w:tab/>
-      </w:r>
-      <w:r>
-        <w:t xml:space="preserve">Substitute Instructor</w:t>
+        <w:t xml:space="preserve">Professional Development</w:t>
+      </w:r>
+    </w:p>
+    <w:p>
+      <w:pPr>
+        <w:keepNext/>
+        <w:tabs>
+          <w:tab w:val="right" w:pos="10512"/>
+        </w:tabs>
+        <w:spacing w:after="0"/>
+      </w:pPr>
+      <w:r>
+        <w:rPr>
+          <w:b/>
+          <w:bCs/>
+        </w:rPr>
+        <w:t xml:space="preserve">High Performance Computing on Frontera</w:t>
+      </w:r>
+      <w:r>
+        <w:tab/>
+      </w:r>
+      <w:r>
+        <w:t xml:space="preserve">May – Jun 2021</w:t>
+      </w:r>
+    </w:p>
+    <w:p>
+      <w:pPr>
+        <w:keepNext/>
+        <w:tabs>
+          <w:tab w:val="right" w:pos="10512"/>
+        </w:tabs>
+        <w:spacing w:after="0"/>
+      </w:pPr>
+      <w:r>
+        <w:rPr>
+          <w:i/>
+          <w:iCs/>
+        </w:rPr>
+        <w:t xml:space="preserve">Jason Allison et al., TACC, Austin, TX</w:t>
+      </w:r>
+      <w:r>
+        <w:tab/>
+      </w:r>
+      <w:r>
+        <w:t xml:space="preserve">Lecture series</w:t>
+      </w:r>
+    </w:p>
+    <w:p>
+      <w:pPr>
+        <w:pStyle w:val="EntryGap"/>
+        <w:spacing w:after="0"/>
+      </w:pPr>
+    </w:p>
+    <w:p>
+      <w:pPr>
+        <w:keepNext/>
+        <w:tabs>
+          <w:tab w:val="right" w:pos="10512"/>
+        </w:tabs>
+        <w:spacing w:after="0"/>
+      </w:pPr>
+      <w:r>
+        <w:rPr>
+          <w:b/>
+          <w:bCs/>
+        </w:rPr>
+        <w:t xml:space="preserve">Writing Winning Grants</w:t>
+      </w:r>
+      <w:r>
+        <w:tab/>
+      </w:r>
+      <w:r>
+        <w:t xml:space="preserve">Nov 2019</w:t>
+      </w:r>
+    </w:p>
+    <w:p>
+      <w:pPr>
+        <w:keepNext/>
+        <w:tabs>
+          <w:tab w:val="right" w:pos="10512"/>
+        </w:tabs>
+        <w:spacing w:after="0"/>
+      </w:pPr>
+      <w:r>
+        <w:rPr>
+          <w:i/>
+          <w:iCs/>
+        </w:rPr>
+        <w:t xml:space="preserve">Dr. Lauren Broyles, Purdue University</w:t>
+      </w:r>
+      <w:r>
+        <w:tab/>
+      </w:r>
+      <w:r>
+        <w:t xml:space="preserve">Lecture</w:t>
+      </w:r>
+    </w:p>
+    <w:p>
+      <w:pPr>
+        <w:pStyle w:val="EntryGap"/>
+        <w:spacing w:after="0"/>
+      </w:pPr>
+    </w:p>
+    <w:p>
+      <w:pPr>
+        <w:keepNext/>
+        <w:tabs>
+          <w:tab w:val="right" w:pos="10512"/>
+        </w:tabs>
+        <w:spacing w:after="0"/>
+      </w:pPr>
+      <w:r>
+        <w:rPr>
+          <w:b/>
+          <w:bCs/>
+        </w:rPr>
+        <w:t xml:space="preserve">XSEDE HPC Workshop: Summer Boot Camp</w:t>
+      </w:r>
+      <w:r>
+        <w:tab/>
+      </w:r>
+      <w:r>
+        <w:t xml:space="preserve">Jun 2019</w:t>
+      </w:r>
+    </w:p>
+    <w:p>
+      <w:pPr>
+        <w:keepNext/>
+        <w:tabs>
+          <w:tab w:val="right" w:pos="10512"/>
+        </w:tabs>
+        <w:spacing w:after="0"/>
+      </w:pPr>
+      <w:r>
+        <w:rPr>
+          <w:i/>
+          <w:iCs/>
+        </w:rPr>
+        <w:t xml:space="preserve">John Urbanic, Purdue University</w:t>
+      </w:r>
+      <w:r>
+        <w:tab/>
+      </w:r>
+      <w:r>
+        <w:t xml:space="preserve">Workshop</w:t>
+      </w:r>
+    </w:p>
+    <w:p>
+      <w:pPr>
+        <w:pStyle w:val="EntryGap"/>
+        <w:spacing w:after="0"/>
+      </w:pPr>
+    </w:p>
+    <w:p>
+      <w:pPr>
+        <w:keepNext/>
+        <w:tabs>
+          <w:tab w:val="right" w:pos="10512"/>
+        </w:tabs>
+        <w:spacing w:after="0"/>
+      </w:pPr>
+      <w:r>
+        <w:rPr>
+          <w:b/>
+          <w:bCs/>
+        </w:rPr>
+        <w:t xml:space="preserve">Data Analysis and Machine Learning with Python</w:t>
+      </w:r>
+      <w:r>
+        <w:tab/>
+      </w:r>
+      <w:r>
+        <w:t xml:space="preserve">Feb 2017</w:t>
+      </w:r>
+    </w:p>
+    <w:p>
+      <w:pPr>
+        <w:keepNext/>
+        <w:tabs>
+          <w:tab w:val="right" w:pos="10512"/>
+        </w:tabs>
+        <w:spacing w:after="0"/>
+      </w:pPr>
+      <w:r>
+        <w:rPr>
+          <w:i/>
+          <w:iCs/>
+        </w:rPr>
+        <w:t xml:space="preserve">Dr. Alejandro Torres, Universitat de València</w:t>
+      </w:r>
+      <w:r>
+        <w:tab/>
+      </w:r>
+      <w:r>
+        <w:t xml:space="preserve">Workshop</w:t>
+      </w:r>
+    </w:p>
+    <w:p>
+      <w:pPr>
+        <w:pStyle w:val="EntryGap"/>
+        <w:spacing w:after="0"/>
+      </w:pPr>
+    </w:p>
+    <w:p>
+      <w:pPr>
+        <w:keepNext/>
+        <w:tabs>
+          <w:tab w:val="right" w:pos="10512"/>
+        </w:tabs>
+        <w:spacing w:after="0"/>
+      </w:pPr>
+      <w:r>
+        <w:rPr>
+          <w:b/>
+          <w:bCs/>
+        </w:rPr>
+        <w:t xml:space="preserve">Numerical Relativity Simulations of BBH Coalescence Using the Einstein Toolkit</w:t>
+      </w:r>
+      <w:r>
+        <w:tab/>
+      </w:r>
+      <w:r>
+        <w:t xml:space="preserve">Jul 2016</w:t>
+      </w:r>
+    </w:p>
+    <w:p>
+      <w:pPr>
+        <w:keepNext/>
+        <w:tabs>
+          <w:tab w:val="right" w:pos="10512"/>
+        </w:tabs>
+        <w:spacing w:after="0"/>
+      </w:pPr>
+      <w:r>
+        <w:rPr>
+          <w:i/>
+          <w:iCs/>
+        </w:rPr>
+        <w:t xml:space="preserve">Dr. Vassilios Mewes, Universitat de València</w:t>
+      </w:r>
+      <w:r>
+        <w:tab/>
+      </w:r>
+      <w:r>
+        <w:t xml:space="preserve">Workshop, 8 hours</w:t>
+      </w:r>
+    </w:p>
+    <w:p>
+      <w:pPr>
+        <w:pStyle w:val="EntryGap"/>
+        <w:spacing w:after="0"/>
+      </w:pPr>
+    </w:p>
+    <w:p>
+      <w:pPr>
+        <w:keepNext/>
+        <w:tabs>
+          <w:tab w:val="right" w:pos="10512"/>
+        </w:tabs>
+        <w:spacing w:after="0"/>
+      </w:pPr>
+      <w:r>
+        <w:rPr>
+          <w:b/>
+          <w:bCs/>
+        </w:rPr>
+        <w:t xml:space="preserve">The Universe in the Light of PLANCK and BICEP2</w:t>
+      </w:r>
+      <w:r>
+        <w:tab/>
+      </w:r>
+      <w:r>
+        <w:t xml:space="preserve">May 2014</w:t>
+      </w:r>
+    </w:p>
+    <w:p>
+      <w:pPr>
+        <w:keepNext/>
+        <w:tabs>
+          <w:tab w:val="right" w:pos="10512"/>
+        </w:tabs>
+        <w:spacing w:after="0"/>
+      </w:pPr>
+      <w:r>
+        <w:rPr>
+          <w:i/>
+          <w:iCs/>
+        </w:rPr>
+        <w:t xml:space="preserve">Prof. Nick Mavromatos, Universitat de València</w:t>
+      </w:r>
+      <w:r>
+        <w:tab/>
+      </w:r>
+      <w:r>
+        <w:t xml:space="preserve">Lecture series, 2 credits</w:t>
+      </w:r>
+    </w:p>
+    <w:p>
+      <w:pPr>
+        <w:pStyle w:val="EntryGap"/>
+        <w:spacing w:after="0"/>
+      </w:pPr>
+    </w:p>
+    <w:p>
+      <w:pPr>
+        <w:keepNext/>
+        <w:tabs>
+          <w:tab w:val="right" w:pos="10512"/>
+        </w:tabs>
+        <w:spacing w:after="0"/>
+      </w:pPr>
+      <w:r>
+        <w:rPr>
+          <w:b/>
+          <w:bCs/>
+        </w:rPr>
+        <w:t xml:space="preserve">Dark Matter</w:t>
+      </w:r>
+      <w:r>
+        <w:tab/>
+      </w:r>
+      <w:r>
+        <w:t xml:space="preserve">Sep 2013</w:t>
+      </w:r>
+    </w:p>
+    <w:p>
+      <w:pPr>
+        <w:keepNext/>
+        <w:tabs>
+          <w:tab w:val="right" w:pos="10512"/>
+        </w:tabs>
+        <w:spacing w:after="0"/>
+      </w:pPr>
+      <w:r>
+        <w:rPr>
+          <w:i/>
+          <w:iCs/>
+        </w:rPr>
+        <w:t xml:space="preserve">Prof. Alejandro Ibarra, Universitat de València</w:t>
+      </w:r>
+      <w:r>
+        <w:tab/>
+      </w:r>
+      <w:r>
+        <w:t xml:space="preserve">Lecture series, 2 credits</w:t>
+      </w:r>
+    </w:p>
+    <w:p>
+      <w:pPr>
+        <w:pStyle w:val="EntryGap"/>
+        <w:spacing w:after="0"/>
+      </w:pPr>
+    </w:p>
+    <w:p>
+      <w:pPr>
+        <w:keepNext/>
+        <w:tabs>
+          <w:tab w:val="right" w:pos="10512"/>
+        </w:tabs>
+        <w:spacing w:after="0"/>
+      </w:pPr>
+      <w:r>
+        <w:rPr>
+          <w:b/>
+          <w:bCs/>
+        </w:rPr>
+        <w:t xml:space="preserve">International Cargèse School on Cosmic Accelerators</w:t>
+      </w:r>
+      <w:r>
+        <w:tab/>
+      </w:r>
+      <w:r>
+        <w:t xml:space="preserve">Apr – May 2013</w:t>
+      </w:r>
+    </w:p>
+    <w:p>
+      <w:pPr>
+        <w:keepNext/>
+        <w:tabs>
+          <w:tab w:val="right" w:pos="10512"/>
+        </w:tabs>
+        <w:spacing w:after="0"/>
+      </w:pPr>
+      <w:r>
+        <w:rPr>
+          <w:i/>
+          <w:iCs/>
+        </w:rPr>
+        <w:t xml:space="preserve">Institut d'Études Scientifiques de Cargèse, France</w:t>
+      </w:r>
+      <w:r>
+        <w:tab/>
+      </w:r>
+      <w:r>
+        <w:t xml:space="preserve">Summer school</w:t>
+      </w:r>
+    </w:p>
+    <w:p>
+      <w:pPr>
+        <w:pStyle w:val="EntryGap"/>
+        <w:spacing w:after="0"/>
+      </w:pPr>
+    </w:p>
+    <w:p>
+      <w:pPr>
+        <w:keepNext/>
+        <w:tabs>
+          <w:tab w:val="right" w:pos="10512"/>
+        </w:tabs>
+        <w:spacing w:after="0"/>
+      </w:pPr>
+      <w:r>
+        <w:rPr>
+          <w:b/>
+          <w:bCs/>
+        </w:rPr>
+        <w:t xml:space="preserve">Introduction to C++ Programming</w:t>
+      </w:r>
+      <w:r>
+        <w:tab/>
+      </w:r>
+      <w:r>
+        <w:t xml:space="preserve">Apr 2012</w:t>
+      </w:r>
+    </w:p>
+    <w:p>
+      <w:pPr>
+        <w:keepNext/>
+        <w:tabs>
+          <w:tab w:val="right" w:pos="10512"/>
+        </w:tabs>
+        <w:spacing w:after="0"/>
+      </w:pPr>
+      <w:r>
+        <w:rPr>
+          <w:i/>
+          <w:iCs/>
+        </w:rPr>
+        <w:t xml:space="preserve">Dr. Jacek Generowicz, Universitat de València</w:t>
+      </w:r>
+      <w:r>
+        <w:tab/>
+      </w:r>
+      <w:r>
+        <w:t xml:space="preserve">Workshop, 6 credits</w:t>
+      </w:r>
+    </w:p>
+    <w:p>
+      <w:pPr>
+        <w:pStyle w:val="EntryGap"/>
+        <w:spacing w:after="0"/>
+      </w:pPr>
+    </w:p>
+    <w:p>
+      <w:pPr>
+        <w:keepNext/>
+        <w:tabs>
+          <w:tab w:val="right" w:pos="10512"/>
+        </w:tabs>
+        <w:spacing w:after="0"/>
+      </w:pPr>
+      <w:r>
+        <w:rPr>
+          <w:b/>
+          <w:bCs/>
+        </w:rPr>
+        <w:t xml:space="preserve">Numerical Relativistic Astrophysics</w:t>
+      </w:r>
+      <w:r>
+        <w:tab/>
+      </w:r>
+      <w:r>
+        <w:t xml:space="preserve">Mar – Apr 2012</w:t>
+      </w:r>
+    </w:p>
+    <w:p>
+      <w:pPr>
+        <w:keepNext/>
+        <w:tabs>
+          <w:tab w:val="right" w:pos="10512"/>
+        </w:tabs>
+        <w:spacing w:after="0"/>
+      </w:pPr>
+      <w:r>
+        <w:rPr>
+          <w:i/>
+          <w:iCs/>
+        </w:rPr>
+        <w:t xml:space="preserve">Prof. Luciano Rezzolla, Universitat de València</w:t>
+      </w:r>
+      <w:r>
+        <w:tab/>
+      </w:r>
+      <w:r>
+        <w:t xml:space="preserve">Lecture series, 9 hours</w:t>
+      </w:r>
+    </w:p>
+    <w:p>
+      <w:pPr>
+        <w:pStyle w:val="EntryGap"/>
+        <w:spacing w:after="0"/>
+      </w:pPr>
+    </w:p>
+    <w:p>
+      <w:pPr>
+        <w:keepNext/>
+        <w:tabs>
+          <w:tab w:val="right" w:pos="10512"/>
+        </w:tabs>
+        <w:spacing w:after="0"/>
+      </w:pPr>
+      <w:r>
+        <w:rPr>
+          <w:b/>
+          <w:bCs/>
+        </w:rPr>
+        <w:t xml:space="preserve">Fortran for Scientific Computing</w:t>
+      </w:r>
+      <w:r>
+        <w:tab/>
+      </w:r>
+      <w:r>
+        <w:t xml:space="preserve">Mar 2012</w:t>
+      </w:r>
+    </w:p>
+    <w:p>
+      <w:pPr>
+        <w:keepNext/>
+        <w:tabs>
+          <w:tab w:val="right" w:pos="10512"/>
+        </w:tabs>
+        <w:spacing w:after="0"/>
+      </w:pPr>
+      <w:r>
+        <w:rPr>
+          <w:i/>
+          <w:iCs/>
+        </w:rPr>
+        <w:t xml:space="preserve">HLRS, University of Stuttgart, Germany</w:t>
+      </w:r>
+      <w:r>
+        <w:tab/>
+      </w:r>
+      <w:r>
+        <w:t xml:space="preserve">Workshop, 33 hours</w:t>
       </w:r>
     </w:p>
     <w:p>
@@ -4052,564 +4378,6 @@
         <w:pStyle w:val="Heading1"/>
       </w:pPr>
       <w:r>
-        <w:t xml:space="preserve">Professional Development</w:t>
-      </w:r>
-    </w:p>
-    <w:p>
-      <w:pPr>
-        <w:keepNext/>
-        <w:tabs>
-          <w:tab w:val="right" w:pos="10512"/>
-        </w:tabs>
-        <w:spacing w:after="0"/>
-      </w:pPr>
-      <w:r>
-        <w:rPr>
-          <w:b/>
-          <w:bCs/>
-        </w:rPr>
-        <w:t xml:space="preserve">High Performance Computing on Frontera</w:t>
-      </w:r>
-      <w:r>
-        <w:tab/>
-      </w:r>
-      <w:r>
-        <w:t xml:space="preserve">May – Jun 2021</w:t>
-      </w:r>
-    </w:p>
-    <w:p>
-      <w:pPr>
-        <w:keepNext/>
-        <w:tabs>
-          <w:tab w:val="right" w:pos="10512"/>
-        </w:tabs>
-        <w:spacing w:after="0"/>
-      </w:pPr>
-      <w:r>
-        <w:rPr>
-          <w:i/>
-          <w:iCs/>
-        </w:rPr>
-        <w:t xml:space="preserve">Jason Allison et al., TACC, Austin, TX</w:t>
-      </w:r>
-      <w:r>
-        <w:tab/>
-      </w:r>
-      <w:r>
-        <w:t xml:space="preserve">Lecture series</w:t>
-      </w:r>
-    </w:p>
-    <w:p>
-      <w:pPr>
-        <w:pStyle w:val="EntryGap"/>
-        <w:spacing w:after="0"/>
-      </w:pPr>
-    </w:p>
-    <w:p>
-      <w:pPr>
-        <w:keepNext/>
-        <w:tabs>
-          <w:tab w:val="right" w:pos="10512"/>
-        </w:tabs>
-        <w:spacing w:after="0"/>
-      </w:pPr>
-      <w:r>
-        <w:rPr>
-          <w:b/>
-          <w:bCs/>
-        </w:rPr>
-        <w:t xml:space="preserve">Writing Winning Grants</w:t>
-      </w:r>
-      <w:r>
-        <w:tab/>
-      </w:r>
-      <w:r>
-        <w:t xml:space="preserve">Nov 2019</w:t>
-      </w:r>
-    </w:p>
-    <w:p>
-      <w:pPr>
-        <w:keepNext/>
-        <w:tabs>
-          <w:tab w:val="right" w:pos="10512"/>
-        </w:tabs>
-        <w:spacing w:after="0"/>
-      </w:pPr>
-      <w:r>
-        <w:rPr>
-          <w:i/>
-          <w:iCs/>
-        </w:rPr>
-        <w:t xml:space="preserve">Dr. Lauren Broyles, Purdue University</w:t>
-      </w:r>
-      <w:r>
-        <w:tab/>
-      </w:r>
-      <w:r>
-        <w:t xml:space="preserve">Lecture</w:t>
-      </w:r>
-    </w:p>
-    <w:p>
-      <w:pPr>
-        <w:pStyle w:val="EntryGap"/>
-        <w:spacing w:after="0"/>
-      </w:pPr>
-    </w:p>
-    <w:p>
-      <w:pPr>
-        <w:keepNext/>
-        <w:tabs>
-          <w:tab w:val="right" w:pos="10512"/>
-        </w:tabs>
-        <w:spacing w:after="0"/>
-      </w:pPr>
-      <w:r>
-        <w:rPr>
-          <w:b/>
-          <w:bCs/>
-        </w:rPr>
-        <w:t xml:space="preserve">XSEDE HPC Workshop: Summer Boot Camp</w:t>
-      </w:r>
-      <w:r>
-        <w:tab/>
-      </w:r>
-      <w:r>
-        <w:t xml:space="preserve">Jun 2019</w:t>
-      </w:r>
-    </w:p>
-    <w:p>
-      <w:pPr>
-        <w:keepNext/>
-        <w:tabs>
-          <w:tab w:val="right" w:pos="10512"/>
-        </w:tabs>
-        <w:spacing w:after="0"/>
-      </w:pPr>
-      <w:r>
-        <w:rPr>
-          <w:i/>
-          <w:iCs/>
-        </w:rPr>
-        <w:t xml:space="preserve">John Urbanic, Purdue University</w:t>
-      </w:r>
-      <w:r>
-        <w:tab/>
-      </w:r>
-      <w:r>
-        <w:t xml:space="preserve">Workshop</w:t>
-      </w:r>
-    </w:p>
-    <w:p>
-      <w:pPr>
-        <w:pStyle w:val="EntryGap"/>
-        <w:spacing w:after="0"/>
-      </w:pPr>
-    </w:p>
-    <w:p>
-      <w:pPr>
-        <w:keepNext/>
-        <w:tabs>
-          <w:tab w:val="right" w:pos="10512"/>
-        </w:tabs>
-        <w:spacing w:after="0"/>
-      </w:pPr>
-      <w:r>
-        <w:rPr>
-          <w:b/>
-          <w:bCs/>
-        </w:rPr>
-        <w:t xml:space="preserve">Data Analysis and Machine Learning with Python</w:t>
-      </w:r>
-      <w:r>
-        <w:tab/>
-      </w:r>
-      <w:r>
-        <w:t xml:space="preserve">Feb 2017</w:t>
-      </w:r>
-    </w:p>
-    <w:p>
-      <w:pPr>
-        <w:keepNext/>
-        <w:tabs>
-          <w:tab w:val="right" w:pos="10512"/>
-        </w:tabs>
-        <w:spacing w:after="0"/>
-      </w:pPr>
-      <w:r>
-        <w:rPr>
-          <w:i/>
-          <w:iCs/>
-        </w:rPr>
-        <w:t xml:space="preserve">Dr. Alejandro Torres, Universitat de València</w:t>
-      </w:r>
-      <w:r>
-        <w:tab/>
-      </w:r>
-      <w:r>
-        <w:t xml:space="preserve">Workshop</w:t>
-      </w:r>
-    </w:p>
-    <w:p>
-      <w:pPr>
-        <w:pStyle w:val="EntryGap"/>
-        <w:spacing w:after="0"/>
-      </w:pPr>
-    </w:p>
-    <w:p>
-      <w:pPr>
-        <w:keepNext/>
-        <w:tabs>
-          <w:tab w:val="right" w:pos="10512"/>
-        </w:tabs>
-        <w:spacing w:after="0"/>
-      </w:pPr>
-      <w:r>
-        <w:rPr>
-          <w:b/>
-          <w:bCs/>
-        </w:rPr>
-        <w:t xml:space="preserve">Numerical Relativity Simulations of BBH Coalescence Using the Einstein Toolkit</w:t>
-      </w:r>
-      <w:r>
-        <w:tab/>
-      </w:r>
-      <w:r>
-        <w:t xml:space="preserve">Jul 2016</w:t>
-      </w:r>
-    </w:p>
-    <w:p>
-      <w:pPr>
-        <w:keepNext/>
-        <w:tabs>
-          <w:tab w:val="right" w:pos="10512"/>
-        </w:tabs>
-        <w:spacing w:after="0"/>
-      </w:pPr>
-      <w:r>
-        <w:rPr>
-          <w:i/>
-          <w:iCs/>
-        </w:rPr>
-        <w:t xml:space="preserve">Dr. Vassilios Mewes, Universitat de València</w:t>
-      </w:r>
-      <w:r>
-        <w:tab/>
-      </w:r>
-      <w:r>
-        <w:t xml:space="preserve">Workshop, 8 hours</w:t>
-      </w:r>
-    </w:p>
-    <w:p>
-      <w:pPr>
-        <w:pStyle w:val="EntryGap"/>
-        <w:spacing w:after="0"/>
-      </w:pPr>
-    </w:p>
-    <w:p>
-      <w:pPr>
-        <w:keepNext/>
-        <w:tabs>
-          <w:tab w:val="right" w:pos="10512"/>
-        </w:tabs>
-        <w:spacing w:after="0"/>
-      </w:pPr>
-      <w:r>
-        <w:rPr>
-          <w:b/>
-          <w:bCs/>
-        </w:rPr>
-        <w:t xml:space="preserve">The Universe in the Light of PLANCK and BICEP2</w:t>
-      </w:r>
-      <w:r>
-        <w:tab/>
-      </w:r>
-      <w:r>
-        <w:t xml:space="preserve">May 2014</w:t>
-      </w:r>
-    </w:p>
-    <w:p>
-      <w:pPr>
-        <w:keepNext/>
-        <w:tabs>
-          <w:tab w:val="right" w:pos="10512"/>
-        </w:tabs>
-        <w:spacing w:after="0"/>
-      </w:pPr>
-      <w:r>
-        <w:rPr>
-          <w:i/>
-          <w:iCs/>
-        </w:rPr>
-        <w:t xml:space="preserve">Prof. Nick Mavromatos, Universitat de València</w:t>
-      </w:r>
-      <w:r>
-        <w:tab/>
-      </w:r>
-      <w:r>
-        <w:t xml:space="preserve">Lecture series, 2 credits</w:t>
-      </w:r>
-    </w:p>
-    <w:p>
-      <w:pPr>
-        <w:pStyle w:val="EntryGap"/>
-        <w:spacing w:after="0"/>
-      </w:pPr>
-    </w:p>
-    <w:p>
-      <w:pPr>
-        <w:keepNext/>
-        <w:tabs>
-          <w:tab w:val="right" w:pos="10512"/>
-        </w:tabs>
-        <w:spacing w:after="0"/>
-      </w:pPr>
-      <w:r>
-        <w:rPr>
-          <w:b/>
-          <w:bCs/>
-        </w:rPr>
-        <w:t xml:space="preserve">Dark Matter</w:t>
-      </w:r>
-      <w:r>
-        <w:tab/>
-      </w:r>
-      <w:r>
-        <w:t xml:space="preserve">Sep 2013</w:t>
-      </w:r>
-    </w:p>
-    <w:p>
-      <w:pPr>
-        <w:keepNext/>
-        <w:tabs>
-          <w:tab w:val="right" w:pos="10512"/>
-        </w:tabs>
-        <w:spacing w:after="0"/>
-      </w:pPr>
-      <w:r>
-        <w:rPr>
-          <w:i/>
-          <w:iCs/>
-        </w:rPr>
-        <w:t xml:space="preserve">Prof. Alejandro Ibarra, Universitat de València</w:t>
-      </w:r>
-      <w:r>
-        <w:tab/>
-      </w:r>
-      <w:r>
-        <w:t xml:space="preserve">Lecture series, 2 credits</w:t>
-      </w:r>
-    </w:p>
-    <w:p>
-      <w:pPr>
-        <w:pStyle w:val="EntryGap"/>
-        <w:spacing w:after="0"/>
-      </w:pPr>
-    </w:p>
-    <w:p>
-      <w:pPr>
-        <w:keepNext/>
-        <w:tabs>
-          <w:tab w:val="right" w:pos="10512"/>
-        </w:tabs>
-        <w:spacing w:after="0"/>
-      </w:pPr>
-      <w:r>
-        <w:rPr>
-          <w:b/>
-          <w:bCs/>
-        </w:rPr>
-        <w:t xml:space="preserve">International Cargèse School on Cosmic Accelerators</w:t>
-      </w:r>
-      <w:r>
-        <w:tab/>
-      </w:r>
-      <w:r>
-        <w:t xml:space="preserve">Apr – May 2013</w:t>
-      </w:r>
-    </w:p>
-    <w:p>
-      <w:pPr>
-        <w:keepNext/>
-        <w:tabs>
-          <w:tab w:val="right" w:pos="10512"/>
-        </w:tabs>
-        <w:spacing w:after="0"/>
-      </w:pPr>
-      <w:r>
-        <w:rPr>
-          <w:i/>
-          <w:iCs/>
-        </w:rPr>
-        <w:t xml:space="preserve">Institut d'Études Scientifiques de Cargèse, France</w:t>
-      </w:r>
-      <w:r>
-        <w:tab/>
-      </w:r>
-      <w:r>
-        <w:t xml:space="preserve">Summer school</w:t>
-      </w:r>
-    </w:p>
-    <w:p>
-      <w:pPr>
-        <w:pStyle w:val="EntryGap"/>
-        <w:spacing w:after="0"/>
-      </w:pPr>
-    </w:p>
-    <w:p>
-      <w:pPr>
-        <w:keepNext/>
-        <w:tabs>
-          <w:tab w:val="right" w:pos="10512"/>
-        </w:tabs>
-        <w:spacing w:after="0"/>
-      </w:pPr>
-      <w:r>
-        <w:rPr>
-          <w:b/>
-          <w:bCs/>
-        </w:rPr>
-        <w:t xml:space="preserve">Introduction to C++ Programming</w:t>
-      </w:r>
-      <w:r>
-        <w:tab/>
-      </w:r>
-      <w:r>
-        <w:t xml:space="preserve">Apr 2012</w:t>
-      </w:r>
-    </w:p>
-    <w:p>
-      <w:pPr>
-        <w:keepNext/>
-        <w:tabs>
-          <w:tab w:val="right" w:pos="10512"/>
-        </w:tabs>
-        <w:spacing w:after="0"/>
-      </w:pPr>
-      <w:r>
-        <w:rPr>
-          <w:i/>
-          <w:iCs/>
-        </w:rPr>
-        <w:t xml:space="preserve">Dr. Jacek Generowicz, Universitat de València</w:t>
-      </w:r>
-      <w:r>
-        <w:tab/>
-      </w:r>
-      <w:r>
-        <w:t xml:space="preserve">Workshop, 6 credits</w:t>
-      </w:r>
-    </w:p>
-    <w:p>
-      <w:pPr>
-        <w:pStyle w:val="EntryGap"/>
-        <w:spacing w:after="0"/>
-      </w:pPr>
-    </w:p>
-    <w:p>
-      <w:pPr>
-        <w:keepNext/>
-        <w:tabs>
-          <w:tab w:val="right" w:pos="10512"/>
-        </w:tabs>
-        <w:spacing w:after="0"/>
-      </w:pPr>
-      <w:r>
-        <w:rPr>
-          <w:b/>
-          <w:bCs/>
-        </w:rPr>
-        <w:t xml:space="preserve">Numerical Relativistic Astrophysics</w:t>
-      </w:r>
-      <w:r>
-        <w:tab/>
-      </w:r>
-      <w:r>
-        <w:t xml:space="preserve">Mar – Apr 2012</w:t>
-      </w:r>
-    </w:p>
-    <w:p>
-      <w:pPr>
-        <w:keepNext/>
-        <w:tabs>
-          <w:tab w:val="right" w:pos="10512"/>
-        </w:tabs>
-        <w:spacing w:after="0"/>
-      </w:pPr>
-      <w:r>
-        <w:rPr>
-          <w:i/>
-          <w:iCs/>
-        </w:rPr>
-        <w:t xml:space="preserve">Prof. Luciano Rezzolla, Universitat de València</w:t>
-      </w:r>
-      <w:r>
-        <w:tab/>
-      </w:r>
-      <w:r>
-        <w:t xml:space="preserve">Lecture series, 9 hours</w:t>
-      </w:r>
-    </w:p>
-    <w:p>
-      <w:pPr>
-        <w:pStyle w:val="EntryGap"/>
-        <w:spacing w:after="0"/>
-      </w:pPr>
-    </w:p>
-    <w:p>
-      <w:pPr>
-        <w:keepNext/>
-        <w:tabs>
-          <w:tab w:val="right" w:pos="10512"/>
-        </w:tabs>
-        <w:spacing w:after="0"/>
-      </w:pPr>
-      <w:r>
-        <w:rPr>
-          <w:b/>
-          <w:bCs/>
-        </w:rPr>
-        <w:t xml:space="preserve">Fortran for Scientific Computing</w:t>
-      </w:r>
-      <w:r>
-        <w:tab/>
-      </w:r>
-      <w:r>
-        <w:t xml:space="preserve">Mar 2012</w:t>
-      </w:r>
-    </w:p>
-    <w:p>
-      <w:pPr>
-        <w:keepNext/>
-        <w:tabs>
-          <w:tab w:val="right" w:pos="10512"/>
-        </w:tabs>
-        <w:spacing w:after="0"/>
-      </w:pPr>
-      <w:r>
-        <w:rPr>
-          <w:i/>
-          <w:iCs/>
-        </w:rPr>
-        <w:t xml:space="preserve">HLRS, University of Stuttgart, Germany</w:t>
-      </w:r>
-      <w:r>
-        <w:tab/>
-      </w:r>
-      <w:r>
-        <w:t xml:space="preserve">Workshop, 33 hours</w:t>
-      </w:r>
-    </w:p>
-    <w:p>
-      <w:pPr>
-        <w:pStyle w:val="EntryGap"/>
-        <w:spacing w:after="0"/>
-      </w:pPr>
-    </w:p>
-    <w:p>
-      <w:pPr>
-        <w:pStyle w:val="Heading1"/>
-      </w:pPr>
-      <w:r>
         <w:t xml:space="preserve">Outreach</w:t>
       </w:r>
     </w:p>
@@ -4761,7 +4529,7 @@
       <w:pPr>
         <w:spacing w:after="0"/>
       </w:pPr>
-      <w:hyperlink w:history="1" r:id="rIdof2pehrwyyiyx67v4tchx">
+      <w:hyperlink w:history="1" r:id="rIdchba3epnocws2-8mcbclq">
         <w:r>
           <w:t xml:space="preserve">mexiciencia.github.io/post/anita</w:t>
         </w:r>
@@ -4821,7 +4589,7 @@
       <w:pPr>
         <w:spacing w:after="0"/>
       </w:pPr>
-      <w:hyperlink w:history="1" r:id="rIdeiahvzextysplnvmok5u_">
+      <w:hyperlink w:history="1" r:id="rId87fcjucck9m4axg0uwsdt">
         <w:r>
           <w:t xml:space="preserve">mexiciencia.github.io/post/modelo-sir</w:t>
         </w:r>
@@ -4884,7 +4652,7 @@
       <w:r>
         <w:t xml:space="preserve">Data analysis and modeling collaborator. </w:t>
       </w:r>
-      <w:hyperlink w:history="1" r:id="rIdcvglk5vnvvyknkv111iml">
+      <w:hyperlink w:history="1" r:id="rIdq3f3kgn_4srh9j3itrkoa">
         <w:r>
           <w:t xml:space="preserve">mexiciencia.github.io/post/covid19</w:t>
         </w:r>

</xml_diff>

<commit_message>
Restore resume Outreach; inline employer/degree on role line
Bring back the Outreach section (outreach_resume.tex) and add a
sub_inline section option to the moderncv, plain LaTeX and Word generators
so Experience and Education print the employer or degree on the heading
line. Together they keep the resume at one page. Regenerate all outputs.

Co-Authored-By: Claude Sonnet 5.5 <noreply@anthropic.com>
</commit_message>
<xml_diff>
--- a/RuedaBecerrilJM-CV-plain.docx
+++ b/RuedaBecerrilJM-CV-plain.docx
@@ -28,7 +28,7 @@
       <w:r>
         <w:t xml:space="preserve">  |  </w:t>
       </w:r>
-      <w:hyperlink w:history="1" r:id="rIdvvelzr0f0dbjcjjb-xiot">
+      <w:hyperlink w:history="1" r:id="rIdvaw4dmaumtbh18tuwfad9">
         <w:r>
           <w:t xml:space="preserve">jm.ruebe@gmail.com</w:t>
         </w:r>
@@ -42,7 +42,7 @@
       <w:r>
         <w:t xml:space="preserve">  |  </w:t>
       </w:r>
-      <w:hyperlink w:history="1" r:id="rIdjezsnoiq0mu-dszb1jofp">
+      <w:hyperlink w:history="1" r:id="rId2lh3_eunqumxjatw-tefc">
         <w:r>
           <w:t xml:space="preserve">linkedin.com/in/jeruebe</w:t>
         </w:r>
@@ -53,7 +53,7 @@
         <w:spacing w:after="60"/>
         <w:jc w:val="center"/>
       </w:pPr>
-      <w:hyperlink w:history="1" r:id="rIdpa2t2u29cqjmvt0xybzg1">
+      <w:hyperlink w:history="1" r:id="rIdbpf-zkhl2zxjqmfplzozt">
         <w:r>
           <w:t xml:space="preserve">altjerue.github.io</w:t>
         </w:r>
@@ -61,7 +61,7 @@
       <w:r>
         <w:t xml:space="preserve">  |  </w:t>
       </w:r>
-      <w:hyperlink w:history="1" r:id="rIdfjc5ke5c3ibj7mng8ot_a">
+      <w:hyperlink w:history="1" r:id="rIdb-_m14kmqjo808rgjbgjj">
         <w:r>
           <w:t xml:space="preserve">github.com/altjerue</w:t>
         </w:r>
@@ -69,7 +69,7 @@
       <w:r>
         <w:t xml:space="preserve">  |  </w:t>
       </w:r>
-      <w:hyperlink w:history="1" r:id="rIdderzdlznhp4pctqn5na7o">
+      <w:hyperlink w:history="1" r:id="rIdwdqqac-syr2f84atdwkoz">
         <w:r>
           <w:t xml:space="preserve">orcid.org/0000-0003-1988-1912</w:t>
         </w:r>
@@ -77,7 +77,7 @@
       <w:r>
         <w:t xml:space="preserve">  |  </w:t>
       </w:r>
-      <w:hyperlink w:history="1" r:id="rId4pqmzfxafpxxclc6dch1e">
+      <w:hyperlink w:history="1" r:id="rIdkarykte4hekpy4ifgi7p4">
         <w:r>
           <w:t xml:space="preserve">Google Scholar</w:t>
         </w:r>
@@ -1399,7 +1399,7 @@
       <w:r>
         <w:t xml:space="preserve">Thesis: </w:t>
       </w:r>
-      <w:hyperlink w:history="1" r:id="rIdctn4jx9zjhxiikqyhrw-h">
+      <w:hyperlink w:history="1" r:id="rIdlc6ietse7rkmqtgf6-g_q">
         <w:r>
           <w:t xml:space="preserve">Numerical treatment of radiation processes in the internal shocks of magnetized relativistic outflows</w:t>
         </w:r>
@@ -1696,7 +1696,7 @@
       <w:r>
         <w:t xml:space="preserve">, </w:t>
       </w:r>
-      <w:hyperlink w:history="1" r:id="rIdjc7m9yrop7xh57hlfnbox">
+      <w:hyperlink w:history="1" r:id="rIdc1f28zwcf95dx6z9erpqd">
         <w:r>
           <w:t xml:space="preserve">ApJ 976, 182 (2024)</w:t>
         </w:r>
@@ -1704,7 +1704,7 @@
       <w:r>
         <w:t xml:space="preserve">, </w:t>
       </w:r>
-      <w:hyperlink w:history="1" r:id="rIdtidympbqa4hr3z4l9c4hk">
+      <w:hyperlink w:history="1" r:id="rId41xte4012ceee8iolf0a9">
         <w:r>
           <w:t xml:space="preserve">arXiv:2405.17581</w:t>
         </w:r>
@@ -1741,7 +1741,7 @@
       <w:r>
         <w:t xml:space="preserve">, </w:t>
       </w:r>
-      <w:hyperlink w:history="1" r:id="rIdw_4n7k9mz2hywuxmvx4cf">
+      <w:hyperlink w:history="1" r:id="rIdfkmchqfsxps1xu0p8gr8f">
         <w:r>
           <w:t xml:space="preserve">MNRAS 513, 5766–5779 (2022)</w:t>
         </w:r>
@@ -1749,7 +1749,7 @@
       <w:r>
         <w:t xml:space="preserve">, </w:t>
       </w:r>
-      <w:hyperlink w:history="1" r:id="rId8rrgzafr-1_bkoyrwe9z9">
+      <w:hyperlink w:history="1" r:id="rIdvmr6dceaey6q88xt5yo99">
         <w:r>
           <w:t xml:space="preserve">arXiv:2201.07790</w:t>
         </w:r>
@@ -1786,7 +1786,7 @@
       <w:r>
         <w:t xml:space="preserve">, </w:t>
       </w:r>
-      <w:hyperlink w:history="1" r:id="rIdycuowmj824qnkezy7aidr">
+      <w:hyperlink w:history="1" r:id="rId9t1yxwemdvok3snnv9t-0">
         <w:r>
           <w:t xml:space="preserve">Phys. Rev. D 106, 083015 (2022)</w:t>
         </w:r>
@@ -1794,7 +1794,7 @@
       <w:r>
         <w:t xml:space="preserve">, </w:t>
       </w:r>
-      <w:hyperlink w:history="1" r:id="rIdgvtn2hwilyyhfbkpyy6fe">
+      <w:hyperlink w:history="1" r:id="rIdz-ixq_b9ted1ft777ew3t">
         <w:r>
           <w:t xml:space="preserve">arXiv:2112.09817</w:t>
         </w:r>
@@ -1831,7 +1831,7 @@
       <w:r>
         <w:t xml:space="preserve">, </w:t>
       </w:r>
-      <w:hyperlink w:history="1" r:id="rIdgh3nrosv8d4jrmf4platr">
+      <w:hyperlink w:history="1" r:id="rIdeutdk8tnki8frl5mpu37p">
         <w:r>
           <w:t xml:space="preserve">ApJ 919, 95 (2021)</w:t>
         </w:r>
@@ -1839,7 +1839,7 @@
       <w:r>
         <w:t xml:space="preserve">, </w:t>
       </w:r>
-      <w:hyperlink w:history="1" r:id="rIdjazvfbuzlstv6zn8w4crn">
+      <w:hyperlink w:history="1" r:id="rId_ivzm8gdoctruf02euqdf">
         <w:r>
           <w:t xml:space="preserve">arXiv:2106.05356</w:t>
         </w:r>
@@ -1876,7 +1876,7 @@
       <w:r>
         <w:t xml:space="preserve">, </w:t>
       </w:r>
-      <w:hyperlink w:history="1" r:id="rIdayyoz7faqqdonmuxhm-l4">
+      <w:hyperlink w:history="1" r:id="rIdpss5jepahmkjghpyesduf">
         <w:r>
           <w:t xml:space="preserve">MNRAS 501, 4092–4102 (2021)</w:t>
         </w:r>
@@ -1884,7 +1884,7 @@
       <w:r>
         <w:t xml:space="preserve">, </w:t>
       </w:r>
-      <w:hyperlink w:history="1" r:id="rId7xrwj_prkl4ibhjfmulw4">
+      <w:hyperlink w:history="1" r:id="rIdgzj827z1f6wdespyxhai_">
         <w:r>
           <w:t xml:space="preserve">arXiv:2009.02273</w:t>
         </w:r>
@@ -1921,7 +1921,7 @@
       <w:r>
         <w:t xml:space="preserve">, </w:t>
       </w:r>
-      <w:hyperlink w:history="1" r:id="rId8mfaho46ah2t-4kmtqtv2">
+      <w:hyperlink w:history="1" r:id="rIdv2yzir_non5xvuhjtar2l">
         <w:r>
           <w:t xml:space="preserve">MNRAS 496, 974–986 (2020)</w:t>
         </w:r>
@@ -1929,7 +1929,7 @@
       <w:r>
         <w:t xml:space="preserve">, </w:t>
       </w:r>
-      <w:hyperlink w:history="1" r:id="rIdqlcrjpaxyo4wgmacjs0wo">
+      <w:hyperlink w:history="1" r:id="rIdplexs88c7miutzti24mlw">
         <w:r>
           <w:t xml:space="preserve">arXiv:1910.14049</w:t>
         </w:r>
@@ -1966,7 +1966,7 @@
       <w:r>
         <w:t xml:space="preserve">, </w:t>
       </w:r>
-      <w:hyperlink w:history="1" r:id="rIdopdvyitrs0anbxjby_ick">
+      <w:hyperlink w:history="1" r:id="rIdbirvszvsaz0qlazrn2lrw">
         <w:r>
           <w:t xml:space="preserve">MNRAS 468, 1169–1182 (2017)</w:t>
         </w:r>
@@ -1974,7 +1974,7 @@
       <w:r>
         <w:t xml:space="preserve">, </w:t>
       </w:r>
-      <w:hyperlink w:history="1" r:id="rIdwttrkbcf6ruo9sm8xoj9k">
+      <w:hyperlink w:history="1" r:id="rIdfem98p1kecl8mk8k-k9dq">
         <w:r>
           <w:t xml:space="preserve">arXiv:1612.06383</w:t>
         </w:r>
@@ -2011,7 +2011,7 @@
       <w:r>
         <w:t xml:space="preserve">, </w:t>
       </w:r>
-      <w:hyperlink w:history="1" r:id="rIdmuq5uexmfq6_ihmr591u6">
+      <w:hyperlink w:history="1" r:id="rIdt-n9ipnk1mgd4du1qsm_p">
         <w:r>
           <w:t xml:space="preserve">MNRAS 438, 1856–1869 (2014)</w:t>
         </w:r>
@@ -2019,7 +2019,7 @@
       <w:r>
         <w:t xml:space="preserve">, </w:t>
       </w:r>
-      <w:hyperlink w:history="1" r:id="rIdpe6rwzdqofih1e8dvddxn">
+      <w:hyperlink w:history="1" r:id="rIdjysfqmcg2fyekg-3-rzdu">
         <w:r>
           <w:t xml:space="preserve">arXiv:1310.5441</w:t>
         </w:r>
@@ -2056,7 +2056,7 @@
       <w:r>
         <w:t xml:space="preserve">, </w:t>
       </w:r>
-      <w:hyperlink w:history="1" r:id="rIdpovieeimgao1riorwbq3-">
+      <w:hyperlink w:history="1" r:id="rId1kpyd2jw6tumjewrzrl2_">
         <w:r>
           <w:t xml:space="preserve">Phys. Rev. D 80, 084023 (2009)</w:t>
         </w:r>
@@ -2064,7 +2064,7 @@
       <w:r>
         <w:t xml:space="preserve">, </w:t>
       </w:r>
-      <w:hyperlink w:history="1" r:id="rIde3bnaxpuhqg8qozfh9hxb">
+      <w:hyperlink w:history="1" r:id="rIdq1kt4spfgamigpmqluezx">
         <w:r>
           <w:t xml:space="preserve">arXiv:1009.1250</w:t>
         </w:r>
@@ -2109,7 +2109,7 @@
       <w:r>
         <w:t xml:space="preserve">, </w:t>
       </w:r>
-      <w:hyperlink w:history="1" r:id="rIdvdjlazwcx4cktfeczxgm-">
+      <w:hyperlink w:history="1" r:id="rIdxn5iskxpolwkyysl83uy3">
         <w:r>
           <w:t xml:space="preserve">Astron. Nachr. 342, 277–282 (2021)</w:t>
         </w:r>
@@ -2117,7 +2117,7 @@
       <w:r>
         <w:t xml:space="preserve">, 9th International Workshop on Astronomy and Relativistic Astrophysics, </w:t>
       </w:r>
-      <w:hyperlink w:history="1" r:id="rIdbnemtpdmatgwcylopmcii">
+      <w:hyperlink w:history="1" r:id="rId4mitvlwplou3klnsmcb7h">
         <w:r>
           <w:t xml:space="preserve">arXiv:2011.13797</w:t>
         </w:r>
@@ -2154,7 +2154,7 @@
       <w:r>
         <w:t xml:space="preserve">, </w:t>
       </w:r>
-      <w:hyperlink w:history="1" r:id="rIdfoars0p1mkmj1xqbfzylq">
+      <w:hyperlink w:history="1" r:id="rIdsmxf1i6xjwsdz1fwcd96u">
         <w:r>
           <w:t xml:space="preserve">Astron. Nachr. 342, 147–152 (2021)</w:t>
         </w:r>
@@ -2162,7 +2162,7 @@
       <w:r>
         <w:t xml:space="preserve">, 9th International Workshop on Astronomy and Relativistic Astrophysics, </w:t>
       </w:r>
-      <w:hyperlink w:history="1" r:id="rId0ws274pxcviwp0sebugmk">
+      <w:hyperlink w:history="1" r:id="rId3-bc8iea5rdmv73zeglhg">
         <w:r>
           <w:t xml:space="preserve">arXiv:2011.13805</w:t>
         </w:r>
@@ -2199,7 +2199,7 @@
       <w:r>
         <w:t xml:space="preserve">, </w:t>
       </w:r>
-      <w:hyperlink w:history="1" r:id="rIdq6c3cwj56fhuee460rdqa">
+      <w:hyperlink w:history="1" r:id="rIdidnczlrsxwa-tcxbar4nt">
         <w:r>
           <w:t xml:space="preserve">PoS(SWIFT 10) 233, 159 (2014)</w:t>
         </w:r>
@@ -2207,7 +2207,7 @@
       <w:r>
         <w:t xml:space="preserve">, </w:t>
       </w:r>
-      <w:hyperlink w:history="1" r:id="rIdb5tubdqfudsef_luxz5fw">
+      <w:hyperlink w:history="1" r:id="rIdknlniio7bdzclxgap8pma">
         <w:r>
           <w:t xml:space="preserve">arXiv:1502.07882</w:t>
         </w:r>
@@ -2244,7 +2244,7 @@
       <w:r>
         <w:t xml:space="preserve">, </w:t>
       </w:r>
-      <w:hyperlink w:history="1" r:id="rId80jdi57h8sd6d2m8tixer">
+      <w:hyperlink w:history="1" r:id="rIdo3qi87yd3j_cgftvdoxqa">
         <w:r>
           <w:t xml:space="preserve">EPJ Web Conf. 61, 02007 (2013)</w:t>
         </w:r>
@@ -2252,7 +2252,7 @@
       <w:r>
         <w:t xml:space="preserve">, </w:t>
       </w:r>
-      <w:hyperlink w:history="1" r:id="rIdbmntbegdzf3aokn4gjne8">
+      <w:hyperlink w:history="1" r:id="rIdsugtcked5asbep_wot3w2">
         <w:r>
           <w:t xml:space="preserve">arXiv:1309.4612</w:t>
         </w:r>
@@ -2289,7 +2289,7 @@
       <w:r>
         <w:t xml:space="preserve">, </w:t>
       </w:r>
-      <w:hyperlink w:history="1" r:id="rIdanns17n7jpoqlnn-ti3cb">
+      <w:hyperlink w:history="1" r:id="rIdl9z_350ft89deifohfxue">
         <w:r>
           <w:t xml:space="preserve">J. Phys.: Conf. Ser. 454, 012001 (2013)</w:t>
         </w:r>
@@ -2297,7 +2297,7 @@
       <w:r>
         <w:t xml:space="preserve">, </w:t>
       </w:r>
-      <w:hyperlink w:history="1" r:id="rId1t8lti-zpfu-ui4q_kd_r">
+      <w:hyperlink w:history="1" r:id="rId5wgg-z-0bre8rjw97e3rj">
         <w:r>
           <w:t xml:space="preserve">arXiv:1211.1794</w:t>
         </w:r>
@@ -2700,7 +2700,7 @@
       <w:r>
         <w:tab/>
       </w:r>
-      <w:hyperlink w:history="1" r:id="rId2w5uny4fa8pg08s8ldfit">
+      <w:hyperlink w:history="1" r:id="rIdyxfh9cdk6jeeyh4kkzume">
         <w:r>
           <w:t xml:space="preserve">github.com/altjerue/ilwikak-ml</w:t>
         </w:r>
@@ -2791,7 +2791,7 @@
       <w:r>
         <w:tab/>
       </w:r>
-      <w:hyperlink w:history="1" r:id="rIdws3-dkorgdbvrgns-esev">
+      <w:hyperlink w:history="1" r:id="rIdk0tm3e2--qyk-doffmcxr">
         <w:r>
           <w:t xml:space="preserve">github.com/UW-ForestMycobiomeLab/WindSporesHills</w:t>
         </w:r>
@@ -2856,7 +2856,7 @@
       <w:r>
         <w:tab/>
       </w:r>
-      <w:hyperlink w:history="1" r:id="rId1v--gag9hzdhrtxrz688d">
+      <w:hyperlink w:history="1" r:id="rIdwxjkvilbpzsnsw5mjpmv8">
         <w:r>
           <w:t xml:space="preserve">github.com/zkdavis/Tleco</w:t>
         </w:r>
@@ -2921,7 +2921,7 @@
       <w:r>
         <w:tab/>
       </w:r>
-      <w:hyperlink w:history="1" r:id="rId1pohprvd-p9zru-2k3un8">
+      <w:hyperlink w:history="1" r:id="rIdrzpcpkd3gqbibeidyr-xf">
         <w:r>
           <w:t xml:space="preserve">github.com/altjerue/paramo</w:t>
         </w:r>
@@ -3532,7 +3532,7 @@
       <w:r>
         <w:t xml:space="preserve">Video: </w:t>
       </w:r>
-      <w:hyperlink w:history="1" r:id="rId8nk3pbdo8oluzcfy-ury5">
+      <w:hyperlink w:history="1" r:id="rIdmeqnjmzqfxwzjv68vbwla">
         <w:r>
           <w:t xml:space="preserve">youtube.com/watch?v=BAZNWLNT69M</w:t>
         </w:r>
@@ -3703,7 +3703,7 @@
       <w:r>
         <w:t xml:space="preserve">Marcos Moshinsky Award for Best Poster. Video: </w:t>
       </w:r>
-      <w:hyperlink w:history="1" r:id="rIdoqignxwpd-8p5hkx0uace">
+      <w:hyperlink w:history="1" r:id="rIdq5ywatbwzj25vatozcrq7">
         <w:r>
           <w:t xml:space="preserve">youtube.com/watch?v=0TJiKg7kOPI</w:t>
         </w:r>
@@ -4529,7 +4529,7 @@
       <w:pPr>
         <w:spacing w:after="0"/>
       </w:pPr>
-      <w:hyperlink w:history="1" r:id="rIdchba3epnocws2-8mcbclq">
+      <w:hyperlink w:history="1" r:id="rIdn5esio6wlkymijrfh8s21">
         <w:r>
           <w:t xml:space="preserve">mexiciencia.github.io/post/anita</w:t>
         </w:r>
@@ -4589,7 +4589,7 @@
       <w:pPr>
         <w:spacing w:after="0"/>
       </w:pPr>
-      <w:hyperlink w:history="1" r:id="rId87fcjucck9m4axg0uwsdt">
+      <w:hyperlink w:history="1" r:id="rIdtslno-otphsdtbtplb5sd">
         <w:r>
           <w:t xml:space="preserve">mexiciencia.github.io/post/modelo-sir</w:t>
         </w:r>
@@ -4652,7 +4652,7 @@
       <w:r>
         <w:t xml:space="preserve">Data analysis and modeling collaborator. </w:t>
       </w:r>
-      <w:hyperlink w:history="1" r:id="rIdq3f3kgn_4srh9j3itrkoa">
+      <w:hyperlink w:history="1" r:id="rIdtodjhrrpaq0q7qy2qkll3">
         <w:r>
           <w:t xml:space="preserve">mexiciencia.github.io/post/covid19</w:t>
         </w:r>

</xml_diff>

<commit_message>
Update CV and resume: add new outreach talks and refine existing entries
</commit_message>
<xml_diff>
--- a/RuedaBecerrilJM-CV-plain.docx
+++ b/RuedaBecerrilJM-CV-plain.docx
@@ -28,7 +28,7 @@
       <w:r>
         <w:t xml:space="preserve">  |  </w:t>
       </w:r>
-      <w:hyperlink w:history="1" r:id="rIdvaw4dmaumtbh18tuwfad9">
+      <w:hyperlink w:history="1" r:id="rId4lg4hdia5tehz34s9-tem">
         <w:r>
           <w:t xml:space="preserve">jm.ruebe@gmail.com</w:t>
         </w:r>
@@ -42,7 +42,7 @@
       <w:r>
         <w:t xml:space="preserve">  |  </w:t>
       </w:r>
-      <w:hyperlink w:history="1" r:id="rId2lh3_eunqumxjatw-tefc">
+      <w:hyperlink w:history="1" r:id="rIdquvd0hjetbgu30kjne5zd">
         <w:r>
           <w:t xml:space="preserve">linkedin.com/in/jeruebe</w:t>
         </w:r>
@@ -53,7 +53,7 @@
         <w:spacing w:after="60"/>
         <w:jc w:val="center"/>
       </w:pPr>
-      <w:hyperlink w:history="1" r:id="rIdbpf-zkhl2zxjqmfplzozt">
+      <w:hyperlink w:history="1" r:id="rIdwc1ocsxtsi6tyljfyasbp">
         <w:r>
           <w:t xml:space="preserve">altjerue.github.io</w:t>
         </w:r>
@@ -61,7 +61,7 @@
       <w:r>
         <w:t xml:space="preserve">  |  </w:t>
       </w:r>
-      <w:hyperlink w:history="1" r:id="rIdb-_m14kmqjo808rgjbgjj">
+      <w:hyperlink w:history="1" r:id="rIdnj_m2ibhemzq7pzdyv4zq">
         <w:r>
           <w:t xml:space="preserve">github.com/altjerue</w:t>
         </w:r>
@@ -69,7 +69,7 @@
       <w:r>
         <w:t xml:space="preserve">  |  </w:t>
       </w:r>
-      <w:hyperlink w:history="1" r:id="rIdwdqqac-syr2f84atdwkoz">
+      <w:hyperlink w:history="1" r:id="rIddllwqqhjnhedol6hy6qws">
         <w:r>
           <w:t xml:space="preserve">orcid.org/0000-0003-1988-1912</w:t>
         </w:r>
@@ -77,7 +77,7 @@
       <w:r>
         <w:t xml:space="preserve">  |  </w:t>
       </w:r>
-      <w:hyperlink w:history="1" r:id="rIdkarykte4hekpy4ifgi7p4">
+      <w:hyperlink w:history="1" r:id="rIdzar299n4-ljkgljxfs5hz">
         <w:r>
           <w:t xml:space="preserve">Google Scholar</w:t>
         </w:r>
@@ -1399,7 +1399,7 @@
       <w:r>
         <w:t xml:space="preserve">Thesis: </w:t>
       </w:r>
-      <w:hyperlink w:history="1" r:id="rIdlc6ietse7rkmqtgf6-g_q">
+      <w:hyperlink w:history="1" r:id="rIdxs8r3y4tiz2o2y1tnburo">
         <w:r>
           <w:t xml:space="preserve">Numerical treatment of radiation processes in the internal shocks of magnetized relativistic outflows</w:t>
         </w:r>
@@ -1696,7 +1696,7 @@
       <w:r>
         <w:t xml:space="preserve">, </w:t>
       </w:r>
-      <w:hyperlink w:history="1" r:id="rIdc1f28zwcf95dx6z9erpqd">
+      <w:hyperlink w:history="1" r:id="rIdnr3y57jnemijmnvzsxdnh">
         <w:r>
           <w:t xml:space="preserve">ApJ 976, 182 (2024)</w:t>
         </w:r>
@@ -1704,7 +1704,7 @@
       <w:r>
         <w:t xml:space="preserve">, </w:t>
       </w:r>
-      <w:hyperlink w:history="1" r:id="rId41xte4012ceee8iolf0a9">
+      <w:hyperlink w:history="1" r:id="rIdh2bsqaldbqk1riqxv1nag">
         <w:r>
           <w:t xml:space="preserve">arXiv:2405.17581</w:t>
         </w:r>
@@ -1741,7 +1741,7 @@
       <w:r>
         <w:t xml:space="preserve">, </w:t>
       </w:r>
-      <w:hyperlink w:history="1" r:id="rIdfkmchqfsxps1xu0p8gr8f">
+      <w:hyperlink w:history="1" r:id="rIdwbk6d5pgrqn_kbtyn3fct">
         <w:r>
           <w:t xml:space="preserve">MNRAS 513, 5766–5779 (2022)</w:t>
         </w:r>
@@ -1749,7 +1749,7 @@
       <w:r>
         <w:t xml:space="preserve">, </w:t>
       </w:r>
-      <w:hyperlink w:history="1" r:id="rIdvmr6dceaey6q88xt5yo99">
+      <w:hyperlink w:history="1" r:id="rIdxgvoihcctv4xanslbcivx">
         <w:r>
           <w:t xml:space="preserve">arXiv:2201.07790</w:t>
         </w:r>
@@ -1786,7 +1786,7 @@
       <w:r>
         <w:t xml:space="preserve">, </w:t>
       </w:r>
-      <w:hyperlink w:history="1" r:id="rId9t1yxwemdvok3snnv9t-0">
+      <w:hyperlink w:history="1" r:id="rIdggulmlstq6jhu7gtkwdll">
         <w:r>
           <w:t xml:space="preserve">Phys. Rev. D 106, 083015 (2022)</w:t>
         </w:r>
@@ -1794,7 +1794,7 @@
       <w:r>
         <w:t xml:space="preserve">, </w:t>
       </w:r>
-      <w:hyperlink w:history="1" r:id="rIdz-ixq_b9ted1ft777ew3t">
+      <w:hyperlink w:history="1" r:id="rIdowfkvzcz3-8dy0jzub-bo">
         <w:r>
           <w:t xml:space="preserve">arXiv:2112.09817</w:t>
         </w:r>
@@ -1831,7 +1831,7 @@
       <w:r>
         <w:t xml:space="preserve">, </w:t>
       </w:r>
-      <w:hyperlink w:history="1" r:id="rIdeutdk8tnki8frl5mpu37p">
+      <w:hyperlink w:history="1" r:id="rIdbn7t3s0bawu11zff5ykdr">
         <w:r>
           <w:t xml:space="preserve">ApJ 919, 95 (2021)</w:t>
         </w:r>
@@ -1839,7 +1839,7 @@
       <w:r>
         <w:t xml:space="preserve">, </w:t>
       </w:r>
-      <w:hyperlink w:history="1" r:id="rId_ivzm8gdoctruf02euqdf">
+      <w:hyperlink w:history="1" r:id="rIdthb1uwhavn_wkvutxuixo">
         <w:r>
           <w:t xml:space="preserve">arXiv:2106.05356</w:t>
         </w:r>
@@ -1876,7 +1876,7 @@
       <w:r>
         <w:t xml:space="preserve">, </w:t>
       </w:r>
-      <w:hyperlink w:history="1" r:id="rIdpss5jepahmkjghpyesduf">
+      <w:hyperlink w:history="1" r:id="rId82ye8m01azl6ovdpyd7yc">
         <w:r>
           <w:t xml:space="preserve">MNRAS 501, 4092–4102 (2021)</w:t>
         </w:r>
@@ -1884,7 +1884,7 @@
       <w:r>
         <w:t xml:space="preserve">, </w:t>
       </w:r>
-      <w:hyperlink w:history="1" r:id="rIdgzj827z1f6wdespyxhai_">
+      <w:hyperlink w:history="1" r:id="rIdpicl5q_kadjosy0jm1qhn">
         <w:r>
           <w:t xml:space="preserve">arXiv:2009.02273</w:t>
         </w:r>
@@ -1921,7 +1921,7 @@
       <w:r>
         <w:t xml:space="preserve">, </w:t>
       </w:r>
-      <w:hyperlink w:history="1" r:id="rIdv2yzir_non5xvuhjtar2l">
+      <w:hyperlink w:history="1" r:id="rId1yntkjccxcnfgyiwvparp">
         <w:r>
           <w:t xml:space="preserve">MNRAS 496, 974–986 (2020)</w:t>
         </w:r>
@@ -1929,7 +1929,7 @@
       <w:r>
         <w:t xml:space="preserve">, </w:t>
       </w:r>
-      <w:hyperlink w:history="1" r:id="rIdplexs88c7miutzti24mlw">
+      <w:hyperlink w:history="1" r:id="rIdsoaevwpz1bpc7c7q9efir">
         <w:r>
           <w:t xml:space="preserve">arXiv:1910.14049</w:t>
         </w:r>
@@ -1966,7 +1966,7 @@
       <w:r>
         <w:t xml:space="preserve">, </w:t>
       </w:r>
-      <w:hyperlink w:history="1" r:id="rIdbirvszvsaz0qlazrn2lrw">
+      <w:hyperlink w:history="1" r:id="rIdv1m-najiwvsqdsczfvc-h">
         <w:r>
           <w:t xml:space="preserve">MNRAS 468, 1169–1182 (2017)</w:t>
         </w:r>
@@ -1974,7 +1974,7 @@
       <w:r>
         <w:t xml:space="preserve">, </w:t>
       </w:r>
-      <w:hyperlink w:history="1" r:id="rIdfem98p1kecl8mk8k-k9dq">
+      <w:hyperlink w:history="1" r:id="rIdtzcowdvehqiznenfm4bjz">
         <w:r>
           <w:t xml:space="preserve">arXiv:1612.06383</w:t>
         </w:r>
@@ -2011,7 +2011,7 @@
       <w:r>
         <w:t xml:space="preserve">, </w:t>
       </w:r>
-      <w:hyperlink w:history="1" r:id="rIdt-n9ipnk1mgd4du1qsm_p">
+      <w:hyperlink w:history="1" r:id="rIdjloyfct19c7y6gruytkqq">
         <w:r>
           <w:t xml:space="preserve">MNRAS 438, 1856–1869 (2014)</w:t>
         </w:r>
@@ -2019,7 +2019,7 @@
       <w:r>
         <w:t xml:space="preserve">, </w:t>
       </w:r>
-      <w:hyperlink w:history="1" r:id="rIdjysfqmcg2fyekg-3-rzdu">
+      <w:hyperlink w:history="1" r:id="rIdzu1lcqosfwjpudcubqu2k">
         <w:r>
           <w:t xml:space="preserve">arXiv:1310.5441</w:t>
         </w:r>
@@ -2056,7 +2056,7 @@
       <w:r>
         <w:t xml:space="preserve">, </w:t>
       </w:r>
-      <w:hyperlink w:history="1" r:id="rId1kpyd2jw6tumjewrzrl2_">
+      <w:hyperlink w:history="1" r:id="rIdethgifrrgzwj18dsgi5xf">
         <w:r>
           <w:t xml:space="preserve">Phys. Rev. D 80, 084023 (2009)</w:t>
         </w:r>
@@ -2064,7 +2064,7 @@
       <w:r>
         <w:t xml:space="preserve">, </w:t>
       </w:r>
-      <w:hyperlink w:history="1" r:id="rIdq1kt4spfgamigpmqluezx">
+      <w:hyperlink w:history="1" r:id="rIdc3n6edb1ssyjt4luv0dxf">
         <w:r>
           <w:t xml:space="preserve">arXiv:1009.1250</w:t>
         </w:r>
@@ -2109,7 +2109,7 @@
       <w:r>
         <w:t xml:space="preserve">, </w:t>
       </w:r>
-      <w:hyperlink w:history="1" r:id="rIdxn5iskxpolwkyysl83uy3">
+      <w:hyperlink w:history="1" r:id="rIdcs2nqtr-j0tgbmieh3hau">
         <w:r>
           <w:t xml:space="preserve">Astron. Nachr. 342, 277–282 (2021)</w:t>
         </w:r>
@@ -2117,7 +2117,7 @@
       <w:r>
         <w:t xml:space="preserve">, 9th International Workshop on Astronomy and Relativistic Astrophysics, </w:t>
       </w:r>
-      <w:hyperlink w:history="1" r:id="rId4mitvlwplou3klnsmcb7h">
+      <w:hyperlink w:history="1" r:id="rIdz60hakj2ki6ndqgwqlomz">
         <w:r>
           <w:t xml:space="preserve">arXiv:2011.13797</w:t>
         </w:r>
@@ -2154,7 +2154,7 @@
       <w:r>
         <w:t xml:space="preserve">, </w:t>
       </w:r>
-      <w:hyperlink w:history="1" r:id="rIdsmxf1i6xjwsdz1fwcd96u">
+      <w:hyperlink w:history="1" r:id="rIdo5lyuk67oq9tz-ttkhxrw">
         <w:r>
           <w:t xml:space="preserve">Astron. Nachr. 342, 147–152 (2021)</w:t>
         </w:r>
@@ -2162,7 +2162,7 @@
       <w:r>
         <w:t xml:space="preserve">, 9th International Workshop on Astronomy and Relativistic Astrophysics, </w:t>
       </w:r>
-      <w:hyperlink w:history="1" r:id="rId3-bc8iea5rdmv73zeglhg">
+      <w:hyperlink w:history="1" r:id="rIdihpbcem3kryfzb3k53qjl">
         <w:r>
           <w:t xml:space="preserve">arXiv:2011.13805</w:t>
         </w:r>
@@ -2199,7 +2199,7 @@
       <w:r>
         <w:t xml:space="preserve">, </w:t>
       </w:r>
-      <w:hyperlink w:history="1" r:id="rIdidnczlrsxwa-tcxbar4nt">
+      <w:hyperlink w:history="1" r:id="rIdlrfttk6upo4h7p1sycke4">
         <w:r>
           <w:t xml:space="preserve">PoS(SWIFT 10) 233, 159 (2014)</w:t>
         </w:r>
@@ -2207,7 +2207,7 @@
       <w:r>
         <w:t xml:space="preserve">, </w:t>
       </w:r>
-      <w:hyperlink w:history="1" r:id="rIdknlniio7bdzclxgap8pma">
+      <w:hyperlink w:history="1" r:id="rIdxqxvqmff5rlybavfie8r3">
         <w:r>
           <w:t xml:space="preserve">arXiv:1502.07882</w:t>
         </w:r>
@@ -2244,7 +2244,7 @@
       <w:r>
         <w:t xml:space="preserve">, </w:t>
       </w:r>
-      <w:hyperlink w:history="1" r:id="rIdo3qi87yd3j_cgftvdoxqa">
+      <w:hyperlink w:history="1" r:id="rIds5px2or5ledkqacmh-pi8">
         <w:r>
           <w:t xml:space="preserve">EPJ Web Conf. 61, 02007 (2013)</w:t>
         </w:r>
@@ -2252,7 +2252,7 @@
       <w:r>
         <w:t xml:space="preserve">, </w:t>
       </w:r>
-      <w:hyperlink w:history="1" r:id="rIdsugtcked5asbep_wot3w2">
+      <w:hyperlink w:history="1" r:id="rIdvh8xt7zqt4qlgqtvqkiad">
         <w:r>
           <w:t xml:space="preserve">arXiv:1309.4612</w:t>
         </w:r>
@@ -2289,7 +2289,7 @@
       <w:r>
         <w:t xml:space="preserve">, </w:t>
       </w:r>
-      <w:hyperlink w:history="1" r:id="rIdl9z_350ft89deifohfxue">
+      <w:hyperlink w:history="1" r:id="rIdmbof0j_5xzgru68nr5h3l">
         <w:r>
           <w:t xml:space="preserve">J. Phys.: Conf. Ser. 454, 012001 (2013)</w:t>
         </w:r>
@@ -2297,7 +2297,7 @@
       <w:r>
         <w:t xml:space="preserve">, </w:t>
       </w:r>
-      <w:hyperlink w:history="1" r:id="rId5wgg-z-0bre8rjw97e3rj">
+      <w:hyperlink w:history="1" r:id="rId_u6b1bj8hl37ka58fdxnu">
         <w:r>
           <w:t xml:space="preserve">arXiv:1211.1794</w:t>
         </w:r>
@@ -2700,7 +2700,7 @@
       <w:r>
         <w:tab/>
       </w:r>
-      <w:hyperlink w:history="1" r:id="rIdyxfh9cdk6jeeyh4kkzume">
+      <w:hyperlink w:history="1" r:id="rIdw8m29abs8y9anosh5fzl6">
         <w:r>
           <w:t xml:space="preserve">github.com/altjerue/ilwikak-ml</w:t>
         </w:r>
@@ -2791,7 +2791,7 @@
       <w:r>
         <w:tab/>
       </w:r>
-      <w:hyperlink w:history="1" r:id="rIdk0tm3e2--qyk-doffmcxr">
+      <w:hyperlink w:history="1" r:id="rIddhqup10ct36p9a8tgsshd">
         <w:r>
           <w:t xml:space="preserve">github.com/UW-ForestMycobiomeLab/WindSporesHills</w:t>
         </w:r>
@@ -2856,7 +2856,7 @@
       <w:r>
         <w:tab/>
       </w:r>
-      <w:hyperlink w:history="1" r:id="rIdwxjkvilbpzsnsw5mjpmv8">
+      <w:hyperlink w:history="1" r:id="rIdhxsvfdwmhhewt41rj7l7q">
         <w:r>
           <w:t xml:space="preserve">github.com/zkdavis/Tleco</w:t>
         </w:r>
@@ -2921,7 +2921,7 @@
       <w:r>
         <w:tab/>
       </w:r>
-      <w:hyperlink w:history="1" r:id="rIdrzpcpkd3gqbibeidyr-xf">
+      <w:hyperlink w:history="1" r:id="rIdqmdvdbwn2tlwfbbju6nao">
         <w:r>
           <w:t xml:space="preserve">github.com/altjerue/paramo</w:t>
         </w:r>
@@ -3136,56 +3136,6 @@
           <w:b/>
           <w:bCs/>
         </w:rPr>
-        <w:t xml:space="preserve">The Role of Machine Learning in Environmental Science</w:t>
-      </w:r>
-      <w:r>
-        <w:tab/>
-      </w:r>
-      <w:r>
-        <w:t xml:space="preserve">Mar 2024</w:t>
-      </w:r>
-    </w:p>
-    <w:p>
-      <w:pPr>
-        <w:keepNext/>
-        <w:tabs>
-          <w:tab w:val="right" w:pos="10512"/>
-        </w:tabs>
-        <w:spacing w:after="0"/>
-      </w:pPr>
-      <w:r>
-        <w:rPr>
-          <w:i/>
-          <w:iCs/>
-        </w:rPr>
-        <w:t xml:space="preserve">Seminar on Climate Change Ecology, University of Washington</w:t>
-      </w:r>
-      <w:r>
-        <w:tab/>
-      </w:r>
-      <w:r>
-        <w:t xml:space="preserve">Seattle, WA</w:t>
-      </w:r>
-    </w:p>
-    <w:p>
-      <w:pPr>
-        <w:pStyle w:val="EntryGap"/>
-        <w:spacing w:after="0"/>
-      </w:pPr>
-    </w:p>
-    <w:p>
-      <w:pPr>
-        <w:keepNext/>
-        <w:tabs>
-          <w:tab w:val="right" w:pos="10512"/>
-        </w:tabs>
-        <w:spacing w:after="0"/>
-      </w:pPr>
-      <w:r>
-        <w:rPr>
-          <w:b/>
-          <w:bCs/>
-        </w:rPr>
         <w:t xml:space="preserve">Morphology of the spectra from numerical simulations of the internal shocks model for blazars</w:t>
       </w:r>
       <w:r>
@@ -3532,7 +3482,7 @@
       <w:r>
         <w:t xml:space="preserve">Video: </w:t>
       </w:r>
-      <w:hyperlink w:history="1" r:id="rIdmeqnjmzqfxwzjv68vbwla">
+      <w:hyperlink w:history="1" r:id="rIdcldadehcpz9wqz8w2ulww">
         <w:r>
           <w:t xml:space="preserve">youtube.com/watch?v=BAZNWLNT69M</w:t>
         </w:r>
@@ -3703,7 +3653,7 @@
       <w:r>
         <w:t xml:space="preserve">Marcos Moshinsky Award for Best Poster. Video: </w:t>
       </w:r>
-      <w:hyperlink w:history="1" r:id="rIdq5ywatbwzj25vatozcrq7">
+      <w:hyperlink w:history="1" r:id="rIdos90lqetak8qtd28i9k-o">
         <w:r>
           <w:t xml:space="preserve">youtube.com/watch?v=0TJiKg7kOPI</w:t>
         </w:r>
@@ -4394,6 +4344,106 @@
           <w:b/>
           <w:bCs/>
         </w:rPr>
+        <w:t xml:space="preserve">El origen del universo y el sistema solar (The Origin of the Universe and the Solar System)</w:t>
+      </w:r>
+      <w:r>
+        <w:tab/>
+      </w:r>
+      <w:r>
+        <w:t xml:space="preserve">Feb 2026</w:t>
+      </w:r>
+    </w:p>
+    <w:p>
+      <w:pPr>
+        <w:keepNext/>
+        <w:tabs>
+          <w:tab w:val="right" w:pos="10512"/>
+        </w:tabs>
+        <w:spacing w:after="0"/>
+      </w:pPr>
+      <w:r>
+        <w:rPr>
+          <w:i/>
+          <w:iCs/>
+        </w:rPr>
+        <w:t xml:space="preserve">Biology students, Facultad de Ciencias, Universidad Autónoma del Estado de México</w:t>
+      </w:r>
+      <w:r>
+        <w:tab/>
+      </w:r>
+      <w:r>
+        <w:t xml:space="preserve">Talk</w:t>
+      </w:r>
+    </w:p>
+    <w:p>
+      <w:pPr>
+        <w:pStyle w:val="EntryGap"/>
+        <w:spacing w:after="0"/>
+      </w:pPr>
+    </w:p>
+    <w:p>
+      <w:pPr>
+        <w:keepNext/>
+        <w:tabs>
+          <w:tab w:val="right" w:pos="10512"/>
+        </w:tabs>
+        <w:spacing w:after="0"/>
+      </w:pPr>
+      <w:r>
+        <w:rPr>
+          <w:b/>
+          <w:bCs/>
+        </w:rPr>
+        <w:t xml:space="preserve">The Role of Machine Learning in Environmental Science</w:t>
+      </w:r>
+      <w:r>
+        <w:tab/>
+      </w:r>
+      <w:r>
+        <w:t xml:space="preserve">Mar 2024</w:t>
+      </w:r>
+    </w:p>
+    <w:p>
+      <w:pPr>
+        <w:keepNext/>
+        <w:tabs>
+          <w:tab w:val="right" w:pos="10512"/>
+        </w:tabs>
+        <w:spacing w:after="0"/>
+      </w:pPr>
+      <w:r>
+        <w:rPr>
+          <w:i/>
+          <w:iCs/>
+        </w:rPr>
+        <w:t xml:space="preserve">Seminar on Climate Change Ecology, University of Washington</w:t>
+      </w:r>
+      <w:r>
+        <w:tab/>
+      </w:r>
+      <w:r>
+        <w:t xml:space="preserve">Seattle, WA</w:t>
+      </w:r>
+    </w:p>
+    <w:p>
+      <w:pPr>
+        <w:pStyle w:val="EntryGap"/>
+        <w:spacing w:after="0"/>
+      </w:pPr>
+    </w:p>
+    <w:p>
+      <w:pPr>
+        <w:keepNext/>
+        <w:tabs>
+          <w:tab w:val="right" w:pos="10512"/>
+        </w:tabs>
+        <w:spacing w:after="0"/>
+      </w:pPr>
+      <w:r>
+        <w:rPr>
+          <w:b/>
+          <w:bCs/>
+        </w:rPr>
         <w:t xml:space="preserve">Los más rápidos y los más furiosos (The Fastest and the Most Furious)</w:t>
       </w:r>
       <w:r>
@@ -4529,7 +4579,7 @@
       <w:pPr>
         <w:spacing w:after="0"/>
       </w:pPr>
-      <w:hyperlink w:history="1" r:id="rIdn5esio6wlkymijrfh8s21">
+      <w:hyperlink w:history="1" r:id="rIdq9_leg0szs92_qqwzc8li">
         <w:r>
           <w:t xml:space="preserve">mexiciencia.github.io/post/anita</w:t>
         </w:r>
@@ -4589,7 +4639,7 @@
       <w:pPr>
         <w:spacing w:after="0"/>
       </w:pPr>
-      <w:hyperlink w:history="1" r:id="rIdtslno-otphsdtbtplb5sd">
+      <w:hyperlink w:history="1" r:id="rIdjlpivljenqarfhsjrqdkp">
         <w:r>
           <w:t xml:space="preserve">mexiciencia.github.io/post/modelo-sir</w:t>
         </w:r>
@@ -4652,7 +4702,7 @@
       <w:r>
         <w:t xml:space="preserve">Data analysis and modeling collaborator. </w:t>
       </w:r>
-      <w:hyperlink w:history="1" r:id="rIdtodjhrrpaq0q7qy2qkll3">
+      <w:hyperlink w:history="1" r:id="rIdmuhr0ua3mfxejt_m1x50l">
         <w:r>
           <w:t xml:space="preserve">mexiciencia.github.io/post/covid19</w:t>
         </w:r>

</xml_diff>

<commit_message>
Tailor CV and resume for Ai2 Research Engineer role
Co-Authored-By: Claude Sonnet 5.5 <noreply@anthropic.com>
</commit_message>
<xml_diff>
--- a/RuedaBecerrilJM-CV-plain.docx
+++ b/RuedaBecerrilJM-CV-plain.docx
@@ -28,7 +28,7 @@
       <w:r>
         <w:t xml:space="preserve">  |  </w:t>
       </w:r>
-      <w:hyperlink w:history="1" r:id="rIdcp_ik5gft9xpskyp9hjjz">
+      <w:hyperlink w:history="1" r:id="rIdccppnq5q4gow69w-vkhp7">
         <w:r>
           <w:t xml:space="preserve">jm.ruebe@gmail.com</w:t>
         </w:r>
@@ -42,7 +42,7 @@
       <w:r>
         <w:t xml:space="preserve">  |  </w:t>
       </w:r>
-      <w:hyperlink w:history="1" r:id="rId7-0ygznevswy-smpxxjqr">
+      <w:hyperlink w:history="1" r:id="rId8p-wivbcjczvulhczjhfw">
         <w:r>
           <w:t xml:space="preserve">linkedin.com/in/jeruebe</w:t>
         </w:r>
@@ -53,7 +53,7 @@
         <w:spacing w:after="60"/>
         <w:jc w:val="center"/>
       </w:pPr>
-      <w:hyperlink w:history="1" r:id="rIdxg3zzmgk0bljru2o1iowi">
+      <w:hyperlink w:history="1" r:id="rIdu03kw-cysidv5jjtipdh8">
         <w:r>
           <w:t xml:space="preserve">altjerue.github.io</w:t>
         </w:r>
@@ -61,7 +61,7 @@
       <w:r>
         <w:t xml:space="preserve">  |  </w:t>
       </w:r>
-      <w:hyperlink w:history="1" r:id="rId4mzikwxkjy-7cqnh0fwxc">
+      <w:hyperlink w:history="1" r:id="rId8ydfyc08sdptpv-pc9yja">
         <w:r>
           <w:t xml:space="preserve">github.com/altjerue</w:t>
         </w:r>
@@ -69,7 +69,7 @@
       <w:r>
         <w:t xml:space="preserve">  |  </w:t>
       </w:r>
-      <w:hyperlink w:history="1" r:id="rIdppoce_1w7hmu0txu_dbsb">
+      <w:hyperlink w:history="1" r:id="rIdhmoscv7wf6n06demrrewy">
         <w:r>
           <w:t xml:space="preserve">orcid.org/0000-0003-1988-1912</w:t>
         </w:r>
@@ -77,7 +77,7 @@
       <w:r>
         <w:t xml:space="preserve">  |  </w:t>
       </w:r>
-      <w:hyperlink w:history="1" r:id="rIdxohnkozayjhcpgr1vsjqx">
+      <w:hyperlink w:history="1" r:id="rId_xamveqmzajqlcskwwqs9">
         <w:r>
           <w:t xml:space="preserve">Google Scholar</w:t>
         </w:r>
@@ -93,7 +93,7 @@
     </w:p>
     <w:p>
       <w:r>
-        <w:t xml:space="preserve">Computational Scientist with a PhD in Physics and 10+ years developing high-performance numerical algorithms and physics-based simulations. Expertise in scientific machine learning and geospatial data analysis. Strong mathematical foundations with a track record of architecting open-source simulation libraries, leading funded research projects, and translating complex physical models into production-quality scientific software. Experienced working across cross-functional research and engineering teams.</w:t>
+        <w:t xml:space="preserve">Research engineer and computational scientist with a PhD in Physics and 10+ years of experience building physics-based numerical models (PDE solvers, radiative transfer, MHD) and applying machine learning to physical-science problems. Python-fluent, with GPU and HPC experience and an open-source track record: architected and maintained simulation libraries adopted by other research groups, tested and shipped code through CI/CD with test suites, and mentored students. Strong at pairing physical principles with data-driven models and explaining the results to scientific and engineering audiences.</w:t>
       </w:r>
     </w:p>
     <w:p>
@@ -116,7 +116,7 @@
         <w:t xml:space="preserve">Languages: </w:t>
       </w:r>
       <w:r>
-        <w:t xml:space="preserve">Python, C/C++, Fortran 95, R, SQL, Shell, Rust, Java, Julia</w:t>
+        <w:t xml:space="preserve">Python, C/C++, Fortran 95, Rust, R, Java, SQL, Julia, Shell</w:t>
       </w:r>
     </w:p>
     <w:p>
@@ -131,7 +131,7 @@
         <w:t xml:space="preserve">ML &amp; Data: </w:t>
       </w:r>
       <w:r>
-        <w:t xml:space="preserve">Scientific ML, PyTorch, TensorFlow, scikit-learn, NumPy, SciPy, Pandas, Astropy, ML-assisted parameter estimation, gradient-based optimization, SVM, random forest, neural networks</w:t>
+        <w:t xml:space="preserve">Scientific ML, hybrid physics–ML modeling, PyTorch, TensorFlow, scikit-learn, NumPy, SciPy, Pandas, Astropy, ML-assisted parameter estimation, gradient-based optimization, SVM, random forest, neural networks</w:t>
       </w:r>
     </w:p>
     <w:p>
@@ -191,7 +191,7 @@
         <w:t xml:space="preserve">Tools: </w:t>
       </w:r>
       <w:r>
-        <w:t xml:space="preserve">Git, Docker, Azure, Jenkins, Kafka, Jira, QGIS, ParaView, VisIt</w:t>
+        <w:t xml:space="preserve">Git and code review, Docker, Azure, CI/CD (Jenkins), Kafka, Jira, QGIS, ParaView, VisIt</w:t>
       </w:r>
     </w:p>
     <w:p>
@@ -452,7 +452,7 @@
         <w:spacing w:after="10"/>
       </w:pPr>
       <w:r>
-        <w:t xml:space="preserve">Co-developed Tleco, a Rust/Python toolkit that models radiation from relativistic outflows by solving the Fokker–Planck equation coupled to radiative transfer; published in ApJ (2024) [9].</w:t>
+        <w:t xml:space="preserve">Co-developed Tleco, an open-source Rust/Python toolkit that models radiation from relativistic outflows by solving the Fokker–Planck equation coupled to radiative transfer; published in ApJ (2024) [9].</w:t>
       </w:r>
     </w:p>
     <w:p>
@@ -1132,7 +1132,7 @@
       <w:r>
         <w:t xml:space="preserve">Thesis: </w:t>
       </w:r>
-      <w:hyperlink w:history="1" r:id="rIdry8wy2fxfoopy8izal6tc">
+      <w:hyperlink w:history="1" r:id="rIdzbwcfltfq7qsuaggfq-or">
         <w:r>
           <w:t xml:space="preserve">Numerical treatment of radiation processes in the internal shocks of magnetized relativistic outflows</w:t>
         </w:r>
@@ -1429,7 +1429,7 @@
       <w:r>
         <w:t xml:space="preserve">, </w:t>
       </w:r>
-      <w:hyperlink w:history="1" r:id="rIdthczanmoxgwti4pyba62m">
+      <w:hyperlink w:history="1" r:id="rIdrsr0uq42dib-ra6vimg2p">
         <w:r>
           <w:t xml:space="preserve">ApJ 976, 182 (2024)</w:t>
         </w:r>
@@ -1437,7 +1437,7 @@
       <w:r>
         <w:t xml:space="preserve">, </w:t>
       </w:r>
-      <w:hyperlink w:history="1" r:id="rIdcapfidgdebdb75a-oydzv">
+      <w:hyperlink w:history="1" r:id="rIdktcaamsniha5od6yrufei">
         <w:r>
           <w:t xml:space="preserve">arXiv:2405.17581</w:t>
         </w:r>
@@ -1474,7 +1474,7 @@
       <w:r>
         <w:t xml:space="preserve">, </w:t>
       </w:r>
-      <w:hyperlink w:history="1" r:id="rIdjh8t1eeujarjpj3ltbsdz">
+      <w:hyperlink w:history="1" r:id="rIdgohh1y-1_wazdb9exa55h">
         <w:r>
           <w:t xml:space="preserve">MNRAS 513, 5766–5779 (2022)</w:t>
         </w:r>
@@ -1482,7 +1482,7 @@
       <w:r>
         <w:t xml:space="preserve">, </w:t>
       </w:r>
-      <w:hyperlink w:history="1" r:id="rId4q__zedjghs33xa5ldan7">
+      <w:hyperlink w:history="1" r:id="rId56ldxruxf5ovcpal2resh">
         <w:r>
           <w:t xml:space="preserve">arXiv:2201.07790</w:t>
         </w:r>
@@ -1519,7 +1519,7 @@
       <w:r>
         <w:t xml:space="preserve">, </w:t>
       </w:r>
-      <w:hyperlink w:history="1" r:id="rIdtderxl6iiht3jr36qldrd">
+      <w:hyperlink w:history="1" r:id="rId2idswsk4nyxbwx5vxyhwu">
         <w:r>
           <w:t xml:space="preserve">Phys. Rev. D 106, 083015 (2022)</w:t>
         </w:r>
@@ -1527,7 +1527,7 @@
       <w:r>
         <w:t xml:space="preserve">, </w:t>
       </w:r>
-      <w:hyperlink w:history="1" r:id="rIdbe7ec4yzr0n7hstpcx7pt">
+      <w:hyperlink w:history="1" r:id="rIddrdpdhjjgjtktbbrqakbg">
         <w:r>
           <w:t xml:space="preserve">arXiv:2112.09817</w:t>
         </w:r>
@@ -1564,7 +1564,7 @@
       <w:r>
         <w:t xml:space="preserve">, </w:t>
       </w:r>
-      <w:hyperlink w:history="1" r:id="rIdbbvauisz9fjbgbjkqhvmv">
+      <w:hyperlink w:history="1" r:id="rIdudslztoqwtfljbie6u7pm">
         <w:r>
           <w:t xml:space="preserve">ApJ 919, 95 (2021)</w:t>
         </w:r>
@@ -1572,7 +1572,7 @@
       <w:r>
         <w:t xml:space="preserve">, </w:t>
       </w:r>
-      <w:hyperlink w:history="1" r:id="rIdpbrzkexjkohtqpt8g6nti">
+      <w:hyperlink w:history="1" r:id="rIdq2t9ccw-osks2u9vj5jax">
         <w:r>
           <w:t xml:space="preserve">arXiv:2106.05356</w:t>
         </w:r>
@@ -1609,7 +1609,7 @@
       <w:r>
         <w:t xml:space="preserve">, </w:t>
       </w:r>
-      <w:hyperlink w:history="1" r:id="rIddvrwdeowdnldkrpcwruma">
+      <w:hyperlink w:history="1" r:id="rIdtm1a8ckb3lawluuuuixl-">
         <w:r>
           <w:t xml:space="preserve">MNRAS 501, 4092–4102 (2021)</w:t>
         </w:r>
@@ -1617,7 +1617,7 @@
       <w:r>
         <w:t xml:space="preserve">, </w:t>
       </w:r>
-      <w:hyperlink w:history="1" r:id="rIdxbta61azq6-ogrwcpr-7u">
+      <w:hyperlink w:history="1" r:id="rIdfs35yzq-zqbjj5uqtbh8u">
         <w:r>
           <w:t xml:space="preserve">arXiv:2009.02273</w:t>
         </w:r>
@@ -1654,7 +1654,7 @@
       <w:r>
         <w:t xml:space="preserve">, </w:t>
       </w:r>
-      <w:hyperlink w:history="1" r:id="rIdf6odr1iur2tkzylvdrj4w">
+      <w:hyperlink w:history="1" r:id="rId46ksd6bxca2bqnlkq8owy">
         <w:r>
           <w:t xml:space="preserve">MNRAS 496, 974–986 (2020)</w:t>
         </w:r>
@@ -1662,7 +1662,7 @@
       <w:r>
         <w:t xml:space="preserve">, </w:t>
       </w:r>
-      <w:hyperlink w:history="1" r:id="rIdviisxqq1c_ebfd_wpcuz1">
+      <w:hyperlink w:history="1" r:id="rIdbnhqrqzv6jsaqq5qkrhi-">
         <w:r>
           <w:t xml:space="preserve">arXiv:1910.14049</w:t>
         </w:r>
@@ -1699,7 +1699,7 @@
       <w:r>
         <w:t xml:space="preserve">, </w:t>
       </w:r>
-      <w:hyperlink w:history="1" r:id="rId9q5x0zjmbq0dlixhn5gnq">
+      <w:hyperlink w:history="1" r:id="rIdc7zp3ahtclxk2owpjppt_">
         <w:r>
           <w:t xml:space="preserve">MNRAS 468, 1169–1182 (2017)</w:t>
         </w:r>
@@ -1707,7 +1707,7 @@
       <w:r>
         <w:t xml:space="preserve">, </w:t>
       </w:r>
-      <w:hyperlink w:history="1" r:id="rIdyr8wjeuwren3vee_zxq2r">
+      <w:hyperlink w:history="1" r:id="rIdqxlgc3kyswxd5-6ji-lr6">
         <w:r>
           <w:t xml:space="preserve">arXiv:1612.06383</w:t>
         </w:r>
@@ -1744,7 +1744,7 @@
       <w:r>
         <w:t xml:space="preserve">, </w:t>
       </w:r>
-      <w:hyperlink w:history="1" r:id="rIdafs_pfzk5x-ad1rme593s">
+      <w:hyperlink w:history="1" r:id="rIdl_ka3iosigebrdxet98v6">
         <w:r>
           <w:t xml:space="preserve">MNRAS 438, 1856–1869 (2014)</w:t>
         </w:r>
@@ -1752,7 +1752,7 @@
       <w:r>
         <w:t xml:space="preserve">, </w:t>
       </w:r>
-      <w:hyperlink w:history="1" r:id="rId1augcig12n0bnlz5w4i1l">
+      <w:hyperlink w:history="1" r:id="rIdloiodiiu444mmzdvk6gsd">
         <w:r>
           <w:t xml:space="preserve">arXiv:1310.5441</w:t>
         </w:r>
@@ -1789,7 +1789,7 @@
       <w:r>
         <w:t xml:space="preserve">, </w:t>
       </w:r>
-      <w:hyperlink w:history="1" r:id="rIdf2dwynphdmxm3cigdyfca">
+      <w:hyperlink w:history="1" r:id="rIdfafhaqabzno8bfvlcekod">
         <w:r>
           <w:t xml:space="preserve">Phys. Rev. D 80, 084023 (2009)</w:t>
         </w:r>
@@ -1797,7 +1797,7 @@
       <w:r>
         <w:t xml:space="preserve">, </w:t>
       </w:r>
-      <w:hyperlink w:history="1" r:id="rId_0zlw-eawp0y1mbrvpc_l">
+      <w:hyperlink w:history="1" r:id="rIdlnvcym8ulmh-ohgyxrb11">
         <w:r>
           <w:t xml:space="preserve">arXiv:1009.1250</w:t>
         </w:r>
@@ -1842,7 +1842,7 @@
       <w:r>
         <w:t xml:space="preserve">, </w:t>
       </w:r>
-      <w:hyperlink w:history="1" r:id="rIdsmjhg-vdrwp_gugq9vltb">
+      <w:hyperlink w:history="1" r:id="rId7ojmoqfx8byfale6k0xow">
         <w:r>
           <w:t xml:space="preserve">Astron. Nachr. 342, 277–282 (2021)</w:t>
         </w:r>
@@ -1850,7 +1850,7 @@
       <w:r>
         <w:t xml:space="preserve">, 9th International Workshop on Astronomy and Relativistic Astrophysics, </w:t>
       </w:r>
-      <w:hyperlink w:history="1" r:id="rId0zeke3bakv7_cqrwogcxc">
+      <w:hyperlink w:history="1" r:id="rIdh5q126nbnqwwz2zp5cajq">
         <w:r>
           <w:t xml:space="preserve">arXiv:2011.13797</w:t>
         </w:r>
@@ -1887,7 +1887,7 @@
       <w:r>
         <w:t xml:space="preserve">, </w:t>
       </w:r>
-      <w:hyperlink w:history="1" r:id="rIdlxnz7jkeske7frmplerc2">
+      <w:hyperlink w:history="1" r:id="rIdkvg97xqg5ozlnxpt8qmsi">
         <w:r>
           <w:t xml:space="preserve">Astron. Nachr. 342, 147–152 (2021)</w:t>
         </w:r>
@@ -1895,7 +1895,7 @@
       <w:r>
         <w:t xml:space="preserve">, 9th International Workshop on Astronomy and Relativistic Astrophysics, </w:t>
       </w:r>
-      <w:hyperlink w:history="1" r:id="rIdlfs5cdyd2k3argb658o6k">
+      <w:hyperlink w:history="1" r:id="rId6zfponztvqumb99wwnsi8">
         <w:r>
           <w:t xml:space="preserve">arXiv:2011.13805</w:t>
         </w:r>
@@ -1932,7 +1932,7 @@
       <w:r>
         <w:t xml:space="preserve">, </w:t>
       </w:r>
-      <w:hyperlink w:history="1" r:id="rIdhloyqgroxbjlsrm5txbnt">
+      <w:hyperlink w:history="1" r:id="rIdo7gkuuw1qw2757nka0fty">
         <w:r>
           <w:t xml:space="preserve">PoS(SWIFT 10) 233, 159 (2014)</w:t>
         </w:r>
@@ -1940,7 +1940,7 @@
       <w:r>
         <w:t xml:space="preserve">, </w:t>
       </w:r>
-      <w:hyperlink w:history="1" r:id="rIdcm2rufbkwwhvwzycyhfzy">
+      <w:hyperlink w:history="1" r:id="rIdreaxcbfqfxawhierfdlum">
         <w:r>
           <w:t xml:space="preserve">arXiv:1502.07882</w:t>
         </w:r>
@@ -1977,7 +1977,7 @@
       <w:r>
         <w:t xml:space="preserve">, </w:t>
       </w:r>
-      <w:hyperlink w:history="1" r:id="rIdaea0lk527gvxlupstfiui">
+      <w:hyperlink w:history="1" r:id="rIdotkjey5eklpxibbh6d6ri">
         <w:r>
           <w:t xml:space="preserve">EPJ Web Conf. 61, 02007 (2013)</w:t>
         </w:r>
@@ -1985,7 +1985,7 @@
       <w:r>
         <w:t xml:space="preserve">, </w:t>
       </w:r>
-      <w:hyperlink w:history="1" r:id="rIdtzfs9ir6kes2uu8nqooxu">
+      <w:hyperlink w:history="1" r:id="rIdhb62ppzxhtowrhtz9q066">
         <w:r>
           <w:t xml:space="preserve">arXiv:1309.4612</w:t>
         </w:r>
@@ -2022,7 +2022,7 @@
       <w:r>
         <w:t xml:space="preserve">, </w:t>
       </w:r>
-      <w:hyperlink w:history="1" r:id="rIdbt2mk2fl3onujfqejvdru">
+      <w:hyperlink w:history="1" r:id="rIdvxb8gvr66gq7xdoqw2mc3">
         <w:r>
           <w:t xml:space="preserve">J. Phys.: Conf. Ser. 454, 012001 (2013)</w:t>
         </w:r>
@@ -2030,7 +2030,7 @@
       <w:r>
         <w:t xml:space="preserve">, </w:t>
       </w:r>
-      <w:hyperlink w:history="1" r:id="rIdi_oueidwagdzhivt01jls">
+      <w:hyperlink w:history="1" r:id="rId3fad8rddsg_ilgvs3ymjg">
         <w:r>
           <w:t xml:space="preserve">arXiv:1211.1794</w:t>
         </w:r>
@@ -2428,12 +2428,12 @@
           <w:i/>
           <w:iCs/>
         </w:rPr>
-        <w:t xml:space="preserve">Scientific ML (Python, scikit-learn, PyTorch)</w:t>
-      </w:r>
-      <w:r>
-        <w:tab/>
-      </w:r>
-      <w:hyperlink w:history="1" r:id="rId6j2wyumvu-hdgxucmi4yd">
+        <w:t xml:space="preserve">Physics-informed ML (Python, scikit-learn, PyTorch)</w:t>
+      </w:r>
+      <w:r>
+        <w:tab/>
+      </w:r>
+      <w:hyperlink w:history="1" r:id="rIdk_6nd-mn8apxh3fw-c94d">
         <w:r>
           <w:t xml:space="preserve">github.com/altjerue/ilwikak-ml</w:t>
         </w:r>
@@ -2462,7 +2462,7 @@
         <w:spacing w:after="10"/>
       </w:pPr>
       <w:r>
-        <w:t xml:space="preserve">Building a neural network that maps physical jet parameters to observable spectral energy distributions accurately enough to compare with Tleco results.</w:t>
+        <w:t xml:space="preserve">Training a neural-network emulator of the physics-based Tleco model that maps physical jet parameters to observable spectral energy distributions, validated against Tleco output.</w:t>
       </w:r>
     </w:p>
     <w:p>
@@ -2524,7 +2524,7 @@
       <w:r>
         <w:tab/>
       </w:r>
-      <w:hyperlink w:history="1" r:id="rIdpourlobghevea6npvouil">
+      <w:hyperlink w:history="1" r:id="rIdsvhqsbhy0kch-gqjfxhcv">
         <w:r>
           <w:t xml:space="preserve">github.com/UW-ForestMycobiomeLab/WindSporesHills</w:t>
         </w:r>
@@ -2589,7 +2589,7 @@
       <w:r>
         <w:tab/>
       </w:r>
-      <w:hyperlink w:history="1" r:id="rIdwqgqa66ntsxp5fcnoofru">
+      <w:hyperlink w:history="1" r:id="rIdazzgmszmtmaleqenw8esl">
         <w:r>
           <w:t xml:space="preserve">github.com/zkdavis/Tleco</w:t>
         </w:r>
@@ -2654,7 +2654,7 @@
       <w:r>
         <w:tab/>
       </w:r>
-      <w:hyperlink w:history="1" r:id="rIdsglhgdrgggtabvp22vqcy">
+      <w:hyperlink w:history="1" r:id="rIdgouyja_xfba6spx5pryfo">
         <w:r>
           <w:t xml:space="preserve">github.com/altjerue/paramo</w:t>
         </w:r>
@@ -3265,7 +3265,7 @@
       <w:r>
         <w:t xml:space="preserve">Video: </w:t>
       </w:r>
-      <w:hyperlink w:history="1" r:id="rIdt0l7c5jm0nh25v-lexr8s">
+      <w:hyperlink w:history="1" r:id="rIdlf0kw26-8cf4rw4zrsre-">
         <w:r>
           <w:t xml:space="preserve">youtube.com/watch?v=BAZNWLNT69M</w:t>
         </w:r>
@@ -3436,7 +3436,7 @@
       <w:r>
         <w:t xml:space="preserve">Marcos Moshinsky Award for Best Poster. Video: </w:t>
       </w:r>
-      <w:hyperlink w:history="1" r:id="rIdjbjrfn7ctsfb0arjx5bqa">
+      <w:hyperlink w:history="1" r:id="rId2t_pl_b03ypxytkdlb3lg">
         <w:r>
           <w:t xml:space="preserve">youtube.com/watch?v=0TJiKg7kOPI</w:t>
         </w:r>
@@ -4494,7 +4494,7 @@
       <w:pPr>
         <w:spacing w:after="0"/>
       </w:pPr>
-      <w:hyperlink w:history="1" r:id="rId8jf526ir6mphereolr27m">
+      <w:hyperlink w:history="1" r:id="rIdehsukn7s6rh9mmfykmscd">
         <w:r>
           <w:t xml:space="preserve">mexiciencia.github.io/post/anita</w:t>
         </w:r>
@@ -4554,7 +4554,7 @@
       <w:pPr>
         <w:spacing w:after="0"/>
       </w:pPr>
-      <w:hyperlink w:history="1" r:id="rIdwgtbmsj10cvohmcfcqu6f">
+      <w:hyperlink w:history="1" r:id="rIdeyntodw9jbt1deaiilche">
         <w:r>
           <w:t xml:space="preserve">mexiciencia.github.io/post/modelo-sir</w:t>
         </w:r>
@@ -4617,7 +4617,7 @@
       <w:r>
         <w:t xml:space="preserve">Data analysis and modeling collaborator. </w:t>
       </w:r>
-      <w:hyperlink w:history="1" r:id="rIdoyrq-sc2874hpyf6mk4na">
+      <w:hyperlink w:history="1" r:id="rIdairuc3qf2k7ooo_ssjaa7">
         <w:r>
           <w:t xml:space="preserve">mexiciencia.github.io/post/covid19</w:t>
         </w:r>

</xml_diff>

<commit_message>
List JAX as introductory coursework in skills
Co-Authored-By: Claude Sonnet 5.5 <noreply@anthropic.com>
</commit_message>
<xml_diff>
--- a/RuedaBecerrilJM-CV-plain.docx
+++ b/RuedaBecerrilJM-CV-plain.docx
@@ -28,7 +28,7 @@
       <w:r>
         <w:t xml:space="preserve">  |  </w:t>
       </w:r>
-      <w:hyperlink w:history="1" r:id="rIdccppnq5q4gow69w-vkhp7">
+      <w:hyperlink w:history="1" r:id="rIdhvztz-26_0s0kojb7on6t">
         <w:r>
           <w:t xml:space="preserve">jm.ruebe@gmail.com</w:t>
         </w:r>
@@ -42,7 +42,7 @@
       <w:r>
         <w:t xml:space="preserve">  |  </w:t>
       </w:r>
-      <w:hyperlink w:history="1" r:id="rId8p-wivbcjczvulhczjhfw">
+      <w:hyperlink w:history="1" r:id="rIdldsxzatzxuzro9go5yprh">
         <w:r>
           <w:t xml:space="preserve">linkedin.com/in/jeruebe</w:t>
         </w:r>
@@ -53,7 +53,7 @@
         <w:spacing w:after="60"/>
         <w:jc w:val="center"/>
       </w:pPr>
-      <w:hyperlink w:history="1" r:id="rIdu03kw-cysidv5jjtipdh8">
+      <w:hyperlink w:history="1" r:id="rId2r3mv8men87mys0xqfx3n">
         <w:r>
           <w:t xml:space="preserve">altjerue.github.io</w:t>
         </w:r>
@@ -61,7 +61,7 @@
       <w:r>
         <w:t xml:space="preserve">  |  </w:t>
       </w:r>
-      <w:hyperlink w:history="1" r:id="rId8ydfyc08sdptpv-pc9yja">
+      <w:hyperlink w:history="1" r:id="rIdwslkrnsjbp_b0vb2xmaos">
         <w:r>
           <w:t xml:space="preserve">github.com/altjerue</w:t>
         </w:r>
@@ -69,7 +69,7 @@
       <w:r>
         <w:t xml:space="preserve">  |  </w:t>
       </w:r>
-      <w:hyperlink w:history="1" r:id="rIdhmoscv7wf6n06demrrewy">
+      <w:hyperlink w:history="1" r:id="rIdeplhgem6wv_xrpsodg7pk">
         <w:r>
           <w:t xml:space="preserve">orcid.org/0000-0003-1988-1912</w:t>
         </w:r>
@@ -77,7 +77,7 @@
       <w:r>
         <w:t xml:space="preserve">  |  </w:t>
       </w:r>
-      <w:hyperlink w:history="1" r:id="rId_xamveqmzajqlcskwwqs9">
+      <w:hyperlink w:history="1" r:id="rIdpe9t2uxa6rih_lhz6dvkm">
         <w:r>
           <w:t xml:space="preserve">Google Scholar</w:t>
         </w:r>
@@ -131,7 +131,7 @@
         <w:t xml:space="preserve">ML &amp; Data: </w:t>
       </w:r>
       <w:r>
-        <w:t xml:space="preserve">Scientific ML, hybrid physics–ML modeling, PyTorch, TensorFlow, scikit-learn, NumPy, SciPy, Pandas, Astropy, ML-assisted parameter estimation, gradient-based optimization, SVM, random forest, neural networks</w:t>
+        <w:t xml:space="preserve">Scientific ML, hybrid physics–ML modeling, PyTorch, TensorFlow, JAX (introductory coursework), scikit-learn, NumPy, SciPy, Pandas, Astropy, ML-assisted parameter estimation, gradient-based optimization, SVM, random forest, neural networks</w:t>
       </w:r>
     </w:p>
     <w:p>
@@ -1132,7 +1132,7 @@
       <w:r>
         <w:t xml:space="preserve">Thesis: </w:t>
       </w:r>
-      <w:hyperlink w:history="1" r:id="rIdzbwcfltfq7qsuaggfq-or">
+      <w:hyperlink w:history="1" r:id="rIdeh-7jltszp-tvmr2drlfk">
         <w:r>
           <w:t xml:space="preserve">Numerical treatment of radiation processes in the internal shocks of magnetized relativistic outflows</w:t>
         </w:r>
@@ -1429,7 +1429,7 @@
       <w:r>
         <w:t xml:space="preserve">, </w:t>
       </w:r>
-      <w:hyperlink w:history="1" r:id="rIdrsr0uq42dib-ra6vimg2p">
+      <w:hyperlink w:history="1" r:id="rId_j-2zsfbwslvh1a7l6upx">
         <w:r>
           <w:t xml:space="preserve">ApJ 976, 182 (2024)</w:t>
         </w:r>
@@ -1437,7 +1437,7 @@
       <w:r>
         <w:t xml:space="preserve">, </w:t>
       </w:r>
-      <w:hyperlink w:history="1" r:id="rIdktcaamsniha5od6yrufei">
+      <w:hyperlink w:history="1" r:id="rIdlbareftuvdfmcdtpakvid">
         <w:r>
           <w:t xml:space="preserve">arXiv:2405.17581</w:t>
         </w:r>
@@ -1474,7 +1474,7 @@
       <w:r>
         <w:t xml:space="preserve">, </w:t>
       </w:r>
-      <w:hyperlink w:history="1" r:id="rIdgohh1y-1_wazdb9exa55h">
+      <w:hyperlink w:history="1" r:id="rIdv6oenr3releypro5szoiy">
         <w:r>
           <w:t xml:space="preserve">MNRAS 513, 5766–5779 (2022)</w:t>
         </w:r>
@@ -1482,7 +1482,7 @@
       <w:r>
         <w:t xml:space="preserve">, </w:t>
       </w:r>
-      <w:hyperlink w:history="1" r:id="rId56ldxruxf5ovcpal2resh">
+      <w:hyperlink w:history="1" r:id="rIdppdqwvf78klycybzscgnn">
         <w:r>
           <w:t xml:space="preserve">arXiv:2201.07790</w:t>
         </w:r>
@@ -1519,7 +1519,7 @@
       <w:r>
         <w:t xml:space="preserve">, </w:t>
       </w:r>
-      <w:hyperlink w:history="1" r:id="rId2idswsk4nyxbwx5vxyhwu">
+      <w:hyperlink w:history="1" r:id="rIdwcknq9h7-m2cugkg4uw4y">
         <w:r>
           <w:t xml:space="preserve">Phys. Rev. D 106, 083015 (2022)</w:t>
         </w:r>
@@ -1527,7 +1527,7 @@
       <w:r>
         <w:t xml:space="preserve">, </w:t>
       </w:r>
-      <w:hyperlink w:history="1" r:id="rIddrdpdhjjgjtktbbrqakbg">
+      <w:hyperlink w:history="1" r:id="rIdqqeyifh_4el0oxjm0zwqh">
         <w:r>
           <w:t xml:space="preserve">arXiv:2112.09817</w:t>
         </w:r>
@@ -1564,7 +1564,7 @@
       <w:r>
         <w:t xml:space="preserve">, </w:t>
       </w:r>
-      <w:hyperlink w:history="1" r:id="rIdudslztoqwtfljbie6u7pm">
+      <w:hyperlink w:history="1" r:id="rIdl5guwrtfywuu63h2wzt3m">
         <w:r>
           <w:t xml:space="preserve">ApJ 919, 95 (2021)</w:t>
         </w:r>
@@ -1572,7 +1572,7 @@
       <w:r>
         <w:t xml:space="preserve">, </w:t>
       </w:r>
-      <w:hyperlink w:history="1" r:id="rIdq2t9ccw-osks2u9vj5jax">
+      <w:hyperlink w:history="1" r:id="rIdbh-bzyexpifwbfycav5_h">
         <w:r>
           <w:t xml:space="preserve">arXiv:2106.05356</w:t>
         </w:r>
@@ -1609,7 +1609,7 @@
       <w:r>
         <w:t xml:space="preserve">, </w:t>
       </w:r>
-      <w:hyperlink w:history="1" r:id="rIdtm1a8ckb3lawluuuuixl-">
+      <w:hyperlink w:history="1" r:id="rIdcgtv-cfzaow7n869lmpl2">
         <w:r>
           <w:t xml:space="preserve">MNRAS 501, 4092–4102 (2021)</w:t>
         </w:r>
@@ -1617,7 +1617,7 @@
       <w:r>
         <w:t xml:space="preserve">, </w:t>
       </w:r>
-      <w:hyperlink w:history="1" r:id="rIdfs35yzq-zqbjj5uqtbh8u">
+      <w:hyperlink w:history="1" r:id="rIdmg8dv8bdoupgbd2oidhwj">
         <w:r>
           <w:t xml:space="preserve">arXiv:2009.02273</w:t>
         </w:r>
@@ -1654,7 +1654,7 @@
       <w:r>
         <w:t xml:space="preserve">, </w:t>
       </w:r>
-      <w:hyperlink w:history="1" r:id="rId46ksd6bxca2bqnlkq8owy">
+      <w:hyperlink w:history="1" r:id="rIddt0gd1kl5zbjx5rsmvrnm">
         <w:r>
           <w:t xml:space="preserve">MNRAS 496, 974–986 (2020)</w:t>
         </w:r>
@@ -1662,7 +1662,7 @@
       <w:r>
         <w:t xml:space="preserve">, </w:t>
       </w:r>
-      <w:hyperlink w:history="1" r:id="rIdbnhqrqzv6jsaqq5qkrhi-">
+      <w:hyperlink w:history="1" r:id="rIdsvez8_mqqkox3rspumfmv">
         <w:r>
           <w:t xml:space="preserve">arXiv:1910.14049</w:t>
         </w:r>
@@ -1699,7 +1699,7 @@
       <w:r>
         <w:t xml:space="preserve">, </w:t>
       </w:r>
-      <w:hyperlink w:history="1" r:id="rIdc7zp3ahtclxk2owpjppt_">
+      <w:hyperlink w:history="1" r:id="rIdiqd_jcvssdyvu7g4x6xfb">
         <w:r>
           <w:t xml:space="preserve">MNRAS 468, 1169–1182 (2017)</w:t>
         </w:r>
@@ -1707,7 +1707,7 @@
       <w:r>
         <w:t xml:space="preserve">, </w:t>
       </w:r>
-      <w:hyperlink w:history="1" r:id="rIdqxlgc3kyswxd5-6ji-lr6">
+      <w:hyperlink w:history="1" r:id="rId_r5em8znvpage80gjezzp">
         <w:r>
           <w:t xml:space="preserve">arXiv:1612.06383</w:t>
         </w:r>
@@ -1744,7 +1744,7 @@
       <w:r>
         <w:t xml:space="preserve">, </w:t>
       </w:r>
-      <w:hyperlink w:history="1" r:id="rIdl_ka3iosigebrdxet98v6">
+      <w:hyperlink w:history="1" r:id="rIddu1ghx0aw_kxe35jdhjdx">
         <w:r>
           <w:t xml:space="preserve">MNRAS 438, 1856–1869 (2014)</w:t>
         </w:r>
@@ -1752,7 +1752,7 @@
       <w:r>
         <w:t xml:space="preserve">, </w:t>
       </w:r>
-      <w:hyperlink w:history="1" r:id="rIdloiodiiu444mmzdvk6gsd">
+      <w:hyperlink w:history="1" r:id="rIdc5qp1oxf7mi_ejyjk0lwi">
         <w:r>
           <w:t xml:space="preserve">arXiv:1310.5441</w:t>
         </w:r>
@@ -1789,7 +1789,7 @@
       <w:r>
         <w:t xml:space="preserve">, </w:t>
       </w:r>
-      <w:hyperlink w:history="1" r:id="rIdfafhaqabzno8bfvlcekod">
+      <w:hyperlink w:history="1" r:id="rIdhlyh55whdza0wpbwvqyju">
         <w:r>
           <w:t xml:space="preserve">Phys. Rev. D 80, 084023 (2009)</w:t>
         </w:r>
@@ -1797,7 +1797,7 @@
       <w:r>
         <w:t xml:space="preserve">, </w:t>
       </w:r>
-      <w:hyperlink w:history="1" r:id="rIdlnvcym8ulmh-ohgyxrb11">
+      <w:hyperlink w:history="1" r:id="rId3x2suso1x7hi3d5wqfsmc">
         <w:r>
           <w:t xml:space="preserve">arXiv:1009.1250</w:t>
         </w:r>
@@ -1842,7 +1842,7 @@
       <w:r>
         <w:t xml:space="preserve">, </w:t>
       </w:r>
-      <w:hyperlink w:history="1" r:id="rId7ojmoqfx8byfale6k0xow">
+      <w:hyperlink w:history="1" r:id="rIduyrybyik_4eldrynjxghv">
         <w:r>
           <w:t xml:space="preserve">Astron. Nachr. 342, 277–282 (2021)</w:t>
         </w:r>
@@ -1850,7 +1850,7 @@
       <w:r>
         <w:t xml:space="preserve">, 9th International Workshop on Astronomy and Relativistic Astrophysics, </w:t>
       </w:r>
-      <w:hyperlink w:history="1" r:id="rIdh5q126nbnqwwz2zp5cajq">
+      <w:hyperlink w:history="1" r:id="rIdnkff4xlihxrc4kjbsqitc">
         <w:r>
           <w:t xml:space="preserve">arXiv:2011.13797</w:t>
         </w:r>
@@ -1887,7 +1887,7 @@
       <w:r>
         <w:t xml:space="preserve">, </w:t>
       </w:r>
-      <w:hyperlink w:history="1" r:id="rIdkvg97xqg5ozlnxpt8qmsi">
+      <w:hyperlink w:history="1" r:id="rIdre7qoexqnpyewybwoqhkn">
         <w:r>
           <w:t xml:space="preserve">Astron. Nachr. 342, 147–152 (2021)</w:t>
         </w:r>
@@ -1895,7 +1895,7 @@
       <w:r>
         <w:t xml:space="preserve">, 9th International Workshop on Astronomy and Relativistic Astrophysics, </w:t>
       </w:r>
-      <w:hyperlink w:history="1" r:id="rId6zfponztvqumb99wwnsi8">
+      <w:hyperlink w:history="1" r:id="rId0f8xl8wrqxfjan09uwl-g">
         <w:r>
           <w:t xml:space="preserve">arXiv:2011.13805</w:t>
         </w:r>
@@ -1932,7 +1932,7 @@
       <w:r>
         <w:t xml:space="preserve">, </w:t>
       </w:r>
-      <w:hyperlink w:history="1" r:id="rIdo7gkuuw1qw2757nka0fty">
+      <w:hyperlink w:history="1" r:id="rIdqjfi7l0zfvpfcqe0wgnkg">
         <w:r>
           <w:t xml:space="preserve">PoS(SWIFT 10) 233, 159 (2014)</w:t>
         </w:r>
@@ -1940,7 +1940,7 @@
       <w:r>
         <w:t xml:space="preserve">, </w:t>
       </w:r>
-      <w:hyperlink w:history="1" r:id="rIdreaxcbfqfxawhierfdlum">
+      <w:hyperlink w:history="1" r:id="rIdvl0dt9nmp38elgbfw9mxi">
         <w:r>
           <w:t xml:space="preserve">arXiv:1502.07882</w:t>
         </w:r>
@@ -1977,7 +1977,7 @@
       <w:r>
         <w:t xml:space="preserve">, </w:t>
       </w:r>
-      <w:hyperlink w:history="1" r:id="rIdotkjey5eklpxibbh6d6ri">
+      <w:hyperlink w:history="1" r:id="rIdrynzrykakzark61eh0hoa">
         <w:r>
           <w:t xml:space="preserve">EPJ Web Conf. 61, 02007 (2013)</w:t>
         </w:r>
@@ -1985,7 +1985,7 @@
       <w:r>
         <w:t xml:space="preserve">, </w:t>
       </w:r>
-      <w:hyperlink w:history="1" r:id="rIdhb62ppzxhtowrhtz9q066">
+      <w:hyperlink w:history="1" r:id="rId7do4n5bzcbt8p4jhnfgqv">
         <w:r>
           <w:t xml:space="preserve">arXiv:1309.4612</w:t>
         </w:r>
@@ -2022,7 +2022,7 @@
       <w:r>
         <w:t xml:space="preserve">, </w:t>
       </w:r>
-      <w:hyperlink w:history="1" r:id="rIdvxb8gvr66gq7xdoqw2mc3">
+      <w:hyperlink w:history="1" r:id="rIdl-lnixm0pc74s2-ec1px7">
         <w:r>
           <w:t xml:space="preserve">J. Phys.: Conf. Ser. 454, 012001 (2013)</w:t>
         </w:r>
@@ -2030,7 +2030,7 @@
       <w:r>
         <w:t xml:space="preserve">, </w:t>
       </w:r>
-      <w:hyperlink w:history="1" r:id="rId3fad8rddsg_ilgvs3ymjg">
+      <w:hyperlink w:history="1" r:id="rId3jvqjmgplb4r7wlni1f9d">
         <w:r>
           <w:t xml:space="preserve">arXiv:1211.1794</w:t>
         </w:r>
@@ -2433,7 +2433,7 @@
       <w:r>
         <w:tab/>
       </w:r>
-      <w:hyperlink w:history="1" r:id="rIdk_6nd-mn8apxh3fw-c94d">
+      <w:hyperlink w:history="1" r:id="rIdqxl5g-1cjacedw3ttlpae">
         <w:r>
           <w:t xml:space="preserve">github.com/altjerue/ilwikak-ml</w:t>
         </w:r>
@@ -2524,7 +2524,7 @@
       <w:r>
         <w:tab/>
       </w:r>
-      <w:hyperlink w:history="1" r:id="rIdsvhqsbhy0kch-gqjfxhcv">
+      <w:hyperlink w:history="1" r:id="rIdxwr-cmicxhw0q17sq38qx">
         <w:r>
           <w:t xml:space="preserve">github.com/UW-ForestMycobiomeLab/WindSporesHills</w:t>
         </w:r>
@@ -2589,7 +2589,7 @@
       <w:r>
         <w:tab/>
       </w:r>
-      <w:hyperlink w:history="1" r:id="rIdazzgmszmtmaleqenw8esl">
+      <w:hyperlink w:history="1" r:id="rIdchs-tviy7xletfwknhzcs">
         <w:r>
           <w:t xml:space="preserve">github.com/zkdavis/Tleco</w:t>
         </w:r>
@@ -2654,7 +2654,7 @@
       <w:r>
         <w:tab/>
       </w:r>
-      <w:hyperlink w:history="1" r:id="rIdgouyja_xfba6spx5pryfo">
+      <w:hyperlink w:history="1" r:id="rIdjym8odfgrhszaeho0jlsd">
         <w:r>
           <w:t xml:space="preserve">github.com/altjerue/paramo</w:t>
         </w:r>
@@ -3265,7 +3265,7 @@
       <w:r>
         <w:t xml:space="preserve">Video: </w:t>
       </w:r>
-      <w:hyperlink w:history="1" r:id="rIdlf0kw26-8cf4rw4zrsre-">
+      <w:hyperlink w:history="1" r:id="rIdzcxstumwqrlrfcbkfcjzh">
         <w:r>
           <w:t xml:space="preserve">youtube.com/watch?v=BAZNWLNT69M</w:t>
         </w:r>
@@ -3436,7 +3436,7 @@
       <w:r>
         <w:t xml:space="preserve">Marcos Moshinsky Award for Best Poster. Video: </w:t>
       </w:r>
-      <w:hyperlink w:history="1" r:id="rId2t_pl_b03ypxytkdlb3lg">
+      <w:hyperlink w:history="1" r:id="rIdssm_ukwoyic26j9nosfuk">
         <w:r>
           <w:t xml:space="preserve">youtube.com/watch?v=0TJiKg7kOPI</w:t>
         </w:r>
@@ -4494,7 +4494,7 @@
       <w:pPr>
         <w:spacing w:after="0"/>
       </w:pPr>
-      <w:hyperlink w:history="1" r:id="rIdehsukn7s6rh9mmfykmscd">
+      <w:hyperlink w:history="1" r:id="rIdkxqenhjcdaba3o8lil3kz">
         <w:r>
           <w:t xml:space="preserve">mexiciencia.github.io/post/anita</w:t>
         </w:r>
@@ -4554,7 +4554,7 @@
       <w:pPr>
         <w:spacing w:after="0"/>
       </w:pPr>
-      <w:hyperlink w:history="1" r:id="rIdeyntodw9jbt1deaiilche">
+      <w:hyperlink w:history="1" r:id="rIdutxj3r7arvkbwjuc5bzpw">
         <w:r>
           <w:t xml:space="preserve">mexiciencia.github.io/post/modelo-sir</w:t>
         </w:r>
@@ -4617,7 +4617,7 @@
       <w:r>
         <w:t xml:space="preserve">Data analysis and modeling collaborator. </w:t>
       </w:r>
-      <w:hyperlink w:history="1" r:id="rIdairuc3qf2k7ooo_ssjaa7">
+      <w:hyperlink w:history="1" r:id="rIdjd42uzdoewihl0y41fxwz">
         <w:r>
           <w:t xml:space="preserve">mexiciencia.github.io/post/covid19</w:t>
         </w:r>

</xml_diff>

<commit_message>
Describe the Tleco emulator as in progress
Co-Authored-By: Claude Sonnet 5.5 <noreply@anthropic.com>
</commit_message>
<xml_diff>
--- a/RuedaBecerrilJM-CV-plain.docx
+++ b/RuedaBecerrilJM-CV-plain.docx
@@ -28,7 +28,7 @@
       <w:r>
         <w:t xml:space="preserve">  |  </w:t>
       </w:r>
-      <w:hyperlink w:history="1" r:id="rIdhvztz-26_0s0kojb7on6t">
+      <w:hyperlink w:history="1" r:id="rId8_efjf_5dfsv6b84knwxn">
         <w:r>
           <w:t xml:space="preserve">jm.ruebe@gmail.com</w:t>
         </w:r>
@@ -42,7 +42,7 @@
       <w:r>
         <w:t xml:space="preserve">  |  </w:t>
       </w:r>
-      <w:hyperlink w:history="1" r:id="rIdldsxzatzxuzro9go5yprh">
+      <w:hyperlink w:history="1" r:id="rIdwgfj8hmfmzvmkb-chedjq">
         <w:r>
           <w:t xml:space="preserve">linkedin.com/in/jeruebe</w:t>
         </w:r>
@@ -53,7 +53,7 @@
         <w:spacing w:after="60"/>
         <w:jc w:val="center"/>
       </w:pPr>
-      <w:hyperlink w:history="1" r:id="rId2r3mv8men87mys0xqfx3n">
+      <w:hyperlink w:history="1" r:id="rIddocahuumkkuxh9rjdm-my">
         <w:r>
           <w:t xml:space="preserve">altjerue.github.io</w:t>
         </w:r>
@@ -61,7 +61,7 @@
       <w:r>
         <w:t xml:space="preserve">  |  </w:t>
       </w:r>
-      <w:hyperlink w:history="1" r:id="rIdwslkrnsjbp_b0vb2xmaos">
+      <w:hyperlink w:history="1" r:id="rIdd9njcigzuasn5av7q4fjd">
         <w:r>
           <w:t xml:space="preserve">github.com/altjerue</w:t>
         </w:r>
@@ -69,7 +69,7 @@
       <w:r>
         <w:t xml:space="preserve">  |  </w:t>
       </w:r>
-      <w:hyperlink w:history="1" r:id="rIdeplhgem6wv_xrpsodg7pk">
+      <w:hyperlink w:history="1" r:id="rIdxuzagrojqqw_8fkt47yon">
         <w:r>
           <w:t xml:space="preserve">orcid.org/0000-0003-1988-1912</w:t>
         </w:r>
@@ -77,7 +77,7 @@
       <w:r>
         <w:t xml:space="preserve">  |  </w:t>
       </w:r>
-      <w:hyperlink w:history="1" r:id="rIdpe9t2uxa6rih_lhz6dvkm">
+      <w:hyperlink w:history="1" r:id="rIdib2k8gtdbtp4p_poy8zqj">
         <w:r>
           <w:t xml:space="preserve">Google Scholar</w:t>
         </w:r>
@@ -1132,7 +1132,7 @@
       <w:r>
         <w:t xml:space="preserve">Thesis: </w:t>
       </w:r>
-      <w:hyperlink w:history="1" r:id="rIdeh-7jltszp-tvmr2drlfk">
+      <w:hyperlink w:history="1" r:id="rIdoybegte3csr7xbzyl9wg0">
         <w:r>
           <w:t xml:space="preserve">Numerical treatment of radiation processes in the internal shocks of magnetized relativistic outflows</w:t>
         </w:r>
@@ -1429,7 +1429,7 @@
       <w:r>
         <w:t xml:space="preserve">, </w:t>
       </w:r>
-      <w:hyperlink w:history="1" r:id="rId_j-2zsfbwslvh1a7l6upx">
+      <w:hyperlink w:history="1" r:id="rIdljvvcopyusnagp2xymojf">
         <w:r>
           <w:t xml:space="preserve">ApJ 976, 182 (2024)</w:t>
         </w:r>
@@ -1437,7 +1437,7 @@
       <w:r>
         <w:t xml:space="preserve">, </w:t>
       </w:r>
-      <w:hyperlink w:history="1" r:id="rIdlbareftuvdfmcdtpakvid">
+      <w:hyperlink w:history="1" r:id="rId5pravndbphc69-zibu_zf">
         <w:r>
           <w:t xml:space="preserve">arXiv:2405.17581</w:t>
         </w:r>
@@ -1474,7 +1474,7 @@
       <w:r>
         <w:t xml:space="preserve">, </w:t>
       </w:r>
-      <w:hyperlink w:history="1" r:id="rIdv6oenr3releypro5szoiy">
+      <w:hyperlink w:history="1" r:id="rIdj6huerg3ozdppkc-l5fr5">
         <w:r>
           <w:t xml:space="preserve">MNRAS 513, 5766–5779 (2022)</w:t>
         </w:r>
@@ -1482,7 +1482,7 @@
       <w:r>
         <w:t xml:space="preserve">, </w:t>
       </w:r>
-      <w:hyperlink w:history="1" r:id="rIdppdqwvf78klycybzscgnn">
+      <w:hyperlink w:history="1" r:id="rIdxfe-t2h4ndmegcokbjwfc">
         <w:r>
           <w:t xml:space="preserve">arXiv:2201.07790</w:t>
         </w:r>
@@ -1519,7 +1519,7 @@
       <w:r>
         <w:t xml:space="preserve">, </w:t>
       </w:r>
-      <w:hyperlink w:history="1" r:id="rIdwcknq9h7-m2cugkg4uw4y">
+      <w:hyperlink w:history="1" r:id="rIdqj6al-bb61imzmea6bshq">
         <w:r>
           <w:t xml:space="preserve">Phys. Rev. D 106, 083015 (2022)</w:t>
         </w:r>
@@ -1527,7 +1527,7 @@
       <w:r>
         <w:t xml:space="preserve">, </w:t>
       </w:r>
-      <w:hyperlink w:history="1" r:id="rIdqqeyifh_4el0oxjm0zwqh">
+      <w:hyperlink w:history="1" r:id="rId1qotcnmaml2llsmhxxgtt">
         <w:r>
           <w:t xml:space="preserve">arXiv:2112.09817</w:t>
         </w:r>
@@ -1564,7 +1564,7 @@
       <w:r>
         <w:t xml:space="preserve">, </w:t>
       </w:r>
-      <w:hyperlink w:history="1" r:id="rIdl5guwrtfywuu63h2wzt3m">
+      <w:hyperlink w:history="1" r:id="rIdwhhi0opono7i1y5pzfrir">
         <w:r>
           <w:t xml:space="preserve">ApJ 919, 95 (2021)</w:t>
         </w:r>
@@ -1572,7 +1572,7 @@
       <w:r>
         <w:t xml:space="preserve">, </w:t>
       </w:r>
-      <w:hyperlink w:history="1" r:id="rIdbh-bzyexpifwbfycav5_h">
+      <w:hyperlink w:history="1" r:id="rIdacspyyh93v94luujh9cqo">
         <w:r>
           <w:t xml:space="preserve">arXiv:2106.05356</w:t>
         </w:r>
@@ -1609,7 +1609,7 @@
       <w:r>
         <w:t xml:space="preserve">, </w:t>
       </w:r>
-      <w:hyperlink w:history="1" r:id="rIdcgtv-cfzaow7n869lmpl2">
+      <w:hyperlink w:history="1" r:id="rIdfruexyvxqgxqdmxtjfap4">
         <w:r>
           <w:t xml:space="preserve">MNRAS 501, 4092–4102 (2021)</w:t>
         </w:r>
@@ -1617,7 +1617,7 @@
       <w:r>
         <w:t xml:space="preserve">, </w:t>
       </w:r>
-      <w:hyperlink w:history="1" r:id="rIdmg8dv8bdoupgbd2oidhwj">
+      <w:hyperlink w:history="1" r:id="rIdotuyfxrxzi96xofn3c1t2">
         <w:r>
           <w:t xml:space="preserve">arXiv:2009.02273</w:t>
         </w:r>
@@ -1654,7 +1654,7 @@
       <w:r>
         <w:t xml:space="preserve">, </w:t>
       </w:r>
-      <w:hyperlink w:history="1" r:id="rIddt0gd1kl5zbjx5rsmvrnm">
+      <w:hyperlink w:history="1" r:id="rIdqwshhqpawzfduzgoxo7qu">
         <w:r>
           <w:t xml:space="preserve">MNRAS 496, 974–986 (2020)</w:t>
         </w:r>
@@ -1662,7 +1662,7 @@
       <w:r>
         <w:t xml:space="preserve">, </w:t>
       </w:r>
-      <w:hyperlink w:history="1" r:id="rIdsvez8_mqqkox3rspumfmv">
+      <w:hyperlink w:history="1" r:id="rIdwgdzfvkanap1ibdtswd1m">
         <w:r>
           <w:t xml:space="preserve">arXiv:1910.14049</w:t>
         </w:r>
@@ -1699,7 +1699,7 @@
       <w:r>
         <w:t xml:space="preserve">, </w:t>
       </w:r>
-      <w:hyperlink w:history="1" r:id="rIdiqd_jcvssdyvu7g4x6xfb">
+      <w:hyperlink w:history="1" r:id="rIdsfnbyixbi2jryokoejq7c">
         <w:r>
           <w:t xml:space="preserve">MNRAS 468, 1169–1182 (2017)</w:t>
         </w:r>
@@ -1707,7 +1707,7 @@
       <w:r>
         <w:t xml:space="preserve">, </w:t>
       </w:r>
-      <w:hyperlink w:history="1" r:id="rId_r5em8znvpage80gjezzp">
+      <w:hyperlink w:history="1" r:id="rIdqekgyjytzsbavj48dct8z">
         <w:r>
           <w:t xml:space="preserve">arXiv:1612.06383</w:t>
         </w:r>
@@ -1744,7 +1744,7 @@
       <w:r>
         <w:t xml:space="preserve">, </w:t>
       </w:r>
-      <w:hyperlink w:history="1" r:id="rIddu1ghx0aw_kxe35jdhjdx">
+      <w:hyperlink w:history="1" r:id="rIdipizyxxxfkgikjii6lops">
         <w:r>
           <w:t xml:space="preserve">MNRAS 438, 1856–1869 (2014)</w:t>
         </w:r>
@@ -1752,7 +1752,7 @@
       <w:r>
         <w:t xml:space="preserve">, </w:t>
       </w:r>
-      <w:hyperlink w:history="1" r:id="rIdc5qp1oxf7mi_ejyjk0lwi">
+      <w:hyperlink w:history="1" r:id="rId3kdmheppc3d3tdkar4uwj">
         <w:r>
           <w:t xml:space="preserve">arXiv:1310.5441</w:t>
         </w:r>
@@ -1789,7 +1789,7 @@
       <w:r>
         <w:t xml:space="preserve">, </w:t>
       </w:r>
-      <w:hyperlink w:history="1" r:id="rIdhlyh55whdza0wpbwvqyju">
+      <w:hyperlink w:history="1" r:id="rIdkxzhhyyuexksd6ocatlqk">
         <w:r>
           <w:t xml:space="preserve">Phys. Rev. D 80, 084023 (2009)</w:t>
         </w:r>
@@ -1797,7 +1797,7 @@
       <w:r>
         <w:t xml:space="preserve">, </w:t>
       </w:r>
-      <w:hyperlink w:history="1" r:id="rId3x2suso1x7hi3d5wqfsmc">
+      <w:hyperlink w:history="1" r:id="rId9kl2pg77khh2atarf86yv">
         <w:r>
           <w:t xml:space="preserve">arXiv:1009.1250</w:t>
         </w:r>
@@ -1842,7 +1842,7 @@
       <w:r>
         <w:t xml:space="preserve">, </w:t>
       </w:r>
-      <w:hyperlink w:history="1" r:id="rIduyrybyik_4eldrynjxghv">
+      <w:hyperlink w:history="1" r:id="rId8nqitpj-oltk0omuknwen">
         <w:r>
           <w:t xml:space="preserve">Astron. Nachr. 342, 277–282 (2021)</w:t>
         </w:r>
@@ -1850,7 +1850,7 @@
       <w:r>
         <w:t xml:space="preserve">, 9th International Workshop on Astronomy and Relativistic Astrophysics, </w:t>
       </w:r>
-      <w:hyperlink w:history="1" r:id="rIdnkff4xlihxrc4kjbsqitc">
+      <w:hyperlink w:history="1" r:id="rIdzhmidgchzaq1kaa9_ipuh">
         <w:r>
           <w:t xml:space="preserve">arXiv:2011.13797</w:t>
         </w:r>
@@ -1887,7 +1887,7 @@
       <w:r>
         <w:t xml:space="preserve">, </w:t>
       </w:r>
-      <w:hyperlink w:history="1" r:id="rIdre7qoexqnpyewybwoqhkn">
+      <w:hyperlink w:history="1" r:id="rId4mkz3814mumvzv_yq7gky">
         <w:r>
           <w:t xml:space="preserve">Astron. Nachr. 342, 147–152 (2021)</w:t>
         </w:r>
@@ -1895,7 +1895,7 @@
       <w:r>
         <w:t xml:space="preserve">, 9th International Workshop on Astronomy and Relativistic Astrophysics, </w:t>
       </w:r>
-      <w:hyperlink w:history="1" r:id="rId0f8xl8wrqxfjan09uwl-g">
+      <w:hyperlink w:history="1" r:id="rIdpf8rkvvkudjqlcdfw0in3">
         <w:r>
           <w:t xml:space="preserve">arXiv:2011.13805</w:t>
         </w:r>
@@ -1932,7 +1932,7 @@
       <w:r>
         <w:t xml:space="preserve">, </w:t>
       </w:r>
-      <w:hyperlink w:history="1" r:id="rIdqjfi7l0zfvpfcqe0wgnkg">
+      <w:hyperlink w:history="1" r:id="rIdzfukurfk_hq0qdi41jba_">
         <w:r>
           <w:t xml:space="preserve">PoS(SWIFT 10) 233, 159 (2014)</w:t>
         </w:r>
@@ -1940,7 +1940,7 @@
       <w:r>
         <w:t xml:space="preserve">, </w:t>
       </w:r>
-      <w:hyperlink w:history="1" r:id="rIdvl0dt9nmp38elgbfw9mxi">
+      <w:hyperlink w:history="1" r:id="rIdg8p3qjdm2ibwzjep4ciji">
         <w:r>
           <w:t xml:space="preserve">arXiv:1502.07882</w:t>
         </w:r>
@@ -1977,7 +1977,7 @@
       <w:r>
         <w:t xml:space="preserve">, </w:t>
       </w:r>
-      <w:hyperlink w:history="1" r:id="rIdrynzrykakzark61eh0hoa">
+      <w:hyperlink w:history="1" r:id="rIdrhfyuvuxacous5n3rwb6a">
         <w:r>
           <w:t xml:space="preserve">EPJ Web Conf. 61, 02007 (2013)</w:t>
         </w:r>
@@ -1985,7 +1985,7 @@
       <w:r>
         <w:t xml:space="preserve">, </w:t>
       </w:r>
-      <w:hyperlink w:history="1" r:id="rId7do4n5bzcbt8p4jhnfgqv">
+      <w:hyperlink w:history="1" r:id="rIdgfo4qxmj6ltwrzxwucoue">
         <w:r>
           <w:t xml:space="preserve">arXiv:1309.4612</w:t>
         </w:r>
@@ -2022,7 +2022,7 @@
       <w:r>
         <w:t xml:space="preserve">, </w:t>
       </w:r>
-      <w:hyperlink w:history="1" r:id="rIdl-lnixm0pc74s2-ec1px7">
+      <w:hyperlink w:history="1" r:id="rIdadzrqpddrzztgycyxa174">
         <w:r>
           <w:t xml:space="preserve">J. Phys.: Conf. Ser. 454, 012001 (2013)</w:t>
         </w:r>
@@ -2030,7 +2030,7 @@
       <w:r>
         <w:t xml:space="preserve">, </w:t>
       </w:r>
-      <w:hyperlink w:history="1" r:id="rId3jvqjmgplb4r7wlni1f9d">
+      <w:hyperlink w:history="1" r:id="rIdwmxf2lad0wbw_1f8levf9">
         <w:r>
           <w:t xml:space="preserve">arXiv:1211.1794</w:t>
         </w:r>
@@ -2433,7 +2433,7 @@
       <w:r>
         <w:tab/>
       </w:r>
-      <w:hyperlink w:history="1" r:id="rIdqxl5g-1cjacedw3ttlpae">
+      <w:hyperlink w:history="1" r:id="rId1yimyyxj_hpy9r5zl8jzq">
         <w:r>
           <w:t xml:space="preserve">github.com/altjerue/ilwikak-ml</w:t>
         </w:r>
@@ -2524,7 +2524,7 @@
       <w:r>
         <w:tab/>
       </w:r>
-      <w:hyperlink w:history="1" r:id="rIdxwr-cmicxhw0q17sq38qx">
+      <w:hyperlink w:history="1" r:id="rIdxu-i5bqs8zoam2pxpu6bk">
         <w:r>
           <w:t xml:space="preserve">github.com/UW-ForestMycobiomeLab/WindSporesHills</w:t>
         </w:r>
@@ -2589,7 +2589,7 @@
       <w:r>
         <w:tab/>
       </w:r>
-      <w:hyperlink w:history="1" r:id="rIdchs-tviy7xletfwknhzcs">
+      <w:hyperlink w:history="1" r:id="rIdorb7xy-i3n81kilhlosis">
         <w:r>
           <w:t xml:space="preserve">github.com/zkdavis/Tleco</w:t>
         </w:r>
@@ -2654,7 +2654,7 @@
       <w:r>
         <w:tab/>
       </w:r>
-      <w:hyperlink w:history="1" r:id="rIdjym8odfgrhszaeho0jlsd">
+      <w:hyperlink w:history="1" r:id="rIdcg1fpmco_t9fagdjlujij">
         <w:r>
           <w:t xml:space="preserve">github.com/altjerue/paramo</w:t>
         </w:r>
@@ -3265,7 +3265,7 @@
       <w:r>
         <w:t xml:space="preserve">Video: </w:t>
       </w:r>
-      <w:hyperlink w:history="1" r:id="rIdzcxstumwqrlrfcbkfcjzh">
+      <w:hyperlink w:history="1" r:id="rIdrh0ruunrddevjh-hkfnd5">
         <w:r>
           <w:t xml:space="preserve">youtube.com/watch?v=BAZNWLNT69M</w:t>
         </w:r>
@@ -3436,7 +3436,7 @@
       <w:r>
         <w:t xml:space="preserve">Marcos Moshinsky Award for Best Poster. Video: </w:t>
       </w:r>
-      <w:hyperlink w:history="1" r:id="rIdssm_ukwoyic26j9nosfuk">
+      <w:hyperlink w:history="1" r:id="rIdjzeo5s09ycovhhtlkhhzu">
         <w:r>
           <w:t xml:space="preserve">youtube.com/watch?v=0TJiKg7kOPI</w:t>
         </w:r>
@@ -4494,7 +4494,7 @@
       <w:pPr>
         <w:spacing w:after="0"/>
       </w:pPr>
-      <w:hyperlink w:history="1" r:id="rIdkxqenhjcdaba3o8lil3kz">
+      <w:hyperlink w:history="1" r:id="rId-nfswjzfi2iz1mvw9dq9s">
         <w:r>
           <w:t xml:space="preserve">mexiciencia.github.io/post/anita</w:t>
         </w:r>
@@ -4554,7 +4554,7 @@
       <w:pPr>
         <w:spacing w:after="0"/>
       </w:pPr>
-      <w:hyperlink w:history="1" r:id="rIdutxj3r7arvkbwjuc5bzpw">
+      <w:hyperlink w:history="1" r:id="rIdkamoipdqm0nd7nj8ucswt">
         <w:r>
           <w:t xml:space="preserve">mexiciencia.github.io/post/modelo-sir</w:t>
         </w:r>
@@ -4617,7 +4617,7 @@
       <w:r>
         <w:t xml:space="preserve">Data analysis and modeling collaborator. </w:t>
       </w:r>
-      <w:hyperlink w:history="1" r:id="rIdjd42uzdoewihl0y41fxwz">
+      <w:hyperlink w:history="1" r:id="rIdypzta36dfgk7vmnrp5aat">
         <w:r>
           <w:t xml:space="preserve">mexiciencia.github.io/post/covid19</w:t>
         </w:r>

</xml_diff>

<commit_message>
Drop the 20x speedup claim from the Paramo bullets; rebuild outputs
Co-Authored-By: Claude Sonnet 5.5 <noreply@anthropic.com>
</commit_message>
<xml_diff>
--- a/RuedaBecerrilJM-CV-plain.docx
+++ b/RuedaBecerrilJM-CV-plain.docx
@@ -28,7 +28,7 @@
       <w:r>
         <w:t xml:space="preserve">  |  </w:t>
       </w:r>
-      <w:hyperlink w:history="1" r:id="rIdnocgd9f8wbc6lsbqtkk97">
+      <w:hyperlink w:history="1" r:id="rIdb5rv_ovafbzdim_nzmycm">
         <w:r>
           <w:t xml:space="preserve">jm.ruebe@gmail.com</w:t>
         </w:r>
@@ -42,7 +42,7 @@
       <w:r>
         <w:t xml:space="preserve">  |  </w:t>
       </w:r>
-      <w:hyperlink w:history="1" r:id="rIdikzp3cgza6dsp-9sv6paf">
+      <w:hyperlink w:history="1" r:id="rIdffmjobnnwhe9blaxfjuxh">
         <w:r>
           <w:t xml:space="preserve">linkedin.com/in/jeruebe</w:t>
         </w:r>
@@ -53,7 +53,7 @@
         <w:spacing w:after="60"/>
         <w:jc w:val="center"/>
       </w:pPr>
-      <w:hyperlink w:history="1" r:id="rId5qahgcwlzazrowgxagot7">
+      <w:hyperlink w:history="1" r:id="rIdsflvujd3ab_tpfeoiwjsa">
         <w:r>
           <w:t xml:space="preserve">altjerue.github.io</w:t>
         </w:r>
@@ -61,7 +61,7 @@
       <w:r>
         <w:t xml:space="preserve">  |  </w:t>
       </w:r>
-      <w:hyperlink w:history="1" r:id="rIdmrerjyoeaovxd2ommr3q3">
+      <w:hyperlink w:history="1" r:id="rIdlbtfdte33mavzkuim65h7">
         <w:r>
           <w:t xml:space="preserve">github.com/altjerue</w:t>
         </w:r>
@@ -69,7 +69,7 @@
       <w:r>
         <w:t xml:space="preserve">  |  </w:t>
       </w:r>
-      <w:hyperlink w:history="1" r:id="rIdqvdruvdjg3hrnsucgqytb">
+      <w:hyperlink w:history="1" r:id="rId6rzud3qco_kj3srjtaprb">
         <w:r>
           <w:t xml:space="preserve">orcid.org/0000-0003-1988-1912</w:t>
         </w:r>
@@ -77,7 +77,7 @@
       <w:r>
         <w:t xml:space="preserve">  |  </w:t>
       </w:r>
-      <w:hyperlink w:history="1" r:id="rId8regwekmydljyhsc58fsu">
+      <w:hyperlink w:history="1" r:id="rIdme1ip1nnexoeqqwbqn_cf">
         <w:r>
           <w:t xml:space="preserve">Google Scholar</w:t>
         </w:r>
@@ -772,7 +772,7 @@
         <w:spacing w:after="10"/>
       </w:pPr>
       <w:r>
-        <w:t xml:space="preserve">Architected Paramo, an open-source Fortran 95 library that solves the Fokker–Planck equation coupled to radiative transfer; parallelized and optimized it with OpenMP, making it about 20× faster than the original serial code on 5 cores.</w:t>
+        <w:t xml:space="preserve">Architected Paramo, an open-source Fortran 95 library that solves the Fokker–Planck equation coupled to radiative transfer; parallelized and optimized it with OpenMP; GPU offload tested with OpenACC.</w:t>
       </w:r>
     </w:p>
     <w:p>
@@ -1132,7 +1132,7 @@
       <w:r>
         <w:t xml:space="preserve">Thesis: </w:t>
       </w:r>
-      <w:hyperlink w:history="1" r:id="rIdtzbx5kuvznow8dhumumrr">
+      <w:hyperlink w:history="1" r:id="rId8pee2un6iivdxsng3mop-">
         <w:r>
           <w:t xml:space="preserve">Numerical treatment of radiation processes in the internal shocks of magnetized relativistic outflows</w:t>
         </w:r>
@@ -1429,7 +1429,7 @@
       <w:r>
         <w:t xml:space="preserve">, </w:t>
       </w:r>
-      <w:hyperlink w:history="1" r:id="rIdcxfvqsi3atpkyovvweyqm">
+      <w:hyperlink w:history="1" r:id="rIddrs5-rp0ws8qnkvrqjl0s">
         <w:r>
           <w:t xml:space="preserve">ApJ 976, 182 (2024)</w:t>
         </w:r>
@@ -1437,7 +1437,7 @@
       <w:r>
         <w:t xml:space="preserve">, </w:t>
       </w:r>
-      <w:hyperlink w:history="1" r:id="rId37e-gopbzz5ujngu3zjb8">
+      <w:hyperlink w:history="1" r:id="rIdxscmjoquaj91lfazdhkyf">
         <w:r>
           <w:t xml:space="preserve">arXiv:2405.17581</w:t>
         </w:r>
@@ -1474,7 +1474,7 @@
       <w:r>
         <w:t xml:space="preserve">, </w:t>
       </w:r>
-      <w:hyperlink w:history="1" r:id="rIdaspenepcbv5zqv4gdolm0">
+      <w:hyperlink w:history="1" r:id="rIdkw-jgmb7zhqc4omnosbcw">
         <w:r>
           <w:t xml:space="preserve">MNRAS 513, 5766–5779 (2022)</w:t>
         </w:r>
@@ -1482,7 +1482,7 @@
       <w:r>
         <w:t xml:space="preserve">, </w:t>
       </w:r>
-      <w:hyperlink w:history="1" r:id="rId1g7kpm-aqqhlvmcthw5zt">
+      <w:hyperlink w:history="1" r:id="rIdtxpmute0otkzkf5pd7grj">
         <w:r>
           <w:t xml:space="preserve">arXiv:2201.07790</w:t>
         </w:r>
@@ -1519,7 +1519,7 @@
       <w:r>
         <w:t xml:space="preserve">, </w:t>
       </w:r>
-      <w:hyperlink w:history="1" r:id="rIdjxfrkeurxnibw_udj0bzi">
+      <w:hyperlink w:history="1" r:id="rIdtl0s0yfxi05mngmhnja8f">
         <w:r>
           <w:t xml:space="preserve">Phys. Rev. D 106, 083015 (2022)</w:t>
         </w:r>
@@ -1527,7 +1527,7 @@
       <w:r>
         <w:t xml:space="preserve">, </w:t>
       </w:r>
-      <w:hyperlink w:history="1" r:id="rIdpmzwzqdq061biyzlidtpf">
+      <w:hyperlink w:history="1" r:id="rId8snp8sifxppdt32gylqwe">
         <w:r>
           <w:t xml:space="preserve">arXiv:2112.09817</w:t>
         </w:r>
@@ -1564,7 +1564,7 @@
       <w:r>
         <w:t xml:space="preserve">, </w:t>
       </w:r>
-      <w:hyperlink w:history="1" r:id="rIdus8k-6irmafs0kdu_y1sz">
+      <w:hyperlink w:history="1" r:id="rIddwctzca4utiiovxgyx8bc">
         <w:r>
           <w:t xml:space="preserve">ApJ 919, 95 (2021)</w:t>
         </w:r>
@@ -1572,7 +1572,7 @@
       <w:r>
         <w:t xml:space="preserve">, </w:t>
       </w:r>
-      <w:hyperlink w:history="1" r:id="rIdalsdtikfrffqcshujsi9r">
+      <w:hyperlink w:history="1" r:id="rId9f6lftg2hqneyyztjiahy">
         <w:r>
           <w:t xml:space="preserve">arXiv:2106.05356</w:t>
         </w:r>
@@ -1609,7 +1609,7 @@
       <w:r>
         <w:t xml:space="preserve">, </w:t>
       </w:r>
-      <w:hyperlink w:history="1" r:id="rId06_u0fr7iwzikctug4v8j">
+      <w:hyperlink w:history="1" r:id="rIdijpzkhymgchjpts_kbyaq">
         <w:r>
           <w:t xml:space="preserve">MNRAS 501, 4092–4102 (2021)</w:t>
         </w:r>
@@ -1617,7 +1617,7 @@
       <w:r>
         <w:t xml:space="preserve">, </w:t>
       </w:r>
-      <w:hyperlink w:history="1" r:id="rIdomwvxajwpey2oyteyobmq">
+      <w:hyperlink w:history="1" r:id="rIdx3vus0iouoj4yf1ceyyzl">
         <w:r>
           <w:t xml:space="preserve">arXiv:2009.02273</w:t>
         </w:r>
@@ -1654,7 +1654,7 @@
       <w:r>
         <w:t xml:space="preserve">, </w:t>
       </w:r>
-      <w:hyperlink w:history="1" r:id="rIdiikp0doukl6sswmzt3nzb">
+      <w:hyperlink w:history="1" r:id="rIdtehvivcrvttrwgb8ttert">
         <w:r>
           <w:t xml:space="preserve">MNRAS 496, 974–986 (2020)</w:t>
         </w:r>
@@ -1662,7 +1662,7 @@
       <w:r>
         <w:t xml:space="preserve">, </w:t>
       </w:r>
-      <w:hyperlink w:history="1" r:id="rIdgzcrkwyfisnn_whqalskq">
+      <w:hyperlink w:history="1" r:id="rIdfccaqgraqs-lgg4lcizt8">
         <w:r>
           <w:t xml:space="preserve">arXiv:1910.14049</w:t>
         </w:r>
@@ -1699,7 +1699,7 @@
       <w:r>
         <w:t xml:space="preserve">, </w:t>
       </w:r>
-      <w:hyperlink w:history="1" r:id="rIdk1gibin8gy_gatvh-73qa">
+      <w:hyperlink w:history="1" r:id="rIdy8frmzit__pxvefesjam2">
         <w:r>
           <w:t xml:space="preserve">MNRAS 468, 1169–1182 (2017)</w:t>
         </w:r>
@@ -1707,7 +1707,7 @@
       <w:r>
         <w:t xml:space="preserve">, </w:t>
       </w:r>
-      <w:hyperlink w:history="1" r:id="rIdild4gg_2makbx8qwxxmhg">
+      <w:hyperlink w:history="1" r:id="rIdzvupzlxycqcey6teedmu_">
         <w:r>
           <w:t xml:space="preserve">arXiv:1612.06383</w:t>
         </w:r>
@@ -1744,7 +1744,7 @@
       <w:r>
         <w:t xml:space="preserve">, </w:t>
       </w:r>
-      <w:hyperlink w:history="1" r:id="rIdhhfmbnj7mpjbpzoqnf8mf">
+      <w:hyperlink w:history="1" r:id="rIdb_cqsp5yfvxel7zzdlmxr">
         <w:r>
           <w:t xml:space="preserve">MNRAS 438, 1856–1869 (2014)</w:t>
         </w:r>
@@ -1752,7 +1752,7 @@
       <w:r>
         <w:t xml:space="preserve">, </w:t>
       </w:r>
-      <w:hyperlink w:history="1" r:id="rIdxzjjz7bnngkn4aopuficf">
+      <w:hyperlink w:history="1" r:id="rIdzbmt19_e-net1crgtezth">
         <w:r>
           <w:t xml:space="preserve">arXiv:1310.5441</w:t>
         </w:r>
@@ -1789,7 +1789,7 @@
       <w:r>
         <w:t xml:space="preserve">, </w:t>
       </w:r>
-      <w:hyperlink w:history="1" r:id="rIdqgetnzf34sc_eownxuqtb">
+      <w:hyperlink w:history="1" r:id="rIdo_-saqnwitfss_uepovzs">
         <w:r>
           <w:t xml:space="preserve">Phys. Rev. D 80, 084023 (2009)</w:t>
         </w:r>
@@ -1797,7 +1797,7 @@
       <w:r>
         <w:t xml:space="preserve">, </w:t>
       </w:r>
-      <w:hyperlink w:history="1" r:id="rIdsrlsogtqlewvvbjvlu9ux">
+      <w:hyperlink w:history="1" r:id="rId6p7yvcfijhsop2syigngv">
         <w:r>
           <w:t xml:space="preserve">arXiv:1009.1250</w:t>
         </w:r>
@@ -1842,7 +1842,7 @@
       <w:r>
         <w:t xml:space="preserve">, </w:t>
       </w:r>
-      <w:hyperlink w:history="1" r:id="rIdwrnm3oiq-ays4t5ik5scp">
+      <w:hyperlink w:history="1" r:id="rIdhikzql0pnendp6h023usc">
         <w:r>
           <w:t xml:space="preserve">Astron. Nachr. 342, 277–282 (2021)</w:t>
         </w:r>
@@ -1850,7 +1850,7 @@
       <w:r>
         <w:t xml:space="preserve">, 9th International Workshop on Astronomy and Relativistic Astrophysics, </w:t>
       </w:r>
-      <w:hyperlink w:history="1" r:id="rIdrc2afsctrjivor-8hvfrh">
+      <w:hyperlink w:history="1" r:id="rIdlhezrxjop0wacoye3o9yf">
         <w:r>
           <w:t xml:space="preserve">arXiv:2011.13797</w:t>
         </w:r>
@@ -1887,7 +1887,7 @@
       <w:r>
         <w:t xml:space="preserve">, </w:t>
       </w:r>
-      <w:hyperlink w:history="1" r:id="rIdr5ueu5dft6iupk3rk3cf7">
+      <w:hyperlink w:history="1" r:id="rIdhormzft8bjmnpzsxouyfe">
         <w:r>
           <w:t xml:space="preserve">Astron. Nachr. 342, 147–152 (2021)</w:t>
         </w:r>
@@ -1895,7 +1895,7 @@
       <w:r>
         <w:t xml:space="preserve">, 9th International Workshop on Astronomy and Relativistic Astrophysics, </w:t>
       </w:r>
-      <w:hyperlink w:history="1" r:id="rId7vbpxazoddrh6glltdlae">
+      <w:hyperlink w:history="1" r:id="rIdhergtagevdhohevofyshs">
         <w:r>
           <w:t xml:space="preserve">arXiv:2011.13805</w:t>
         </w:r>
@@ -1932,7 +1932,7 @@
       <w:r>
         <w:t xml:space="preserve">, </w:t>
       </w:r>
-      <w:hyperlink w:history="1" r:id="rIdwpxur2rjbfxf5j4b7zmnl">
+      <w:hyperlink w:history="1" r:id="rIdbvvx4fktii5vjmbsrd1uy">
         <w:r>
           <w:t xml:space="preserve">PoS(SWIFT 10) 233, 159 (2014)</w:t>
         </w:r>
@@ -1940,7 +1940,7 @@
       <w:r>
         <w:t xml:space="preserve">, </w:t>
       </w:r>
-      <w:hyperlink w:history="1" r:id="rIdunpdqg6htigyxaetdgv7c">
+      <w:hyperlink w:history="1" r:id="rIdlv45eu1zejbzowwz4zcfz">
         <w:r>
           <w:t xml:space="preserve">arXiv:1502.07882</w:t>
         </w:r>
@@ -1977,7 +1977,7 @@
       <w:r>
         <w:t xml:space="preserve">, </w:t>
       </w:r>
-      <w:hyperlink w:history="1" r:id="rId1mc76m7kt40phi4btekqa">
+      <w:hyperlink w:history="1" r:id="rIdt-a1k10yp3ykbvggims_6">
         <w:r>
           <w:t xml:space="preserve">EPJ Web Conf. 61, 02007 (2013)</w:t>
         </w:r>
@@ -1985,7 +1985,7 @@
       <w:r>
         <w:t xml:space="preserve">, </w:t>
       </w:r>
-      <w:hyperlink w:history="1" r:id="rIdjqgnj8qmlkzsuo3jacgap">
+      <w:hyperlink w:history="1" r:id="rIdx-ruleykow65u4kmil3oq">
         <w:r>
           <w:t xml:space="preserve">arXiv:1309.4612</w:t>
         </w:r>
@@ -2022,7 +2022,7 @@
       <w:r>
         <w:t xml:space="preserve">, </w:t>
       </w:r>
-      <w:hyperlink w:history="1" r:id="rIdhpgbyaqgymzxxw8jvf-o4">
+      <w:hyperlink w:history="1" r:id="rIdwgp7ghjx8is39doar8tic">
         <w:r>
           <w:t xml:space="preserve">J. Phys.: Conf. Ser. 454, 012001 (2013)</w:t>
         </w:r>
@@ -2030,7 +2030,7 @@
       <w:r>
         <w:t xml:space="preserve">, </w:t>
       </w:r>
-      <w:hyperlink w:history="1" r:id="rId6qwd8sqba5ju1ht58v_q8">
+      <w:hyperlink w:history="1" r:id="rIddtdojrrc-os4bnp4m-god">
         <w:r>
           <w:t xml:space="preserve">arXiv:1211.1794</w:t>
         </w:r>
@@ -2433,7 +2433,7 @@
       <w:r>
         <w:tab/>
       </w:r>
-      <w:hyperlink w:history="1" r:id="rIdfew3qw6ar0dvcof-chiyt">
+      <w:hyperlink w:history="1" r:id="rId58myeco7lhpsuqqtapn0z">
         <w:r>
           <w:t xml:space="preserve">github.com/altjerue/ilwikak-ml</w:t>
         </w:r>
@@ -2524,7 +2524,7 @@
       <w:r>
         <w:tab/>
       </w:r>
-      <w:hyperlink w:history="1" r:id="rIddab3ibgz72k5pvnfk32rq">
+      <w:hyperlink w:history="1" r:id="rIdhdr3otd8riroluc38ytd8">
         <w:r>
           <w:t xml:space="preserve">github.com/UW-ForestMycobiomeLab/WindSporesHills</w:t>
         </w:r>
@@ -2589,7 +2589,7 @@
       <w:r>
         <w:tab/>
       </w:r>
-      <w:hyperlink w:history="1" r:id="rIddulufhzzsjdj4lk8ueucq">
+      <w:hyperlink w:history="1" r:id="rIdidevlbelnfofph83gvbzu">
         <w:r>
           <w:t xml:space="preserve">github.com/zkdavis/Tleco</w:t>
         </w:r>
@@ -2654,7 +2654,7 @@
       <w:r>
         <w:tab/>
       </w:r>
-      <w:hyperlink w:history="1" r:id="rIdhhio-vvzns8rtlduzxpuy">
+      <w:hyperlink w:history="1" r:id="rIdk95thupircomhhxvzjshc">
         <w:r>
           <w:t xml:space="preserve">github.com/altjerue/paramo</w:t>
         </w:r>
@@ -3265,7 +3265,7 @@
       <w:r>
         <w:t xml:space="preserve">Video: </w:t>
       </w:r>
-      <w:hyperlink w:history="1" r:id="rId22gtq2bcgcb_zliuefsxs">
+      <w:hyperlink w:history="1" r:id="rIdlcvyokn--zrxaot2qjd3q">
         <w:r>
           <w:t xml:space="preserve">youtube.com/watch?v=BAZNWLNT69M</w:t>
         </w:r>
@@ -3436,7 +3436,7 @@
       <w:r>
         <w:t xml:space="preserve">Marcos Moshinsky Award for Best Poster. Video: </w:t>
       </w:r>
-      <w:hyperlink w:history="1" r:id="rIdhtylc9dfgiha-l6amezxw">
+      <w:hyperlink w:history="1" r:id="rIdrx1skxjqdz6pz_pivosho">
         <w:r>
           <w:t xml:space="preserve">youtube.com/watch?v=0TJiKg7kOPI</w:t>
         </w:r>
@@ -4494,7 +4494,7 @@
       <w:pPr>
         <w:spacing w:after="0"/>
       </w:pPr>
-      <w:hyperlink w:history="1" r:id="rIdhvgs_mbw6omahjwqvvsjt">
+      <w:hyperlink w:history="1" r:id="rIdab6e0h25x-ayqr06ool18">
         <w:r>
           <w:t xml:space="preserve">mexiciencia.github.io/post/anita</w:t>
         </w:r>
@@ -4554,7 +4554,7 @@
       <w:pPr>
         <w:spacing w:after="0"/>
       </w:pPr>
-      <w:hyperlink w:history="1" r:id="rIddawtegy4anjiowzllv_jj">
+      <w:hyperlink w:history="1" r:id="rIdsl813w9rnlksggost1ltn">
         <w:r>
           <w:t xml:space="preserve">mexiciencia.github.io/post/modelo-sir</w:t>
         </w:r>
@@ -4617,7 +4617,7 @@
       <w:r>
         <w:t xml:space="preserve">Data analysis and modeling collaborator. </w:t>
       </w:r>
-      <w:hyperlink w:history="1" r:id="rIdur-6jqrnrj-8__j334tbs">
+      <w:hyperlink w:history="1" r:id="rIdjerawgnlwt_s1silcxvjf">
         <w:r>
           <w:t xml:space="preserve">mexiciencia.github.io/post/covid19</w:t>
         </w:r>

</xml_diff>

<commit_message>
Drop the 20x Paramo speedup claim; describe the Tleco emulator as in progress
- Paramo (resume and CV Purdue bullets, CV software entry): keep the
  OpenMP optimization and OpenACC GPU test, drop the "about 20x faster
  on 5 cores" figure. Same wording as on res-engineer.
- Blazar Population ML: the neural network is a Tleco emulator that is
  still being built and is yet to be validated against Tleco output.

Co-Authored-By: Claude Opus 5.5 <noreply@anthropic.com>
</commit_message>
<xml_diff>
--- a/RuedaBecerrilJM-CV-plain.docx
+++ b/RuedaBecerrilJM-CV-plain.docx
@@ -28,7 +28,7 @@
       <w:r>
         <w:t xml:space="preserve">  |  </w:t>
       </w:r>
-      <w:hyperlink w:history="1" r:id="rIdcp_ik5gft9xpskyp9hjjz">
+      <w:hyperlink w:history="1" r:id="rIdvjuuouwktvcbe0j0grlep">
         <w:r>
           <w:t xml:space="preserve">jm.ruebe@gmail.com</w:t>
         </w:r>
@@ -42,7 +42,7 @@
       <w:r>
         <w:t xml:space="preserve">  |  </w:t>
       </w:r>
-      <w:hyperlink w:history="1" r:id="rId7-0ygznevswy-smpxxjqr">
+      <w:hyperlink w:history="1" r:id="rIdwngmn9kfyuyjjhz8ghrqz">
         <w:r>
           <w:t xml:space="preserve">linkedin.com/in/jeruebe</w:t>
         </w:r>
@@ -53,7 +53,7 @@
         <w:spacing w:after="60"/>
         <w:jc w:val="center"/>
       </w:pPr>
-      <w:hyperlink w:history="1" r:id="rIdxg3zzmgk0bljru2o1iowi">
+      <w:hyperlink w:history="1" r:id="rIdde8coviowr6jh7unjjife">
         <w:r>
           <w:t xml:space="preserve">altjerue.github.io</w:t>
         </w:r>
@@ -61,7 +61,7 @@
       <w:r>
         <w:t xml:space="preserve">  |  </w:t>
       </w:r>
-      <w:hyperlink w:history="1" r:id="rId4mzikwxkjy-7cqnh0fwxc">
+      <w:hyperlink w:history="1" r:id="rId3oaisvo3jss1eq-_uwhcz">
         <w:r>
           <w:t xml:space="preserve">github.com/altjerue</w:t>
         </w:r>
@@ -69,7 +69,7 @@
       <w:r>
         <w:t xml:space="preserve">  |  </w:t>
       </w:r>
-      <w:hyperlink w:history="1" r:id="rIdppoce_1w7hmu0txu_dbsb">
+      <w:hyperlink w:history="1" r:id="rIdqhridfthzyknqzohy3klx">
         <w:r>
           <w:t xml:space="preserve">orcid.org/0000-0003-1988-1912</w:t>
         </w:r>
@@ -77,7 +77,7 @@
       <w:r>
         <w:t xml:space="preserve">  |  </w:t>
       </w:r>
-      <w:hyperlink w:history="1" r:id="rIdxohnkozayjhcpgr1vsjqx">
+      <w:hyperlink w:history="1" r:id="rId571wm1e9bcvccpze0qicj">
         <w:r>
           <w:t xml:space="preserve">Google Scholar</w:t>
         </w:r>
@@ -772,7 +772,7 @@
         <w:spacing w:after="10"/>
       </w:pPr>
       <w:r>
-        <w:t xml:space="preserve">Architected Paramo, an open-source Fortran 95 library that solves the Fokker–Planck equation coupled to radiative transfer; parallelized and optimized it with OpenMP, making it about 20× faster than the original serial code on 5 cores.</w:t>
+        <w:t xml:space="preserve">Architected Paramo, an open-source Fortran 95 library that solves the Fokker–Planck equation coupled to radiative transfer; parallelized and optimized it with OpenMP; GPU offload tested with OpenACC.</w:t>
       </w:r>
     </w:p>
     <w:p>
@@ -1132,7 +1132,7 @@
       <w:r>
         <w:t xml:space="preserve">Thesis: </w:t>
       </w:r>
-      <w:hyperlink w:history="1" r:id="rIdry8wy2fxfoopy8izal6tc">
+      <w:hyperlink w:history="1" r:id="rIdemsmlcyfnswgiblox5rpg">
         <w:r>
           <w:t xml:space="preserve">Numerical treatment of radiation processes in the internal shocks of magnetized relativistic outflows</w:t>
         </w:r>
@@ -1429,7 +1429,7 @@
       <w:r>
         <w:t xml:space="preserve">, </w:t>
       </w:r>
-      <w:hyperlink w:history="1" r:id="rIdthczanmoxgwti4pyba62m">
+      <w:hyperlink w:history="1" r:id="rIdegpl8xrmcn8ljcx4mxywq">
         <w:r>
           <w:t xml:space="preserve">ApJ 976, 182 (2024)</w:t>
         </w:r>
@@ -1437,7 +1437,7 @@
       <w:r>
         <w:t xml:space="preserve">, </w:t>
       </w:r>
-      <w:hyperlink w:history="1" r:id="rIdcapfidgdebdb75a-oydzv">
+      <w:hyperlink w:history="1" r:id="rId7tmijnp585lmj8btkoabh">
         <w:r>
           <w:t xml:space="preserve">arXiv:2405.17581</w:t>
         </w:r>
@@ -1474,7 +1474,7 @@
       <w:r>
         <w:t xml:space="preserve">, </w:t>
       </w:r>
-      <w:hyperlink w:history="1" r:id="rIdjh8t1eeujarjpj3ltbsdz">
+      <w:hyperlink w:history="1" r:id="rId5bgothbcpggauptksffxf">
         <w:r>
           <w:t xml:space="preserve">MNRAS 513, 5766–5779 (2022)</w:t>
         </w:r>
@@ -1482,7 +1482,7 @@
       <w:r>
         <w:t xml:space="preserve">, </w:t>
       </w:r>
-      <w:hyperlink w:history="1" r:id="rId4q__zedjghs33xa5ldan7">
+      <w:hyperlink w:history="1" r:id="rIdrjkyjprf3djswfj04qe8x">
         <w:r>
           <w:t xml:space="preserve">arXiv:2201.07790</w:t>
         </w:r>
@@ -1519,7 +1519,7 @@
       <w:r>
         <w:t xml:space="preserve">, </w:t>
       </w:r>
-      <w:hyperlink w:history="1" r:id="rIdtderxl6iiht3jr36qldrd">
+      <w:hyperlink w:history="1" r:id="rIdhnwdambjx9mwrkoq2x5na">
         <w:r>
           <w:t xml:space="preserve">Phys. Rev. D 106, 083015 (2022)</w:t>
         </w:r>
@@ -1527,7 +1527,7 @@
       <w:r>
         <w:t xml:space="preserve">, </w:t>
       </w:r>
-      <w:hyperlink w:history="1" r:id="rIdbe7ec4yzr0n7hstpcx7pt">
+      <w:hyperlink w:history="1" r:id="rIdrtdamtxsnqf-wcf_utxzp">
         <w:r>
           <w:t xml:space="preserve">arXiv:2112.09817</w:t>
         </w:r>
@@ -1564,7 +1564,7 @@
       <w:r>
         <w:t xml:space="preserve">, </w:t>
       </w:r>
-      <w:hyperlink w:history="1" r:id="rIdbbvauisz9fjbgbjkqhvmv">
+      <w:hyperlink w:history="1" r:id="rIdqalwoalvnhu51tqgcbtz9">
         <w:r>
           <w:t xml:space="preserve">ApJ 919, 95 (2021)</w:t>
         </w:r>
@@ -1572,7 +1572,7 @@
       <w:r>
         <w:t xml:space="preserve">, </w:t>
       </w:r>
-      <w:hyperlink w:history="1" r:id="rIdpbrzkexjkohtqpt8g6nti">
+      <w:hyperlink w:history="1" r:id="rIdpq44rbr2q9epgndc5uzyq">
         <w:r>
           <w:t xml:space="preserve">arXiv:2106.05356</w:t>
         </w:r>
@@ -1609,7 +1609,7 @@
       <w:r>
         <w:t xml:space="preserve">, </w:t>
       </w:r>
-      <w:hyperlink w:history="1" r:id="rIddvrwdeowdnldkrpcwruma">
+      <w:hyperlink w:history="1" r:id="rId9brouirveejlmaz0lihlu">
         <w:r>
           <w:t xml:space="preserve">MNRAS 501, 4092–4102 (2021)</w:t>
         </w:r>
@@ -1617,7 +1617,7 @@
       <w:r>
         <w:t xml:space="preserve">, </w:t>
       </w:r>
-      <w:hyperlink w:history="1" r:id="rIdxbta61azq6-ogrwcpr-7u">
+      <w:hyperlink w:history="1" r:id="rIdrx3nqb0hemjm-aak-ewao">
         <w:r>
           <w:t xml:space="preserve">arXiv:2009.02273</w:t>
         </w:r>
@@ -1654,7 +1654,7 @@
       <w:r>
         <w:t xml:space="preserve">, </w:t>
       </w:r>
-      <w:hyperlink w:history="1" r:id="rIdf6odr1iur2tkzylvdrj4w">
+      <w:hyperlink w:history="1" r:id="rIdxw10kb3y2rlaub0tkmlwi">
         <w:r>
           <w:t xml:space="preserve">MNRAS 496, 974–986 (2020)</w:t>
         </w:r>
@@ -1662,7 +1662,7 @@
       <w:r>
         <w:t xml:space="preserve">, </w:t>
       </w:r>
-      <w:hyperlink w:history="1" r:id="rIdviisxqq1c_ebfd_wpcuz1">
+      <w:hyperlink w:history="1" r:id="rIdc1wwbp1bf5ig_4g02xkyd">
         <w:r>
           <w:t xml:space="preserve">arXiv:1910.14049</w:t>
         </w:r>
@@ -1699,7 +1699,7 @@
       <w:r>
         <w:t xml:space="preserve">, </w:t>
       </w:r>
-      <w:hyperlink w:history="1" r:id="rId9q5x0zjmbq0dlixhn5gnq">
+      <w:hyperlink w:history="1" r:id="rIdk5evjux4uwovoxr4vd1mg">
         <w:r>
           <w:t xml:space="preserve">MNRAS 468, 1169–1182 (2017)</w:t>
         </w:r>
@@ -1707,7 +1707,7 @@
       <w:r>
         <w:t xml:space="preserve">, </w:t>
       </w:r>
-      <w:hyperlink w:history="1" r:id="rIdyr8wjeuwren3vee_zxq2r">
+      <w:hyperlink w:history="1" r:id="rIdita07w7av47uah7o9kdbr">
         <w:r>
           <w:t xml:space="preserve">arXiv:1612.06383</w:t>
         </w:r>
@@ -1744,7 +1744,7 @@
       <w:r>
         <w:t xml:space="preserve">, </w:t>
       </w:r>
-      <w:hyperlink w:history="1" r:id="rIdafs_pfzk5x-ad1rme593s">
+      <w:hyperlink w:history="1" r:id="rIdmmgxmfjvzfql8xrokjrz0">
         <w:r>
           <w:t xml:space="preserve">MNRAS 438, 1856–1869 (2014)</w:t>
         </w:r>
@@ -1752,7 +1752,7 @@
       <w:r>
         <w:t xml:space="preserve">, </w:t>
       </w:r>
-      <w:hyperlink w:history="1" r:id="rId1augcig12n0bnlz5w4i1l">
+      <w:hyperlink w:history="1" r:id="rIdhflbnedx_aa8dzj39mfj8">
         <w:r>
           <w:t xml:space="preserve">arXiv:1310.5441</w:t>
         </w:r>
@@ -1789,7 +1789,7 @@
       <w:r>
         <w:t xml:space="preserve">, </w:t>
       </w:r>
-      <w:hyperlink w:history="1" r:id="rIdf2dwynphdmxm3cigdyfca">
+      <w:hyperlink w:history="1" r:id="rIdw12hn7coyumegicyl_kvg">
         <w:r>
           <w:t xml:space="preserve">Phys. Rev. D 80, 084023 (2009)</w:t>
         </w:r>
@@ -1797,7 +1797,7 @@
       <w:r>
         <w:t xml:space="preserve">, </w:t>
       </w:r>
-      <w:hyperlink w:history="1" r:id="rId_0zlw-eawp0y1mbrvpc_l">
+      <w:hyperlink w:history="1" r:id="rIdercg6hxvcdgly5xesfmhq">
         <w:r>
           <w:t xml:space="preserve">arXiv:1009.1250</w:t>
         </w:r>
@@ -1842,7 +1842,7 @@
       <w:r>
         <w:t xml:space="preserve">, </w:t>
       </w:r>
-      <w:hyperlink w:history="1" r:id="rIdsmjhg-vdrwp_gugq9vltb">
+      <w:hyperlink w:history="1" r:id="rIdjhi_5lydssgaxu7rgsjey">
         <w:r>
           <w:t xml:space="preserve">Astron. Nachr. 342, 277–282 (2021)</w:t>
         </w:r>
@@ -1850,7 +1850,7 @@
       <w:r>
         <w:t xml:space="preserve">, 9th International Workshop on Astronomy and Relativistic Astrophysics, </w:t>
       </w:r>
-      <w:hyperlink w:history="1" r:id="rId0zeke3bakv7_cqrwogcxc">
+      <w:hyperlink w:history="1" r:id="rIdczrddt26xfmltivzlsjdi">
         <w:r>
           <w:t xml:space="preserve">arXiv:2011.13797</w:t>
         </w:r>
@@ -1887,7 +1887,7 @@
       <w:r>
         <w:t xml:space="preserve">, </w:t>
       </w:r>
-      <w:hyperlink w:history="1" r:id="rIdlxnz7jkeske7frmplerc2">
+      <w:hyperlink w:history="1" r:id="rIdtmsyr9rnz4w6smqei1qv2">
         <w:r>
           <w:t xml:space="preserve">Astron. Nachr. 342, 147–152 (2021)</w:t>
         </w:r>
@@ -1895,7 +1895,7 @@
       <w:r>
         <w:t xml:space="preserve">, 9th International Workshop on Astronomy and Relativistic Astrophysics, </w:t>
       </w:r>
-      <w:hyperlink w:history="1" r:id="rIdlfs5cdyd2k3argb658o6k">
+      <w:hyperlink w:history="1" r:id="rIdbbefcxuipyis-rvtizdyb">
         <w:r>
           <w:t xml:space="preserve">arXiv:2011.13805</w:t>
         </w:r>
@@ -1932,7 +1932,7 @@
       <w:r>
         <w:t xml:space="preserve">, </w:t>
       </w:r>
-      <w:hyperlink w:history="1" r:id="rIdhloyqgroxbjlsrm5txbnt">
+      <w:hyperlink w:history="1" r:id="rId20gssb_-qjfo4a2gxihr_">
         <w:r>
           <w:t xml:space="preserve">PoS(SWIFT 10) 233, 159 (2014)</w:t>
         </w:r>
@@ -1940,7 +1940,7 @@
       <w:r>
         <w:t xml:space="preserve">, </w:t>
       </w:r>
-      <w:hyperlink w:history="1" r:id="rIdcm2rufbkwwhvwzycyhfzy">
+      <w:hyperlink w:history="1" r:id="rIdwt6b09j2bk9mh5uypdh00">
         <w:r>
           <w:t xml:space="preserve">arXiv:1502.07882</w:t>
         </w:r>
@@ -1977,7 +1977,7 @@
       <w:r>
         <w:t xml:space="preserve">, </w:t>
       </w:r>
-      <w:hyperlink w:history="1" r:id="rIdaea0lk527gvxlupstfiui">
+      <w:hyperlink w:history="1" r:id="rIdzb2-3ib2mv7zljfvtyraw">
         <w:r>
           <w:t xml:space="preserve">EPJ Web Conf. 61, 02007 (2013)</w:t>
         </w:r>
@@ -1985,7 +1985,7 @@
       <w:r>
         <w:t xml:space="preserve">, </w:t>
       </w:r>
-      <w:hyperlink w:history="1" r:id="rIdtzfs9ir6kes2uu8nqooxu">
+      <w:hyperlink w:history="1" r:id="rIdj1i0ewf5xqm3wqwyfqfxm">
         <w:r>
           <w:t xml:space="preserve">arXiv:1309.4612</w:t>
         </w:r>
@@ -2022,7 +2022,7 @@
       <w:r>
         <w:t xml:space="preserve">, </w:t>
       </w:r>
-      <w:hyperlink w:history="1" r:id="rIdbt2mk2fl3onujfqejvdru">
+      <w:hyperlink w:history="1" r:id="rIdo5a46yativli4bxq5w6j1">
         <w:r>
           <w:t xml:space="preserve">J. Phys.: Conf. Ser. 454, 012001 (2013)</w:t>
         </w:r>
@@ -2030,7 +2030,7 @@
       <w:r>
         <w:t xml:space="preserve">, </w:t>
       </w:r>
-      <w:hyperlink w:history="1" r:id="rIdi_oueidwagdzhivt01jls">
+      <w:hyperlink w:history="1" r:id="rIdgb2ttc0luci-qtz1f8eg3">
         <w:r>
           <w:t xml:space="preserve">arXiv:1211.1794</w:t>
         </w:r>
@@ -2433,7 +2433,7 @@
       <w:r>
         <w:tab/>
       </w:r>
-      <w:hyperlink w:history="1" r:id="rId6j2wyumvu-hdgxucmi4yd">
+      <w:hyperlink w:history="1" r:id="rIdf-8srpcr2p2cterij8voz">
         <w:r>
           <w:t xml:space="preserve">github.com/altjerue/ilwikak-ml</w:t>
         </w:r>
@@ -2462,7 +2462,7 @@
         <w:spacing w:after="10"/>
       </w:pPr>
       <w:r>
-        <w:t xml:space="preserve">Building a neural network that maps physical jet parameters to observable spectral energy distributions accurately enough to compare with Tleco results.</w:t>
+        <w:t xml:space="preserve">Building a neural-network emulator of the physics-based Tleco model that maps physical jet parameters to observable spectral energy distributions, to be validated against Tleco output (in progress).</w:t>
       </w:r>
     </w:p>
     <w:p>
@@ -2524,7 +2524,7 @@
       <w:r>
         <w:tab/>
       </w:r>
-      <w:hyperlink w:history="1" r:id="rIdpourlobghevea6npvouil">
+      <w:hyperlink w:history="1" r:id="rIddkxkkif6wlmfmpdvh2zhm">
         <w:r>
           <w:t xml:space="preserve">github.com/UW-ForestMycobiomeLab/WindSporesHills</w:t>
         </w:r>
@@ -2589,7 +2589,7 @@
       <w:r>
         <w:tab/>
       </w:r>
-      <w:hyperlink w:history="1" r:id="rIdwqgqa66ntsxp5fcnoofru">
+      <w:hyperlink w:history="1" r:id="rIdpppz7wprywvhqnfuyvd-f">
         <w:r>
           <w:t xml:space="preserve">github.com/zkdavis/Tleco</w:t>
         </w:r>
@@ -2654,7 +2654,7 @@
       <w:r>
         <w:tab/>
       </w:r>
-      <w:hyperlink w:history="1" r:id="rIdsglhgdrgggtabvp22vqcy">
+      <w:hyperlink w:history="1" r:id="rIdd9rap3-vznfwdbg1qo0oj">
         <w:r>
           <w:t xml:space="preserve">github.com/altjerue/paramo</w:t>
         </w:r>
@@ -2670,7 +2670,7 @@
         <w:spacing w:after="10"/>
       </w:pPr>
       <w:r>
-        <w:t xml:space="preserve">Fokker–Planck and radiative-transfer solver for relativistic particle distributions; about 20× faster than the original serial code on 5 cores after OpenMP parallelization and optimization; used by other groups, including Combi &amp; Siegel (2023).</w:t>
+        <w:t xml:space="preserve">Fokker–Planck and radiative-transfer solver for relativistic particle distributions, parallelized with OpenMP; used by other groups, including Combi &amp; Siegel (2023).</w:t>
       </w:r>
     </w:p>
     <w:p>
@@ -3265,7 +3265,7 @@
       <w:r>
         <w:t xml:space="preserve">Video: </w:t>
       </w:r>
-      <w:hyperlink w:history="1" r:id="rIdt0l7c5jm0nh25v-lexr8s">
+      <w:hyperlink w:history="1" r:id="rIdm-ypibujr2lfhsnlrnt6l">
         <w:r>
           <w:t xml:space="preserve">youtube.com/watch?v=BAZNWLNT69M</w:t>
         </w:r>
@@ -3436,7 +3436,7 @@
       <w:r>
         <w:t xml:space="preserve">Marcos Moshinsky Award for Best Poster. Video: </w:t>
       </w:r>
-      <w:hyperlink w:history="1" r:id="rIdjbjrfn7ctsfb0arjx5bqa">
+      <w:hyperlink w:history="1" r:id="rIdkcdangqqyd23csyrkbdl6">
         <w:r>
           <w:t xml:space="preserve">youtube.com/watch?v=0TJiKg7kOPI</w:t>
         </w:r>
@@ -4494,7 +4494,7 @@
       <w:pPr>
         <w:spacing w:after="0"/>
       </w:pPr>
-      <w:hyperlink w:history="1" r:id="rId8jf526ir6mphereolr27m">
+      <w:hyperlink w:history="1" r:id="rIddzj6fw22z3qawsb8e-og2">
         <w:r>
           <w:t xml:space="preserve">mexiciencia.github.io/post/anita</w:t>
         </w:r>
@@ -4554,7 +4554,7 @@
       <w:pPr>
         <w:spacing w:after="0"/>
       </w:pPr>
-      <w:hyperlink w:history="1" r:id="rIdwgtbmsj10cvohmcfcqu6f">
+      <w:hyperlink w:history="1" r:id="rIdzj5s3x5avaqryvimteirb">
         <w:r>
           <w:t xml:space="preserve">mexiciencia.github.io/post/modelo-sir</w:t>
         </w:r>
@@ -4617,7 +4617,7 @@
       <w:r>
         <w:t xml:space="preserve">Data analysis and modeling collaborator. </w:t>
       </w:r>
-      <w:hyperlink w:history="1" r:id="rIdoyrq-sc2874hpyf6mk4na">
+      <w:hyperlink w:history="1" r:id="rIdb_qplwmvyn17lolayscg2">
         <w:r>
           <w:t xml:space="preserve">mexiciencia.github.io/post/covid19</w:t>
         </w:r>

</xml_diff>

<commit_message>
Use sub_inline for Education and Experience in both documents
Employer or institution now follows the role or degree on the heading
line ("Software Engineer, Paychex"), with dates on the right.

- Resume: locations are commented out (kept in the YAML for easy
  restoring), so each entry's heading is one line; Education shows the
  Ph.D. year on the right and no M.Sc./B.Sc. years, as before.
- CV: keeps the locations, which now sit alone on a right-aligned
  second line.

Still 2 pages (resume) and 6 pages (CV) in every format. The README
documents the option.

Co-Authored-By: Claude Opus 5.5 <noreply@anthropic.com>
</commit_message>
<xml_diff>
--- a/RuedaBecerrilJM-CV-plain.docx
+++ b/RuedaBecerrilJM-CV-plain.docx
@@ -28,7 +28,7 @@
       <w:r>
         <w:t xml:space="preserve">  |  </w:t>
       </w:r>
-      <w:hyperlink w:history="1" r:id="rIdvjuuouwktvcbe0j0grlep">
+      <w:hyperlink w:history="1" r:id="rIdqyxsbthvwizoxze8rphsi">
         <w:r>
           <w:t xml:space="preserve">jm.ruebe@gmail.com</w:t>
         </w:r>
@@ -42,7 +42,7 @@
       <w:r>
         <w:t xml:space="preserve">  |  </w:t>
       </w:r>
-      <w:hyperlink w:history="1" r:id="rIdwngmn9kfyuyjjhz8ghrqz">
+      <w:hyperlink w:history="1" r:id="rIdg-1yrtcrna-tphajf-fv8">
         <w:r>
           <w:t xml:space="preserve">linkedin.com/in/jeruebe</w:t>
         </w:r>
@@ -53,7 +53,7 @@
         <w:spacing w:after="60"/>
         <w:jc w:val="center"/>
       </w:pPr>
-      <w:hyperlink w:history="1" r:id="rIdde8coviowr6jh7unjjife">
+      <w:hyperlink w:history="1" r:id="rId2cypamsocwnix8zr3auhs">
         <w:r>
           <w:t xml:space="preserve">altjerue.github.io</w:t>
         </w:r>
@@ -61,7 +61,7 @@
       <w:r>
         <w:t xml:space="preserve">  |  </w:t>
       </w:r>
-      <w:hyperlink w:history="1" r:id="rId3oaisvo3jss1eq-_uwhcz">
+      <w:hyperlink w:history="1" r:id="rId3939finfbgca_lznaawye">
         <w:r>
           <w:t xml:space="preserve">github.com/altjerue</w:t>
         </w:r>
@@ -69,7 +69,7 @@
       <w:r>
         <w:t xml:space="preserve">  |  </w:t>
       </w:r>
-      <w:hyperlink w:history="1" r:id="rIdqhridfthzyknqzohy3klx">
+      <w:hyperlink w:history="1" r:id="rIdyewnplvwk1uaiuekhfxbm">
         <w:r>
           <w:t xml:space="preserve">orcid.org/0000-0003-1988-1912</w:t>
         </w:r>
@@ -77,7 +77,7 @@
       <w:r>
         <w:t xml:space="preserve">  |  </w:t>
       </w:r>
-      <w:hyperlink w:history="1" r:id="rId571wm1e9bcvccpze0qicj">
+      <w:hyperlink w:history="1" r:id="rId6kionpdmwsr_xfqg5rhx0">
         <w:r>
           <w:t xml:space="preserve">Google Scholar</w:t>
         </w:r>
@@ -218,6 +218,16 @@
         <w:t xml:space="preserve">Independent Contractor</w:t>
       </w:r>
       <w:r>
+        <w:t xml:space="preserve">, </w:t>
+      </w:r>
+      <w:r>
+        <w:rPr>
+          <w:i/>
+          <w:iCs/>
+        </w:rPr>
+        <w:t xml:space="preserve">Mercor</w:t>
+      </w:r>
+      <w:r>
         <w:tab/>
       </w:r>
       <w:r>
@@ -232,13 +242,6 @@
         </w:tabs>
         <w:spacing w:after="0"/>
       </w:pPr>
-      <w:r>
-        <w:rPr>
-          <w:i/>
-          <w:iCs/>
-        </w:rPr>
-        <w:t xml:space="preserve">Mercor</w:t>
-      </w:r>
       <w:r>
         <w:tab/>
       </w:r>
@@ -294,6 +297,16 @@
         <w:t xml:space="preserve">Spatial Data Scientist</w:t>
       </w:r>
       <w:r>
+        <w:t xml:space="preserve">, </w:t>
+      </w:r>
+      <w:r>
+        <w:rPr>
+          <w:i/>
+          <w:iCs/>
+        </w:rPr>
+        <w:t xml:space="preserve">TealWaters</w:t>
+      </w:r>
+      <w:r>
         <w:tab/>
       </w:r>
       <w:r>
@@ -308,13 +321,6 @@
         </w:tabs>
         <w:spacing w:after="0"/>
       </w:pPr>
-      <w:r>
-        <w:rPr>
-          <w:i/>
-          <w:iCs/>
-        </w:rPr>
-        <w:t xml:space="preserve">TealWaters</w:t>
-      </w:r>
       <w:r>
         <w:tab/>
       </w:r>
@@ -405,6 +411,16 @@
         <w:t xml:space="preserve">Independent Researcher &amp; Open-Source Developer</w:t>
       </w:r>
       <w:r>
+        <w:t xml:space="preserve">, </w:t>
+      </w:r>
+      <w:r>
+        <w:rPr>
+          <w:i/>
+          <w:iCs/>
+        </w:rPr>
+        <w:t xml:space="preserve">Self-directed</w:t>
+      </w:r>
+      <w:r>
         <w:tab/>
       </w:r>
       <w:r>
@@ -419,13 +435,6 @@
         </w:tabs>
         <w:spacing w:after="0"/>
       </w:pPr>
-      <w:r>
-        <w:rPr>
-          <w:i/>
-          <w:iCs/>
-        </w:rPr>
-        <w:t xml:space="preserve">Self-directed</w:t>
-      </w:r>
       <w:r>
         <w:tab/>
       </w:r>
@@ -503,6 +512,16 @@
         <w:t xml:space="preserve">Software Engineer</w:t>
       </w:r>
       <w:r>
+        <w:t xml:space="preserve">, </w:t>
+      </w:r>
+      <w:r>
+        <w:rPr>
+          <w:i/>
+          <w:iCs/>
+        </w:rPr>
+        <w:t xml:space="preserve">Paychex</w:t>
+      </w:r>
+      <w:r>
         <w:tab/>
       </w:r>
       <w:r>
@@ -517,13 +536,6 @@
         </w:tabs>
         <w:spacing w:after="0"/>
       </w:pPr>
-      <w:r>
-        <w:rPr>
-          <w:i/>
-          <w:iCs/>
-        </w:rPr>
-        <w:t xml:space="preserve">Paychex</w:t>
-      </w:r>
       <w:r>
         <w:tab/>
       </w:r>
@@ -601,6 +613,16 @@
         <w:t xml:space="preserve">Postdoctoral Research Associate</w:t>
       </w:r>
       <w:r>
+        <w:t xml:space="preserve">, </w:t>
+      </w:r>
+      <w:r>
+        <w:rPr>
+          <w:i/>
+          <w:iCs/>
+        </w:rPr>
+        <w:t xml:space="preserve">Rochester Institute of Technology</w:t>
+      </w:r>
+      <w:r>
         <w:tab/>
       </w:r>
       <w:r>
@@ -615,13 +637,6 @@
         </w:tabs>
         <w:spacing w:after="0"/>
       </w:pPr>
-      <w:r>
-        <w:rPr>
-          <w:i/>
-          <w:iCs/>
-        </w:rPr>
-        <w:t xml:space="preserve">Rochester Institute of Technology</w:t>
-      </w:r>
       <w:r>
         <w:tab/>
       </w:r>
@@ -725,6 +740,16 @@
         <w:t xml:space="preserve">Postdoctoral Research Fellow</w:t>
       </w:r>
       <w:r>
+        <w:t xml:space="preserve">, </w:t>
+      </w:r>
+      <w:r>
+        <w:rPr>
+          <w:i/>
+          <w:iCs/>
+        </w:rPr>
+        <w:t xml:space="preserve">Purdue University</w:t>
+      </w:r>
+      <w:r>
         <w:tab/>
       </w:r>
       <w:r>
@@ -739,13 +764,6 @@
         </w:tabs>
         <w:spacing w:after="0"/>
       </w:pPr>
-      <w:r>
-        <w:rPr>
-          <w:i/>
-          <w:iCs/>
-        </w:rPr>
-        <w:t xml:space="preserve">Purdue University</w:t>
-      </w:r>
       <w:r>
         <w:tab/>
       </w:r>
@@ -862,6 +880,16 @@
         <w:t xml:space="preserve">Postdoctoral Research Fellow</w:t>
       </w:r>
       <w:r>
+        <w:t xml:space="preserve">, </w:t>
+      </w:r>
+      <w:r>
+        <w:rPr>
+          <w:i/>
+          <w:iCs/>
+        </w:rPr>
+        <w:t xml:space="preserve">Universidad Michoacana de San Nicolás de Hidalgo</w:t>
+      </w:r>
+      <w:r>
         <w:tab/>
       </w:r>
       <w:r>
@@ -876,13 +904,6 @@
         </w:tabs>
         <w:spacing w:after="0"/>
       </w:pPr>
-      <w:r>
-        <w:rPr>
-          <w:i/>
-          <w:iCs/>
-        </w:rPr>
-        <w:t xml:space="preserve">Universidad Michoacana de San Nicolás de Hidalgo</w:t>
-      </w:r>
       <w:r>
         <w:tab/>
       </w:r>
@@ -951,6 +972,16 @@
         <w:t xml:space="preserve">Graduate Research Assistant</w:t>
       </w:r>
       <w:r>
+        <w:t xml:space="preserve">, </w:t>
+      </w:r>
+      <w:r>
+        <w:rPr>
+          <w:i/>
+          <w:iCs/>
+        </w:rPr>
+        <w:t xml:space="preserve">Universitat de València</w:t>
+      </w:r>
+      <w:r>
         <w:tab/>
       </w:r>
       <w:r>
@@ -965,13 +996,6 @@
         </w:tabs>
         <w:spacing w:after="0"/>
       </w:pPr>
-      <w:r>
-        <w:rPr>
-          <w:i/>
-          <w:iCs/>
-        </w:rPr>
-        <w:t xml:space="preserve">Universitat de València</w:t>
-      </w:r>
       <w:r>
         <w:tab/>
       </w:r>
@@ -1074,6 +1098,16 @@
         <w:t xml:space="preserve">Ph.D. in Physics</w:t>
       </w:r>
       <w:r>
+        <w:t xml:space="preserve">, </w:t>
+      </w:r>
+      <w:r>
+        <w:rPr>
+          <w:i/>
+          <w:iCs/>
+        </w:rPr>
+        <w:t xml:space="preserve">Universitat de València</w:t>
+      </w:r>
+      <w:r>
         <w:tab/>
       </w:r>
       <w:r>
@@ -1089,13 +1123,6 @@
         <w:spacing w:after="0"/>
       </w:pPr>
       <w:r>
-        <w:rPr>
-          <w:i/>
-          <w:iCs/>
-        </w:rPr>
-        <w:t xml:space="preserve">Universitat de València</w:t>
-      </w:r>
-      <w:r>
         <w:tab/>
       </w:r>
       <w:r>
@@ -1132,7 +1159,7 @@
       <w:r>
         <w:t xml:space="preserve">Thesis: </w:t>
       </w:r>
-      <w:hyperlink w:history="1" r:id="rIdemsmlcyfnswgiblox5rpg">
+      <w:hyperlink w:history="1" r:id="rId_by1azbg54c8sjzwyxbne">
         <w:r>
           <w:t xml:space="preserve">Numerical treatment of radiation processes in the internal shocks of magnetized relativistic outflows</w:t>
         </w:r>
@@ -1160,6 +1187,16 @@
         <w:t xml:space="preserve">M.Sc. in Physics</w:t>
       </w:r>
       <w:r>
+        <w:t xml:space="preserve">, </w:t>
+      </w:r>
+      <w:r>
+        <w:rPr>
+          <w:i/>
+          <w:iCs/>
+        </w:rPr>
+        <w:t xml:space="preserve">Universidad Michoacana de San Nicolás de Hidalgo</w:t>
+      </w:r>
+      <w:r>
         <w:tab/>
       </w:r>
       <w:r>
@@ -1175,13 +1212,6 @@
         <w:spacing w:after="0"/>
       </w:pPr>
       <w:r>
-        <w:rPr>
-          <w:i/>
-          <w:iCs/>
-        </w:rPr>
-        <w:t xml:space="preserve">Universidad Michoacana de San Nicolás de Hidalgo</w:t>
-      </w:r>
-      <w:r>
         <w:tab/>
       </w:r>
       <w:r>
@@ -1233,6 +1263,16 @@
         <w:t xml:space="preserve">B.Sc. in Physics</w:t>
       </w:r>
       <w:r>
+        <w:t xml:space="preserve">, </w:t>
+      </w:r>
+      <w:r>
+        <w:rPr>
+          <w:i/>
+          <w:iCs/>
+        </w:rPr>
+        <w:t xml:space="preserve">Universidad Autónoma del Estado de México</w:t>
+      </w:r>
+      <w:r>
         <w:tab/>
       </w:r>
       <w:r>
@@ -1247,13 +1287,6 @@
         </w:tabs>
         <w:spacing w:after="0"/>
       </w:pPr>
-      <w:r>
-        <w:rPr>
-          <w:i/>
-          <w:iCs/>
-        </w:rPr>
-        <w:t xml:space="preserve">Universidad Autónoma del Estado de México</w:t>
-      </w:r>
       <w:r>
         <w:tab/>
       </w:r>
@@ -1429,7 +1462,7 @@
       <w:r>
         <w:t xml:space="preserve">, </w:t>
       </w:r>
-      <w:hyperlink w:history="1" r:id="rIdegpl8xrmcn8ljcx4mxywq">
+      <w:hyperlink w:history="1" r:id="rIdjsezfwqmky8efi_icukos">
         <w:r>
           <w:t xml:space="preserve">ApJ 976, 182 (2024)</w:t>
         </w:r>
@@ -1437,7 +1470,7 @@
       <w:r>
         <w:t xml:space="preserve">, </w:t>
       </w:r>
-      <w:hyperlink w:history="1" r:id="rId7tmijnp585lmj8btkoabh">
+      <w:hyperlink w:history="1" r:id="rIdb9zym-lvo-podf6bbkhwi">
         <w:r>
           <w:t xml:space="preserve">arXiv:2405.17581</w:t>
         </w:r>
@@ -1474,7 +1507,7 @@
       <w:r>
         <w:t xml:space="preserve">, </w:t>
       </w:r>
-      <w:hyperlink w:history="1" r:id="rId5bgothbcpggauptksffxf">
+      <w:hyperlink w:history="1" r:id="rIdguhreusfe30eqgeb9c48n">
         <w:r>
           <w:t xml:space="preserve">MNRAS 513, 5766–5779 (2022)</w:t>
         </w:r>
@@ -1482,7 +1515,7 @@
       <w:r>
         <w:t xml:space="preserve">, </w:t>
       </w:r>
-      <w:hyperlink w:history="1" r:id="rIdrjkyjprf3djswfj04qe8x">
+      <w:hyperlink w:history="1" r:id="rIdnt4b5hsc94qzygwnsomuo">
         <w:r>
           <w:t xml:space="preserve">arXiv:2201.07790</w:t>
         </w:r>
@@ -1519,7 +1552,7 @@
       <w:r>
         <w:t xml:space="preserve">, </w:t>
       </w:r>
-      <w:hyperlink w:history="1" r:id="rIdhnwdambjx9mwrkoq2x5na">
+      <w:hyperlink w:history="1" r:id="rIdrxmznlfl_qkghsa2w70hm">
         <w:r>
           <w:t xml:space="preserve">Phys. Rev. D 106, 083015 (2022)</w:t>
         </w:r>
@@ -1527,7 +1560,7 @@
       <w:r>
         <w:t xml:space="preserve">, </w:t>
       </w:r>
-      <w:hyperlink w:history="1" r:id="rIdrtdamtxsnqf-wcf_utxzp">
+      <w:hyperlink w:history="1" r:id="rIdqxwzwd5h_qlmz_-bvcrdc">
         <w:r>
           <w:t xml:space="preserve">arXiv:2112.09817</w:t>
         </w:r>
@@ -1564,7 +1597,7 @@
       <w:r>
         <w:t xml:space="preserve">, </w:t>
       </w:r>
-      <w:hyperlink w:history="1" r:id="rIdqalwoalvnhu51tqgcbtz9">
+      <w:hyperlink w:history="1" r:id="rIderory2lv1afl5ul-s2rf5">
         <w:r>
           <w:t xml:space="preserve">ApJ 919, 95 (2021)</w:t>
         </w:r>
@@ -1572,7 +1605,7 @@
       <w:r>
         <w:t xml:space="preserve">, </w:t>
       </w:r>
-      <w:hyperlink w:history="1" r:id="rIdpq44rbr2q9epgndc5uzyq">
+      <w:hyperlink w:history="1" r:id="rIdxpmcoupb7fscmpvj7aafv">
         <w:r>
           <w:t xml:space="preserve">arXiv:2106.05356</w:t>
         </w:r>
@@ -1609,7 +1642,7 @@
       <w:r>
         <w:t xml:space="preserve">, </w:t>
       </w:r>
-      <w:hyperlink w:history="1" r:id="rId9brouirveejlmaz0lihlu">
+      <w:hyperlink w:history="1" r:id="rIdljuc4x1g9-ikvdkcpj7md">
         <w:r>
           <w:t xml:space="preserve">MNRAS 501, 4092–4102 (2021)</w:t>
         </w:r>
@@ -1617,7 +1650,7 @@
       <w:r>
         <w:t xml:space="preserve">, </w:t>
       </w:r>
-      <w:hyperlink w:history="1" r:id="rIdrx3nqb0hemjm-aak-ewao">
+      <w:hyperlink w:history="1" r:id="rIdvxbzvlewqzyyi2vcvikav">
         <w:r>
           <w:t xml:space="preserve">arXiv:2009.02273</w:t>
         </w:r>
@@ -1654,7 +1687,7 @@
       <w:r>
         <w:t xml:space="preserve">, </w:t>
       </w:r>
-      <w:hyperlink w:history="1" r:id="rIdxw10kb3y2rlaub0tkmlwi">
+      <w:hyperlink w:history="1" r:id="rIdt5ay4yotfxaya-wjsljnl">
         <w:r>
           <w:t xml:space="preserve">MNRAS 496, 974–986 (2020)</w:t>
         </w:r>
@@ -1662,7 +1695,7 @@
       <w:r>
         <w:t xml:space="preserve">, </w:t>
       </w:r>
-      <w:hyperlink w:history="1" r:id="rIdc1wwbp1bf5ig_4g02xkyd">
+      <w:hyperlink w:history="1" r:id="rIdlv9wyutrosxzccauwj7e-">
         <w:r>
           <w:t xml:space="preserve">arXiv:1910.14049</w:t>
         </w:r>
@@ -1699,7 +1732,7 @@
       <w:r>
         <w:t xml:space="preserve">, </w:t>
       </w:r>
-      <w:hyperlink w:history="1" r:id="rIdk5evjux4uwovoxr4vd1mg">
+      <w:hyperlink w:history="1" r:id="rIdob4ze8vnbntvfbbj-nt00">
         <w:r>
           <w:t xml:space="preserve">MNRAS 468, 1169–1182 (2017)</w:t>
         </w:r>
@@ -1707,7 +1740,7 @@
       <w:r>
         <w:t xml:space="preserve">, </w:t>
       </w:r>
-      <w:hyperlink w:history="1" r:id="rIdita07w7av47uah7o9kdbr">
+      <w:hyperlink w:history="1" r:id="rIdxtvx1r4pt6v3xpxswfxfk">
         <w:r>
           <w:t xml:space="preserve">arXiv:1612.06383</w:t>
         </w:r>
@@ -1744,7 +1777,7 @@
       <w:r>
         <w:t xml:space="preserve">, </w:t>
       </w:r>
-      <w:hyperlink w:history="1" r:id="rIdmmgxmfjvzfql8xrokjrz0">
+      <w:hyperlink w:history="1" r:id="rIdqqmp66pvjplruo137uyxf">
         <w:r>
           <w:t xml:space="preserve">MNRAS 438, 1856–1869 (2014)</w:t>
         </w:r>
@@ -1752,7 +1785,7 @@
       <w:r>
         <w:t xml:space="preserve">, </w:t>
       </w:r>
-      <w:hyperlink w:history="1" r:id="rIdhflbnedx_aa8dzj39mfj8">
+      <w:hyperlink w:history="1" r:id="rIdcgqkrbwclljrqumh6qj3v">
         <w:r>
           <w:t xml:space="preserve">arXiv:1310.5441</w:t>
         </w:r>
@@ -1789,7 +1822,7 @@
       <w:r>
         <w:t xml:space="preserve">, </w:t>
       </w:r>
-      <w:hyperlink w:history="1" r:id="rIdw12hn7coyumegicyl_kvg">
+      <w:hyperlink w:history="1" r:id="rIdk6yhdcsb8q9hv8z5qfytb">
         <w:r>
           <w:t xml:space="preserve">Phys. Rev. D 80, 084023 (2009)</w:t>
         </w:r>
@@ -1797,7 +1830,7 @@
       <w:r>
         <w:t xml:space="preserve">, </w:t>
       </w:r>
-      <w:hyperlink w:history="1" r:id="rIdercg6hxvcdgly5xesfmhq">
+      <w:hyperlink w:history="1" r:id="rIdc6i33vubp098y8emt0ou-">
         <w:r>
           <w:t xml:space="preserve">arXiv:1009.1250</w:t>
         </w:r>
@@ -1842,7 +1875,7 @@
       <w:r>
         <w:t xml:space="preserve">, </w:t>
       </w:r>
-      <w:hyperlink w:history="1" r:id="rIdjhi_5lydssgaxu7rgsjey">
+      <w:hyperlink w:history="1" r:id="rIdwgt6xt8tfcjgxtueljwit">
         <w:r>
           <w:t xml:space="preserve">Astron. Nachr. 342, 277–282 (2021)</w:t>
         </w:r>
@@ -1850,7 +1883,7 @@
       <w:r>
         <w:t xml:space="preserve">, 9th International Workshop on Astronomy and Relativistic Astrophysics, </w:t>
       </w:r>
-      <w:hyperlink w:history="1" r:id="rIdczrddt26xfmltivzlsjdi">
+      <w:hyperlink w:history="1" r:id="rIdyoufde0i4hv5zeuruddqy">
         <w:r>
           <w:t xml:space="preserve">arXiv:2011.13797</w:t>
         </w:r>
@@ -1887,7 +1920,7 @@
       <w:r>
         <w:t xml:space="preserve">, </w:t>
       </w:r>
-      <w:hyperlink w:history="1" r:id="rIdtmsyr9rnz4w6smqei1qv2">
+      <w:hyperlink w:history="1" r:id="rIduebzs3vymn-gwc0vz6peq">
         <w:r>
           <w:t xml:space="preserve">Astron. Nachr. 342, 147–152 (2021)</w:t>
         </w:r>
@@ -1895,7 +1928,7 @@
       <w:r>
         <w:t xml:space="preserve">, 9th International Workshop on Astronomy and Relativistic Astrophysics, </w:t>
       </w:r>
-      <w:hyperlink w:history="1" r:id="rIdbbefcxuipyis-rvtizdyb">
+      <w:hyperlink w:history="1" r:id="rIdknjzah8hhts84nhwcuf7c">
         <w:r>
           <w:t xml:space="preserve">arXiv:2011.13805</w:t>
         </w:r>
@@ -1932,7 +1965,7 @@
       <w:r>
         <w:t xml:space="preserve">, </w:t>
       </w:r>
-      <w:hyperlink w:history="1" r:id="rId20gssb_-qjfo4a2gxihr_">
+      <w:hyperlink w:history="1" r:id="rId0mciobtgofhaalwjtcx3g">
         <w:r>
           <w:t xml:space="preserve">PoS(SWIFT 10) 233, 159 (2014)</w:t>
         </w:r>
@@ -1940,7 +1973,7 @@
       <w:r>
         <w:t xml:space="preserve">, </w:t>
       </w:r>
-      <w:hyperlink w:history="1" r:id="rIdwt6b09j2bk9mh5uypdh00">
+      <w:hyperlink w:history="1" r:id="rIdmz2rg_xvjohcr5i9njynq">
         <w:r>
           <w:t xml:space="preserve">arXiv:1502.07882</w:t>
         </w:r>
@@ -1977,7 +2010,7 @@
       <w:r>
         <w:t xml:space="preserve">, </w:t>
       </w:r>
-      <w:hyperlink w:history="1" r:id="rIdzb2-3ib2mv7zljfvtyraw">
+      <w:hyperlink w:history="1" r:id="rIdeswm5mjdd9h-u9uj24zve">
         <w:r>
           <w:t xml:space="preserve">EPJ Web Conf. 61, 02007 (2013)</w:t>
         </w:r>
@@ -1985,7 +2018,7 @@
       <w:r>
         <w:t xml:space="preserve">, </w:t>
       </w:r>
-      <w:hyperlink w:history="1" r:id="rIdj1i0ewf5xqm3wqwyfqfxm">
+      <w:hyperlink w:history="1" r:id="rIdpdw91ew9qq-zq1hpbhnvt">
         <w:r>
           <w:t xml:space="preserve">arXiv:1309.4612</w:t>
         </w:r>
@@ -2022,7 +2055,7 @@
       <w:r>
         <w:t xml:space="preserve">, </w:t>
       </w:r>
-      <w:hyperlink w:history="1" r:id="rIdo5a46yativli4bxq5w6j1">
+      <w:hyperlink w:history="1" r:id="rIdy6v7-csh4-swraer14zak">
         <w:r>
           <w:t xml:space="preserve">J. Phys.: Conf. Ser. 454, 012001 (2013)</w:t>
         </w:r>
@@ -2030,7 +2063,7 @@
       <w:r>
         <w:t xml:space="preserve">, </w:t>
       </w:r>
-      <w:hyperlink w:history="1" r:id="rIdgb2ttc0luci-qtz1f8eg3">
+      <w:hyperlink w:history="1" r:id="rIddad4nxhqgrejkoybreni7">
         <w:r>
           <w:t xml:space="preserve">arXiv:1211.1794</w:t>
         </w:r>
@@ -2433,7 +2466,7 @@
       <w:r>
         <w:tab/>
       </w:r>
-      <w:hyperlink w:history="1" r:id="rIdf-8srpcr2p2cterij8voz">
+      <w:hyperlink w:history="1" r:id="rIdqtoymqxwukmlbxhgywujy">
         <w:r>
           <w:t xml:space="preserve">github.com/altjerue/ilwikak-ml</w:t>
         </w:r>
@@ -2524,7 +2557,7 @@
       <w:r>
         <w:tab/>
       </w:r>
-      <w:hyperlink w:history="1" r:id="rIddkxkkif6wlmfmpdvh2zhm">
+      <w:hyperlink w:history="1" r:id="rIdrwcjdpj3hcf_cmzmcvwvi">
         <w:r>
           <w:t xml:space="preserve">github.com/UW-ForestMycobiomeLab/WindSporesHills</w:t>
         </w:r>
@@ -2589,7 +2622,7 @@
       <w:r>
         <w:tab/>
       </w:r>
-      <w:hyperlink w:history="1" r:id="rIdpppz7wprywvhqnfuyvd-f">
+      <w:hyperlink w:history="1" r:id="rIdzr5qmtm-uhqq_qqseyetn">
         <w:r>
           <w:t xml:space="preserve">github.com/zkdavis/Tleco</w:t>
         </w:r>
@@ -2654,7 +2687,7 @@
       <w:r>
         <w:tab/>
       </w:r>
-      <w:hyperlink w:history="1" r:id="rIdd9rap3-vznfwdbg1qo0oj">
+      <w:hyperlink w:history="1" r:id="rIdh7fgyld_iv5hpc6lkcq7e">
         <w:r>
           <w:t xml:space="preserve">github.com/altjerue/paramo</w:t>
         </w:r>
@@ -3265,7 +3298,7 @@
       <w:r>
         <w:t xml:space="preserve">Video: </w:t>
       </w:r>
-      <w:hyperlink w:history="1" r:id="rIdm-ypibujr2lfhsnlrnt6l">
+      <w:hyperlink w:history="1" r:id="rIdzp6xqxpnzdq7prcqd1mmy">
         <w:r>
           <w:t xml:space="preserve">youtube.com/watch?v=BAZNWLNT69M</w:t>
         </w:r>
@@ -3436,7 +3469,7 @@
       <w:r>
         <w:t xml:space="preserve">Marcos Moshinsky Award for Best Poster. Video: </w:t>
       </w:r>
-      <w:hyperlink w:history="1" r:id="rIdkcdangqqyd23csyrkbdl6">
+      <w:hyperlink w:history="1" r:id="rIdaj5e36bztdrkfy5xmlwfd">
         <w:r>
           <w:t xml:space="preserve">youtube.com/watch?v=0TJiKg7kOPI</w:t>
         </w:r>
@@ -4494,7 +4527,7 @@
       <w:pPr>
         <w:spacing w:after="0"/>
       </w:pPr>
-      <w:hyperlink w:history="1" r:id="rIddzj6fw22z3qawsb8e-og2">
+      <w:hyperlink w:history="1" r:id="rId4j5i_1xusc3ooinhld-44">
         <w:r>
           <w:t xml:space="preserve">mexiciencia.github.io/post/anita</w:t>
         </w:r>
@@ -4554,7 +4587,7 @@
       <w:pPr>
         <w:spacing w:after="0"/>
       </w:pPr>
-      <w:hyperlink w:history="1" r:id="rIdzj5s3x5avaqryvimteirb">
+      <w:hyperlink w:history="1" r:id="rIdzp8e8n_twnx4bqfwmc5je">
         <w:r>
           <w:t xml:space="preserve">mexiciencia.github.io/post/modelo-sir</w:t>
         </w:r>
@@ -4617,7 +4650,7 @@
       <w:r>
         <w:t xml:space="preserve">Data analysis and modeling collaborator. </w:t>
       </w:r>
-      <w:hyperlink w:history="1" r:id="rIdb_qplwmvyn17lolayscg2">
+      <w:hyperlink w:history="1" r:id="rIdb8ywj1pouw0mslssxy8s1">
         <w:r>
           <w:t xml:space="preserve">mexiciencia.github.io/post/covid19</w:t>
         </w:r>

</xml_diff>

<commit_message>
Keep the CV's two-line entry layout instead of sub_inline
In the CV, Experience and Education go back to role/degree with dates
on the first line, and employer/institution with location on the
second. Only the resume uses sub_inline now. The CV's generated
sections are identical to before sub_inline; still 6 pages.

Co-Authored-By: Claude Opus 5.5 <noreply@anthropic.com>
</commit_message>
<xml_diff>
--- a/RuedaBecerrilJM-CV-plain.docx
+++ b/RuedaBecerrilJM-CV-plain.docx
@@ -28,7 +28,7 @@
       <w:r>
         <w:t xml:space="preserve">  |  </w:t>
       </w:r>
-      <w:hyperlink w:history="1" r:id="rIdqyxsbthvwizoxze8rphsi">
+      <w:hyperlink w:history="1" r:id="rId3fev5egxxv7irothvzcck">
         <w:r>
           <w:t xml:space="preserve">jm.ruebe@gmail.com</w:t>
         </w:r>
@@ -42,7 +42,7 @@
       <w:r>
         <w:t xml:space="preserve">  |  </w:t>
       </w:r>
-      <w:hyperlink w:history="1" r:id="rIdg-1yrtcrna-tphajf-fv8">
+      <w:hyperlink w:history="1" r:id="rId0n8bjiannoylisz_1crel">
         <w:r>
           <w:t xml:space="preserve">linkedin.com/in/jeruebe</w:t>
         </w:r>
@@ -53,7 +53,7 @@
         <w:spacing w:after="60"/>
         <w:jc w:val="center"/>
       </w:pPr>
-      <w:hyperlink w:history="1" r:id="rId2cypamsocwnix8zr3auhs">
+      <w:hyperlink w:history="1" r:id="rIdtzojq28fadkehmucglgjq">
         <w:r>
           <w:t xml:space="preserve">altjerue.github.io</w:t>
         </w:r>
@@ -61,7 +61,7 @@
       <w:r>
         <w:t xml:space="preserve">  |  </w:t>
       </w:r>
-      <w:hyperlink w:history="1" r:id="rId3939finfbgca_lznaawye">
+      <w:hyperlink w:history="1" r:id="rIdwl6xsbtrxq54-obmp_-08">
         <w:r>
           <w:t xml:space="preserve">github.com/altjerue</w:t>
         </w:r>
@@ -69,7 +69,7 @@
       <w:r>
         <w:t xml:space="preserve">  |  </w:t>
       </w:r>
-      <w:hyperlink w:history="1" r:id="rIdyewnplvwk1uaiuekhfxbm">
+      <w:hyperlink w:history="1" r:id="rIdr3gdn4ybj7g4jyijetnui">
         <w:r>
           <w:t xml:space="preserve">orcid.org/0000-0003-1988-1912</w:t>
         </w:r>
@@ -77,7 +77,7 @@
       <w:r>
         <w:t xml:space="preserve">  |  </w:t>
       </w:r>
-      <w:hyperlink w:history="1" r:id="rId6kionpdmwsr_xfqg5rhx0">
+      <w:hyperlink w:history="1" r:id="rId5mqdaooc3h-wdp-dgxcu2">
         <w:r>
           <w:t xml:space="preserve">Google Scholar</w:t>
         </w:r>
@@ -218,8 +218,20 @@
         <w:t xml:space="preserve">Independent Contractor</w:t>
       </w:r>
       <w:r>
-        <w:t xml:space="preserve">, </w:t>
-      </w:r>
+        <w:tab/>
+      </w:r>
+      <w:r>
+        <w:t xml:space="preserve">Jan 2026 – Present</w:t>
+      </w:r>
+    </w:p>
+    <w:p>
+      <w:pPr>
+        <w:keepNext/>
+        <w:tabs>
+          <w:tab w:val="right" w:pos="10512"/>
+        </w:tabs>
+        <w:spacing w:after="0"/>
+      </w:pPr>
       <w:r>
         <w:rPr>
           <w:i/>
@@ -227,21 +239,6 @@
         </w:rPr>
         <w:t xml:space="preserve">Mercor</w:t>
       </w:r>
-      <w:r>
-        <w:tab/>
-      </w:r>
-      <w:r>
-        <w:t xml:space="preserve">Jan 2026 – Present</w:t>
-      </w:r>
-    </w:p>
-    <w:p>
-      <w:pPr>
-        <w:keepNext/>
-        <w:tabs>
-          <w:tab w:val="right" w:pos="10512"/>
-        </w:tabs>
-        <w:spacing w:after="0"/>
-      </w:pPr>
       <w:r>
         <w:tab/>
       </w:r>
@@ -297,8 +294,20 @@
         <w:t xml:space="preserve">Spatial Data Scientist</w:t>
       </w:r>
       <w:r>
-        <w:t xml:space="preserve">, </w:t>
-      </w:r>
+        <w:tab/>
+      </w:r>
+      <w:r>
+        <w:t xml:space="preserve">May 2025 – Jan 2026</w:t>
+      </w:r>
+    </w:p>
+    <w:p>
+      <w:pPr>
+        <w:keepNext/>
+        <w:tabs>
+          <w:tab w:val="right" w:pos="10512"/>
+        </w:tabs>
+        <w:spacing w:after="0"/>
+      </w:pPr>
       <w:r>
         <w:rPr>
           <w:i/>
@@ -306,21 +315,6 @@
         </w:rPr>
         <w:t xml:space="preserve">TealWaters</w:t>
       </w:r>
-      <w:r>
-        <w:tab/>
-      </w:r>
-      <w:r>
-        <w:t xml:space="preserve">May 2025 – Jan 2026</w:t>
-      </w:r>
-    </w:p>
-    <w:p>
-      <w:pPr>
-        <w:keepNext/>
-        <w:tabs>
-          <w:tab w:val="right" w:pos="10512"/>
-        </w:tabs>
-        <w:spacing w:after="0"/>
-      </w:pPr>
       <w:r>
         <w:tab/>
       </w:r>
@@ -411,8 +405,20 @@
         <w:t xml:space="preserve">Independent Researcher &amp; Open-Source Developer</w:t>
       </w:r>
       <w:r>
-        <w:t xml:space="preserve">, </w:t>
-      </w:r>
+        <w:tab/>
+      </w:r>
+      <w:r>
+        <w:t xml:space="preserve">Jan 2024 – May 2025</w:t>
+      </w:r>
+    </w:p>
+    <w:p>
+      <w:pPr>
+        <w:keepNext/>
+        <w:tabs>
+          <w:tab w:val="right" w:pos="10512"/>
+        </w:tabs>
+        <w:spacing w:after="0"/>
+      </w:pPr>
       <w:r>
         <w:rPr>
           <w:i/>
@@ -420,21 +426,6 @@
         </w:rPr>
         <w:t xml:space="preserve">Self-directed</w:t>
       </w:r>
-      <w:r>
-        <w:tab/>
-      </w:r>
-      <w:r>
-        <w:t xml:space="preserve">Jan 2024 – May 2025</w:t>
-      </w:r>
-    </w:p>
-    <w:p>
-      <w:pPr>
-        <w:keepNext/>
-        <w:tabs>
-          <w:tab w:val="right" w:pos="10512"/>
-        </w:tabs>
-        <w:spacing w:after="0"/>
-      </w:pPr>
       <w:r>
         <w:tab/>
       </w:r>
@@ -512,8 +503,20 @@
         <w:t xml:space="preserve">Software Engineer</w:t>
       </w:r>
       <w:r>
-        <w:t xml:space="preserve">, </w:t>
-      </w:r>
+        <w:tab/>
+      </w:r>
+      <w:r>
+        <w:t xml:space="preserve">Apr 2022 – Jan 2024</w:t>
+      </w:r>
+    </w:p>
+    <w:p>
+      <w:pPr>
+        <w:keepNext/>
+        <w:tabs>
+          <w:tab w:val="right" w:pos="10512"/>
+        </w:tabs>
+        <w:spacing w:after="0"/>
+      </w:pPr>
       <w:r>
         <w:rPr>
           <w:i/>
@@ -521,21 +524,6 @@
         </w:rPr>
         <w:t xml:space="preserve">Paychex</w:t>
       </w:r>
-      <w:r>
-        <w:tab/>
-      </w:r>
-      <w:r>
-        <w:t xml:space="preserve">Apr 2022 – Jan 2024</w:t>
-      </w:r>
-    </w:p>
-    <w:p>
-      <w:pPr>
-        <w:keepNext/>
-        <w:tabs>
-          <w:tab w:val="right" w:pos="10512"/>
-        </w:tabs>
-        <w:spacing w:after="0"/>
-      </w:pPr>
       <w:r>
         <w:tab/>
       </w:r>
@@ -613,8 +601,20 @@
         <w:t xml:space="preserve">Postdoctoral Research Associate</w:t>
       </w:r>
       <w:r>
-        <w:t xml:space="preserve">, </w:t>
-      </w:r>
+        <w:tab/>
+      </w:r>
+      <w:r>
+        <w:t xml:space="preserve">Feb 2021 – Apr 2022</w:t>
+      </w:r>
+    </w:p>
+    <w:p>
+      <w:pPr>
+        <w:keepNext/>
+        <w:tabs>
+          <w:tab w:val="right" w:pos="10512"/>
+        </w:tabs>
+        <w:spacing w:after="0"/>
+      </w:pPr>
       <w:r>
         <w:rPr>
           <w:i/>
@@ -622,21 +622,6 @@
         </w:rPr>
         <w:t xml:space="preserve">Rochester Institute of Technology</w:t>
       </w:r>
-      <w:r>
-        <w:tab/>
-      </w:r>
-      <w:r>
-        <w:t xml:space="preserve">Feb 2021 – Apr 2022</w:t>
-      </w:r>
-    </w:p>
-    <w:p>
-      <w:pPr>
-        <w:keepNext/>
-        <w:tabs>
-          <w:tab w:val="right" w:pos="10512"/>
-        </w:tabs>
-        <w:spacing w:after="0"/>
-      </w:pPr>
       <w:r>
         <w:tab/>
       </w:r>
@@ -740,8 +725,20 @@
         <w:t xml:space="preserve">Postdoctoral Research Fellow</w:t>
       </w:r>
       <w:r>
-        <w:t xml:space="preserve">, </w:t>
-      </w:r>
+        <w:tab/>
+      </w:r>
+      <w:r>
+        <w:t xml:space="preserve">Oct 2018 – Nov 2020</w:t>
+      </w:r>
+    </w:p>
+    <w:p>
+      <w:pPr>
+        <w:keepNext/>
+        <w:tabs>
+          <w:tab w:val="right" w:pos="10512"/>
+        </w:tabs>
+        <w:spacing w:after="0"/>
+      </w:pPr>
       <w:r>
         <w:rPr>
           <w:i/>
@@ -749,21 +746,6 @@
         </w:rPr>
         <w:t xml:space="preserve">Purdue University</w:t>
       </w:r>
-      <w:r>
-        <w:tab/>
-      </w:r>
-      <w:r>
-        <w:t xml:space="preserve">Oct 2018 – Nov 2020</w:t>
-      </w:r>
-    </w:p>
-    <w:p>
-      <w:pPr>
-        <w:keepNext/>
-        <w:tabs>
-          <w:tab w:val="right" w:pos="10512"/>
-        </w:tabs>
-        <w:spacing w:after="0"/>
-      </w:pPr>
       <w:r>
         <w:tab/>
       </w:r>
@@ -880,8 +862,20 @@
         <w:t xml:space="preserve">Postdoctoral Research Fellow</w:t>
       </w:r>
       <w:r>
-        <w:t xml:space="preserve">, </w:t>
-      </w:r>
+        <w:tab/>
+      </w:r>
+      <w:r>
+        <w:t xml:space="preserve">Jan 2018 – Sep 2018</w:t>
+      </w:r>
+    </w:p>
+    <w:p>
+      <w:pPr>
+        <w:keepNext/>
+        <w:tabs>
+          <w:tab w:val="right" w:pos="10512"/>
+        </w:tabs>
+        <w:spacing w:after="0"/>
+      </w:pPr>
       <w:r>
         <w:rPr>
           <w:i/>
@@ -889,21 +883,6 @@
         </w:rPr>
         <w:t xml:space="preserve">Universidad Michoacana de San Nicolás de Hidalgo</w:t>
       </w:r>
-      <w:r>
-        <w:tab/>
-      </w:r>
-      <w:r>
-        <w:t xml:space="preserve">Jan 2018 – Sep 2018</w:t>
-      </w:r>
-    </w:p>
-    <w:p>
-      <w:pPr>
-        <w:keepNext/>
-        <w:tabs>
-          <w:tab w:val="right" w:pos="10512"/>
-        </w:tabs>
-        <w:spacing w:after="0"/>
-      </w:pPr>
       <w:r>
         <w:tab/>
       </w:r>
@@ -972,8 +951,20 @@
         <w:t xml:space="preserve">Graduate Research Assistant</w:t>
       </w:r>
       <w:r>
-        <w:t xml:space="preserve">, </w:t>
-      </w:r>
+        <w:tab/>
+      </w:r>
+      <w:r>
+        <w:t xml:space="preserve">Oct 2011 – Jul 2017</w:t>
+      </w:r>
+    </w:p>
+    <w:p>
+      <w:pPr>
+        <w:keepNext/>
+        <w:tabs>
+          <w:tab w:val="right" w:pos="10512"/>
+        </w:tabs>
+        <w:spacing w:after="0"/>
+      </w:pPr>
       <w:r>
         <w:rPr>
           <w:i/>
@@ -981,21 +972,6 @@
         </w:rPr>
         <w:t xml:space="preserve">Universitat de València</w:t>
       </w:r>
-      <w:r>
-        <w:tab/>
-      </w:r>
-      <w:r>
-        <w:t xml:space="preserve">Oct 2011 – Jul 2017</w:t>
-      </w:r>
-    </w:p>
-    <w:p>
-      <w:pPr>
-        <w:keepNext/>
-        <w:tabs>
-          <w:tab w:val="right" w:pos="10512"/>
-        </w:tabs>
-        <w:spacing w:after="0"/>
-      </w:pPr>
       <w:r>
         <w:tab/>
       </w:r>
@@ -1098,8 +1074,20 @@
         <w:t xml:space="preserve">Ph.D. in Physics</w:t>
       </w:r>
       <w:r>
-        <w:t xml:space="preserve">, </w:t>
-      </w:r>
+        <w:tab/>
+      </w:r>
+      <w:r>
+        <w:t xml:space="preserve">Oct 2011 – Jul 2017</w:t>
+      </w:r>
+    </w:p>
+    <w:p>
+      <w:pPr>
+        <w:keepNext/>
+        <w:tabs>
+          <w:tab w:val="right" w:pos="10512"/>
+        </w:tabs>
+        <w:spacing w:after="0"/>
+      </w:pPr>
       <w:r>
         <w:rPr>
           <w:i/>
@@ -1111,21 +1099,6 @@
         <w:tab/>
       </w:r>
       <w:r>
-        <w:t xml:space="preserve">Oct 2011 – Jul 2017</w:t>
-      </w:r>
-    </w:p>
-    <w:p>
-      <w:pPr>
-        <w:keepNext/>
-        <w:tabs>
-          <w:tab w:val="right" w:pos="10512"/>
-        </w:tabs>
-        <w:spacing w:after="0"/>
-      </w:pPr>
-      <w:r>
-        <w:tab/>
-      </w:r>
-      <w:r>
         <w:t xml:space="preserve">Valencia, Spain</w:t>
       </w:r>
     </w:p>
@@ -1159,7 +1132,7 @@
       <w:r>
         <w:t xml:space="preserve">Thesis: </w:t>
       </w:r>
-      <w:hyperlink w:history="1" r:id="rId_by1azbg54c8sjzwyxbne">
+      <w:hyperlink w:history="1" r:id="rIdaxl7wgrf9ofkgexrctszu">
         <w:r>
           <w:t xml:space="preserve">Numerical treatment of radiation processes in the internal shocks of magnetized relativistic outflows</w:t>
         </w:r>
@@ -1187,8 +1160,20 @@
         <w:t xml:space="preserve">M.Sc. in Physics</w:t>
       </w:r>
       <w:r>
-        <w:t xml:space="preserve">, </w:t>
-      </w:r>
+        <w:tab/>
+      </w:r>
+      <w:r>
+        <w:t xml:space="preserve">Aug 2009 – Sep 2011</w:t>
+      </w:r>
+    </w:p>
+    <w:p>
+      <w:pPr>
+        <w:keepNext/>
+        <w:tabs>
+          <w:tab w:val="right" w:pos="10512"/>
+        </w:tabs>
+        <w:spacing w:after="0"/>
+      </w:pPr>
       <w:r>
         <w:rPr>
           <w:i/>
@@ -1200,21 +1185,6 @@
         <w:tab/>
       </w:r>
       <w:r>
-        <w:t xml:space="preserve">Aug 2009 – Sep 2011</w:t>
-      </w:r>
-    </w:p>
-    <w:p>
-      <w:pPr>
-        <w:keepNext/>
-        <w:tabs>
-          <w:tab w:val="right" w:pos="10512"/>
-        </w:tabs>
-        <w:spacing w:after="0"/>
-      </w:pPr>
-      <w:r>
-        <w:tab/>
-      </w:r>
-      <w:r>
         <w:t xml:space="preserve">Morelia, Mexico</w:t>
       </w:r>
     </w:p>
@@ -1263,8 +1233,20 @@
         <w:t xml:space="preserve">B.Sc. in Physics</w:t>
       </w:r>
       <w:r>
-        <w:t xml:space="preserve">, </w:t>
-      </w:r>
+        <w:tab/>
+      </w:r>
+      <w:r>
+        <w:t xml:space="preserve">Aug 2004 – Dec 2008</w:t>
+      </w:r>
+    </w:p>
+    <w:p>
+      <w:pPr>
+        <w:keepNext/>
+        <w:tabs>
+          <w:tab w:val="right" w:pos="10512"/>
+        </w:tabs>
+        <w:spacing w:after="0"/>
+      </w:pPr>
       <w:r>
         <w:rPr>
           <w:i/>
@@ -1272,21 +1254,6 @@
         </w:rPr>
         <w:t xml:space="preserve">Universidad Autónoma del Estado de México</w:t>
       </w:r>
-      <w:r>
-        <w:tab/>
-      </w:r>
-      <w:r>
-        <w:t xml:space="preserve">Aug 2004 – Dec 2008</w:t>
-      </w:r>
-    </w:p>
-    <w:p>
-      <w:pPr>
-        <w:keepNext/>
-        <w:tabs>
-          <w:tab w:val="right" w:pos="10512"/>
-        </w:tabs>
-        <w:spacing w:after="0"/>
-      </w:pPr>
       <w:r>
         <w:tab/>
       </w:r>
@@ -1462,7 +1429,7 @@
       <w:r>
         <w:t xml:space="preserve">, </w:t>
       </w:r>
-      <w:hyperlink w:history="1" r:id="rIdjsezfwqmky8efi_icukos">
+      <w:hyperlink w:history="1" r:id="rIdnclehpp9jwubcw6gcszw-">
         <w:r>
           <w:t xml:space="preserve">ApJ 976, 182 (2024)</w:t>
         </w:r>
@@ -1470,7 +1437,7 @@
       <w:r>
         <w:t xml:space="preserve">, </w:t>
       </w:r>
-      <w:hyperlink w:history="1" r:id="rIdb9zym-lvo-podf6bbkhwi">
+      <w:hyperlink w:history="1" r:id="rIdeq8qz_mp5wttrunzotnfr">
         <w:r>
           <w:t xml:space="preserve">arXiv:2405.17581</w:t>
         </w:r>
@@ -1507,7 +1474,7 @@
       <w:r>
         <w:t xml:space="preserve">, </w:t>
       </w:r>
-      <w:hyperlink w:history="1" r:id="rIdguhreusfe30eqgeb9c48n">
+      <w:hyperlink w:history="1" r:id="rId6qsvnlr98dcwvyzyd91q5">
         <w:r>
           <w:t xml:space="preserve">MNRAS 513, 5766–5779 (2022)</w:t>
         </w:r>
@@ -1515,7 +1482,7 @@
       <w:r>
         <w:t xml:space="preserve">, </w:t>
       </w:r>
-      <w:hyperlink w:history="1" r:id="rIdnt4b5hsc94qzygwnsomuo">
+      <w:hyperlink w:history="1" r:id="rIdmwkgvrz9ic-bqvrxyj7j-">
         <w:r>
           <w:t xml:space="preserve">arXiv:2201.07790</w:t>
         </w:r>
@@ -1552,7 +1519,7 @@
       <w:r>
         <w:t xml:space="preserve">, </w:t>
       </w:r>
-      <w:hyperlink w:history="1" r:id="rIdrxmznlfl_qkghsa2w70hm">
+      <w:hyperlink w:history="1" r:id="rIdkp5s7cpg9qj3c9xbbvgoa">
         <w:r>
           <w:t xml:space="preserve">Phys. Rev. D 106, 083015 (2022)</w:t>
         </w:r>
@@ -1560,7 +1527,7 @@
       <w:r>
         <w:t xml:space="preserve">, </w:t>
       </w:r>
-      <w:hyperlink w:history="1" r:id="rIdqxwzwd5h_qlmz_-bvcrdc">
+      <w:hyperlink w:history="1" r:id="rIdnhmueuerfczgumkn1qo2x">
         <w:r>
           <w:t xml:space="preserve">arXiv:2112.09817</w:t>
         </w:r>
@@ -1597,7 +1564,7 @@
       <w:r>
         <w:t xml:space="preserve">, </w:t>
       </w:r>
-      <w:hyperlink w:history="1" r:id="rIderory2lv1afl5ul-s2rf5">
+      <w:hyperlink w:history="1" r:id="rIdnzrydhki2t-oas6cuupvb">
         <w:r>
           <w:t xml:space="preserve">ApJ 919, 95 (2021)</w:t>
         </w:r>
@@ -1605,7 +1572,7 @@
       <w:r>
         <w:t xml:space="preserve">, </w:t>
       </w:r>
-      <w:hyperlink w:history="1" r:id="rIdxpmcoupb7fscmpvj7aafv">
+      <w:hyperlink w:history="1" r:id="rIder8o0hqnmkl2ervjk4jvm">
         <w:r>
           <w:t xml:space="preserve">arXiv:2106.05356</w:t>
         </w:r>
@@ -1642,7 +1609,7 @@
       <w:r>
         <w:t xml:space="preserve">, </w:t>
       </w:r>
-      <w:hyperlink w:history="1" r:id="rIdljuc4x1g9-ikvdkcpj7md">
+      <w:hyperlink w:history="1" r:id="rIdevv7ospmybquvfc9rv598">
         <w:r>
           <w:t xml:space="preserve">MNRAS 501, 4092–4102 (2021)</w:t>
         </w:r>
@@ -1650,7 +1617,7 @@
       <w:r>
         <w:t xml:space="preserve">, </w:t>
       </w:r>
-      <w:hyperlink w:history="1" r:id="rIdvxbzvlewqzyyi2vcvikav">
+      <w:hyperlink w:history="1" r:id="rIdnidnrofa5apqkecc42nmz">
         <w:r>
           <w:t xml:space="preserve">arXiv:2009.02273</w:t>
         </w:r>
@@ -1687,7 +1654,7 @@
       <w:r>
         <w:t xml:space="preserve">, </w:t>
       </w:r>
-      <w:hyperlink w:history="1" r:id="rIdt5ay4yotfxaya-wjsljnl">
+      <w:hyperlink w:history="1" r:id="rIdksgacirbtkkz4o7l8orrp">
         <w:r>
           <w:t xml:space="preserve">MNRAS 496, 974–986 (2020)</w:t>
         </w:r>
@@ -1695,7 +1662,7 @@
       <w:r>
         <w:t xml:space="preserve">, </w:t>
       </w:r>
-      <w:hyperlink w:history="1" r:id="rIdlv9wyutrosxzccauwj7e-">
+      <w:hyperlink w:history="1" r:id="rId4xu27-4uaqvxg5x6cmhqq">
         <w:r>
           <w:t xml:space="preserve">arXiv:1910.14049</w:t>
         </w:r>
@@ -1732,7 +1699,7 @@
       <w:r>
         <w:t xml:space="preserve">, </w:t>
       </w:r>
-      <w:hyperlink w:history="1" r:id="rIdob4ze8vnbntvfbbj-nt00">
+      <w:hyperlink w:history="1" r:id="rIdsfwo78d_4fb4-drvacevc">
         <w:r>
           <w:t xml:space="preserve">MNRAS 468, 1169–1182 (2017)</w:t>
         </w:r>
@@ -1740,7 +1707,7 @@
       <w:r>
         <w:t xml:space="preserve">, </w:t>
       </w:r>
-      <w:hyperlink w:history="1" r:id="rIdxtvx1r4pt6v3xpxswfxfk">
+      <w:hyperlink w:history="1" r:id="rIdp2wd_ut6x3gz0fuq7mqxj">
         <w:r>
           <w:t xml:space="preserve">arXiv:1612.06383</w:t>
         </w:r>
@@ -1777,7 +1744,7 @@
       <w:r>
         <w:t xml:space="preserve">, </w:t>
       </w:r>
-      <w:hyperlink w:history="1" r:id="rIdqqmp66pvjplruo137uyxf">
+      <w:hyperlink w:history="1" r:id="rId-srk3n65lwpajva56cjyg">
         <w:r>
           <w:t xml:space="preserve">MNRAS 438, 1856–1869 (2014)</w:t>
         </w:r>
@@ -1785,7 +1752,7 @@
       <w:r>
         <w:t xml:space="preserve">, </w:t>
       </w:r>
-      <w:hyperlink w:history="1" r:id="rIdcgqkrbwclljrqumh6qj3v">
+      <w:hyperlink w:history="1" r:id="rId4qkzkt6ywouawatmq8ws8">
         <w:r>
           <w:t xml:space="preserve">arXiv:1310.5441</w:t>
         </w:r>
@@ -1822,7 +1789,7 @@
       <w:r>
         <w:t xml:space="preserve">, </w:t>
       </w:r>
-      <w:hyperlink w:history="1" r:id="rIdk6yhdcsb8q9hv8z5qfytb">
+      <w:hyperlink w:history="1" r:id="rIdvr_veqes9ahn1a9rsj4aa">
         <w:r>
           <w:t xml:space="preserve">Phys. Rev. D 80, 084023 (2009)</w:t>
         </w:r>
@@ -1830,7 +1797,7 @@
       <w:r>
         <w:t xml:space="preserve">, </w:t>
       </w:r>
-      <w:hyperlink w:history="1" r:id="rIdc6i33vubp098y8emt0ou-">
+      <w:hyperlink w:history="1" r:id="rIdd7fhjdncntjaxvbjnifw3">
         <w:r>
           <w:t xml:space="preserve">arXiv:1009.1250</w:t>
         </w:r>
@@ -1875,7 +1842,7 @@
       <w:r>
         <w:t xml:space="preserve">, </w:t>
       </w:r>
-      <w:hyperlink w:history="1" r:id="rIdwgt6xt8tfcjgxtueljwit">
+      <w:hyperlink w:history="1" r:id="rId3_fjmaz7xrj5h2ae-eddd">
         <w:r>
           <w:t xml:space="preserve">Astron. Nachr. 342, 277–282 (2021)</w:t>
         </w:r>
@@ -1883,7 +1850,7 @@
       <w:r>
         <w:t xml:space="preserve">, 9th International Workshop on Astronomy and Relativistic Astrophysics, </w:t>
       </w:r>
-      <w:hyperlink w:history="1" r:id="rIdyoufde0i4hv5zeuruddqy">
+      <w:hyperlink w:history="1" r:id="rIdmauhg5ktldmzbvu4l7dns">
         <w:r>
           <w:t xml:space="preserve">arXiv:2011.13797</w:t>
         </w:r>
@@ -1920,7 +1887,7 @@
       <w:r>
         <w:t xml:space="preserve">, </w:t>
       </w:r>
-      <w:hyperlink w:history="1" r:id="rIduebzs3vymn-gwc0vz6peq">
+      <w:hyperlink w:history="1" r:id="rIdyguxggdsbanlkh0rm76gn">
         <w:r>
           <w:t xml:space="preserve">Astron. Nachr. 342, 147–152 (2021)</w:t>
         </w:r>
@@ -1928,7 +1895,7 @@
       <w:r>
         <w:t xml:space="preserve">, 9th International Workshop on Astronomy and Relativistic Astrophysics, </w:t>
       </w:r>
-      <w:hyperlink w:history="1" r:id="rIdknjzah8hhts84nhwcuf7c">
+      <w:hyperlink w:history="1" r:id="rIdv1la4a377xnyrbkpbk150">
         <w:r>
           <w:t xml:space="preserve">arXiv:2011.13805</w:t>
         </w:r>
@@ -1965,7 +1932,7 @@
       <w:r>
         <w:t xml:space="preserve">, </w:t>
       </w:r>
-      <w:hyperlink w:history="1" r:id="rId0mciobtgofhaalwjtcx3g">
+      <w:hyperlink w:history="1" r:id="rIdvtekkfnn_dgppyyxabbff">
         <w:r>
           <w:t xml:space="preserve">PoS(SWIFT 10) 233, 159 (2014)</w:t>
         </w:r>
@@ -1973,7 +1940,7 @@
       <w:r>
         <w:t xml:space="preserve">, </w:t>
       </w:r>
-      <w:hyperlink w:history="1" r:id="rIdmz2rg_xvjohcr5i9njynq">
+      <w:hyperlink w:history="1" r:id="rIdgcwg8zrfcrbkzvkais5op">
         <w:r>
           <w:t xml:space="preserve">arXiv:1502.07882</w:t>
         </w:r>
@@ -2010,7 +1977,7 @@
       <w:r>
         <w:t xml:space="preserve">, </w:t>
       </w:r>
-      <w:hyperlink w:history="1" r:id="rIdeswm5mjdd9h-u9uj24zve">
+      <w:hyperlink w:history="1" r:id="rIdr81cznsdplrpinurezk9j">
         <w:r>
           <w:t xml:space="preserve">EPJ Web Conf. 61, 02007 (2013)</w:t>
         </w:r>
@@ -2018,7 +1985,7 @@
       <w:r>
         <w:t xml:space="preserve">, </w:t>
       </w:r>
-      <w:hyperlink w:history="1" r:id="rIdpdw91ew9qq-zq1hpbhnvt">
+      <w:hyperlink w:history="1" r:id="rIdcfydcfnz9etdak1qrxdyh">
         <w:r>
           <w:t xml:space="preserve">arXiv:1309.4612</w:t>
         </w:r>
@@ -2055,7 +2022,7 @@
       <w:r>
         <w:t xml:space="preserve">, </w:t>
       </w:r>
-      <w:hyperlink w:history="1" r:id="rIdy6v7-csh4-swraer14zak">
+      <w:hyperlink w:history="1" r:id="rIdrft46glsowiw_4tp2bsv6">
         <w:r>
           <w:t xml:space="preserve">J. Phys.: Conf. Ser. 454, 012001 (2013)</w:t>
         </w:r>
@@ -2063,7 +2030,7 @@
       <w:r>
         <w:t xml:space="preserve">, </w:t>
       </w:r>
-      <w:hyperlink w:history="1" r:id="rIddad4nxhqgrejkoybreni7">
+      <w:hyperlink w:history="1" r:id="rId2l7yf3c4bpzreciapl1zz">
         <w:r>
           <w:t xml:space="preserve">arXiv:1211.1794</w:t>
         </w:r>
@@ -2466,7 +2433,7 @@
       <w:r>
         <w:tab/>
       </w:r>
-      <w:hyperlink w:history="1" r:id="rIdqtoymqxwukmlbxhgywujy">
+      <w:hyperlink w:history="1" r:id="rIdgjkezf_vjkxpyhis7xm3e">
         <w:r>
           <w:t xml:space="preserve">github.com/altjerue/ilwikak-ml</w:t>
         </w:r>
@@ -2557,7 +2524,7 @@
       <w:r>
         <w:tab/>
       </w:r>
-      <w:hyperlink w:history="1" r:id="rIdrwcjdpj3hcf_cmzmcvwvi">
+      <w:hyperlink w:history="1" r:id="rIdxmq4qzp3kw5fu_su6z0ng">
         <w:r>
           <w:t xml:space="preserve">github.com/UW-ForestMycobiomeLab/WindSporesHills</w:t>
         </w:r>
@@ -2622,7 +2589,7 @@
       <w:r>
         <w:tab/>
       </w:r>
-      <w:hyperlink w:history="1" r:id="rIdzr5qmtm-uhqq_qqseyetn">
+      <w:hyperlink w:history="1" r:id="rId0wcb2tnupczdbaqrjgaei">
         <w:r>
           <w:t xml:space="preserve">github.com/zkdavis/Tleco</w:t>
         </w:r>
@@ -2687,7 +2654,7 @@
       <w:r>
         <w:tab/>
       </w:r>
-      <w:hyperlink w:history="1" r:id="rIdh7fgyld_iv5hpc6lkcq7e">
+      <w:hyperlink w:history="1" r:id="rIdu3pwewacg6xldvt-o-jhy">
         <w:r>
           <w:t xml:space="preserve">github.com/altjerue/paramo</w:t>
         </w:r>
@@ -3298,7 +3265,7 @@
       <w:r>
         <w:t xml:space="preserve">Video: </w:t>
       </w:r>
-      <w:hyperlink w:history="1" r:id="rIdzp6xqxpnzdq7prcqd1mmy">
+      <w:hyperlink w:history="1" r:id="rIdch1awv4jiwdnudhvfncu8">
         <w:r>
           <w:t xml:space="preserve">youtube.com/watch?v=BAZNWLNT69M</w:t>
         </w:r>
@@ -3469,7 +3436,7 @@
       <w:r>
         <w:t xml:space="preserve">Marcos Moshinsky Award for Best Poster. Video: </w:t>
       </w:r>
-      <w:hyperlink w:history="1" r:id="rIdaj5e36bztdrkfy5xmlwfd">
+      <w:hyperlink w:history="1" r:id="rIdljyg7h3dgjrjtk9njdf38">
         <w:r>
           <w:t xml:space="preserve">youtube.com/watch?v=0TJiKg7kOPI</w:t>
         </w:r>
@@ -4527,7 +4494,7 @@
       <w:pPr>
         <w:spacing w:after="0"/>
       </w:pPr>
-      <w:hyperlink w:history="1" r:id="rId4j5i_1xusc3ooinhld-44">
+      <w:hyperlink w:history="1" r:id="rIdezhynxsebw2hgf59nrdk4">
         <w:r>
           <w:t xml:space="preserve">mexiciencia.github.io/post/anita</w:t>
         </w:r>
@@ -4587,7 +4554,7 @@
       <w:pPr>
         <w:spacing w:after="0"/>
       </w:pPr>
-      <w:hyperlink w:history="1" r:id="rIdzp8e8n_twnx4bqfwmc5je">
+      <w:hyperlink w:history="1" r:id="rIdb0du8vwmrkobyxgcap2hd">
         <w:r>
           <w:t xml:space="preserve">mexiciencia.github.io/post/modelo-sir</w:t>
         </w:r>
@@ -4650,7 +4617,7 @@
       <w:r>
         <w:t xml:space="preserve">Data analysis and modeling collaborator. </w:t>
       </w:r>
-      <w:hyperlink w:history="1" r:id="rIdb8ywj1pouw0mslssxy8s1">
+      <w:hyperlink w:history="1" r:id="rIdjwvxuolivn-dfu4_1z6nz">
         <w:r>
           <w:t xml:space="preserve">mexiciencia.github.io/post/covid19</w:t>
         </w:r>

</xml_diff>

<commit_message>
Add a page_break entry option; start the resume's page 2 at the Purdue postdoc
Co-Authored-By: Claude Sonnet 5.5 <noreply@anthropic.com>
</commit_message>
<xml_diff>
--- a/RuedaBecerrilJM-CV-plain.docx
+++ b/RuedaBecerrilJM-CV-plain.docx
@@ -28,7 +28,7 @@
       <w:r>
         <w:t xml:space="preserve">  |  </w:t>
       </w:r>
-      <w:hyperlink w:history="1" r:id="rIdehq10acjcta0l7oargg4t">
+      <w:hyperlink w:history="1" r:id="rIdb9t0gpdfs6e6b2vnvrhl7">
         <w:r>
           <w:t xml:space="preserve">jm.ruebe@gmail.com</w:t>
         </w:r>
@@ -42,7 +42,7 @@
       <w:r>
         <w:t xml:space="preserve">  |  </w:t>
       </w:r>
-      <w:hyperlink w:history="1" r:id="rIdzcigigchdh9jgwevwhbrf">
+      <w:hyperlink w:history="1" r:id="rIds55z1ze8me7esa5sztwob">
         <w:r>
           <w:t xml:space="preserve">linkedin.com/in/jeruebe</w:t>
         </w:r>
@@ -53,7 +53,7 @@
         <w:spacing w:after="60"/>
         <w:jc w:val="center"/>
       </w:pPr>
-      <w:hyperlink w:history="1" r:id="rId-jkzq7dxwagx12r9h8zsu">
+      <w:hyperlink w:history="1" r:id="rId8awlvspdrgzy821pvzums">
         <w:r>
           <w:t xml:space="preserve">altjerue.github.io</w:t>
         </w:r>
@@ -61,7 +61,7 @@
       <w:r>
         <w:t xml:space="preserve">  |  </w:t>
       </w:r>
-      <w:hyperlink w:history="1" r:id="rIdtdcfkdapxbwjxf785hcyy">
+      <w:hyperlink w:history="1" r:id="rIdg4esv1dyitg5iqb5anrts">
         <w:r>
           <w:t xml:space="preserve">github.com/altjerue</w:t>
         </w:r>
@@ -69,7 +69,7 @@
       <w:r>
         <w:t xml:space="preserve">  |  </w:t>
       </w:r>
-      <w:hyperlink w:history="1" r:id="rIdf2fy4jgs1wyugbnebvuro">
+      <w:hyperlink w:history="1" r:id="rIddujcwuvsvxm9dwhuguk6x">
         <w:r>
           <w:t xml:space="preserve">orcid.org/0000-0003-1988-1912</w:t>
         </w:r>
@@ -77,7 +77,7 @@
       <w:r>
         <w:t xml:space="preserve">  |  </w:t>
       </w:r>
-      <w:hyperlink w:history="1" r:id="rIdfciifqvco9tt4hfx3upc1">
+      <w:hyperlink w:history="1" r:id="rIddhg1dbiswxm7q_s-h-fl9">
         <w:r>
           <w:t xml:space="preserve">Google Scholar</w:t>
         </w:r>
@@ -1132,7 +1132,7 @@
       <w:r>
         <w:t xml:space="preserve">Thesis: </w:t>
       </w:r>
-      <w:hyperlink w:history="1" r:id="rIdlevcgebixxcqsb5bfoyoy">
+      <w:hyperlink w:history="1" r:id="rIdlj2hzrwoa6uag_zfw_zyp">
         <w:r>
           <w:t xml:space="preserve">Numerical treatment of radiation processes in the internal shocks of magnetized relativistic outflows</w:t>
         </w:r>
@@ -1429,7 +1429,7 @@
       <w:r>
         <w:t xml:space="preserve">, </w:t>
       </w:r>
-      <w:hyperlink w:history="1" r:id="rIdixzpovdd3ybzaulnbzj08">
+      <w:hyperlink w:history="1" r:id="rIdlzdzowm3sgiwju-llo-ds">
         <w:r>
           <w:t xml:space="preserve">ApJ 976, 182 (2024)</w:t>
         </w:r>
@@ -1437,7 +1437,7 @@
       <w:r>
         <w:t xml:space="preserve">, </w:t>
       </w:r>
-      <w:hyperlink w:history="1" r:id="rIdzwv34vs2jbd8wtu0qpcpw">
+      <w:hyperlink w:history="1" r:id="rIdmgcuuhsfyyxcmfwch6pcz">
         <w:r>
           <w:t xml:space="preserve">arXiv:2405.17581</w:t>
         </w:r>
@@ -1474,7 +1474,7 @@
       <w:r>
         <w:t xml:space="preserve">, </w:t>
       </w:r>
-      <w:hyperlink w:history="1" r:id="rId1qhtdmnydzbwptjf8q8-2">
+      <w:hyperlink w:history="1" r:id="rIdcwaa2ejryp1hnhisrxy3i">
         <w:r>
           <w:t xml:space="preserve">MNRAS 513, 5766–5779 (2022)</w:t>
         </w:r>
@@ -1482,7 +1482,7 @@
       <w:r>
         <w:t xml:space="preserve">, </w:t>
       </w:r>
-      <w:hyperlink w:history="1" r:id="rIdt_xum_gad9yy2ynzviquw">
+      <w:hyperlink w:history="1" r:id="rIdplgz-zc_chfxxkjidxzv2">
         <w:r>
           <w:t xml:space="preserve">arXiv:2201.07790</w:t>
         </w:r>
@@ -1519,7 +1519,7 @@
       <w:r>
         <w:t xml:space="preserve">, </w:t>
       </w:r>
-      <w:hyperlink w:history="1" r:id="rIdlkqlsnzh9drduqk2u8n0f">
+      <w:hyperlink w:history="1" r:id="rIdvfeuuuxpjuyekfdd5ixqx">
         <w:r>
           <w:t xml:space="preserve">Phys. Rev. D 106, 083015 (2022)</w:t>
         </w:r>
@@ -1527,7 +1527,7 @@
       <w:r>
         <w:t xml:space="preserve">, </w:t>
       </w:r>
-      <w:hyperlink w:history="1" r:id="rId3kvzthy4e9_ldownjk-da">
+      <w:hyperlink w:history="1" r:id="rIdzioixn_9jmvovnbzxm-41">
         <w:r>
           <w:t xml:space="preserve">arXiv:2112.09817</w:t>
         </w:r>
@@ -1564,7 +1564,7 @@
       <w:r>
         <w:t xml:space="preserve">, </w:t>
       </w:r>
-      <w:hyperlink w:history="1" r:id="rIdguxfa9daaqgglfwctnbka">
+      <w:hyperlink w:history="1" r:id="rId_jquugoqgghsrmpovfj_b">
         <w:r>
           <w:t xml:space="preserve">ApJ 919, 95 (2021)</w:t>
         </w:r>
@@ -1572,7 +1572,7 @@
       <w:r>
         <w:t xml:space="preserve">, </w:t>
       </w:r>
-      <w:hyperlink w:history="1" r:id="rId-2eihtiwpxvubtyu62yzl">
+      <w:hyperlink w:history="1" r:id="rId_e6fauna8nhsxdz8s6ggw">
         <w:r>
           <w:t xml:space="preserve">arXiv:2106.05356</w:t>
         </w:r>
@@ -1609,7 +1609,7 @@
       <w:r>
         <w:t xml:space="preserve">, </w:t>
       </w:r>
-      <w:hyperlink w:history="1" r:id="rIdbheflshydw77am5ezwek9">
+      <w:hyperlink w:history="1" r:id="rIdkx8j7bztsdkhyxiyrxj1p">
         <w:r>
           <w:t xml:space="preserve">MNRAS 501, 4092–4102 (2021)</w:t>
         </w:r>
@@ -1617,7 +1617,7 @@
       <w:r>
         <w:t xml:space="preserve">, </w:t>
       </w:r>
-      <w:hyperlink w:history="1" r:id="rIdm6keptz3rqz7hygpxq0uy">
+      <w:hyperlink w:history="1" r:id="rIdmtopjsjeoyev7jhxpzcqk">
         <w:r>
           <w:t xml:space="preserve">arXiv:2009.02273</w:t>
         </w:r>
@@ -1654,7 +1654,7 @@
       <w:r>
         <w:t xml:space="preserve">, </w:t>
       </w:r>
-      <w:hyperlink w:history="1" r:id="rIdgcqv0bcunlt1bfelp1cgg">
+      <w:hyperlink w:history="1" r:id="rIddj8nvbowdyecwugcwk60d">
         <w:r>
           <w:t xml:space="preserve">MNRAS 496, 974–986 (2020)</w:t>
         </w:r>
@@ -1662,7 +1662,7 @@
       <w:r>
         <w:t xml:space="preserve">, </w:t>
       </w:r>
-      <w:hyperlink w:history="1" r:id="rId8yri9zzqlby0ie13kyqtp">
+      <w:hyperlink w:history="1" r:id="rIdj3nji07nkq89ajeimhlwx">
         <w:r>
           <w:t xml:space="preserve">arXiv:1910.14049</w:t>
         </w:r>
@@ -1699,7 +1699,7 @@
       <w:r>
         <w:t xml:space="preserve">, </w:t>
       </w:r>
-      <w:hyperlink w:history="1" r:id="rIdn8lqnwiivbfvh8ciuctov">
+      <w:hyperlink w:history="1" r:id="rIdru3zqz7irzck8-xlfgk_r">
         <w:r>
           <w:t xml:space="preserve">MNRAS 468, 1169–1182 (2017)</w:t>
         </w:r>
@@ -1707,7 +1707,7 @@
       <w:r>
         <w:t xml:space="preserve">, </w:t>
       </w:r>
-      <w:hyperlink w:history="1" r:id="rId-hem5__uijw9pdflnfg8l">
+      <w:hyperlink w:history="1" r:id="rIdi8whsg_h89eoa2ujxxsiy">
         <w:r>
           <w:t xml:space="preserve">arXiv:1612.06383</w:t>
         </w:r>
@@ -1744,7 +1744,7 @@
       <w:r>
         <w:t xml:space="preserve">, </w:t>
       </w:r>
-      <w:hyperlink w:history="1" r:id="rIdmhwggrdmoe4vggggilq4a">
+      <w:hyperlink w:history="1" r:id="rIdvzwqmb2umrqkodr0lnbhw">
         <w:r>
           <w:t xml:space="preserve">MNRAS 438, 1856–1869 (2014)</w:t>
         </w:r>
@@ -1752,7 +1752,7 @@
       <w:r>
         <w:t xml:space="preserve">, </w:t>
       </w:r>
-      <w:hyperlink w:history="1" r:id="rIdcketp5vc3ocrqw0izyeoe">
+      <w:hyperlink w:history="1" r:id="rIdj_ewf4r1ka4kosuaajnrq">
         <w:r>
           <w:t xml:space="preserve">arXiv:1310.5441</w:t>
         </w:r>
@@ -1789,7 +1789,7 @@
       <w:r>
         <w:t xml:space="preserve">, </w:t>
       </w:r>
-      <w:hyperlink w:history="1" r:id="rIdbo83xxl9avqxd0enf0cez">
+      <w:hyperlink w:history="1" r:id="rIdz86chlohojwfb2nyeqtiz">
         <w:r>
           <w:t xml:space="preserve">Phys. Rev. D 80, 084023 (2009)</w:t>
         </w:r>
@@ -1797,7 +1797,7 @@
       <w:r>
         <w:t xml:space="preserve">, </w:t>
       </w:r>
-      <w:hyperlink w:history="1" r:id="rIdewj6d_jhzkja9vxfz5nuz">
+      <w:hyperlink w:history="1" r:id="rIds02fo7wtqsbswt-lecnl7">
         <w:r>
           <w:t xml:space="preserve">arXiv:1009.1250</w:t>
         </w:r>
@@ -1842,7 +1842,7 @@
       <w:r>
         <w:t xml:space="preserve">, </w:t>
       </w:r>
-      <w:hyperlink w:history="1" r:id="rIdzfyn0azkmmw5a0wfkzxpe">
+      <w:hyperlink w:history="1" r:id="rIddzt-ctelmdrjcs-p5t1lk">
         <w:r>
           <w:t xml:space="preserve">Astron. Nachr. 342, 277–282 (2021)</w:t>
         </w:r>
@@ -1850,7 +1850,7 @@
       <w:r>
         <w:t xml:space="preserve">, 9th International Workshop on Astronomy and Relativistic Astrophysics, </w:t>
       </w:r>
-      <w:hyperlink w:history="1" r:id="rIdeesc8bjnrbquduoirji3a">
+      <w:hyperlink w:history="1" r:id="rIdlce8el2f8rimkm3qt8otz">
         <w:r>
           <w:t xml:space="preserve">arXiv:2011.13797</w:t>
         </w:r>
@@ -1887,7 +1887,7 @@
       <w:r>
         <w:t xml:space="preserve">, </w:t>
       </w:r>
-      <w:hyperlink w:history="1" r:id="rIdj4a4rgnx-ztp-9yp-tyek">
+      <w:hyperlink w:history="1" r:id="rId0flozmpmxtpivvkvdmgbd">
         <w:r>
           <w:t xml:space="preserve">Astron. Nachr. 342, 147–152 (2021)</w:t>
         </w:r>
@@ -1895,7 +1895,7 @@
       <w:r>
         <w:t xml:space="preserve">, 9th International Workshop on Astronomy and Relativistic Astrophysics, </w:t>
       </w:r>
-      <w:hyperlink w:history="1" r:id="rId0nkzz2-zj5lplvqtkpjte">
+      <w:hyperlink w:history="1" r:id="rIdzmvosvtivlibfffziawuv">
         <w:r>
           <w:t xml:space="preserve">arXiv:2011.13805</w:t>
         </w:r>
@@ -1932,7 +1932,7 @@
       <w:r>
         <w:t xml:space="preserve">, </w:t>
       </w:r>
-      <w:hyperlink w:history="1" r:id="rIdcduon8z_fighc_yu7-tea">
+      <w:hyperlink w:history="1" r:id="rIdic3p-cmm4wcrm8x4ahavd">
         <w:r>
           <w:t xml:space="preserve">PoS(SWIFT 10) 233, 159 (2014)</w:t>
         </w:r>
@@ -1940,7 +1940,7 @@
       <w:r>
         <w:t xml:space="preserve">, </w:t>
       </w:r>
-      <w:hyperlink w:history="1" r:id="rIddu6obdq8bwbhf_tw-c74v">
+      <w:hyperlink w:history="1" r:id="rIdy2hbqgy3ehjpjwwhiojnx">
         <w:r>
           <w:t xml:space="preserve">arXiv:1502.07882</w:t>
         </w:r>
@@ -1977,7 +1977,7 @@
       <w:r>
         <w:t xml:space="preserve">, </w:t>
       </w:r>
-      <w:hyperlink w:history="1" r:id="rIddke3zfezduhbiv_khbkwt">
+      <w:hyperlink w:history="1" r:id="rIdot3vrass8x3yepaa_jnun">
         <w:r>
           <w:t xml:space="preserve">EPJ Web Conf. 61, 02007 (2013)</w:t>
         </w:r>
@@ -1985,7 +1985,7 @@
       <w:r>
         <w:t xml:space="preserve">, </w:t>
       </w:r>
-      <w:hyperlink w:history="1" r:id="rId_cibwjvynnkgb-aqosg07">
+      <w:hyperlink w:history="1" r:id="rId6rwj4mumdmu77adcie1sb">
         <w:r>
           <w:t xml:space="preserve">arXiv:1309.4612</w:t>
         </w:r>
@@ -2022,7 +2022,7 @@
       <w:r>
         <w:t xml:space="preserve">, </w:t>
       </w:r>
-      <w:hyperlink w:history="1" r:id="rIdy5sdo6rxq9jmsqmbk7sra">
+      <w:hyperlink w:history="1" r:id="rIdssa5cpazvgjaoesa0v9yp">
         <w:r>
           <w:t xml:space="preserve">J. Phys.: Conf. Ser. 454, 012001 (2013)</w:t>
         </w:r>
@@ -2030,7 +2030,7 @@
       <w:r>
         <w:t xml:space="preserve">, </w:t>
       </w:r>
-      <w:hyperlink w:history="1" r:id="rIdbxkluv205ksi-qjkwy_5s">
+      <w:hyperlink w:history="1" r:id="rIdlfyotzottuuhtkpwcmsqq">
         <w:r>
           <w:t xml:space="preserve">arXiv:1211.1794</w:t>
         </w:r>
@@ -2433,7 +2433,7 @@
       <w:r>
         <w:tab/>
       </w:r>
-      <w:hyperlink w:history="1" r:id="rIdhel-troydnci4dlwfmssj">
+      <w:hyperlink w:history="1" r:id="rIdmp43_sdn0pxefyf_op1fo">
         <w:r>
           <w:t xml:space="preserve">github.com/altjerue/ilwikak-ml</w:t>
         </w:r>
@@ -2524,7 +2524,7 @@
       <w:r>
         <w:tab/>
       </w:r>
-      <w:hyperlink w:history="1" r:id="rId8lhu2yqms8d5be3l2yav-">
+      <w:hyperlink w:history="1" r:id="rIddzetnhmlhmqe9v7svzhzk">
         <w:r>
           <w:t xml:space="preserve">github.com/UW-ForestMycobiomeLab/WindSporesHills</w:t>
         </w:r>
@@ -2589,7 +2589,7 @@
       <w:r>
         <w:tab/>
       </w:r>
-      <w:hyperlink w:history="1" r:id="rIdvtj6epkn_yfs53csr4oss">
+      <w:hyperlink w:history="1" r:id="rIdf8kb8ownatoetokx_4sdo">
         <w:r>
           <w:t xml:space="preserve">github.com/zkdavis/Tleco</w:t>
         </w:r>
@@ -2654,7 +2654,7 @@
       <w:r>
         <w:tab/>
       </w:r>
-      <w:hyperlink w:history="1" r:id="rIdhklafsod3ug0nzcd6qiwu">
+      <w:hyperlink w:history="1" r:id="rIdbbm68fdtwhahry0ldus4r">
         <w:r>
           <w:t xml:space="preserve">github.com/altjerue/paramo</w:t>
         </w:r>
@@ -3265,7 +3265,7 @@
       <w:r>
         <w:t xml:space="preserve">Video: </w:t>
       </w:r>
-      <w:hyperlink w:history="1" r:id="rIdh9h_vt4hvv1anfj71ielz">
+      <w:hyperlink w:history="1" r:id="rIdinkymhwz098cqzc9zppuy">
         <w:r>
           <w:t xml:space="preserve">youtube.com/watch?v=BAZNWLNT69M</w:t>
         </w:r>
@@ -3436,7 +3436,7 @@
       <w:r>
         <w:t xml:space="preserve">Marcos Moshinsky Award for Best Poster. Video: </w:t>
       </w:r>
-      <w:hyperlink w:history="1" r:id="rIddrm5oemtn-za10xkba4bs">
+      <w:hyperlink w:history="1" r:id="rId3thi6rdsp-zrxdjs7m7rp">
         <w:r>
           <w:t xml:space="preserve">youtube.com/watch?v=0TJiKg7kOPI</w:t>
         </w:r>
@@ -4494,7 +4494,7 @@
       <w:pPr>
         <w:spacing w:after="0"/>
       </w:pPr>
-      <w:hyperlink w:history="1" r:id="rIdupmngrhdqxfvrhicvdwka">
+      <w:hyperlink w:history="1" r:id="rIdw3ltiywg0ycuc9_zozaut">
         <w:r>
           <w:t xml:space="preserve">mexiciencia.github.io/post/anita</w:t>
         </w:r>
@@ -4554,7 +4554,7 @@
       <w:pPr>
         <w:spacing w:after="0"/>
       </w:pPr>
-      <w:hyperlink w:history="1" r:id="rIdltbvlgu3lkju7jzoemh6m">
+      <w:hyperlink w:history="1" r:id="rId6zg0_wbx_oeuc3cmik3gi">
         <w:r>
           <w:t xml:space="preserve">mexiciencia.github.io/post/modelo-sir</w:t>
         </w:r>
@@ -4617,7 +4617,7 @@
       <w:r>
         <w:t xml:space="preserve">Data analysis and modeling collaborator. </w:t>
       </w:r>
-      <w:hyperlink w:history="1" r:id="rId8tik4shut_0l0eadp3xbu">
+      <w:hyperlink w:history="1" r:id="rIdmq_z3u2fx9knh4hd18nsm">
         <w:r>
           <w:t xml:space="preserve">mexiciencia.github.io/post/covid19</w:t>
         </w:r>

</xml_diff>

<commit_message>
Note that the Blazar Population ML project was developed with Claude
Co-Authored-By: Claude Sonnet 5.5 <noreply@anthropic.com>
</commit_message>
<xml_diff>
--- a/RuedaBecerrilJM-CV-plain.docx
+++ b/RuedaBecerrilJM-CV-plain.docx
@@ -28,7 +28,7 @@
       <w:r>
         <w:t xml:space="preserve">  |  </w:t>
       </w:r>
-      <w:hyperlink w:history="1" r:id="rIdh6rtbzoswsk2q2n6z7yfs">
+      <w:hyperlink w:history="1" r:id="rId44zd1z8usnc1wn634dsiq">
         <w:r>
           <w:t xml:space="preserve">jm.ruebe@gmail.com</w:t>
         </w:r>
@@ -42,7 +42,7 @@
       <w:r>
         <w:t xml:space="preserve">  |  </w:t>
       </w:r>
-      <w:hyperlink w:history="1" r:id="rIdshbotqzymg6imag419ey-">
+      <w:hyperlink w:history="1" r:id="rIdcrnlaftpznbueeqjade2e">
         <w:r>
           <w:t xml:space="preserve">linkedin.com/in/jeruebe</w:t>
         </w:r>
@@ -53,7 +53,7 @@
         <w:spacing w:after="60"/>
         <w:jc w:val="center"/>
       </w:pPr>
-      <w:hyperlink w:history="1" r:id="rIdxyzlx1ai9somyaufdec_m">
+      <w:hyperlink w:history="1" r:id="rIdnds3s66jpye98ub8qitiw">
         <w:r>
           <w:t xml:space="preserve">altjerue.github.io</w:t>
         </w:r>
@@ -61,7 +61,7 @@
       <w:r>
         <w:t xml:space="preserve">  |  </w:t>
       </w:r>
-      <w:hyperlink w:history="1" r:id="rIdp16sxygc1xu3cup9end8y">
+      <w:hyperlink w:history="1" r:id="rIdgyb7s8xqtzki9ovly5ulf">
         <w:r>
           <w:t xml:space="preserve">github.com/altjerue</w:t>
         </w:r>
@@ -69,7 +69,7 @@
       <w:r>
         <w:t xml:space="preserve">  |  </w:t>
       </w:r>
-      <w:hyperlink w:history="1" r:id="rId34yzhaearfxilqag7aony">
+      <w:hyperlink w:history="1" r:id="rIdiwlfgkdljs_xjd3mkfvyj">
         <w:r>
           <w:t xml:space="preserve">orcid.org/0000-0003-1988-1912</w:t>
         </w:r>
@@ -77,7 +77,7 @@
       <w:r>
         <w:t xml:space="preserve">  |  </w:t>
       </w:r>
-      <w:hyperlink w:history="1" r:id="rIdzzjas942_suwiaj131sva">
+      <w:hyperlink w:history="1" r:id="rIdp9pcaq84yg959a82h_q3e">
         <w:r>
           <w:t xml:space="preserve">Google Scholar</w:t>
         </w:r>
@@ -1132,7 +1132,7 @@
       <w:r>
         <w:t xml:space="preserve">Thesis: </w:t>
       </w:r>
-      <w:hyperlink w:history="1" r:id="rIdkb6s3rrhim4tlxzcbtrva">
+      <w:hyperlink w:history="1" r:id="rId973yveyskhkofs4k-vq7v">
         <w:r>
           <w:t xml:space="preserve">Numerical treatment of radiation processes in the internal shocks of magnetized relativistic outflows</w:t>
         </w:r>
@@ -1429,7 +1429,7 @@
       <w:r>
         <w:t xml:space="preserve">, </w:t>
       </w:r>
-      <w:hyperlink w:history="1" r:id="rIdmfmng_2clvu_hd8yapxpy">
+      <w:hyperlink w:history="1" r:id="rIdudh2qxybmujueyn10m5gb">
         <w:r>
           <w:t xml:space="preserve">ApJ 976, 182 (2024)</w:t>
         </w:r>
@@ -1437,7 +1437,7 @@
       <w:r>
         <w:t xml:space="preserve">, </w:t>
       </w:r>
-      <w:hyperlink w:history="1" r:id="rIdanusqhq9cd0a67qdrdfph">
+      <w:hyperlink w:history="1" r:id="rId-txwywaqoqufe-mnudgvt">
         <w:r>
           <w:t xml:space="preserve">arXiv:2405.17581</w:t>
         </w:r>
@@ -1474,7 +1474,7 @@
       <w:r>
         <w:t xml:space="preserve">, </w:t>
       </w:r>
-      <w:hyperlink w:history="1" r:id="rIdzh0yzeg1qtlq_c02yadgi">
+      <w:hyperlink w:history="1" r:id="rId2li-u7d0purjgwudocwef">
         <w:r>
           <w:t xml:space="preserve">MNRAS 513, 5766–5779 (2022)</w:t>
         </w:r>
@@ -1482,7 +1482,7 @@
       <w:r>
         <w:t xml:space="preserve">, </w:t>
       </w:r>
-      <w:hyperlink w:history="1" r:id="rIdgxzjuw93xo9xx1mxvqxxg">
+      <w:hyperlink w:history="1" r:id="rIdqivdobnk9rkf5u5wwzt7p">
         <w:r>
           <w:t xml:space="preserve">arXiv:2201.07790</w:t>
         </w:r>
@@ -1519,7 +1519,7 @@
       <w:r>
         <w:t xml:space="preserve">, </w:t>
       </w:r>
-      <w:hyperlink w:history="1" r:id="rId3lsv6p9dhdbi_2jwu4lkv">
+      <w:hyperlink w:history="1" r:id="rIdu4kog77d5b1irm3yfqnwr">
         <w:r>
           <w:t xml:space="preserve">Phys. Rev. D 106, 083015 (2022)</w:t>
         </w:r>
@@ -1527,7 +1527,7 @@
       <w:r>
         <w:t xml:space="preserve">, </w:t>
       </w:r>
-      <w:hyperlink w:history="1" r:id="rIdioivdc1pie6hufu1_pmu7">
+      <w:hyperlink w:history="1" r:id="rIdirb6uyeeehcee22n-b6rs">
         <w:r>
           <w:t xml:space="preserve">arXiv:2112.09817</w:t>
         </w:r>
@@ -1564,7 +1564,7 @@
       <w:r>
         <w:t xml:space="preserve">, </w:t>
       </w:r>
-      <w:hyperlink w:history="1" r:id="rIdbzrw8vkg0niaig_rgaw9u">
+      <w:hyperlink w:history="1" r:id="rIdklu9czfzu5xfcewe5uxf8">
         <w:r>
           <w:t xml:space="preserve">ApJ 919, 95 (2021)</w:t>
         </w:r>
@@ -1572,7 +1572,7 @@
       <w:r>
         <w:t xml:space="preserve">, </w:t>
       </w:r>
-      <w:hyperlink w:history="1" r:id="rIdj6ujow1uxdbxb4zapbchq">
+      <w:hyperlink w:history="1" r:id="rIdabyoysmjr0rmqjnagyomc">
         <w:r>
           <w:t xml:space="preserve">arXiv:2106.05356</w:t>
         </w:r>
@@ -1609,7 +1609,7 @@
       <w:r>
         <w:t xml:space="preserve">, </w:t>
       </w:r>
-      <w:hyperlink w:history="1" r:id="rIdmf7ejpjoujgchn4an8wkj">
+      <w:hyperlink w:history="1" r:id="rIdehluz82-ip5ytzk4mbneb">
         <w:r>
           <w:t xml:space="preserve">MNRAS 501, 4092–4102 (2021)</w:t>
         </w:r>
@@ -1617,7 +1617,7 @@
       <w:r>
         <w:t xml:space="preserve">, </w:t>
       </w:r>
-      <w:hyperlink w:history="1" r:id="rIdn9qrvb39d5-pilvxxxxoo">
+      <w:hyperlink w:history="1" r:id="rIdtgguynk4amtrc2yphoeok">
         <w:r>
           <w:t xml:space="preserve">arXiv:2009.02273</w:t>
         </w:r>
@@ -1654,7 +1654,7 @@
       <w:r>
         <w:t xml:space="preserve">, </w:t>
       </w:r>
-      <w:hyperlink w:history="1" r:id="rId2ph9gkotyasi1jkxsebms">
+      <w:hyperlink w:history="1" r:id="rIdsjgskdfo_ptak4elqiimg">
         <w:r>
           <w:t xml:space="preserve">MNRAS 496, 974–986 (2020)</w:t>
         </w:r>
@@ -1662,7 +1662,7 @@
       <w:r>
         <w:t xml:space="preserve">, </w:t>
       </w:r>
-      <w:hyperlink w:history="1" r:id="rIdd3intmgcq5xmyegvhcpiv">
+      <w:hyperlink w:history="1" r:id="rIdf5jsugarhnyty2l4lszrr">
         <w:r>
           <w:t xml:space="preserve">arXiv:1910.14049</w:t>
         </w:r>
@@ -1699,7 +1699,7 @@
       <w:r>
         <w:t xml:space="preserve">, </w:t>
       </w:r>
-      <w:hyperlink w:history="1" r:id="rIdjey8fx1ah1_unjvqiagv_">
+      <w:hyperlink w:history="1" r:id="rIdtgq90sb7f0pmil-ku2zcb">
         <w:r>
           <w:t xml:space="preserve">MNRAS 468, 1169–1182 (2017)</w:t>
         </w:r>
@@ -1707,7 +1707,7 @@
       <w:r>
         <w:t xml:space="preserve">, </w:t>
       </w:r>
-      <w:hyperlink w:history="1" r:id="rIdrqw46wexljuy-7xfvw8us">
+      <w:hyperlink w:history="1" r:id="rId0yngside7_4zsya_u1sb1">
         <w:r>
           <w:t xml:space="preserve">arXiv:1612.06383</w:t>
         </w:r>
@@ -1744,7 +1744,7 @@
       <w:r>
         <w:t xml:space="preserve">, </w:t>
       </w:r>
-      <w:hyperlink w:history="1" r:id="rId6z3ppoyi5ujrcqlklurvs">
+      <w:hyperlink w:history="1" r:id="rIdgkqkpctywf8msh4whz2o6">
         <w:r>
           <w:t xml:space="preserve">MNRAS 438, 1856–1869 (2014)</w:t>
         </w:r>
@@ -1752,7 +1752,7 @@
       <w:r>
         <w:t xml:space="preserve">, </w:t>
       </w:r>
-      <w:hyperlink w:history="1" r:id="rId1cjxkanm9aujsuqj-guyo">
+      <w:hyperlink w:history="1" r:id="rId_xtrkhsqfewapojiyghaw">
         <w:r>
           <w:t xml:space="preserve">arXiv:1310.5441</w:t>
         </w:r>
@@ -1789,7 +1789,7 @@
       <w:r>
         <w:t xml:space="preserve">, </w:t>
       </w:r>
-      <w:hyperlink w:history="1" r:id="rIdcann17bor8iiug2yvgmwv">
+      <w:hyperlink w:history="1" r:id="rIdwtea2ymkxw9aqmzqp9tm3">
         <w:r>
           <w:t xml:space="preserve">Phys. Rev. D 80, 084023 (2009)</w:t>
         </w:r>
@@ -1797,7 +1797,7 @@
       <w:r>
         <w:t xml:space="preserve">, </w:t>
       </w:r>
-      <w:hyperlink w:history="1" r:id="rIdd8na9jstco2h1bktnjgm4">
+      <w:hyperlink w:history="1" r:id="rIdzxpjxfurkl3hyuwnm3emr">
         <w:r>
           <w:t xml:space="preserve">arXiv:1009.1250</w:t>
         </w:r>
@@ -1842,7 +1842,7 @@
       <w:r>
         <w:t xml:space="preserve">, </w:t>
       </w:r>
-      <w:hyperlink w:history="1" r:id="rIdbx06vf5meaqla9yms8ken">
+      <w:hyperlink w:history="1" r:id="rIdgej5_9ov7xig97dr9dooz">
         <w:r>
           <w:t xml:space="preserve">Astron. Nachr. 342, 277–282 (2021)</w:t>
         </w:r>
@@ -1850,7 +1850,7 @@
       <w:r>
         <w:t xml:space="preserve">, 9th International Workshop on Astronomy and Relativistic Astrophysics, </w:t>
       </w:r>
-      <w:hyperlink w:history="1" r:id="rIdltobjltpywi14y6y4hstw">
+      <w:hyperlink w:history="1" r:id="rIdpsbe5unpd0czxqhvd760n">
         <w:r>
           <w:t xml:space="preserve">arXiv:2011.13797</w:t>
         </w:r>
@@ -1887,7 +1887,7 @@
       <w:r>
         <w:t xml:space="preserve">, </w:t>
       </w:r>
-      <w:hyperlink w:history="1" r:id="rIds3fv-m96cncktspk5fx-g">
+      <w:hyperlink w:history="1" r:id="rIdhtsszesm2yblphjy9rib7">
         <w:r>
           <w:t xml:space="preserve">Astron. Nachr. 342, 147–152 (2021)</w:t>
         </w:r>
@@ -1895,7 +1895,7 @@
       <w:r>
         <w:t xml:space="preserve">, 9th International Workshop on Astronomy and Relativistic Astrophysics, </w:t>
       </w:r>
-      <w:hyperlink w:history="1" r:id="rIdtinwforsv2pc9f0ow-hxc">
+      <w:hyperlink w:history="1" r:id="rIdxvuw2_i9843vkghiuvvti">
         <w:r>
           <w:t xml:space="preserve">arXiv:2011.13805</w:t>
         </w:r>
@@ -1932,7 +1932,7 @@
       <w:r>
         <w:t xml:space="preserve">, </w:t>
       </w:r>
-      <w:hyperlink w:history="1" r:id="rId9xffab-ufiam2psj1rwcw">
+      <w:hyperlink w:history="1" r:id="rId5d40u2cayrwz6romlc6rh">
         <w:r>
           <w:t xml:space="preserve">PoS(SWIFT 10) 233, 159 (2014)</w:t>
         </w:r>
@@ -1940,7 +1940,7 @@
       <w:r>
         <w:t xml:space="preserve">, </w:t>
       </w:r>
-      <w:hyperlink w:history="1" r:id="rIduwmmrf5ic9_pjd50ybi_p">
+      <w:hyperlink w:history="1" r:id="rIdrcvai82nxbq5dzdg51dsf">
         <w:r>
           <w:t xml:space="preserve">arXiv:1502.07882</w:t>
         </w:r>
@@ -1977,7 +1977,7 @@
       <w:r>
         <w:t xml:space="preserve">, </w:t>
       </w:r>
-      <w:hyperlink w:history="1" r:id="rIdspgxsexdtq0elerroe1tg">
+      <w:hyperlink w:history="1" r:id="rIdw2l9xnpigxn1xru-vlujp">
         <w:r>
           <w:t xml:space="preserve">EPJ Web Conf. 61, 02007 (2013)</w:t>
         </w:r>
@@ -1985,7 +1985,7 @@
       <w:r>
         <w:t xml:space="preserve">, </w:t>
       </w:r>
-      <w:hyperlink w:history="1" r:id="rIdz8fzmvnti562ho4yw_fou">
+      <w:hyperlink w:history="1" r:id="rIdix8vnoa8ocsejph2alwsp">
         <w:r>
           <w:t xml:space="preserve">arXiv:1309.4612</w:t>
         </w:r>
@@ -2022,7 +2022,7 @@
       <w:r>
         <w:t xml:space="preserve">, </w:t>
       </w:r>
-      <w:hyperlink w:history="1" r:id="rIdnojalvi2cv2zfarn0ydr5">
+      <w:hyperlink w:history="1" r:id="rIdnblghgt4k-fpywhmlx2ja">
         <w:r>
           <w:t xml:space="preserve">J. Phys.: Conf. Ser. 454, 012001 (2013)</w:t>
         </w:r>
@@ -2030,7 +2030,7 @@
       <w:r>
         <w:t xml:space="preserve">, </w:t>
       </w:r>
-      <w:hyperlink w:history="1" r:id="rIdxlr9byrissgekdpg2ksqh">
+      <w:hyperlink w:history="1" r:id="rIdweoluryel-rcdzam1i62x">
         <w:r>
           <w:t xml:space="preserve">arXiv:1211.1794</w:t>
         </w:r>
@@ -2428,12 +2428,12 @@
           <w:i/>
           <w:iCs/>
         </w:rPr>
-        <w:t xml:space="preserve">Physics-informed ML (Python, scikit-learn, PyTorch)</w:t>
-      </w:r>
-      <w:r>
-        <w:tab/>
-      </w:r>
-      <w:hyperlink w:history="1" r:id="rIdqi9decv_9rbyqfdlfh6rv">
+        <w:t xml:space="preserve">Physics-informed ML (Python, scikit-learn, PyTorch), developed with Claude</w:t>
+      </w:r>
+      <w:r>
+        <w:tab/>
+      </w:r>
+      <w:hyperlink w:history="1" r:id="rIdv7v6fhqxistmmbzgjzczw">
         <w:r>
           <w:t xml:space="preserve">github.com/altjerue/ilwikak-ml</w:t>
         </w:r>
@@ -2524,7 +2524,7 @@
       <w:r>
         <w:tab/>
       </w:r>
-      <w:hyperlink w:history="1" r:id="rId48ehatunlg7kpxunqdpcp">
+      <w:hyperlink w:history="1" r:id="rId_1wlprj0ji2_c4kqv-1ej">
         <w:r>
           <w:t xml:space="preserve">github.com/UW-ForestMycobiomeLab/WindSporesHills</w:t>
         </w:r>
@@ -2589,7 +2589,7 @@
       <w:r>
         <w:tab/>
       </w:r>
-      <w:hyperlink w:history="1" r:id="rId6mja1rm-t5da5re0abmf3">
+      <w:hyperlink w:history="1" r:id="rIdqguomrf9jdglz0z-iuugj">
         <w:r>
           <w:t xml:space="preserve">github.com/zkdavis/Tleco</w:t>
         </w:r>
@@ -2654,7 +2654,7 @@
       <w:r>
         <w:tab/>
       </w:r>
-      <w:hyperlink w:history="1" r:id="rId-mvv11i3s5keqt3zw6dwy">
+      <w:hyperlink w:history="1" r:id="rIdiwhm1jodvizhcbd7nfdbx">
         <w:r>
           <w:t xml:space="preserve">github.com/altjerue/paramo</w:t>
         </w:r>
@@ -3265,7 +3265,7 @@
       <w:r>
         <w:t xml:space="preserve">Video: </w:t>
       </w:r>
-      <w:hyperlink w:history="1" r:id="rIdoesqiaj1tuyjwu6xqaaqx">
+      <w:hyperlink w:history="1" r:id="rId-tznccgc-sbbcjjjwfve6">
         <w:r>
           <w:t xml:space="preserve">youtube.com/watch?v=BAZNWLNT69M</w:t>
         </w:r>
@@ -3436,7 +3436,7 @@
       <w:r>
         <w:t xml:space="preserve">Marcos Moshinsky Award for Best Poster. Video: </w:t>
       </w:r>
-      <w:hyperlink w:history="1" r:id="rIdy41tbng8yvz0yyo1mya0u">
+      <w:hyperlink w:history="1" r:id="rId8od93ihrjwzodkxhmqfyz">
         <w:r>
           <w:t xml:space="preserve">youtube.com/watch?v=0TJiKg7kOPI</w:t>
         </w:r>
@@ -4494,7 +4494,7 @@
       <w:pPr>
         <w:spacing w:after="0"/>
       </w:pPr>
-      <w:hyperlink w:history="1" r:id="rIdwkhpqorauoygepsf6_ivy">
+      <w:hyperlink w:history="1" r:id="rIdensi3u7kn8mxnk5bwnfcc">
         <w:r>
           <w:t xml:space="preserve">mexiciencia.github.io/post/anita</w:t>
         </w:r>
@@ -4554,7 +4554,7 @@
       <w:pPr>
         <w:spacing w:after="0"/>
       </w:pPr>
-      <w:hyperlink w:history="1" r:id="rId7t9etefpcxyhafvanbj5y">
+      <w:hyperlink w:history="1" r:id="rIdh4izlkmt7wpqrgj0svgxd">
         <w:r>
           <w:t xml:space="preserve">mexiciencia.github.io/post/modelo-sir</w:t>
         </w:r>
@@ -4617,7 +4617,7 @@
       <w:r>
         <w:t xml:space="preserve">Data analysis and modeling collaborator. </w:t>
       </w:r>
-      <w:hyperlink w:history="1" r:id="rIdlzvgvrdu3etawxizn_doa">
+      <w:hyperlink w:history="1" r:id="rIdspnvjz20sds4pqtrmoabr">
         <w:r>
           <w:t xml:space="preserve">mexiciencia.github.io/post/covid19</w:t>
         </w:r>

</xml_diff>

<commit_message>
changing lab to labs
</commit_message>
<xml_diff>
--- a/RuedaBecerrilJM-CV-plain.docx
+++ b/RuedaBecerrilJM-CV-plain.docx
@@ -28,7 +28,7 @@
       <w:r>
         <w:t xml:space="preserve">  |  </w:t>
       </w:r>
-      <w:hyperlink w:history="1" r:id="rId44zd1z8usnc1wn634dsiq">
+      <w:hyperlink w:history="1" r:id="rIdhqceaij79-8omqymjp7o3">
         <w:r>
           <w:t xml:space="preserve">jm.ruebe@gmail.com</w:t>
         </w:r>
@@ -42,7 +42,7 @@
       <w:r>
         <w:t xml:space="preserve">  |  </w:t>
       </w:r>
-      <w:hyperlink w:history="1" r:id="rIdcrnlaftpznbueeqjade2e">
+      <w:hyperlink w:history="1" r:id="rIdvf7x8jml7bwva3yqyt_0a">
         <w:r>
           <w:t xml:space="preserve">linkedin.com/in/jeruebe</w:t>
         </w:r>
@@ -53,7 +53,7 @@
         <w:spacing w:after="60"/>
         <w:jc w:val="center"/>
       </w:pPr>
-      <w:hyperlink w:history="1" r:id="rIdnds3s66jpye98ub8qitiw">
+      <w:hyperlink w:history="1" r:id="rIdvqy5nsond9oc8dmuj0-bl">
         <w:r>
           <w:t xml:space="preserve">altjerue.github.io</w:t>
         </w:r>
@@ -61,7 +61,7 @@
       <w:r>
         <w:t xml:space="preserve">  |  </w:t>
       </w:r>
-      <w:hyperlink w:history="1" r:id="rIdgyb7s8xqtzki9ovly5ulf">
+      <w:hyperlink w:history="1" r:id="rIdkrkpujisvbnnjnrzzxioy">
         <w:r>
           <w:t xml:space="preserve">github.com/altjerue</w:t>
         </w:r>
@@ -69,7 +69,7 @@
       <w:r>
         <w:t xml:space="preserve">  |  </w:t>
       </w:r>
-      <w:hyperlink w:history="1" r:id="rIdiwlfgkdljs_xjd3mkfvyj">
+      <w:hyperlink w:history="1" r:id="rIdxopt8mswp614p4sle0hug">
         <w:r>
           <w:t xml:space="preserve">orcid.org/0000-0003-1988-1912</w:t>
         </w:r>
@@ -77,7 +77,7 @@
       <w:r>
         <w:t xml:space="preserve">  |  </w:t>
       </w:r>
-      <w:hyperlink w:history="1" r:id="rIdp9pcaq84yg959a82h_q3e">
+      <w:hyperlink w:history="1" r:id="rId_z25hnucrjegkdhhu0du2">
         <w:r>
           <w:t xml:space="preserve">Google Scholar</w:t>
         </w:r>
@@ -256,7 +256,7 @@
         <w:spacing w:after="10"/>
       </w:pPr>
       <w:r>
-        <w:t xml:space="preserve">Physics expert for a leading AI lab: reviewed 50+ expert-level problems in physics, hydrodynamics, astrophysics, and cosmology; wrote original prompts that stumped frontier models.</w:t>
+        <w:t xml:space="preserve">Physics expert for a leading AI labs: reviewed 50+ expert-level problems in physics, hydrodynamics, astrophysics, and cosmology; wrote original prompts that stumped frontier models.</w:t>
       </w:r>
     </w:p>
     <w:p>
@@ -1132,7 +1132,7 @@
       <w:r>
         <w:t xml:space="preserve">Thesis: </w:t>
       </w:r>
-      <w:hyperlink w:history="1" r:id="rId973yveyskhkofs4k-vq7v">
+      <w:hyperlink w:history="1" r:id="rIdj8uh6__ea8gyvmi9bqijo">
         <w:r>
           <w:t xml:space="preserve">Numerical treatment of radiation processes in the internal shocks of magnetized relativistic outflows</w:t>
         </w:r>
@@ -1429,7 +1429,7 @@
       <w:r>
         <w:t xml:space="preserve">, </w:t>
       </w:r>
-      <w:hyperlink w:history="1" r:id="rIdudh2qxybmujueyn10m5gb">
+      <w:hyperlink w:history="1" r:id="rIduevrkyv7fjqepyj4syprp">
         <w:r>
           <w:t xml:space="preserve">ApJ 976, 182 (2024)</w:t>
         </w:r>
@@ -1437,7 +1437,7 @@
       <w:r>
         <w:t xml:space="preserve">, </w:t>
       </w:r>
-      <w:hyperlink w:history="1" r:id="rId-txwywaqoqufe-mnudgvt">
+      <w:hyperlink w:history="1" r:id="rIdtp3cwifwwemp8pkwfrjxs">
         <w:r>
           <w:t xml:space="preserve">arXiv:2405.17581</w:t>
         </w:r>
@@ -1474,7 +1474,7 @@
       <w:r>
         <w:t xml:space="preserve">, </w:t>
       </w:r>
-      <w:hyperlink w:history="1" r:id="rId2li-u7d0purjgwudocwef">
+      <w:hyperlink w:history="1" r:id="rIdjv2zvuful5umqp4c_6eix">
         <w:r>
           <w:t xml:space="preserve">MNRAS 513, 5766–5779 (2022)</w:t>
         </w:r>
@@ -1482,7 +1482,7 @@
       <w:r>
         <w:t xml:space="preserve">, </w:t>
       </w:r>
-      <w:hyperlink w:history="1" r:id="rIdqivdobnk9rkf5u5wwzt7p">
+      <w:hyperlink w:history="1" r:id="rIdshipakexzp3vpeb8im3ca">
         <w:r>
           <w:t xml:space="preserve">arXiv:2201.07790</w:t>
         </w:r>
@@ -1519,7 +1519,7 @@
       <w:r>
         <w:t xml:space="preserve">, </w:t>
       </w:r>
-      <w:hyperlink w:history="1" r:id="rIdu4kog77d5b1irm3yfqnwr">
+      <w:hyperlink w:history="1" r:id="rIdf23lzndufolgxi7r2cgk7">
         <w:r>
           <w:t xml:space="preserve">Phys. Rev. D 106, 083015 (2022)</w:t>
         </w:r>
@@ -1527,7 +1527,7 @@
       <w:r>
         <w:t xml:space="preserve">, </w:t>
       </w:r>
-      <w:hyperlink w:history="1" r:id="rIdirb6uyeeehcee22n-b6rs">
+      <w:hyperlink w:history="1" r:id="rId8vw8v5iaywmoufnzg4di-">
         <w:r>
           <w:t xml:space="preserve">arXiv:2112.09817</w:t>
         </w:r>
@@ -1564,7 +1564,7 @@
       <w:r>
         <w:t xml:space="preserve">, </w:t>
       </w:r>
-      <w:hyperlink w:history="1" r:id="rIdklu9czfzu5xfcewe5uxf8">
+      <w:hyperlink w:history="1" r:id="rIdiwidp-l2vcptbguvy06hs">
         <w:r>
           <w:t xml:space="preserve">ApJ 919, 95 (2021)</w:t>
         </w:r>
@@ -1572,7 +1572,7 @@
       <w:r>
         <w:t xml:space="preserve">, </w:t>
       </w:r>
-      <w:hyperlink w:history="1" r:id="rIdabyoysmjr0rmqjnagyomc">
+      <w:hyperlink w:history="1" r:id="rIdxtrs8g9gs3anpgbt_alx6">
         <w:r>
           <w:t xml:space="preserve">arXiv:2106.05356</w:t>
         </w:r>
@@ -1609,7 +1609,7 @@
       <w:r>
         <w:t xml:space="preserve">, </w:t>
       </w:r>
-      <w:hyperlink w:history="1" r:id="rIdehluz82-ip5ytzk4mbneb">
+      <w:hyperlink w:history="1" r:id="rIdbmcifzh2qytjljpa2zkap">
         <w:r>
           <w:t xml:space="preserve">MNRAS 501, 4092–4102 (2021)</w:t>
         </w:r>
@@ -1617,7 +1617,7 @@
       <w:r>
         <w:t xml:space="preserve">, </w:t>
       </w:r>
-      <w:hyperlink w:history="1" r:id="rIdtgguynk4amtrc2yphoeok">
+      <w:hyperlink w:history="1" r:id="rId59k1ky5mrqogaenxlhkoe">
         <w:r>
           <w:t xml:space="preserve">arXiv:2009.02273</w:t>
         </w:r>
@@ -1654,7 +1654,7 @@
       <w:r>
         <w:t xml:space="preserve">, </w:t>
       </w:r>
-      <w:hyperlink w:history="1" r:id="rIdsjgskdfo_ptak4elqiimg">
+      <w:hyperlink w:history="1" r:id="rIdqyuk4eizzdcak7mxvf3gx">
         <w:r>
           <w:t xml:space="preserve">MNRAS 496, 974–986 (2020)</w:t>
         </w:r>
@@ -1662,7 +1662,7 @@
       <w:r>
         <w:t xml:space="preserve">, </w:t>
       </w:r>
-      <w:hyperlink w:history="1" r:id="rIdf5jsugarhnyty2l4lszrr">
+      <w:hyperlink w:history="1" r:id="rIdntlj_p-ad_eyjvsn1iyj5">
         <w:r>
           <w:t xml:space="preserve">arXiv:1910.14049</w:t>
         </w:r>
@@ -1699,7 +1699,7 @@
       <w:r>
         <w:t xml:space="preserve">, </w:t>
       </w:r>
-      <w:hyperlink w:history="1" r:id="rIdtgq90sb7f0pmil-ku2zcb">
+      <w:hyperlink w:history="1" r:id="rIdzwuitmxangccunwbw2c8x">
         <w:r>
           <w:t xml:space="preserve">MNRAS 468, 1169–1182 (2017)</w:t>
         </w:r>
@@ -1707,7 +1707,7 @@
       <w:r>
         <w:t xml:space="preserve">, </w:t>
       </w:r>
-      <w:hyperlink w:history="1" r:id="rId0yngside7_4zsya_u1sb1">
+      <w:hyperlink w:history="1" r:id="rIdjzwam8xxigcklxypx7szz">
         <w:r>
           <w:t xml:space="preserve">arXiv:1612.06383</w:t>
         </w:r>
@@ -1744,7 +1744,7 @@
       <w:r>
         <w:t xml:space="preserve">, </w:t>
       </w:r>
-      <w:hyperlink w:history="1" r:id="rIdgkqkpctywf8msh4whz2o6">
+      <w:hyperlink w:history="1" r:id="rId6iswpq6z2_fjwac72dcwx">
         <w:r>
           <w:t xml:space="preserve">MNRAS 438, 1856–1869 (2014)</w:t>
         </w:r>
@@ -1752,7 +1752,7 @@
       <w:r>
         <w:t xml:space="preserve">, </w:t>
       </w:r>
-      <w:hyperlink w:history="1" r:id="rId_xtrkhsqfewapojiyghaw">
+      <w:hyperlink w:history="1" r:id="rIdrkhpdfxxwxfsyohtuxh6u">
         <w:r>
           <w:t xml:space="preserve">arXiv:1310.5441</w:t>
         </w:r>
@@ -1789,7 +1789,7 @@
       <w:r>
         <w:t xml:space="preserve">, </w:t>
       </w:r>
-      <w:hyperlink w:history="1" r:id="rIdwtea2ymkxw9aqmzqp9tm3">
+      <w:hyperlink w:history="1" r:id="rIdqek0byls_nvzwtm4xlcef">
         <w:r>
           <w:t xml:space="preserve">Phys. Rev. D 80, 084023 (2009)</w:t>
         </w:r>
@@ -1797,7 +1797,7 @@
       <w:r>
         <w:t xml:space="preserve">, </w:t>
       </w:r>
-      <w:hyperlink w:history="1" r:id="rIdzxpjxfurkl3hyuwnm3emr">
+      <w:hyperlink w:history="1" r:id="rIdvr2o3hup5m1ecataalpi7">
         <w:r>
           <w:t xml:space="preserve">arXiv:1009.1250</w:t>
         </w:r>
@@ -1842,7 +1842,7 @@
       <w:r>
         <w:t xml:space="preserve">, </w:t>
       </w:r>
-      <w:hyperlink w:history="1" r:id="rIdgej5_9ov7xig97dr9dooz">
+      <w:hyperlink w:history="1" r:id="rIdvccyjhvr8pgb61acb1wdt">
         <w:r>
           <w:t xml:space="preserve">Astron. Nachr. 342, 277–282 (2021)</w:t>
         </w:r>
@@ -1850,7 +1850,7 @@
       <w:r>
         <w:t xml:space="preserve">, 9th International Workshop on Astronomy and Relativistic Astrophysics, </w:t>
       </w:r>
-      <w:hyperlink w:history="1" r:id="rIdpsbe5unpd0czxqhvd760n">
+      <w:hyperlink w:history="1" r:id="rIdvnefhfwoqiq3rttkskqc7">
         <w:r>
           <w:t xml:space="preserve">arXiv:2011.13797</w:t>
         </w:r>
@@ -1887,7 +1887,7 @@
       <w:r>
         <w:t xml:space="preserve">, </w:t>
       </w:r>
-      <w:hyperlink w:history="1" r:id="rIdhtsszesm2yblphjy9rib7">
+      <w:hyperlink w:history="1" r:id="rIdcb4-dsv0rau5mfem4o_zs">
         <w:r>
           <w:t xml:space="preserve">Astron. Nachr. 342, 147–152 (2021)</w:t>
         </w:r>
@@ -1895,7 +1895,7 @@
       <w:r>
         <w:t xml:space="preserve">, 9th International Workshop on Astronomy and Relativistic Astrophysics, </w:t>
       </w:r>
-      <w:hyperlink w:history="1" r:id="rIdxvuw2_i9843vkghiuvvti">
+      <w:hyperlink w:history="1" r:id="rIdxut9q9eeigcasx_kv8igu">
         <w:r>
           <w:t xml:space="preserve">arXiv:2011.13805</w:t>
         </w:r>
@@ -1932,7 +1932,7 @@
       <w:r>
         <w:t xml:space="preserve">, </w:t>
       </w:r>
-      <w:hyperlink w:history="1" r:id="rId5d40u2cayrwz6romlc6rh">
+      <w:hyperlink w:history="1" r:id="rId335zapg5t6qq8pteknz9p">
         <w:r>
           <w:t xml:space="preserve">PoS(SWIFT 10) 233, 159 (2014)</w:t>
         </w:r>
@@ -1940,7 +1940,7 @@
       <w:r>
         <w:t xml:space="preserve">, </w:t>
       </w:r>
-      <w:hyperlink w:history="1" r:id="rIdrcvai82nxbq5dzdg51dsf">
+      <w:hyperlink w:history="1" r:id="rIdhwnxzklrhjdws9ulijbqj">
         <w:r>
           <w:t xml:space="preserve">arXiv:1502.07882</w:t>
         </w:r>
@@ -1977,7 +1977,7 @@
       <w:r>
         <w:t xml:space="preserve">, </w:t>
       </w:r>
-      <w:hyperlink w:history="1" r:id="rIdw2l9xnpigxn1xru-vlujp">
+      <w:hyperlink w:history="1" r:id="rIda8l7an-hlad9be5pir7fg">
         <w:r>
           <w:t xml:space="preserve">EPJ Web Conf. 61, 02007 (2013)</w:t>
         </w:r>
@@ -1985,7 +1985,7 @@
       <w:r>
         <w:t xml:space="preserve">, </w:t>
       </w:r>
-      <w:hyperlink w:history="1" r:id="rIdix8vnoa8ocsejph2alwsp">
+      <w:hyperlink w:history="1" r:id="rIdksvl0lyhfkb6q3rm5mejf">
         <w:r>
           <w:t xml:space="preserve">arXiv:1309.4612</w:t>
         </w:r>
@@ -2022,7 +2022,7 @@
       <w:r>
         <w:t xml:space="preserve">, </w:t>
       </w:r>
-      <w:hyperlink w:history="1" r:id="rIdnblghgt4k-fpywhmlx2ja">
+      <w:hyperlink w:history="1" r:id="rIde-5x56_cg3wkgiyazmazu">
         <w:r>
           <w:t xml:space="preserve">J. Phys.: Conf. Ser. 454, 012001 (2013)</w:t>
         </w:r>
@@ -2030,7 +2030,7 @@
       <w:r>
         <w:t xml:space="preserve">, </w:t>
       </w:r>
-      <w:hyperlink w:history="1" r:id="rIdweoluryel-rcdzam1i62x">
+      <w:hyperlink w:history="1" r:id="rIdt0zxraj6q5odwm8xy83fh">
         <w:r>
           <w:t xml:space="preserve">arXiv:1211.1794</w:t>
         </w:r>
@@ -2433,7 +2433,7 @@
       <w:r>
         <w:tab/>
       </w:r>
-      <w:hyperlink w:history="1" r:id="rIdv7v6fhqxistmmbzgjzczw">
+      <w:hyperlink w:history="1" r:id="rIdvbageaoxmdot04gtuitvs">
         <w:r>
           <w:t xml:space="preserve">github.com/altjerue/ilwikak-ml</w:t>
         </w:r>
@@ -2524,7 +2524,7 @@
       <w:r>
         <w:tab/>
       </w:r>
-      <w:hyperlink w:history="1" r:id="rId_1wlprj0ji2_c4kqv-1ej">
+      <w:hyperlink w:history="1" r:id="rIdfdooveowfevib2hyq7s0z">
         <w:r>
           <w:t xml:space="preserve">github.com/UW-ForestMycobiomeLab/WindSporesHills</w:t>
         </w:r>
@@ -2589,7 +2589,7 @@
       <w:r>
         <w:tab/>
       </w:r>
-      <w:hyperlink w:history="1" r:id="rIdqguomrf9jdglz0z-iuugj">
+      <w:hyperlink w:history="1" r:id="rIdhk0qt7ccslje-h-vk4c9e">
         <w:r>
           <w:t xml:space="preserve">github.com/zkdavis/Tleco</w:t>
         </w:r>
@@ -2654,7 +2654,7 @@
       <w:r>
         <w:tab/>
       </w:r>
-      <w:hyperlink w:history="1" r:id="rIdiwhm1jodvizhcbd7nfdbx">
+      <w:hyperlink w:history="1" r:id="rIdk19ekyvfovuvf7tisth60">
         <w:r>
           <w:t xml:space="preserve">github.com/altjerue/paramo</w:t>
         </w:r>
@@ -3265,7 +3265,7 @@
       <w:r>
         <w:t xml:space="preserve">Video: </w:t>
       </w:r>
-      <w:hyperlink w:history="1" r:id="rId-tznccgc-sbbcjjjwfve6">
+      <w:hyperlink w:history="1" r:id="rIdusmfr6fzgvcos0cmhzpi-">
         <w:r>
           <w:t xml:space="preserve">youtube.com/watch?v=BAZNWLNT69M</w:t>
         </w:r>
@@ -3436,7 +3436,7 @@
       <w:r>
         <w:t xml:space="preserve">Marcos Moshinsky Award for Best Poster. Video: </w:t>
       </w:r>
-      <w:hyperlink w:history="1" r:id="rId8od93ihrjwzodkxhmqfyz">
+      <w:hyperlink w:history="1" r:id="rId43m6v239eeprrvlz4yqcn">
         <w:r>
           <w:t xml:space="preserve">youtube.com/watch?v=0TJiKg7kOPI</w:t>
         </w:r>
@@ -4494,7 +4494,7 @@
       <w:pPr>
         <w:spacing w:after="0"/>
       </w:pPr>
-      <w:hyperlink w:history="1" r:id="rIdensi3u7kn8mxnk5bwnfcc">
+      <w:hyperlink w:history="1" r:id="rIdsvu3hnkavtybkbo8dewno">
         <w:r>
           <w:t xml:space="preserve">mexiciencia.github.io/post/anita</w:t>
         </w:r>
@@ -4554,7 +4554,7 @@
       <w:pPr>
         <w:spacing w:after="0"/>
       </w:pPr>
-      <w:hyperlink w:history="1" r:id="rIdh4izlkmt7wpqrgj0svgxd">
+      <w:hyperlink w:history="1" r:id="rIdjorp6xihdldhimbboudwc">
         <w:r>
           <w:t xml:space="preserve">mexiciencia.github.io/post/modelo-sir</w:t>
         </w:r>
@@ -4617,7 +4617,7 @@
       <w:r>
         <w:t xml:space="preserve">Data analysis and modeling collaborator. </w:t>
       </w:r>
-      <w:hyperlink w:history="1" r:id="rIdspnvjz20sds4pqtrmoabr">
+      <w:hyperlink w:history="1" r:id="rId-sdb4cecwgtvj7witcqiy">
         <w:r>
           <w:t xml:space="preserve">mexiciencia.github.io/post/covid19</w:t>
         </w:r>

</xml_diff>

<commit_message>
Apply teaching-role resume suggestions
Rewrite the summary (substitute instructor, bilingual, seeking to teach
physics and astronomy), move Talks and Outreach right after Teaching and
Mentoring, note Spanish teaching in Languages, and shorten the Tleco,
Paychex, RIT and Purdue lines to keep the resume at one page. Regenerate
all outputs.

Co-Authored-By: Claude Sonnet 5.5 <noreply@anthropic.com>
</commit_message>
<xml_diff>
--- a/RuedaBecerrilJM-CV-plain.docx
+++ b/RuedaBecerrilJM-CV-plain.docx
@@ -28,7 +28,7 @@
       <w:r>
         <w:t xml:space="preserve">  |  </w:t>
       </w:r>
-      <w:hyperlink w:history="1" r:id="rId5fc2joutortbui7qsiisr">
+      <w:hyperlink w:history="1" r:id="rIdteywhj86yvcc5fljpybt8">
         <w:r>
           <w:t xml:space="preserve">jm.ruebe@gmail.com</w:t>
         </w:r>
@@ -42,7 +42,7 @@
       <w:r>
         <w:t xml:space="preserve">  |  </w:t>
       </w:r>
-      <w:hyperlink w:history="1" r:id="rIdfmrid07gcj3bwlgsswjrp">
+      <w:hyperlink w:history="1" r:id="rIde-vcsccoyyeqbxtrxp70n">
         <w:r>
           <w:t xml:space="preserve">linkedin.com/in/jeruebe</w:t>
         </w:r>
@@ -53,7 +53,7 @@
         <w:spacing w:after="60"/>
         <w:jc w:val="center"/>
       </w:pPr>
-      <w:hyperlink w:history="1" r:id="rIdcj5yetw0hjdn_djkoy7m_">
+      <w:hyperlink w:history="1" r:id="rIdy5xyhlz3rahy5glgflij0">
         <w:r>
           <w:t xml:space="preserve">altjerue.github.io</w:t>
         </w:r>
@@ -61,7 +61,7 @@
       <w:r>
         <w:t xml:space="preserve">  |  </w:t>
       </w:r>
-      <w:hyperlink w:history="1" r:id="rIdlc4btxswcnc0ahjgrzgi3">
+      <w:hyperlink w:history="1" r:id="rId9mxzjloficn9xba9m0nw9">
         <w:r>
           <w:t xml:space="preserve">github.com/altjerue</w:t>
         </w:r>
@@ -69,7 +69,7 @@
       <w:r>
         <w:t xml:space="preserve">  |  </w:t>
       </w:r>
-      <w:hyperlink w:history="1" r:id="rIdymv__7ln2enapwvh5d7-j">
+      <w:hyperlink w:history="1" r:id="rIdh1an4xss8nfirmyahzchc">
         <w:r>
           <w:t xml:space="preserve">orcid.org/0000-0003-1988-1912</w:t>
         </w:r>
@@ -77,7 +77,7 @@
       <w:r>
         <w:t xml:space="preserve">  |  </w:t>
       </w:r>
-      <w:hyperlink w:history="1" r:id="rId3ym7fro0o9s9c8fpsybs1">
+      <w:hyperlink w:history="1" r:id="rId9tkxpfwoedpoylstqvgcw">
         <w:r>
           <w:t xml:space="preserve">Google Scholar</w:t>
         </w:r>
@@ -93,7 +93,7 @@
     </w:p>
     <w:p>
       <w:r>
-        <w:t xml:space="preserve">Physicist (Ph.D. and M.Sc. in Physics) with ten years of research in computational astrophysics. Taught a graduate thermodynamics course, mentored three graduate researchers who co-authored papers with me, and gave talks to undergraduate physics students. Teaching approach built on intuition, critical thinking, and collaborative problem-solving.</w:t>
+        <w:t xml:space="preserve">Physicist (Ph.D. and M.Sc. in Physics) with ten years of research in computational astrophysics, seeking to teach physics and astronomy. Substitute instructor for a graduate thermodynamics course; mentored three graduate researchers who co-authored papers with me. Bilingual (English/Spanish). Teaching approach built on intuition, critical thinking, and collaborative problem-solving.</w:t>
       </w:r>
     </w:p>
     <w:p>
@@ -1399,7 +1399,7 @@
       <w:r>
         <w:t xml:space="preserve">Thesis: </w:t>
       </w:r>
-      <w:hyperlink w:history="1" r:id="rIdi3ong3uoobwf5j9kqag50">
+      <w:hyperlink w:history="1" r:id="rIdarnbxpf1eyyhdimurjlvv">
         <w:r>
           <w:t xml:space="preserve">Numerical treatment of radiation processes in the internal shocks of magnetized relativistic outflows</w:t>
         </w:r>
@@ -1696,7 +1696,7 @@
       <w:r>
         <w:t xml:space="preserve">, </w:t>
       </w:r>
-      <w:hyperlink w:history="1" r:id="rIdx0qqrc-nzwskkirhbjw2v">
+      <w:hyperlink w:history="1" r:id="rIdyrrjhk2kvr8mfv6c7rixd">
         <w:r>
           <w:t xml:space="preserve">ApJ 976, 182 (2024)</w:t>
         </w:r>
@@ -1704,7 +1704,7 @@
       <w:r>
         <w:t xml:space="preserve">, </w:t>
       </w:r>
-      <w:hyperlink w:history="1" r:id="rIdfetezpaueoti-k_cvrd-f">
+      <w:hyperlink w:history="1" r:id="rId_trknhz3n9dt-soj_qhvs">
         <w:r>
           <w:t xml:space="preserve">arXiv:2405.17581</w:t>
         </w:r>
@@ -1741,7 +1741,7 @@
       <w:r>
         <w:t xml:space="preserve">, </w:t>
       </w:r>
-      <w:hyperlink w:history="1" r:id="rIdq2uzuab1d-mzm6itlxnni">
+      <w:hyperlink w:history="1" r:id="rIdr00glwq6jh3j3azyeqpzs">
         <w:r>
           <w:t xml:space="preserve">MNRAS 513, 5766–5779 (2022)</w:t>
         </w:r>
@@ -1749,7 +1749,7 @@
       <w:r>
         <w:t xml:space="preserve">, </w:t>
       </w:r>
-      <w:hyperlink w:history="1" r:id="rIdhlfrxrh3qel_0p5sbetlz">
+      <w:hyperlink w:history="1" r:id="rId_u5ipwflpqkiyowxsrgig">
         <w:r>
           <w:t xml:space="preserve">arXiv:2201.07790</w:t>
         </w:r>
@@ -1786,7 +1786,7 @@
       <w:r>
         <w:t xml:space="preserve">, </w:t>
       </w:r>
-      <w:hyperlink w:history="1" r:id="rIdagsmlxnzdn-9i5_nxa6ma">
+      <w:hyperlink w:history="1" r:id="rIdqzo5gs7bkanr49up4npqq">
         <w:r>
           <w:t xml:space="preserve">Phys. Rev. D 106, 083015 (2022)</w:t>
         </w:r>
@@ -1794,7 +1794,7 @@
       <w:r>
         <w:t xml:space="preserve">, </w:t>
       </w:r>
-      <w:hyperlink w:history="1" r:id="rIdnp0u0qevc7wqnvegmdtta">
+      <w:hyperlink w:history="1" r:id="rIdaml4ivvzf5mctcaqitv3g">
         <w:r>
           <w:t xml:space="preserve">arXiv:2112.09817</w:t>
         </w:r>
@@ -1831,7 +1831,7 @@
       <w:r>
         <w:t xml:space="preserve">, </w:t>
       </w:r>
-      <w:hyperlink w:history="1" r:id="rIdadm42oh71zbkvaeo-4lrx">
+      <w:hyperlink w:history="1" r:id="rIdghpnwifrmqpokacfzkyld">
         <w:r>
           <w:t xml:space="preserve">ApJ 919, 95 (2021)</w:t>
         </w:r>
@@ -1839,7 +1839,7 @@
       <w:r>
         <w:t xml:space="preserve">, </w:t>
       </w:r>
-      <w:hyperlink w:history="1" r:id="rIddeh_swaxvlm6oxf-aqg2f">
+      <w:hyperlink w:history="1" r:id="rIdycxnkquiftdegitlnjvuu">
         <w:r>
           <w:t xml:space="preserve">arXiv:2106.05356</w:t>
         </w:r>
@@ -1876,7 +1876,7 @@
       <w:r>
         <w:t xml:space="preserve">, </w:t>
       </w:r>
-      <w:hyperlink w:history="1" r:id="rIdthwh_s6tevtyubrn5v3kl">
+      <w:hyperlink w:history="1" r:id="rIdiy7grfmnwljesz9vsa5lx">
         <w:r>
           <w:t xml:space="preserve">MNRAS 501, 4092–4102 (2021)</w:t>
         </w:r>
@@ -1884,7 +1884,7 @@
       <w:r>
         <w:t xml:space="preserve">, </w:t>
       </w:r>
-      <w:hyperlink w:history="1" r:id="rId-77egbmql42nh7jvfgywt">
+      <w:hyperlink w:history="1" r:id="rId_5-wtir9gs4uhddgeaw7w">
         <w:r>
           <w:t xml:space="preserve">arXiv:2009.02273</w:t>
         </w:r>
@@ -1921,7 +1921,7 @@
       <w:r>
         <w:t xml:space="preserve">, </w:t>
       </w:r>
-      <w:hyperlink w:history="1" r:id="rIdx9s-5lmqgikbybwzur7zv">
+      <w:hyperlink w:history="1" r:id="rIdo33grsnrrxkxqpe65kuan">
         <w:r>
           <w:t xml:space="preserve">MNRAS 496, 974–986 (2020)</w:t>
         </w:r>
@@ -1929,7 +1929,7 @@
       <w:r>
         <w:t xml:space="preserve">, </w:t>
       </w:r>
-      <w:hyperlink w:history="1" r:id="rIdeexqjcywtgemsjyomabyp">
+      <w:hyperlink w:history="1" r:id="rIdiiogkhal0dhesqpdqqwee">
         <w:r>
           <w:t xml:space="preserve">arXiv:1910.14049</w:t>
         </w:r>
@@ -1966,7 +1966,7 @@
       <w:r>
         <w:t xml:space="preserve">, </w:t>
       </w:r>
-      <w:hyperlink w:history="1" r:id="rIduisn0rknvyq2x34az_m_-">
+      <w:hyperlink w:history="1" r:id="rId-y0exglopogjs5bynydkr">
         <w:r>
           <w:t xml:space="preserve">MNRAS 468, 1169–1182 (2017)</w:t>
         </w:r>
@@ -1974,7 +1974,7 @@
       <w:r>
         <w:t xml:space="preserve">, </w:t>
       </w:r>
-      <w:hyperlink w:history="1" r:id="rIduopsfvpxfugk7bhpzygmy">
+      <w:hyperlink w:history="1" r:id="rIdtnzm9w89pt9-etvp54jyb">
         <w:r>
           <w:t xml:space="preserve">arXiv:1612.06383</w:t>
         </w:r>
@@ -2011,7 +2011,7 @@
       <w:r>
         <w:t xml:space="preserve">, </w:t>
       </w:r>
-      <w:hyperlink w:history="1" r:id="rIdvxpes1fytwkg457bblzb2">
+      <w:hyperlink w:history="1" r:id="rId1oug_mktbwgswg1msa-9r">
         <w:r>
           <w:t xml:space="preserve">MNRAS 438, 1856–1869 (2014)</w:t>
         </w:r>
@@ -2019,7 +2019,7 @@
       <w:r>
         <w:t xml:space="preserve">, </w:t>
       </w:r>
-      <w:hyperlink w:history="1" r:id="rIdatjpvs3rzonjm06slcwky">
+      <w:hyperlink w:history="1" r:id="rIdnyfbpn2gf1fnldzo4uvrd">
         <w:r>
           <w:t xml:space="preserve">arXiv:1310.5441</w:t>
         </w:r>
@@ -2056,7 +2056,7 @@
       <w:r>
         <w:t xml:space="preserve">, </w:t>
       </w:r>
-      <w:hyperlink w:history="1" r:id="rIdsh37wxtb18n7bvl8sycrq">
+      <w:hyperlink w:history="1" r:id="rIdjbyqickodvk4qhw4yopb4">
         <w:r>
           <w:t xml:space="preserve">Phys. Rev. D 80, 084023 (2009)</w:t>
         </w:r>
@@ -2064,7 +2064,7 @@
       <w:r>
         <w:t xml:space="preserve">, </w:t>
       </w:r>
-      <w:hyperlink w:history="1" r:id="rId-tcwghvbcgcqyhrslkadv">
+      <w:hyperlink w:history="1" r:id="rIdgdteqx9pqligyzfwuawvp">
         <w:r>
           <w:t xml:space="preserve">arXiv:1009.1250</w:t>
         </w:r>
@@ -2109,7 +2109,7 @@
       <w:r>
         <w:t xml:space="preserve">, </w:t>
       </w:r>
-      <w:hyperlink w:history="1" r:id="rIdq6z79qn2oxxsdf2k0sjna">
+      <w:hyperlink w:history="1" r:id="rIdujfxpg7npthnqsb_icyro">
         <w:r>
           <w:t xml:space="preserve">Astron. Nachr. 342, 277–282 (2021)</w:t>
         </w:r>
@@ -2117,7 +2117,7 @@
       <w:r>
         <w:t xml:space="preserve">, 9th International Workshop on Astronomy and Relativistic Astrophysics, </w:t>
       </w:r>
-      <w:hyperlink w:history="1" r:id="rIdofau8c0kr2tgqrl-gcubc">
+      <w:hyperlink w:history="1" r:id="rIdbvcl6rpoefradmqttxjno">
         <w:r>
           <w:t xml:space="preserve">arXiv:2011.13797</w:t>
         </w:r>
@@ -2154,7 +2154,7 @@
       <w:r>
         <w:t xml:space="preserve">, </w:t>
       </w:r>
-      <w:hyperlink w:history="1" r:id="rIdqug9stigjtcqj9r3f39fw">
+      <w:hyperlink w:history="1" r:id="rIdictfnsmkid2tyxnhh4fqt">
         <w:r>
           <w:t xml:space="preserve">Astron. Nachr. 342, 147–152 (2021)</w:t>
         </w:r>
@@ -2162,7 +2162,7 @@
       <w:r>
         <w:t xml:space="preserve">, 9th International Workshop on Astronomy and Relativistic Astrophysics, </w:t>
       </w:r>
-      <w:hyperlink w:history="1" r:id="rIdspbatdfsnbsl8kro5khpo">
+      <w:hyperlink w:history="1" r:id="rId6anbyjciyjebcxzfwjqca">
         <w:r>
           <w:t xml:space="preserve">arXiv:2011.13805</w:t>
         </w:r>
@@ -2199,7 +2199,7 @@
       <w:r>
         <w:t xml:space="preserve">, </w:t>
       </w:r>
-      <w:hyperlink w:history="1" r:id="rIdh7k6attnuiznxrr8tpmrs">
+      <w:hyperlink w:history="1" r:id="rIdj_juto_vs0zk6lgl10cj_">
         <w:r>
           <w:t xml:space="preserve">PoS(SWIFT 10) 233, 159 (2014)</w:t>
         </w:r>
@@ -2207,7 +2207,7 @@
       <w:r>
         <w:t xml:space="preserve">, </w:t>
       </w:r>
-      <w:hyperlink w:history="1" r:id="rId1yqoeshtdkdq96yxawbmv">
+      <w:hyperlink w:history="1" r:id="rIdypvsw4i_qfwh8ijibfca-">
         <w:r>
           <w:t xml:space="preserve">arXiv:1502.07882</w:t>
         </w:r>
@@ -2244,7 +2244,7 @@
       <w:r>
         <w:t xml:space="preserve">, </w:t>
       </w:r>
-      <w:hyperlink w:history="1" r:id="rId8n6la9lmwks-q1gnzl_4o">
+      <w:hyperlink w:history="1" r:id="rId8lzdnfgzqbhtwknsnc40k">
         <w:r>
           <w:t xml:space="preserve">EPJ Web Conf. 61, 02007 (2013)</w:t>
         </w:r>
@@ -2252,7 +2252,7 @@
       <w:r>
         <w:t xml:space="preserve">, </w:t>
       </w:r>
-      <w:hyperlink w:history="1" r:id="rIdk_hc_xmwcs9rbimjcghyy">
+      <w:hyperlink w:history="1" r:id="rIdbq9bw7yudse-k75mtt63l">
         <w:r>
           <w:t xml:space="preserve">arXiv:1309.4612</w:t>
         </w:r>
@@ -2289,7 +2289,7 @@
       <w:r>
         <w:t xml:space="preserve">, </w:t>
       </w:r>
-      <w:hyperlink w:history="1" r:id="rId6y35fuvsxbxbyebqrna2m">
+      <w:hyperlink w:history="1" r:id="rIdrkmnkyqbbjeylmc9gezjq">
         <w:r>
           <w:t xml:space="preserve">J. Phys.: Conf. Ser. 454, 012001 (2013)</w:t>
         </w:r>
@@ -2297,7 +2297,7 @@
       <w:r>
         <w:t xml:space="preserve">, </w:t>
       </w:r>
-      <w:hyperlink w:history="1" r:id="rIdwc3esehq9ok9gizmozdxq">
+      <w:hyperlink w:history="1" r:id="rIdk6gshkpw_k_p_xmjg-gy1">
         <w:r>
           <w:t xml:space="preserve">arXiv:1211.1794</w:t>
         </w:r>
@@ -2700,7 +2700,7 @@
       <w:r>
         <w:tab/>
       </w:r>
-      <w:hyperlink w:history="1" r:id="rId0ivgkekvwqzsytsvctkca">
+      <w:hyperlink w:history="1" r:id="rIdraab-hrxu7dqq8uxfax7q">
         <w:r>
           <w:t xml:space="preserve">github.com/altjerue/ilwikak-ml</w:t>
         </w:r>
@@ -2791,7 +2791,7 @@
       <w:r>
         <w:tab/>
       </w:r>
-      <w:hyperlink w:history="1" r:id="rIdopvnsjc0-b4kzmraphjtp">
+      <w:hyperlink w:history="1" r:id="rIdlscnp_hrvta2u8agnyaj4">
         <w:r>
           <w:t xml:space="preserve">github.com/UW-ForestMycobiomeLab/WindSporesHills</w:t>
         </w:r>
@@ -2856,7 +2856,7 @@
       <w:r>
         <w:tab/>
       </w:r>
-      <w:hyperlink w:history="1" r:id="rIdptsr-tvxblpzeloeoyjvw">
+      <w:hyperlink w:history="1" r:id="rIdndxi8eczdass6g_ufva2w">
         <w:r>
           <w:t xml:space="preserve">github.com/zkdavis/Tleco</w:t>
         </w:r>
@@ -2921,7 +2921,7 @@
       <w:r>
         <w:tab/>
       </w:r>
-      <w:hyperlink w:history="1" r:id="rIdj6s73dbbdpk3hq1hahtg0">
+      <w:hyperlink w:history="1" r:id="rIdziew6hvqas8hmarzxpgdl">
         <w:r>
           <w:t xml:space="preserve">github.com/altjerue/paramo</w:t>
         </w:r>
@@ -3482,7 +3482,7 @@
       <w:r>
         <w:t xml:space="preserve">Video: </w:t>
       </w:r>
-      <w:hyperlink w:history="1" r:id="rIdhcnhd2me3gt1kkareqoz-">
+      <w:hyperlink w:history="1" r:id="rIdca0nd15jk8pfct46neqpv">
         <w:r>
           <w:t xml:space="preserve">youtube.com/watch?v=BAZNWLNT69M</w:t>
         </w:r>
@@ -3653,7 +3653,7 @@
       <w:r>
         <w:t xml:space="preserve">Marcos Moshinsky Award for Best Poster. Video: </w:t>
       </w:r>
-      <w:hyperlink w:history="1" r:id="rIdjp6076qhpkm5a9th-flje">
+      <w:hyperlink w:history="1" r:id="rIddpffefjrp20lpknb6b4gq">
         <w:r>
           <w:t xml:space="preserve">youtube.com/watch?v=0TJiKg7kOPI</w:t>
         </w:r>
@@ -4579,7 +4579,7 @@
       <w:pPr>
         <w:spacing w:after="0"/>
       </w:pPr>
-      <w:hyperlink w:history="1" r:id="rIdztlyidsxpwyvct9fgivnx">
+      <w:hyperlink w:history="1" r:id="rId3b6mn9bmb2qkas-phli_6">
         <w:r>
           <w:t xml:space="preserve">mexiciencia.github.io/post/anita</w:t>
         </w:r>
@@ -4639,7 +4639,7 @@
       <w:pPr>
         <w:spacing w:after="0"/>
       </w:pPr>
-      <w:hyperlink w:history="1" r:id="rIdpp6sx1ukud7zav_xzizcm">
+      <w:hyperlink w:history="1" r:id="rIdxllte4tldigh-g0bi-h1_">
         <w:r>
           <w:t xml:space="preserve">mexiciencia.github.io/post/modelo-sir</w:t>
         </w:r>
@@ -4702,7 +4702,7 @@
       <w:r>
         <w:t xml:space="preserve">Data analysis and modeling collaborator. </w:t>
       </w:r>
-      <w:hyperlink w:history="1" r:id="rIdqutclhyai0aukpj0vrkfa">
+      <w:hyperlink w:history="1" r:id="rIdt-imysrjcuy-1ktg0flvw">
         <w:r>
           <w:t xml:space="preserve">mexiciencia.github.io/post/covid19</w:t>
         </w:r>

</xml_diff>